<commit_message>
Folder structure and more design stuff
</commit_message>
<xml_diff>
--- a/docs/TusMuertos-v2.0-Design.docx
+++ b/docs/TusMuertos-v2.0-Design.docx
@@ -301,6 +301,164 @@
         <w:t xml:space="preserve"> BOCHS &gt;&gt; QEMU &gt;&gt; HYPER-V &gt;&gt; rest of hypervisors</w:t>
       </w:r>
     </w:p>
+    <w:p>
+      <w:pPr>
+        <w:pStyle w:val="ListParagraph"/>
+        <w:numPr>
+          <w:ilvl w:val="0"/>
+          <w:numId w:val="1"/>
+        </w:numPr>
+      </w:pPr>
+      <w:r>
+        <w:rPr>
+          <w:b/>
+          <w:bCs/>
+        </w:rPr>
+        <w:t>Calling convention on bootloader</w:t>
+      </w:r>
+    </w:p>
+    <w:p>
+      <w:pPr>
+        <w:pStyle w:val="ListParagraph"/>
+        <w:numPr>
+          <w:ilvl w:val="0"/>
+          <w:numId w:val="1"/>
+        </w:numPr>
+      </w:pPr>
+      <w:r>
+        <w:rPr>
+          <w:b/>
+          <w:bCs/>
+        </w:rPr>
+        <w:t>Calling convention on Kernel</w:t>
+      </w:r>
+    </w:p>
+    <w:p>
+      <w:pPr>
+        <w:pStyle w:val="ListParagraph"/>
+        <w:numPr>
+          <w:ilvl w:val="0"/>
+          <w:numId w:val="1"/>
+        </w:numPr>
+      </w:pPr>
+      <w:r>
+        <w:rPr>
+          <w:b/>
+          <w:bCs/>
+        </w:rPr>
+        <w:t>Other tools:</w:t>
+      </w:r>
+    </w:p>
+    <w:p>
+      <w:pPr>
+        <w:pStyle w:val="ListParagraph"/>
+        <w:numPr>
+          <w:ilvl w:val="1"/>
+          <w:numId w:val="1"/>
+        </w:numPr>
+      </w:pPr>
+      <w:r>
+        <w:rPr>
+          <w:b/>
+          <w:bCs/>
+        </w:rPr>
+        <w:t>Hex editor:</w:t>
+      </w:r>
+      <w:r>
+        <w:t xml:space="preserve"> HIMEX</w:t>
+      </w:r>
+    </w:p>
+    <w:p>
+      <w:pPr>
+        <w:pStyle w:val="ListParagraph"/>
+        <w:numPr>
+          <w:ilvl w:val="1"/>
+          <w:numId w:val="1"/>
+        </w:numPr>
+      </w:pPr>
+      <w:r>
+        <w:rPr>
+          <w:b/>
+          <w:bCs/>
+        </w:rPr>
+        <w:t>Text editor:</w:t>
+      </w:r>
+      <w:r>
+        <w:t xml:space="preserve"> Notepad++, Visual Studio Code</w:t>
+      </w:r>
+    </w:p>
+    <w:p>
+      <w:pPr>
+        <w:pStyle w:val="ListParagraph"/>
+        <w:numPr>
+          <w:ilvl w:val="1"/>
+          <w:numId w:val="1"/>
+        </w:numPr>
+      </w:pPr>
+      <w:r>
+        <w:rPr>
+          <w:b/>
+          <w:bCs/>
+        </w:rPr>
+        <w:t>IDE Assembly:</w:t>
+      </w:r>
+      <w:r>
+        <w:t xml:space="preserve"> Visual Studio Code</w:t>
+      </w:r>
+    </w:p>
+    <w:p>
+      <w:pPr>
+        <w:pStyle w:val="ListParagraph"/>
+        <w:numPr>
+          <w:ilvl w:val="1"/>
+          <w:numId w:val="1"/>
+        </w:numPr>
+      </w:pPr>
+      <w:r>
+        <w:rPr>
+          <w:b/>
+          <w:bCs/>
+        </w:rPr>
+        <w:t xml:space="preserve">IDE </w:t>
+      </w:r>
+      <w:r>
+        <w:rPr>
+          <w:b/>
+          <w:bCs/>
+        </w:rPr>
+        <w:t>C</w:t>
+      </w:r>
+      <w:r>
+        <w:rPr>
+          <w:b/>
+          <w:bCs/>
+        </w:rPr>
+        <w:t xml:space="preserve"> or Rust:</w:t>
+      </w:r>
+      <w:r>
+        <w:t xml:space="preserve"> Visual Studio Code or Visual Studio 2022</w:t>
+      </w:r>
+    </w:p>
+    <w:p>
+      <w:pPr>
+        <w:pStyle w:val="ListParagraph"/>
+        <w:numPr>
+          <w:ilvl w:val="1"/>
+          <w:numId w:val="1"/>
+        </w:numPr>
+      </w:pPr>
+      <w:r>
+        <w:t xml:space="preserve">Image, bin editor, concatenation, elf info, debug, tracer, </w:t>
+      </w:r>
+      <w:proofErr w:type="spellStart"/>
+      <w:r>
+        <w:t>etc</w:t>
+      </w:r>
+      <w:proofErr w:type="spellEnd"/>
+      <w:r>
+        <w:t>……</w:t>
+      </w:r>
+    </w:p>
     <w:p/>
     <w:p>
       <w:pPr>
@@ -308,11 +466,893 @@
       </w:pPr>
       <w:r>
         <w:t>Bootloader</w:t>
+      </w:r>
+    </w:p>
+    <w:p>
+      <w:r>
+        <w:t xml:space="preserve">   </w:t>
+      </w:r>
+    </w:p>
+    <w:p>
+      <w:pPr>
+        <w:pStyle w:val="ListParagraph"/>
+        <w:numPr>
+          <w:ilvl w:val="0"/>
+          <w:numId w:val="1"/>
+        </w:numPr>
+        <w:rPr>
+          <w:b/>
+          <w:bCs/>
+        </w:rPr>
+      </w:pPr>
+      <w:r>
+        <w:rPr>
+          <w:b/>
+          <w:bCs/>
+        </w:rPr>
+        <w:t>General:</w:t>
+      </w:r>
+    </w:p>
+    <w:p>
+      <w:pPr>
+        <w:pStyle w:val="ListParagraph"/>
+        <w:numPr>
+          <w:ilvl w:val="1"/>
+          <w:numId w:val="1"/>
+        </w:numPr>
+      </w:pPr>
+      <w:r>
+        <w:t>Language: NASM Assembly</w:t>
+      </w:r>
+    </w:p>
+    <w:p>
+      <w:pPr>
+        <w:pStyle w:val="ListParagraph"/>
+        <w:numPr>
+          <w:ilvl w:val="1"/>
+          <w:numId w:val="1"/>
+        </w:numPr>
+      </w:pPr>
+      <w:r>
+        <w:t>Toolchain: NASM (Linux or windows, preferably Linux on WSL)</w:t>
+      </w:r>
+    </w:p>
+    <w:p>
+      <w:pPr>
+        <w:pStyle w:val="ListParagraph"/>
+        <w:numPr>
+          <w:ilvl w:val="1"/>
+          <w:numId w:val="1"/>
+        </w:numPr>
+      </w:pPr>
+      <w:r>
+        <w:t xml:space="preserve">2 Stages. Minimal first stage until Protected mode + Second stage to </w:t>
+      </w:r>
+      <w:proofErr w:type="gramStart"/>
+      <w:r>
+        <w:t>Long</w:t>
+      </w:r>
+      <w:proofErr w:type="gramEnd"/>
+      <w:r>
+        <w:t xml:space="preserve"> mode</w:t>
+      </w:r>
+    </w:p>
+    <w:p>
+      <w:pPr>
+        <w:pStyle w:val="ListParagraph"/>
+        <w:numPr>
+          <w:ilvl w:val="2"/>
+          <w:numId w:val="1"/>
+        </w:numPr>
+      </w:pPr>
+      <w:r>
+        <w:t>Stage1: 16 bits to 32 bits Real to Protected. NASM on 16 bits, only code on 32 bits is the jump to the second stage.</w:t>
+      </w:r>
+    </w:p>
+    <w:p>
+      <w:pPr>
+        <w:pStyle w:val="ListParagraph"/>
+        <w:numPr>
+          <w:ilvl w:val="0"/>
+          <w:numId w:val="1"/>
+        </w:numPr>
+        <w:rPr>
+          <w:b/>
+          <w:bCs/>
+        </w:rPr>
+      </w:pPr>
+      <w:r>
+        <w:rPr>
+          <w:b/>
+          <w:bCs/>
+        </w:rPr>
+        <w:t>Functionality:</w:t>
+      </w:r>
+    </w:p>
+    <w:p>
+      <w:pPr>
+        <w:pStyle w:val="ListParagraph"/>
+        <w:numPr>
+          <w:ilvl w:val="1"/>
+          <w:numId w:val="1"/>
+        </w:numPr>
+        <w:rPr>
+          <w:b/>
+          <w:bCs/>
+        </w:rPr>
+      </w:pPr>
+      <w:r>
+        <w:rPr>
+          <w:b/>
+          <w:bCs/>
+        </w:rPr>
+        <w:t>Stage1:</w:t>
+      </w:r>
+    </w:p>
+    <w:p>
+      <w:pPr>
+        <w:pStyle w:val="ListParagraph"/>
+        <w:numPr>
+          <w:ilvl w:val="2"/>
+          <w:numId w:val="1"/>
+        </w:numPr>
+      </w:pPr>
+      <w:r>
+        <w:t>BIOS loads at 0x7C00 (0x07C0 x 0x0000)</w:t>
+      </w:r>
+    </w:p>
+    <w:p>
+      <w:pPr>
+        <w:pStyle w:val="ListParagraph"/>
+        <w:numPr>
+          <w:ilvl w:val="2"/>
+          <w:numId w:val="1"/>
+        </w:numPr>
+      </w:pPr>
+      <w:r>
+        <w:t>Verify 0x55AA signature</w:t>
+      </w:r>
+      <w:r>
+        <w:t xml:space="preserve"> (0101 0101 1010 1010)</w:t>
+      </w:r>
+    </w:p>
+    <w:p>
+      <w:pPr>
+        <w:pStyle w:val="ListParagraph"/>
+        <w:numPr>
+          <w:ilvl w:val="2"/>
+          <w:numId w:val="1"/>
+        </w:numPr>
+      </w:pPr>
+      <w:r>
+        <w:t>CPU registers and flags initialization</w:t>
+      </w:r>
+    </w:p>
+    <w:p>
+      <w:pPr>
+        <w:pStyle w:val="ListParagraph"/>
+        <w:numPr>
+          <w:ilvl w:val="2"/>
+          <w:numId w:val="1"/>
+        </w:numPr>
+      </w:pPr>
+      <w:r>
+        <w:lastRenderedPageBreak/>
+        <w:t>Set a temporary stack</w:t>
+      </w:r>
+      <w:r>
+        <w:t>. Probably 0x7C00 downwards.</w:t>
+      </w:r>
+    </w:p>
+    <w:p>
+      <w:pPr>
+        <w:pStyle w:val="ListParagraph"/>
+        <w:numPr>
+          <w:ilvl w:val="2"/>
+          <w:numId w:val="1"/>
+        </w:numPr>
+      </w:pPr>
+      <w:r>
+        <w:t>Print early status</w:t>
+      </w:r>
+    </w:p>
+    <w:p>
+      <w:pPr>
+        <w:pStyle w:val="ListParagraph"/>
+        <w:numPr>
+          <w:ilvl w:val="2"/>
+          <w:numId w:val="1"/>
+        </w:numPr>
+      </w:pPr>
+      <w:r>
+        <w:t xml:space="preserve">Detect storage </w:t>
+      </w:r>
+      <w:r>
+        <w:t>drives. Probably only one at the beginning.</w:t>
+      </w:r>
+    </w:p>
+    <w:p>
+      <w:pPr>
+        <w:pStyle w:val="ListParagraph"/>
+        <w:numPr>
+          <w:ilvl w:val="2"/>
+          <w:numId w:val="1"/>
+        </w:numPr>
+      </w:pPr>
+      <w:r>
+        <w:t>Storage fixed LBA or simple Fat12/26/32????</w:t>
+      </w:r>
+    </w:p>
+    <w:p>
+      <w:pPr>
+        <w:pStyle w:val="ListParagraph"/>
+        <w:numPr>
+          <w:ilvl w:val="2"/>
+          <w:numId w:val="1"/>
+        </w:numPr>
+      </w:pPr>
+      <w:r>
+        <w:t>Jump to Protected mode</w:t>
+      </w:r>
+      <w:r>
+        <w:t>. Maybe change this to the second stage?</w:t>
+      </w:r>
+    </w:p>
+    <w:p>
+      <w:pPr>
+        <w:pStyle w:val="ListParagraph"/>
+        <w:numPr>
+          <w:ilvl w:val="2"/>
+          <w:numId w:val="1"/>
+        </w:numPr>
+      </w:pPr>
+      <w:r>
+        <w:t>Load stage 2. Target memory TBD</w:t>
+      </w:r>
+    </w:p>
+    <w:p>
+      <w:pPr>
+        <w:pStyle w:val="ListParagraph"/>
+        <w:numPr>
+          <w:ilvl w:val="2"/>
+          <w:numId w:val="1"/>
+        </w:numPr>
+      </w:pPr>
+      <w:r>
+        <w:t>Jump to Stage 2</w:t>
+      </w:r>
+    </w:p>
+    <w:p>
+      <w:pPr>
+        <w:pStyle w:val="ListParagraph"/>
+        <w:numPr>
+          <w:ilvl w:val="1"/>
+          <w:numId w:val="1"/>
+        </w:numPr>
+      </w:pPr>
+      <w:r>
+        <w:rPr>
+          <w:b/>
+          <w:bCs/>
+        </w:rPr>
+        <w:t>Stage2</w:t>
+      </w:r>
+      <w:r>
+        <w:t>:</w:t>
+      </w:r>
+    </w:p>
+    <w:p>
+      <w:pPr>
+        <w:pStyle w:val="ListParagraph"/>
+        <w:numPr>
+          <w:ilvl w:val="2"/>
+          <w:numId w:val="1"/>
+        </w:numPr>
+      </w:pPr>
+      <w:r>
+        <w:t xml:space="preserve">Jump to Protected mode if Stage1 </w:t>
+      </w:r>
+      <w:proofErr w:type="gramStart"/>
+      <w:r>
+        <w:t>did</w:t>
+      </w:r>
+      <w:proofErr w:type="gramEnd"/>
+      <w:r>
+        <w:t xml:space="preserve"> not change mode.</w:t>
+      </w:r>
+    </w:p>
+    <w:p>
+      <w:pPr>
+        <w:pStyle w:val="ListParagraph"/>
+        <w:numPr>
+          <w:ilvl w:val="2"/>
+          <w:numId w:val="1"/>
+        </w:numPr>
+      </w:pPr>
+      <w:r>
+        <w:t xml:space="preserve">Enable </w:t>
+      </w:r>
+      <w:proofErr w:type="gramStart"/>
+      <w:r>
+        <w:t>A20, or</w:t>
+      </w:r>
+      <w:proofErr w:type="gramEnd"/>
+      <w:r>
+        <w:t xml:space="preserve"> at least check. There are multiple strategies for this. Some platforms have fast </w:t>
+      </w:r>
+      <w:proofErr w:type="gramStart"/>
+      <w:r>
+        <w:t>enable</w:t>
+      </w:r>
+      <w:proofErr w:type="gramEnd"/>
+      <w:r>
+        <w:t xml:space="preserve"> 0x92, or they come with A20 already enable. XXXX</w:t>
+      </w:r>
+    </w:p>
+    <w:p>
+      <w:pPr>
+        <w:pStyle w:val="ListParagraph"/>
+        <w:numPr>
+          <w:ilvl w:val="2"/>
+          <w:numId w:val="1"/>
+        </w:numPr>
+      </w:pPr>
+      <w:r>
+        <w:t>Create console helpers for printing and stuff.</w:t>
+      </w:r>
+    </w:p>
+    <w:p>
+      <w:pPr>
+        <w:pStyle w:val="ListParagraph"/>
+        <w:numPr>
+          <w:ilvl w:val="2"/>
+          <w:numId w:val="1"/>
+        </w:numPr>
+      </w:pPr>
+      <w:r>
+        <w:t xml:space="preserve">Gather info for the kernel: Memory, graphics, bios, </w:t>
+      </w:r>
+      <w:proofErr w:type="spellStart"/>
+      <w:r>
+        <w:t>acpi</w:t>
+      </w:r>
+      <w:proofErr w:type="spellEnd"/>
+      <w:r>
+        <w:t>, others…</w:t>
+      </w:r>
+    </w:p>
+    <w:p>
+      <w:pPr>
+        <w:pStyle w:val="ListParagraph"/>
+        <w:numPr>
+          <w:ilvl w:val="2"/>
+          <w:numId w:val="1"/>
+        </w:numPr>
+      </w:pPr>
+      <w:r>
+        <w:t>Load kernel:</w:t>
+      </w:r>
+    </w:p>
+    <w:p>
+      <w:pPr>
+        <w:pStyle w:val="ListParagraph"/>
+        <w:numPr>
+          <w:ilvl w:val="3"/>
+          <w:numId w:val="1"/>
+        </w:numPr>
+      </w:pPr>
+      <w:r>
+        <w:t xml:space="preserve">Flat binary: Explore this option, </w:t>
+      </w:r>
+      <w:proofErr w:type="gramStart"/>
+      <w:r>
+        <w:t>maybe</w:t>
+      </w:r>
+      <w:proofErr w:type="gramEnd"/>
+      <w:r>
+        <w:t xml:space="preserve"> is simpler</w:t>
+      </w:r>
+    </w:p>
+    <w:p>
+      <w:pPr>
+        <w:pStyle w:val="ListParagraph"/>
+        <w:numPr>
+          <w:ilvl w:val="3"/>
+          <w:numId w:val="1"/>
+        </w:numPr>
+      </w:pPr>
+      <w:r>
+        <w:t xml:space="preserve">ELF: Parser + segments + </w:t>
+      </w:r>
+      <w:proofErr w:type="spellStart"/>
+      <w:r>
+        <w:t>etc</w:t>
+      </w:r>
+      <w:proofErr w:type="spellEnd"/>
+      <w:r>
+        <w:t>…</w:t>
+      </w:r>
+    </w:p>
+    <w:p>
+      <w:pPr>
+        <w:pStyle w:val="ListParagraph"/>
+        <w:numPr>
+          <w:ilvl w:val="2"/>
+          <w:numId w:val="1"/>
+        </w:numPr>
+      </w:pPr>
+      <w:r>
+        <w:t>Define kernel entry</w:t>
+      </w:r>
+    </w:p>
+    <w:p>
+      <w:pPr>
+        <w:pStyle w:val="ListParagraph"/>
+        <w:numPr>
+          <w:ilvl w:val="2"/>
+          <w:numId w:val="1"/>
+        </w:numPr>
+      </w:pPr>
+      <w:r>
+        <w:t>Set the GDT and Jump to protected mode</w:t>
+      </w:r>
+    </w:p>
+    <w:p>
+      <w:pPr>
+        <w:pStyle w:val="ListParagraph"/>
+        <w:numPr>
+          <w:ilvl w:val="2"/>
+          <w:numId w:val="1"/>
+        </w:numPr>
+      </w:pPr>
+      <w:r>
+        <w:t xml:space="preserve">Verify if long </w:t>
+      </w:r>
+      <w:proofErr w:type="gramStart"/>
+      <w:r>
+        <w:t>mode</w:t>
+      </w:r>
+      <w:proofErr w:type="gramEnd"/>
+      <w:r>
+        <w:t xml:space="preserve"> if possible, for completeness</w:t>
+      </w:r>
+    </w:p>
+    <w:p>
+      <w:pPr>
+        <w:pStyle w:val="ListParagraph"/>
+        <w:numPr>
+          <w:ilvl w:val="2"/>
+          <w:numId w:val="1"/>
+        </w:numPr>
+      </w:pPr>
+      <w:r>
+        <w:t>Enable paging</w:t>
+      </w:r>
+    </w:p>
+    <w:p>
+      <w:pPr>
+        <w:pStyle w:val="ListParagraph"/>
+        <w:numPr>
+          <w:ilvl w:val="2"/>
+          <w:numId w:val="1"/>
+        </w:numPr>
+      </w:pPr>
+      <w:r>
+        <w:t>Enable PAE</w:t>
+      </w:r>
+    </w:p>
+    <w:p>
+      <w:pPr>
+        <w:pStyle w:val="ListParagraph"/>
+        <w:numPr>
+          <w:ilvl w:val="2"/>
+          <w:numId w:val="1"/>
+        </w:numPr>
+      </w:pPr>
+      <w:r>
+        <w:t>Jump to Long mode</w:t>
+      </w:r>
+    </w:p>
+    <w:p>
+      <w:pPr>
+        <w:pStyle w:val="ListParagraph"/>
+        <w:numPr>
+          <w:ilvl w:val="1"/>
+          <w:numId w:val="1"/>
+        </w:numPr>
+      </w:pPr>
+      <w:r>
+        <w:t>Optional, but bonus points:</w:t>
+      </w:r>
+    </w:p>
+    <w:p>
+      <w:pPr>
+        <w:pStyle w:val="ListParagraph"/>
+        <w:numPr>
+          <w:ilvl w:val="2"/>
+          <w:numId w:val="1"/>
+        </w:numPr>
+      </w:pPr>
+      <w:r>
+        <w:t>Error handling</w:t>
+      </w:r>
+    </w:p>
+    <w:p>
+      <w:pPr>
+        <w:pStyle w:val="ListParagraph"/>
+        <w:numPr>
+          <w:ilvl w:val="2"/>
+          <w:numId w:val="1"/>
+        </w:numPr>
+      </w:pPr>
+      <w:r>
+        <w:t xml:space="preserve">Checksums </w:t>
       </w:r>
     </w:p>
     <w:p/>
     <w:p/>
     <w:p/>
+    <w:p/>
+    <w:p>
+      <w:pPr>
+        <w:pStyle w:val="Heading1"/>
+      </w:pPr>
+      <w:r>
+        <w:t>Misc and notes</w:t>
+      </w:r>
+    </w:p>
+    <w:p/>
+    <w:p>
+      <w:pPr>
+        <w:pStyle w:val="ListParagraph"/>
+        <w:numPr>
+          <w:ilvl w:val="0"/>
+          <w:numId w:val="1"/>
+        </w:numPr>
+      </w:pPr>
+      <w:r>
+        <w:t>WSL:</w:t>
+      </w:r>
+    </w:p>
+    <w:p>
+      <w:pPr>
+        <w:pStyle w:val="ListParagraph"/>
+        <w:numPr>
+          <w:ilvl w:val="1"/>
+          <w:numId w:val="1"/>
+        </w:numPr>
+      </w:pPr>
+      <w:r>
+        <w:t>File system:</w:t>
+      </w:r>
+    </w:p>
+    <w:p>
+      <w:pPr>
+        <w:pStyle w:val="ListParagraph"/>
+        <w:numPr>
+          <w:ilvl w:val="2"/>
+          <w:numId w:val="1"/>
+        </w:numPr>
+      </w:pPr>
+      <w:r>
+        <w:t>Accessing Windows from Linux:</w:t>
+      </w:r>
+    </w:p>
+    <w:p>
+      <w:pPr>
+        <w:pStyle w:val="ListParagraph"/>
+        <w:numPr>
+          <w:ilvl w:val="3"/>
+          <w:numId w:val="1"/>
+        </w:numPr>
+      </w:pPr>
+      <w:r>
+        <w:t>Console</w:t>
+      </w:r>
+      <w:r>
+        <w:t>:</w:t>
+      </w:r>
+    </w:p>
+    <w:p>
+      <w:pPr>
+        <w:pStyle w:val="ListParagraph"/>
+        <w:numPr>
+          <w:ilvl w:val="4"/>
+          <w:numId w:val="1"/>
+        </w:numPr>
+      </w:pPr>
+      <w:r>
+        <w:t>Invoke explorer Windows using “</w:t>
+      </w:r>
+      <w:proofErr w:type="gramStart"/>
+      <w:r>
+        <w:rPr>
+          <w:b/>
+          <w:bCs/>
+        </w:rPr>
+        <w:t>explorer.exe .</w:t>
+      </w:r>
+      <w:proofErr w:type="gramEnd"/>
+      <w:r>
+        <w:t>”</w:t>
+      </w:r>
+    </w:p>
+    <w:p>
+      <w:pPr>
+        <w:pStyle w:val="ListParagraph"/>
+        <w:numPr>
+          <w:ilvl w:val="4"/>
+          <w:numId w:val="1"/>
+        </w:numPr>
+        <w:rPr>
+          <w:b/>
+          <w:bCs/>
+        </w:rPr>
+      </w:pPr>
+      <w:r>
+        <w:t xml:space="preserve">Access Windows drives through the mounted drive: </w:t>
+      </w:r>
+      <w:r>
+        <w:rPr>
+          <w:b/>
+          <w:bCs/>
+        </w:rPr>
+        <w:t>/</w:t>
+      </w:r>
+      <w:proofErr w:type="spellStart"/>
+      <w:r>
+        <w:rPr>
+          <w:b/>
+          <w:bCs/>
+        </w:rPr>
+        <w:t>mnt</w:t>
+      </w:r>
+      <w:proofErr w:type="spellEnd"/>
+      <w:r>
+        <w:rPr>
+          <w:b/>
+          <w:bCs/>
+        </w:rPr>
+        <w:t>/c/Program Files (x86)</w:t>
+      </w:r>
+    </w:p>
+    <w:p>
+      <w:pPr>
+        <w:pStyle w:val="ListParagraph"/>
+        <w:numPr>
+          <w:ilvl w:val="3"/>
+          <w:numId w:val="1"/>
+        </w:numPr>
+      </w:pPr>
+      <w:r>
+        <w:t>Running directly from Linux console:</w:t>
+      </w:r>
+    </w:p>
+    <w:p>
+      <w:pPr>
+        <w:pStyle w:val="ListParagraph"/>
+        <w:numPr>
+          <w:ilvl w:val="4"/>
+          <w:numId w:val="1"/>
+        </w:numPr>
+      </w:pPr>
+      <w:r>
+        <w:lastRenderedPageBreak/>
+        <w:t>Example: “</w:t>
+      </w:r>
+      <w:r>
+        <w:rPr>
+          <w:b/>
+          <w:bCs/>
+        </w:rPr>
+        <w:t>ipconfig.exe | grep IPv4 | cut -d: -f2</w:t>
+      </w:r>
+      <w:r>
+        <w:t>”</w:t>
+      </w:r>
+    </w:p>
+    <w:p>
+      <w:pPr>
+        <w:pStyle w:val="ListParagraph"/>
+        <w:numPr>
+          <w:ilvl w:val="2"/>
+          <w:numId w:val="1"/>
+        </w:numPr>
+      </w:pPr>
+      <w:r>
+        <w:t>Accessing Linux from Windows</w:t>
+      </w:r>
+    </w:p>
+    <w:p>
+      <w:pPr>
+        <w:pStyle w:val="ListParagraph"/>
+        <w:numPr>
+          <w:ilvl w:val="3"/>
+          <w:numId w:val="1"/>
+        </w:numPr>
+      </w:pPr>
+      <w:r>
+        <w:t>Console</w:t>
+      </w:r>
+    </w:p>
+    <w:p>
+      <w:pPr>
+        <w:pStyle w:val="ListParagraph"/>
+        <w:numPr>
+          <w:ilvl w:val="4"/>
+          <w:numId w:val="1"/>
+        </w:numPr>
+      </w:pPr>
+      <w:r>
+        <w:t xml:space="preserve">Using PowerShell: </w:t>
+      </w:r>
+      <w:r>
+        <w:rPr>
+          <w:b/>
+          <w:bCs/>
+        </w:rPr>
+        <w:t xml:space="preserve">cd </w:t>
+      </w:r>
+      <w:hyperlink r:id="rId5" w:history="1">
+        <w:r>
+          <w:rPr>
+            <w:rStyle w:val="Hyperlink"/>
+            <w:b/>
+            <w:bCs/>
+          </w:rPr>
+          <w:t>\\wsl.localhost\Ubuntu\home</w:t>
+        </w:r>
+      </w:hyperlink>
+    </w:p>
+    <w:p>
+      <w:pPr>
+        <w:pStyle w:val="ListParagraph"/>
+        <w:numPr>
+          <w:ilvl w:val="4"/>
+          <w:numId w:val="1"/>
+        </w:numPr>
+        <w:rPr>
+          <w:b/>
+          <w:bCs/>
+        </w:rPr>
+      </w:pPr>
+      <w:proofErr w:type="gramStart"/>
+      <w:r>
+        <w:t>Also</w:t>
+      </w:r>
+      <w:proofErr w:type="gramEnd"/>
+      <w:r>
+        <w:t xml:space="preserve"> you can </w:t>
+      </w:r>
+      <w:r>
+        <w:t xml:space="preserve">net use </w:t>
+      </w:r>
+      <w:r>
+        <w:rPr>
+          <w:b/>
+          <w:bCs/>
+        </w:rPr>
+        <w:t>Z: \\wsl.localhost\Ubuntu</w:t>
+      </w:r>
+    </w:p>
+    <w:p>
+      <w:pPr>
+        <w:pStyle w:val="ListParagraph"/>
+        <w:numPr>
+          <w:ilvl w:val="3"/>
+          <w:numId w:val="1"/>
+        </w:numPr>
+      </w:pPr>
+      <w:r>
+        <w:t>Explorer</w:t>
+      </w:r>
+    </w:p>
+    <w:p>
+      <w:pPr>
+        <w:pStyle w:val="ListParagraph"/>
+        <w:numPr>
+          <w:ilvl w:val="3"/>
+          <w:numId w:val="1"/>
+        </w:numPr>
+      </w:pPr>
+      <w:r>
+        <w:t>Running directly from windows console:</w:t>
+      </w:r>
+    </w:p>
+    <w:p>
+      <w:pPr>
+        <w:pStyle w:val="ListParagraph"/>
+        <w:numPr>
+          <w:ilvl w:val="4"/>
+          <w:numId w:val="1"/>
+        </w:numPr>
+      </w:pPr>
+      <w:r>
+        <w:t>Example: “</w:t>
+      </w:r>
+      <w:proofErr w:type="spellStart"/>
+      <w:r>
+        <w:rPr>
+          <w:b/>
+          <w:bCs/>
+        </w:rPr>
+        <w:t>wsl</w:t>
+      </w:r>
+      <w:proofErr w:type="spellEnd"/>
+      <w:r>
+        <w:rPr>
+          <w:b/>
+          <w:bCs/>
+        </w:rPr>
+        <w:t xml:space="preserve"> ls -la</w:t>
+      </w:r>
+      <w:r>
+        <w:t>”</w:t>
+      </w:r>
+      <w:r>
+        <w:t xml:space="preserve"> will output </w:t>
+      </w:r>
+      <w:proofErr w:type="spellStart"/>
+      <w:r>
+        <w:t>Windos</w:t>
+      </w:r>
+      <w:proofErr w:type="spellEnd"/>
+      <w:r>
+        <w:t xml:space="preserve"> folder but using Linux ls</w:t>
+      </w:r>
+    </w:p>
+    <w:p>
+      <w:pPr>
+        <w:pStyle w:val="ListParagraph"/>
+        <w:numPr>
+          <w:ilvl w:val="4"/>
+          <w:numId w:val="1"/>
+        </w:numPr>
+      </w:pPr>
+      <w:r>
+        <w:t xml:space="preserve">Example: </w:t>
+      </w:r>
+      <w:proofErr w:type="spellStart"/>
+      <w:r>
+        <w:rPr>
+          <w:b/>
+          <w:bCs/>
+        </w:rPr>
+        <w:t>wsl</w:t>
+      </w:r>
+      <w:proofErr w:type="spellEnd"/>
+      <w:r>
+        <w:rPr>
+          <w:b/>
+          <w:bCs/>
+        </w:rPr>
+        <w:t xml:space="preserve"> ls -la | </w:t>
+      </w:r>
+      <w:proofErr w:type="spellStart"/>
+      <w:r>
+        <w:rPr>
+          <w:b/>
+          <w:bCs/>
+        </w:rPr>
+        <w:t>findstr</w:t>
+      </w:r>
+      <w:proofErr w:type="spellEnd"/>
+      <w:r>
+        <w:rPr>
+          <w:b/>
+          <w:bCs/>
+        </w:rPr>
+        <w:t xml:space="preserve"> "git"</w:t>
+      </w:r>
+    </w:p>
+    <w:p>
+      <w:r>
+        <w:tab/>
+      </w:r>
+      <w:r>
+        <w:tab/>
+      </w:r>
+    </w:p>
     <w:sectPr>
       <w:pgSz w:w="12240" w:h="15840"/>
       <w:pgMar w:top="1440" w:right="1440" w:bottom="1440" w:left="1440" w:header="720" w:footer="720" w:gutter="0"/>
@@ -447,7 +1487,7 @@
         <w:rFonts w:ascii="Wingdings" w:hAnsi="Wingdings" w:hint="default"/>
       </w:rPr>
     </w:lvl>
-    <w:lvl w:ilvl="2" w:tplc="04090005" w:tentative="1">
+    <w:lvl w:ilvl="2" w:tplc="04090005">
       <w:start w:val="1"/>
       <w:numFmt w:val="bullet"/>
       <w:lvlText w:val=""/>
@@ -459,7 +1499,7 @@
         <w:rFonts w:ascii="Wingdings" w:hAnsi="Wingdings" w:hint="default"/>
       </w:rPr>
     </w:lvl>
-    <w:lvl w:ilvl="3" w:tplc="04090001" w:tentative="1">
+    <w:lvl w:ilvl="3" w:tplc="04090001">
       <w:start w:val="1"/>
       <w:numFmt w:val="bullet"/>
       <w:lvlText w:val=""/>
@@ -471,7 +1511,7 @@
         <w:rFonts w:ascii="Symbol" w:hAnsi="Symbol" w:hint="default"/>
       </w:rPr>
     </w:lvl>
-    <w:lvl w:ilvl="4" w:tplc="04090003" w:tentative="1">
+    <w:lvl w:ilvl="4" w:tplc="04090003">
       <w:start w:val="1"/>
       <w:numFmt w:val="bullet"/>
       <w:lvlText w:val="o"/>
@@ -566,6 +1606,9 @@
     <w:abstractNumId w:val="0"/>
   </w:num>
   <w:num w:numId="12" w16cid:durableId="1704011092">
+    <w:abstractNumId w:val="0"/>
+  </w:num>
+  <w:num w:numId="13" w16cid:durableId="25956992">
     <w:abstractNumId w:val="0"/>
   </w:num>
 </w:numbering>
@@ -1225,7 +2268,6 @@
   <w:style w:type="character" w:default="1" w:styleId="DefaultParagraphFont">
     <w:name w:val="Default Paragraph Font"/>
     <w:uiPriority w:val="1"/>
-    <w:semiHidden/>
     <w:unhideWhenUsed/>
   </w:style>
   <w:style w:type="table" w:default="1" w:styleId="TableNormal">
@@ -1646,6 +2688,29 @@
     <w:pPr>
       <w:outlineLvl w:val="9"/>
     </w:pPr>
+  </w:style>
+  <w:style w:type="character" w:styleId="Hyperlink">
+    <w:name w:val="Hyperlink"/>
+    <w:basedOn w:val="DefaultParagraphFont"/>
+    <w:uiPriority w:val="99"/>
+    <w:unhideWhenUsed/>
+    <w:rsid w:val="0005304E"/>
+    <w:rPr>
+      <w:color w:val="6B9F25" w:themeColor="hyperlink"/>
+      <w:u w:val="single"/>
+    </w:rPr>
+  </w:style>
+  <w:style w:type="character" w:styleId="UnresolvedMention">
+    <w:name w:val="Unresolved Mention"/>
+    <w:basedOn w:val="DefaultParagraphFont"/>
+    <w:uiPriority w:val="99"/>
+    <w:semiHidden/>
+    <w:unhideWhenUsed/>
+    <w:rsid w:val="0005304E"/>
+    <w:rPr>
+      <w:color w:val="605E5C"/>
+      <w:shd w:val="clear" w:color="auto" w:fill="E1DFDD"/>
+    </w:rPr>
   </w:style>
 </w:styles>
 </file>

</xml_diff>

<commit_message>
Cookie cutter bootloader to test the build chain with nasm. Added also a sandbox to test the org directive.
</commit_message>
<xml_diff>
--- a/docs/TusMuertos-v2.0-Design.docx
+++ b/docs/TusMuertos-v2.0-Design.docx
@@ -448,15 +448,7 @@
         </w:numPr>
       </w:pPr>
       <w:r>
-        <w:t xml:space="preserve">Image, bin editor, concatenation, elf info, debug, tracer, </w:t>
-      </w:r>
-      <w:proofErr w:type="spellStart"/>
-      <w:r>
-        <w:t>etc</w:t>
-      </w:r>
-      <w:proofErr w:type="spellEnd"/>
-      <w:r>
-        <w:t>……</w:t>
+        <w:t>Image, bin editor, concatenation, elf info, debug, tracer, etc……</w:t>
       </w:r>
     </w:p>
     <w:p/>
@@ -526,15 +518,7 @@
         </w:numPr>
       </w:pPr>
       <w:r>
-        <w:t xml:space="preserve">2 Stages. Minimal first stage until Protected mode + Second stage to </w:t>
-      </w:r>
-      <w:proofErr w:type="gramStart"/>
-      <w:r>
-        <w:t>Long</w:t>
-      </w:r>
-      <w:proofErr w:type="gramEnd"/>
-      <w:r>
-        <w:t xml:space="preserve"> mode</w:t>
+        <w:t>2 Stages. Minimal first stage until Protected mode + Second stage to Long mode</w:t>
       </w:r>
     </w:p>
     <w:p>
@@ -750,15 +734,7 @@
         </w:numPr>
       </w:pPr>
       <w:r>
-        <w:t xml:space="preserve">Jump to Protected mode if Stage1 </w:t>
-      </w:r>
-      <w:proofErr w:type="gramStart"/>
-      <w:r>
-        <w:t>did</w:t>
-      </w:r>
-      <w:proofErr w:type="gramEnd"/>
-      <w:r>
-        <w:t xml:space="preserve"> not change mode.</w:t>
+        <w:t>Jump to Protected mode if Stage1 did not change mode.</w:t>
       </w:r>
     </w:p>
     <w:p>
@@ -770,23 +746,7 @@
         </w:numPr>
       </w:pPr>
       <w:r>
-        <w:t xml:space="preserve">Enable </w:t>
-      </w:r>
-      <w:proofErr w:type="gramStart"/>
-      <w:r>
-        <w:t>A20, or</w:t>
-      </w:r>
-      <w:proofErr w:type="gramEnd"/>
-      <w:r>
-        <w:t xml:space="preserve"> at least check. There are multiple strategies for this. Some platforms have fast </w:t>
-      </w:r>
-      <w:proofErr w:type="gramStart"/>
-      <w:r>
-        <w:t>enable</w:t>
-      </w:r>
-      <w:proofErr w:type="gramEnd"/>
-      <w:r>
-        <w:t xml:space="preserve"> 0x92, or they come with A20 already enable. XXXX</w:t>
+        <w:t>Enable A20, or at least check. There are multiple strategies for this. Some platforms have fast enable 0x92, or they come with A20 already enable. XXXX</w:t>
       </w:r>
     </w:p>
     <w:p>
@@ -810,15 +770,7 @@
         </w:numPr>
       </w:pPr>
       <w:r>
-        <w:t xml:space="preserve">Gather info for the kernel: Memory, graphics, bios, </w:t>
-      </w:r>
-      <w:proofErr w:type="spellStart"/>
-      <w:r>
-        <w:t>acpi</w:t>
-      </w:r>
-      <w:proofErr w:type="spellEnd"/>
-      <w:r>
-        <w:t>, others…</w:t>
+        <w:t>Gather info for the kernel: Memory, graphics, bios, acpi, others…</w:t>
       </w:r>
     </w:p>
     <w:p>
@@ -842,15 +794,7 @@
         </w:numPr>
       </w:pPr>
       <w:r>
-        <w:t xml:space="preserve">Flat binary: Explore this option, </w:t>
-      </w:r>
-      <w:proofErr w:type="gramStart"/>
-      <w:r>
-        <w:t>maybe</w:t>
-      </w:r>
-      <w:proofErr w:type="gramEnd"/>
-      <w:r>
-        <w:t xml:space="preserve"> is simpler</w:t>
+        <w:t>Flat binary: Explore this option, maybe is simpler</w:t>
       </w:r>
     </w:p>
     <w:p>
@@ -862,15 +806,7 @@
         </w:numPr>
       </w:pPr>
       <w:r>
-        <w:t xml:space="preserve">ELF: Parser + segments + </w:t>
-      </w:r>
-      <w:proofErr w:type="spellStart"/>
-      <w:r>
-        <w:t>etc</w:t>
-      </w:r>
-      <w:proofErr w:type="spellEnd"/>
-      <w:r>
-        <w:t>…</w:t>
+        <w:t>ELF: Parser + segments + etc…</w:t>
       </w:r>
     </w:p>
     <w:p>
@@ -906,15 +842,7 @@
         </w:numPr>
       </w:pPr>
       <w:r>
-        <w:t xml:space="preserve">Verify if long </w:t>
-      </w:r>
-      <w:proofErr w:type="gramStart"/>
-      <w:r>
-        <w:t>mode</w:t>
-      </w:r>
-      <w:proofErr w:type="gramEnd"/>
-      <w:r>
-        <w:t xml:space="preserve"> if possible, for completeness</w:t>
+        <w:t>Verify if long mode if possible, for completeness</w:t>
       </w:r>
     </w:p>
     <w:p>
@@ -1064,7 +992,6 @@
       <w:r>
         <w:t>Invoke explorer Windows using “</w:t>
       </w:r>
-      <w:proofErr w:type="gramStart"/>
       <w:r>
         <w:rPr>
           <w:b/>
@@ -1072,7 +999,6 @@
         </w:rPr>
         <w:t>explorer.exe .</w:t>
       </w:r>
-      <w:proofErr w:type="gramEnd"/>
       <w:r>
         <w:t>”</w:t>
       </w:r>
@@ -1097,23 +1023,7 @@
           <w:b/>
           <w:bCs/>
         </w:rPr>
-        <w:t>/</w:t>
-      </w:r>
-      <w:proofErr w:type="spellStart"/>
-      <w:r>
-        <w:rPr>
-          <w:b/>
-          <w:bCs/>
-        </w:rPr>
-        <w:t>mnt</w:t>
-      </w:r>
-      <w:proofErr w:type="spellEnd"/>
-      <w:r>
-        <w:rPr>
-          <w:b/>
-          <w:bCs/>
-        </w:rPr>
-        <w:t>/c/Program Files (x86)</w:t>
+        <w:t>/mnt/c/Program Files (x86)</w:t>
       </w:r>
     </w:p>
     <w:p>
@@ -1216,13 +1126,8 @@
           <w:bCs/>
         </w:rPr>
       </w:pPr>
-      <w:proofErr w:type="gramStart"/>
-      <w:r>
-        <w:t>Also</w:t>
-      </w:r>
-      <w:proofErr w:type="gramEnd"/>
-      <w:r>
-        <w:t xml:space="preserve"> you can </w:t>
+      <w:r>
+        <w:t xml:space="preserve">Also you can </w:t>
       </w:r>
       <w:r>
         <w:t xml:space="preserve">net use </w:t>
@@ -1270,35 +1175,18 @@
       <w:r>
         <w:t>Example: “</w:t>
       </w:r>
-      <w:proofErr w:type="spellStart"/>
-      <w:r>
-        <w:rPr>
-          <w:b/>
-          <w:bCs/>
-        </w:rPr>
-        <w:t>wsl</w:t>
-      </w:r>
-      <w:proofErr w:type="spellEnd"/>
-      <w:r>
-        <w:rPr>
-          <w:b/>
-          <w:bCs/>
-        </w:rPr>
-        <w:t xml:space="preserve"> ls -la</w:t>
+      <w:r>
+        <w:rPr>
+          <w:b/>
+          <w:bCs/>
+        </w:rPr>
+        <w:t>wsl ls -la</w:t>
       </w:r>
       <w:r>
         <w:t>”</w:t>
       </w:r>
       <w:r>
-        <w:t xml:space="preserve"> will output </w:t>
-      </w:r>
-      <w:proofErr w:type="spellStart"/>
-      <w:r>
-        <w:t>Windos</w:t>
-      </w:r>
-      <w:proofErr w:type="spellEnd"/>
-      <w:r>
-        <w:t xml:space="preserve"> folder but using Linux ls</w:t>
+        <w:t xml:space="preserve"> will output Windos folder but using Linux ls</w:t>
       </w:r>
     </w:p>
     <w:p>
@@ -1312,37 +1200,12 @@
       <w:r>
         <w:t xml:space="preserve">Example: </w:t>
       </w:r>
-      <w:proofErr w:type="spellStart"/>
-      <w:r>
-        <w:rPr>
-          <w:b/>
-          <w:bCs/>
-        </w:rPr>
-        <w:t>wsl</w:t>
-      </w:r>
-      <w:proofErr w:type="spellEnd"/>
-      <w:r>
-        <w:rPr>
-          <w:b/>
-          <w:bCs/>
-        </w:rPr>
-        <w:t xml:space="preserve"> ls -la | </w:t>
-      </w:r>
-      <w:proofErr w:type="spellStart"/>
-      <w:r>
-        <w:rPr>
-          <w:b/>
-          <w:bCs/>
-        </w:rPr>
-        <w:t>findstr</w:t>
-      </w:r>
-      <w:proofErr w:type="spellEnd"/>
-      <w:r>
-        <w:rPr>
-          <w:b/>
-          <w:bCs/>
-        </w:rPr>
-        <w:t xml:space="preserve"> "git"</w:t>
+      <w:r>
+        <w:rPr>
+          <w:b/>
+          <w:bCs/>
+        </w:rPr>
+        <w:t>wsl ls -la | findstr "git"</w:t>
       </w:r>
     </w:p>
     <w:p>
@@ -1351,6 +1214,244 @@
       </w:r>
       <w:r>
         <w:tab/>
+      </w:r>
+    </w:p>
+    <w:p/>
+    <w:p>
+      <w:r>
+        <w:t>Setup build:</w:t>
+      </w:r>
+    </w:p>
+    <w:p>
+      <w:pPr>
+        <w:pStyle w:val="ListParagraph"/>
+        <w:numPr>
+          <w:ilvl w:val="0"/>
+          <w:numId w:val="1"/>
+        </w:numPr>
+      </w:pPr>
+      <w:r>
+        <w:t xml:space="preserve">Install IMHEX hex editor. </w:t>
+      </w:r>
+      <w:hyperlink r:id="rId6" w:history="1">
+        <w:r>
+          <w:rPr>
+            <w:rStyle w:val="Hyperlink"/>
+          </w:rPr>
+          <w:t>https://imhex.werwolv.net/</w:t>
+        </w:r>
+      </w:hyperlink>
+      <w:r>
+        <w:t xml:space="preserve"> </w:t>
+      </w:r>
+    </w:p>
+    <w:p>
+      <w:pPr>
+        <w:pStyle w:val="ListParagraph"/>
+        <w:numPr>
+          <w:ilvl w:val="0"/>
+          <w:numId w:val="1"/>
+        </w:numPr>
+      </w:pPr>
+      <w:r>
+        <w:t xml:space="preserve">Install WSL, Ubuntu, v2. </w:t>
+      </w:r>
+    </w:p>
+    <w:p>
+      <w:pPr>
+        <w:pStyle w:val="ListParagraph"/>
+        <w:numPr>
+          <w:ilvl w:val="0"/>
+          <w:numId w:val="1"/>
+        </w:numPr>
+      </w:pPr>
+      <w:r>
+        <w:t>Update WSL:</w:t>
+      </w:r>
+    </w:p>
+    <w:p>
+      <w:pPr>
+        <w:pStyle w:val="ListParagraph"/>
+        <w:numPr>
+          <w:ilvl w:val="1"/>
+          <w:numId w:val="1"/>
+        </w:numPr>
+      </w:pPr>
+      <w:r>
+        <w:t>sudo apt update</w:t>
+      </w:r>
+    </w:p>
+    <w:p>
+      <w:pPr>
+        <w:pStyle w:val="ListParagraph"/>
+        <w:numPr>
+          <w:ilvl w:val="1"/>
+          <w:numId w:val="1"/>
+        </w:numPr>
+      </w:pPr>
+      <w:r>
+        <w:t>sudo apt upgrade -y</w:t>
+      </w:r>
+    </w:p>
+    <w:p>
+      <w:pPr>
+        <w:pStyle w:val="ListParagraph"/>
+        <w:numPr>
+          <w:ilvl w:val="1"/>
+          <w:numId w:val="1"/>
+        </w:numPr>
+      </w:pPr>
+      <w:r>
+        <w:t>sudo apt full-upgrade -y</w:t>
+      </w:r>
+    </w:p>
+    <w:p>
+      <w:pPr>
+        <w:pStyle w:val="ListParagraph"/>
+        <w:numPr>
+          <w:ilvl w:val="1"/>
+          <w:numId w:val="1"/>
+        </w:numPr>
+      </w:pPr>
+      <w:r>
+        <w:t>sudo apt autoremove -y</w:t>
+      </w:r>
+    </w:p>
+    <w:p>
+      <w:pPr>
+        <w:pStyle w:val="ListParagraph"/>
+        <w:numPr>
+          <w:ilvl w:val="0"/>
+          <w:numId w:val="1"/>
+        </w:numPr>
+      </w:pPr>
+      <w:r>
+        <w:t>Install NASM assembler</w:t>
+      </w:r>
+    </w:p>
+    <w:p>
+      <w:pPr>
+        <w:pStyle w:val="ListParagraph"/>
+        <w:numPr>
+          <w:ilvl w:val="1"/>
+          <w:numId w:val="1"/>
+        </w:numPr>
+      </w:pPr>
+      <w:r>
+        <w:t>sudo apt install nasm -y</w:t>
+      </w:r>
+    </w:p>
+    <w:p>
+      <w:pPr>
+        <w:pStyle w:val="ListParagraph"/>
+        <w:numPr>
+          <w:ilvl w:val="0"/>
+          <w:numId w:val="1"/>
+        </w:numPr>
+      </w:pPr>
+      <w:r>
+        <w:t>Create a temporary alias for cls = clear(investigate how to make it permanent)</w:t>
+      </w:r>
+    </w:p>
+    <w:p>
+      <w:pPr>
+        <w:pStyle w:val="ListParagraph"/>
+        <w:numPr>
+          <w:ilvl w:val="1"/>
+          <w:numId w:val="1"/>
+        </w:numPr>
+      </w:pPr>
+      <w:r>
+        <w:t>alias cls='clear'</w:t>
+      </w:r>
+    </w:p>
+    <w:p/>
+    <w:p>
+      <w:r>
+        <w:t>Common Linux and Windows commands</w:t>
+      </w:r>
+    </w:p>
+    <w:p/>
+    <w:p>
+      <w:r>
+        <w:t>Linux</w:t>
+      </w:r>
+    </w:p>
+    <w:p/>
+    <w:p>
+      <w:r>
+        <w:t>nasm -f bin src/bootloader/stage1.asm -o src/build/stage1.bin</w:t>
+      </w:r>
+    </w:p>
+    <w:p/>
+    <w:p/>
+    <w:p/>
+    <w:p>
+      <w:pPr>
+        <w:pStyle w:val="Heading1"/>
+      </w:pPr>
+      <w:r>
+        <w:t>Random nuggets of knowledge</w:t>
+      </w:r>
+    </w:p>
+    <w:p/>
+    <w:p>
+      <w:pPr>
+        <w:pStyle w:val="Heading2"/>
+      </w:pPr>
+      <w:r>
+        <w:lastRenderedPageBreak/>
+        <w:t>How Org directive works in NASM assembly</w:t>
+      </w:r>
+    </w:p>
+    <w:p>
+      <w:r>
+        <w:t>Example:</w:t>
+      </w:r>
+    </w:p>
+    <w:p>
+      <w:r>
+        <w:t>[org 0x7C00]</w:t>
+      </w:r>
+    </w:p>
+    <w:p>
+      <w:r>
+        <w:t>bits 16</w:t>
+      </w:r>
+    </w:p>
+    <w:p>
+      <w:r>
+        <w:t>start:</w:t>
+      </w:r>
+    </w:p>
+    <w:p>
+      <w:r>
+        <w:t xml:space="preserve">    mov ax, start      ; imm16 encodes the absolute offset of “start”</w:t>
+      </w:r>
+    </w:p>
+    <w:p/>
+    <w:p>
+      <w:pPr>
+        <w:pStyle w:val="ListParagraph"/>
+        <w:numPr>
+          <w:ilvl w:val="0"/>
+          <w:numId w:val="1"/>
+        </w:numPr>
+      </w:pPr>
+      <w:r>
+        <w:t>With org 0x7C00, this assembles as: B8 00 7C (AX ← 0x7C00)</w:t>
+      </w:r>
+    </w:p>
+    <w:p>
+      <w:pPr>
+        <w:pStyle w:val="ListParagraph"/>
+        <w:numPr>
+          <w:ilvl w:val="0"/>
+          <w:numId w:val="1"/>
+        </w:numPr>
+      </w:pPr>
+      <w:r>
+        <w:t>With org 0x0000, it assembles as: B8 00 00 (AX ← 0x0000)</w:t>
       </w:r>
     </w:p>
     <w:sectPr>
@@ -1609,6 +1710,9 @@
     <w:abstractNumId w:val="0"/>
   </w:num>
   <w:num w:numId="13" w16cid:durableId="25956992">
+    <w:abstractNumId w:val="0"/>
+  </w:num>
+  <w:num w:numId="14" w16cid:durableId="1536117323">
     <w:abstractNumId w:val="0"/>
   </w:num>
 </w:numbering>
@@ -2050,7 +2154,6 @@
     <w:next w:val="Normal"/>
     <w:link w:val="Heading2Char"/>
     <w:uiPriority w:val="9"/>
-    <w:semiHidden/>
     <w:unhideWhenUsed/>
     <w:qFormat/>
     <w:rsid w:val="00457DEC"/>
@@ -2312,7 +2415,6 @@
     <w:basedOn w:val="DefaultParagraphFont"/>
     <w:link w:val="Heading2"/>
     <w:uiPriority w:val="9"/>
-    <w:semiHidden/>
     <w:rsid w:val="00457DEC"/>
     <w:rPr>
       <w:rFonts w:asciiTheme="majorHAnsi" w:eastAsiaTheme="majorEastAsia" w:hAnsiTheme="majorHAnsi" w:cstheme="majorBidi"/>

</xml_diff>

<commit_message>
End of day 1. General Setup, small bootloader, NASM toolchain. Some documentation and design
</commit_message>
<xml_diff>
--- a/docs/TusMuertos-v2.0-Design.docx
+++ b/docs/TusMuertos-v2.0-Design.docx
@@ -16,27 +16,536 @@
         <w:t xml:space="preserve"> 2.0 design document</w:t>
       </w:r>
     </w:p>
+    <w:p>
+      <w:pPr>
+        <w:pStyle w:val="ListParagraph"/>
+        <w:numPr>
+          <w:ilvl w:val="0"/>
+          <w:numId w:val="1"/>
+        </w:numPr>
+      </w:pPr>
+      <w:r>
+        <w:rPr>
+          <w:b/>
+          <w:bCs/>
+        </w:rPr>
+        <w:t>Target architecture:</w:t>
+      </w:r>
+      <w:r>
+        <w:t xml:space="preserve"> </w:t>
+      </w:r>
+      <w:r>
+        <w:t>x86_64 (AMD64)</w:t>
+      </w:r>
+    </w:p>
+    <w:p>
+      <w:pPr>
+        <w:pStyle w:val="ListParagraph"/>
+        <w:numPr>
+          <w:ilvl w:val="0"/>
+          <w:numId w:val="1"/>
+        </w:numPr>
+      </w:pPr>
+      <w:r>
+        <w:rPr>
+          <w:b/>
+          <w:bCs/>
+        </w:rPr>
+        <w:t>Execution mode</w:t>
+      </w:r>
+      <w:r>
+        <w:t>:</w:t>
+      </w:r>
+      <w:r>
+        <w:t xml:space="preserve"> </w:t>
+      </w:r>
+      <w:r>
+        <w:t>Real mode (16 bits) &gt;&gt;&gt; Protected mode (32 Bits) &gt;&gt;&gt; Long mode (64 bits)</w:t>
+      </w:r>
+    </w:p>
+    <w:p>
+      <w:pPr>
+        <w:pStyle w:val="ListParagraph"/>
+        <w:numPr>
+          <w:ilvl w:val="0"/>
+          <w:numId w:val="1"/>
+        </w:numPr>
+      </w:pPr>
+      <w:r>
+        <w:rPr>
+          <w:b/>
+          <w:bCs/>
+        </w:rPr>
+        <w:t>Endianness:</w:t>
+      </w:r>
+      <w:r>
+        <w:t xml:space="preserve"> Little-endian</w:t>
+      </w:r>
+    </w:p>
+    <w:p>
+      <w:pPr>
+        <w:pStyle w:val="ListParagraph"/>
+        <w:numPr>
+          <w:ilvl w:val="0"/>
+          <w:numId w:val="1"/>
+        </w:numPr>
+      </w:pPr>
+      <w:r>
+        <w:rPr>
+          <w:b/>
+          <w:bCs/>
+        </w:rPr>
+        <w:t>Word size:</w:t>
+      </w:r>
+      <w:r>
+        <w:t xml:space="preserve"> 64bits</w:t>
+      </w:r>
+    </w:p>
+    <w:p>
+      <w:pPr>
+        <w:pStyle w:val="ListParagraph"/>
+        <w:numPr>
+          <w:ilvl w:val="0"/>
+          <w:numId w:val="1"/>
+        </w:numPr>
+      </w:pPr>
+      <w:r>
+        <w:rPr>
+          <w:b/>
+          <w:bCs/>
+        </w:rPr>
+        <w:t>Boot platform:</w:t>
+      </w:r>
+      <w:r>
+        <w:t xml:space="preserve"> BIOS or UEFI</w:t>
+      </w:r>
+      <w:r>
+        <w:t>. Probably BIOS for Bochs compatibility.</w:t>
+      </w:r>
+    </w:p>
+    <w:p>
+      <w:pPr>
+        <w:pStyle w:val="ListParagraph"/>
+        <w:numPr>
+          <w:ilvl w:val="0"/>
+          <w:numId w:val="1"/>
+        </w:numPr>
+      </w:pPr>
+      <w:r>
+        <w:rPr>
+          <w:b/>
+          <w:bCs/>
+        </w:rPr>
+        <w:t>Bootloader:</w:t>
+      </w:r>
+      <w:r>
+        <w:t xml:space="preserve"> Custom bootloader</w:t>
+      </w:r>
+    </w:p>
+    <w:p>
+      <w:pPr>
+        <w:pStyle w:val="ListParagraph"/>
+        <w:numPr>
+          <w:ilvl w:val="0"/>
+          <w:numId w:val="1"/>
+        </w:numPr>
+      </w:pPr>
+      <w:r>
+        <w:rPr>
+          <w:b/>
+          <w:bCs/>
+        </w:rPr>
+        <w:t>Kernel type:</w:t>
+      </w:r>
+      <w:r>
+        <w:t xml:space="preserve"> Monolithic </w:t>
+      </w:r>
+    </w:p>
+    <w:p>
+      <w:pPr>
+        <w:pStyle w:val="ListParagraph"/>
+        <w:numPr>
+          <w:ilvl w:val="0"/>
+          <w:numId w:val="1"/>
+        </w:numPr>
+      </w:pPr>
+      <w:r>
+        <w:rPr>
+          <w:b/>
+          <w:bCs/>
+        </w:rPr>
+        <w:t>Build system:</w:t>
+      </w:r>
+      <w:r>
+        <w:t xml:space="preserve"> make or modern alternative </w:t>
+      </w:r>
+    </w:p>
+    <w:p>
+      <w:pPr>
+        <w:pStyle w:val="ListParagraph"/>
+        <w:numPr>
+          <w:ilvl w:val="0"/>
+          <w:numId w:val="1"/>
+        </w:numPr>
+      </w:pPr>
+      <w:r>
+        <w:rPr>
+          <w:b/>
+          <w:bCs/>
+        </w:rPr>
+        <w:t>Language:</w:t>
+      </w:r>
+      <w:r>
+        <w:t xml:space="preserve"> c for simplicity, Rust</w:t>
+      </w:r>
+      <w:r>
+        <w:t>/Zig</w:t>
+      </w:r>
+      <w:r>
+        <w:t xml:space="preserve"> for challenge. NASM assembly for bootloader</w:t>
+      </w:r>
+      <w:r>
+        <w:t xml:space="preserve">. </w:t>
+      </w:r>
+    </w:p>
+    <w:p>
+      <w:pPr>
+        <w:pStyle w:val="ListParagraph"/>
+        <w:numPr>
+          <w:ilvl w:val="0"/>
+          <w:numId w:val="1"/>
+        </w:numPr>
+      </w:pPr>
+      <w:r>
+        <w:rPr>
+          <w:b/>
+          <w:bCs/>
+        </w:rPr>
+        <w:t>Assembly syntax:</w:t>
+      </w:r>
+      <w:r>
+        <w:t xml:space="preserve"> Intel syntax</w:t>
+      </w:r>
+    </w:p>
+    <w:p>
+      <w:pPr>
+        <w:pStyle w:val="ListParagraph"/>
+        <w:numPr>
+          <w:ilvl w:val="0"/>
+          <w:numId w:val="1"/>
+        </w:numPr>
+      </w:pPr>
+      <w:r>
+        <w:rPr>
+          <w:b/>
+          <w:bCs/>
+        </w:rPr>
+        <w:t>Toolchain:</w:t>
+      </w:r>
+      <w:r>
+        <w:t xml:space="preserve"> GCC cross-compiler or rust freestanding.</w:t>
+      </w:r>
+      <w:r>
+        <w:t xml:space="preserve"> NASM for assembly.</w:t>
+      </w:r>
+    </w:p>
+    <w:p>
+      <w:pPr>
+        <w:pStyle w:val="ListParagraph"/>
+        <w:numPr>
+          <w:ilvl w:val="0"/>
+          <w:numId w:val="1"/>
+        </w:numPr>
+      </w:pPr>
+      <w:r>
+        <w:rPr>
+          <w:b/>
+          <w:bCs/>
+        </w:rPr>
+        <w:t>Target</w:t>
+      </w:r>
+      <w:r>
+        <w:rPr>
+          <w:b/>
+          <w:bCs/>
+        </w:rPr>
+        <w:t>-triplet:</w:t>
+      </w:r>
+      <w:r>
+        <w:t xml:space="preserve"> </w:t>
+      </w:r>
+      <w:r>
+        <w:t>x86_64-unknown-tusmuert</w:t>
+      </w:r>
+      <w:r>
+        <w:t>os</w:t>
+      </w:r>
+    </w:p>
+    <w:p>
+      <w:pPr>
+        <w:pStyle w:val="ListParagraph"/>
+        <w:numPr>
+          <w:ilvl w:val="0"/>
+          <w:numId w:val="1"/>
+        </w:numPr>
+      </w:pPr>
+      <w:r>
+        <w:rPr>
+          <w:b/>
+          <w:bCs/>
+        </w:rPr>
+        <w:t>Target platform:</w:t>
+      </w:r>
+      <w:r>
+        <w:t xml:space="preserve"> BOCHS &gt;&gt; QEMU &gt;&gt; HYPER-V &gt;&gt; rest of hypervisors</w:t>
+      </w:r>
+    </w:p>
+    <w:p>
+      <w:pPr>
+        <w:pStyle w:val="ListParagraph"/>
+        <w:numPr>
+          <w:ilvl w:val="0"/>
+          <w:numId w:val="1"/>
+        </w:numPr>
+      </w:pPr>
+      <w:r>
+        <w:rPr>
+          <w:b/>
+          <w:bCs/>
+        </w:rPr>
+        <w:t>Calling convention on bootloader</w:t>
+      </w:r>
+    </w:p>
+    <w:p>
+      <w:pPr>
+        <w:pStyle w:val="ListParagraph"/>
+        <w:numPr>
+          <w:ilvl w:val="0"/>
+          <w:numId w:val="1"/>
+        </w:numPr>
+      </w:pPr>
+      <w:r>
+        <w:rPr>
+          <w:b/>
+          <w:bCs/>
+        </w:rPr>
+        <w:t>Calling convention on Kernel</w:t>
+      </w:r>
+    </w:p>
+    <w:p>
+      <w:pPr>
+        <w:pStyle w:val="ListParagraph"/>
+        <w:numPr>
+          <w:ilvl w:val="0"/>
+          <w:numId w:val="1"/>
+        </w:numPr>
+      </w:pPr>
+      <w:r>
+        <w:rPr>
+          <w:b/>
+          <w:bCs/>
+        </w:rPr>
+        <w:t>Other tools:</w:t>
+      </w:r>
+    </w:p>
+    <w:p>
+      <w:pPr>
+        <w:pStyle w:val="ListParagraph"/>
+        <w:numPr>
+          <w:ilvl w:val="1"/>
+          <w:numId w:val="1"/>
+        </w:numPr>
+      </w:pPr>
+      <w:r>
+        <w:rPr>
+          <w:b/>
+          <w:bCs/>
+        </w:rPr>
+        <w:t>Hex editor:</w:t>
+      </w:r>
+      <w:r>
+        <w:t xml:space="preserve"> HIMEX</w:t>
+      </w:r>
+    </w:p>
+    <w:p>
+      <w:pPr>
+        <w:pStyle w:val="ListParagraph"/>
+        <w:numPr>
+          <w:ilvl w:val="1"/>
+          <w:numId w:val="1"/>
+        </w:numPr>
+      </w:pPr>
+      <w:r>
+        <w:rPr>
+          <w:b/>
+          <w:bCs/>
+        </w:rPr>
+        <w:t>Text editor:</w:t>
+      </w:r>
+      <w:r>
+        <w:t xml:space="preserve"> Notepad++, Visual Studio Code</w:t>
+      </w:r>
+    </w:p>
+    <w:p>
+      <w:pPr>
+        <w:pStyle w:val="ListParagraph"/>
+        <w:numPr>
+          <w:ilvl w:val="1"/>
+          <w:numId w:val="1"/>
+        </w:numPr>
+      </w:pPr>
+      <w:r>
+        <w:rPr>
+          <w:b/>
+          <w:bCs/>
+        </w:rPr>
+        <w:t>IDE Assembly:</w:t>
+      </w:r>
+      <w:r>
+        <w:t xml:space="preserve"> Visual Studio Code</w:t>
+      </w:r>
+    </w:p>
+    <w:p>
+      <w:pPr>
+        <w:pStyle w:val="ListParagraph"/>
+        <w:numPr>
+          <w:ilvl w:val="1"/>
+          <w:numId w:val="1"/>
+        </w:numPr>
+      </w:pPr>
+      <w:r>
+        <w:rPr>
+          <w:b/>
+          <w:bCs/>
+        </w:rPr>
+        <w:t xml:space="preserve">IDE </w:t>
+      </w:r>
+      <w:r>
+        <w:rPr>
+          <w:b/>
+          <w:bCs/>
+        </w:rPr>
+        <w:t>C</w:t>
+      </w:r>
+      <w:r>
+        <w:rPr>
+          <w:b/>
+          <w:bCs/>
+        </w:rPr>
+        <w:t xml:space="preserve"> or Rust:</w:t>
+      </w:r>
+      <w:r>
+        <w:t xml:space="preserve"> Visual Studio Code or Visual Studio 2022</w:t>
+      </w:r>
+    </w:p>
+    <w:p>
+      <w:pPr>
+        <w:pStyle w:val="ListParagraph"/>
+        <w:numPr>
+          <w:ilvl w:val="1"/>
+          <w:numId w:val="1"/>
+        </w:numPr>
+      </w:pPr>
+      <w:r>
+        <w:t xml:space="preserve">Image, bin editor, concatenation, elf info, debug, tracer, </w:t>
+      </w:r>
+      <w:proofErr w:type="spellStart"/>
+      <w:r>
+        <w:t>etc</w:t>
+      </w:r>
+      <w:proofErr w:type="spellEnd"/>
+      <w:r>
+        <w:t>……</w:t>
+      </w:r>
+    </w:p>
     <w:p/>
     <w:p>
       <w:pPr>
+        <w:pStyle w:val="Heading1"/>
+      </w:pPr>
+      <w:r>
+        <w:t>Bootloader</w:t>
+      </w:r>
+    </w:p>
+    <w:p>
+      <w:r>
+        <w:t xml:space="preserve">   </w:t>
+      </w:r>
+    </w:p>
+    <w:p>
+      <w:pPr>
         <w:pStyle w:val="ListParagraph"/>
         <w:numPr>
           <w:ilvl w:val="0"/>
           <w:numId w:val="1"/>
         </w:numPr>
-      </w:pPr>
-      <w:r>
-        <w:rPr>
-          <w:b/>
-          <w:bCs/>
-        </w:rPr>
-        <w:t>Target architecture:</w:t>
-      </w:r>
-      <w:r>
-        <w:t xml:space="preserve"> </w:t>
-      </w:r>
-      <w:r>
-        <w:t>x86_64 (AMD64)</w:t>
+        <w:rPr>
+          <w:b/>
+          <w:bCs/>
+        </w:rPr>
+      </w:pPr>
+      <w:r>
+        <w:rPr>
+          <w:b/>
+          <w:bCs/>
+        </w:rPr>
+        <w:t>General:</w:t>
+      </w:r>
+    </w:p>
+    <w:p>
+      <w:pPr>
+        <w:pStyle w:val="ListParagraph"/>
+        <w:numPr>
+          <w:ilvl w:val="1"/>
+          <w:numId w:val="1"/>
+        </w:numPr>
+      </w:pPr>
+      <w:r>
+        <w:t>Language: NASM Assembly</w:t>
+      </w:r>
+    </w:p>
+    <w:p>
+      <w:pPr>
+        <w:pStyle w:val="ListParagraph"/>
+        <w:numPr>
+          <w:ilvl w:val="1"/>
+          <w:numId w:val="1"/>
+        </w:numPr>
+      </w:pPr>
+      <w:r>
+        <w:t>Toolchain: NASM (Linux or windows, preferably Linux on WSL)</w:t>
+      </w:r>
+    </w:p>
+    <w:p>
+      <w:pPr>
+        <w:pStyle w:val="ListParagraph"/>
+        <w:numPr>
+          <w:ilvl w:val="1"/>
+          <w:numId w:val="1"/>
+        </w:numPr>
+      </w:pPr>
+      <w:r>
+        <w:t xml:space="preserve">2 Stages. Minimal first stage until Protected mode + Second stage to </w:t>
+      </w:r>
+      <w:proofErr w:type="gramStart"/>
+      <w:r>
+        <w:t>Long</w:t>
+      </w:r>
+      <w:proofErr w:type="gramEnd"/>
+      <w:r>
+        <w:t xml:space="preserve"> mode</w:t>
+      </w:r>
+    </w:p>
+    <w:p>
+      <w:pPr>
+        <w:pStyle w:val="ListParagraph"/>
+        <w:numPr>
+          <w:ilvl w:val="2"/>
+          <w:numId w:val="1"/>
+        </w:numPr>
+      </w:pPr>
+      <w:r>
+        <w:t>Stage1: 16 bits to 32 bits Real to Protected. NASM on 16 bits, only code on 32 bits is the jump to the second stage.</w:t>
       </w:r>
     </w:p>
     <w:p>
@@ -46,307 +555,401 @@
           <w:ilvl w:val="0"/>
           <w:numId w:val="1"/>
         </w:numPr>
-      </w:pPr>
-      <w:r>
-        <w:rPr>
-          <w:b/>
-          <w:bCs/>
-        </w:rPr>
-        <w:t>Execution mode</w:t>
+        <w:rPr>
+          <w:b/>
+          <w:bCs/>
+        </w:rPr>
+      </w:pPr>
+      <w:r>
+        <w:rPr>
+          <w:b/>
+          <w:bCs/>
+        </w:rPr>
+        <w:t>Functionality:</w:t>
+      </w:r>
+    </w:p>
+    <w:p>
+      <w:pPr>
+        <w:pStyle w:val="ListParagraph"/>
+        <w:numPr>
+          <w:ilvl w:val="1"/>
+          <w:numId w:val="1"/>
+        </w:numPr>
+        <w:rPr>
+          <w:b/>
+          <w:bCs/>
+        </w:rPr>
+      </w:pPr>
+      <w:r>
+        <w:rPr>
+          <w:b/>
+          <w:bCs/>
+        </w:rPr>
+        <w:t>Stage1:</w:t>
+      </w:r>
+    </w:p>
+    <w:p>
+      <w:pPr>
+        <w:pStyle w:val="ListParagraph"/>
+        <w:numPr>
+          <w:ilvl w:val="2"/>
+          <w:numId w:val="1"/>
+        </w:numPr>
+      </w:pPr>
+      <w:r>
+        <w:t>BIOS loads at 0x7C00 (0x07C0 x 0x0000)</w:t>
+      </w:r>
+    </w:p>
+    <w:p>
+      <w:pPr>
+        <w:pStyle w:val="ListParagraph"/>
+        <w:numPr>
+          <w:ilvl w:val="2"/>
+          <w:numId w:val="1"/>
+        </w:numPr>
+      </w:pPr>
+      <w:r>
+        <w:t>Verify 0x55AA signature</w:t>
+      </w:r>
+      <w:r>
+        <w:t xml:space="preserve"> (0101 0101 1010 1010)</w:t>
+      </w:r>
+    </w:p>
+    <w:p>
+      <w:pPr>
+        <w:pStyle w:val="ListParagraph"/>
+        <w:numPr>
+          <w:ilvl w:val="2"/>
+          <w:numId w:val="1"/>
+        </w:numPr>
+      </w:pPr>
+      <w:r>
+        <w:t>CPU registers and flags initialization</w:t>
+      </w:r>
+    </w:p>
+    <w:p>
+      <w:pPr>
+        <w:pStyle w:val="ListParagraph"/>
+        <w:numPr>
+          <w:ilvl w:val="2"/>
+          <w:numId w:val="1"/>
+        </w:numPr>
+      </w:pPr>
+      <w:r>
+        <w:t>Set a temporary stack</w:t>
+      </w:r>
+      <w:r>
+        <w:t>. Probably 0x7C00 downwards.</w:t>
+      </w:r>
+    </w:p>
+    <w:p>
+      <w:pPr>
+        <w:pStyle w:val="ListParagraph"/>
+        <w:numPr>
+          <w:ilvl w:val="2"/>
+          <w:numId w:val="1"/>
+        </w:numPr>
+      </w:pPr>
+      <w:r>
+        <w:t>Print early status</w:t>
+      </w:r>
+    </w:p>
+    <w:p>
+      <w:pPr>
+        <w:pStyle w:val="ListParagraph"/>
+        <w:numPr>
+          <w:ilvl w:val="2"/>
+          <w:numId w:val="1"/>
+        </w:numPr>
+      </w:pPr>
+      <w:r>
+        <w:t xml:space="preserve">Detect storage </w:t>
+      </w:r>
+      <w:r>
+        <w:t>drives. Probably only one at the beginning.</w:t>
+      </w:r>
+    </w:p>
+    <w:p>
+      <w:pPr>
+        <w:pStyle w:val="ListParagraph"/>
+        <w:numPr>
+          <w:ilvl w:val="2"/>
+          <w:numId w:val="1"/>
+        </w:numPr>
+      </w:pPr>
+      <w:r>
+        <w:t>Storage fixed LBA or simple Fat12/26/32????</w:t>
+      </w:r>
+    </w:p>
+    <w:p>
+      <w:pPr>
+        <w:pStyle w:val="ListParagraph"/>
+        <w:numPr>
+          <w:ilvl w:val="2"/>
+          <w:numId w:val="1"/>
+        </w:numPr>
+      </w:pPr>
+      <w:r>
+        <w:t>Jump to Protected mode</w:t>
+      </w:r>
+      <w:r>
+        <w:t>. Maybe change this to the second stage?</w:t>
+      </w:r>
+    </w:p>
+    <w:p>
+      <w:pPr>
+        <w:pStyle w:val="ListParagraph"/>
+        <w:numPr>
+          <w:ilvl w:val="2"/>
+          <w:numId w:val="1"/>
+        </w:numPr>
+      </w:pPr>
+      <w:r>
+        <w:t>Load stage 2. Target memory TBD</w:t>
+      </w:r>
+    </w:p>
+    <w:p>
+      <w:pPr>
+        <w:pStyle w:val="ListParagraph"/>
+        <w:numPr>
+          <w:ilvl w:val="2"/>
+          <w:numId w:val="1"/>
+        </w:numPr>
+      </w:pPr>
+      <w:r>
+        <w:t>Jump to Stage 2</w:t>
+      </w:r>
+    </w:p>
+    <w:p>
+      <w:pPr>
+        <w:pStyle w:val="ListParagraph"/>
+        <w:numPr>
+          <w:ilvl w:val="1"/>
+          <w:numId w:val="1"/>
+        </w:numPr>
+      </w:pPr>
+      <w:r>
+        <w:rPr>
+          <w:b/>
+          <w:bCs/>
+        </w:rPr>
+        <w:lastRenderedPageBreak/>
+        <w:t>Stage2</w:t>
       </w:r>
       <w:r>
         <w:t>:</w:t>
       </w:r>
-      <w:r>
-        <w:t xml:space="preserve"> </w:t>
-      </w:r>
-      <w:r>
-        <w:t>Real mode (16 bits) &gt;&gt;&gt; Protected mode (32 Bits) &gt;&gt;&gt; Long mode (64 bits)</w:t>
-      </w:r>
-    </w:p>
-    <w:p>
-      <w:pPr>
-        <w:pStyle w:val="ListParagraph"/>
-        <w:numPr>
-          <w:ilvl w:val="0"/>
-          <w:numId w:val="1"/>
-        </w:numPr>
-      </w:pPr>
-      <w:r>
-        <w:rPr>
-          <w:b/>
-          <w:bCs/>
-        </w:rPr>
-        <w:t>Endianness:</w:t>
-      </w:r>
-      <w:r>
-        <w:t xml:space="preserve"> Little-endian</w:t>
-      </w:r>
-    </w:p>
-    <w:p>
-      <w:pPr>
-        <w:pStyle w:val="ListParagraph"/>
-        <w:numPr>
-          <w:ilvl w:val="0"/>
-          <w:numId w:val="1"/>
-        </w:numPr>
-      </w:pPr>
-      <w:r>
-        <w:rPr>
-          <w:b/>
-          <w:bCs/>
-        </w:rPr>
-        <w:t>Word size:</w:t>
-      </w:r>
-      <w:r>
-        <w:t xml:space="preserve"> 64bits</w:t>
-      </w:r>
-    </w:p>
-    <w:p>
-      <w:pPr>
-        <w:pStyle w:val="ListParagraph"/>
-        <w:numPr>
-          <w:ilvl w:val="0"/>
-          <w:numId w:val="1"/>
-        </w:numPr>
-      </w:pPr>
-      <w:r>
-        <w:rPr>
-          <w:b/>
-          <w:bCs/>
-        </w:rPr>
-        <w:t>Boot platform:</w:t>
-      </w:r>
-      <w:r>
-        <w:t xml:space="preserve"> BIOS or UEFI</w:t>
-      </w:r>
-      <w:r>
-        <w:t>. Probably BIOS for Bochs compatibility.</w:t>
-      </w:r>
-    </w:p>
-    <w:p>
-      <w:pPr>
-        <w:pStyle w:val="ListParagraph"/>
-        <w:numPr>
-          <w:ilvl w:val="0"/>
-          <w:numId w:val="1"/>
-        </w:numPr>
-      </w:pPr>
-      <w:r>
-        <w:rPr>
-          <w:b/>
-          <w:bCs/>
-        </w:rPr>
-        <w:t>Bootloader:</w:t>
-      </w:r>
-      <w:r>
-        <w:t xml:space="preserve"> Custom bootloader</w:t>
-      </w:r>
-    </w:p>
-    <w:p>
-      <w:pPr>
-        <w:pStyle w:val="ListParagraph"/>
-        <w:numPr>
-          <w:ilvl w:val="0"/>
-          <w:numId w:val="1"/>
-        </w:numPr>
-      </w:pPr>
-      <w:r>
-        <w:rPr>
-          <w:b/>
-          <w:bCs/>
-        </w:rPr>
-        <w:t>Kernel type:</w:t>
-      </w:r>
-      <w:r>
-        <w:t xml:space="preserve"> Monolithic </w:t>
-      </w:r>
-    </w:p>
-    <w:p>
-      <w:pPr>
-        <w:pStyle w:val="ListParagraph"/>
-        <w:numPr>
-          <w:ilvl w:val="0"/>
-          <w:numId w:val="1"/>
-        </w:numPr>
-      </w:pPr>
-      <w:r>
-        <w:rPr>
-          <w:b/>
-          <w:bCs/>
-        </w:rPr>
-        <w:t>Build system:</w:t>
-      </w:r>
-      <w:r>
-        <w:t xml:space="preserve"> make or modern alternative </w:t>
-      </w:r>
-    </w:p>
-    <w:p>
-      <w:pPr>
-        <w:pStyle w:val="ListParagraph"/>
-        <w:numPr>
-          <w:ilvl w:val="0"/>
-          <w:numId w:val="1"/>
-        </w:numPr>
-      </w:pPr>
-      <w:r>
-        <w:rPr>
-          <w:b/>
-          <w:bCs/>
-        </w:rPr>
-        <w:t>Language:</w:t>
-      </w:r>
-      <w:r>
-        <w:t xml:space="preserve"> c for simplicity, Rust</w:t>
-      </w:r>
-      <w:r>
-        <w:t>/Zig</w:t>
-      </w:r>
-      <w:r>
-        <w:t xml:space="preserve"> for challenge. NASM assembly for bootloader</w:t>
-      </w:r>
-      <w:r>
-        <w:t xml:space="preserve">. </w:t>
-      </w:r>
-    </w:p>
-    <w:p>
-      <w:pPr>
-        <w:pStyle w:val="ListParagraph"/>
-        <w:numPr>
-          <w:ilvl w:val="0"/>
-          <w:numId w:val="1"/>
-        </w:numPr>
-      </w:pPr>
-      <w:r>
-        <w:rPr>
-          <w:b/>
-          <w:bCs/>
-        </w:rPr>
-        <w:t>Assembly syntax:</w:t>
-      </w:r>
-      <w:r>
-        <w:t xml:space="preserve"> Intel syntax</w:t>
-      </w:r>
-    </w:p>
-    <w:p>
-      <w:pPr>
-        <w:pStyle w:val="ListParagraph"/>
-        <w:numPr>
-          <w:ilvl w:val="0"/>
-          <w:numId w:val="1"/>
-        </w:numPr>
-      </w:pPr>
-      <w:r>
-        <w:rPr>
-          <w:b/>
-          <w:bCs/>
-        </w:rPr>
-        <w:t>Toolchain:</w:t>
-      </w:r>
-      <w:r>
-        <w:t xml:space="preserve"> GCC cross-compiler or rust freestanding.</w:t>
-      </w:r>
-      <w:r>
-        <w:t xml:space="preserve"> NASM for assembly.</w:t>
-      </w:r>
-    </w:p>
-    <w:p>
-      <w:pPr>
-        <w:pStyle w:val="ListParagraph"/>
-        <w:numPr>
-          <w:ilvl w:val="0"/>
-          <w:numId w:val="1"/>
-        </w:numPr>
-      </w:pPr>
-      <w:r>
-        <w:rPr>
-          <w:b/>
-          <w:bCs/>
-        </w:rPr>
-        <w:t>Target</w:t>
-      </w:r>
-      <w:r>
-        <w:rPr>
-          <w:b/>
-          <w:bCs/>
-        </w:rPr>
-        <w:t>-triplet:</w:t>
-      </w:r>
-      <w:r>
-        <w:t xml:space="preserve"> </w:t>
-      </w:r>
-      <w:r>
-        <w:t>x86_64-unknown-tusmuert</w:t>
-      </w:r>
-      <w:r>
-        <w:t>os</w:t>
-      </w:r>
-    </w:p>
-    <w:p>
-      <w:pPr>
-        <w:pStyle w:val="ListParagraph"/>
-        <w:numPr>
-          <w:ilvl w:val="0"/>
-          <w:numId w:val="1"/>
-        </w:numPr>
-      </w:pPr>
-      <w:r>
-        <w:rPr>
-          <w:b/>
-          <w:bCs/>
-        </w:rPr>
-        <w:t>Target platform:</w:t>
-      </w:r>
-      <w:r>
-        <w:t xml:space="preserve"> BOCHS &gt;&gt; QEMU &gt;&gt; HYPER-V &gt;&gt; rest of hypervisors</w:t>
-      </w:r>
-    </w:p>
-    <w:p>
-      <w:pPr>
-        <w:pStyle w:val="ListParagraph"/>
-        <w:numPr>
-          <w:ilvl w:val="0"/>
-          <w:numId w:val="1"/>
-        </w:numPr>
-      </w:pPr>
-      <w:r>
-        <w:rPr>
-          <w:b/>
-          <w:bCs/>
-        </w:rPr>
-        <w:t>Calling convention on bootloader</w:t>
-      </w:r>
-    </w:p>
-    <w:p>
-      <w:pPr>
-        <w:pStyle w:val="ListParagraph"/>
-        <w:numPr>
-          <w:ilvl w:val="0"/>
-          <w:numId w:val="1"/>
-        </w:numPr>
-      </w:pPr>
-      <w:r>
-        <w:rPr>
-          <w:b/>
-          <w:bCs/>
-        </w:rPr>
-        <w:t>Calling convention on Kernel</w:t>
-      </w:r>
-    </w:p>
-    <w:p>
-      <w:pPr>
-        <w:pStyle w:val="ListParagraph"/>
-        <w:numPr>
-          <w:ilvl w:val="0"/>
-          <w:numId w:val="1"/>
-        </w:numPr>
-      </w:pPr>
-      <w:r>
-        <w:rPr>
-          <w:b/>
-          <w:bCs/>
-        </w:rPr>
-        <w:t>Other tools:</w:t>
+    </w:p>
+    <w:p>
+      <w:pPr>
+        <w:pStyle w:val="ListParagraph"/>
+        <w:numPr>
+          <w:ilvl w:val="2"/>
+          <w:numId w:val="1"/>
+        </w:numPr>
+      </w:pPr>
+      <w:r>
+        <w:t xml:space="preserve">Jump to Protected mode if Stage1 </w:t>
+      </w:r>
+      <w:proofErr w:type="gramStart"/>
+      <w:r>
+        <w:t>did</w:t>
+      </w:r>
+      <w:proofErr w:type="gramEnd"/>
+      <w:r>
+        <w:t xml:space="preserve"> not change mode.</w:t>
+      </w:r>
+    </w:p>
+    <w:p>
+      <w:pPr>
+        <w:pStyle w:val="ListParagraph"/>
+        <w:numPr>
+          <w:ilvl w:val="2"/>
+          <w:numId w:val="1"/>
+        </w:numPr>
+      </w:pPr>
+      <w:r>
+        <w:t xml:space="preserve">Enable </w:t>
+      </w:r>
+      <w:proofErr w:type="gramStart"/>
+      <w:r>
+        <w:t>A20, or</w:t>
+      </w:r>
+      <w:proofErr w:type="gramEnd"/>
+      <w:r>
+        <w:t xml:space="preserve"> at least check. There are multiple strategies for this. Some platforms have fast </w:t>
+      </w:r>
+      <w:proofErr w:type="gramStart"/>
+      <w:r>
+        <w:t>enable</w:t>
+      </w:r>
+      <w:proofErr w:type="gramEnd"/>
+      <w:r>
+        <w:t xml:space="preserve"> 0x92, or they come with A20 already enable. XXXX</w:t>
+      </w:r>
+    </w:p>
+    <w:p>
+      <w:pPr>
+        <w:pStyle w:val="ListParagraph"/>
+        <w:numPr>
+          <w:ilvl w:val="2"/>
+          <w:numId w:val="1"/>
+        </w:numPr>
+      </w:pPr>
+      <w:r>
+        <w:t>Create console helpers for printing and stuff.</w:t>
+      </w:r>
+    </w:p>
+    <w:p>
+      <w:pPr>
+        <w:pStyle w:val="ListParagraph"/>
+        <w:numPr>
+          <w:ilvl w:val="2"/>
+          <w:numId w:val="1"/>
+        </w:numPr>
+      </w:pPr>
+      <w:r>
+        <w:t xml:space="preserve">Gather info for the kernel: Memory, graphics, bios, </w:t>
+      </w:r>
+      <w:proofErr w:type="spellStart"/>
+      <w:r>
+        <w:t>acpi</w:t>
+      </w:r>
+      <w:proofErr w:type="spellEnd"/>
+      <w:r>
+        <w:t>, others…</w:t>
+      </w:r>
+    </w:p>
+    <w:p>
+      <w:pPr>
+        <w:pStyle w:val="ListParagraph"/>
+        <w:numPr>
+          <w:ilvl w:val="2"/>
+          <w:numId w:val="1"/>
+        </w:numPr>
+      </w:pPr>
+      <w:r>
+        <w:t>Load kernel:</w:t>
+      </w:r>
+    </w:p>
+    <w:p>
+      <w:pPr>
+        <w:pStyle w:val="ListParagraph"/>
+        <w:numPr>
+          <w:ilvl w:val="3"/>
+          <w:numId w:val="1"/>
+        </w:numPr>
+      </w:pPr>
+      <w:r>
+        <w:t xml:space="preserve">Flat binary: Explore this option, </w:t>
+      </w:r>
+      <w:proofErr w:type="gramStart"/>
+      <w:r>
+        <w:t>maybe</w:t>
+      </w:r>
+      <w:proofErr w:type="gramEnd"/>
+      <w:r>
+        <w:t xml:space="preserve"> is simpler</w:t>
+      </w:r>
+    </w:p>
+    <w:p>
+      <w:pPr>
+        <w:pStyle w:val="ListParagraph"/>
+        <w:numPr>
+          <w:ilvl w:val="3"/>
+          <w:numId w:val="1"/>
+        </w:numPr>
+      </w:pPr>
+      <w:r>
+        <w:t xml:space="preserve">ELF: Parser + segments + </w:t>
+      </w:r>
+      <w:proofErr w:type="spellStart"/>
+      <w:r>
+        <w:t>etc</w:t>
+      </w:r>
+      <w:proofErr w:type="spellEnd"/>
+      <w:r>
+        <w:t>…</w:t>
+      </w:r>
+    </w:p>
+    <w:p>
+      <w:pPr>
+        <w:pStyle w:val="ListParagraph"/>
+        <w:numPr>
+          <w:ilvl w:val="2"/>
+          <w:numId w:val="1"/>
+        </w:numPr>
+      </w:pPr>
+      <w:r>
+        <w:t>Define kernel entry</w:t>
+      </w:r>
+    </w:p>
+    <w:p>
+      <w:pPr>
+        <w:pStyle w:val="ListParagraph"/>
+        <w:numPr>
+          <w:ilvl w:val="2"/>
+          <w:numId w:val="1"/>
+        </w:numPr>
+      </w:pPr>
+      <w:r>
+        <w:t>Set the GDT and Jump to protected mode</w:t>
+      </w:r>
+    </w:p>
+    <w:p>
+      <w:pPr>
+        <w:pStyle w:val="ListParagraph"/>
+        <w:numPr>
+          <w:ilvl w:val="2"/>
+          <w:numId w:val="1"/>
+        </w:numPr>
+      </w:pPr>
+      <w:r>
+        <w:t xml:space="preserve">Verify if long </w:t>
+      </w:r>
+      <w:proofErr w:type="gramStart"/>
+      <w:r>
+        <w:t>mode</w:t>
+      </w:r>
+      <w:proofErr w:type="gramEnd"/>
+      <w:r>
+        <w:t xml:space="preserve"> if possible, for completeness</w:t>
+      </w:r>
+    </w:p>
+    <w:p>
+      <w:pPr>
+        <w:pStyle w:val="ListParagraph"/>
+        <w:numPr>
+          <w:ilvl w:val="2"/>
+          <w:numId w:val="1"/>
+        </w:numPr>
+      </w:pPr>
+      <w:r>
+        <w:t>Enable paging</w:t>
+      </w:r>
+    </w:p>
+    <w:p>
+      <w:pPr>
+        <w:pStyle w:val="ListParagraph"/>
+        <w:numPr>
+          <w:ilvl w:val="2"/>
+          <w:numId w:val="1"/>
+        </w:numPr>
+      </w:pPr>
+      <w:r>
+        <w:t>Enable PAE</w:t>
+      </w:r>
+    </w:p>
+    <w:p>
+      <w:pPr>
+        <w:pStyle w:val="ListParagraph"/>
+        <w:numPr>
+          <w:ilvl w:val="2"/>
+          <w:numId w:val="1"/>
+        </w:numPr>
+      </w:pPr>
+      <w:r>
+        <w:t>Jump to Long mode</w:t>
       </w:r>
     </w:p>
     <w:p>
@@ -362,535 +965,24 @@
           <w:b/>
           <w:bCs/>
         </w:rPr>
-        <w:t>Hex editor:</w:t>
-      </w:r>
-      <w:r>
-        <w:t xml:space="preserve"> HIMEX</w:t>
-      </w:r>
-    </w:p>
-    <w:p>
-      <w:pPr>
-        <w:pStyle w:val="ListParagraph"/>
-        <w:numPr>
-          <w:ilvl w:val="1"/>
-          <w:numId w:val="1"/>
-        </w:numPr>
-      </w:pPr>
-      <w:r>
-        <w:rPr>
-          <w:b/>
-          <w:bCs/>
-        </w:rPr>
-        <w:t>Text editor:</w:t>
-      </w:r>
-      <w:r>
-        <w:t xml:space="preserve"> Notepad++, Visual Studio Code</w:t>
-      </w:r>
-    </w:p>
-    <w:p>
-      <w:pPr>
-        <w:pStyle w:val="ListParagraph"/>
-        <w:numPr>
-          <w:ilvl w:val="1"/>
-          <w:numId w:val="1"/>
-        </w:numPr>
-      </w:pPr>
-      <w:r>
-        <w:rPr>
-          <w:b/>
-          <w:bCs/>
-        </w:rPr>
-        <w:t>IDE Assembly:</w:t>
-      </w:r>
-      <w:r>
-        <w:t xml:space="preserve"> Visual Studio Code</w:t>
-      </w:r>
-    </w:p>
-    <w:p>
-      <w:pPr>
-        <w:pStyle w:val="ListParagraph"/>
-        <w:numPr>
-          <w:ilvl w:val="1"/>
-          <w:numId w:val="1"/>
-        </w:numPr>
-      </w:pPr>
-      <w:r>
-        <w:rPr>
-          <w:b/>
-          <w:bCs/>
-        </w:rPr>
-        <w:t xml:space="preserve">IDE </w:t>
-      </w:r>
-      <w:r>
-        <w:rPr>
-          <w:b/>
-          <w:bCs/>
-        </w:rPr>
-        <w:t>C</w:t>
-      </w:r>
-      <w:r>
-        <w:rPr>
-          <w:b/>
-          <w:bCs/>
-        </w:rPr>
-        <w:t xml:space="preserve"> or Rust:</w:t>
-      </w:r>
-      <w:r>
-        <w:t xml:space="preserve"> Visual Studio Code or Visual Studio 2022</w:t>
-      </w:r>
-    </w:p>
-    <w:p>
-      <w:pPr>
-        <w:pStyle w:val="ListParagraph"/>
-        <w:numPr>
-          <w:ilvl w:val="1"/>
-          <w:numId w:val="1"/>
-        </w:numPr>
-      </w:pPr>
-      <w:r>
-        <w:t>Image, bin editor, concatenation, elf info, debug, tracer, etc……</w:t>
-      </w:r>
-    </w:p>
-    <w:p/>
-    <w:p>
-      <w:pPr>
-        <w:pStyle w:val="Heading1"/>
-      </w:pPr>
-      <w:r>
-        <w:t>Bootloader</w:t>
-      </w:r>
-    </w:p>
-    <w:p>
-      <w:r>
-        <w:t xml:space="preserve">   </w:t>
-      </w:r>
-    </w:p>
-    <w:p>
-      <w:pPr>
-        <w:pStyle w:val="ListParagraph"/>
-        <w:numPr>
-          <w:ilvl w:val="0"/>
-          <w:numId w:val="1"/>
-        </w:numPr>
-        <w:rPr>
-          <w:b/>
-          <w:bCs/>
-        </w:rPr>
-      </w:pPr>
-      <w:r>
-        <w:rPr>
-          <w:b/>
-          <w:bCs/>
-        </w:rPr>
-        <w:t>General:</w:t>
-      </w:r>
-    </w:p>
-    <w:p>
-      <w:pPr>
-        <w:pStyle w:val="ListParagraph"/>
-        <w:numPr>
-          <w:ilvl w:val="1"/>
-          <w:numId w:val="1"/>
-        </w:numPr>
-      </w:pPr>
-      <w:r>
-        <w:t>Language: NASM Assembly</w:t>
-      </w:r>
-    </w:p>
-    <w:p>
-      <w:pPr>
-        <w:pStyle w:val="ListParagraph"/>
-        <w:numPr>
-          <w:ilvl w:val="1"/>
-          <w:numId w:val="1"/>
-        </w:numPr>
-      </w:pPr>
-      <w:r>
-        <w:t>Toolchain: NASM (Linux or windows, preferably Linux on WSL)</w:t>
-      </w:r>
-    </w:p>
-    <w:p>
-      <w:pPr>
-        <w:pStyle w:val="ListParagraph"/>
-        <w:numPr>
-          <w:ilvl w:val="1"/>
-          <w:numId w:val="1"/>
-        </w:numPr>
-      </w:pPr>
-      <w:r>
-        <w:t>2 Stages. Minimal first stage until Protected mode + Second stage to Long mode</w:t>
-      </w:r>
-    </w:p>
-    <w:p>
-      <w:pPr>
-        <w:pStyle w:val="ListParagraph"/>
-        <w:numPr>
-          <w:ilvl w:val="2"/>
-          <w:numId w:val="1"/>
-        </w:numPr>
-      </w:pPr>
-      <w:r>
-        <w:t>Stage1: 16 bits to 32 bits Real to Protected. NASM on 16 bits, only code on 32 bits is the jump to the second stage.</w:t>
-      </w:r>
-    </w:p>
-    <w:p>
-      <w:pPr>
-        <w:pStyle w:val="ListParagraph"/>
-        <w:numPr>
-          <w:ilvl w:val="0"/>
-          <w:numId w:val="1"/>
-        </w:numPr>
-        <w:rPr>
-          <w:b/>
-          <w:bCs/>
-        </w:rPr>
-      </w:pPr>
-      <w:r>
-        <w:rPr>
-          <w:b/>
-          <w:bCs/>
-        </w:rPr>
-        <w:t>Functionality:</w:t>
-      </w:r>
-    </w:p>
-    <w:p>
-      <w:pPr>
-        <w:pStyle w:val="ListParagraph"/>
-        <w:numPr>
-          <w:ilvl w:val="1"/>
-          <w:numId w:val="1"/>
-        </w:numPr>
-        <w:rPr>
-          <w:b/>
-          <w:bCs/>
-        </w:rPr>
-      </w:pPr>
-      <w:r>
-        <w:rPr>
-          <w:b/>
-          <w:bCs/>
-        </w:rPr>
-        <w:t>Stage1:</w:t>
-      </w:r>
-    </w:p>
-    <w:p>
-      <w:pPr>
-        <w:pStyle w:val="ListParagraph"/>
-        <w:numPr>
-          <w:ilvl w:val="2"/>
-          <w:numId w:val="1"/>
-        </w:numPr>
-      </w:pPr>
-      <w:r>
-        <w:t>BIOS loads at 0x7C00 (0x07C0 x 0x0000)</w:t>
-      </w:r>
-    </w:p>
-    <w:p>
-      <w:pPr>
-        <w:pStyle w:val="ListParagraph"/>
-        <w:numPr>
-          <w:ilvl w:val="2"/>
-          <w:numId w:val="1"/>
-        </w:numPr>
-      </w:pPr>
-      <w:r>
-        <w:t>Verify 0x55AA signature</w:t>
-      </w:r>
-      <w:r>
-        <w:t xml:space="preserve"> (0101 0101 1010 1010)</w:t>
-      </w:r>
-    </w:p>
-    <w:p>
-      <w:pPr>
-        <w:pStyle w:val="ListParagraph"/>
-        <w:numPr>
-          <w:ilvl w:val="2"/>
-          <w:numId w:val="1"/>
-        </w:numPr>
-      </w:pPr>
-      <w:r>
-        <w:t>CPU registers and flags initialization</w:t>
-      </w:r>
-    </w:p>
-    <w:p>
-      <w:pPr>
-        <w:pStyle w:val="ListParagraph"/>
-        <w:numPr>
-          <w:ilvl w:val="2"/>
-          <w:numId w:val="1"/>
-        </w:numPr>
-      </w:pPr>
-      <w:r>
-        <w:lastRenderedPageBreak/>
-        <w:t>Set a temporary stack</w:t>
-      </w:r>
-      <w:r>
-        <w:t>. Probably 0x7C00 downwards.</w:t>
-      </w:r>
-    </w:p>
-    <w:p>
-      <w:pPr>
-        <w:pStyle w:val="ListParagraph"/>
-        <w:numPr>
-          <w:ilvl w:val="2"/>
-          <w:numId w:val="1"/>
-        </w:numPr>
-      </w:pPr>
-      <w:r>
-        <w:t>Print early status</w:t>
-      </w:r>
-    </w:p>
-    <w:p>
-      <w:pPr>
-        <w:pStyle w:val="ListParagraph"/>
-        <w:numPr>
-          <w:ilvl w:val="2"/>
-          <w:numId w:val="1"/>
-        </w:numPr>
-      </w:pPr>
-      <w:r>
-        <w:t xml:space="preserve">Detect storage </w:t>
-      </w:r>
-      <w:r>
-        <w:t>drives. Probably only one at the beginning.</w:t>
-      </w:r>
-    </w:p>
-    <w:p>
-      <w:pPr>
-        <w:pStyle w:val="ListParagraph"/>
-        <w:numPr>
-          <w:ilvl w:val="2"/>
-          <w:numId w:val="1"/>
-        </w:numPr>
-      </w:pPr>
-      <w:r>
-        <w:t>Storage fixed LBA or simple Fat12/26/32????</w:t>
-      </w:r>
-    </w:p>
-    <w:p>
-      <w:pPr>
-        <w:pStyle w:val="ListParagraph"/>
-        <w:numPr>
-          <w:ilvl w:val="2"/>
-          <w:numId w:val="1"/>
-        </w:numPr>
-      </w:pPr>
-      <w:r>
-        <w:t>Jump to Protected mode</w:t>
-      </w:r>
-      <w:r>
-        <w:t>. Maybe change this to the second stage?</w:t>
-      </w:r>
-    </w:p>
-    <w:p>
-      <w:pPr>
-        <w:pStyle w:val="ListParagraph"/>
-        <w:numPr>
-          <w:ilvl w:val="2"/>
-          <w:numId w:val="1"/>
-        </w:numPr>
-      </w:pPr>
-      <w:r>
-        <w:t>Load stage 2. Target memory TBD</w:t>
-      </w:r>
-    </w:p>
-    <w:p>
-      <w:pPr>
-        <w:pStyle w:val="ListParagraph"/>
-        <w:numPr>
-          <w:ilvl w:val="2"/>
-          <w:numId w:val="1"/>
-        </w:numPr>
-      </w:pPr>
-      <w:r>
-        <w:t>Jump to Stage 2</w:t>
-      </w:r>
-    </w:p>
-    <w:p>
-      <w:pPr>
-        <w:pStyle w:val="ListParagraph"/>
-        <w:numPr>
-          <w:ilvl w:val="1"/>
-          <w:numId w:val="1"/>
-        </w:numPr>
-      </w:pPr>
-      <w:r>
-        <w:rPr>
-          <w:b/>
-          <w:bCs/>
-        </w:rPr>
-        <w:t>Stage2</w:t>
+        <w:t xml:space="preserve">Optional, but </w:t>
+      </w:r>
+      <w:r>
+        <w:rPr>
+          <w:b/>
+          <w:bCs/>
+        </w:rPr>
+        <w:t>style</w:t>
+      </w:r>
+      <w:r>
+        <w:rPr>
+          <w:b/>
+          <w:bCs/>
+        </w:rPr>
+        <w:t xml:space="preserve"> points</w:t>
       </w:r>
       <w:r>
         <w:t>:</w:t>
-      </w:r>
-    </w:p>
-    <w:p>
-      <w:pPr>
-        <w:pStyle w:val="ListParagraph"/>
-        <w:numPr>
-          <w:ilvl w:val="2"/>
-          <w:numId w:val="1"/>
-        </w:numPr>
-      </w:pPr>
-      <w:r>
-        <w:t>Jump to Protected mode if Stage1 did not change mode.</w:t>
-      </w:r>
-    </w:p>
-    <w:p>
-      <w:pPr>
-        <w:pStyle w:val="ListParagraph"/>
-        <w:numPr>
-          <w:ilvl w:val="2"/>
-          <w:numId w:val="1"/>
-        </w:numPr>
-      </w:pPr>
-      <w:r>
-        <w:t>Enable A20, or at least check. There are multiple strategies for this. Some platforms have fast enable 0x92, or they come with A20 already enable. XXXX</w:t>
-      </w:r>
-    </w:p>
-    <w:p>
-      <w:pPr>
-        <w:pStyle w:val="ListParagraph"/>
-        <w:numPr>
-          <w:ilvl w:val="2"/>
-          <w:numId w:val="1"/>
-        </w:numPr>
-      </w:pPr>
-      <w:r>
-        <w:t>Create console helpers for printing and stuff.</w:t>
-      </w:r>
-    </w:p>
-    <w:p>
-      <w:pPr>
-        <w:pStyle w:val="ListParagraph"/>
-        <w:numPr>
-          <w:ilvl w:val="2"/>
-          <w:numId w:val="1"/>
-        </w:numPr>
-      </w:pPr>
-      <w:r>
-        <w:t>Gather info for the kernel: Memory, graphics, bios, acpi, others…</w:t>
-      </w:r>
-    </w:p>
-    <w:p>
-      <w:pPr>
-        <w:pStyle w:val="ListParagraph"/>
-        <w:numPr>
-          <w:ilvl w:val="2"/>
-          <w:numId w:val="1"/>
-        </w:numPr>
-      </w:pPr>
-      <w:r>
-        <w:t>Load kernel:</w:t>
-      </w:r>
-    </w:p>
-    <w:p>
-      <w:pPr>
-        <w:pStyle w:val="ListParagraph"/>
-        <w:numPr>
-          <w:ilvl w:val="3"/>
-          <w:numId w:val="1"/>
-        </w:numPr>
-      </w:pPr>
-      <w:r>
-        <w:t>Flat binary: Explore this option, maybe is simpler</w:t>
-      </w:r>
-    </w:p>
-    <w:p>
-      <w:pPr>
-        <w:pStyle w:val="ListParagraph"/>
-        <w:numPr>
-          <w:ilvl w:val="3"/>
-          <w:numId w:val="1"/>
-        </w:numPr>
-      </w:pPr>
-      <w:r>
-        <w:t>ELF: Parser + segments + etc…</w:t>
-      </w:r>
-    </w:p>
-    <w:p>
-      <w:pPr>
-        <w:pStyle w:val="ListParagraph"/>
-        <w:numPr>
-          <w:ilvl w:val="2"/>
-          <w:numId w:val="1"/>
-        </w:numPr>
-      </w:pPr>
-      <w:r>
-        <w:t>Define kernel entry</w:t>
-      </w:r>
-    </w:p>
-    <w:p>
-      <w:pPr>
-        <w:pStyle w:val="ListParagraph"/>
-        <w:numPr>
-          <w:ilvl w:val="2"/>
-          <w:numId w:val="1"/>
-        </w:numPr>
-      </w:pPr>
-      <w:r>
-        <w:t>Set the GDT and Jump to protected mode</w:t>
-      </w:r>
-    </w:p>
-    <w:p>
-      <w:pPr>
-        <w:pStyle w:val="ListParagraph"/>
-        <w:numPr>
-          <w:ilvl w:val="2"/>
-          <w:numId w:val="1"/>
-        </w:numPr>
-      </w:pPr>
-      <w:r>
-        <w:t>Verify if long mode if possible, for completeness</w:t>
-      </w:r>
-    </w:p>
-    <w:p>
-      <w:pPr>
-        <w:pStyle w:val="ListParagraph"/>
-        <w:numPr>
-          <w:ilvl w:val="2"/>
-          <w:numId w:val="1"/>
-        </w:numPr>
-      </w:pPr>
-      <w:r>
-        <w:t>Enable paging</w:t>
-      </w:r>
-    </w:p>
-    <w:p>
-      <w:pPr>
-        <w:pStyle w:val="ListParagraph"/>
-        <w:numPr>
-          <w:ilvl w:val="2"/>
-          <w:numId w:val="1"/>
-        </w:numPr>
-      </w:pPr>
-      <w:r>
-        <w:t>Enable PAE</w:t>
-      </w:r>
-    </w:p>
-    <w:p>
-      <w:pPr>
-        <w:pStyle w:val="ListParagraph"/>
-        <w:numPr>
-          <w:ilvl w:val="2"/>
-          <w:numId w:val="1"/>
-        </w:numPr>
-      </w:pPr>
-      <w:r>
-        <w:t>Jump to Long mode</w:t>
-      </w:r>
-    </w:p>
-    <w:p>
-      <w:pPr>
-        <w:pStyle w:val="ListParagraph"/>
-        <w:numPr>
-          <w:ilvl w:val="1"/>
-          <w:numId w:val="1"/>
-        </w:numPr>
-      </w:pPr>
-      <w:r>
-        <w:t>Optional, but bonus points:</w:t>
       </w:r>
     </w:p>
     <w:p>
@@ -932,14 +1024,34 @@
     <w:p/>
     <w:p>
       <w:pPr>
+        <w:pStyle w:val="Heading2"/>
+      </w:pPr>
+      <w:r>
+        <w:t>WSL</w:t>
+      </w:r>
+      <w:r>
+        <w:t xml:space="preserve"> stuff</w:t>
+      </w:r>
+    </w:p>
+    <w:p/>
+    <w:p>
+      <w:pPr>
         <w:pStyle w:val="ListParagraph"/>
         <w:numPr>
           <w:ilvl w:val="0"/>
           <w:numId w:val="1"/>
         </w:numPr>
-      </w:pPr>
-      <w:r>
-        <w:t>WSL:</w:t>
+        <w:rPr>
+          <w:b/>
+          <w:bCs/>
+        </w:rPr>
+      </w:pPr>
+      <w:r>
+        <w:rPr>
+          <w:b/>
+          <w:bCs/>
+        </w:rPr>
+        <w:t>File system:</w:t>
       </w:r>
     </w:p>
     <w:p>
@@ -949,9 +1061,17 @@
           <w:ilvl w:val="1"/>
           <w:numId w:val="1"/>
         </w:numPr>
-      </w:pPr>
-      <w:r>
-        <w:t>File system:</w:t>
+        <w:rPr>
+          <w:b/>
+          <w:bCs/>
+        </w:rPr>
+      </w:pPr>
+      <w:r>
+        <w:rPr>
+          <w:b/>
+          <w:bCs/>
+        </w:rPr>
+        <w:t>Accessing Windows from Linux:</w:t>
       </w:r>
     </w:p>
     <w:p>
@@ -963,7 +1083,10 @@
         </w:numPr>
       </w:pPr>
       <w:r>
-        <w:t>Accessing Windows from Linux:</w:t>
+        <w:t>Console</w:t>
+      </w:r>
+      <w:r>
+        <w:t>:</w:t>
       </w:r>
     </w:p>
     <w:p>
@@ -975,121 +1098,138 @@
         </w:numPr>
       </w:pPr>
       <w:r>
+        <w:t>Invoke explorer Windows using “</w:t>
+      </w:r>
+      <w:proofErr w:type="gramStart"/>
+      <w:r>
+        <w:rPr>
+          <w:b/>
+          <w:bCs/>
+        </w:rPr>
+        <w:t>explorer.exe .</w:t>
+      </w:r>
+      <w:proofErr w:type="gramEnd"/>
+      <w:r>
+        <w:t>”</w:t>
+      </w:r>
+    </w:p>
+    <w:p>
+      <w:pPr>
+        <w:pStyle w:val="ListParagraph"/>
+        <w:numPr>
+          <w:ilvl w:val="3"/>
+          <w:numId w:val="1"/>
+        </w:numPr>
+        <w:rPr>
+          <w:b/>
+          <w:bCs/>
+        </w:rPr>
+      </w:pPr>
+      <w:r>
+        <w:t xml:space="preserve">Access Windows drives through the mounted drive: </w:t>
+      </w:r>
+      <w:r>
+        <w:rPr>
+          <w:b/>
+          <w:bCs/>
+        </w:rPr>
+        <w:t>/</w:t>
+      </w:r>
+      <w:proofErr w:type="spellStart"/>
+      <w:r>
+        <w:rPr>
+          <w:b/>
+          <w:bCs/>
+        </w:rPr>
+        <w:t>mnt</w:t>
+      </w:r>
+      <w:proofErr w:type="spellEnd"/>
+      <w:r>
+        <w:rPr>
+          <w:b/>
+          <w:bCs/>
+        </w:rPr>
+        <w:t>/c/Program Files (x86)</w:t>
+      </w:r>
+    </w:p>
+    <w:p>
+      <w:pPr>
+        <w:pStyle w:val="ListParagraph"/>
+        <w:numPr>
+          <w:ilvl w:val="2"/>
+          <w:numId w:val="1"/>
+        </w:numPr>
+      </w:pPr>
+      <w:r>
+        <w:t>Running directly from Linux console:</w:t>
+      </w:r>
+    </w:p>
+    <w:p>
+      <w:pPr>
+        <w:pStyle w:val="ListParagraph"/>
+        <w:numPr>
+          <w:ilvl w:val="3"/>
+          <w:numId w:val="1"/>
+        </w:numPr>
+      </w:pPr>
+      <w:r>
+        <w:t>Example: “</w:t>
+      </w:r>
+      <w:r>
+        <w:rPr>
+          <w:b/>
+          <w:bCs/>
+        </w:rPr>
+        <w:t>ipconfig.exe | grep IPv4 | cut -d: -f2</w:t>
+      </w:r>
+      <w:r>
+        <w:t>”</w:t>
+      </w:r>
+    </w:p>
+    <w:p>
+      <w:pPr>
+        <w:pStyle w:val="ListParagraph"/>
+        <w:numPr>
+          <w:ilvl w:val="1"/>
+          <w:numId w:val="1"/>
+        </w:numPr>
+        <w:rPr>
+          <w:b/>
+          <w:bCs/>
+        </w:rPr>
+      </w:pPr>
+      <w:r>
+        <w:rPr>
+          <w:b/>
+          <w:bCs/>
+        </w:rPr>
+        <w:t>Accessing Linux from Windows</w:t>
+      </w:r>
+      <w:r>
+        <w:rPr>
+          <w:b/>
+          <w:bCs/>
+        </w:rPr>
+        <w:t>:</w:t>
+      </w:r>
+    </w:p>
+    <w:p>
+      <w:pPr>
+        <w:pStyle w:val="ListParagraph"/>
+        <w:numPr>
+          <w:ilvl w:val="2"/>
+          <w:numId w:val="1"/>
+        </w:numPr>
+      </w:pPr>
+      <w:r>
         <w:t>Console</w:t>
       </w:r>
-      <w:r>
-        <w:t>:</w:t>
-      </w:r>
-    </w:p>
-    <w:p>
-      <w:pPr>
-        <w:pStyle w:val="ListParagraph"/>
-        <w:numPr>
-          <w:ilvl w:val="4"/>
-          <w:numId w:val="1"/>
-        </w:numPr>
-      </w:pPr>
-      <w:r>
-        <w:t>Invoke explorer Windows using “</w:t>
-      </w:r>
-      <w:r>
-        <w:rPr>
-          <w:b/>
-          <w:bCs/>
-        </w:rPr>
-        <w:t>explorer.exe .</w:t>
-      </w:r>
-      <w:r>
-        <w:t>”</w:t>
-      </w:r>
-    </w:p>
-    <w:p>
-      <w:pPr>
-        <w:pStyle w:val="ListParagraph"/>
-        <w:numPr>
-          <w:ilvl w:val="4"/>
-          <w:numId w:val="1"/>
-        </w:numPr>
-        <w:rPr>
-          <w:b/>
-          <w:bCs/>
-        </w:rPr>
-      </w:pPr>
-      <w:r>
-        <w:t xml:space="preserve">Access Windows drives through the mounted drive: </w:t>
-      </w:r>
-      <w:r>
-        <w:rPr>
-          <w:b/>
-          <w:bCs/>
-        </w:rPr>
-        <w:t>/mnt/c/Program Files (x86)</w:t>
-      </w:r>
     </w:p>
     <w:p>
       <w:pPr>
         <w:pStyle w:val="ListParagraph"/>
         <w:numPr>
           <w:ilvl w:val="3"/>
-          <w:numId w:val="1"/>
-        </w:numPr>
-      </w:pPr>
-      <w:r>
-        <w:t>Running directly from Linux console:</w:t>
-      </w:r>
-    </w:p>
-    <w:p>
-      <w:pPr>
-        <w:pStyle w:val="ListParagraph"/>
-        <w:numPr>
-          <w:ilvl w:val="4"/>
-          <w:numId w:val="1"/>
-        </w:numPr>
-      </w:pPr>
-      <w:r>
-        <w:lastRenderedPageBreak/>
-        <w:t>Example: “</w:t>
-      </w:r>
-      <w:r>
-        <w:rPr>
-          <w:b/>
-          <w:bCs/>
-        </w:rPr>
-        <w:t>ipconfig.exe | grep IPv4 | cut -d: -f2</w:t>
-      </w:r>
-      <w:r>
-        <w:t>”</w:t>
-      </w:r>
-    </w:p>
-    <w:p>
-      <w:pPr>
-        <w:pStyle w:val="ListParagraph"/>
-        <w:numPr>
-          <w:ilvl w:val="2"/>
-          <w:numId w:val="1"/>
-        </w:numPr>
-      </w:pPr>
-      <w:r>
-        <w:t>Accessing Linux from Windows</w:t>
-      </w:r>
-    </w:p>
-    <w:p>
-      <w:pPr>
-        <w:pStyle w:val="ListParagraph"/>
-        <w:numPr>
-          <w:ilvl w:val="3"/>
-          <w:numId w:val="1"/>
-        </w:numPr>
-      </w:pPr>
-      <w:r>
-        <w:t>Console</w:t>
-      </w:r>
-    </w:p>
-    <w:p>
-      <w:pPr>
-        <w:pStyle w:val="ListParagraph"/>
-        <w:numPr>
-          <w:ilvl w:val="4"/>
           <w:numId w:val="1"/>
         </w:numPr>
       </w:pPr>
@@ -1118,16 +1258,21 @@
       <w:pPr>
         <w:pStyle w:val="ListParagraph"/>
         <w:numPr>
-          <w:ilvl w:val="4"/>
-          <w:numId w:val="1"/>
-        </w:numPr>
-        <w:rPr>
-          <w:b/>
-          <w:bCs/>
-        </w:rPr>
-      </w:pPr>
-      <w:r>
-        <w:t xml:space="preserve">Also you can </w:t>
+          <w:ilvl w:val="3"/>
+          <w:numId w:val="1"/>
+        </w:numPr>
+        <w:rPr>
+          <w:b/>
+          <w:bCs/>
+        </w:rPr>
+      </w:pPr>
+      <w:proofErr w:type="gramStart"/>
+      <w:r>
+        <w:t>Also</w:t>
+      </w:r>
+      <w:proofErr w:type="gramEnd"/>
+      <w:r>
+        <w:t xml:space="preserve"> you can </w:t>
       </w:r>
       <w:r>
         <w:t xml:space="preserve">net use </w:t>
@@ -1144,12 +1289,66 @@
       <w:pPr>
         <w:pStyle w:val="ListParagraph"/>
         <w:numPr>
+          <w:ilvl w:val="2"/>
+          <w:numId w:val="1"/>
+        </w:numPr>
+      </w:pPr>
+      <w:r>
+        <w:t>Explorer</w:t>
+      </w:r>
+    </w:p>
+    <w:p>
+      <w:pPr>
+        <w:pStyle w:val="ListParagraph"/>
+        <w:numPr>
+          <w:ilvl w:val="2"/>
+          <w:numId w:val="1"/>
+        </w:numPr>
+      </w:pPr>
+      <w:r>
+        <w:t>Running directly from windows console:</w:t>
+      </w:r>
+    </w:p>
+    <w:p>
+      <w:pPr>
+        <w:pStyle w:val="ListParagraph"/>
+        <w:numPr>
           <w:ilvl w:val="3"/>
           <w:numId w:val="1"/>
         </w:numPr>
       </w:pPr>
       <w:r>
-        <w:t>Explorer</w:t>
+        <w:t>Example: “</w:t>
+      </w:r>
+      <w:proofErr w:type="spellStart"/>
+      <w:r>
+        <w:rPr>
+          <w:b/>
+          <w:bCs/>
+        </w:rPr>
+        <w:t>wsl</w:t>
+      </w:r>
+      <w:proofErr w:type="spellEnd"/>
+      <w:r>
+        <w:rPr>
+          <w:b/>
+          <w:bCs/>
+        </w:rPr>
+        <w:t xml:space="preserve"> ls -la</w:t>
+      </w:r>
+      <w:r>
+        <w:t>”</w:t>
+      </w:r>
+      <w:r>
+        <w:t xml:space="preserve"> will output </w:t>
+      </w:r>
+      <w:proofErr w:type="spellStart"/>
+      <w:r>
+        <w:t>Windos</w:t>
+      </w:r>
+      <w:proofErr w:type="spellEnd"/>
+      <w:r>
+        <w:t xml:space="preserve"> folder but using Linux ls</w:t>
       </w:r>
     </w:p>
     <w:p>
@@ -1161,55 +1360,44 @@
         </w:numPr>
       </w:pPr>
       <w:r>
-        <w:t>Running directly from windows console:</w:t>
-      </w:r>
-    </w:p>
-    <w:p>
-      <w:pPr>
-        <w:pStyle w:val="ListParagraph"/>
-        <w:numPr>
-          <w:ilvl w:val="4"/>
-          <w:numId w:val="1"/>
-        </w:numPr>
-      </w:pPr>
-      <w:r>
-        <w:t>Example: “</w:t>
-      </w:r>
-      <w:r>
-        <w:rPr>
-          <w:b/>
-          <w:bCs/>
-        </w:rPr>
-        <w:t>wsl ls -la</w:t>
-      </w:r>
-      <w:r>
-        <w:t>”</w:t>
-      </w:r>
-      <w:r>
-        <w:t xml:space="preserve"> will output Windos folder but using Linux ls</w:t>
-      </w:r>
-    </w:p>
-    <w:p>
-      <w:pPr>
-        <w:pStyle w:val="ListParagraph"/>
-        <w:numPr>
-          <w:ilvl w:val="4"/>
-          <w:numId w:val="1"/>
-        </w:numPr>
-      </w:pPr>
-      <w:r>
         <w:t xml:space="preserve">Example: </w:t>
       </w:r>
-      <w:r>
-        <w:rPr>
-          <w:b/>
-          <w:bCs/>
-        </w:rPr>
-        <w:t>wsl ls -la | findstr "git"</w:t>
-      </w:r>
-    </w:p>
-    <w:p>
-      <w:r>
+      <w:proofErr w:type="spellStart"/>
+      <w:r>
+        <w:rPr>
+          <w:b/>
+          <w:bCs/>
+        </w:rPr>
+        <w:t>wsl</w:t>
+      </w:r>
+      <w:proofErr w:type="spellEnd"/>
+      <w:r>
+        <w:rPr>
+          <w:b/>
+          <w:bCs/>
+        </w:rPr>
+        <w:t xml:space="preserve"> ls -la | </w:t>
+      </w:r>
+      <w:proofErr w:type="spellStart"/>
+      <w:r>
+        <w:rPr>
+          <w:b/>
+          <w:bCs/>
+        </w:rPr>
+        <w:t>findstr</w:t>
+      </w:r>
+      <w:proofErr w:type="spellEnd"/>
+      <w:r>
+        <w:rPr>
+          <w:b/>
+          <w:bCs/>
+        </w:rPr>
+        <w:t xml:space="preserve"> "git"</w:t>
+      </w:r>
+    </w:p>
+    <w:p>
+      <w:r>
+        <w:lastRenderedPageBreak/>
         <w:tab/>
       </w:r>
       <w:r>
@@ -1218,8 +1406,11 @@
     </w:p>
     <w:p/>
     <w:p>
-      <w:r>
-        <w:t>Setup build:</w:t>
+      <w:pPr>
+        <w:pStyle w:val="Heading2"/>
+      </w:pPr>
+      <w:r>
+        <w:t>Setup build</w:t>
       </w:r>
     </w:p>
     <w:p>
@@ -1277,8 +1468,13 @@
           <w:numId w:val="1"/>
         </w:numPr>
       </w:pPr>
-      <w:r>
-        <w:t>sudo apt update</w:t>
+      <w:proofErr w:type="spellStart"/>
+      <w:r>
+        <w:t>sudo</w:t>
+      </w:r>
+      <w:proofErr w:type="spellEnd"/>
+      <w:r>
+        <w:t xml:space="preserve"> apt update</w:t>
       </w:r>
     </w:p>
     <w:p>
@@ -1289,8 +1485,13 @@
           <w:numId w:val="1"/>
         </w:numPr>
       </w:pPr>
-      <w:r>
-        <w:t>sudo apt upgrade -y</w:t>
+      <w:proofErr w:type="spellStart"/>
+      <w:r>
+        <w:t>sudo</w:t>
+      </w:r>
+      <w:proofErr w:type="spellEnd"/>
+      <w:r>
+        <w:t xml:space="preserve"> apt upgrade -y</w:t>
       </w:r>
     </w:p>
     <w:p>
@@ -1301,8 +1502,13 @@
           <w:numId w:val="1"/>
         </w:numPr>
       </w:pPr>
-      <w:r>
-        <w:t>sudo apt full-upgrade -y</w:t>
+      <w:proofErr w:type="spellStart"/>
+      <w:r>
+        <w:t>sudo</w:t>
+      </w:r>
+      <w:proofErr w:type="spellEnd"/>
+      <w:r>
+        <w:t xml:space="preserve"> apt full-upgrade -y</w:t>
       </w:r>
     </w:p>
     <w:p>
@@ -1313,8 +1519,21 @@
           <w:numId w:val="1"/>
         </w:numPr>
       </w:pPr>
-      <w:r>
-        <w:t>sudo apt autoremove -y</w:t>
+      <w:proofErr w:type="spellStart"/>
+      <w:r>
+        <w:t>sudo</w:t>
+      </w:r>
+      <w:proofErr w:type="spellEnd"/>
+      <w:r>
+        <w:t xml:space="preserve"> apt </w:t>
+      </w:r>
+      <w:proofErr w:type="spellStart"/>
+      <w:r>
+        <w:t>autoremove</w:t>
+      </w:r>
+      <w:proofErr w:type="spellEnd"/>
+      <w:r>
+        <w:t xml:space="preserve"> -y</w:t>
       </w:r>
     </w:p>
     <w:p>
@@ -1325,8 +1544,13 @@
           <w:numId w:val="1"/>
         </w:numPr>
       </w:pPr>
-      <w:r>
-        <w:t>Install NASM assembler</w:t>
+      <w:proofErr w:type="gramStart"/>
+      <w:r>
+        <w:t>Install</w:t>
+      </w:r>
+      <w:proofErr w:type="gramEnd"/>
+      <w:r>
+        <w:t xml:space="preserve"> NASM assembler</w:t>
       </w:r>
     </w:p>
     <w:p>
@@ -1337,8 +1561,21 @@
           <w:numId w:val="1"/>
         </w:numPr>
       </w:pPr>
-      <w:r>
-        <w:t>sudo apt install nasm -y</w:t>
+      <w:proofErr w:type="spellStart"/>
+      <w:r>
+        <w:t>sudo</w:t>
+      </w:r>
+      <w:proofErr w:type="spellEnd"/>
+      <w:r>
+        <w:t xml:space="preserve"> apt install </w:t>
+      </w:r>
+      <w:proofErr w:type="spellStart"/>
+      <w:r>
+        <w:t>nasm</w:t>
+      </w:r>
+      <w:proofErr w:type="spellEnd"/>
+      <w:r>
+        <w:t xml:space="preserve"> -y</w:t>
       </w:r>
     </w:p>
     <w:p>
@@ -1350,7 +1587,23 @@
         </w:numPr>
       </w:pPr>
       <w:r>
-        <w:t>Create a temporary alias for cls = clear(investigate how to make it permanent)</w:t>
+        <w:t xml:space="preserve">Create a temporary alias for </w:t>
+      </w:r>
+      <w:proofErr w:type="spellStart"/>
+      <w:r>
+        <w:t>cls</w:t>
+      </w:r>
+      <w:proofErr w:type="spellEnd"/>
+      <w:r>
+        <w:t xml:space="preserve"> = </w:t>
+      </w:r>
+      <w:proofErr w:type="gramStart"/>
+      <w:r>
+        <w:t>clear(</w:t>
+      </w:r>
+      <w:proofErr w:type="gramEnd"/>
+      <w:r>
+        <w:t>investigate how to make it permanent)</w:t>
       </w:r>
     </w:p>
     <w:p>
@@ -1362,30 +1615,174 @@
         </w:numPr>
       </w:pPr>
       <w:r>
-        <w:t>alias cls='clear'</w:t>
-      </w:r>
+        <w:t xml:space="preserve">alias </w:t>
+      </w:r>
+      <w:proofErr w:type="spellStart"/>
+      <w:r>
+        <w:t>cls</w:t>
+      </w:r>
+      <w:proofErr w:type="spellEnd"/>
+      <w:r>
+        <w:t>='clear'</w:t>
+      </w:r>
+    </w:p>
+    <w:p>
+      <w:pPr>
+        <w:pStyle w:val="ListParagraph"/>
+        <w:numPr>
+          <w:ilvl w:val="0"/>
+          <w:numId w:val="1"/>
+        </w:numPr>
+      </w:pPr>
+      <w:r>
+        <w:t xml:space="preserve">Install </w:t>
+      </w:r>
+      <w:proofErr w:type="spellStart"/>
+      <w:r>
+        <w:t>qemu</w:t>
+      </w:r>
+      <w:proofErr w:type="spellEnd"/>
+      <w:r>
+        <w:t xml:space="preserve"> on Windows:</w:t>
+      </w:r>
+      <w:r>
+        <w:t xml:space="preserve"> </w:t>
+      </w:r>
+      <w:hyperlink r:id="rId7" w:history="1">
+        <w:r>
+          <w:rPr>
+            <w:rStyle w:val="Hyperlink"/>
+          </w:rPr>
+          <w:t>https://www.qemu.org/</w:t>
+        </w:r>
+      </w:hyperlink>
+      <w:r>
+        <w:t xml:space="preserve"> </w:t>
+      </w:r>
+      <w:hyperlink r:id="rId8" w:history="1">
+        <w:r>
+          <w:rPr>
+            <w:rStyle w:val="Hyperlink"/>
+          </w:rPr>
+          <w:t>https://qemu.weilnetz.de/w64/</w:t>
+        </w:r>
+      </w:hyperlink>
+      <w:r>
+        <w:t xml:space="preserve"> </w:t>
+      </w:r>
+    </w:p>
+    <w:p>
+      <w:pPr>
+        <w:pStyle w:val="ListParagraph"/>
+        <w:numPr>
+          <w:ilvl w:val="1"/>
+          <w:numId w:val="1"/>
+        </w:numPr>
+      </w:pPr>
+      <w:r>
+        <w:t>Current version, October 2025 is 10.1.2</w:t>
+      </w:r>
+    </w:p>
+    <w:p>
+      <w:pPr>
+        <w:pStyle w:val="ListParagraph"/>
+        <w:numPr>
+          <w:ilvl w:val="1"/>
+          <w:numId w:val="1"/>
+        </w:numPr>
+      </w:pPr>
     </w:p>
     <w:p/>
     <w:p>
+      <w:pPr>
+        <w:pStyle w:val="Heading1"/>
+      </w:pPr>
       <w:r>
         <w:t>Common Linux and Windows commands</w:t>
       </w:r>
     </w:p>
     <w:p/>
     <w:p>
+      <w:pPr>
+        <w:pStyle w:val="Heading2"/>
+      </w:pPr>
       <w:r>
         <w:t>Linux</w:t>
       </w:r>
     </w:p>
     <w:p/>
     <w:p>
-      <w:r>
-        <w:t>nasm -f bin src/bootloader/stage1.asm -o src/build/stage1.bin</w:t>
+      <w:proofErr w:type="spellStart"/>
+      <w:r>
+        <w:t>nasm</w:t>
+      </w:r>
+      <w:proofErr w:type="spellEnd"/>
+      <w:r>
+        <w:t xml:space="preserve"> -f bin </w:t>
+      </w:r>
+      <w:proofErr w:type="spellStart"/>
+      <w:r>
+        <w:t>src</w:t>
+      </w:r>
+      <w:proofErr w:type="spellEnd"/>
+      <w:r>
+        <w:t xml:space="preserve">/bootloader/stage1.asm -o </w:t>
+      </w:r>
+      <w:proofErr w:type="spellStart"/>
+      <w:r>
+        <w:t>src</w:t>
+      </w:r>
+      <w:proofErr w:type="spellEnd"/>
+      <w:r>
+        <w:t>/build/stage1.bin</w:t>
+      </w:r>
+    </w:p>
+    <w:p/>
+    <w:p>
+      <w:pPr>
+        <w:pStyle w:val="Heading2"/>
+      </w:pPr>
+      <w:r>
+        <w:t>Windows PowerShell</w:t>
+      </w:r>
+    </w:p>
+    <w:p/>
+    <w:p>
+      <w:r>
+        <w:t xml:space="preserve">Run </w:t>
+      </w:r>
+      <w:proofErr w:type="spellStart"/>
+      <w:r>
+        <w:t>qemu</w:t>
+      </w:r>
+      <w:proofErr w:type="spellEnd"/>
+      <w:r>
+        <w:t xml:space="preserve"> with the bootloader bin</w:t>
+      </w:r>
+    </w:p>
+    <w:p>
+      <w:r>
+        <w:t>qemu-system-i386 -drive format=</w:t>
+      </w:r>
+      <w:proofErr w:type="gramStart"/>
+      <w:r>
+        <w:t>raw,file</w:t>
+      </w:r>
+      <w:proofErr w:type="gramEnd"/>
+      <w:r>
+        <w:t>=</w:t>
+      </w:r>
+      <w:proofErr w:type="gramStart"/>
+      <w:r>
+        <w:t>C:\Users\mihe\Dropbox\TusMuertOS-Oct2025\src\build\stage1.bin,if</w:t>
+      </w:r>
+      <w:proofErr w:type="gramEnd"/>
+      <w:r>
+        <w:t>=floppy</w:t>
       </w:r>
     </w:p>
     <w:p/>
     <w:p/>
-    <w:p/>
     <w:p>
       <w:pPr>
         <w:pStyle w:val="Heading1"/>
@@ -1405,6 +1802,11 @@
       </w:r>
     </w:p>
     <w:p>
+      <w:pPr>
+        <w:pBdr>
+          <w:bottom w:val="single" w:sz="6" w:space="1" w:color="auto"/>
+        </w:pBdr>
+      </w:pPr>
       <w:r>
         <w:t>Example:</w:t>
       </w:r>
@@ -1425,11 +1827,23 @@
       </w:r>
     </w:p>
     <w:p>
-      <w:r>
-        <w:t xml:space="preserve">    mov ax, start      ; imm16 encodes the absolute offset of “start”</w:t>
-      </w:r>
-    </w:p>
-    <w:p/>
+      <w:pPr>
+        <w:pBdr>
+          <w:bottom w:val="single" w:sz="6" w:space="1" w:color="auto"/>
+        </w:pBdr>
+      </w:pPr>
+      <w:r>
+        <w:t xml:space="preserve">    mov ax, start    </w:t>
+      </w:r>
+      <w:proofErr w:type="gramStart"/>
+      <w:r>
+        <w:t xml:space="preserve">  ;</w:t>
+      </w:r>
+      <w:proofErr w:type="gramEnd"/>
+      <w:r>
+        <w:t xml:space="preserve"> imm16 encodes the absolute offset of “start”</w:t>
+      </w:r>
+    </w:p>
     <w:p>
       <w:pPr>
         <w:pStyle w:val="ListParagraph"/>
@@ -1713,6 +2127,18 @@
     <w:abstractNumId w:val="0"/>
   </w:num>
   <w:num w:numId="14" w16cid:durableId="1536117323">
+    <w:abstractNumId w:val="0"/>
+  </w:num>
+  <w:num w:numId="15" w16cid:durableId="1143620383">
+    <w:abstractNumId w:val="0"/>
+  </w:num>
+  <w:num w:numId="16" w16cid:durableId="442653734">
+    <w:abstractNumId w:val="0"/>
+  </w:num>
+  <w:num w:numId="17" w16cid:durableId="1055929721">
+    <w:abstractNumId w:val="0"/>
+  </w:num>
+  <w:num w:numId="18" w16cid:durableId="438843113">
     <w:abstractNumId w:val="0"/>
   </w:num>
 </w:numbering>
@@ -2116,7 +2542,10 @@
   <w:style w:type="paragraph" w:default="1" w:styleId="Normal">
     <w:name w:val="Normal"/>
     <w:qFormat/>
-    <w:rsid w:val="00457DEC"/>
+    <w:rsid w:val="007C771D"/>
+    <w:rPr>
+      <w:sz w:val="20"/>
+    </w:rPr>
   </w:style>
   <w:style w:type="paragraph" w:styleId="Heading1">
     <w:name w:val="heading 1"/>
@@ -2335,7 +2764,6 @@
     <w:rPr>
       <w:rFonts w:asciiTheme="majorHAnsi" w:eastAsiaTheme="majorEastAsia" w:hAnsiTheme="majorHAnsi" w:cstheme="majorBidi"/>
       <w:color w:val="404040" w:themeColor="text1" w:themeTint="BF"/>
-      <w:sz w:val="20"/>
       <w:szCs w:val="20"/>
     </w:rPr>
   </w:style>
@@ -2364,13 +2792,13 @@
       <w:i/>
       <w:iCs/>
       <w:color w:val="404040" w:themeColor="text1" w:themeTint="BF"/>
-      <w:sz w:val="20"/>
       <w:szCs w:val="20"/>
     </w:rPr>
   </w:style>
   <w:style w:type="character" w:default="1" w:styleId="DefaultParagraphFont">
     <w:name w:val="Default Paragraph Font"/>
     <w:uiPriority w:val="1"/>
+    <w:semiHidden/>
     <w:unhideWhenUsed/>
   </w:style>
   <w:style w:type="table" w:default="1" w:styleId="TableNormal">
@@ -2622,11 +3050,14 @@
     <w:basedOn w:val="Normal"/>
     <w:uiPriority w:val="34"/>
     <w:qFormat/>
-    <w:rsid w:val="00382500"/>
+    <w:rsid w:val="007C771D"/>
     <w:pPr>
       <w:ind w:left="720"/>
       <w:contextualSpacing/>
     </w:pPr>
+    <w:rPr>
+      <w:sz w:val="18"/>
+    </w:rPr>
   </w:style>
   <w:style w:type="character" w:styleId="IntenseEmphasis">
     <w:name w:val="Intense Emphasis"/>
@@ -2858,110 +3289,16 @@
         <a:srgbClr val="B26B02"/>
       </a:folHlink>
     </a:clrScheme>
-    <a:fontScheme name="Office">
+    <a:fontScheme name="Custom 3">
       <a:majorFont>
-        <a:latin typeface="Aptos Display" panose="02110004020202020204"/>
+        <a:latin typeface="Fira Code"/>
         <a:ea typeface=""/>
         <a:cs typeface=""/>
-        <a:font script="Jpan" typeface="游ゴシック Light"/>
-        <a:font script="Hang" typeface="맑은 고딕"/>
-        <a:font script="Hans" typeface="等线 Light"/>
-        <a:font script="Hant" typeface="新細明體"/>
-        <a:font script="Arab" typeface="Times New Roman"/>
-        <a:font script="Hebr" typeface="Times New Roman"/>
-        <a:font script="Thai" typeface="Angsana New"/>
-        <a:font script="Ethi" typeface="Nyala"/>
-        <a:font script="Beng" typeface="Vrinda"/>
-        <a:font script="Gujr" typeface="Shruti"/>
-        <a:font script="Khmr" typeface="MoolBoran"/>
-        <a:font script="Knda" typeface="Tunga"/>
-        <a:font script="Guru" typeface="Raavi"/>
-        <a:font script="Cans" typeface="Euphemia"/>
-        <a:font script="Cher" typeface="Plantagenet Cherokee"/>
-        <a:font script="Yiii" typeface="Microsoft Yi Baiti"/>
-        <a:font script="Tibt" typeface="Microsoft Himalaya"/>
-        <a:font script="Thaa" typeface="MV Boli"/>
-        <a:font script="Deva" typeface="Mangal"/>
-        <a:font script="Telu" typeface="Gautami"/>
-        <a:font script="Taml" typeface="Latha"/>
-        <a:font script="Syrc" typeface="Estrangelo Edessa"/>
-        <a:font script="Orya" typeface="Kalinga"/>
-        <a:font script="Mlym" typeface="Kartika"/>
-        <a:font script="Laoo" typeface="DokChampa"/>
-        <a:font script="Sinh" typeface="Iskoola Pota"/>
-        <a:font script="Mong" typeface="Mongolian Baiti"/>
-        <a:font script="Viet" typeface="Times New Roman"/>
-        <a:font script="Uigh" typeface="Microsoft Uighur"/>
-        <a:font script="Geor" typeface="Sylfaen"/>
-        <a:font script="Armn" typeface="Arial"/>
-        <a:font script="Bugi" typeface="Leelawadee UI"/>
-        <a:font script="Bopo" typeface="Microsoft JhengHei"/>
-        <a:font script="Java" typeface="Javanese Text"/>
-        <a:font script="Lisu" typeface="Segoe UI"/>
-        <a:font script="Mymr" typeface="Myanmar Text"/>
-        <a:font script="Nkoo" typeface="Ebrima"/>
-        <a:font script="Olck" typeface="Nirmala UI"/>
-        <a:font script="Osma" typeface="Ebrima"/>
-        <a:font script="Phag" typeface="Phagspa"/>
-        <a:font script="Syrn" typeface="Estrangelo Edessa"/>
-        <a:font script="Syrj" typeface="Estrangelo Edessa"/>
-        <a:font script="Syre" typeface="Estrangelo Edessa"/>
-        <a:font script="Sora" typeface="Nirmala UI"/>
-        <a:font script="Tale" typeface="Microsoft Tai Le"/>
-        <a:font script="Talu" typeface="Microsoft New Tai Lue"/>
-        <a:font script="Tfng" typeface="Ebrima"/>
       </a:majorFont>
       <a:minorFont>
-        <a:latin typeface="Aptos" panose="02110004020202020204"/>
+        <a:latin typeface="Fira Code"/>
         <a:ea typeface=""/>
         <a:cs typeface=""/>
-        <a:font script="Jpan" typeface="游明朝"/>
-        <a:font script="Hang" typeface="맑은 고딕"/>
-        <a:font script="Hans" typeface="等线"/>
-        <a:font script="Hant" typeface="新細明體"/>
-        <a:font script="Arab" typeface="Arial"/>
-        <a:font script="Hebr" typeface="Arial"/>
-        <a:font script="Thai" typeface="Cordia New"/>
-        <a:font script="Ethi" typeface="Nyala"/>
-        <a:font script="Beng" typeface="Vrinda"/>
-        <a:font script="Gujr" typeface="Shruti"/>
-        <a:font script="Khmr" typeface="DaunPenh"/>
-        <a:font script="Knda" typeface="Tunga"/>
-        <a:font script="Guru" typeface="Raavi"/>
-        <a:font script="Cans" typeface="Euphemia"/>
-        <a:font script="Cher" typeface="Plantagenet Cherokee"/>
-        <a:font script="Yiii" typeface="Microsoft Yi Baiti"/>
-        <a:font script="Tibt" typeface="Microsoft Himalaya"/>
-        <a:font script="Thaa" typeface="MV Boli"/>
-        <a:font script="Deva" typeface="Mangal"/>
-        <a:font script="Telu" typeface="Gautami"/>
-        <a:font script="Taml" typeface="Latha"/>
-        <a:font script="Syrc" typeface="Estrangelo Edessa"/>
-        <a:font script="Orya" typeface="Kalinga"/>
-        <a:font script="Mlym" typeface="Kartika"/>
-        <a:font script="Laoo" typeface="DokChampa"/>
-        <a:font script="Sinh" typeface="Iskoola Pota"/>
-        <a:font script="Mong" typeface="Mongolian Baiti"/>
-        <a:font script="Viet" typeface="Arial"/>
-        <a:font script="Uigh" typeface="Microsoft Uighur"/>
-        <a:font script="Geor" typeface="Sylfaen"/>
-        <a:font script="Armn" typeface="Arial"/>
-        <a:font script="Bugi" typeface="Leelawadee UI"/>
-        <a:font script="Bopo" typeface="Microsoft JhengHei"/>
-        <a:font script="Java" typeface="Javanese Text"/>
-        <a:font script="Lisu" typeface="Segoe UI"/>
-        <a:font script="Mymr" typeface="Myanmar Text"/>
-        <a:font script="Nkoo" typeface="Ebrima"/>
-        <a:font script="Olck" typeface="Nirmala UI"/>
-        <a:font script="Osma" typeface="Ebrima"/>
-        <a:font script="Phag" typeface="Phagspa"/>
-        <a:font script="Syrn" typeface="Estrangelo Edessa"/>
-        <a:font script="Syrj" typeface="Estrangelo Edessa"/>
-        <a:font script="Syre" typeface="Estrangelo Edessa"/>
-        <a:font script="Sora" typeface="Nirmala UI"/>
-        <a:font script="Tale" typeface="Microsoft Tai Le"/>
-        <a:font script="Talu" typeface="Microsoft New Tai Lue"/>
-        <a:font script="Tfng" typeface="Ebrima"/>
       </a:minorFont>
     </a:fontScheme>
     <a:fmtScheme name="Office">

</xml_diff>

<commit_message>
Installed bochs, created runtime config file. Everything works except automatic breakpoints via RC file
</commit_message>
<xml_diff>
--- a/docs/TusMuertos-v2.0-Design.docx
+++ b/docs/TusMuertos-v2.0-Design.docx
@@ -447,15 +447,7 @@
         </w:numPr>
       </w:pPr>
       <w:r>
-        <w:t xml:space="preserve">Image, bin editor, concatenation, elf info, debug, tracer, </w:t>
-      </w:r>
-      <w:proofErr w:type="spellStart"/>
-      <w:r>
-        <w:t>etc</w:t>
-      </w:r>
-      <w:proofErr w:type="spellEnd"/>
-      <w:r>
-        <w:t>……</w:t>
+        <w:t>Image, bin editor, concatenation, elf info, debug, tracer, etc……</w:t>
       </w:r>
     </w:p>
     <w:p/>
@@ -525,15 +517,7 @@
         </w:numPr>
       </w:pPr>
       <w:r>
-        <w:t xml:space="preserve">2 Stages. Minimal first stage until Protected mode + Second stage to </w:t>
-      </w:r>
-      <w:proofErr w:type="gramStart"/>
-      <w:r>
-        <w:t>Long</w:t>
-      </w:r>
-      <w:proofErr w:type="gramEnd"/>
-      <w:r>
-        <w:t xml:space="preserve"> mode</w:t>
+        <w:t>2 Stages. Minimal first stage until Protected mode + Second stage to Long mode</w:t>
       </w:r>
     </w:p>
     <w:p>
@@ -749,15 +733,7 @@
         </w:numPr>
       </w:pPr>
       <w:r>
-        <w:t xml:space="preserve">Jump to Protected mode if Stage1 </w:t>
-      </w:r>
-      <w:proofErr w:type="gramStart"/>
-      <w:r>
-        <w:t>did</w:t>
-      </w:r>
-      <w:proofErr w:type="gramEnd"/>
-      <w:r>
-        <w:t xml:space="preserve"> not change mode.</w:t>
+        <w:t>Jump to Protected mode if Stage1 did not change mode.</w:t>
       </w:r>
     </w:p>
     <w:p>
@@ -769,23 +745,7 @@
         </w:numPr>
       </w:pPr>
       <w:r>
-        <w:t xml:space="preserve">Enable </w:t>
-      </w:r>
-      <w:proofErr w:type="gramStart"/>
-      <w:r>
-        <w:t>A20, or</w:t>
-      </w:r>
-      <w:proofErr w:type="gramEnd"/>
-      <w:r>
-        <w:t xml:space="preserve"> at least check. There are multiple strategies for this. Some platforms have fast </w:t>
-      </w:r>
-      <w:proofErr w:type="gramStart"/>
-      <w:r>
-        <w:t>enable</w:t>
-      </w:r>
-      <w:proofErr w:type="gramEnd"/>
-      <w:r>
-        <w:t xml:space="preserve"> 0x92, or they come with A20 already enable. XXXX</w:t>
+        <w:t>Enable A20, or at least check. There are multiple strategies for this. Some platforms have fast enable 0x92, or they come with A20 already enable. XXXX</w:t>
       </w:r>
     </w:p>
     <w:p>
@@ -809,15 +769,7 @@
         </w:numPr>
       </w:pPr>
       <w:r>
-        <w:t xml:space="preserve">Gather info for the kernel: Memory, graphics, bios, </w:t>
-      </w:r>
-      <w:proofErr w:type="spellStart"/>
-      <w:r>
-        <w:t>acpi</w:t>
-      </w:r>
-      <w:proofErr w:type="spellEnd"/>
-      <w:r>
-        <w:t>, others…</w:t>
+        <w:t>Gather info for the kernel: Memory, graphics, bios, acpi, others…</w:t>
       </w:r>
     </w:p>
     <w:p>
@@ -841,15 +793,7 @@
         </w:numPr>
       </w:pPr>
       <w:r>
-        <w:t xml:space="preserve">Flat binary: Explore this option, </w:t>
-      </w:r>
-      <w:proofErr w:type="gramStart"/>
-      <w:r>
-        <w:t>maybe</w:t>
-      </w:r>
-      <w:proofErr w:type="gramEnd"/>
-      <w:r>
-        <w:t xml:space="preserve"> is simpler</w:t>
+        <w:t>Flat binary: Explore this option, maybe is simpler</w:t>
       </w:r>
     </w:p>
     <w:p>
@@ -861,15 +805,7 @@
         </w:numPr>
       </w:pPr>
       <w:r>
-        <w:t xml:space="preserve">ELF: Parser + segments + </w:t>
-      </w:r>
-      <w:proofErr w:type="spellStart"/>
-      <w:r>
-        <w:t>etc</w:t>
-      </w:r>
-      <w:proofErr w:type="spellEnd"/>
-      <w:r>
-        <w:t>…</w:t>
+        <w:t>ELF: Parser + segments + etc…</w:t>
       </w:r>
     </w:p>
     <w:p>
@@ -905,15 +841,7 @@
         </w:numPr>
       </w:pPr>
       <w:r>
-        <w:t xml:space="preserve">Verify if long </w:t>
-      </w:r>
-      <w:proofErr w:type="gramStart"/>
-      <w:r>
-        <w:t>mode</w:t>
-      </w:r>
-      <w:proofErr w:type="gramEnd"/>
-      <w:r>
-        <w:t xml:space="preserve"> if possible, for completeness</w:t>
+        <w:t>Verify if long mode if possible, for completeness</w:t>
       </w:r>
     </w:p>
     <w:p>
@@ -1100,7 +1028,6 @@
       <w:r>
         <w:t>Invoke explorer Windows using “</w:t>
       </w:r>
-      <w:proofErr w:type="gramStart"/>
       <w:r>
         <w:rPr>
           <w:b/>
@@ -1108,7 +1035,6 @@
         </w:rPr>
         <w:t>explorer.exe .</w:t>
       </w:r>
-      <w:proofErr w:type="gramEnd"/>
       <w:r>
         <w:t>”</w:t>
       </w:r>
@@ -1133,23 +1059,7 @@
           <w:b/>
           <w:bCs/>
         </w:rPr>
-        <w:t>/</w:t>
-      </w:r>
-      <w:proofErr w:type="spellStart"/>
-      <w:r>
-        <w:rPr>
-          <w:b/>
-          <w:bCs/>
-        </w:rPr>
-        <w:t>mnt</w:t>
-      </w:r>
-      <w:proofErr w:type="spellEnd"/>
-      <w:r>
-        <w:rPr>
-          <w:b/>
-          <w:bCs/>
-        </w:rPr>
-        <w:t>/c/Program Files (x86)</w:t>
+        <w:t>/mnt/c/Program Files (x86)</w:t>
       </w:r>
     </w:p>
     <w:p>
@@ -1266,13 +1176,8 @@
           <w:bCs/>
         </w:rPr>
       </w:pPr>
-      <w:proofErr w:type="gramStart"/>
-      <w:r>
-        <w:t>Also</w:t>
-      </w:r>
-      <w:proofErr w:type="gramEnd"/>
-      <w:r>
-        <w:t xml:space="preserve"> you can </w:t>
+      <w:r>
+        <w:t xml:space="preserve">Also you can </w:t>
       </w:r>
       <w:r>
         <w:t xml:space="preserve">net use </w:t>
@@ -1320,35 +1225,18 @@
       <w:r>
         <w:t>Example: “</w:t>
       </w:r>
-      <w:proofErr w:type="spellStart"/>
-      <w:r>
-        <w:rPr>
-          <w:b/>
-          <w:bCs/>
-        </w:rPr>
-        <w:t>wsl</w:t>
-      </w:r>
-      <w:proofErr w:type="spellEnd"/>
-      <w:r>
-        <w:rPr>
-          <w:b/>
-          <w:bCs/>
-        </w:rPr>
-        <w:t xml:space="preserve"> ls -la</w:t>
+      <w:r>
+        <w:rPr>
+          <w:b/>
+          <w:bCs/>
+        </w:rPr>
+        <w:t>wsl ls -la</w:t>
       </w:r>
       <w:r>
         <w:t>”</w:t>
       </w:r>
       <w:r>
-        <w:t xml:space="preserve"> will output </w:t>
-      </w:r>
-      <w:proofErr w:type="spellStart"/>
-      <w:r>
-        <w:t>Windos</w:t>
-      </w:r>
-      <w:proofErr w:type="spellEnd"/>
-      <w:r>
-        <w:t xml:space="preserve"> folder but using Linux ls</w:t>
+        <w:t xml:space="preserve"> will output Windos folder but using Linux ls</w:t>
       </w:r>
     </w:p>
     <w:p>
@@ -1362,37 +1250,12 @@
       <w:r>
         <w:t xml:space="preserve">Example: </w:t>
       </w:r>
-      <w:proofErr w:type="spellStart"/>
-      <w:r>
-        <w:rPr>
-          <w:b/>
-          <w:bCs/>
-        </w:rPr>
-        <w:t>wsl</w:t>
-      </w:r>
-      <w:proofErr w:type="spellEnd"/>
-      <w:r>
-        <w:rPr>
-          <w:b/>
-          <w:bCs/>
-        </w:rPr>
-        <w:t xml:space="preserve"> ls -la | </w:t>
-      </w:r>
-      <w:proofErr w:type="spellStart"/>
-      <w:r>
-        <w:rPr>
-          <w:b/>
-          <w:bCs/>
-        </w:rPr>
-        <w:t>findstr</w:t>
-      </w:r>
-      <w:proofErr w:type="spellEnd"/>
-      <w:r>
-        <w:rPr>
-          <w:b/>
-          <w:bCs/>
-        </w:rPr>
-        <w:t xml:space="preserve"> "git"</w:t>
+      <w:r>
+        <w:rPr>
+          <w:b/>
+          <w:bCs/>
+        </w:rPr>
+        <w:t>wsl ls -la | findstr "git"</w:t>
       </w:r>
     </w:p>
     <w:p>
@@ -1468,13 +1331,8 @@
           <w:numId w:val="1"/>
         </w:numPr>
       </w:pPr>
-      <w:proofErr w:type="spellStart"/>
-      <w:r>
-        <w:t>sudo</w:t>
-      </w:r>
-      <w:proofErr w:type="spellEnd"/>
-      <w:r>
-        <w:t xml:space="preserve"> apt update</w:t>
+      <w:r>
+        <w:t>sudo apt update</w:t>
       </w:r>
     </w:p>
     <w:p>
@@ -1485,13 +1343,8 @@
           <w:numId w:val="1"/>
         </w:numPr>
       </w:pPr>
-      <w:proofErr w:type="spellStart"/>
-      <w:r>
-        <w:t>sudo</w:t>
-      </w:r>
-      <w:proofErr w:type="spellEnd"/>
-      <w:r>
-        <w:t xml:space="preserve"> apt upgrade -y</w:t>
+      <w:r>
+        <w:t>sudo apt upgrade -y</w:t>
       </w:r>
     </w:p>
     <w:p>
@@ -1502,13 +1355,8 @@
           <w:numId w:val="1"/>
         </w:numPr>
       </w:pPr>
-      <w:proofErr w:type="spellStart"/>
-      <w:r>
-        <w:t>sudo</w:t>
-      </w:r>
-      <w:proofErr w:type="spellEnd"/>
-      <w:r>
-        <w:t xml:space="preserve"> apt full-upgrade -y</w:t>
+      <w:r>
+        <w:t>sudo apt full-upgrade -y</w:t>
       </w:r>
     </w:p>
     <w:p>
@@ -1519,21 +1367,8 @@
           <w:numId w:val="1"/>
         </w:numPr>
       </w:pPr>
-      <w:proofErr w:type="spellStart"/>
-      <w:r>
-        <w:t>sudo</w:t>
-      </w:r>
-      <w:proofErr w:type="spellEnd"/>
-      <w:r>
-        <w:t xml:space="preserve"> apt </w:t>
-      </w:r>
-      <w:proofErr w:type="spellStart"/>
-      <w:r>
-        <w:t>autoremove</w:t>
-      </w:r>
-      <w:proofErr w:type="spellEnd"/>
-      <w:r>
-        <w:t xml:space="preserve"> -y</w:t>
+      <w:r>
+        <w:t>sudo apt autoremove -y</w:t>
       </w:r>
     </w:p>
     <w:p>
@@ -1544,13 +1379,8 @@
           <w:numId w:val="1"/>
         </w:numPr>
       </w:pPr>
-      <w:proofErr w:type="gramStart"/>
-      <w:r>
-        <w:t>Install</w:t>
-      </w:r>
-      <w:proofErr w:type="gramEnd"/>
-      <w:r>
-        <w:t xml:space="preserve"> NASM assembler</w:t>
+      <w:r>
+        <w:t>Install NASM assembler</w:t>
       </w:r>
     </w:p>
     <w:p>
@@ -1561,21 +1391,8 @@
           <w:numId w:val="1"/>
         </w:numPr>
       </w:pPr>
-      <w:proofErr w:type="spellStart"/>
-      <w:r>
-        <w:t>sudo</w:t>
-      </w:r>
-      <w:proofErr w:type="spellEnd"/>
-      <w:r>
-        <w:t xml:space="preserve"> apt install </w:t>
-      </w:r>
-      <w:proofErr w:type="spellStart"/>
-      <w:r>
-        <w:t>nasm</w:t>
-      </w:r>
-      <w:proofErr w:type="spellEnd"/>
-      <w:r>
-        <w:t xml:space="preserve"> -y</w:t>
+      <w:r>
+        <w:t>sudo apt install nasm -y</w:t>
       </w:r>
     </w:p>
     <w:p>
@@ -1587,23 +1404,7 @@
         </w:numPr>
       </w:pPr>
       <w:r>
-        <w:t xml:space="preserve">Create a temporary alias for </w:t>
-      </w:r>
-      <w:proofErr w:type="spellStart"/>
-      <w:r>
-        <w:t>cls</w:t>
-      </w:r>
-      <w:proofErr w:type="spellEnd"/>
-      <w:r>
-        <w:t xml:space="preserve"> = </w:t>
-      </w:r>
-      <w:proofErr w:type="gramStart"/>
-      <w:r>
-        <w:t>clear(</w:t>
-      </w:r>
-      <w:proofErr w:type="gramEnd"/>
-      <w:r>
-        <w:t>investigate how to make it permanent)</w:t>
+        <w:t>Install bximage:</w:t>
       </w:r>
     </w:p>
     <w:p>
@@ -1615,15 +1416,7 @@
         </w:numPr>
       </w:pPr>
       <w:r>
-        <w:t xml:space="preserve">alias </w:t>
-      </w:r>
-      <w:proofErr w:type="spellStart"/>
-      <w:r>
-        <w:t>cls</w:t>
-      </w:r>
-      <w:proofErr w:type="spellEnd"/>
-      <w:r>
-        <w:t>='clear'</w:t>
+        <w:t>sudo apt install bximage</w:t>
       </w:r>
     </w:p>
     <w:p>
@@ -1635,15 +1428,31 @@
         </w:numPr>
       </w:pPr>
       <w:r>
-        <w:t xml:space="preserve">Install </w:t>
-      </w:r>
-      <w:proofErr w:type="spellStart"/>
-      <w:r>
-        <w:t>qemu</w:t>
-      </w:r>
-      <w:proofErr w:type="spellEnd"/>
-      <w:r>
-        <w:t xml:space="preserve"> on Windows:</w:t>
+        <w:t>Create a temporary alias for cls = clear(investigate how to make it permanent)</w:t>
+      </w:r>
+    </w:p>
+    <w:p>
+      <w:pPr>
+        <w:pStyle w:val="ListParagraph"/>
+        <w:numPr>
+          <w:ilvl w:val="1"/>
+          <w:numId w:val="1"/>
+        </w:numPr>
+      </w:pPr>
+      <w:r>
+        <w:t>alias cls='clear'</w:t>
+      </w:r>
+    </w:p>
+    <w:p>
+      <w:pPr>
+        <w:pStyle w:val="ListParagraph"/>
+        <w:numPr>
+          <w:ilvl w:val="0"/>
+          <w:numId w:val="1"/>
+        </w:numPr>
+      </w:pPr>
+      <w:r>
+        <w:t>Install qemu on Windows:</w:t>
       </w:r>
       <w:r>
         <w:t xml:space="preserve"> </w:t>
@@ -1687,107 +1496,221 @@
       <w:pPr>
         <w:pStyle w:val="ListParagraph"/>
         <w:numPr>
+          <w:ilvl w:val="0"/>
+          <w:numId w:val="1"/>
+        </w:numPr>
+      </w:pPr>
+      <w:r>
+        <w:t xml:space="preserve">Install Bochs, version 3.0 October 2025 </w:t>
+      </w:r>
+      <w:hyperlink r:id="rId9" w:history="1">
+        <w:r>
+          <w:rPr>
+            <w:rStyle w:val="Hyperlink"/>
+          </w:rPr>
+          <w:t>https://github.com/bochs-emu/Bochs/releases</w:t>
+        </w:r>
+      </w:hyperlink>
+      <w:r>
+        <w:t xml:space="preserve"> </w:t>
+      </w:r>
+    </w:p>
+    <w:p>
+      <w:pPr>
+        <w:pStyle w:val="ListParagraph"/>
+        <w:numPr>
           <w:ilvl w:val="1"/>
           <w:numId w:val="1"/>
         </w:numPr>
       </w:pPr>
+      <w:r>
+        <w:t xml:space="preserve">Installation path: </w:t>
+      </w:r>
+      <w:r>
+        <w:t>C:\Program Files\Bochs-3.0</w:t>
+      </w:r>
     </w:p>
     <w:p/>
     <w:p>
       <w:pPr>
-        <w:pStyle w:val="Heading1"/>
-      </w:pPr>
-      <w:r>
-        <w:t>Common Linux and Windows commands</w:t>
-      </w:r>
-    </w:p>
-    <w:p/>
-    <w:p>
-      <w:pPr>
         <w:pStyle w:val="Heading2"/>
       </w:pPr>
       <w:r>
-        <w:t>Linux</w:t>
-      </w:r>
-    </w:p>
-    <w:p/>
-    <w:p>
-      <w:proofErr w:type="spellStart"/>
-      <w:r>
-        <w:t>nasm</w:t>
-      </w:r>
-      <w:proofErr w:type="spellEnd"/>
-      <w:r>
-        <w:t xml:space="preserve"> -f bin </w:t>
-      </w:r>
-      <w:proofErr w:type="spellStart"/>
-      <w:r>
-        <w:t>src</w:t>
-      </w:r>
-      <w:proofErr w:type="spellEnd"/>
-      <w:r>
-        <w:t xml:space="preserve">/bootloader/stage1.asm -o </w:t>
-      </w:r>
-      <w:proofErr w:type="spellStart"/>
-      <w:r>
-        <w:t>src</w:t>
-      </w:r>
-      <w:proofErr w:type="spellEnd"/>
-      <w:r>
-        <w:t>/build/stage1.bin</w:t>
-      </w:r>
-    </w:p>
-    <w:p/>
-    <w:p>
-      <w:pPr>
-        <w:pStyle w:val="Heading2"/>
-      </w:pPr>
-      <w:r>
-        <w:t>Windows PowerShell</w:t>
-      </w:r>
-    </w:p>
-    <w:p/>
-    <w:p>
-      <w:r>
-        <w:t xml:space="preserve">Run </w:t>
-      </w:r>
-      <w:proofErr w:type="spellStart"/>
-      <w:r>
-        <w:t>qemu</w:t>
-      </w:r>
-      <w:proofErr w:type="spellEnd"/>
-      <w:r>
-        <w:t xml:space="preserve"> with the bootloader bin</w:t>
-      </w:r>
-    </w:p>
-    <w:p>
-      <w:r>
-        <w:t>qemu-system-i386 -drive format=</w:t>
-      </w:r>
-      <w:proofErr w:type="gramStart"/>
-      <w:r>
-        <w:t>raw,file</w:t>
-      </w:r>
-      <w:proofErr w:type="gramEnd"/>
-      <w:r>
-        <w:t>=</w:t>
-      </w:r>
-      <w:proofErr w:type="gramStart"/>
-      <w:r>
-        <w:t>C:\Users\mihe\Dropbox\TusMuertOS-Oct2025\src\build\stage1.bin,if</w:t>
-      </w:r>
-      <w:proofErr w:type="gramEnd"/>
-      <w:r>
-        <w:t>=floppy</w:t>
+        <w:t>BUILD PROCESS BEFORE MAKE</w:t>
       </w:r>
     </w:p>
     <w:p/>
     <w:p/>
     <w:p>
       <w:pPr>
+        <w:pStyle w:val="Heading2"/>
+      </w:pPr>
+      <w:r>
+        <w:t>BUILD PROCESS AFTER MAKE</w:t>
+      </w:r>
+    </w:p>
+    <w:p/>
+    <w:p>
+      <w:pPr>
         <w:pStyle w:val="Heading1"/>
       </w:pPr>
       <w:r>
+        <w:t>Common Linux and Windows commands</w:t>
+      </w:r>
+    </w:p>
+    <w:p/>
+    <w:p>
+      <w:pPr>
+        <w:pStyle w:val="Heading2"/>
+      </w:pPr>
+      <w:r>
+        <w:t>Linux</w:t>
+      </w:r>
+    </w:p>
+    <w:p/>
+    <w:p>
+      <w:r>
+        <w:t>nasm -f bin src/bootloader/stage1.asm -o src/build/stage1.bin</w:t>
+      </w:r>
+    </w:p>
+    <w:p/>
+    <w:p>
+      <w:r>
+        <w:t xml:space="preserve">bximage to create an empty floppy disk. It is an interactive tool with a menu. It shows this info after execution: </w:t>
+      </w:r>
+      <w:r>
+        <w:t>The following line should appear in your bochsrc:</w:t>
+      </w:r>
+    </w:p>
+    <w:p>
+      <w:r>
+        <w:lastRenderedPageBreak/>
+        <w:t xml:space="preserve">  floppya: image="floppy.img", status=inserted</w:t>
+      </w:r>
+    </w:p>
+    <w:p>
+      <w:r>
+        <w:t xml:space="preserve">Alternative to create the empty disk: </w:t>
+      </w:r>
+      <w:r>
+        <w:t>dd if=/dev/zero of=teaching.img bs=512 count=2880</w:t>
+      </w:r>
+    </w:p>
+    <w:p/>
+    <w:p>
+      <w:r>
+        <w:t xml:space="preserve">Inject the bootloader (512 bytes, One sector if I am not mistaketn) at the beginning of the empty disk image: </w:t>
+      </w:r>
+      <w:r>
+        <w:t>dd if=stage1.bin of=floppy.img bs=512 count=1 conv=notrunc</w:t>
+      </w:r>
+    </w:p>
+    <w:p/>
+    <w:p>
+      <w:r>
+        <w:t xml:space="preserve">To quickly see the content of the disk: </w:t>
+      </w:r>
+      <w:r>
+        <w:t>xxd -l 512 floppy.img</w:t>
+      </w:r>
+    </w:p>
+    <w:p/>
+    <w:p/>
+    <w:p>
+      <w:pPr>
+        <w:pStyle w:val="Heading2"/>
+      </w:pPr>
+      <w:r>
+        <w:t>Windows PowerShell</w:t>
+      </w:r>
+    </w:p>
+    <w:p/>
+    <w:p>
+      <w:r>
+        <w:t>Run qemu with the bootloader bin</w:t>
+      </w:r>
+    </w:p>
+    <w:p>
+      <w:r>
+        <w:t>qemu-system-i386 -drive format=raw,file=C:\Users\mihe\Dropbox\TusMuertOS-Oct2025\src\build\stage1.bin,if=floppy</w:t>
+      </w:r>
+    </w:p>
+    <w:p/>
+    <w:p>
+      <w:r>
+        <w:t>Prepare and run Bochs</w:t>
+      </w:r>
+    </w:p>
+    <w:p>
+      <w:r>
+        <w:t xml:space="preserve">Create a Bochs configuration file, copying the template: </w:t>
+      </w:r>
+      <w:r>
+        <w:t>bochsrc-sample.txt</w:t>
+      </w:r>
+    </w:p>
+    <w:p>
+      <w:r>
+        <w:t xml:space="preserve">Uncomment the lines you require with the settings you require. </w:t>
+      </w:r>
+    </w:p>
+    <w:p>
+      <w:r>
+        <w:t>Copy the template where the img is (in the file you also use full path or relative to the .img and output logs).</w:t>
+      </w:r>
+    </w:p>
+    <w:p>
+      <w:r>
+        <w:t xml:space="preserve">Run this: </w:t>
+      </w:r>
+      <w:r>
+        <w:t>bochs -f .\bochsrc-runtime.txt -q -debugger</w:t>
+      </w:r>
+    </w:p>
+    <w:p>
+      <w:r>
+        <w:tab/>
+        <w:t>-f: configfile</w:t>
+      </w:r>
+    </w:p>
+    <w:p>
+      <w:r>
+        <w:tab/>
+        <w:t>-q: don’t show the configuration screen before start</w:t>
+      </w:r>
+    </w:p>
+    <w:p>
+      <w:r>
+        <w:tab/>
+        <w:t>-debugger: memory, registers, etc…</w:t>
+      </w:r>
+    </w:p>
+    <w:p>
+      <w:r>
+        <w:t>bochs -f .\bochsrc-runtime.txt -q -debugger</w:t>
+      </w:r>
+    </w:p>
+    <w:p/>
+    <w:p>
+      <w:r>
+        <w:t>NEXT DAY !!!!!!!!!!!!!!!!!!!!!!!!!!!!!!!!!!!!!!</w:t>
+      </w:r>
+    </w:p>
+    <w:p>
+      <w:r>
+        <w:t>bochs -f .\bochsrc-runtime.txt -q -debugger -rc .\bochs.cmds</w:t>
+      </w:r>
+      <w:r>
+        <w:t xml:space="preserve"> try to enable automatic breakpoint, without magic breakpoints, which take space from the bootloader.</w:t>
+      </w:r>
+    </w:p>
+    <w:p/>
+    <w:p>
+      <w:pPr>
+        <w:pStyle w:val="Heading1"/>
+      </w:pPr>
+      <w:r>
+        <w:lastRenderedPageBreak/>
         <w:t>Random nuggets of knowledge</w:t>
       </w:r>
     </w:p>
@@ -1797,7 +1720,6 @@
         <w:pStyle w:val="Heading2"/>
       </w:pPr>
       <w:r>
-        <w:lastRenderedPageBreak/>
         <w:t>How Org directive works in NASM assembly</w:t>
       </w:r>
     </w:p>
@@ -1833,15 +1755,7 @@
         </w:pBdr>
       </w:pPr>
       <w:r>
-        <w:t xml:space="preserve">    mov ax, start    </w:t>
-      </w:r>
-      <w:proofErr w:type="gramStart"/>
-      <w:r>
-        <w:t xml:space="preserve">  ;</w:t>
-      </w:r>
-      <w:proofErr w:type="gramEnd"/>
-      <w:r>
-        <w:t xml:space="preserve"> imm16 encodes the absolute offset of “start”</w:t>
+        <w:t xml:space="preserve">    mov ax, start      ; imm16 encodes the absolute offset of “start”</w:t>
       </w:r>
     </w:p>
     <w:p>
@@ -1866,6 +1780,66 @@
       </w:pPr>
       <w:r>
         <w:t>With org 0x0000, it assembles as: B8 00 00 (AX ← 0x0000)</w:t>
+      </w:r>
+    </w:p>
+    <w:p/>
+    <w:p/>
+    <w:p/>
+    <w:p/>
+    <w:p>
+      <w:pPr>
+        <w:pStyle w:val="Heading2"/>
+      </w:pPr>
+      <w:r>
+        <w:t>Screenshots</w:t>
+      </w:r>
+    </w:p>
+    <w:p/>
+    <w:p>
+      <w:r>
+        <w:t>31-October-2025</w:t>
+      </w:r>
+    </w:p>
+    <w:p/>
+    <w:p/>
+    <w:p>
+      <w:r>
+        <w:lastRenderedPageBreak/>
+        <w:drawing>
+          <wp:inline distT="0" distB="0" distL="0" distR="0" wp14:anchorId="13B72F9A" wp14:editId="3497B51B">
+            <wp:extent cx="5943600" cy="3763645"/>
+            <wp:effectExtent l="0" t="0" r="0" b="8255"/>
+            <wp:docPr id="1202577022" name="Picture 1" descr="A screenshot of a computer&#10;&#10;AI-generated content may be incorrect."/>
+            <wp:cNvGraphicFramePr>
+              <a:graphicFrameLocks xmlns:a="http://schemas.openxmlformats.org/drawingml/2006/main" noChangeAspect="1"/>
+            </wp:cNvGraphicFramePr>
+            <a:graphic xmlns:a="http://schemas.openxmlformats.org/drawingml/2006/main">
+              <a:graphicData uri="http://schemas.openxmlformats.org/drawingml/2006/picture">
+                <pic:pic xmlns:pic="http://schemas.openxmlformats.org/drawingml/2006/picture">
+                  <pic:nvPicPr>
+                    <pic:cNvPr id="1202577022" name="Picture 1" descr="A screenshot of a computer&#10;&#10;AI-generated content may be incorrect."/>
+                    <pic:cNvPicPr/>
+                  </pic:nvPicPr>
+                  <pic:blipFill>
+                    <a:blip r:embed="rId10"/>
+                    <a:stretch>
+                      <a:fillRect/>
+                    </a:stretch>
+                  </pic:blipFill>
+                  <pic:spPr>
+                    <a:xfrm>
+                      <a:off x="0" y="0"/>
+                      <a:ext cx="5943600" cy="3763645"/>
+                    </a:xfrm>
+                    <a:prstGeom prst="rect">
+                      <a:avLst/>
+                    </a:prstGeom>
+                  </pic:spPr>
+                </pic:pic>
+              </a:graphicData>
+            </a:graphic>
+          </wp:inline>
+        </w:drawing>
       </w:r>
     </w:p>
     <w:sectPr>
@@ -2139,6 +2113,15 @@
     <w:abstractNumId w:val="0"/>
   </w:num>
   <w:num w:numId="18" w16cid:durableId="438843113">
+    <w:abstractNumId w:val="0"/>
+  </w:num>
+  <w:num w:numId="19" w16cid:durableId="1767576235">
+    <w:abstractNumId w:val="0"/>
+  </w:num>
+  <w:num w:numId="20" w16cid:durableId="2083985307">
+    <w:abstractNumId w:val="0"/>
+  </w:num>
+  <w:num w:numId="21" w16cid:durableId="808014797">
     <w:abstractNumId w:val="0"/>
   </w:num>
 </w:numbering>

</xml_diff>

<commit_message>
vscode no autocomplete for asm and makefile. Added simple build makefile
</commit_message>
<xml_diff>
--- a/docs/TusMuertos-v2.0-Design.docx
+++ b/docs/TusMuertos-v2.0-Design.docx
@@ -202,8 +202,13 @@
         <w:t>/Zig</w:t>
       </w:r>
       <w:r>
-        <w:t xml:space="preserve"> for challenge. NASM assembly for bootloader</w:t>
-      </w:r>
+        <w:t xml:space="preserve"> for challenge. NASM assembly for </w:t>
+      </w:r>
+      <w:proofErr w:type="gramStart"/>
+      <w:r>
+        <w:t>bootloader</w:t>
+      </w:r>
+      <w:proofErr w:type="gramEnd"/>
       <w:r>
         <w:t xml:space="preserve">. </w:t>
       </w:r>
@@ -447,7 +452,15 @@
         </w:numPr>
       </w:pPr>
       <w:r>
-        <w:t>Image, bin editor, concatenation, elf info, debug, tracer, etc……</w:t>
+        <w:t xml:space="preserve">Image, bin editor, concatenation, elf info, debug, tracer, </w:t>
+      </w:r>
+      <w:proofErr w:type="spellStart"/>
+      <w:r>
+        <w:t>etc</w:t>
+      </w:r>
+      <w:proofErr w:type="spellEnd"/>
+      <w:r>
+        <w:t>……</w:t>
       </w:r>
     </w:p>
     <w:p/>
@@ -517,7 +530,15 @@
         </w:numPr>
       </w:pPr>
       <w:r>
-        <w:t>2 Stages. Minimal first stage until Protected mode + Second stage to Long mode</w:t>
+        <w:t xml:space="preserve">2 Stages. Minimal first stage until Protected mode + Second stage to </w:t>
+      </w:r>
+      <w:proofErr w:type="gramStart"/>
+      <w:r>
+        <w:t>Long</w:t>
+      </w:r>
+      <w:proofErr w:type="gramEnd"/>
+      <w:r>
+        <w:t xml:space="preserve"> mode</w:t>
       </w:r>
     </w:p>
     <w:p>
@@ -733,7 +754,15 @@
         </w:numPr>
       </w:pPr>
       <w:r>
-        <w:t>Jump to Protected mode if Stage1 did not change mode.</w:t>
+        <w:t xml:space="preserve">Jump to Protected mode if Stage1 </w:t>
+      </w:r>
+      <w:proofErr w:type="gramStart"/>
+      <w:r>
+        <w:t>did</w:t>
+      </w:r>
+      <w:proofErr w:type="gramEnd"/>
+      <w:r>
+        <w:t xml:space="preserve"> not change mode.</w:t>
       </w:r>
     </w:p>
     <w:p>
@@ -745,7 +774,23 @@
         </w:numPr>
       </w:pPr>
       <w:r>
-        <w:t>Enable A20, or at least check. There are multiple strategies for this. Some platforms have fast enable 0x92, or they come with A20 already enable. XXXX</w:t>
+        <w:t xml:space="preserve">Enable </w:t>
+      </w:r>
+      <w:proofErr w:type="gramStart"/>
+      <w:r>
+        <w:t>A20, or</w:t>
+      </w:r>
+      <w:proofErr w:type="gramEnd"/>
+      <w:r>
+        <w:t xml:space="preserve"> at least check. There are multiple strategies for this. Some platforms have fast </w:t>
+      </w:r>
+      <w:proofErr w:type="gramStart"/>
+      <w:r>
+        <w:t>enable</w:t>
+      </w:r>
+      <w:proofErr w:type="gramEnd"/>
+      <w:r>
+        <w:t xml:space="preserve"> 0x92, or they come with A20 already enable. XXXX</w:t>
       </w:r>
     </w:p>
     <w:p>
@@ -769,7 +814,15 @@
         </w:numPr>
       </w:pPr>
       <w:r>
-        <w:t>Gather info for the kernel: Memory, graphics, bios, acpi, others…</w:t>
+        <w:t xml:space="preserve">Gather info for the kernel: Memory, graphics, bios, </w:t>
+      </w:r>
+      <w:proofErr w:type="spellStart"/>
+      <w:r>
+        <w:t>acpi</w:t>
+      </w:r>
+      <w:proofErr w:type="spellEnd"/>
+      <w:r>
+        <w:t>, others…</w:t>
       </w:r>
     </w:p>
     <w:p>
@@ -793,7 +846,15 @@
         </w:numPr>
       </w:pPr>
       <w:r>
-        <w:t>Flat binary: Explore this option, maybe is simpler</w:t>
+        <w:t xml:space="preserve">Flat binary: Explore this option, </w:t>
+      </w:r>
+      <w:proofErr w:type="gramStart"/>
+      <w:r>
+        <w:t>maybe</w:t>
+      </w:r>
+      <w:proofErr w:type="gramEnd"/>
+      <w:r>
+        <w:t xml:space="preserve"> is simpler</w:t>
       </w:r>
     </w:p>
     <w:p>
@@ -805,7 +866,15 @@
         </w:numPr>
       </w:pPr>
       <w:r>
-        <w:t>ELF: Parser + segments + etc…</w:t>
+        <w:t xml:space="preserve">ELF: Parser + segments + </w:t>
+      </w:r>
+      <w:proofErr w:type="spellStart"/>
+      <w:r>
+        <w:t>etc</w:t>
+      </w:r>
+      <w:proofErr w:type="spellEnd"/>
+      <w:r>
+        <w:t>…</w:t>
       </w:r>
     </w:p>
     <w:p>
@@ -841,7 +910,15 @@
         </w:numPr>
       </w:pPr>
       <w:r>
-        <w:t>Verify if long mode if possible, for completeness</w:t>
+        <w:t xml:space="preserve">Verify if long </w:t>
+      </w:r>
+      <w:proofErr w:type="gramStart"/>
+      <w:r>
+        <w:t>mode</w:t>
+      </w:r>
+      <w:proofErr w:type="gramEnd"/>
+      <w:r>
+        <w:t xml:space="preserve"> if possible, for completeness</w:t>
       </w:r>
     </w:p>
     <w:p>
@@ -1028,6 +1105,7 @@
       <w:r>
         <w:t>Invoke explorer Windows using “</w:t>
       </w:r>
+      <w:proofErr w:type="gramStart"/>
       <w:r>
         <w:rPr>
           <w:b/>
@@ -1035,6 +1113,7 @@
         </w:rPr>
         <w:t>explorer.exe .</w:t>
       </w:r>
+      <w:proofErr w:type="gramEnd"/>
       <w:r>
         <w:t>”</w:t>
       </w:r>
@@ -1059,7 +1138,23 @@
           <w:b/>
           <w:bCs/>
         </w:rPr>
-        <w:t>/mnt/c/Program Files (x86)</w:t>
+        <w:t>/</w:t>
+      </w:r>
+      <w:proofErr w:type="spellStart"/>
+      <w:r>
+        <w:rPr>
+          <w:b/>
+          <w:bCs/>
+        </w:rPr>
+        <w:t>mnt</w:t>
+      </w:r>
+      <w:proofErr w:type="spellEnd"/>
+      <w:r>
+        <w:rPr>
+          <w:b/>
+          <w:bCs/>
+        </w:rPr>
+        <w:t>/c/Program Files (x86)</w:t>
       </w:r>
     </w:p>
     <w:p>
@@ -1176,8 +1271,13 @@
           <w:bCs/>
         </w:rPr>
       </w:pPr>
-      <w:r>
-        <w:t xml:space="preserve">Also you can </w:t>
+      <w:proofErr w:type="gramStart"/>
+      <w:r>
+        <w:t>Also</w:t>
+      </w:r>
+      <w:proofErr w:type="gramEnd"/>
+      <w:r>
+        <w:t xml:space="preserve"> you can </w:t>
       </w:r>
       <w:r>
         <w:t xml:space="preserve">net use </w:t>
@@ -1225,18 +1325,35 @@
       <w:r>
         <w:t>Example: “</w:t>
       </w:r>
-      <w:r>
-        <w:rPr>
-          <w:b/>
-          <w:bCs/>
-        </w:rPr>
-        <w:t>wsl ls -la</w:t>
+      <w:proofErr w:type="spellStart"/>
+      <w:r>
+        <w:rPr>
+          <w:b/>
+          <w:bCs/>
+        </w:rPr>
+        <w:t>wsl</w:t>
+      </w:r>
+      <w:proofErr w:type="spellEnd"/>
+      <w:r>
+        <w:rPr>
+          <w:b/>
+          <w:bCs/>
+        </w:rPr>
+        <w:t xml:space="preserve"> ls -la</w:t>
       </w:r>
       <w:r>
         <w:t>”</w:t>
       </w:r>
       <w:r>
-        <w:t xml:space="preserve"> will output Windos folder but using Linux ls</w:t>
+        <w:t xml:space="preserve"> will output </w:t>
+      </w:r>
+      <w:proofErr w:type="spellStart"/>
+      <w:r>
+        <w:t>Windos</w:t>
+      </w:r>
+      <w:proofErr w:type="spellEnd"/>
+      <w:r>
+        <w:t xml:space="preserve"> folder but using Linux ls</w:t>
       </w:r>
     </w:p>
     <w:p>
@@ -1250,12 +1367,37 @@
       <w:r>
         <w:t xml:space="preserve">Example: </w:t>
       </w:r>
-      <w:r>
-        <w:rPr>
-          <w:b/>
-          <w:bCs/>
-        </w:rPr>
-        <w:t>wsl ls -la | findstr "git"</w:t>
+      <w:proofErr w:type="spellStart"/>
+      <w:r>
+        <w:rPr>
+          <w:b/>
+          <w:bCs/>
+        </w:rPr>
+        <w:t>wsl</w:t>
+      </w:r>
+      <w:proofErr w:type="spellEnd"/>
+      <w:r>
+        <w:rPr>
+          <w:b/>
+          <w:bCs/>
+        </w:rPr>
+        <w:t xml:space="preserve"> ls -la | </w:t>
+      </w:r>
+      <w:proofErr w:type="spellStart"/>
+      <w:r>
+        <w:rPr>
+          <w:b/>
+          <w:bCs/>
+        </w:rPr>
+        <w:t>findstr</w:t>
+      </w:r>
+      <w:proofErr w:type="spellEnd"/>
+      <w:r>
+        <w:rPr>
+          <w:b/>
+          <w:bCs/>
+        </w:rPr>
+        <w:t xml:space="preserve"> "git"</w:t>
       </w:r>
     </w:p>
     <w:p>
@@ -1331,8 +1473,13 @@
           <w:numId w:val="1"/>
         </w:numPr>
       </w:pPr>
-      <w:r>
-        <w:t>sudo apt update</w:t>
+      <w:proofErr w:type="spellStart"/>
+      <w:r>
+        <w:t>sudo</w:t>
+      </w:r>
+      <w:proofErr w:type="spellEnd"/>
+      <w:r>
+        <w:t xml:space="preserve"> apt update</w:t>
       </w:r>
     </w:p>
     <w:p>
@@ -1343,8 +1490,13 @@
           <w:numId w:val="1"/>
         </w:numPr>
       </w:pPr>
-      <w:r>
-        <w:t>sudo apt upgrade -y</w:t>
+      <w:proofErr w:type="spellStart"/>
+      <w:r>
+        <w:t>sudo</w:t>
+      </w:r>
+      <w:proofErr w:type="spellEnd"/>
+      <w:r>
+        <w:t xml:space="preserve"> apt upgrade -y</w:t>
       </w:r>
     </w:p>
     <w:p>
@@ -1355,8 +1507,13 @@
           <w:numId w:val="1"/>
         </w:numPr>
       </w:pPr>
-      <w:r>
-        <w:t>sudo apt full-upgrade -y</w:t>
+      <w:proofErr w:type="spellStart"/>
+      <w:r>
+        <w:t>sudo</w:t>
+      </w:r>
+      <w:proofErr w:type="spellEnd"/>
+      <w:r>
+        <w:t xml:space="preserve"> apt full-upgrade -y</w:t>
       </w:r>
     </w:p>
     <w:p>
@@ -1367,8 +1524,21 @@
           <w:numId w:val="1"/>
         </w:numPr>
       </w:pPr>
-      <w:r>
-        <w:t>sudo apt autoremove -y</w:t>
+      <w:proofErr w:type="spellStart"/>
+      <w:r>
+        <w:t>sudo</w:t>
+      </w:r>
+      <w:proofErr w:type="spellEnd"/>
+      <w:r>
+        <w:t xml:space="preserve"> apt </w:t>
+      </w:r>
+      <w:proofErr w:type="spellStart"/>
+      <w:r>
+        <w:t>autoremove</w:t>
+      </w:r>
+      <w:proofErr w:type="spellEnd"/>
+      <w:r>
+        <w:t xml:space="preserve"> -y</w:t>
       </w:r>
     </w:p>
     <w:p>
@@ -1379,8 +1549,13 @@
           <w:numId w:val="1"/>
         </w:numPr>
       </w:pPr>
-      <w:r>
-        <w:t>Install NASM assembler</w:t>
+      <w:proofErr w:type="gramStart"/>
+      <w:r>
+        <w:t>Install</w:t>
+      </w:r>
+      <w:proofErr w:type="gramEnd"/>
+      <w:r>
+        <w:t xml:space="preserve"> NASM assembler</w:t>
       </w:r>
     </w:p>
     <w:p>
@@ -1391,8 +1566,21 @@
           <w:numId w:val="1"/>
         </w:numPr>
       </w:pPr>
-      <w:r>
-        <w:t>sudo apt install nasm -y</w:t>
+      <w:proofErr w:type="spellStart"/>
+      <w:r>
+        <w:t>sudo</w:t>
+      </w:r>
+      <w:proofErr w:type="spellEnd"/>
+      <w:r>
+        <w:t xml:space="preserve"> apt install </w:t>
+      </w:r>
+      <w:proofErr w:type="spellStart"/>
+      <w:r>
+        <w:t>nasm</w:t>
+      </w:r>
+      <w:proofErr w:type="spellEnd"/>
+      <w:r>
+        <w:t xml:space="preserve"> -y</w:t>
       </w:r>
     </w:p>
     <w:p>
@@ -1404,7 +1592,15 @@
         </w:numPr>
       </w:pPr>
       <w:r>
-        <w:t>Install bximage:</w:t>
+        <w:t xml:space="preserve">Install </w:t>
+      </w:r>
+      <w:proofErr w:type="spellStart"/>
+      <w:r>
+        <w:t>bximage</w:t>
+      </w:r>
+      <w:proofErr w:type="spellEnd"/>
+      <w:r>
+        <w:t>:</w:t>
       </w:r>
     </w:p>
     <w:p>
@@ -1415,9 +1611,19 @@
           <w:numId w:val="1"/>
         </w:numPr>
       </w:pPr>
-      <w:r>
-        <w:t>sudo apt install bximage</w:t>
-      </w:r>
+      <w:proofErr w:type="spellStart"/>
+      <w:r>
+        <w:t>sudo</w:t>
+      </w:r>
+      <w:proofErr w:type="spellEnd"/>
+      <w:r>
+        <w:t xml:space="preserve"> apt install </w:t>
+      </w:r>
+      <w:proofErr w:type="spellStart"/>
+      <w:r>
+        <w:t>bximage</w:t>
+      </w:r>
+      <w:proofErr w:type="spellEnd"/>
     </w:p>
     <w:p>
       <w:pPr>
@@ -1428,7 +1634,7 @@
         </w:numPr>
       </w:pPr>
       <w:r>
-        <w:t>Create a temporary alias for cls = clear(investigate how to make it permanent)</w:t>
+        <w:t>Install make:</w:t>
       </w:r>
     </w:p>
     <w:p>
@@ -1439,8 +1645,13 @@
           <w:numId w:val="1"/>
         </w:numPr>
       </w:pPr>
-      <w:r>
-        <w:t>alias cls='clear'</w:t>
+      <w:proofErr w:type="spellStart"/>
+      <w:r>
+        <w:t>sudo</w:t>
+      </w:r>
+      <w:proofErr w:type="spellEnd"/>
+      <w:r>
+        <w:t xml:space="preserve"> apt install make</w:t>
       </w:r>
     </w:p>
     <w:p>
@@ -1452,7 +1663,63 @@
         </w:numPr>
       </w:pPr>
       <w:r>
-        <w:t>Install qemu on Windows:</w:t>
+        <w:t xml:space="preserve">Create a temporary alias for </w:t>
+      </w:r>
+      <w:proofErr w:type="spellStart"/>
+      <w:r>
+        <w:t>cls</w:t>
+      </w:r>
+      <w:proofErr w:type="spellEnd"/>
+      <w:r>
+        <w:t xml:space="preserve"> = </w:t>
+      </w:r>
+      <w:proofErr w:type="gramStart"/>
+      <w:r>
+        <w:t>clear(</w:t>
+      </w:r>
+      <w:proofErr w:type="gramEnd"/>
+      <w:r>
+        <w:t>investigate how to make it permanent)</w:t>
+      </w:r>
+    </w:p>
+    <w:p>
+      <w:pPr>
+        <w:pStyle w:val="ListParagraph"/>
+        <w:numPr>
+          <w:ilvl w:val="1"/>
+          <w:numId w:val="1"/>
+        </w:numPr>
+      </w:pPr>
+      <w:r>
+        <w:t xml:space="preserve">alias </w:t>
+      </w:r>
+      <w:proofErr w:type="spellStart"/>
+      <w:r>
+        <w:t>cls</w:t>
+      </w:r>
+      <w:proofErr w:type="spellEnd"/>
+      <w:r>
+        <w:t>='clear'</w:t>
+      </w:r>
+    </w:p>
+    <w:p>
+      <w:pPr>
+        <w:pStyle w:val="ListParagraph"/>
+        <w:numPr>
+          <w:ilvl w:val="0"/>
+          <w:numId w:val="1"/>
+        </w:numPr>
+      </w:pPr>
+      <w:r>
+        <w:t xml:space="preserve">Install </w:t>
+      </w:r>
+      <w:proofErr w:type="spellStart"/>
+      <w:r>
+        <w:t>qemu</w:t>
+      </w:r>
+      <w:proofErr w:type="spellEnd"/>
+      <w:r>
+        <w:t xml:space="preserve"> on Windows:</w:t>
       </w:r>
       <w:r>
         <w:t xml:space="preserve"> </w:t>
@@ -1570,49 +1837,232 @@
     <w:p/>
     <w:p>
       <w:r>
-        <w:t>nasm -f bin src/bootloader/stage1.asm -o src/build/stage1.bin</w:t>
+        <w:t xml:space="preserve">Build binary from </w:t>
+      </w:r>
+      <w:proofErr w:type="spellStart"/>
+      <w:r>
+        <w:t>asm</w:t>
+      </w:r>
+      <w:proofErr w:type="spellEnd"/>
+      <w:r>
+        <w:t xml:space="preserve"> file using NASM. Relative path, the full path for this is: </w:t>
+      </w:r>
+      <w:r>
+        <w:t>/</w:t>
+      </w:r>
+      <w:proofErr w:type="spellStart"/>
+      <w:r>
+        <w:t>mnt</w:t>
+      </w:r>
+      <w:proofErr w:type="spellEnd"/>
+      <w:r>
+        <w:t>/c/Users/mihe/Dropbox/TusMuertOS-Oct2025</w:t>
+      </w:r>
+    </w:p>
+    <w:p>
+      <w:proofErr w:type="spellStart"/>
+      <w:r>
+        <w:t>nasm</w:t>
+      </w:r>
+      <w:proofErr w:type="spellEnd"/>
+      <w:r>
+        <w:t xml:space="preserve"> -f bin </w:t>
+      </w:r>
+      <w:proofErr w:type="spellStart"/>
+      <w:r>
+        <w:t>src</w:t>
+      </w:r>
+      <w:proofErr w:type="spellEnd"/>
+      <w:r>
+        <w:t xml:space="preserve">/bootloader/stage1.asm -o </w:t>
+      </w:r>
+      <w:proofErr w:type="spellStart"/>
+      <w:r>
+        <w:t>src</w:t>
+      </w:r>
+      <w:proofErr w:type="spellEnd"/>
+      <w:r>
+        <w:t>/build/stage1.bin</w:t>
       </w:r>
     </w:p>
     <w:p/>
     <w:p>
-      <w:r>
-        <w:t xml:space="preserve">bximage to create an empty floppy disk. It is an interactive tool with a menu. It shows this info after execution: </w:t>
-      </w:r>
-      <w:r>
-        <w:t>The following line should appear in your bochsrc:</w:t>
-      </w:r>
-    </w:p>
-    <w:p>
-      <w:r>
-        <w:lastRenderedPageBreak/>
-        <w:t xml:space="preserve">  floppya: image="floppy.img", status=inserted</w:t>
-      </w:r>
-    </w:p>
-    <w:p>
+      <w:proofErr w:type="spellStart"/>
+      <w:r>
+        <w:t>bximage</w:t>
+      </w:r>
+      <w:proofErr w:type="spellEnd"/>
+      <w:r>
+        <w:t xml:space="preserve"> to create an empty floppy disk. It is an interactive tool with a menu. It shows this info after execution: The following line should appear in your </w:t>
+      </w:r>
+      <w:proofErr w:type="spellStart"/>
+      <w:r>
+        <w:t>bochsrc</w:t>
+      </w:r>
+      <w:proofErr w:type="spellEnd"/>
+      <w:r>
+        <w:t>:</w:t>
+      </w:r>
+    </w:p>
+    <w:p>
+      <w:r>
+        <w:t xml:space="preserve">  </w:t>
+      </w:r>
+      <w:proofErr w:type="spellStart"/>
+      <w:r>
+        <w:t>floppya</w:t>
+      </w:r>
+      <w:proofErr w:type="spellEnd"/>
+      <w:r>
+        <w:t>: image="</w:t>
+      </w:r>
+      <w:proofErr w:type="spellStart"/>
+      <w:r>
+        <w:t>floppy.img</w:t>
+      </w:r>
+      <w:proofErr w:type="spellEnd"/>
+      <w:r>
+        <w:t>", status=inserted</w:t>
+      </w:r>
+    </w:p>
+    <w:p>
+      <w:pPr>
+        <w:rPr>
+          <w:b/>
+          <w:bCs/>
+        </w:rPr>
+      </w:pPr>
       <w:r>
         <w:t xml:space="preserve">Alternative to create the empty disk: </w:t>
       </w:r>
       <w:r>
-        <w:t>dd if=/dev/zero of=teaching.img bs=512 count=2880</w:t>
+        <w:rPr>
+          <w:b/>
+          <w:bCs/>
+        </w:rPr>
+        <w:t>dd if=/dev/zero of=</w:t>
+      </w:r>
+      <w:proofErr w:type="spellStart"/>
+      <w:r>
+        <w:rPr>
+          <w:b/>
+          <w:bCs/>
+        </w:rPr>
+        <w:t>teaching.img</w:t>
+      </w:r>
+      <w:proofErr w:type="spellEnd"/>
+      <w:r>
+        <w:rPr>
+          <w:b/>
+          <w:bCs/>
+        </w:rPr>
+        <w:t xml:space="preserve"> bs=512 count=2880</w:t>
       </w:r>
     </w:p>
     <w:p/>
     <w:p>
       <w:r>
-        <w:t xml:space="preserve">Inject the bootloader (512 bytes, One sector if I am not mistaketn) at the beginning of the empty disk image: </w:t>
-      </w:r>
-      <w:r>
-        <w:t>dd if=stage1.bin of=floppy.img bs=512 count=1 conv=notrunc</w:t>
-      </w:r>
+        <w:t xml:space="preserve">Inject the bootloader (512 bytes, </w:t>
+      </w:r>
+      <w:proofErr w:type="gramStart"/>
+      <w:r>
+        <w:t>One</w:t>
+      </w:r>
+      <w:proofErr w:type="gramEnd"/>
+      <w:r>
+        <w:t xml:space="preserve"> sector if I am not </w:t>
+      </w:r>
+      <w:proofErr w:type="spellStart"/>
+      <w:r>
+        <w:t>mistaketn</w:t>
+      </w:r>
+      <w:proofErr w:type="spellEnd"/>
+      <w:r>
+        <w:t xml:space="preserve">) at the beginning of the empty disk image: </w:t>
+      </w:r>
+      <w:r>
+        <w:rPr>
+          <w:b/>
+          <w:bCs/>
+        </w:rPr>
+        <w:t>dd if=</w:t>
+      </w:r>
+      <w:proofErr w:type="spellStart"/>
+      <w:r>
+        <w:rPr>
+          <w:b/>
+          <w:bCs/>
+        </w:rPr>
+        <w:t>src</w:t>
+      </w:r>
+      <w:proofErr w:type="spellEnd"/>
+      <w:r>
+        <w:rPr>
+          <w:b/>
+          <w:bCs/>
+        </w:rPr>
+        <w:t>/build/stage1.bin of=</w:t>
+      </w:r>
+      <w:proofErr w:type="spellStart"/>
+      <w:r>
+        <w:rPr>
+          <w:b/>
+          <w:bCs/>
+        </w:rPr>
+        <w:t>src</w:t>
+      </w:r>
+      <w:proofErr w:type="spellEnd"/>
+      <w:r>
+        <w:rPr>
+          <w:b/>
+          <w:bCs/>
+        </w:rPr>
+        <w:t>/build/</w:t>
+      </w:r>
+      <w:proofErr w:type="spellStart"/>
+      <w:r>
+        <w:rPr>
+          <w:b/>
+          <w:bCs/>
+        </w:rPr>
+        <w:t>floppy.img</w:t>
+      </w:r>
+      <w:proofErr w:type="spellEnd"/>
+      <w:r>
+        <w:rPr>
+          <w:b/>
+          <w:bCs/>
+        </w:rPr>
+        <w:t xml:space="preserve"> bs=512 count=1 conv=</w:t>
+      </w:r>
+      <w:proofErr w:type="spellStart"/>
+      <w:r>
+        <w:rPr>
+          <w:b/>
+          <w:bCs/>
+        </w:rPr>
+        <w:t>notrunc</w:t>
+      </w:r>
+      <w:proofErr w:type="spellEnd"/>
     </w:p>
     <w:p/>
     <w:p>
       <w:r>
         <w:t xml:space="preserve">To quickly see the content of the disk: </w:t>
       </w:r>
-      <w:r>
-        <w:t>xxd -l 512 floppy.img</w:t>
-      </w:r>
+      <w:proofErr w:type="spellStart"/>
+      <w:r>
+        <w:t>xxd</w:t>
+      </w:r>
+      <w:proofErr w:type="spellEnd"/>
+      <w:r>
+        <w:t xml:space="preserve"> -l 512 </w:t>
+      </w:r>
+      <w:proofErr w:type="spellStart"/>
+      <w:r>
+        <w:t>floppy.img</w:t>
+      </w:r>
+      <w:proofErr w:type="spellEnd"/>
     </w:p>
     <w:p/>
     <w:p/>
@@ -1627,12 +2077,36 @@
     <w:p/>
     <w:p>
       <w:r>
-        <w:t>Run qemu with the bootloader bin</w:t>
-      </w:r>
-    </w:p>
-    <w:p>
-      <w:r>
-        <w:t>qemu-system-i386 -drive format=raw,file=C:\Users\mihe\Dropbox\TusMuertOS-Oct2025\src\build\stage1.bin,if=floppy</w:t>
+        <w:t xml:space="preserve">Run </w:t>
+      </w:r>
+      <w:proofErr w:type="spellStart"/>
+      <w:r>
+        <w:t>qemu</w:t>
+      </w:r>
+      <w:proofErr w:type="spellEnd"/>
+      <w:r>
+        <w:t xml:space="preserve"> with the bootloader bin</w:t>
+      </w:r>
+    </w:p>
+    <w:p>
+      <w:r>
+        <w:t>qemu-system-i386 -drive format=</w:t>
+      </w:r>
+      <w:proofErr w:type="gramStart"/>
+      <w:r>
+        <w:t>raw,file</w:t>
+      </w:r>
+      <w:proofErr w:type="gramEnd"/>
+      <w:r>
+        <w:t>=</w:t>
+      </w:r>
+      <w:proofErr w:type="gramStart"/>
+      <w:r>
+        <w:t>C:\Users\mihe\Dropbox\TusMuertOS-Oct2025\src\build\stage1.bin,if</w:t>
+      </w:r>
+      <w:proofErr w:type="gramEnd"/>
+      <w:r>
+        <w:t>=floppy</w:t>
       </w:r>
     </w:p>
     <w:p/>
@@ -1656,50 +2130,118 @@
     </w:p>
     <w:p>
       <w:r>
-        <w:t>Copy the template where the img is (in the file you also use full path or relative to the .img and output logs).</w:t>
+        <w:t xml:space="preserve">Copy the template where the </w:t>
+      </w:r>
+      <w:proofErr w:type="spellStart"/>
+      <w:r>
+        <w:t>img</w:t>
+      </w:r>
+      <w:proofErr w:type="spellEnd"/>
+      <w:r>
+        <w:t xml:space="preserve"> is (in the file you also use full path or relative to the .</w:t>
+      </w:r>
+      <w:proofErr w:type="spellStart"/>
+      <w:r>
+        <w:t>img</w:t>
+      </w:r>
+      <w:proofErr w:type="spellEnd"/>
+      <w:r>
+        <w:t xml:space="preserve"> and output logs).</w:t>
       </w:r>
     </w:p>
     <w:p>
       <w:r>
         <w:t xml:space="preserve">Run this: </w:t>
       </w:r>
-      <w:r>
-        <w:t>bochs -f .\bochsrc-runtime.txt -q -debugger</w:t>
+      <w:proofErr w:type="spellStart"/>
+      <w:r>
+        <w:t>bochs</w:t>
+      </w:r>
+      <w:proofErr w:type="spellEnd"/>
+      <w:r>
+        <w:t xml:space="preserve"> -f .\bochsrc-runtime.txt -q -debugger</w:t>
       </w:r>
     </w:p>
     <w:p>
       <w:r>
         <w:tab/>
-        <w:t>-f: configfile</w:t>
-      </w:r>
+        <w:t xml:space="preserve">-f: </w:t>
+      </w:r>
+      <w:proofErr w:type="spellStart"/>
+      <w:r>
+        <w:t>configfile</w:t>
+      </w:r>
+      <w:proofErr w:type="spellEnd"/>
     </w:p>
     <w:p>
       <w:r>
         <w:tab/>
-        <w:t>-q: don’t show the configuration screen before start</w:t>
-      </w:r>
+        <w:t xml:space="preserve">-q: don’t show the configuration screen before </w:t>
+      </w:r>
+      <w:proofErr w:type="gramStart"/>
+      <w:r>
+        <w:t>start</w:t>
+      </w:r>
+      <w:proofErr w:type="gramEnd"/>
     </w:p>
     <w:p>
       <w:r>
         <w:tab/>
-        <w:t>-debugger: memory, registers, etc…</w:t>
-      </w:r>
-    </w:p>
-    <w:p>
-      <w:r>
-        <w:t>bochs -f .\bochsrc-runtime.txt -q -debugger</w:t>
+        <w:t xml:space="preserve">-debugger: memory, registers, </w:t>
+      </w:r>
+      <w:proofErr w:type="spellStart"/>
+      <w:r>
+        <w:t>etc</w:t>
+      </w:r>
+      <w:proofErr w:type="spellEnd"/>
+      <w:r>
+        <w:t>…</w:t>
+      </w:r>
+    </w:p>
+    <w:p>
+      <w:proofErr w:type="spellStart"/>
+      <w:r>
+        <w:t>bochs</w:t>
+      </w:r>
+      <w:proofErr w:type="spellEnd"/>
+      <w:r>
+        <w:t xml:space="preserve"> -f .\bochsrc-runtime.txt -q -debugger</w:t>
       </w:r>
     </w:p>
     <w:p/>
     <w:p>
       <w:r>
-        <w:t>NEXT DAY !!!!!!!!!!!!!!!!!!!!!!!!!!!!!!!!!!!!!!</w:t>
-      </w:r>
-    </w:p>
-    <w:p>
-      <w:r>
-        <w:t>bochs -f .\bochsrc-runtime.txt -q -debugger -rc .\bochs.cmds</w:t>
-      </w:r>
+        <w:t xml:space="preserve">NEXT </w:t>
+      </w:r>
+      <w:proofErr w:type="gramStart"/>
+      <w:r>
+        <w:t>DAY !!!!!!!!!!!!!!!!!!!!!!!!!!!!!!!!!!!!!!</w:t>
+      </w:r>
+      <w:proofErr w:type="gramEnd"/>
+    </w:p>
+    <w:p>
+      <w:proofErr w:type="spellStart"/>
+      <w:r>
+        <w:lastRenderedPageBreak/>
+        <w:t>bochs</w:t>
+      </w:r>
+      <w:proofErr w:type="spellEnd"/>
+      <w:r>
+        <w:t xml:space="preserve"> -f .\bochsrc-runtime.txt -q -debugger -</w:t>
+      </w:r>
+      <w:proofErr w:type="spellStart"/>
+      <w:r>
+        <w:t>rc</w:t>
+      </w:r>
+      <w:proofErr w:type="spellEnd"/>
+      <w:r>
+        <w:t xml:space="preserve"> .\</w:t>
+      </w:r>
+      <w:proofErr w:type="spellStart"/>
+      <w:r>
+        <w:t>bochs.cmds</w:t>
+      </w:r>
+      <w:proofErr w:type="spellEnd"/>
       <w:r>
         <w:t xml:space="preserve"> try to enable automatic breakpoint, without magic breakpoints, which take space from the bootloader.</w:t>
       </w:r>
@@ -1710,7 +2252,6 @@
         <w:pStyle w:val="Heading1"/>
       </w:pPr>
       <w:r>
-        <w:lastRenderedPageBreak/>
         <w:t>Random nuggets of knowledge</w:t>
       </w:r>
     </w:p>
@@ -1755,7 +2296,15 @@
         </w:pBdr>
       </w:pPr>
       <w:r>
-        <w:t xml:space="preserve">    mov ax, start      ; imm16 encodes the absolute offset of “start”</w:t>
+        <w:t xml:space="preserve">    mov ax, start    </w:t>
+      </w:r>
+      <w:proofErr w:type="gramStart"/>
+      <w:r>
+        <w:t xml:space="preserve">  ;</w:t>
+      </w:r>
+      <w:proofErr w:type="gramEnd"/>
+      <w:r>
+        <w:t xml:space="preserve"> imm16 encodes the absolute offset of “start”</w:t>
       </w:r>
     </w:p>
     <w:p>
@@ -1780,30 +2329,85 @@
       </w:pPr>
       <w:r>
         <w:t>With org 0x0000, it assembles as: B8 00 00 (AX ← 0x0000)</w:t>
+      </w:r>
+    </w:p>
+    <w:p/>
+    <w:p>
+      <w:pPr>
+        <w:pStyle w:val="Heading2"/>
+      </w:pPr>
+      <w:r>
+        <w:t xml:space="preserve">WSL Tab autocomplete </w:t>
+      </w:r>
+      <w:proofErr w:type="spellStart"/>
+      <w:r>
+        <w:t>searchs</w:t>
+      </w:r>
+      <w:proofErr w:type="spellEnd"/>
+      <w:r>
+        <w:t xml:space="preserve"> only on windows/system32</w:t>
+      </w:r>
+    </w:p>
+    <w:p/>
+    <w:p>
+      <w:r>
+        <w:t xml:space="preserve">No solution </w:t>
+      </w:r>
+      <w:proofErr w:type="gramStart"/>
+      <w:r>
+        <w:t>found</w:t>
+      </w:r>
+      <w:proofErr w:type="gramEnd"/>
+      <w:r>
+        <w:t xml:space="preserve"> yet. Tried to add to </w:t>
+      </w:r>
+      <w:proofErr w:type="spellStart"/>
+      <w:r>
+        <w:t>etc</w:t>
+      </w:r>
+      <w:proofErr w:type="spellEnd"/>
+      <w:r>
+        <w:t>/</w:t>
+      </w:r>
+      <w:proofErr w:type="spellStart"/>
+      <w:r>
+        <w:t>wsl.conf</w:t>
+      </w:r>
+      <w:proofErr w:type="spellEnd"/>
+      <w:r>
+        <w:t xml:space="preserve"> this </w:t>
+      </w:r>
+      <w:proofErr w:type="spellStart"/>
+      <w:r>
+        <w:t>appendWindowsPath</w:t>
+      </w:r>
+      <w:proofErr w:type="spellEnd"/>
+      <w:r>
+        <w:t>=false</w:t>
+      </w:r>
+    </w:p>
+    <w:p/>
+    <w:p>
+      <w:pPr>
+        <w:pStyle w:val="Heading2"/>
+      </w:pPr>
+      <w:r>
+        <w:t>Screenshots</w:t>
+      </w:r>
+    </w:p>
+    <w:p/>
+    <w:p>
+      <w:r>
+        <w:t>31-October-2025</w:t>
       </w:r>
     </w:p>
     <w:p/>
     <w:p/>
-    <w:p/>
-    <w:p/>
-    <w:p>
-      <w:pPr>
-        <w:pStyle w:val="Heading2"/>
-      </w:pPr>
-      <w:r>
-        <w:t>Screenshots</w:t>
-      </w:r>
-    </w:p>
-    <w:p/>
-    <w:p>
-      <w:r>
-        <w:t>31-October-2025</w:t>
-      </w:r>
-    </w:p>
-    <w:p/>
-    <w:p/>
-    <w:p>
-      <w:r>
+    <w:p>
+      <w:r>
+        <w:rPr>
+          <w:noProof/>
+        </w:rPr>
         <w:lastRenderedPageBreak/>
         <w:drawing>
           <wp:inline distT="0" distB="0" distL="0" distR="0" wp14:anchorId="13B72F9A" wp14:editId="3497B51B">
@@ -1842,6 +2446,124 @@
         </w:drawing>
       </w:r>
     </w:p>
+    <w:p/>
+    <w:p/>
+    <w:p>
+      <w:pPr>
+        <w:pStyle w:val="Heading1"/>
+      </w:pPr>
+      <w:r>
+        <w:t>Clock in/out hours</w:t>
+      </w:r>
+    </w:p>
+    <w:p/>
+    <w:p/>
+    <w:tbl>
+      <w:tblPr>
+        <w:tblStyle w:val="TableGrid"/>
+        <w:tblW w:w="0" w:type="auto"/>
+        <w:tblLook w:val="04A0" w:firstRow="1" w:lastRow="0" w:firstColumn="1" w:lastColumn="0" w:noHBand="0" w:noVBand="1"/>
+      </w:tblPr>
+      <w:tblGrid>
+        <w:gridCol w:w="4675"/>
+        <w:gridCol w:w="4675"/>
+      </w:tblGrid>
+      <w:tr>
+        <w:tc>
+          <w:tcPr>
+            <w:tcW w:w="4675" w:type="dxa"/>
+          </w:tcPr>
+          <w:p>
+            <w:r>
+              <w:t>Day</w:t>
+            </w:r>
+          </w:p>
+        </w:tc>
+        <w:tc>
+          <w:tcPr>
+            <w:tcW w:w="4675" w:type="dxa"/>
+          </w:tcPr>
+          <w:p>
+            <w:r>
+              <w:t xml:space="preserve">Hours </w:t>
+            </w:r>
+            <w:proofErr w:type="spellStart"/>
+            <w:r>
+              <w:t>aprox</w:t>
+            </w:r>
+            <w:proofErr w:type="spellEnd"/>
+            <w:r>
+              <w:t>.</w:t>
+            </w:r>
+          </w:p>
+        </w:tc>
+      </w:tr>
+      <w:tr>
+        <w:tc>
+          <w:tcPr>
+            <w:tcW w:w="4675" w:type="dxa"/>
+          </w:tcPr>
+          <w:p>
+            <w:r>
+              <w:t>31-October-2025</w:t>
+            </w:r>
+          </w:p>
+        </w:tc>
+        <w:tc>
+          <w:tcPr>
+            <w:tcW w:w="4675" w:type="dxa"/>
+          </w:tcPr>
+          <w:p>
+            <w:r>
+              <w:t>4</w:t>
+            </w:r>
+          </w:p>
+        </w:tc>
+      </w:tr>
+      <w:tr>
+        <w:tc>
+          <w:tcPr>
+            <w:tcW w:w="4675" w:type="dxa"/>
+          </w:tcPr>
+          <w:p/>
+        </w:tc>
+        <w:tc>
+          <w:tcPr>
+            <w:tcW w:w="4675" w:type="dxa"/>
+          </w:tcPr>
+          <w:p/>
+        </w:tc>
+      </w:tr>
+      <w:tr>
+        <w:tc>
+          <w:tcPr>
+            <w:tcW w:w="4675" w:type="dxa"/>
+          </w:tcPr>
+          <w:p/>
+        </w:tc>
+        <w:tc>
+          <w:tcPr>
+            <w:tcW w:w="4675" w:type="dxa"/>
+          </w:tcPr>
+          <w:p/>
+        </w:tc>
+      </w:tr>
+      <w:tr>
+        <w:tc>
+          <w:tcPr>
+            <w:tcW w:w="4675" w:type="dxa"/>
+          </w:tcPr>
+          <w:p/>
+        </w:tc>
+        <w:tc>
+          <w:tcPr>
+            <w:tcW w:w="4675" w:type="dxa"/>
+          </w:tcPr>
+          <w:p/>
+        </w:tc>
+      </w:tr>
+    </w:tbl>
+    <w:p/>
     <w:sectPr>
       <w:pgSz w:w="12240" w:h="15840"/>
       <w:pgMar w:top="1440" w:right="1440" w:bottom="1440" w:left="1440" w:header="720" w:footer="720" w:gutter="0"/>
@@ -2122,6 +2844,12 @@
     <w:abstractNumId w:val="0"/>
   </w:num>
   <w:num w:numId="21" w16cid:durableId="808014797">
+    <w:abstractNumId w:val="0"/>
+  </w:num>
+  <w:num w:numId="22" w16cid:durableId="1925530001">
+    <w:abstractNumId w:val="0"/>
+  </w:num>
+  <w:num w:numId="23" w16cid:durableId="69078920">
     <w:abstractNumId w:val="0"/>
   </w:num>
 </w:numbering>
@@ -2525,7 +3253,7 @@
   <w:style w:type="paragraph" w:default="1" w:styleId="Normal">
     <w:name w:val="Normal"/>
     <w:qFormat/>
-    <w:rsid w:val="007C771D"/>
+    <w:rsid w:val="0075488B"/>
     <w:rPr>
       <w:sz w:val="20"/>
     </w:rPr>
@@ -3227,6 +3955,25 @@
       <w:color w:val="605E5C"/>
       <w:shd w:val="clear" w:color="auto" w:fill="E1DFDD"/>
     </w:rPr>
+  </w:style>
+  <w:style w:type="table" w:styleId="TableGrid">
+    <w:name w:val="Table Grid"/>
+    <w:basedOn w:val="TableNormal"/>
+    <w:uiPriority w:val="39"/>
+    <w:rsid w:val="0075488B"/>
+    <w:pPr>
+      <w:spacing w:after="0" w:line="240" w:lineRule="auto"/>
+    </w:pPr>
+    <w:tblPr>
+      <w:tblBorders>
+        <w:top w:val="single" w:sz="4" w:space="0" w:color="auto"/>
+        <w:left w:val="single" w:sz="4" w:space="0" w:color="auto"/>
+        <w:bottom w:val="single" w:sz="4" w:space="0" w:color="auto"/>
+        <w:right w:val="single" w:sz="4" w:space="0" w:color="auto"/>
+        <w:insideH w:val="single" w:sz="4" w:space="0" w:color="auto"/>
+        <w:insideV w:val="single" w:sz="4" w:space="0" w:color="auto"/>
+      </w:tblBorders>
+    </w:tblPr>
   </w:style>
 </w:styles>
 </file>

</xml_diff>

<commit_message>
Preliminary research and work on FAT and image creator utility. Interim work not complete
</commit_message>
<xml_diff>
--- a/docs/TusMuertos-v2.0-Design.docx
+++ b/docs/TusMuertos-v2.0-Design.docx
@@ -3367,7 +3367,15 @@
         </w:numPr>
       </w:pPr>
       <w:r>
-        <w:t>Image, bin editor, concatenation, elf info, debug, tracer, etc……</w:t>
+        <w:t xml:space="preserve">Image, bin editor, concatenation, elf info, debug, tracer, </w:t>
+      </w:r>
+      <w:proofErr w:type="spellStart"/>
+      <w:r>
+        <w:t>etc</w:t>
+      </w:r>
+      <w:proofErr w:type="spellEnd"/>
+      <w:r>
+        <w:t>……</w:t>
       </w:r>
     </w:p>
     <w:p/>
@@ -3736,7 +3744,15 @@
         </w:numPr>
       </w:pPr>
       <w:r>
-        <w:t>Gather info for the kernel: Memory, graphics, bios, acpi, others…</w:t>
+        <w:t xml:space="preserve">Gather info for the kernel: Memory, graphics, bios, </w:t>
+      </w:r>
+      <w:proofErr w:type="spellStart"/>
+      <w:r>
+        <w:t>acpi</w:t>
+      </w:r>
+      <w:proofErr w:type="spellEnd"/>
+      <w:r>
+        <w:t>, others…</w:t>
       </w:r>
     </w:p>
     <w:p>
@@ -3772,7 +3788,15 @@
         </w:numPr>
       </w:pPr>
       <w:r>
-        <w:t>ELF: Parser + segments + etc…</w:t>
+        <w:t xml:space="preserve">ELF: Parser + segments + </w:t>
+      </w:r>
+      <w:proofErr w:type="spellStart"/>
+      <w:r>
+        <w:t>etc</w:t>
+      </w:r>
+      <w:proofErr w:type="spellEnd"/>
+      <w:r>
+        <w:t>…</w:t>
       </w:r>
     </w:p>
     <w:p>
@@ -3906,14 +3930,163 @@
     </w:p>
     <w:p/>
     <w:p/>
+    <w:p>
+      <w:pPr>
+        <w:pStyle w:val="Heading1"/>
+      </w:pPr>
+      <w:r>
+        <w:t>Helpers and auxiliary tools</w:t>
+      </w:r>
+    </w:p>
     <w:p/>
+    <w:p>
+      <w:pPr>
+        <w:pStyle w:val="Heading2"/>
+      </w:pPr>
+      <w:r>
+        <w:t>FAT32 image creator</w:t>
+      </w:r>
+    </w:p>
     <w:p/>
     <w:p>
       <w:pPr>
+        <w:rPr>
+          <w:b/>
+          <w:bCs/>
+        </w:rPr>
+      </w:pPr>
+      <w:r>
+        <w:rPr>
+          <w:b/>
+          <w:bCs/>
+        </w:rPr>
+        <w:t>Purpose and scope</w:t>
+      </w:r>
+    </w:p>
+    <w:p>
+      <w:pPr>
+        <w:pStyle w:val="ListParagraph"/>
+        <w:numPr>
+          <w:ilvl w:val="0"/>
+          <w:numId w:val="1"/>
+        </w:numPr>
+      </w:pPr>
+      <w:r>
+        <w:t>Automate the process of creating a binary image file to load as floppy/</w:t>
+      </w:r>
+      <w:proofErr w:type="spellStart"/>
+      <w:r>
+        <w:t>usb</w:t>
+      </w:r>
+      <w:proofErr w:type="spellEnd"/>
+      <w:r>
+        <w:t>.</w:t>
+      </w:r>
+    </w:p>
+    <w:p>
+      <w:pPr>
+        <w:pStyle w:val="ListParagraph"/>
+        <w:numPr>
+          <w:ilvl w:val="0"/>
+          <w:numId w:val="1"/>
+        </w:numPr>
+      </w:pPr>
+      <w:r>
+        <w:t>It creates an MBR and VBR(with BPB) to boot and have a FAT12/16/32 structure</w:t>
+      </w:r>
+    </w:p>
+    <w:p>
+      <w:pPr>
+        <w:pStyle w:val="ListParagraph"/>
+        <w:numPr>
+          <w:ilvl w:val="0"/>
+          <w:numId w:val="1"/>
+        </w:numPr>
+        <w:rPr>
+          <w:b/>
+          <w:bCs/>
+        </w:rPr>
+      </w:pPr>
+      <w:r>
+        <w:t xml:space="preserve">Once the FAT structure is ready, copy (inject) some files </w:t>
+      </w:r>
+      <w:r>
+        <w:t>onto</w:t>
+      </w:r>
+      <w:r>
+        <w:t xml:space="preserve"> the file system</w:t>
+      </w:r>
+      <w:r>
+        <w:rPr>
+          <w:b/>
+          <w:bCs/>
+        </w:rPr>
+        <w:t>.</w:t>
+      </w:r>
+    </w:p>
+    <w:p>
+      <w:pPr>
+        <w:rPr>
+          <w:b/>
+          <w:bCs/>
+        </w:rPr>
+      </w:pPr>
+      <w:r>
+        <w:rPr>
+          <w:b/>
+          <w:bCs/>
+        </w:rPr>
+        <w:t>Technical details</w:t>
+      </w:r>
+    </w:p>
+    <w:p>
+      <w:pPr>
+        <w:pStyle w:val="ListParagraph"/>
+        <w:numPr>
+          <w:ilvl w:val="0"/>
+          <w:numId w:val="1"/>
+        </w:numPr>
+      </w:pPr>
+      <w:r>
+        <w:t>Language: C</w:t>
+      </w:r>
+    </w:p>
+    <w:p>
+      <w:pPr>
+        <w:pStyle w:val="ListParagraph"/>
+        <w:numPr>
+          <w:ilvl w:val="0"/>
+          <w:numId w:val="1"/>
+        </w:numPr>
+      </w:pPr>
+      <w:r>
+        <w:t>Runtime: Linux (explore Windows compatibility)</w:t>
+      </w:r>
+    </w:p>
+    <w:p>
+      <w:pPr>
+        <w:pStyle w:val="ListParagraph"/>
+        <w:numPr>
+          <w:ilvl w:val="0"/>
+          <w:numId w:val="1"/>
+        </w:numPr>
+      </w:pPr>
+      <w:r>
+        <w:t xml:space="preserve">Binary Name: </w:t>
+      </w:r>
+      <w:proofErr w:type="spellStart"/>
+      <w:r>
+        <w:t>fatimagecreator</w:t>
+      </w:r>
+      <w:proofErr w:type="spellEnd"/>
+    </w:p>
+    <w:p>
+      <w:pPr>
         <w:pStyle w:val="Heading1"/>
       </w:pPr>
       <w:bookmarkStart w:id="2" w:name="_Toc212933569"/>
       <w:r>
+        <w:lastRenderedPageBreak/>
         <w:t>Misc and notes</w:t>
       </w:r>
       <w:bookmarkEnd w:id="2"/>
@@ -4016,6 +4189,7 @@
         <w:rPr>
           <w:noProof/>
         </w:rPr>
+        <w:lastRenderedPageBreak/>
         <mc:AlternateContent>
           <mc:Choice Requires="wps">
             <w:drawing>
@@ -4071,12 +4245,197 @@
                                 <w:szCs w:val="16"/>
                               </w:rPr>
                             </w:pPr>
+                            <w:proofErr w:type="spellStart"/>
                             <w:r>
                               <w:rPr>
                                 <w:sz w:val="16"/>
                                 <w:szCs w:val="16"/>
                               </w:rPr>
-                              <w:t>display_library: win32, options="traphotkeys, autoscale, gui_debug"</w:t>
+                              <w:t>display_library</w:t>
+                            </w:r>
+                            <w:proofErr w:type="spellEnd"/>
+                            <w:r>
+                              <w:rPr>
+                                <w:sz w:val="16"/>
+                                <w:szCs w:val="16"/>
+                              </w:rPr>
+                              <w:t>: win32, options="</w:t>
+                            </w:r>
+                            <w:proofErr w:type="spellStart"/>
+                            <w:r>
+                              <w:rPr>
+                                <w:sz w:val="16"/>
+                                <w:szCs w:val="16"/>
+                              </w:rPr>
+                              <w:t>traphotkeys</w:t>
+                            </w:r>
+                            <w:proofErr w:type="spellEnd"/>
+                            <w:r>
+                              <w:rPr>
+                                <w:sz w:val="16"/>
+                                <w:szCs w:val="16"/>
+                              </w:rPr>
+                              <w:t xml:space="preserve">, </w:t>
+                            </w:r>
+                            <w:proofErr w:type="spellStart"/>
+                            <w:r>
+                              <w:rPr>
+                                <w:sz w:val="16"/>
+                                <w:szCs w:val="16"/>
+                              </w:rPr>
+                              <w:t>autoscale</w:t>
+                            </w:r>
+                            <w:proofErr w:type="spellEnd"/>
+                            <w:r>
+                              <w:rPr>
+                                <w:sz w:val="16"/>
+                                <w:szCs w:val="16"/>
+                              </w:rPr>
+                              <w:t xml:space="preserve">, </w:t>
+                            </w:r>
+                            <w:proofErr w:type="spellStart"/>
+                            <w:r>
+                              <w:rPr>
+                                <w:sz w:val="16"/>
+                                <w:szCs w:val="16"/>
+                              </w:rPr>
+                              <w:t>gui_debug</w:t>
+                            </w:r>
+                            <w:proofErr w:type="spellEnd"/>
+                            <w:r>
+                              <w:rPr>
+                                <w:sz w:val="16"/>
+                                <w:szCs w:val="16"/>
+                              </w:rPr>
+                              <w:t>"</w:t>
+                            </w:r>
+                          </w:p>
+                          <w:p>
+                            <w:pPr>
+                              <w:rPr>
+                                <w:sz w:val="16"/>
+                                <w:szCs w:val="16"/>
+                              </w:rPr>
+                            </w:pPr>
+                            <w:proofErr w:type="spellStart"/>
+                            <w:r>
+                              <w:rPr>
+                                <w:sz w:val="16"/>
+                                <w:szCs w:val="16"/>
+                              </w:rPr>
+                              <w:t>cpu</w:t>
+                            </w:r>
+                            <w:proofErr w:type="spellEnd"/>
+                            <w:r>
+                              <w:rPr>
+                                <w:sz w:val="16"/>
+                                <w:szCs w:val="16"/>
+                              </w:rPr>
+                              <w:t xml:space="preserve">: model=core2_penryn_t9600, count=1, </w:t>
+                            </w:r>
+                            <w:proofErr w:type="spellStart"/>
+                            <w:r>
+                              <w:rPr>
+                                <w:sz w:val="16"/>
+                                <w:szCs w:val="16"/>
+                              </w:rPr>
+                              <w:t>ips</w:t>
+                            </w:r>
+                            <w:proofErr w:type="spellEnd"/>
+                            <w:r>
+                              <w:rPr>
+                                <w:sz w:val="16"/>
+                                <w:szCs w:val="16"/>
+                              </w:rPr>
+                              <w:t xml:space="preserve">=50000000, </w:t>
+                            </w:r>
+                            <w:proofErr w:type="spellStart"/>
+                            <w:r>
+                              <w:rPr>
+                                <w:sz w:val="16"/>
+                                <w:szCs w:val="16"/>
+                              </w:rPr>
+                              <w:t>reset_on_triple_fault</w:t>
+                            </w:r>
+                            <w:proofErr w:type="spellEnd"/>
+                            <w:r>
+                              <w:rPr>
+                                <w:sz w:val="16"/>
+                                <w:szCs w:val="16"/>
+                              </w:rPr>
+                              <w:t xml:space="preserve">=1, </w:t>
+                            </w:r>
+                            <w:proofErr w:type="spellStart"/>
+                            <w:r>
+                              <w:rPr>
+                                <w:sz w:val="16"/>
+                                <w:szCs w:val="16"/>
+                              </w:rPr>
+                              <w:t>ignore_bad_msrs</w:t>
+                            </w:r>
+                            <w:proofErr w:type="spellEnd"/>
+                            <w:r>
+                              <w:rPr>
+                                <w:sz w:val="16"/>
+                                <w:szCs w:val="16"/>
+                              </w:rPr>
+                              <w:t xml:space="preserve">=1, </w:t>
+                            </w:r>
+                            <w:proofErr w:type="spellStart"/>
+                            <w:r>
+                              <w:rPr>
+                                <w:sz w:val="16"/>
+                                <w:szCs w:val="16"/>
+                              </w:rPr>
+                              <w:t>msrs</w:t>
+                            </w:r>
+                            <w:proofErr w:type="spellEnd"/>
+                            <w:r>
+                              <w:rPr>
+                                <w:sz w:val="16"/>
+                                <w:szCs w:val="16"/>
+                              </w:rPr>
+                              <w:t>="msrs.def"</w:t>
+                            </w:r>
+                          </w:p>
+                          <w:p>
+                            <w:pPr>
+                              <w:rPr>
+                                <w:sz w:val="16"/>
+                                <w:szCs w:val="16"/>
+                              </w:rPr>
+                            </w:pPr>
+                            <w:proofErr w:type="spellStart"/>
+                            <w:r>
+                              <w:rPr>
+                                <w:sz w:val="16"/>
+                                <w:szCs w:val="16"/>
+                              </w:rPr>
+                              <w:t>cpu</w:t>
+                            </w:r>
+                            <w:proofErr w:type="spellEnd"/>
+                            <w:r>
+                              <w:rPr>
+                                <w:sz w:val="16"/>
+                                <w:szCs w:val="16"/>
+                              </w:rPr>
+                              <w:t xml:space="preserve">: </w:t>
+                            </w:r>
+                            <w:proofErr w:type="spellStart"/>
+                            <w:r>
+                              <w:rPr>
+                                <w:sz w:val="16"/>
+                                <w:szCs w:val="16"/>
+                              </w:rPr>
+                              <w:t>cpuid_limit_winnt</w:t>
+                            </w:r>
+                            <w:proofErr w:type="spellEnd"/>
+                            <w:r>
+                              <w:rPr>
+                                <w:sz w:val="16"/>
+                                <w:szCs w:val="16"/>
+                              </w:rPr>
+                              <w:t>=0</w:t>
                             </w:r>
                           </w:p>
                           <w:p>
@@ -4091,8 +4450,122 @@
                                 <w:sz w:val="16"/>
                                 <w:szCs w:val="16"/>
                               </w:rPr>
-                              <w:t>cpu: model=core2_penryn_t9600, count=1, ips=50000000, reset_on_triple_fault=1, ignore_bad_msrs=1, msrs="msrs.def"</w:t>
+                              <w:t xml:space="preserve">memory: guest=512, host=256, </w:t>
                             </w:r>
+                            <w:proofErr w:type="spellStart"/>
+                            <w:r>
+                              <w:rPr>
+                                <w:sz w:val="16"/>
+                                <w:szCs w:val="16"/>
+                              </w:rPr>
+                              <w:t>block_size</w:t>
+                            </w:r>
+                            <w:proofErr w:type="spellEnd"/>
+                            <w:r>
+                              <w:rPr>
+                                <w:sz w:val="16"/>
+                                <w:szCs w:val="16"/>
+                              </w:rPr>
+                              <w:t>=512</w:t>
+                            </w:r>
+                          </w:p>
+                          <w:p>
+                            <w:pPr>
+                              <w:rPr>
+                                <w:sz w:val="16"/>
+                                <w:szCs w:val="16"/>
+                              </w:rPr>
+                            </w:pPr>
+                            <w:proofErr w:type="spellStart"/>
+                            <w:r>
+                              <w:rPr>
+                                <w:sz w:val="16"/>
+                                <w:szCs w:val="16"/>
+                              </w:rPr>
+                              <w:t>romimage</w:t>
+                            </w:r>
+                            <w:proofErr w:type="spellEnd"/>
+                            <w:r>
+                              <w:rPr>
+                                <w:sz w:val="16"/>
+                                <w:szCs w:val="16"/>
+                              </w:rPr>
+                              <w:t>: file=$BXSHARE/BIOS-</w:t>
+                            </w:r>
+                            <w:proofErr w:type="spellStart"/>
+                            <w:r>
+                              <w:rPr>
+                                <w:sz w:val="16"/>
+                                <w:szCs w:val="16"/>
+                              </w:rPr>
+                              <w:t>bochs</w:t>
+                            </w:r>
+                            <w:proofErr w:type="spellEnd"/>
+                            <w:r>
+                              <w:rPr>
+                                <w:sz w:val="16"/>
+                                <w:szCs w:val="16"/>
+                              </w:rPr>
+                              <w:t>-latest, options=</w:t>
+                            </w:r>
+                            <w:proofErr w:type="spellStart"/>
+                            <w:r>
+                              <w:rPr>
+                                <w:sz w:val="16"/>
+                                <w:szCs w:val="16"/>
+                              </w:rPr>
+                              <w:t>fastboot</w:t>
+                            </w:r>
+                            <w:proofErr w:type="spellEnd"/>
+                          </w:p>
+                          <w:p>
+                            <w:pPr>
+                              <w:rPr>
+                                <w:sz w:val="16"/>
+                                <w:szCs w:val="16"/>
+                              </w:rPr>
+                            </w:pPr>
+                            <w:proofErr w:type="spellStart"/>
+                            <w:r>
+                              <w:rPr>
+                                <w:sz w:val="16"/>
+                                <w:szCs w:val="16"/>
+                              </w:rPr>
+                              <w:t>vgaromimage</w:t>
+                            </w:r>
+                            <w:proofErr w:type="spellEnd"/>
+                            <w:r>
+                              <w:rPr>
+                                <w:sz w:val="16"/>
+                                <w:szCs w:val="16"/>
+                              </w:rPr>
+                              <w:t>: file=$BXSHARE/VGABIOS-</w:t>
+                            </w:r>
+                            <w:proofErr w:type="spellStart"/>
+                            <w:r>
+                              <w:rPr>
+                                <w:sz w:val="16"/>
+                                <w:szCs w:val="16"/>
+                              </w:rPr>
+                              <w:t>lgpl</w:t>
+                            </w:r>
+                            <w:proofErr w:type="spellEnd"/>
+                            <w:r>
+                              <w:rPr>
+                                <w:sz w:val="16"/>
+                                <w:szCs w:val="16"/>
+                              </w:rPr>
+                              <w:t>-</w:t>
+                            </w:r>
+                            <w:proofErr w:type="spellStart"/>
+                            <w:r>
+                              <w:rPr>
+                                <w:sz w:val="16"/>
+                                <w:szCs w:val="16"/>
+                              </w:rPr>
+                              <w:t>latest.bin</w:t>
+                            </w:r>
+                            <w:proofErr w:type="spellEnd"/>
                           </w:p>
                           <w:p>
                             <w:pPr>
@@ -4106,67 +4579,23 @@
                                 <w:sz w:val="16"/>
                                 <w:szCs w:val="16"/>
                               </w:rPr>
-                              <w:t>cpu: cpuid_limit_winnt=0</w:t>
+                              <w:t xml:space="preserve">keyboard: type=mf, </w:t>
                             </w:r>
-                          </w:p>
-                          <w:p>
-                            <w:pPr>
-                              <w:rPr>
-                                <w:sz w:val="16"/>
-                                <w:szCs w:val="16"/>
-                              </w:rPr>
-                            </w:pPr>
+                            <w:proofErr w:type="spellStart"/>
                             <w:r>
                               <w:rPr>
                                 <w:sz w:val="16"/>
                                 <w:szCs w:val="16"/>
                               </w:rPr>
-                              <w:t>memory: guest=512, host=256, block_size=512</w:t>
+                              <w:t>serial_delay</w:t>
                             </w:r>
-                          </w:p>
-                          <w:p>
-                            <w:pPr>
-                              <w:rPr>
-                                <w:sz w:val="16"/>
-                                <w:szCs w:val="16"/>
-                              </w:rPr>
-                            </w:pPr>
+                            <w:proofErr w:type="spellEnd"/>
                             <w:r>
                               <w:rPr>
                                 <w:sz w:val="16"/>
                                 <w:szCs w:val="16"/>
                               </w:rPr>
-                              <w:t>romimage: file=$BXSHARE/BIOS-bochs-latest, options=fastboot</w:t>
-                            </w:r>
-                          </w:p>
-                          <w:p>
-                            <w:pPr>
-                              <w:rPr>
-                                <w:sz w:val="16"/>
-                                <w:szCs w:val="16"/>
-                              </w:rPr>
-                            </w:pPr>
-                            <w:r>
-                              <w:rPr>
-                                <w:sz w:val="16"/>
-                                <w:szCs w:val="16"/>
-                              </w:rPr>
-                              <w:t>vgaromimage: file=$BXSHARE/VGABIOS-lgpl-latest.bin</w:t>
-                            </w:r>
-                          </w:p>
-                          <w:p>
-                            <w:pPr>
-                              <w:rPr>
-                                <w:sz w:val="16"/>
-                                <w:szCs w:val="16"/>
-                              </w:rPr>
-                            </w:pPr>
-                            <w:r>
-                              <w:rPr>
-                                <w:sz w:val="16"/>
-                                <w:szCs w:val="16"/>
-                              </w:rPr>
-                              <w:t>keyboard: type=mf, serial_delay=150</w:t>
+                              <w:t>=150</w:t>
                             </w:r>
                           </w:p>
                           <w:p>
@@ -4191,12 +4620,21 @@
                                 <w:szCs w:val="16"/>
                               </w:rPr>
                             </w:pPr>
+                            <w:proofErr w:type="spellStart"/>
                             <w:r>
                               <w:rPr>
                                 <w:sz w:val="16"/>
                                 <w:szCs w:val="16"/>
                               </w:rPr>
-                              <w:t>pci: enabled=1, chipset=i440fx</w:t>
+                              <w:t>pci</w:t>
+                            </w:r>
+                            <w:proofErr w:type="spellEnd"/>
+                            <w:r>
+                              <w:rPr>
+                                <w:sz w:val="16"/>
+                                <w:szCs w:val="16"/>
+                              </w:rPr>
+                              <w:t>: enabled=1, chipset=i440fx</w:t>
                             </w:r>
                           </w:p>
                           <w:p>
@@ -4206,12 +4644,21 @@
                                 <w:szCs w:val="16"/>
                               </w:rPr>
                             </w:pPr>
+                            <w:proofErr w:type="spellStart"/>
                             <w:r>
                               <w:rPr>
                                 <w:sz w:val="16"/>
                                 <w:szCs w:val="16"/>
                               </w:rPr>
-                              <w:t>private_colormap: enabled=0</w:t>
+                              <w:t>private_colormap</w:t>
+                            </w:r>
+                            <w:proofErr w:type="spellEnd"/>
+                            <w:r>
+                              <w:rPr>
+                                <w:sz w:val="16"/>
+                                <w:szCs w:val="16"/>
+                              </w:rPr>
+                              <w:t>: enabled=0</w:t>
                             </w:r>
                           </w:p>
                           <w:p>
@@ -4221,12 +4668,37 @@
                                 <w:szCs w:val="16"/>
                               </w:rPr>
                             </w:pPr>
+                            <w:proofErr w:type="spellStart"/>
                             <w:r>
                               <w:rPr>
                                 <w:sz w:val="16"/>
                                 <w:szCs w:val="16"/>
                               </w:rPr>
-                              <w:t>floppya: 1_44=C:\Users\mihe\Dropbox\TusMuertOS-Oct2025\src\build\floppy.img, status=inserted, write_protected=1</w:t>
+                              <w:t>floppya</w:t>
+                            </w:r>
+                            <w:proofErr w:type="spellEnd"/>
+                            <w:r>
+                              <w:rPr>
+                                <w:sz w:val="16"/>
+                                <w:szCs w:val="16"/>
+                              </w:rPr>
+                              <w:t xml:space="preserve">: 1_44=C:\Users\mihe\Dropbox\TusMuertOS-Oct2025\src\build\floppy.img, status=inserted, </w:t>
+                            </w:r>
+                            <w:proofErr w:type="spellStart"/>
+                            <w:r>
+                              <w:rPr>
+                                <w:sz w:val="16"/>
+                                <w:szCs w:val="16"/>
+                              </w:rPr>
+                              <w:t>write_protected</w:t>
+                            </w:r>
+                            <w:proofErr w:type="spellEnd"/>
+                            <w:r>
+                              <w:rPr>
+                                <w:sz w:val="16"/>
+                                <w:szCs w:val="16"/>
+                              </w:rPr>
+                              <w:t>=1</w:t>
                             </w:r>
                           </w:p>
                           <w:p>
@@ -4251,12 +4723,21 @@
                                 <w:szCs w:val="16"/>
                               </w:rPr>
                             </w:pPr>
+                            <w:proofErr w:type="spellStart"/>
                             <w:r>
                               <w:rPr>
                                 <w:sz w:val="16"/>
                                 <w:szCs w:val="16"/>
                               </w:rPr>
-                              <w:t>floppy_bootsig_check: disabled=0</w:t>
+                              <w:t>floppy_bootsig_check</w:t>
+                            </w:r>
+                            <w:proofErr w:type="spellEnd"/>
+                            <w:r>
+                              <w:rPr>
+                                <w:sz w:val="16"/>
+                                <w:szCs w:val="16"/>
+                              </w:rPr>
+                              <w:t>: disabled=0</w:t>
                             </w:r>
                           </w:p>
                           <w:p>
@@ -4331,7 +4812,63 @@
                                 <w:sz w:val="16"/>
                                 <w:szCs w:val="16"/>
                               </w:rPr>
-                              <w:t>debug: action=ignore, pci=report # report BX_DEBUG from module 'pci'</w:t>
+                              <w:t xml:space="preserve">debug: action=ignore, </w:t>
+                            </w:r>
+                            <w:proofErr w:type="spellStart"/>
+                            <w:r>
+                              <w:rPr>
+                                <w:sz w:val="16"/>
+                                <w:szCs w:val="16"/>
+                              </w:rPr>
+                              <w:t>pci</w:t>
+                            </w:r>
+                            <w:proofErr w:type="spellEnd"/>
+                            <w:r>
+                              <w:rPr>
+                                <w:sz w:val="16"/>
+                                <w:szCs w:val="16"/>
+                              </w:rPr>
+                              <w:t>=report # report BX_DEBUG from module '</w:t>
+                            </w:r>
+                            <w:proofErr w:type="spellStart"/>
+                            <w:r>
+                              <w:rPr>
+                                <w:sz w:val="16"/>
+                                <w:szCs w:val="16"/>
+                              </w:rPr>
+                              <w:t>pci</w:t>
+                            </w:r>
+                            <w:proofErr w:type="spellEnd"/>
+                            <w:r>
+                              <w:rPr>
+                                <w:sz w:val="16"/>
+                                <w:szCs w:val="16"/>
+                              </w:rPr>
+                              <w:t>'</w:t>
+                            </w:r>
+                          </w:p>
+                          <w:p>
+                            <w:pPr>
+                              <w:rPr>
+                                <w:sz w:val="16"/>
+                                <w:szCs w:val="16"/>
+                              </w:rPr>
+                            </w:pPr>
+                            <w:proofErr w:type="spellStart"/>
+                            <w:r>
+                              <w:rPr>
+                                <w:sz w:val="16"/>
+                                <w:szCs w:val="16"/>
+                              </w:rPr>
+                              <w:t>debugger_log</w:t>
+                            </w:r>
+                            <w:proofErr w:type="spellEnd"/>
+                            <w:r>
+                              <w:rPr>
+                                <w:sz w:val="16"/>
+                                <w:szCs w:val="16"/>
+                              </w:rPr>
+                              <w:t>: -</w:t>
                             </w:r>
                           </w:p>
                           <w:p>
@@ -4346,7 +4883,23 @@
                                 <w:sz w:val="16"/>
                                 <w:szCs w:val="16"/>
                               </w:rPr>
-                              <w:t>debugger_log: -</w:t>
+                              <w:t>parport1: enabled=1, file="</w:t>
+                            </w:r>
+                            <w:proofErr w:type="spellStart"/>
+                            <w:r>
+                              <w:rPr>
+                                <w:sz w:val="16"/>
+                                <w:szCs w:val="16"/>
+                              </w:rPr>
+                              <w:t>parport.out</w:t>
+                            </w:r>
+                            <w:proofErr w:type="spellEnd"/>
+                            <w:r>
+                              <w:rPr>
+                                <w:sz w:val="16"/>
+                                <w:szCs w:val="16"/>
+                              </w:rPr>
+                              <w:t>"</w:t>
                             </w:r>
                           </w:p>
                           <w:p>
@@ -4361,22 +4914,55 @@
                                 <w:sz w:val="16"/>
                                 <w:szCs w:val="16"/>
                               </w:rPr>
-                              <w:t>parport1: enabled=1, file="parport.out"</w:t>
+                              <w:t xml:space="preserve">sound: driver=default, </w:t>
                             </w:r>
-                          </w:p>
-                          <w:p>
-                            <w:pPr>
-                              <w:rPr>
-                                <w:sz w:val="16"/>
-                                <w:szCs w:val="16"/>
-                              </w:rPr>
-                            </w:pPr>
+                            <w:proofErr w:type="spellStart"/>
                             <w:r>
                               <w:rPr>
                                 <w:sz w:val="16"/>
                                 <w:szCs w:val="16"/>
                               </w:rPr>
-                              <w:t>sound: driver=default, waveout=/dev/dsp. wavein=, midiout=</w:t>
+                              <w:t>waveout</w:t>
+                            </w:r>
+                            <w:proofErr w:type="spellEnd"/>
+                            <w:r>
+                              <w:rPr>
+                                <w:sz w:val="16"/>
+                                <w:szCs w:val="16"/>
+                              </w:rPr>
+                              <w:t xml:space="preserve">=/dev/dsp. </w:t>
+                            </w:r>
+                            <w:proofErr w:type="spellStart"/>
+                            <w:r>
+                              <w:rPr>
+                                <w:sz w:val="16"/>
+                                <w:szCs w:val="16"/>
+                              </w:rPr>
+                              <w:t>wavein</w:t>
+                            </w:r>
+                            <w:proofErr w:type="spellEnd"/>
+                            <w:r>
+                              <w:rPr>
+                                <w:sz w:val="16"/>
+                                <w:szCs w:val="16"/>
+                              </w:rPr>
+                              <w:t xml:space="preserve">=, </w:t>
+                            </w:r>
+                            <w:proofErr w:type="spellStart"/>
+                            <w:r>
+                              <w:rPr>
+                                <w:sz w:val="16"/>
+                                <w:szCs w:val="16"/>
+                              </w:rPr>
+                              <w:t>midiout</w:t>
+                            </w:r>
+                            <w:proofErr w:type="spellEnd"/>
+                            <w:r>
+                              <w:rPr>
+                                <w:sz w:val="16"/>
+                                <w:szCs w:val="16"/>
+                              </w:rPr>
+                              <w:t>=</w:t>
                             </w:r>
                           </w:p>
                           <w:p>
@@ -4401,12 +4987,21 @@
                                 <w:szCs w:val="16"/>
                               </w:rPr>
                             </w:pPr>
+                            <w:proofErr w:type="spellStart"/>
                             <w:r>
                               <w:rPr>
                                 <w:sz w:val="16"/>
                                 <w:szCs w:val="16"/>
                               </w:rPr>
-                              <w:t>magic_break: enabled=1</w:t>
+                              <w:t>magic_break</w:t>
+                            </w:r>
+                            <w:proofErr w:type="spellEnd"/>
+                            <w:r>
+                              <w:rPr>
+                                <w:sz w:val="16"/>
+                                <w:szCs w:val="16"/>
+                              </w:rPr>
+                              <w:t>: enabled=1</w:t>
                             </w:r>
                           </w:p>
                           <w:p>
@@ -4450,12 +5045,197 @@
                           <w:szCs w:val="16"/>
                         </w:rPr>
                       </w:pPr>
+                      <w:proofErr w:type="spellStart"/>
                       <w:r>
                         <w:rPr>
                           <w:sz w:val="16"/>
                           <w:szCs w:val="16"/>
                         </w:rPr>
-                        <w:t>display_library: win32, options="traphotkeys, autoscale, gui_debug"</w:t>
+                        <w:t>display_library</w:t>
+                      </w:r>
+                      <w:proofErr w:type="spellEnd"/>
+                      <w:r>
+                        <w:rPr>
+                          <w:sz w:val="16"/>
+                          <w:szCs w:val="16"/>
+                        </w:rPr>
+                        <w:t>: win32, options="</w:t>
+                      </w:r>
+                      <w:proofErr w:type="spellStart"/>
+                      <w:r>
+                        <w:rPr>
+                          <w:sz w:val="16"/>
+                          <w:szCs w:val="16"/>
+                        </w:rPr>
+                        <w:t>traphotkeys</w:t>
+                      </w:r>
+                      <w:proofErr w:type="spellEnd"/>
+                      <w:r>
+                        <w:rPr>
+                          <w:sz w:val="16"/>
+                          <w:szCs w:val="16"/>
+                        </w:rPr>
+                        <w:t xml:space="preserve">, </w:t>
+                      </w:r>
+                      <w:proofErr w:type="spellStart"/>
+                      <w:r>
+                        <w:rPr>
+                          <w:sz w:val="16"/>
+                          <w:szCs w:val="16"/>
+                        </w:rPr>
+                        <w:t>autoscale</w:t>
+                      </w:r>
+                      <w:proofErr w:type="spellEnd"/>
+                      <w:r>
+                        <w:rPr>
+                          <w:sz w:val="16"/>
+                          <w:szCs w:val="16"/>
+                        </w:rPr>
+                        <w:t xml:space="preserve">, </w:t>
+                      </w:r>
+                      <w:proofErr w:type="spellStart"/>
+                      <w:r>
+                        <w:rPr>
+                          <w:sz w:val="16"/>
+                          <w:szCs w:val="16"/>
+                        </w:rPr>
+                        <w:t>gui_debug</w:t>
+                      </w:r>
+                      <w:proofErr w:type="spellEnd"/>
+                      <w:r>
+                        <w:rPr>
+                          <w:sz w:val="16"/>
+                          <w:szCs w:val="16"/>
+                        </w:rPr>
+                        <w:t>"</w:t>
+                      </w:r>
+                    </w:p>
+                    <w:p>
+                      <w:pPr>
+                        <w:rPr>
+                          <w:sz w:val="16"/>
+                          <w:szCs w:val="16"/>
+                        </w:rPr>
+                      </w:pPr>
+                      <w:proofErr w:type="spellStart"/>
+                      <w:r>
+                        <w:rPr>
+                          <w:sz w:val="16"/>
+                          <w:szCs w:val="16"/>
+                        </w:rPr>
+                        <w:t>cpu</w:t>
+                      </w:r>
+                      <w:proofErr w:type="spellEnd"/>
+                      <w:r>
+                        <w:rPr>
+                          <w:sz w:val="16"/>
+                          <w:szCs w:val="16"/>
+                        </w:rPr>
+                        <w:t xml:space="preserve">: model=core2_penryn_t9600, count=1, </w:t>
+                      </w:r>
+                      <w:proofErr w:type="spellStart"/>
+                      <w:r>
+                        <w:rPr>
+                          <w:sz w:val="16"/>
+                          <w:szCs w:val="16"/>
+                        </w:rPr>
+                        <w:t>ips</w:t>
+                      </w:r>
+                      <w:proofErr w:type="spellEnd"/>
+                      <w:r>
+                        <w:rPr>
+                          <w:sz w:val="16"/>
+                          <w:szCs w:val="16"/>
+                        </w:rPr>
+                        <w:t xml:space="preserve">=50000000, </w:t>
+                      </w:r>
+                      <w:proofErr w:type="spellStart"/>
+                      <w:r>
+                        <w:rPr>
+                          <w:sz w:val="16"/>
+                          <w:szCs w:val="16"/>
+                        </w:rPr>
+                        <w:t>reset_on_triple_fault</w:t>
+                      </w:r>
+                      <w:proofErr w:type="spellEnd"/>
+                      <w:r>
+                        <w:rPr>
+                          <w:sz w:val="16"/>
+                          <w:szCs w:val="16"/>
+                        </w:rPr>
+                        <w:t xml:space="preserve">=1, </w:t>
+                      </w:r>
+                      <w:proofErr w:type="spellStart"/>
+                      <w:r>
+                        <w:rPr>
+                          <w:sz w:val="16"/>
+                          <w:szCs w:val="16"/>
+                        </w:rPr>
+                        <w:t>ignore_bad_msrs</w:t>
+                      </w:r>
+                      <w:proofErr w:type="spellEnd"/>
+                      <w:r>
+                        <w:rPr>
+                          <w:sz w:val="16"/>
+                          <w:szCs w:val="16"/>
+                        </w:rPr>
+                        <w:t xml:space="preserve">=1, </w:t>
+                      </w:r>
+                      <w:proofErr w:type="spellStart"/>
+                      <w:r>
+                        <w:rPr>
+                          <w:sz w:val="16"/>
+                          <w:szCs w:val="16"/>
+                        </w:rPr>
+                        <w:t>msrs</w:t>
+                      </w:r>
+                      <w:proofErr w:type="spellEnd"/>
+                      <w:r>
+                        <w:rPr>
+                          <w:sz w:val="16"/>
+                          <w:szCs w:val="16"/>
+                        </w:rPr>
+                        <w:t>="msrs.def"</w:t>
+                      </w:r>
+                    </w:p>
+                    <w:p>
+                      <w:pPr>
+                        <w:rPr>
+                          <w:sz w:val="16"/>
+                          <w:szCs w:val="16"/>
+                        </w:rPr>
+                      </w:pPr>
+                      <w:proofErr w:type="spellStart"/>
+                      <w:r>
+                        <w:rPr>
+                          <w:sz w:val="16"/>
+                          <w:szCs w:val="16"/>
+                        </w:rPr>
+                        <w:t>cpu</w:t>
+                      </w:r>
+                      <w:proofErr w:type="spellEnd"/>
+                      <w:r>
+                        <w:rPr>
+                          <w:sz w:val="16"/>
+                          <w:szCs w:val="16"/>
+                        </w:rPr>
+                        <w:t xml:space="preserve">: </w:t>
+                      </w:r>
+                      <w:proofErr w:type="spellStart"/>
+                      <w:r>
+                        <w:rPr>
+                          <w:sz w:val="16"/>
+                          <w:szCs w:val="16"/>
+                        </w:rPr>
+                        <w:t>cpuid_limit_winnt</w:t>
+                      </w:r>
+                      <w:proofErr w:type="spellEnd"/>
+                      <w:r>
+                        <w:rPr>
+                          <w:sz w:val="16"/>
+                          <w:szCs w:val="16"/>
+                        </w:rPr>
+                        <w:t>=0</w:t>
                       </w:r>
                     </w:p>
                     <w:p>
@@ -4470,8 +5250,122 @@
                           <w:sz w:val="16"/>
                           <w:szCs w:val="16"/>
                         </w:rPr>
-                        <w:t>cpu: model=core2_penryn_t9600, count=1, ips=50000000, reset_on_triple_fault=1, ignore_bad_msrs=1, msrs="msrs.def"</w:t>
+                        <w:t xml:space="preserve">memory: guest=512, host=256, </w:t>
                       </w:r>
+                      <w:proofErr w:type="spellStart"/>
+                      <w:r>
+                        <w:rPr>
+                          <w:sz w:val="16"/>
+                          <w:szCs w:val="16"/>
+                        </w:rPr>
+                        <w:t>block_size</w:t>
+                      </w:r>
+                      <w:proofErr w:type="spellEnd"/>
+                      <w:r>
+                        <w:rPr>
+                          <w:sz w:val="16"/>
+                          <w:szCs w:val="16"/>
+                        </w:rPr>
+                        <w:t>=512</w:t>
+                      </w:r>
+                    </w:p>
+                    <w:p>
+                      <w:pPr>
+                        <w:rPr>
+                          <w:sz w:val="16"/>
+                          <w:szCs w:val="16"/>
+                        </w:rPr>
+                      </w:pPr>
+                      <w:proofErr w:type="spellStart"/>
+                      <w:r>
+                        <w:rPr>
+                          <w:sz w:val="16"/>
+                          <w:szCs w:val="16"/>
+                        </w:rPr>
+                        <w:t>romimage</w:t>
+                      </w:r>
+                      <w:proofErr w:type="spellEnd"/>
+                      <w:r>
+                        <w:rPr>
+                          <w:sz w:val="16"/>
+                          <w:szCs w:val="16"/>
+                        </w:rPr>
+                        <w:t>: file=$BXSHARE/BIOS-</w:t>
+                      </w:r>
+                      <w:proofErr w:type="spellStart"/>
+                      <w:r>
+                        <w:rPr>
+                          <w:sz w:val="16"/>
+                          <w:szCs w:val="16"/>
+                        </w:rPr>
+                        <w:t>bochs</w:t>
+                      </w:r>
+                      <w:proofErr w:type="spellEnd"/>
+                      <w:r>
+                        <w:rPr>
+                          <w:sz w:val="16"/>
+                          <w:szCs w:val="16"/>
+                        </w:rPr>
+                        <w:t>-latest, options=</w:t>
+                      </w:r>
+                      <w:proofErr w:type="spellStart"/>
+                      <w:r>
+                        <w:rPr>
+                          <w:sz w:val="16"/>
+                          <w:szCs w:val="16"/>
+                        </w:rPr>
+                        <w:t>fastboot</w:t>
+                      </w:r>
+                      <w:proofErr w:type="spellEnd"/>
+                    </w:p>
+                    <w:p>
+                      <w:pPr>
+                        <w:rPr>
+                          <w:sz w:val="16"/>
+                          <w:szCs w:val="16"/>
+                        </w:rPr>
+                      </w:pPr>
+                      <w:proofErr w:type="spellStart"/>
+                      <w:r>
+                        <w:rPr>
+                          <w:sz w:val="16"/>
+                          <w:szCs w:val="16"/>
+                        </w:rPr>
+                        <w:t>vgaromimage</w:t>
+                      </w:r>
+                      <w:proofErr w:type="spellEnd"/>
+                      <w:r>
+                        <w:rPr>
+                          <w:sz w:val="16"/>
+                          <w:szCs w:val="16"/>
+                        </w:rPr>
+                        <w:t>: file=$BXSHARE/VGABIOS-</w:t>
+                      </w:r>
+                      <w:proofErr w:type="spellStart"/>
+                      <w:r>
+                        <w:rPr>
+                          <w:sz w:val="16"/>
+                          <w:szCs w:val="16"/>
+                        </w:rPr>
+                        <w:t>lgpl</w:t>
+                      </w:r>
+                      <w:proofErr w:type="spellEnd"/>
+                      <w:r>
+                        <w:rPr>
+                          <w:sz w:val="16"/>
+                          <w:szCs w:val="16"/>
+                        </w:rPr>
+                        <w:t>-</w:t>
+                      </w:r>
+                      <w:proofErr w:type="spellStart"/>
+                      <w:r>
+                        <w:rPr>
+                          <w:sz w:val="16"/>
+                          <w:szCs w:val="16"/>
+                        </w:rPr>
+                        <w:t>latest.bin</w:t>
+                      </w:r>
+                      <w:proofErr w:type="spellEnd"/>
                     </w:p>
                     <w:p>
                       <w:pPr>
@@ -4485,67 +5379,23 @@
                           <w:sz w:val="16"/>
                           <w:szCs w:val="16"/>
                         </w:rPr>
-                        <w:t>cpu: cpuid_limit_winnt=0</w:t>
+                        <w:t xml:space="preserve">keyboard: type=mf, </w:t>
                       </w:r>
-                    </w:p>
-                    <w:p>
-                      <w:pPr>
-                        <w:rPr>
-                          <w:sz w:val="16"/>
-                          <w:szCs w:val="16"/>
-                        </w:rPr>
-                      </w:pPr>
+                      <w:proofErr w:type="spellStart"/>
                       <w:r>
                         <w:rPr>
                           <w:sz w:val="16"/>
                           <w:szCs w:val="16"/>
                         </w:rPr>
-                        <w:t>memory: guest=512, host=256, block_size=512</w:t>
+                        <w:t>serial_delay</w:t>
                       </w:r>
-                    </w:p>
-                    <w:p>
-                      <w:pPr>
-                        <w:rPr>
-                          <w:sz w:val="16"/>
-                          <w:szCs w:val="16"/>
-                        </w:rPr>
-                      </w:pPr>
+                      <w:proofErr w:type="spellEnd"/>
                       <w:r>
                         <w:rPr>
                           <w:sz w:val="16"/>
                           <w:szCs w:val="16"/>
                         </w:rPr>
-                        <w:t>romimage: file=$BXSHARE/BIOS-bochs-latest, options=fastboot</w:t>
-                      </w:r>
-                    </w:p>
-                    <w:p>
-                      <w:pPr>
-                        <w:rPr>
-                          <w:sz w:val="16"/>
-                          <w:szCs w:val="16"/>
-                        </w:rPr>
-                      </w:pPr>
-                      <w:r>
-                        <w:rPr>
-                          <w:sz w:val="16"/>
-                          <w:szCs w:val="16"/>
-                        </w:rPr>
-                        <w:t>vgaromimage: file=$BXSHARE/VGABIOS-lgpl-latest.bin</w:t>
-                      </w:r>
-                    </w:p>
-                    <w:p>
-                      <w:pPr>
-                        <w:rPr>
-                          <w:sz w:val="16"/>
-                          <w:szCs w:val="16"/>
-                        </w:rPr>
-                      </w:pPr>
-                      <w:r>
-                        <w:rPr>
-                          <w:sz w:val="16"/>
-                          <w:szCs w:val="16"/>
-                        </w:rPr>
-                        <w:t>keyboard: type=mf, serial_delay=150</w:t>
+                        <w:t>=150</w:t>
                       </w:r>
                     </w:p>
                     <w:p>
@@ -4570,12 +5420,21 @@
                           <w:szCs w:val="16"/>
                         </w:rPr>
                       </w:pPr>
+                      <w:proofErr w:type="spellStart"/>
                       <w:r>
                         <w:rPr>
                           <w:sz w:val="16"/>
                           <w:szCs w:val="16"/>
                         </w:rPr>
-                        <w:t>pci: enabled=1, chipset=i440fx</w:t>
+                        <w:t>pci</w:t>
+                      </w:r>
+                      <w:proofErr w:type="spellEnd"/>
+                      <w:r>
+                        <w:rPr>
+                          <w:sz w:val="16"/>
+                          <w:szCs w:val="16"/>
+                        </w:rPr>
+                        <w:t>: enabled=1, chipset=i440fx</w:t>
                       </w:r>
                     </w:p>
                     <w:p>
@@ -4585,12 +5444,21 @@
                           <w:szCs w:val="16"/>
                         </w:rPr>
                       </w:pPr>
+                      <w:proofErr w:type="spellStart"/>
                       <w:r>
                         <w:rPr>
                           <w:sz w:val="16"/>
                           <w:szCs w:val="16"/>
                         </w:rPr>
-                        <w:t>private_colormap: enabled=0</w:t>
+                        <w:t>private_colormap</w:t>
+                      </w:r>
+                      <w:proofErr w:type="spellEnd"/>
+                      <w:r>
+                        <w:rPr>
+                          <w:sz w:val="16"/>
+                          <w:szCs w:val="16"/>
+                        </w:rPr>
+                        <w:t>: enabled=0</w:t>
                       </w:r>
                     </w:p>
                     <w:p>
@@ -4600,12 +5468,37 @@
                           <w:szCs w:val="16"/>
                         </w:rPr>
                       </w:pPr>
+                      <w:proofErr w:type="spellStart"/>
                       <w:r>
                         <w:rPr>
                           <w:sz w:val="16"/>
                           <w:szCs w:val="16"/>
                         </w:rPr>
-                        <w:t>floppya: 1_44=C:\Users\mihe\Dropbox\TusMuertOS-Oct2025\src\build\floppy.img, status=inserted, write_protected=1</w:t>
+                        <w:t>floppya</w:t>
+                      </w:r>
+                      <w:proofErr w:type="spellEnd"/>
+                      <w:r>
+                        <w:rPr>
+                          <w:sz w:val="16"/>
+                          <w:szCs w:val="16"/>
+                        </w:rPr>
+                        <w:t xml:space="preserve">: 1_44=C:\Users\mihe\Dropbox\TusMuertOS-Oct2025\src\build\floppy.img, status=inserted, </w:t>
+                      </w:r>
+                      <w:proofErr w:type="spellStart"/>
+                      <w:r>
+                        <w:rPr>
+                          <w:sz w:val="16"/>
+                          <w:szCs w:val="16"/>
+                        </w:rPr>
+                        <w:t>write_protected</w:t>
+                      </w:r>
+                      <w:proofErr w:type="spellEnd"/>
+                      <w:r>
+                        <w:rPr>
+                          <w:sz w:val="16"/>
+                          <w:szCs w:val="16"/>
+                        </w:rPr>
+                        <w:t>=1</w:t>
                       </w:r>
                     </w:p>
                     <w:p>
@@ -4630,12 +5523,21 @@
                           <w:szCs w:val="16"/>
                         </w:rPr>
                       </w:pPr>
+                      <w:proofErr w:type="spellStart"/>
                       <w:r>
                         <w:rPr>
                           <w:sz w:val="16"/>
                           <w:szCs w:val="16"/>
                         </w:rPr>
-                        <w:t>floppy_bootsig_check: disabled=0</w:t>
+                        <w:t>floppy_bootsig_check</w:t>
+                      </w:r>
+                      <w:proofErr w:type="spellEnd"/>
+                      <w:r>
+                        <w:rPr>
+                          <w:sz w:val="16"/>
+                          <w:szCs w:val="16"/>
+                        </w:rPr>
+                        <w:t>: disabled=0</w:t>
                       </w:r>
                     </w:p>
                     <w:p>
@@ -4710,7 +5612,63 @@
                           <w:sz w:val="16"/>
                           <w:szCs w:val="16"/>
                         </w:rPr>
-                        <w:t>debug: action=ignore, pci=report # report BX_DEBUG from module 'pci'</w:t>
+                        <w:t xml:space="preserve">debug: action=ignore, </w:t>
+                      </w:r>
+                      <w:proofErr w:type="spellStart"/>
+                      <w:r>
+                        <w:rPr>
+                          <w:sz w:val="16"/>
+                          <w:szCs w:val="16"/>
+                        </w:rPr>
+                        <w:t>pci</w:t>
+                      </w:r>
+                      <w:proofErr w:type="spellEnd"/>
+                      <w:r>
+                        <w:rPr>
+                          <w:sz w:val="16"/>
+                          <w:szCs w:val="16"/>
+                        </w:rPr>
+                        <w:t>=report # report BX_DEBUG from module '</w:t>
+                      </w:r>
+                      <w:proofErr w:type="spellStart"/>
+                      <w:r>
+                        <w:rPr>
+                          <w:sz w:val="16"/>
+                          <w:szCs w:val="16"/>
+                        </w:rPr>
+                        <w:t>pci</w:t>
+                      </w:r>
+                      <w:proofErr w:type="spellEnd"/>
+                      <w:r>
+                        <w:rPr>
+                          <w:sz w:val="16"/>
+                          <w:szCs w:val="16"/>
+                        </w:rPr>
+                        <w:t>'</w:t>
+                      </w:r>
+                    </w:p>
+                    <w:p>
+                      <w:pPr>
+                        <w:rPr>
+                          <w:sz w:val="16"/>
+                          <w:szCs w:val="16"/>
+                        </w:rPr>
+                      </w:pPr>
+                      <w:proofErr w:type="spellStart"/>
+                      <w:r>
+                        <w:rPr>
+                          <w:sz w:val="16"/>
+                          <w:szCs w:val="16"/>
+                        </w:rPr>
+                        <w:t>debugger_log</w:t>
+                      </w:r>
+                      <w:proofErr w:type="spellEnd"/>
+                      <w:r>
+                        <w:rPr>
+                          <w:sz w:val="16"/>
+                          <w:szCs w:val="16"/>
+                        </w:rPr>
+                        <w:t>: -</w:t>
                       </w:r>
                     </w:p>
                     <w:p>
@@ -4725,7 +5683,23 @@
                           <w:sz w:val="16"/>
                           <w:szCs w:val="16"/>
                         </w:rPr>
-                        <w:t>debugger_log: -</w:t>
+                        <w:t>parport1: enabled=1, file="</w:t>
+                      </w:r>
+                      <w:proofErr w:type="spellStart"/>
+                      <w:r>
+                        <w:rPr>
+                          <w:sz w:val="16"/>
+                          <w:szCs w:val="16"/>
+                        </w:rPr>
+                        <w:t>parport.out</w:t>
+                      </w:r>
+                      <w:proofErr w:type="spellEnd"/>
+                      <w:r>
+                        <w:rPr>
+                          <w:sz w:val="16"/>
+                          <w:szCs w:val="16"/>
+                        </w:rPr>
+                        <w:t>"</w:t>
                       </w:r>
                     </w:p>
                     <w:p>
@@ -4740,22 +5714,55 @@
                           <w:sz w:val="16"/>
                           <w:szCs w:val="16"/>
                         </w:rPr>
-                        <w:t>parport1: enabled=1, file="parport.out"</w:t>
+                        <w:t xml:space="preserve">sound: driver=default, </w:t>
                       </w:r>
-                    </w:p>
-                    <w:p>
-                      <w:pPr>
-                        <w:rPr>
-                          <w:sz w:val="16"/>
-                          <w:szCs w:val="16"/>
-                        </w:rPr>
-                      </w:pPr>
+                      <w:proofErr w:type="spellStart"/>
                       <w:r>
                         <w:rPr>
                           <w:sz w:val="16"/>
                           <w:szCs w:val="16"/>
                         </w:rPr>
-                        <w:t>sound: driver=default, waveout=/dev/dsp. wavein=, midiout=</w:t>
+                        <w:t>waveout</w:t>
+                      </w:r>
+                      <w:proofErr w:type="spellEnd"/>
+                      <w:r>
+                        <w:rPr>
+                          <w:sz w:val="16"/>
+                          <w:szCs w:val="16"/>
+                        </w:rPr>
+                        <w:t xml:space="preserve">=/dev/dsp. </w:t>
+                      </w:r>
+                      <w:proofErr w:type="spellStart"/>
+                      <w:r>
+                        <w:rPr>
+                          <w:sz w:val="16"/>
+                          <w:szCs w:val="16"/>
+                        </w:rPr>
+                        <w:t>wavein</w:t>
+                      </w:r>
+                      <w:proofErr w:type="spellEnd"/>
+                      <w:r>
+                        <w:rPr>
+                          <w:sz w:val="16"/>
+                          <w:szCs w:val="16"/>
+                        </w:rPr>
+                        <w:t xml:space="preserve">=, </w:t>
+                      </w:r>
+                      <w:proofErr w:type="spellStart"/>
+                      <w:r>
+                        <w:rPr>
+                          <w:sz w:val="16"/>
+                          <w:szCs w:val="16"/>
+                        </w:rPr>
+                        <w:t>midiout</w:t>
+                      </w:r>
+                      <w:proofErr w:type="spellEnd"/>
+                      <w:r>
+                        <w:rPr>
+                          <w:sz w:val="16"/>
+                          <w:szCs w:val="16"/>
+                        </w:rPr>
+                        <w:t>=</w:t>
                       </w:r>
                     </w:p>
                     <w:p>
@@ -4780,12 +5787,21 @@
                           <w:szCs w:val="16"/>
                         </w:rPr>
                       </w:pPr>
+                      <w:proofErr w:type="spellStart"/>
                       <w:r>
                         <w:rPr>
                           <w:sz w:val="16"/>
                           <w:szCs w:val="16"/>
                         </w:rPr>
-                        <w:t>magic_break: enabled=1</w:t>
+                        <w:t>magic_break</w:t>
+                      </w:r>
+                      <w:proofErr w:type="spellEnd"/>
+                      <w:r>
+                        <w:rPr>
+                          <w:sz w:val="16"/>
+                          <w:szCs w:val="16"/>
+                        </w:rPr>
+                        <w:t>: enabled=1</w:t>
                       </w:r>
                     </w:p>
                     <w:p>
@@ -4885,8 +5901,13 @@
           <w:numId w:val="1"/>
         </w:numPr>
       </w:pPr>
-      <w:r>
-        <w:t>Formated a USB drive:</w:t>
+      <w:proofErr w:type="spellStart"/>
+      <w:r>
+        <w:t>Formated</w:t>
+      </w:r>
+      <w:proofErr w:type="spellEnd"/>
+      <w:r>
+        <w:t xml:space="preserve"> a USB drive:</w:t>
       </w:r>
     </w:p>
     <w:p>
@@ -4958,7 +5979,15 @@
         </w:numPr>
       </w:pPr>
       <w:r>
-        <w:t>Open the Disk using HxD (Open disk option is brilliant!)</w:t>
+        <w:t xml:space="preserve">Open the Disk using </w:t>
+      </w:r>
+      <w:proofErr w:type="spellStart"/>
+      <w:r>
+        <w:t>HxD</w:t>
+      </w:r>
+      <w:proofErr w:type="spellEnd"/>
+      <w:r>
+        <w:t xml:space="preserve"> (Open disk option is brilliant!)</w:t>
       </w:r>
     </w:p>
     <w:p>
@@ -4976,8 +6005,13 @@
         <w:t>, sector 2048 contains the BPB of a partition.</w:t>
       </w:r>
       <w:r>
-        <w:t xml:space="preserve"> Both can be see easily using HxD</w:t>
-      </w:r>
+        <w:t xml:space="preserve"> Both can be see easily using </w:t>
+      </w:r>
+      <w:proofErr w:type="spellStart"/>
+      <w:r>
+        <w:t>HxD</w:t>
+      </w:r>
+      <w:proofErr w:type="spellEnd"/>
     </w:p>
     <w:p>
       <w:pPr>
@@ -5006,7 +6040,23 @@
         </w:numPr>
       </w:pPr>
       <w:r>
-        <w:t>Exported first 512 to a file using HxD, then used ImHEx disassembler feature to see the code. 16bits-x86-LitteEndian.</w:t>
+        <w:t xml:space="preserve">Exported first 512 to a file using </w:t>
+      </w:r>
+      <w:proofErr w:type="spellStart"/>
+      <w:r>
+        <w:t>HxD</w:t>
+      </w:r>
+      <w:proofErr w:type="spellEnd"/>
+      <w:r>
+        <w:t xml:space="preserve">, then used </w:t>
+      </w:r>
+      <w:proofErr w:type="spellStart"/>
+      <w:r>
+        <w:t>ImHEx</w:t>
+      </w:r>
+      <w:proofErr w:type="spellEnd"/>
+      <w:r>
+        <w:t xml:space="preserve"> disassembler feature to see the code. 16bits-x86-LitteEndian.</w:t>
       </w:r>
     </w:p>
     <w:p>
@@ -5567,37 +6617,79 @@
       <w:r>
         <w:t>Example: “</w:t>
       </w:r>
+      <w:proofErr w:type="spellStart"/>
       <w:r>
         <w:rPr>
           <w:b/>
           <w:bCs/>
         </w:rPr>
-        <w:t>wsl ls -la</w:t>
-      </w:r>
-      <w:r>
-        <w:t>”</w:t>
-      </w:r>
-      <w:r>
-        <w:t xml:space="preserve"> will output Windos folder but using Linux ls</w:t>
-      </w:r>
-    </w:p>
-    <w:p>
-      <w:pPr>
-        <w:pStyle w:val="ListParagraph"/>
-        <w:numPr>
-          <w:ilvl w:val="3"/>
-          <w:numId w:val="1"/>
-        </w:numPr>
-      </w:pPr>
-      <w:r>
-        <w:t xml:space="preserve">Example: </w:t>
-      </w:r>
+        <w:t>wsl</w:t>
+      </w:r>
+      <w:proofErr w:type="spellEnd"/>
       <w:r>
         <w:rPr>
           <w:b/>
           <w:bCs/>
         </w:rPr>
-        <w:t>wsl ls -la | findstr "git"</w:t>
+        <w:t xml:space="preserve"> ls -la</w:t>
+      </w:r>
+      <w:r>
+        <w:t>”</w:t>
+      </w:r>
+      <w:r>
+        <w:t xml:space="preserve"> will output </w:t>
+      </w:r>
+      <w:proofErr w:type="spellStart"/>
+      <w:r>
+        <w:t>Windos</w:t>
+      </w:r>
+      <w:proofErr w:type="spellEnd"/>
+      <w:r>
+        <w:t xml:space="preserve"> folder but using Linux ls</w:t>
+      </w:r>
+    </w:p>
+    <w:p>
+      <w:pPr>
+        <w:pStyle w:val="ListParagraph"/>
+        <w:numPr>
+          <w:ilvl w:val="3"/>
+          <w:numId w:val="1"/>
+        </w:numPr>
+      </w:pPr>
+      <w:r>
+        <w:t xml:space="preserve">Example: </w:t>
+      </w:r>
+      <w:proofErr w:type="spellStart"/>
+      <w:r>
+        <w:rPr>
+          <w:b/>
+          <w:bCs/>
+        </w:rPr>
+        <w:t>wsl</w:t>
+      </w:r>
+      <w:proofErr w:type="spellEnd"/>
+      <w:r>
+        <w:rPr>
+          <w:b/>
+          <w:bCs/>
+        </w:rPr>
+        <w:t xml:space="preserve"> ls -la | </w:t>
+      </w:r>
+      <w:proofErr w:type="spellStart"/>
+      <w:r>
+        <w:rPr>
+          <w:b/>
+          <w:bCs/>
+        </w:rPr>
+        <w:t>findstr</w:t>
+      </w:r>
+      <w:proofErr w:type="spellEnd"/>
+      <w:r>
+        <w:rPr>
+          <w:b/>
+          <w:bCs/>
+        </w:rPr>
+        <w:t xml:space="preserve"> "git"</w:t>
       </w:r>
     </w:p>
     <w:p>
@@ -5711,7 +6803,15 @@
         </w:numPr>
       </w:pPr>
       <w:r>
-        <w:t>sudo apt autoremove -y</w:t>
+        <w:t xml:space="preserve">sudo apt </w:t>
+      </w:r>
+      <w:proofErr w:type="spellStart"/>
+      <w:r>
+        <w:t>autoremove</w:t>
+      </w:r>
+      <w:proofErr w:type="spellEnd"/>
+      <w:r>
+        <w:t xml:space="preserve"> -y</w:t>
       </w:r>
     </w:p>
     <w:p>
@@ -5738,7 +6838,15 @@
         </w:numPr>
       </w:pPr>
       <w:r>
-        <w:t>sudo apt install nasm -y</w:t>
+        <w:t xml:space="preserve">sudo apt install </w:t>
+      </w:r>
+      <w:proofErr w:type="spellStart"/>
+      <w:r>
+        <w:t>nasm</w:t>
+      </w:r>
+      <w:proofErr w:type="spellEnd"/>
+      <w:r>
+        <w:t xml:space="preserve"> -y</w:t>
       </w:r>
     </w:p>
     <w:p>
@@ -5750,7 +6858,15 @@
         </w:numPr>
       </w:pPr>
       <w:r>
-        <w:t>Install bximage:</w:t>
+        <w:t xml:space="preserve">Install </w:t>
+      </w:r>
+      <w:proofErr w:type="spellStart"/>
+      <w:r>
+        <w:t>bximage</w:t>
+      </w:r>
+      <w:proofErr w:type="spellEnd"/>
+      <w:r>
+        <w:t>:</w:t>
       </w:r>
     </w:p>
     <w:p>
@@ -5762,8 +6878,13 @@
         </w:numPr>
       </w:pPr>
       <w:r>
-        <w:t>sudo apt install bximage</w:t>
-      </w:r>
+        <w:t xml:space="preserve">sudo apt install </w:t>
+      </w:r>
+      <w:proofErr w:type="spellStart"/>
+      <w:r>
+        <w:t>bximage</w:t>
+      </w:r>
+      <w:proofErr w:type="spellEnd"/>
     </w:p>
     <w:p>
       <w:pPr>
@@ -5798,7 +6919,15 @@
         </w:numPr>
       </w:pPr>
       <w:r>
-        <w:t>Create a temporary alias for cls = clear(investigate how to make it permanent)</w:t>
+        <w:t xml:space="preserve">Create a temporary alias for </w:t>
+      </w:r>
+      <w:proofErr w:type="spellStart"/>
+      <w:r>
+        <w:t>cls</w:t>
+      </w:r>
+      <w:proofErr w:type="spellEnd"/>
+      <w:r>
+        <w:t xml:space="preserve"> = clear(investigate how to make it permanent)</w:t>
       </w:r>
     </w:p>
     <w:p>
@@ -5810,7 +6939,15 @@
         </w:numPr>
       </w:pPr>
       <w:r>
-        <w:t>alias cls='clear'</w:t>
+        <w:t xml:space="preserve">alias </w:t>
+      </w:r>
+      <w:proofErr w:type="spellStart"/>
+      <w:r>
+        <w:t>cls</w:t>
+      </w:r>
+      <w:proofErr w:type="spellEnd"/>
+      <w:r>
+        <w:t>='clear'</w:t>
       </w:r>
     </w:p>
     <w:p>
@@ -5822,7 +6959,15 @@
         </w:numPr>
       </w:pPr>
       <w:r>
-        <w:t xml:space="preserve">Install qemu on Windows: </w:t>
+        <w:t xml:space="preserve">Install </w:t>
+      </w:r>
+      <w:proofErr w:type="spellStart"/>
+      <w:r>
+        <w:t>qemu</w:t>
+      </w:r>
+      <w:proofErr w:type="spellEnd"/>
+      <w:r>
+        <w:t xml:space="preserve"> on Windows: </w:t>
       </w:r>
       <w:hyperlink r:id="rId15" w:history="1">
         <w:r>
@@ -5906,7 +7051,15 @@
         </w:numPr>
       </w:pPr>
       <w:r>
-        <w:t>Install gcc on WSL:</w:t>
+        <w:t xml:space="preserve">Install </w:t>
+      </w:r>
+      <w:proofErr w:type="spellStart"/>
+      <w:r>
+        <w:t>gcc</w:t>
+      </w:r>
+      <w:proofErr w:type="spellEnd"/>
+      <w:r>
+        <w:t xml:space="preserve"> on WSL:</w:t>
       </w:r>
     </w:p>
     <w:p>
@@ -5918,8 +7071,13 @@
         </w:numPr>
       </w:pPr>
       <w:r>
-        <w:t>Sudo apt install gcc</w:t>
-      </w:r>
+        <w:t xml:space="preserve">Sudo apt install </w:t>
+      </w:r>
+      <w:proofErr w:type="spellStart"/>
+      <w:r>
+        <w:t>gcc</w:t>
+      </w:r>
+      <w:proofErr w:type="spellEnd"/>
     </w:p>
     <w:p>
       <w:pPr>
@@ -5930,7 +7088,15 @@
         </w:numPr>
       </w:pPr>
       <w:r>
-        <w:t>Install build-essential and gdb:</w:t>
+        <w:t xml:space="preserve">Install build-essential and </w:t>
+      </w:r>
+      <w:proofErr w:type="spellStart"/>
+      <w:r>
+        <w:t>gdb</w:t>
+      </w:r>
+      <w:proofErr w:type="spellEnd"/>
+      <w:r>
+        <w:t>:</w:t>
       </w:r>
     </w:p>
     <w:p>
@@ -5942,17 +7108,1383 @@
         </w:numPr>
       </w:pPr>
       <w:r>
-        <w:t>sudo apt-get install build-essential gdb</w:t>
-      </w:r>
-    </w:p>
-    <w:p/>
+        <w:t xml:space="preserve">sudo apt-get install build-essential </w:t>
+      </w:r>
+      <w:proofErr w:type="spellStart"/>
+      <w:r>
+        <w:t>gdb</w:t>
+      </w:r>
+      <w:proofErr w:type="spellEnd"/>
+    </w:p>
+    <w:p>
+      <w:pPr>
+        <w:pStyle w:val="ListParagraph"/>
+        <w:numPr>
+          <w:ilvl w:val="0"/>
+          <w:numId w:val="1"/>
+        </w:numPr>
+      </w:pPr>
+      <w:r>
+        <w:t>Enable GUI for WSL. (Using remote WSL/VSCODE is insufferable):</w:t>
+      </w:r>
+    </w:p>
+    <w:p>
+      <w:pPr>
+        <w:pStyle w:val="ListParagraph"/>
+        <w:numPr>
+          <w:ilvl w:val="1"/>
+          <w:numId w:val="1"/>
+        </w:numPr>
+      </w:pPr>
+      <w:r>
+        <w:t>READ ALL STEPS BEFORE STARTING THE FIRST</w:t>
+      </w:r>
+    </w:p>
+    <w:p>
+      <w:pPr>
+        <w:pStyle w:val="ListParagraph"/>
+        <w:numPr>
+          <w:ilvl w:val="1"/>
+          <w:numId w:val="1"/>
+        </w:numPr>
+      </w:pPr>
+      <w:proofErr w:type="spellStart"/>
+      <w:r>
+        <w:t>wsl</w:t>
+      </w:r>
+      <w:proofErr w:type="spellEnd"/>
+      <w:r>
+        <w:t xml:space="preserve"> </w:t>
+      </w:r>
+      <w:r>
+        <w:t>–</w:t>
+      </w:r>
+      <w:r>
+        <w:t>update</w:t>
+      </w:r>
+    </w:p>
+    <w:p>
+      <w:pPr>
+        <w:pStyle w:val="ListParagraph"/>
+        <w:numPr>
+          <w:ilvl w:val="1"/>
+          <w:numId w:val="1"/>
+        </w:numPr>
+      </w:pPr>
+      <w:proofErr w:type="spellStart"/>
+      <w:r>
+        <w:t>wsl</w:t>
+      </w:r>
+      <w:proofErr w:type="spellEnd"/>
+      <w:r>
+        <w:t xml:space="preserve"> </w:t>
+      </w:r>
+      <w:r>
+        <w:t>–</w:t>
+      </w:r>
+      <w:r>
+        <w:t>shutdown</w:t>
+      </w:r>
+    </w:p>
+    <w:p>
+      <w:pPr>
+        <w:pStyle w:val="ListParagraph"/>
+        <w:numPr>
+          <w:ilvl w:val="1"/>
+          <w:numId w:val="1"/>
+        </w:numPr>
+      </w:pPr>
+      <w:r>
+        <w:t>sudo snap install --classic code # or code-insiders</w:t>
+      </w:r>
+    </w:p>
+    <w:p>
+      <w:pPr>
+        <w:pStyle w:val="ListParagraph"/>
+        <w:numPr>
+          <w:ilvl w:val="1"/>
+          <w:numId w:val="1"/>
+        </w:numPr>
+      </w:pPr>
+      <w:r>
+        <w:lastRenderedPageBreak/>
+        <w:t>type -a code</w:t>
+      </w:r>
+    </w:p>
+    <w:p>
+      <w:pPr>
+        <w:pStyle w:val="ListParagraph"/>
+        <w:numPr>
+          <w:ilvl w:val="2"/>
+          <w:numId w:val="1"/>
+        </w:numPr>
+      </w:pPr>
+      <w:r>
+        <w:t>code is /mnt/c/Program Files/Microsoft VS Code/bin/code</w:t>
+      </w:r>
+    </w:p>
+    <w:p>
+      <w:pPr>
+        <w:pStyle w:val="ListParagraph"/>
+        <w:numPr>
+          <w:ilvl w:val="2"/>
+          <w:numId w:val="1"/>
+        </w:numPr>
+      </w:pPr>
+      <w:r>
+        <w:t>code is /snap/bin/code</w:t>
+      </w:r>
+    </w:p>
+    <w:p>
+      <w:pPr>
+        <w:pStyle w:val="ListParagraph"/>
+        <w:numPr>
+          <w:ilvl w:val="1"/>
+          <w:numId w:val="1"/>
+        </w:numPr>
+      </w:pPr>
+      <w:r>
+        <w:t>sudo mv /usr/bin/code /usr/bin/code-windows</w:t>
+      </w:r>
+    </w:p>
+    <w:p>
+      <w:pPr>
+        <w:pStyle w:val="ListParagraph"/>
+        <w:numPr>
+          <w:ilvl w:val="1"/>
+          <w:numId w:val="1"/>
+        </w:numPr>
+      </w:pPr>
+      <w:r>
+        <w:t xml:space="preserve">(if I want to restore the command above) </w:t>
+      </w:r>
+      <w:r>
+        <w:t>sudo mv /usr/bin/code-windows /usr/bin/code</w:t>
+      </w:r>
+    </w:p>
+    <w:p>
+      <w:pPr>
+        <w:pStyle w:val="ListParagraph"/>
+        <w:numPr>
+          <w:ilvl w:val="1"/>
+          <w:numId w:val="1"/>
+        </w:numPr>
+      </w:pPr>
+      <w:r>
+        <w:t>Actually,</w:t>
+      </w:r>
+      <w:r>
+        <w:t xml:space="preserve"> what worked was [interop] </w:t>
+      </w:r>
+      <w:r>
+        <w:t>appendWindowsPath=false</w:t>
+      </w:r>
+    </w:p>
+    <w:p>
+      <w:pPr>
+        <w:pStyle w:val="ListParagraph"/>
+        <w:numPr>
+          <w:ilvl w:val="1"/>
+          <w:numId w:val="1"/>
+        </w:numPr>
+      </w:pPr>
+      <w:r>
+        <w:t>Wsl –shutdown again.</w:t>
+      </w:r>
+    </w:p>
+    <w:p>
+      <w:pPr>
+        <w:pStyle w:val="ListParagraph"/>
+        <w:numPr>
+          <w:ilvl w:val="1"/>
+          <w:numId w:val="1"/>
+        </w:numPr>
+      </w:pPr>
+      <w:r>
+        <w:t xml:space="preserve">After these steps I lost the ability to run windows commands from WSL console, such as IPCONFIG. </w:t>
+      </w:r>
+    </w:p>
+    <w:p>
+      <w:pPr>
+        <w:pStyle w:val="ListParagraph"/>
+        <w:numPr>
+          <w:ilvl w:val="1"/>
+          <w:numId w:val="1"/>
+        </w:numPr>
+      </w:pPr>
+      <w:r>
+        <w:t>Now using code .</w:t>
+      </w:r>
+      <w:r>
+        <w:t xml:space="preserve"> will open native, with a warning.</w:t>
+      </w:r>
+    </w:p>
+    <w:p>
+      <w:pPr>
+        <w:pStyle w:val="ListParagraph"/>
+        <w:numPr>
+          <w:ilvl w:val="1"/>
+          <w:numId w:val="1"/>
+        </w:numPr>
+      </w:pPr>
+      <w:r>
+        <w:t>sudo apt install nautilus</w:t>
+      </w:r>
+      <w:r>
+        <w:t xml:space="preserve"> (because why not)</w:t>
+      </w:r>
+    </w:p>
+    <w:p>
+      <w:pPr>
+        <w:pStyle w:val="ListParagraph"/>
+        <w:numPr>
+          <w:ilvl w:val="1"/>
+          <w:numId w:val="1"/>
+        </w:numPr>
+      </w:pPr>
+      <w:r>
+        <w:t xml:space="preserve">sudo apt install -y </w:t>
+      </w:r>
+      <w:proofErr w:type="spellStart"/>
+      <w:r>
+        <w:t>firefox</w:t>
+      </w:r>
+      <w:proofErr w:type="spellEnd"/>
+      <w:r>
+        <w:t xml:space="preserve"> (to complete the </w:t>
+      </w:r>
+      <w:proofErr w:type="spellStart"/>
+      <w:r>
+        <w:t>oauth</w:t>
+      </w:r>
+      <w:proofErr w:type="spellEnd"/>
+      <w:r>
+        <w:t xml:space="preserve"> </w:t>
+      </w:r>
+      <w:proofErr w:type="spellStart"/>
+      <w:r>
+        <w:t>github</w:t>
+      </w:r>
+      <w:proofErr w:type="spellEnd"/>
+      <w:r>
+        <w:t xml:space="preserve"> auth)</w:t>
+      </w:r>
+    </w:p>
+    <w:p>
+      <w:pPr>
+        <w:pStyle w:val="ListParagraph"/>
+        <w:numPr>
+          <w:ilvl w:val="0"/>
+          <w:numId w:val="1"/>
+        </w:numPr>
+      </w:pPr>
+      <w:r>
+        <w:t xml:space="preserve">Prepare </w:t>
+      </w:r>
+      <w:proofErr w:type="spellStart"/>
+      <w:r>
+        <w:t>vscode</w:t>
+      </w:r>
+      <w:proofErr w:type="spellEnd"/>
+      <w:r>
+        <w:t xml:space="preserve"> on Linux for c:</w:t>
+      </w:r>
+    </w:p>
+    <w:p>
+      <w:pPr>
+        <w:pStyle w:val="ListParagraph"/>
+        <w:numPr>
+          <w:ilvl w:val="1"/>
+          <w:numId w:val="1"/>
+        </w:numPr>
+      </w:pPr>
+      <w:r>
+        <w:t xml:space="preserve">Create a launch and tasks </w:t>
+      </w:r>
+      <w:proofErr w:type="spellStart"/>
+      <w:r>
+        <w:t>jsons</w:t>
+      </w:r>
+      <w:proofErr w:type="spellEnd"/>
+      <w:r>
+        <w:t>.</w:t>
+      </w:r>
+    </w:p>
+    <w:p>
+      <w:pPr>
+        <w:pStyle w:val="ListParagraph"/>
+        <w:numPr>
+          <w:ilvl w:val="1"/>
+          <w:numId w:val="1"/>
+        </w:numPr>
+      </w:pPr>
+      <w:r>
+        <w:t>Watch if defender is blocking the creation of binaries. Exclude the folder if required.</w:t>
+      </w:r>
+    </w:p>
+    <w:p>
+      <w:pPr>
+        <w:pStyle w:val="ListParagraph"/>
+        <w:numPr>
+          <w:ilvl w:val="1"/>
+          <w:numId w:val="1"/>
+        </w:numPr>
+      </w:pPr>
+      <w:r>
+        <w:t>{</w:t>
+      </w:r>
+    </w:p>
+    <w:p>
+      <w:pPr>
+        <w:pStyle w:val="ListParagraph"/>
+        <w:numPr>
+          <w:ilvl w:val="1"/>
+          <w:numId w:val="1"/>
+        </w:numPr>
+      </w:pPr>
+      <w:r>
+        <w:t xml:space="preserve">    // Use IntelliSense to learn about possible attributes.</w:t>
+      </w:r>
+    </w:p>
+    <w:p>
+      <w:pPr>
+        <w:pStyle w:val="ListParagraph"/>
+        <w:numPr>
+          <w:ilvl w:val="1"/>
+          <w:numId w:val="1"/>
+        </w:numPr>
+      </w:pPr>
+      <w:r>
+        <w:t xml:space="preserve">    // Hover to view descriptions of existing attributes.</w:t>
+      </w:r>
+    </w:p>
+    <w:p>
+      <w:pPr>
+        <w:pStyle w:val="ListParagraph"/>
+        <w:numPr>
+          <w:ilvl w:val="1"/>
+          <w:numId w:val="1"/>
+        </w:numPr>
+      </w:pPr>
+      <w:r>
+        <w:t xml:space="preserve">    // For more information, visit: https://go.microsoft.com/fwlink/?linkid=830387</w:t>
+      </w:r>
+    </w:p>
+    <w:p>
+      <w:pPr>
+        <w:pStyle w:val="ListParagraph"/>
+        <w:numPr>
+          <w:ilvl w:val="1"/>
+          <w:numId w:val="1"/>
+        </w:numPr>
+      </w:pPr>
+      <w:r>
+        <w:t xml:space="preserve">    "version": "0.2.0",</w:t>
+      </w:r>
+    </w:p>
+    <w:p>
+      <w:pPr>
+        <w:pStyle w:val="ListParagraph"/>
+        <w:numPr>
+          <w:ilvl w:val="1"/>
+          <w:numId w:val="1"/>
+        </w:numPr>
+      </w:pPr>
+      <w:r>
+        <w:t xml:space="preserve">    "configurations": [</w:t>
+      </w:r>
+    </w:p>
+    <w:p>
+      <w:pPr>
+        <w:pStyle w:val="ListParagraph"/>
+        <w:numPr>
+          <w:ilvl w:val="1"/>
+          <w:numId w:val="1"/>
+        </w:numPr>
+      </w:pPr>
+      <w:r>
+        <w:t xml:space="preserve">        {</w:t>
+      </w:r>
+    </w:p>
+    <w:p>
+      <w:pPr>
+        <w:pStyle w:val="ListParagraph"/>
+        <w:numPr>
+          <w:ilvl w:val="1"/>
+          <w:numId w:val="1"/>
+        </w:numPr>
+      </w:pPr>
+      <w:r>
+        <w:t xml:space="preserve">            "</w:t>
+      </w:r>
+      <w:proofErr w:type="spellStart"/>
+      <w:r>
+        <w:t>preLaunchTask</w:t>
+      </w:r>
+      <w:proofErr w:type="spellEnd"/>
+      <w:r>
+        <w:t xml:space="preserve">": "C/C++: </w:t>
+      </w:r>
+      <w:proofErr w:type="spellStart"/>
+      <w:r>
+        <w:t>gcc</w:t>
+      </w:r>
+      <w:proofErr w:type="spellEnd"/>
+      <w:r>
+        <w:t xml:space="preserve"> build active file",</w:t>
+      </w:r>
+    </w:p>
+    <w:p>
+      <w:pPr>
+        <w:pStyle w:val="ListParagraph"/>
+        <w:numPr>
+          <w:ilvl w:val="1"/>
+          <w:numId w:val="1"/>
+        </w:numPr>
+      </w:pPr>
+      <w:r>
+        <w:t xml:space="preserve">            "name": "(</w:t>
+      </w:r>
+      <w:proofErr w:type="spellStart"/>
+      <w:r>
+        <w:t>gdb</w:t>
+      </w:r>
+      <w:proofErr w:type="spellEnd"/>
+      <w:r>
+        <w:t>) Launch",</w:t>
+      </w:r>
+    </w:p>
+    <w:p>
+      <w:pPr>
+        <w:pStyle w:val="ListParagraph"/>
+        <w:numPr>
+          <w:ilvl w:val="1"/>
+          <w:numId w:val="1"/>
+        </w:numPr>
+      </w:pPr>
+      <w:r>
+        <w:t xml:space="preserve">            "type": "</w:t>
+      </w:r>
+      <w:proofErr w:type="spellStart"/>
+      <w:r>
+        <w:t>cppdbg</w:t>
+      </w:r>
+      <w:proofErr w:type="spellEnd"/>
+      <w:r>
+        <w:t>",</w:t>
+      </w:r>
+    </w:p>
+    <w:p>
+      <w:pPr>
+        <w:pStyle w:val="ListParagraph"/>
+        <w:numPr>
+          <w:ilvl w:val="1"/>
+          <w:numId w:val="1"/>
+        </w:numPr>
+      </w:pPr>
+      <w:r>
+        <w:t xml:space="preserve">            "request": "launch",</w:t>
+      </w:r>
+    </w:p>
+    <w:p>
+      <w:pPr>
+        <w:pStyle w:val="ListParagraph"/>
+        <w:numPr>
+          <w:ilvl w:val="1"/>
+          <w:numId w:val="1"/>
+        </w:numPr>
+      </w:pPr>
+      <w:r>
+        <w:t xml:space="preserve">            "program": "${</w:t>
+      </w:r>
+      <w:proofErr w:type="spellStart"/>
+      <w:r>
+        <w:t>fileDirname</w:t>
+      </w:r>
+      <w:proofErr w:type="spellEnd"/>
+      <w:r>
+        <w:t>}/${</w:t>
+      </w:r>
+      <w:proofErr w:type="spellStart"/>
+      <w:r>
+        <w:t>fileBasenameNoExtension</w:t>
+      </w:r>
+      <w:proofErr w:type="spellEnd"/>
+      <w:r>
+        <w:t>}",</w:t>
+      </w:r>
+    </w:p>
+    <w:p>
+      <w:pPr>
+        <w:pStyle w:val="ListParagraph"/>
+        <w:numPr>
+          <w:ilvl w:val="1"/>
+          <w:numId w:val="1"/>
+        </w:numPr>
+      </w:pPr>
+      <w:r>
+        <w:t xml:space="preserve">            "</w:t>
+      </w:r>
+      <w:proofErr w:type="spellStart"/>
+      <w:r>
+        <w:t>args</w:t>
+      </w:r>
+      <w:proofErr w:type="spellEnd"/>
+      <w:r>
+        <w:t>": [</w:t>
+      </w:r>
+    </w:p>
+    <w:p>
+      <w:pPr>
+        <w:pStyle w:val="ListParagraph"/>
+        <w:numPr>
+          <w:ilvl w:val="1"/>
+          <w:numId w:val="1"/>
+        </w:numPr>
+      </w:pPr>
+      <w:r>
+        <w:t xml:space="preserve">                "</w:t>
+      </w:r>
+      <w:proofErr w:type="spellStart"/>
+      <w:r>
+        <w:t>aaaaa</w:t>
+      </w:r>
+      <w:proofErr w:type="spellEnd"/>
+      <w:r>
+        <w:t>",</w:t>
+      </w:r>
+    </w:p>
+    <w:p>
+      <w:pPr>
+        <w:pStyle w:val="ListParagraph"/>
+        <w:numPr>
+          <w:ilvl w:val="1"/>
+          <w:numId w:val="1"/>
+        </w:numPr>
+      </w:pPr>
+      <w:r>
+        <w:t xml:space="preserve">                "</w:t>
+      </w:r>
+      <w:proofErr w:type="spellStart"/>
+      <w:r>
+        <w:t>bbbbb</w:t>
+      </w:r>
+      <w:proofErr w:type="spellEnd"/>
+      <w:r>
+        <w:t>",</w:t>
+      </w:r>
+    </w:p>
+    <w:p>
+      <w:pPr>
+        <w:pStyle w:val="ListParagraph"/>
+        <w:numPr>
+          <w:ilvl w:val="1"/>
+          <w:numId w:val="1"/>
+        </w:numPr>
+      </w:pPr>
+      <w:r>
+        <w:t xml:space="preserve">                "</w:t>
+      </w:r>
+      <w:proofErr w:type="spellStart"/>
+      <w:r>
+        <w:t>ccccc</w:t>
+      </w:r>
+      <w:proofErr w:type="spellEnd"/>
+      <w:r>
+        <w:t>"</w:t>
+      </w:r>
+    </w:p>
+    <w:p>
+      <w:pPr>
+        <w:pStyle w:val="ListParagraph"/>
+        <w:numPr>
+          <w:ilvl w:val="1"/>
+          <w:numId w:val="1"/>
+        </w:numPr>
+      </w:pPr>
+      <w:r>
+        <w:t xml:space="preserve">            ],</w:t>
+      </w:r>
+    </w:p>
+    <w:p>
+      <w:pPr>
+        <w:pStyle w:val="ListParagraph"/>
+        <w:numPr>
+          <w:ilvl w:val="1"/>
+          <w:numId w:val="1"/>
+        </w:numPr>
+      </w:pPr>
+      <w:r>
+        <w:t xml:space="preserve">            "</w:t>
+      </w:r>
+      <w:proofErr w:type="spellStart"/>
+      <w:r>
+        <w:t>stopAtEntry</w:t>
+      </w:r>
+      <w:proofErr w:type="spellEnd"/>
+      <w:r>
+        <w:t>": false,</w:t>
+      </w:r>
+    </w:p>
+    <w:p>
+      <w:pPr>
+        <w:pStyle w:val="ListParagraph"/>
+        <w:numPr>
+          <w:ilvl w:val="1"/>
+          <w:numId w:val="1"/>
+        </w:numPr>
+      </w:pPr>
+      <w:r>
+        <w:t xml:space="preserve">            "</w:t>
+      </w:r>
+      <w:proofErr w:type="spellStart"/>
+      <w:r>
+        <w:t>cwd</w:t>
+      </w:r>
+      <w:proofErr w:type="spellEnd"/>
+      <w:r>
+        <w:t>": "${</w:t>
+      </w:r>
+      <w:proofErr w:type="spellStart"/>
+      <w:r>
+        <w:t>fileDirname</w:t>
+      </w:r>
+      <w:proofErr w:type="spellEnd"/>
+      <w:r>
+        <w:t>}",</w:t>
+      </w:r>
+    </w:p>
+    <w:p>
+      <w:pPr>
+        <w:pStyle w:val="ListParagraph"/>
+        <w:numPr>
+          <w:ilvl w:val="1"/>
+          <w:numId w:val="1"/>
+        </w:numPr>
+      </w:pPr>
+      <w:r>
+        <w:t xml:space="preserve">            "environment": [],</w:t>
+      </w:r>
+    </w:p>
+    <w:p>
+      <w:pPr>
+        <w:pStyle w:val="ListParagraph"/>
+        <w:numPr>
+          <w:ilvl w:val="1"/>
+          <w:numId w:val="1"/>
+        </w:numPr>
+      </w:pPr>
+      <w:r>
+        <w:t xml:space="preserve">            "</w:t>
+      </w:r>
+      <w:proofErr w:type="spellStart"/>
+      <w:r>
+        <w:t>externalConsole</w:t>
+      </w:r>
+      <w:proofErr w:type="spellEnd"/>
+      <w:r>
+        <w:t>": false,</w:t>
+      </w:r>
+    </w:p>
+    <w:p>
+      <w:pPr>
+        <w:pStyle w:val="ListParagraph"/>
+        <w:numPr>
+          <w:ilvl w:val="1"/>
+          <w:numId w:val="1"/>
+        </w:numPr>
+      </w:pPr>
+      <w:r>
+        <w:t xml:space="preserve">            "</w:t>
+      </w:r>
+      <w:proofErr w:type="spellStart"/>
+      <w:r>
+        <w:t>MIMode</w:t>
+      </w:r>
+      <w:proofErr w:type="spellEnd"/>
+      <w:r>
+        <w:t>": "</w:t>
+      </w:r>
+      <w:proofErr w:type="spellStart"/>
+      <w:r>
+        <w:t>gdb</w:t>
+      </w:r>
+      <w:proofErr w:type="spellEnd"/>
+      <w:r>
+        <w:t>",</w:t>
+      </w:r>
+    </w:p>
+    <w:p>
+      <w:pPr>
+        <w:pStyle w:val="ListParagraph"/>
+        <w:numPr>
+          <w:ilvl w:val="1"/>
+          <w:numId w:val="1"/>
+        </w:numPr>
+      </w:pPr>
+      <w:r>
+        <w:t xml:space="preserve">            "</w:t>
+      </w:r>
+      <w:proofErr w:type="spellStart"/>
+      <w:r>
+        <w:t>setupCommands</w:t>
+      </w:r>
+      <w:proofErr w:type="spellEnd"/>
+      <w:r>
+        <w:t>": [</w:t>
+      </w:r>
+    </w:p>
+    <w:p>
+      <w:pPr>
+        <w:pStyle w:val="ListParagraph"/>
+        <w:numPr>
+          <w:ilvl w:val="1"/>
+          <w:numId w:val="1"/>
+        </w:numPr>
+      </w:pPr>
+      <w:r>
+        <w:t xml:space="preserve">                {</w:t>
+      </w:r>
+    </w:p>
+    <w:p>
+      <w:pPr>
+        <w:pStyle w:val="ListParagraph"/>
+        <w:numPr>
+          <w:ilvl w:val="1"/>
+          <w:numId w:val="1"/>
+        </w:numPr>
+      </w:pPr>
+      <w:r>
+        <w:t xml:space="preserve">                    "description": "Enable pretty-printing for </w:t>
+      </w:r>
+      <w:proofErr w:type="spellStart"/>
+      <w:r>
+        <w:t>gdb</w:t>
+      </w:r>
+      <w:proofErr w:type="spellEnd"/>
+      <w:r>
+        <w:t>",</w:t>
+      </w:r>
+    </w:p>
+    <w:p>
+      <w:pPr>
+        <w:pStyle w:val="ListParagraph"/>
+        <w:numPr>
+          <w:ilvl w:val="1"/>
+          <w:numId w:val="1"/>
+        </w:numPr>
+      </w:pPr>
+      <w:r>
+        <w:t xml:space="preserve">                    "text": "-enable-pretty-printing",</w:t>
+      </w:r>
+    </w:p>
+    <w:p>
+      <w:pPr>
+        <w:pStyle w:val="ListParagraph"/>
+        <w:numPr>
+          <w:ilvl w:val="1"/>
+          <w:numId w:val="1"/>
+        </w:numPr>
+      </w:pPr>
+      <w:r>
+        <w:t xml:space="preserve">                    "</w:t>
+      </w:r>
+      <w:proofErr w:type="spellStart"/>
+      <w:r>
+        <w:t>ignoreFailures</w:t>
+      </w:r>
+      <w:proofErr w:type="spellEnd"/>
+      <w:r>
+        <w:t>": true</w:t>
+      </w:r>
+    </w:p>
+    <w:p>
+      <w:pPr>
+        <w:pStyle w:val="ListParagraph"/>
+        <w:numPr>
+          <w:ilvl w:val="1"/>
+          <w:numId w:val="1"/>
+        </w:numPr>
+      </w:pPr>
+      <w:r>
+        <w:t xml:space="preserve">                },</w:t>
+      </w:r>
+    </w:p>
+    <w:p>
+      <w:pPr>
+        <w:pStyle w:val="ListParagraph"/>
+        <w:numPr>
+          <w:ilvl w:val="1"/>
+          <w:numId w:val="1"/>
+        </w:numPr>
+      </w:pPr>
+      <w:r>
+        <w:t xml:space="preserve">                {</w:t>
+      </w:r>
+    </w:p>
+    <w:p>
+      <w:pPr>
+        <w:pStyle w:val="ListParagraph"/>
+        <w:numPr>
+          <w:ilvl w:val="1"/>
+          <w:numId w:val="1"/>
+        </w:numPr>
+      </w:pPr>
+      <w:r>
+        <w:t xml:space="preserve">                    "description": "Set Disassembly Flavor to Intel",</w:t>
+      </w:r>
+    </w:p>
+    <w:p>
+      <w:pPr>
+        <w:pStyle w:val="ListParagraph"/>
+        <w:numPr>
+          <w:ilvl w:val="1"/>
+          <w:numId w:val="1"/>
+        </w:numPr>
+      </w:pPr>
+      <w:r>
+        <w:t xml:space="preserve">                    "text": "-</w:t>
+      </w:r>
+      <w:proofErr w:type="spellStart"/>
+      <w:r>
+        <w:t>gdb</w:t>
+      </w:r>
+      <w:proofErr w:type="spellEnd"/>
+      <w:r>
+        <w:t>-set disassembly-flavor intel",</w:t>
+      </w:r>
+    </w:p>
+    <w:p>
+      <w:pPr>
+        <w:pStyle w:val="ListParagraph"/>
+        <w:numPr>
+          <w:ilvl w:val="1"/>
+          <w:numId w:val="1"/>
+        </w:numPr>
+      </w:pPr>
+      <w:r>
+        <w:t xml:space="preserve">                    "</w:t>
+      </w:r>
+      <w:proofErr w:type="spellStart"/>
+      <w:r>
+        <w:t>ignoreFailures</w:t>
+      </w:r>
+      <w:proofErr w:type="spellEnd"/>
+      <w:r>
+        <w:t>": true</w:t>
+      </w:r>
+    </w:p>
+    <w:p>
+      <w:pPr>
+        <w:pStyle w:val="ListParagraph"/>
+        <w:numPr>
+          <w:ilvl w:val="1"/>
+          <w:numId w:val="1"/>
+        </w:numPr>
+      </w:pPr>
+      <w:r>
+        <w:t xml:space="preserve">                }</w:t>
+      </w:r>
+    </w:p>
+    <w:p>
+      <w:pPr>
+        <w:pStyle w:val="ListParagraph"/>
+        <w:numPr>
+          <w:ilvl w:val="1"/>
+          <w:numId w:val="1"/>
+        </w:numPr>
+      </w:pPr>
+      <w:r>
+        <w:t xml:space="preserve">            ]</w:t>
+      </w:r>
+    </w:p>
+    <w:p>
+      <w:pPr>
+        <w:pStyle w:val="ListParagraph"/>
+        <w:numPr>
+          <w:ilvl w:val="1"/>
+          <w:numId w:val="1"/>
+        </w:numPr>
+      </w:pPr>
+      <w:r>
+        <w:t xml:space="preserve">        }</w:t>
+      </w:r>
+    </w:p>
+    <w:p>
+      <w:pPr>
+        <w:pStyle w:val="ListParagraph"/>
+        <w:numPr>
+          <w:ilvl w:val="1"/>
+          <w:numId w:val="1"/>
+        </w:numPr>
+      </w:pPr>
+      <w:r>
+        <w:t xml:space="preserve">    ]</w:t>
+      </w:r>
+    </w:p>
+    <w:p>
+      <w:pPr>
+        <w:pStyle w:val="ListParagraph"/>
+        <w:numPr>
+          <w:ilvl w:val="1"/>
+          <w:numId w:val="1"/>
+        </w:numPr>
+      </w:pPr>
+      <w:r>
+        <w:lastRenderedPageBreak/>
+        <w:t>}</w:t>
+      </w:r>
+    </w:p>
+    <w:p>
+      <w:pPr>
+        <w:pStyle w:val="ListParagraph"/>
+        <w:numPr>
+          <w:ilvl w:val="1"/>
+          <w:numId w:val="1"/>
+        </w:numPr>
+      </w:pPr>
+      <w:r>
+        <w:t>{</w:t>
+      </w:r>
+    </w:p>
+    <w:p>
+      <w:pPr>
+        <w:pStyle w:val="ListParagraph"/>
+        <w:numPr>
+          <w:ilvl w:val="1"/>
+          <w:numId w:val="1"/>
+        </w:numPr>
+      </w:pPr>
+      <w:r>
+        <w:t xml:space="preserve">    "tasks": [</w:t>
+      </w:r>
+    </w:p>
+    <w:p>
+      <w:pPr>
+        <w:pStyle w:val="ListParagraph"/>
+        <w:numPr>
+          <w:ilvl w:val="1"/>
+          <w:numId w:val="1"/>
+        </w:numPr>
+      </w:pPr>
+      <w:r>
+        <w:t xml:space="preserve">        {</w:t>
+      </w:r>
+    </w:p>
+    <w:p>
+      <w:pPr>
+        <w:pStyle w:val="ListParagraph"/>
+        <w:numPr>
+          <w:ilvl w:val="1"/>
+          <w:numId w:val="1"/>
+        </w:numPr>
+      </w:pPr>
+      <w:r>
+        <w:t xml:space="preserve">            "type": "</w:t>
+      </w:r>
+      <w:proofErr w:type="spellStart"/>
+      <w:r>
+        <w:t>cppbuild</w:t>
+      </w:r>
+      <w:proofErr w:type="spellEnd"/>
+      <w:r>
+        <w:t>",</w:t>
+      </w:r>
+    </w:p>
+    <w:p>
+      <w:pPr>
+        <w:pStyle w:val="ListParagraph"/>
+        <w:numPr>
+          <w:ilvl w:val="1"/>
+          <w:numId w:val="1"/>
+        </w:numPr>
+      </w:pPr>
+      <w:r>
+        <w:t xml:space="preserve">            "label": "C/C++: </w:t>
+      </w:r>
+      <w:proofErr w:type="spellStart"/>
+      <w:r>
+        <w:t>gcc</w:t>
+      </w:r>
+      <w:proofErr w:type="spellEnd"/>
+      <w:r>
+        <w:t xml:space="preserve"> build active file",</w:t>
+      </w:r>
+    </w:p>
+    <w:p>
+      <w:pPr>
+        <w:pStyle w:val="ListParagraph"/>
+        <w:numPr>
+          <w:ilvl w:val="1"/>
+          <w:numId w:val="1"/>
+        </w:numPr>
+      </w:pPr>
+      <w:r>
+        <w:t xml:space="preserve">            "command": "/usr/bin/</w:t>
+      </w:r>
+      <w:proofErr w:type="spellStart"/>
+      <w:r>
+        <w:t>gcc</w:t>
+      </w:r>
+      <w:proofErr w:type="spellEnd"/>
+      <w:r>
+        <w:t>",</w:t>
+      </w:r>
+    </w:p>
+    <w:p>
+      <w:pPr>
+        <w:pStyle w:val="ListParagraph"/>
+        <w:numPr>
+          <w:ilvl w:val="1"/>
+          <w:numId w:val="1"/>
+        </w:numPr>
+      </w:pPr>
+      <w:r>
+        <w:t xml:space="preserve">            "</w:t>
+      </w:r>
+      <w:proofErr w:type="spellStart"/>
+      <w:r>
+        <w:t>args</w:t>
+      </w:r>
+      <w:proofErr w:type="spellEnd"/>
+      <w:r>
+        <w:t>": [</w:t>
+      </w:r>
+    </w:p>
+    <w:p>
+      <w:pPr>
+        <w:pStyle w:val="ListParagraph"/>
+        <w:numPr>
+          <w:ilvl w:val="1"/>
+          <w:numId w:val="1"/>
+        </w:numPr>
+      </w:pPr>
+      <w:r>
+        <w:t xml:space="preserve">                "-</w:t>
+      </w:r>
+      <w:proofErr w:type="spellStart"/>
+      <w:r>
+        <w:t>fdiagnostics</w:t>
+      </w:r>
+      <w:proofErr w:type="spellEnd"/>
+      <w:r>
+        <w:t>-color=always",</w:t>
+      </w:r>
+    </w:p>
+    <w:p>
+      <w:pPr>
+        <w:pStyle w:val="ListParagraph"/>
+        <w:numPr>
+          <w:ilvl w:val="1"/>
+          <w:numId w:val="1"/>
+        </w:numPr>
+      </w:pPr>
+      <w:r>
+        <w:t xml:space="preserve">                "-g",</w:t>
+      </w:r>
+    </w:p>
+    <w:p>
+      <w:pPr>
+        <w:pStyle w:val="ListParagraph"/>
+        <w:numPr>
+          <w:ilvl w:val="1"/>
+          <w:numId w:val="1"/>
+        </w:numPr>
+      </w:pPr>
+      <w:r>
+        <w:t xml:space="preserve">                "${file}",</w:t>
+      </w:r>
+    </w:p>
+    <w:p>
+      <w:pPr>
+        <w:pStyle w:val="ListParagraph"/>
+        <w:numPr>
+          <w:ilvl w:val="1"/>
+          <w:numId w:val="1"/>
+        </w:numPr>
+      </w:pPr>
+      <w:r>
+        <w:t xml:space="preserve">                "-o",</w:t>
+      </w:r>
+    </w:p>
+    <w:p>
+      <w:pPr>
+        <w:pStyle w:val="ListParagraph"/>
+        <w:numPr>
+          <w:ilvl w:val="1"/>
+          <w:numId w:val="1"/>
+        </w:numPr>
+      </w:pPr>
+      <w:r>
+        <w:t xml:space="preserve">                "${</w:t>
+      </w:r>
+      <w:proofErr w:type="spellStart"/>
+      <w:r>
+        <w:t>fileDirname</w:t>
+      </w:r>
+      <w:proofErr w:type="spellEnd"/>
+      <w:r>
+        <w:t>}/${</w:t>
+      </w:r>
+      <w:proofErr w:type="spellStart"/>
+      <w:r>
+        <w:t>fileBasenameNoExtension</w:t>
+      </w:r>
+      <w:proofErr w:type="spellEnd"/>
+      <w:r>
+        <w:t>}"</w:t>
+      </w:r>
+    </w:p>
+    <w:p>
+      <w:pPr>
+        <w:pStyle w:val="ListParagraph"/>
+        <w:numPr>
+          <w:ilvl w:val="1"/>
+          <w:numId w:val="1"/>
+        </w:numPr>
+      </w:pPr>
+      <w:r>
+        <w:t xml:space="preserve">            ],</w:t>
+      </w:r>
+    </w:p>
+    <w:p>
+      <w:pPr>
+        <w:pStyle w:val="ListParagraph"/>
+        <w:numPr>
+          <w:ilvl w:val="1"/>
+          <w:numId w:val="1"/>
+        </w:numPr>
+      </w:pPr>
+      <w:r>
+        <w:t xml:space="preserve">            "options": {</w:t>
+      </w:r>
+    </w:p>
+    <w:p>
+      <w:pPr>
+        <w:pStyle w:val="ListParagraph"/>
+        <w:numPr>
+          <w:ilvl w:val="1"/>
+          <w:numId w:val="1"/>
+        </w:numPr>
+      </w:pPr>
+      <w:r>
+        <w:t xml:space="preserve">                "</w:t>
+      </w:r>
+      <w:proofErr w:type="spellStart"/>
+      <w:r>
+        <w:t>cwd</w:t>
+      </w:r>
+      <w:proofErr w:type="spellEnd"/>
+      <w:r>
+        <w:t>": "${</w:t>
+      </w:r>
+      <w:proofErr w:type="spellStart"/>
+      <w:r>
+        <w:t>fileDirname</w:t>
+      </w:r>
+      <w:proofErr w:type="spellEnd"/>
+      <w:r>
+        <w:t>}"</w:t>
+      </w:r>
+    </w:p>
+    <w:p>
+      <w:pPr>
+        <w:pStyle w:val="ListParagraph"/>
+        <w:numPr>
+          <w:ilvl w:val="1"/>
+          <w:numId w:val="1"/>
+        </w:numPr>
+      </w:pPr>
+      <w:r>
+        <w:t xml:space="preserve">            },</w:t>
+      </w:r>
+    </w:p>
+    <w:p>
+      <w:pPr>
+        <w:pStyle w:val="ListParagraph"/>
+        <w:numPr>
+          <w:ilvl w:val="1"/>
+          <w:numId w:val="1"/>
+        </w:numPr>
+      </w:pPr>
+      <w:r>
+        <w:t xml:space="preserve">            "</w:t>
+      </w:r>
+      <w:proofErr w:type="spellStart"/>
+      <w:r>
+        <w:t>problemMatcher</w:t>
+      </w:r>
+      <w:proofErr w:type="spellEnd"/>
+      <w:r>
+        <w:t>": [</w:t>
+      </w:r>
+    </w:p>
+    <w:p>
+      <w:pPr>
+        <w:pStyle w:val="ListParagraph"/>
+        <w:numPr>
+          <w:ilvl w:val="1"/>
+          <w:numId w:val="1"/>
+        </w:numPr>
+      </w:pPr>
+      <w:r>
+        <w:t xml:space="preserve">                "$</w:t>
+      </w:r>
+      <w:proofErr w:type="spellStart"/>
+      <w:r>
+        <w:t>gcc</w:t>
+      </w:r>
+      <w:proofErr w:type="spellEnd"/>
+      <w:r>
+        <w:t>"</w:t>
+      </w:r>
+    </w:p>
+    <w:p>
+      <w:pPr>
+        <w:pStyle w:val="ListParagraph"/>
+        <w:numPr>
+          <w:ilvl w:val="1"/>
+          <w:numId w:val="1"/>
+        </w:numPr>
+      </w:pPr>
+      <w:r>
+        <w:t xml:space="preserve">            ],</w:t>
+      </w:r>
+    </w:p>
+    <w:p>
+      <w:pPr>
+        <w:pStyle w:val="ListParagraph"/>
+        <w:numPr>
+          <w:ilvl w:val="1"/>
+          <w:numId w:val="1"/>
+        </w:numPr>
+      </w:pPr>
+      <w:r>
+        <w:t xml:space="preserve">            "group": {</w:t>
+      </w:r>
+    </w:p>
+    <w:p>
+      <w:pPr>
+        <w:pStyle w:val="ListParagraph"/>
+        <w:numPr>
+          <w:ilvl w:val="1"/>
+          <w:numId w:val="1"/>
+        </w:numPr>
+      </w:pPr>
+      <w:r>
+        <w:t xml:space="preserve">                "kind": "build",</w:t>
+      </w:r>
+    </w:p>
+    <w:p>
+      <w:pPr>
+        <w:pStyle w:val="ListParagraph"/>
+        <w:numPr>
+          <w:ilvl w:val="1"/>
+          <w:numId w:val="1"/>
+        </w:numPr>
+      </w:pPr>
+      <w:r>
+        <w:t xml:space="preserve">                "</w:t>
+      </w:r>
+      <w:proofErr w:type="spellStart"/>
+      <w:r>
+        <w:t>isDefault</w:t>
+      </w:r>
+      <w:proofErr w:type="spellEnd"/>
+      <w:r>
+        <w:t>": true</w:t>
+      </w:r>
+    </w:p>
+    <w:p>
+      <w:pPr>
+        <w:pStyle w:val="ListParagraph"/>
+        <w:numPr>
+          <w:ilvl w:val="1"/>
+          <w:numId w:val="1"/>
+        </w:numPr>
+      </w:pPr>
+      <w:r>
+        <w:t xml:space="preserve">            },</w:t>
+      </w:r>
+    </w:p>
+    <w:p>
+      <w:pPr>
+        <w:pStyle w:val="ListParagraph"/>
+        <w:numPr>
+          <w:ilvl w:val="1"/>
+          <w:numId w:val="1"/>
+        </w:numPr>
+      </w:pPr>
+      <w:r>
+        <w:t xml:space="preserve">            "detail": "Task generated by Debugger."</w:t>
+      </w:r>
+    </w:p>
+    <w:p>
+      <w:pPr>
+        <w:pStyle w:val="ListParagraph"/>
+        <w:numPr>
+          <w:ilvl w:val="1"/>
+          <w:numId w:val="1"/>
+        </w:numPr>
+      </w:pPr>
+      <w:r>
+        <w:t xml:space="preserve">        }</w:t>
+      </w:r>
+    </w:p>
+    <w:p>
+      <w:pPr>
+        <w:pStyle w:val="ListParagraph"/>
+        <w:numPr>
+          <w:ilvl w:val="1"/>
+          <w:numId w:val="1"/>
+        </w:numPr>
+      </w:pPr>
+      <w:r>
+        <w:t xml:space="preserve">    ],</w:t>
+      </w:r>
+    </w:p>
+    <w:p>
+      <w:pPr>
+        <w:pStyle w:val="ListParagraph"/>
+        <w:numPr>
+          <w:ilvl w:val="1"/>
+          <w:numId w:val="1"/>
+        </w:numPr>
+      </w:pPr>
+      <w:r>
+        <w:t xml:space="preserve">    "version": "2.0.0"</w:t>
+      </w:r>
+    </w:p>
+    <w:p>
+      <w:pPr>
+        <w:pStyle w:val="ListParagraph"/>
+        <w:numPr>
+          <w:ilvl w:val="1"/>
+          <w:numId w:val="1"/>
+        </w:numPr>
+      </w:pPr>
+      <w:r>
+        <w:t>}</w:t>
+      </w:r>
+    </w:p>
+    <w:p>
+      <w:pPr>
+        <w:pStyle w:val="ListParagraph"/>
+        <w:numPr>
+          <w:ilvl w:val="0"/>
+          <w:numId w:val="1"/>
+        </w:numPr>
+      </w:pPr>
+      <w:r>
+        <w:t>Next setup task. . . ..</w:t>
+      </w:r>
+    </w:p>
     <w:p>
       <w:pPr>
         <w:pStyle w:val="Heading2"/>
       </w:pPr>
       <w:bookmarkStart w:id="11" w:name="_Toc212933575"/>
       <w:r>
-        <w:lastRenderedPageBreak/>
         <w:t>BUILD PROCESS BEFORE MAKE</w:t>
       </w:r>
       <w:bookmarkEnd w:id="11"/>
@@ -6004,6 +8536,7 @@
         <w:rPr>
           <w:noProof/>
         </w:rPr>
+        <w:lastRenderedPageBreak/>
         <w:drawing>
           <wp:inline distT="0" distB="0" distL="0" distR="0" wp14:anchorId="214DE4BB" wp14:editId="7F8C982B">
             <wp:extent cx="5943600" cy="2092960"/>
@@ -6075,7 +8608,6 @@
         <w:rPr>
           <w:noProof/>
         </w:rPr>
-        <w:lastRenderedPageBreak/>
         <w:drawing>
           <wp:inline distT="0" distB="0" distL="0" distR="0" wp14:anchorId="3FBA7AED" wp14:editId="7B4321D9">
             <wp:extent cx="5943600" cy="4516755"/>
@@ -6120,6 +8652,7 @@
       </w:pPr>
       <w:bookmarkStart w:id="14" w:name="_Toc212933578"/>
       <w:r>
+        <w:lastRenderedPageBreak/>
         <w:t>Common Linux and Windows commands</w:t>
       </w:r>
       <w:bookmarkEnd w:id="14"/>
@@ -6138,7 +8671,15 @@
     <w:p/>
     <w:p>
       <w:r>
-        <w:t xml:space="preserve">Build binary from asm file using NASM. Relative path, the full path for this is: </w:t>
+        <w:t xml:space="preserve">Build binary from </w:t>
+      </w:r>
+      <w:proofErr w:type="spellStart"/>
+      <w:r>
+        <w:t>asm</w:t>
+      </w:r>
+      <w:proofErr w:type="spellEnd"/>
+      <w:r>
+        <w:t xml:space="preserve"> file using NASM. Relative path, the full path for this is: </w:t>
       </w:r>
     </w:p>
     <w:p>
@@ -6170,19 +8711,72 @@
           <w:bCs/>
         </w:rPr>
       </w:pPr>
+      <w:proofErr w:type="spellStart"/>
       <w:r>
         <w:rPr>
           <w:b/>
           <w:bCs/>
         </w:rPr>
-        <w:t>nasm -f bin src/bootloader/stage1.asm -o src/build/stage1.bin</w:t>
+        <w:t>nasm</w:t>
+      </w:r>
+      <w:proofErr w:type="spellEnd"/>
+      <w:r>
+        <w:rPr>
+          <w:b/>
+          <w:bCs/>
+        </w:rPr>
+        <w:t xml:space="preserve"> -f bin </w:t>
+      </w:r>
+      <w:proofErr w:type="spellStart"/>
+      <w:r>
+        <w:rPr>
+          <w:b/>
+          <w:bCs/>
+        </w:rPr>
+        <w:t>src</w:t>
+      </w:r>
+      <w:proofErr w:type="spellEnd"/>
+      <w:r>
+        <w:rPr>
+          <w:b/>
+          <w:bCs/>
+        </w:rPr>
+        <w:t xml:space="preserve">/bootloader/stage1.asm -o </w:t>
+      </w:r>
+      <w:proofErr w:type="spellStart"/>
+      <w:r>
+        <w:rPr>
+          <w:b/>
+          <w:bCs/>
+        </w:rPr>
+        <w:t>src</w:t>
+      </w:r>
+      <w:proofErr w:type="spellEnd"/>
+      <w:r>
+        <w:rPr>
+          <w:b/>
+          <w:bCs/>
+        </w:rPr>
+        <w:t>/build/stage1.bin</w:t>
       </w:r>
     </w:p>
     <w:p/>
     <w:p>
-      <w:r>
-        <w:lastRenderedPageBreak/>
-        <w:t>bximage to create an empty floppy disk. It is an interactive tool with a menu. It shows this info after execution: The following line should appear in your bochsrc:</w:t>
+      <w:proofErr w:type="spellStart"/>
+      <w:r>
+        <w:t>bximage</w:t>
+      </w:r>
+      <w:proofErr w:type="spellEnd"/>
+      <w:r>
+        <w:t xml:space="preserve"> to create an empty floppy disk. It is an interactive tool with a menu. It shows this info after execution: The following line should appear in your </w:t>
+      </w:r>
+      <w:proofErr w:type="spellStart"/>
+      <w:r>
+        <w:t>bochsrc</w:t>
+      </w:r>
+      <w:proofErr w:type="spellEnd"/>
+      <w:r>
+        <w:t>:</w:t>
       </w:r>
     </w:p>
     <w:p>
@@ -6193,12 +8787,37 @@
           <w:bCs/>
         </w:rPr>
       </w:pPr>
+      <w:proofErr w:type="spellStart"/>
       <w:r>
         <w:rPr>
           <w:b/>
           <w:bCs/>
         </w:rPr>
-        <w:t>floppya: image="floppy.img", status=inserted</w:t>
+        <w:t>floppya</w:t>
+      </w:r>
+      <w:proofErr w:type="spellEnd"/>
+      <w:r>
+        <w:rPr>
+          <w:b/>
+          <w:bCs/>
+        </w:rPr>
+        <w:t>: image="</w:t>
+      </w:r>
+      <w:proofErr w:type="spellStart"/>
+      <w:r>
+        <w:rPr>
+          <w:b/>
+          <w:bCs/>
+        </w:rPr>
+        <w:t>floppy.img</w:t>
+      </w:r>
+      <w:proofErr w:type="spellEnd"/>
+      <w:r>
+        <w:rPr>
+          <w:b/>
+          <w:bCs/>
+        </w:rPr>
+        <w:t>", status=inserted</w:t>
       </w:r>
     </w:p>
     <w:p>
@@ -6219,26 +8838,107 @@
           <w:b/>
           <w:bCs/>
         </w:rPr>
-        <w:t>dd if=/dev/zero of=teaching.img bs=512 count=2880</w:t>
-      </w:r>
-    </w:p>
-    <w:p/>
-    <w:p>
-      <w:r>
-        <w:t>Inject the bootloader (512 bytes, One sector if I am not mistaketn) at the beginning of the empty disk image:</w:t>
-      </w:r>
-    </w:p>
-    <w:p>
-      <w:pPr>
-        <w:ind w:firstLine="720"/>
-      </w:pPr>
+        <w:t>dd if=/dev/zero of=</w:t>
+      </w:r>
+      <w:proofErr w:type="spellStart"/>
       <w:r>
         <w:rPr>
           <w:b/>
           <w:bCs/>
         </w:rPr>
-        <w:t>dd if=src/build/stage1.bin of=src/build/floppy.img bs=512 count=1 conv=notrunc</w:t>
-      </w:r>
+        <w:t>teaching.img</w:t>
+      </w:r>
+      <w:proofErr w:type="spellEnd"/>
+      <w:r>
+        <w:rPr>
+          <w:b/>
+          <w:bCs/>
+        </w:rPr>
+        <w:t xml:space="preserve"> bs=512 count=2880</w:t>
+      </w:r>
+    </w:p>
+    <w:p/>
+    <w:p>
+      <w:r>
+        <w:t xml:space="preserve">Inject the bootloader (512 bytes, One sector if I am not </w:t>
+      </w:r>
+      <w:proofErr w:type="spellStart"/>
+      <w:r>
+        <w:t>mistaketn</w:t>
+      </w:r>
+      <w:proofErr w:type="spellEnd"/>
+      <w:r>
+        <w:t>) at the beginning of the empty disk image:</w:t>
+      </w:r>
+    </w:p>
+    <w:p>
+      <w:pPr>
+        <w:ind w:firstLine="720"/>
+      </w:pPr>
+      <w:r>
+        <w:rPr>
+          <w:b/>
+          <w:bCs/>
+        </w:rPr>
+        <w:t>dd if=</w:t>
+      </w:r>
+      <w:proofErr w:type="spellStart"/>
+      <w:r>
+        <w:rPr>
+          <w:b/>
+          <w:bCs/>
+        </w:rPr>
+        <w:t>src</w:t>
+      </w:r>
+      <w:proofErr w:type="spellEnd"/>
+      <w:r>
+        <w:rPr>
+          <w:b/>
+          <w:bCs/>
+        </w:rPr>
+        <w:t>/build/stage1.bin of=</w:t>
+      </w:r>
+      <w:proofErr w:type="spellStart"/>
+      <w:r>
+        <w:rPr>
+          <w:b/>
+          <w:bCs/>
+        </w:rPr>
+        <w:t>src</w:t>
+      </w:r>
+      <w:proofErr w:type="spellEnd"/>
+      <w:r>
+        <w:rPr>
+          <w:b/>
+          <w:bCs/>
+        </w:rPr>
+        <w:t>/build/</w:t>
+      </w:r>
+      <w:proofErr w:type="spellStart"/>
+      <w:r>
+        <w:rPr>
+          <w:b/>
+          <w:bCs/>
+        </w:rPr>
+        <w:t>floppy.img</w:t>
+      </w:r>
+      <w:proofErr w:type="spellEnd"/>
+      <w:r>
+        <w:rPr>
+          <w:b/>
+          <w:bCs/>
+        </w:rPr>
+        <w:t xml:space="preserve"> bs=512 count=1 conv=</w:t>
+      </w:r>
+      <w:proofErr w:type="spellStart"/>
+      <w:r>
+        <w:rPr>
+          <w:b/>
+          <w:bCs/>
+        </w:rPr>
+        <w:t>notrunc</w:t>
+      </w:r>
+      <w:proofErr w:type="spellEnd"/>
     </w:p>
     <w:p/>
     <w:p>
@@ -6254,13 +8954,31 @@
           <w:bCs/>
         </w:rPr>
       </w:pPr>
+      <w:proofErr w:type="spellStart"/>
       <w:r>
         <w:rPr>
           <w:b/>
           <w:bCs/>
         </w:rPr>
-        <w:t>xxd -l 512 floppy.img</w:t>
-      </w:r>
+        <w:t>xxd</w:t>
+      </w:r>
+      <w:proofErr w:type="spellEnd"/>
+      <w:r>
+        <w:rPr>
+          <w:b/>
+          <w:bCs/>
+        </w:rPr>
+        <w:t xml:space="preserve"> -l 512 </w:t>
+      </w:r>
+      <w:proofErr w:type="spellStart"/>
+      <w:r>
+        <w:rPr>
+          <w:b/>
+          <w:bCs/>
+        </w:rPr>
+        <w:t>floppy.img</w:t>
+      </w:r>
+      <w:proofErr w:type="spellEnd"/>
     </w:p>
     <w:p/>
     <w:p/>
@@ -6277,7 +8995,15 @@
     <w:p/>
     <w:p>
       <w:r>
-        <w:t>Run qemu with the bootloader bin</w:t>
+        <w:t xml:space="preserve">Run </w:t>
+      </w:r>
+      <w:proofErr w:type="spellStart"/>
+      <w:r>
+        <w:t>qemu</w:t>
+      </w:r>
+      <w:proofErr w:type="spellEnd"/>
+      <w:r>
+        <w:t xml:space="preserve"> with the bootloader bin</w:t>
       </w:r>
     </w:p>
     <w:p>
@@ -6303,19 +9029,48 @@
     </w:p>
     <w:p>
       <w:r>
-        <w:t>Copy the template where the img is (in the file you also use full path or relative to the .img and output logs).</w:t>
-      </w:r>
-    </w:p>
-    <w:p>
-      <w:r>
-        <w:t>Run this: bochs -f .\bochsrc-runtime.txt -q -debugger</w:t>
+        <w:t xml:space="preserve">Copy the template where the </w:t>
+      </w:r>
+      <w:proofErr w:type="spellStart"/>
+      <w:r>
+        <w:t>img</w:t>
+      </w:r>
+      <w:proofErr w:type="spellEnd"/>
+      <w:r>
+        <w:t xml:space="preserve"> is (in the file you also use full path or relative to the .</w:t>
+      </w:r>
+      <w:proofErr w:type="spellStart"/>
+      <w:r>
+        <w:t>img</w:t>
+      </w:r>
+      <w:proofErr w:type="spellEnd"/>
+      <w:r>
+        <w:t xml:space="preserve"> and output logs).</w:t>
+      </w:r>
+    </w:p>
+    <w:p>
+      <w:r>
+        <w:t xml:space="preserve">Run this: </w:t>
+      </w:r>
+      <w:proofErr w:type="spellStart"/>
+      <w:r>
+        <w:t>bochs</w:t>
+      </w:r>
+      <w:proofErr w:type="spellEnd"/>
+      <w:r>
+        <w:t xml:space="preserve"> -f .\bochsrc-runtime.txt -q -debugger</w:t>
       </w:r>
     </w:p>
     <w:p>
       <w:r>
         <w:tab/>
-        <w:t>-f: configfile</w:t>
-      </w:r>
+        <w:t xml:space="preserve">-f: </w:t>
+      </w:r>
+      <w:proofErr w:type="spellStart"/>
+      <w:r>
+        <w:t>configfile</w:t>
+      </w:r>
+      <w:proofErr w:type="spellEnd"/>
     </w:p>
     <w:p>
       <w:r>
@@ -6326,12 +9081,25 @@
     <w:p>
       <w:r>
         <w:tab/>
-        <w:t>-debugger: memory, registers, etc…</w:t>
-      </w:r>
-    </w:p>
-    <w:p>
-      <w:r>
-        <w:t>bochs -f .\bochsrc-runtime.txt -q -debugger</w:t>
+        <w:t xml:space="preserve">-debugger: memory, registers, </w:t>
+      </w:r>
+      <w:proofErr w:type="spellStart"/>
+      <w:r>
+        <w:t>etc</w:t>
+      </w:r>
+      <w:proofErr w:type="spellEnd"/>
+      <w:r>
+        <w:t>…</w:t>
+      </w:r>
+    </w:p>
+    <w:p>
+      <w:proofErr w:type="spellStart"/>
+      <w:r>
+        <w:t>bochs</w:t>
+      </w:r>
+      <w:proofErr w:type="spellEnd"/>
+      <w:r>
+        <w:t xml:space="preserve"> -f .\bochsrc-runtime.txt -q -debugger</w:t>
       </w:r>
     </w:p>
     <w:p/>
@@ -6341,8 +9109,29 @@
       </w:r>
     </w:p>
     <w:p>
-      <w:r>
-        <w:t>bochs -f .\bochsrc-runtime.txt -q -debugger -rc .\bochs.cmds try to enable automatic breakpoint, without magic breakpoints, which take space from the bootloader.</w:t>
+      <w:proofErr w:type="spellStart"/>
+      <w:r>
+        <w:t>bochs</w:t>
+      </w:r>
+      <w:proofErr w:type="spellEnd"/>
+      <w:r>
+        <w:t xml:space="preserve"> -f .\bochsrc-runtime.txt -q -debugger -</w:t>
+      </w:r>
+      <w:proofErr w:type="spellStart"/>
+      <w:r>
+        <w:t>rc</w:t>
+      </w:r>
+      <w:proofErr w:type="spellEnd"/>
+      <w:r>
+        <w:t xml:space="preserve"> .\</w:t>
+      </w:r>
+      <w:proofErr w:type="spellStart"/>
+      <w:r>
+        <w:t>bochs.cmds</w:t>
+      </w:r>
+      <w:proofErr w:type="spellEnd"/>
+      <w:r>
+        <w:t xml:space="preserve"> try to enable automatic breakpoint, without magic breakpoints, which take space from the bootloader.</w:t>
       </w:r>
     </w:p>
     <w:p/>
@@ -6435,9 +9224,11 @@
       <w:r>
         <w:t xml:space="preserve">WSL Tab autocomplete </w:t>
       </w:r>
+      <w:proofErr w:type="spellStart"/>
       <w:r>
         <w:t>searchs</w:t>
       </w:r>
+      <w:proofErr w:type="spellEnd"/>
       <w:r>
         <w:t xml:space="preserve"> only on windows/system32</w:t>
       </w:r>
@@ -6446,7 +9237,24 @@
     <w:p/>
     <w:p>
       <w:r>
-        <w:t>No solution found yet. Tried to add to etc/wsl.conf this appendWindowsPath=false</w:t>
+        <w:lastRenderedPageBreak/>
+        <w:t xml:space="preserve">No solution found yet. Tried to add to </w:t>
+      </w:r>
+      <w:proofErr w:type="spellStart"/>
+      <w:r>
+        <w:t>etc</w:t>
+      </w:r>
+      <w:proofErr w:type="spellEnd"/>
+      <w:r>
+        <w:t>/</w:t>
+      </w:r>
+      <w:proofErr w:type="spellStart"/>
+      <w:r>
+        <w:t>wsl.conf</w:t>
+      </w:r>
+      <w:proofErr w:type="spellEnd"/>
+      <w:r>
+        <w:t xml:space="preserve"> this appendWindowsPath=false</w:t>
       </w:r>
     </w:p>
     <w:p/>
@@ -6456,7 +9264,15 @@
       </w:pPr>
       <w:bookmarkStart w:id="20" w:name="_Toc212933584"/>
       <w:r>
-        <w:t>On bootloader, will mov sp, 0x7C00 make the next push to overwrite the first byte of the bootloader? (Overlap)</w:t>
+        <w:t xml:space="preserve">On bootloader, will mov </w:t>
+      </w:r>
+      <w:proofErr w:type="spellStart"/>
+      <w:r>
+        <w:t>sp</w:t>
+      </w:r>
+      <w:proofErr w:type="spellEnd"/>
+      <w:r>
+        <w:t>, 0x7C00 make the next push to overwrite the first byte of the bootloader? (Overlap)</w:t>
       </w:r>
       <w:bookmarkEnd w:id="20"/>
     </w:p>
@@ -6515,7 +9331,6 @@
       </w:pPr>
       <w:bookmarkStart w:id="21" w:name="_Toc212933585"/>
       <w:r>
-        <w:lastRenderedPageBreak/>
         <w:t xml:space="preserve">Full </w:t>
       </w:r>
       <w:r>
@@ -6550,7 +9365,15 @@
     <w:p/>
     <w:p>
       <w:r>
-        <w:t>The easiest way to resolve this would be to add .gitattributes file with a * text=auto line. This should normalize the line endings and prevent this issue within this specific repository. See </w:t>
+        <w:t>The easiest way to resolve this would be to add .</w:t>
+      </w:r>
+      <w:proofErr w:type="spellStart"/>
+      <w:r>
+        <w:t>gitattributes</w:t>
+      </w:r>
+      <w:proofErr w:type="spellEnd"/>
+      <w:r>
+        <w:t> file with a * text=auto line. This should normalize the line endings and prevent this issue within this specific repository. See </w:t>
       </w:r>
       <w:hyperlink r:id="rId21" w:anchor="per-repository-settings" w:history="1">
         <w:r>
@@ -6633,6 +9456,7 @@
         </w:numPr>
       </w:pPr>
       <w:r>
+        <w:lastRenderedPageBreak/>
         <w:t xml:space="preserve">On floppy, the FAT info at 0 starts with a jump to code, followed by the FAT info. This way both, the bootloader and FAT info can coexist, because there is a jump. Validate this because I got this explained by </w:t>
       </w:r>
       <w:r>
@@ -6697,6 +9521,42 @@
       </w:r>
       <w:r>
         <w:t>resolution.</w:t>
+      </w:r>
+    </w:p>
+    <w:p>
+      <w:pPr>
+        <w:pStyle w:val="ListParagraph"/>
+        <w:numPr>
+          <w:ilvl w:val="0"/>
+          <w:numId w:val="1"/>
+        </w:numPr>
+      </w:pPr>
+      <w:r>
+        <w:t xml:space="preserve">Change the path order (open first code from </w:t>
+      </w:r>
+      <w:proofErr w:type="spellStart"/>
+      <w:r>
+        <w:t>linux</w:t>
+      </w:r>
+      <w:proofErr w:type="spellEnd"/>
+      <w:r>
+        <w:t xml:space="preserve"> instead of windows, without removing the windows path via </w:t>
+      </w:r>
+      <w:proofErr w:type="spellStart"/>
+      <w:r>
+        <w:t>etc</w:t>
+      </w:r>
+      <w:proofErr w:type="spellEnd"/>
+      <w:r>
+        <w:t>/</w:t>
+      </w:r>
+      <w:proofErr w:type="spellStart"/>
+      <w:r>
+        <w:t>wsl.conf</w:t>
+      </w:r>
+      <w:proofErr w:type="spellEnd"/>
+      <w:r>
+        <w:t xml:space="preserve"> file )</w:t>
       </w:r>
     </w:p>
     <w:p>
@@ -6792,7 +9652,6 @@
         <w:rPr>
           <w:noProof/>
         </w:rPr>
-        <w:lastRenderedPageBreak/>
         <w:drawing>
           <wp:inline distT="0" distB="0" distL="0" distR="0" wp14:anchorId="32D8F6A5" wp14:editId="7ECDF19D">
             <wp:extent cx="5943600" cy="4198620"/>
@@ -6847,7 +9706,15 @@
         </w:r>
       </w:fldSimple>
       <w:r>
-        <w:t xml:space="preserve"> Early makefile for the bootloader</w:t>
+        <w:t xml:space="preserve"> Early </w:t>
+      </w:r>
+      <w:proofErr w:type="spellStart"/>
+      <w:r>
+        <w:t>makefile</w:t>
+      </w:r>
+      <w:proofErr w:type="spellEnd"/>
+      <w:r>
+        <w:t xml:space="preserve"> for the bootloader</w:t>
       </w:r>
       <w:bookmarkEnd w:id="25"/>
     </w:p>
@@ -6940,6 +9807,11 @@
       <w:bookmarkEnd w:id="26"/>
     </w:p>
     <w:p/>
+    <w:p>
+      <w:r>
+        <w:t>02-November-2025</w:t>
+      </w:r>
+    </w:p>
     <w:p/>
     <w:p/>
     <w:p>
@@ -7011,9 +9883,11 @@
             <w:r>
               <w:t xml:space="preserve">bootloader made in assembly. </w:t>
             </w:r>
+            <w:proofErr w:type="spellStart"/>
             <w:r>
               <w:t>diskwrite.c</w:t>
             </w:r>
+            <w:proofErr w:type="spellEnd"/>
             <w:r>
               <w:t>, it looks like a custom FAT32 image writer, which is an idea I am toying with.</w:t>
             </w:r>
@@ -7081,8 +9955,21 @@
               <w:t xml:space="preserve"> and projects</w:t>
             </w:r>
             <w:r>
-              <w:t xml:space="preserve"> section contain a lot of pre-canned structures and asm for OsDev</w:t>
-            </w:r>
+              <w:t xml:space="preserve"> section contain a lot of pre-canned structures and </w:t>
+            </w:r>
+            <w:proofErr w:type="spellStart"/>
+            <w:r>
+              <w:t>asm</w:t>
+            </w:r>
+            <w:proofErr w:type="spellEnd"/>
+            <w:r>
+              <w:t xml:space="preserve"> for </w:t>
+            </w:r>
+            <w:proofErr w:type="spellStart"/>
+            <w:r>
+              <w:t>OsDev</w:t>
+            </w:r>
+            <w:proofErr w:type="spellEnd"/>
           </w:p>
         </w:tc>
       </w:tr>
@@ -7165,7 +10052,15 @@
     <w:p/>
     <w:p>
       <w:r>
-        <w:t>Hours clocked-in includes, coding, research, testing, reading, documenting, etc…</w:t>
+        <w:t xml:space="preserve">Hours clocked-in includes, coding, research, testing, reading, documenting, </w:t>
+      </w:r>
+      <w:proofErr w:type="spellStart"/>
+      <w:r>
+        <w:t>etc</w:t>
+      </w:r>
+      <w:proofErr w:type="spellEnd"/>
+      <w:r>
+        <w:t>…</w:t>
       </w:r>
     </w:p>
     <w:p/>
@@ -7196,7 +10091,15 @@
           </w:tcPr>
           <w:p>
             <w:r>
-              <w:t>Hours aprox.</w:t>
+              <w:t xml:space="preserve">Hours </w:t>
+            </w:r>
+            <w:proofErr w:type="spellStart"/>
+            <w:r>
+              <w:t>aprox</w:t>
+            </w:r>
+            <w:proofErr w:type="spellEnd"/>
+            <w:r>
+              <w:t>.</w:t>
             </w:r>
           </w:p>
         </w:tc>
@@ -7240,7 +10143,7 @@
           </w:tcPr>
           <w:p>
             <w:r>
-              <w:t>4</w:t>
+              <w:t>12</w:t>
             </w:r>
           </w:p>
         </w:tc>
@@ -8111,6 +11014,118 @@
     </w:lvl>
   </w:abstractNum>
   <w:abstractNum w:abstractNumId="1" w15:restartNumberingAfterBreak="0">
+    <w:nsid w:val="271C24AF"/>
+    <w:multiLevelType w:val="hybridMultilevel"/>
+    <w:tmpl w:val="C376196C"/>
+    <w:lvl w:ilvl="0" w:tplc="DFA2DC44">
+      <w:numFmt w:val="bullet"/>
+      <w:lvlText w:val="-"/>
+      <w:lvlJc w:val="left"/>
+      <w:pPr>
+        <w:ind w:left="720" w:hanging="360"/>
+      </w:pPr>
+      <w:rPr>
+        <w:rFonts w:ascii="Fira Code" w:eastAsiaTheme="minorEastAsia" w:hAnsi="Fira Code" w:cs="Fira Code" w:hint="default"/>
+      </w:rPr>
+    </w:lvl>
+    <w:lvl w:ilvl="1" w:tplc="04090003" w:tentative="1">
+      <w:start w:val="1"/>
+      <w:numFmt w:val="bullet"/>
+      <w:lvlText w:val="o"/>
+      <w:lvlJc w:val="left"/>
+      <w:pPr>
+        <w:ind w:left="1440" w:hanging="360"/>
+      </w:pPr>
+      <w:rPr>
+        <w:rFonts w:ascii="Courier New" w:hAnsi="Courier New" w:cs="Courier New" w:hint="default"/>
+      </w:rPr>
+    </w:lvl>
+    <w:lvl w:ilvl="2" w:tplc="04090005" w:tentative="1">
+      <w:start w:val="1"/>
+      <w:numFmt w:val="bullet"/>
+      <w:lvlText w:val=""/>
+      <w:lvlJc w:val="left"/>
+      <w:pPr>
+        <w:ind w:left="2160" w:hanging="360"/>
+      </w:pPr>
+      <w:rPr>
+        <w:rFonts w:ascii="Wingdings" w:hAnsi="Wingdings" w:hint="default"/>
+      </w:rPr>
+    </w:lvl>
+    <w:lvl w:ilvl="3" w:tplc="04090001" w:tentative="1">
+      <w:start w:val="1"/>
+      <w:numFmt w:val="bullet"/>
+      <w:lvlText w:val=""/>
+      <w:lvlJc w:val="left"/>
+      <w:pPr>
+        <w:ind w:left="2880" w:hanging="360"/>
+      </w:pPr>
+      <w:rPr>
+        <w:rFonts w:ascii="Symbol" w:hAnsi="Symbol" w:hint="default"/>
+      </w:rPr>
+    </w:lvl>
+    <w:lvl w:ilvl="4" w:tplc="04090003" w:tentative="1">
+      <w:start w:val="1"/>
+      <w:numFmt w:val="bullet"/>
+      <w:lvlText w:val="o"/>
+      <w:lvlJc w:val="left"/>
+      <w:pPr>
+        <w:ind w:left="3600" w:hanging="360"/>
+      </w:pPr>
+      <w:rPr>
+        <w:rFonts w:ascii="Courier New" w:hAnsi="Courier New" w:cs="Courier New" w:hint="default"/>
+      </w:rPr>
+    </w:lvl>
+    <w:lvl w:ilvl="5" w:tplc="04090005" w:tentative="1">
+      <w:start w:val="1"/>
+      <w:numFmt w:val="bullet"/>
+      <w:lvlText w:val=""/>
+      <w:lvlJc w:val="left"/>
+      <w:pPr>
+        <w:ind w:left="4320" w:hanging="360"/>
+      </w:pPr>
+      <w:rPr>
+        <w:rFonts w:ascii="Wingdings" w:hAnsi="Wingdings" w:hint="default"/>
+      </w:rPr>
+    </w:lvl>
+    <w:lvl w:ilvl="6" w:tplc="04090001" w:tentative="1">
+      <w:start w:val="1"/>
+      <w:numFmt w:val="bullet"/>
+      <w:lvlText w:val=""/>
+      <w:lvlJc w:val="left"/>
+      <w:pPr>
+        <w:ind w:left="5040" w:hanging="360"/>
+      </w:pPr>
+      <w:rPr>
+        <w:rFonts w:ascii="Symbol" w:hAnsi="Symbol" w:hint="default"/>
+      </w:rPr>
+    </w:lvl>
+    <w:lvl w:ilvl="7" w:tplc="04090003" w:tentative="1">
+      <w:start w:val="1"/>
+      <w:numFmt w:val="bullet"/>
+      <w:lvlText w:val="o"/>
+      <w:lvlJc w:val="left"/>
+      <w:pPr>
+        <w:ind w:left="5760" w:hanging="360"/>
+      </w:pPr>
+      <w:rPr>
+        <w:rFonts w:ascii="Courier New" w:hAnsi="Courier New" w:cs="Courier New" w:hint="default"/>
+      </w:rPr>
+    </w:lvl>
+    <w:lvl w:ilvl="8" w:tplc="04090005" w:tentative="1">
+      <w:start w:val="1"/>
+      <w:numFmt w:val="bullet"/>
+      <w:lvlText w:val=""/>
+      <w:lvlJc w:val="left"/>
+      <w:pPr>
+        <w:ind w:left="6480" w:hanging="360"/>
+      </w:pPr>
+      <w:rPr>
+        <w:rFonts w:ascii="Wingdings" w:hAnsi="Wingdings" w:hint="default"/>
+      </w:rPr>
+    </w:lvl>
+  </w:abstractNum>
+  <w:abstractNum w:abstractNumId="2" w15:restartNumberingAfterBreak="0">
     <w:nsid w:val="4B54229F"/>
     <w:multiLevelType w:val="hybridMultilevel"/>
     <w:tmpl w:val="B2BEBE80"/>
@@ -8223,7 +11238,7 @@
     </w:lvl>
   </w:abstractNum>
   <w:num w:numId="1" w16cid:durableId="427585744">
-    <w:abstractNumId w:val="1"/>
+    <w:abstractNumId w:val="2"/>
   </w:num>
   <w:num w:numId="2" w16cid:durableId="1325932507">
     <w:abstractNumId w:val="0"/>
@@ -8317,6 +11332,15 @@
   </w:num>
   <w:num w:numId="32" w16cid:durableId="355691831">
     <w:abstractNumId w:val="0"/>
+  </w:num>
+  <w:num w:numId="33" w16cid:durableId="1017197461">
+    <w:abstractNumId w:val="0"/>
+  </w:num>
+  <w:num w:numId="34" w16cid:durableId="1772240409">
+    <w:abstractNumId w:val="0"/>
+  </w:num>
+  <w:num w:numId="35" w16cid:durableId="1390111797">
+    <w:abstractNumId w:val="1"/>
   </w:num>
 </w:numbering>
 </file>
@@ -8974,7 +11998,6 @@
   <w:style w:type="character" w:default="1" w:styleId="DefaultParagraphFont">
     <w:name w:val="Default Paragraph Font"/>
     <w:uiPriority w:val="1"/>
-    <w:semiHidden/>
     <w:unhideWhenUsed/>
   </w:style>
   <w:style w:type="table" w:default="1" w:styleId="TableNormal">

</xml_diff>

<commit_message>
FAT research. FAT imaging tool continuation
</commit_message>
<xml_diff>
--- a/docs/TusMuertos-v2.0-Design.docx
+++ b/docs/TusMuertos-v2.0-Design.docx
@@ -758,7 +758,7 @@
           <w:pPr>
             <w:pStyle w:val="TOC1"/>
             <w:tabs>
-              <w:tab w:val="left" w:pos="480"/>
+              <w:tab w:val="left" w:pos="400"/>
               <w:tab w:val="right" w:leader="dot" w:pos="9350"/>
             </w:tabs>
             <w:rPr>
@@ -778,7 +778,7 @@
           <w:r>
             <w:fldChar w:fldCharType="separate"/>
           </w:r>
-          <w:hyperlink w:anchor="_Toc212933567" w:history="1">
+          <w:hyperlink w:anchor="_Toc213004598" w:history="1">
             <w:r>
               <w:rPr>
                 <w:rStyle w:val="Hyperlink"/>
@@ -822,7 +822,7 @@
                 <w:noProof/>
                 <w:webHidden/>
               </w:rPr>
-              <w:instrText xml:space="preserve"> PAGEREF _Toc212933567 \h </w:instrText>
+              <w:instrText xml:space="preserve"> PAGEREF _Toc213004598 \h </w:instrText>
             </w:r>
             <w:r>
               <w:rPr>
@@ -857,7 +857,7 @@
           <w:pPr>
             <w:pStyle w:val="TOC1"/>
             <w:tabs>
-              <w:tab w:val="left" w:pos="480"/>
+              <w:tab w:val="left" w:pos="400"/>
               <w:tab w:val="right" w:leader="dot" w:pos="9350"/>
             </w:tabs>
             <w:rPr>
@@ -868,7 +868,7 @@
               <w14:ligatures w14:val="standardContextual"/>
             </w:rPr>
           </w:pPr>
-          <w:hyperlink w:anchor="_Toc212933568" w:history="1">
+          <w:hyperlink w:anchor="_Toc213004599" w:history="1">
             <w:r>
               <w:rPr>
                 <w:rStyle w:val="Hyperlink"/>
@@ -912,7 +912,7 @@
                 <w:noProof/>
                 <w:webHidden/>
               </w:rPr>
-              <w:instrText xml:space="preserve"> PAGEREF _Toc212933568 \h </w:instrText>
+              <w:instrText xml:space="preserve"> PAGEREF _Toc213004599 \h </w:instrText>
             </w:r>
             <w:r>
               <w:rPr>
@@ -947,7 +947,7 @@
           <w:pPr>
             <w:pStyle w:val="TOC1"/>
             <w:tabs>
-              <w:tab w:val="left" w:pos="480"/>
+              <w:tab w:val="left" w:pos="400"/>
               <w:tab w:val="right" w:leader="dot" w:pos="9350"/>
             </w:tabs>
             <w:rPr>
@@ -958,7 +958,7 @@
               <w14:ligatures w14:val="standardContextual"/>
             </w:rPr>
           </w:pPr>
-          <w:hyperlink w:anchor="_Toc212933569" w:history="1">
+          <w:hyperlink w:anchor="_Toc213004600" w:history="1">
             <w:r>
               <w:rPr>
                 <w:rStyle w:val="Hyperlink"/>
@@ -981,7 +981,7 @@
                 <w:rStyle w:val="Hyperlink"/>
                 <w:noProof/>
               </w:rPr>
-              <w:t>Misc and notes</w:t>
+              <w:t>Helpers and auxiliary tools</w:t>
             </w:r>
             <w:r>
               <w:rPr>
@@ -1002,7 +1002,7 @@
                 <w:noProof/>
                 <w:webHidden/>
               </w:rPr>
-              <w:instrText xml:space="preserve"> PAGEREF _Toc212933569 \h </w:instrText>
+              <w:instrText xml:space="preserve"> PAGEREF _Toc213004600 \h </w:instrText>
             </w:r>
             <w:r>
               <w:rPr>
@@ -1048,7 +1048,7 @@
               <w14:ligatures w14:val="standardContextual"/>
             </w:rPr>
           </w:pPr>
-          <w:hyperlink w:anchor="_Toc212933570" w:history="1">
+          <w:hyperlink w:anchor="_Toc213004601" w:history="1">
             <w:r>
               <w:rPr>
                 <w:rStyle w:val="Hyperlink"/>
@@ -1071,7 +1071,7 @@
                 <w:rStyle w:val="Hyperlink"/>
                 <w:noProof/>
               </w:rPr>
-              <w:t>Random notes</w:t>
+              <w:t>FAT32 image creator</w:t>
             </w:r>
             <w:r>
               <w:rPr>
@@ -1092,7 +1092,7 @@
                 <w:noProof/>
                 <w:webHidden/>
               </w:rPr>
-              <w:instrText xml:space="preserve"> PAGEREF _Toc212933570 \h </w:instrText>
+              <w:instrText xml:space="preserve"> PAGEREF _Toc213004601 \h </w:instrText>
             </w:r>
             <w:r>
               <w:rPr>
@@ -1125,26 +1125,34 @@
         </w:p>
         <w:p>
           <w:pPr>
-            <w:pStyle w:val="TOC3"/>
+            <w:pStyle w:val="TOC1"/>
             <w:tabs>
-              <w:tab w:val="left" w:pos="1440"/>
+              <w:tab w:val="left" w:pos="400"/>
               <w:tab w:val="right" w:leader="dot" w:pos="9350"/>
             </w:tabs>
             <w:rPr>
               <w:noProof/>
+              <w:kern w:val="2"/>
+              <w:sz w:val="24"/>
+              <w:szCs w:val="24"/>
+              <w14:ligatures w14:val="standardContextual"/>
             </w:rPr>
           </w:pPr>
-          <w:hyperlink w:anchor="_Toc212933571" w:history="1">
+          <w:hyperlink w:anchor="_Toc213004602" w:history="1">
             <w:r>
               <w:rPr>
                 <w:rStyle w:val="Hyperlink"/>
                 <w:noProof/>
               </w:rPr>
-              <w:t>4.1.1</w:t>
-            </w:r>
-            <w:r>
-              <w:rPr>
-                <w:noProof/>
+              <w:t>5</w:t>
+            </w:r>
+            <w:r>
+              <w:rPr>
+                <w:noProof/>
+                <w:kern w:val="2"/>
+                <w:sz w:val="24"/>
+                <w:szCs w:val="24"/>
+                <w14:ligatures w14:val="standardContextual"/>
               </w:rPr>
               <w:tab/>
             </w:r>
@@ -1153,7 +1161,7 @@
                 <w:rStyle w:val="Hyperlink"/>
                 <w:noProof/>
               </w:rPr>
-              <w:t>BOCHS</w:t>
+              <w:t>Misc and notes</w:t>
             </w:r>
             <w:r>
               <w:rPr>
@@ -1174,7 +1182,7 @@
                 <w:noProof/>
                 <w:webHidden/>
               </w:rPr>
-              <w:instrText xml:space="preserve"> PAGEREF _Toc212933571 \h </w:instrText>
+              <w:instrText xml:space="preserve"> PAGEREF _Toc213004602 \h </w:instrText>
             </w:r>
             <w:r>
               <w:rPr>
@@ -1194,89 +1202,7 @@
                 <w:noProof/>
                 <w:webHidden/>
               </w:rPr>
-              <w:t>3</w:t>
-            </w:r>
-            <w:r>
-              <w:rPr>
-                <w:noProof/>
-                <w:webHidden/>
-              </w:rPr>
-              <w:fldChar w:fldCharType="end"/>
-            </w:r>
-          </w:hyperlink>
-        </w:p>
-        <w:p>
-          <w:pPr>
-            <w:pStyle w:val="TOC3"/>
-            <w:tabs>
-              <w:tab w:val="left" w:pos="1440"/>
-              <w:tab w:val="right" w:leader="dot" w:pos="9350"/>
-            </w:tabs>
-            <w:rPr>
-              <w:noProof/>
-            </w:rPr>
-          </w:pPr>
-          <w:hyperlink w:anchor="_Toc212933572" w:history="1">
-            <w:r>
-              <w:rPr>
-                <w:rStyle w:val="Hyperlink"/>
-                <w:noProof/>
-              </w:rPr>
-              <w:t>4.1.2</w:t>
-            </w:r>
-            <w:r>
-              <w:rPr>
-                <w:noProof/>
-              </w:rPr>
-              <w:tab/>
-            </w:r>
-            <w:r>
-              <w:rPr>
-                <w:rStyle w:val="Hyperlink"/>
-                <w:noProof/>
-              </w:rPr>
-              <w:t>STORAGE</w:t>
-            </w:r>
-            <w:r>
-              <w:rPr>
-                <w:noProof/>
-                <w:webHidden/>
-              </w:rPr>
-              <w:tab/>
-            </w:r>
-            <w:r>
-              <w:rPr>
-                <w:noProof/>
-                <w:webHidden/>
-              </w:rPr>
-              <w:fldChar w:fldCharType="begin"/>
-            </w:r>
-            <w:r>
-              <w:rPr>
-                <w:noProof/>
-                <w:webHidden/>
-              </w:rPr>
-              <w:instrText xml:space="preserve"> PAGEREF _Toc212933572 \h </w:instrText>
-            </w:r>
-            <w:r>
-              <w:rPr>
-                <w:noProof/>
-                <w:webHidden/>
-              </w:rPr>
-            </w:r>
-            <w:r>
-              <w:rPr>
-                <w:noProof/>
-                <w:webHidden/>
-              </w:rPr>
-              <w:fldChar w:fldCharType="separate"/>
-            </w:r>
-            <w:r>
-              <w:rPr>
-                <w:noProof/>
-                <w:webHidden/>
-              </w:rPr>
-              <w:t>5</w:t>
+              <w:t>4</w:t>
             </w:r>
             <w:r>
               <w:rPr>
@@ -1302,13 +1228,13 @@
               <w14:ligatures w14:val="standardContextual"/>
             </w:rPr>
           </w:pPr>
-          <w:hyperlink w:anchor="_Toc212933573" w:history="1">
+          <w:hyperlink w:anchor="_Toc213004603" w:history="1">
             <w:r>
               <w:rPr>
                 <w:rStyle w:val="Hyperlink"/>
                 <w:noProof/>
               </w:rPr>
-              <w:t>4.2</w:t>
+              <w:t>5.1</w:t>
             </w:r>
             <w:r>
               <w:rPr>
@@ -1325,7 +1251,7 @@
                 <w:rStyle w:val="Hyperlink"/>
                 <w:noProof/>
               </w:rPr>
-              <w:t>WSL stuff</w:t>
+              <w:t>Random notes</w:t>
             </w:r>
             <w:r>
               <w:rPr>
@@ -1346,7 +1272,7 @@
                 <w:noProof/>
                 <w:webHidden/>
               </w:rPr>
-              <w:instrText xml:space="preserve"> PAGEREF _Toc212933573 \h </w:instrText>
+              <w:instrText xml:space="preserve"> PAGEREF _Toc213004603 \h </w:instrText>
             </w:r>
             <w:r>
               <w:rPr>
@@ -1366,7 +1292,187 @@
                 <w:noProof/>
                 <w:webHidden/>
               </w:rPr>
-              <w:t>8</w:t>
+              <w:t>4</w:t>
+            </w:r>
+            <w:r>
+              <w:rPr>
+                <w:noProof/>
+                <w:webHidden/>
+              </w:rPr>
+              <w:fldChar w:fldCharType="end"/>
+            </w:r>
+          </w:hyperlink>
+        </w:p>
+        <w:p>
+          <w:pPr>
+            <w:pStyle w:val="TOC3"/>
+            <w:tabs>
+              <w:tab w:val="left" w:pos="1200"/>
+              <w:tab w:val="right" w:leader="dot" w:pos="9350"/>
+            </w:tabs>
+            <w:rPr>
+              <w:noProof/>
+              <w:kern w:val="2"/>
+              <w:sz w:val="24"/>
+              <w:szCs w:val="24"/>
+              <w14:ligatures w14:val="standardContextual"/>
+            </w:rPr>
+          </w:pPr>
+          <w:hyperlink w:anchor="_Toc213004604" w:history="1">
+            <w:r>
+              <w:rPr>
+                <w:rStyle w:val="Hyperlink"/>
+                <w:noProof/>
+              </w:rPr>
+              <w:t>5.1.1</w:t>
+            </w:r>
+            <w:r>
+              <w:rPr>
+                <w:noProof/>
+                <w:kern w:val="2"/>
+                <w:sz w:val="24"/>
+                <w:szCs w:val="24"/>
+                <w14:ligatures w14:val="standardContextual"/>
+              </w:rPr>
+              <w:tab/>
+            </w:r>
+            <w:r>
+              <w:rPr>
+                <w:rStyle w:val="Hyperlink"/>
+                <w:noProof/>
+              </w:rPr>
+              <w:t>BOCHS</w:t>
+            </w:r>
+            <w:r>
+              <w:rPr>
+                <w:noProof/>
+                <w:webHidden/>
+              </w:rPr>
+              <w:tab/>
+            </w:r>
+            <w:r>
+              <w:rPr>
+                <w:noProof/>
+                <w:webHidden/>
+              </w:rPr>
+              <w:fldChar w:fldCharType="begin"/>
+            </w:r>
+            <w:r>
+              <w:rPr>
+                <w:noProof/>
+                <w:webHidden/>
+              </w:rPr>
+              <w:instrText xml:space="preserve"> PAGEREF _Toc213004604 \h </w:instrText>
+            </w:r>
+            <w:r>
+              <w:rPr>
+                <w:noProof/>
+                <w:webHidden/>
+              </w:rPr>
+            </w:r>
+            <w:r>
+              <w:rPr>
+                <w:noProof/>
+                <w:webHidden/>
+              </w:rPr>
+              <w:fldChar w:fldCharType="separate"/>
+            </w:r>
+            <w:r>
+              <w:rPr>
+                <w:noProof/>
+                <w:webHidden/>
+              </w:rPr>
+              <w:t>4</w:t>
+            </w:r>
+            <w:r>
+              <w:rPr>
+                <w:noProof/>
+                <w:webHidden/>
+              </w:rPr>
+              <w:fldChar w:fldCharType="end"/>
+            </w:r>
+          </w:hyperlink>
+        </w:p>
+        <w:p>
+          <w:pPr>
+            <w:pStyle w:val="TOC3"/>
+            <w:tabs>
+              <w:tab w:val="left" w:pos="1200"/>
+              <w:tab w:val="right" w:leader="dot" w:pos="9350"/>
+            </w:tabs>
+            <w:rPr>
+              <w:noProof/>
+              <w:kern w:val="2"/>
+              <w:sz w:val="24"/>
+              <w:szCs w:val="24"/>
+              <w14:ligatures w14:val="standardContextual"/>
+            </w:rPr>
+          </w:pPr>
+          <w:hyperlink w:anchor="_Toc213004605" w:history="1">
+            <w:r>
+              <w:rPr>
+                <w:rStyle w:val="Hyperlink"/>
+                <w:noProof/>
+              </w:rPr>
+              <w:t>5.1.2</w:t>
+            </w:r>
+            <w:r>
+              <w:rPr>
+                <w:noProof/>
+                <w:kern w:val="2"/>
+                <w:sz w:val="24"/>
+                <w:szCs w:val="24"/>
+                <w14:ligatures w14:val="standardContextual"/>
+              </w:rPr>
+              <w:tab/>
+            </w:r>
+            <w:r>
+              <w:rPr>
+                <w:rStyle w:val="Hyperlink"/>
+                <w:noProof/>
+              </w:rPr>
+              <w:t>STORAGE</w:t>
+            </w:r>
+            <w:r>
+              <w:rPr>
+                <w:noProof/>
+                <w:webHidden/>
+              </w:rPr>
+              <w:tab/>
+            </w:r>
+            <w:r>
+              <w:rPr>
+                <w:noProof/>
+                <w:webHidden/>
+              </w:rPr>
+              <w:fldChar w:fldCharType="begin"/>
+            </w:r>
+            <w:r>
+              <w:rPr>
+                <w:noProof/>
+                <w:webHidden/>
+              </w:rPr>
+              <w:instrText xml:space="preserve"> PAGEREF _Toc213004605 \h </w:instrText>
+            </w:r>
+            <w:r>
+              <w:rPr>
+                <w:noProof/>
+                <w:webHidden/>
+              </w:rPr>
+            </w:r>
+            <w:r>
+              <w:rPr>
+                <w:noProof/>
+                <w:webHidden/>
+              </w:rPr>
+              <w:fldChar w:fldCharType="separate"/>
+            </w:r>
+            <w:r>
+              <w:rPr>
+                <w:noProof/>
+                <w:webHidden/>
+              </w:rPr>
+              <w:t>6</w:t>
             </w:r>
             <w:r>
               <w:rPr>
@@ -1392,13 +1498,13 @@
               <w14:ligatures w14:val="standardContextual"/>
             </w:rPr>
           </w:pPr>
-          <w:hyperlink w:anchor="_Toc212933574" w:history="1">
+          <w:hyperlink w:anchor="_Toc213004606" w:history="1">
             <w:r>
               <w:rPr>
                 <w:rStyle w:val="Hyperlink"/>
                 <w:noProof/>
               </w:rPr>
-              <w:t>4.3</w:t>
+              <w:t>5.2</w:t>
             </w:r>
             <w:r>
               <w:rPr>
@@ -1415,7 +1521,7 @@
                 <w:rStyle w:val="Hyperlink"/>
                 <w:noProof/>
               </w:rPr>
-              <w:t>Setup build</w:t>
+              <w:t>WSL stuff</w:t>
             </w:r>
             <w:r>
               <w:rPr>
@@ -1436,7 +1542,7 @@
                 <w:noProof/>
                 <w:webHidden/>
               </w:rPr>
-              <w:instrText xml:space="preserve"> PAGEREF _Toc212933574 \h </w:instrText>
+              <w:instrText xml:space="preserve"> PAGEREF _Toc213004606 \h </w:instrText>
             </w:r>
             <w:r>
               <w:rPr>
@@ -1482,13 +1588,13 @@
               <w14:ligatures w14:val="standardContextual"/>
             </w:rPr>
           </w:pPr>
-          <w:hyperlink w:anchor="_Toc212933575" w:history="1">
+          <w:hyperlink w:anchor="_Toc213004607" w:history="1">
             <w:r>
               <w:rPr>
                 <w:rStyle w:val="Hyperlink"/>
                 <w:noProof/>
               </w:rPr>
-              <w:t>4.4</w:t>
+              <w:t>5.3</w:t>
             </w:r>
             <w:r>
               <w:rPr>
@@ -1505,7 +1611,7 @@
                 <w:rStyle w:val="Hyperlink"/>
                 <w:noProof/>
               </w:rPr>
-              <w:t>BUILD PROCESS BEFORE MAKE</w:t>
+              <w:t>Setup build</w:t>
             </w:r>
             <w:r>
               <w:rPr>
@@ -1526,7 +1632,7 @@
                 <w:noProof/>
                 <w:webHidden/>
               </w:rPr>
-              <w:instrText xml:space="preserve"> PAGEREF _Toc212933575 \h </w:instrText>
+              <w:instrText xml:space="preserve"> PAGEREF _Toc213004607 \h </w:instrText>
             </w:r>
             <w:r>
               <w:rPr>
@@ -1546,7 +1652,7 @@
                 <w:noProof/>
                 <w:webHidden/>
               </w:rPr>
-              <w:t>9</w:t>
+              <w:t>10</w:t>
             </w:r>
             <w:r>
               <w:rPr>
@@ -1572,13 +1678,13 @@
               <w14:ligatures w14:val="standardContextual"/>
             </w:rPr>
           </w:pPr>
-          <w:hyperlink w:anchor="_Toc212933576" w:history="1">
+          <w:hyperlink w:anchor="_Toc213004608" w:history="1">
             <w:r>
               <w:rPr>
                 <w:rStyle w:val="Hyperlink"/>
                 <w:noProof/>
               </w:rPr>
-              <w:t>4.5</w:t>
+              <w:t>5.4</w:t>
             </w:r>
             <w:r>
               <w:rPr>
@@ -1595,7 +1701,7 @@
                 <w:rStyle w:val="Hyperlink"/>
                 <w:noProof/>
               </w:rPr>
-              <w:t>BUILD PROCESS AFTER MAKE</w:t>
+              <w:t>BUILD PROCESS BEFORE MAKE</w:t>
             </w:r>
             <w:r>
               <w:rPr>
@@ -1616,7 +1722,7 @@
                 <w:noProof/>
                 <w:webHidden/>
               </w:rPr>
-              <w:instrText xml:space="preserve"> PAGEREF _Toc212933576 \h </w:instrText>
+              <w:instrText xml:space="preserve"> PAGEREF _Toc213004608 \h </w:instrText>
             </w:r>
             <w:r>
               <w:rPr>
@@ -1636,7 +1742,7 @@
                 <w:noProof/>
                 <w:webHidden/>
               </w:rPr>
-              <w:t>10</w:t>
+              <w:t>12</w:t>
             </w:r>
             <w:r>
               <w:rPr>
@@ -1662,13 +1768,13 @@
               <w14:ligatures w14:val="standardContextual"/>
             </w:rPr>
           </w:pPr>
-          <w:hyperlink w:anchor="_Toc212933577" w:history="1">
+          <w:hyperlink w:anchor="_Toc213004609" w:history="1">
             <w:r>
               <w:rPr>
                 <w:rStyle w:val="Hyperlink"/>
                 <w:noProof/>
               </w:rPr>
-              <w:t>4.6</w:t>
+              <w:t>5.5</w:t>
             </w:r>
             <w:r>
               <w:rPr>
@@ -1685,6 +1791,96 @@
                 <w:rStyle w:val="Hyperlink"/>
                 <w:noProof/>
               </w:rPr>
+              <w:t>BUILD PROCESS AFTER MAKE</w:t>
+            </w:r>
+            <w:r>
+              <w:rPr>
+                <w:noProof/>
+                <w:webHidden/>
+              </w:rPr>
+              <w:tab/>
+            </w:r>
+            <w:r>
+              <w:rPr>
+                <w:noProof/>
+                <w:webHidden/>
+              </w:rPr>
+              <w:fldChar w:fldCharType="begin"/>
+            </w:r>
+            <w:r>
+              <w:rPr>
+                <w:noProof/>
+                <w:webHidden/>
+              </w:rPr>
+              <w:instrText xml:space="preserve"> PAGEREF _Toc213004609 \h </w:instrText>
+            </w:r>
+            <w:r>
+              <w:rPr>
+                <w:noProof/>
+                <w:webHidden/>
+              </w:rPr>
+            </w:r>
+            <w:r>
+              <w:rPr>
+                <w:noProof/>
+                <w:webHidden/>
+              </w:rPr>
+              <w:fldChar w:fldCharType="separate"/>
+            </w:r>
+            <w:r>
+              <w:rPr>
+                <w:noProof/>
+                <w:webHidden/>
+              </w:rPr>
+              <w:t>12</w:t>
+            </w:r>
+            <w:r>
+              <w:rPr>
+                <w:noProof/>
+                <w:webHidden/>
+              </w:rPr>
+              <w:fldChar w:fldCharType="end"/>
+            </w:r>
+          </w:hyperlink>
+        </w:p>
+        <w:p>
+          <w:pPr>
+            <w:pStyle w:val="TOC2"/>
+            <w:tabs>
+              <w:tab w:val="left" w:pos="720"/>
+              <w:tab w:val="right" w:leader="dot" w:pos="9350"/>
+            </w:tabs>
+            <w:rPr>
+              <w:noProof/>
+              <w:kern w:val="2"/>
+              <w:sz w:val="24"/>
+              <w:szCs w:val="24"/>
+              <w14:ligatures w14:val="standardContextual"/>
+            </w:rPr>
+          </w:pPr>
+          <w:hyperlink w:anchor="_Toc213004610" w:history="1">
+            <w:r>
+              <w:rPr>
+                <w:rStyle w:val="Hyperlink"/>
+                <w:noProof/>
+              </w:rPr>
+              <w:t>5.6</w:t>
+            </w:r>
+            <w:r>
+              <w:rPr>
+                <w:noProof/>
+                <w:kern w:val="2"/>
+                <w:sz w:val="24"/>
+                <w:szCs w:val="24"/>
+                <w14:ligatures w14:val="standardContextual"/>
+              </w:rPr>
+              <w:tab/>
+            </w:r>
+            <w:r>
+              <w:rPr>
+                <w:rStyle w:val="Hyperlink"/>
+                <w:noProof/>
+              </w:rPr>
               <w:t>CPU registers</w:t>
             </w:r>
             <w:r>
@@ -1706,7 +1902,7 @@
                 <w:noProof/>
                 <w:webHidden/>
               </w:rPr>
-              <w:instrText xml:space="preserve"> PAGEREF _Toc212933577 \h </w:instrText>
+              <w:instrText xml:space="preserve"> PAGEREF _Toc213004610 \h </w:instrText>
             </w:r>
             <w:r>
               <w:rPr>
@@ -1726,7 +1922,7 @@
                 <w:noProof/>
                 <w:webHidden/>
               </w:rPr>
-              <w:t>10</w:t>
+              <w:t>12</w:t>
             </w:r>
             <w:r>
               <w:rPr>
@@ -1752,13 +1948,13 @@
               <w14:ligatures w14:val="standardContextual"/>
             </w:rPr>
           </w:pPr>
-          <w:hyperlink w:anchor="_Toc212933578" w:history="1">
+          <w:hyperlink w:anchor="_Toc213004611" w:history="1">
             <w:r>
               <w:rPr>
                 <w:rStyle w:val="Hyperlink"/>
                 <w:noProof/>
               </w:rPr>
-              <w:t>5</w:t>
+              <w:t>6</w:t>
             </w:r>
             <w:r>
               <w:rPr>
@@ -1796,7 +1992,7 @@
                 <w:noProof/>
                 <w:webHidden/>
               </w:rPr>
-              <w:instrText xml:space="preserve"> PAGEREF _Toc212933578 \h </w:instrText>
+              <w:instrText xml:space="preserve"> PAGEREF _Toc213004611 \h </w:instrText>
             </w:r>
             <w:r>
               <w:rPr>
@@ -1816,7 +2012,7 @@
                 <w:noProof/>
                 <w:webHidden/>
               </w:rPr>
-              <w:t>11</w:t>
+              <w:t>14</w:t>
             </w:r>
             <w:r>
               <w:rPr>
@@ -1842,13 +2038,13 @@
               <w14:ligatures w14:val="standardContextual"/>
             </w:rPr>
           </w:pPr>
-          <w:hyperlink w:anchor="_Toc212933579" w:history="1">
+          <w:hyperlink w:anchor="_Toc213004612" w:history="1">
             <w:r>
               <w:rPr>
                 <w:rStyle w:val="Hyperlink"/>
                 <w:noProof/>
               </w:rPr>
-              <w:t>5.1</w:t>
+              <w:t>6.1</w:t>
             </w:r>
             <w:r>
               <w:rPr>
@@ -1886,7 +2082,7 @@
                 <w:noProof/>
                 <w:webHidden/>
               </w:rPr>
-              <w:instrText xml:space="preserve"> PAGEREF _Toc212933579 \h </w:instrText>
+              <w:instrText xml:space="preserve"> PAGEREF _Toc213004612 \h </w:instrText>
             </w:r>
             <w:r>
               <w:rPr>
@@ -1906,7 +2102,7 @@
                 <w:noProof/>
                 <w:webHidden/>
               </w:rPr>
-              <w:t>11</w:t>
+              <w:t>14</w:t>
             </w:r>
             <w:r>
               <w:rPr>
@@ -1932,13 +2128,13 @@
               <w14:ligatures w14:val="standardContextual"/>
             </w:rPr>
           </w:pPr>
-          <w:hyperlink w:anchor="_Toc212933580" w:history="1">
+          <w:hyperlink w:anchor="_Toc213004613" w:history="1">
             <w:r>
               <w:rPr>
                 <w:rStyle w:val="Hyperlink"/>
                 <w:noProof/>
               </w:rPr>
-              <w:t>5.2</w:t>
+              <w:t>6.2</w:t>
             </w:r>
             <w:r>
               <w:rPr>
@@ -1976,7 +2172,7 @@
                 <w:noProof/>
                 <w:webHidden/>
               </w:rPr>
-              <w:instrText xml:space="preserve"> PAGEREF _Toc212933580 \h </w:instrText>
+              <w:instrText xml:space="preserve"> PAGEREF _Toc213004613 \h </w:instrText>
             </w:r>
             <w:r>
               <w:rPr>
@@ -1996,7 +2192,7 @@
                 <w:noProof/>
                 <w:webHidden/>
               </w:rPr>
-              <w:t>12</w:t>
+              <w:t>14</w:t>
             </w:r>
             <w:r>
               <w:rPr>
@@ -2022,13 +2218,13 @@
               <w14:ligatures w14:val="standardContextual"/>
             </w:rPr>
           </w:pPr>
-          <w:hyperlink w:anchor="_Toc212933581" w:history="1">
+          <w:hyperlink w:anchor="_Toc213004614" w:history="1">
             <w:r>
               <w:rPr>
                 <w:rStyle w:val="Hyperlink"/>
                 <w:noProof/>
               </w:rPr>
-              <w:t>6</w:t>
+              <w:t>7</w:t>
             </w:r>
             <w:r>
               <w:rPr>
@@ -2066,7 +2262,7 @@
                 <w:noProof/>
                 <w:webHidden/>
               </w:rPr>
-              <w:instrText xml:space="preserve"> PAGEREF _Toc212933581 \h </w:instrText>
+              <w:instrText xml:space="preserve"> PAGEREF _Toc213004614 \h </w:instrText>
             </w:r>
             <w:r>
               <w:rPr>
@@ -2086,7 +2282,7 @@
                 <w:noProof/>
                 <w:webHidden/>
               </w:rPr>
-              <w:t>13</w:t>
+              <w:t>15</w:t>
             </w:r>
             <w:r>
               <w:rPr>
@@ -2112,13 +2308,13 @@
               <w14:ligatures w14:val="standardContextual"/>
             </w:rPr>
           </w:pPr>
-          <w:hyperlink w:anchor="_Toc212933582" w:history="1">
+          <w:hyperlink w:anchor="_Toc213004615" w:history="1">
             <w:r>
               <w:rPr>
                 <w:rStyle w:val="Hyperlink"/>
                 <w:noProof/>
               </w:rPr>
-              <w:t>6.1</w:t>
+              <w:t>7.1</w:t>
             </w:r>
             <w:r>
               <w:rPr>
@@ -2156,7 +2352,7 @@
                 <w:noProof/>
                 <w:webHidden/>
               </w:rPr>
-              <w:instrText xml:space="preserve"> PAGEREF _Toc212933582 \h </w:instrText>
+              <w:instrText xml:space="preserve"> PAGEREF _Toc213004615 \h </w:instrText>
             </w:r>
             <w:r>
               <w:rPr>
@@ -2176,7 +2372,7 @@
                 <w:noProof/>
                 <w:webHidden/>
               </w:rPr>
-              <w:t>13</w:t>
+              <w:t>15</w:t>
             </w:r>
             <w:r>
               <w:rPr>
@@ -2202,13 +2398,13 @@
               <w14:ligatures w14:val="standardContextual"/>
             </w:rPr>
           </w:pPr>
-          <w:hyperlink w:anchor="_Toc212933583" w:history="1">
+          <w:hyperlink w:anchor="_Toc213004616" w:history="1">
             <w:r>
               <w:rPr>
                 <w:rStyle w:val="Hyperlink"/>
                 <w:noProof/>
               </w:rPr>
-              <w:t>6.2</w:t>
+              <w:t>7.2</w:t>
             </w:r>
             <w:r>
               <w:rPr>
@@ -2246,7 +2442,7 @@
                 <w:noProof/>
                 <w:webHidden/>
               </w:rPr>
-              <w:instrText xml:space="preserve"> PAGEREF _Toc212933583 \h </w:instrText>
+              <w:instrText xml:space="preserve"> PAGEREF _Toc213004616 \h </w:instrText>
             </w:r>
             <w:r>
               <w:rPr>
@@ -2266,7 +2462,7 @@
                 <w:noProof/>
                 <w:webHidden/>
               </w:rPr>
-              <w:t>13</w:t>
+              <w:t>15</w:t>
             </w:r>
             <w:r>
               <w:rPr>
@@ -2292,13 +2488,13 @@
               <w14:ligatures w14:val="standardContextual"/>
             </w:rPr>
           </w:pPr>
-          <w:hyperlink w:anchor="_Toc212933584" w:history="1">
+          <w:hyperlink w:anchor="_Toc213004617" w:history="1">
             <w:r>
               <w:rPr>
                 <w:rStyle w:val="Hyperlink"/>
                 <w:noProof/>
               </w:rPr>
-              <w:t>6.3</w:t>
+              <w:t>7.3</w:t>
             </w:r>
             <w:r>
               <w:rPr>
@@ -2336,7 +2532,7 @@
                 <w:noProof/>
                 <w:webHidden/>
               </w:rPr>
-              <w:instrText xml:space="preserve"> PAGEREF _Toc212933584 \h </w:instrText>
+              <w:instrText xml:space="preserve"> PAGEREF _Toc213004617 \h </w:instrText>
             </w:r>
             <w:r>
               <w:rPr>
@@ -2356,7 +2552,7 @@
                 <w:noProof/>
                 <w:webHidden/>
               </w:rPr>
-              <w:t>13</w:t>
+              <w:t>16</w:t>
             </w:r>
             <w:r>
               <w:rPr>
@@ -2382,13 +2578,13 @@
               <w14:ligatures w14:val="standardContextual"/>
             </w:rPr>
           </w:pPr>
-          <w:hyperlink w:anchor="_Toc212933585" w:history="1">
+          <w:hyperlink w:anchor="_Toc213004618" w:history="1">
             <w:r>
               <w:rPr>
                 <w:rStyle w:val="Hyperlink"/>
                 <w:noProof/>
               </w:rPr>
-              <w:t>6.4</w:t>
+              <w:t>7.4</w:t>
             </w:r>
             <w:r>
               <w:rPr>
@@ -2426,7 +2622,7 @@
                 <w:noProof/>
                 <w:webHidden/>
               </w:rPr>
-              <w:instrText xml:space="preserve"> PAGEREF _Toc212933585 \h </w:instrText>
+              <w:instrText xml:space="preserve"> PAGEREF _Toc213004618 \h </w:instrText>
             </w:r>
             <w:r>
               <w:rPr>
@@ -2446,7 +2642,97 @@
                 <w:noProof/>
                 <w:webHidden/>
               </w:rPr>
-              <w:t>14</w:t>
+              <w:t>16</w:t>
+            </w:r>
+            <w:r>
+              <w:rPr>
+                <w:noProof/>
+                <w:webHidden/>
+              </w:rPr>
+              <w:fldChar w:fldCharType="end"/>
+            </w:r>
+          </w:hyperlink>
+        </w:p>
+        <w:p>
+          <w:pPr>
+            <w:pStyle w:val="TOC2"/>
+            <w:tabs>
+              <w:tab w:val="left" w:pos="720"/>
+              <w:tab w:val="right" w:leader="dot" w:pos="9350"/>
+            </w:tabs>
+            <w:rPr>
+              <w:noProof/>
+              <w:kern w:val="2"/>
+              <w:sz w:val="24"/>
+              <w:szCs w:val="24"/>
+              <w14:ligatures w14:val="standardContextual"/>
+            </w:rPr>
+          </w:pPr>
+          <w:hyperlink w:anchor="_Toc213004619" w:history="1">
+            <w:r>
+              <w:rPr>
+                <w:rStyle w:val="Hyperlink"/>
+                <w:noProof/>
+              </w:rPr>
+              <w:t>7.5</w:t>
+            </w:r>
+            <w:r>
+              <w:rPr>
+                <w:noProof/>
+                <w:kern w:val="2"/>
+                <w:sz w:val="24"/>
+                <w:szCs w:val="24"/>
+                <w14:ligatures w14:val="standardContextual"/>
+              </w:rPr>
+              <w:tab/>
+            </w:r>
+            <w:r>
+              <w:rPr>
+                <w:rStyle w:val="Hyperlink"/>
+                <w:noProof/>
+              </w:rPr>
+              <w:t>Git inconsistency between files on the same folder via Windows and WSL on VSCODE</w:t>
+            </w:r>
+            <w:r>
+              <w:rPr>
+                <w:noProof/>
+                <w:webHidden/>
+              </w:rPr>
+              <w:tab/>
+            </w:r>
+            <w:r>
+              <w:rPr>
+                <w:noProof/>
+                <w:webHidden/>
+              </w:rPr>
+              <w:fldChar w:fldCharType="begin"/>
+            </w:r>
+            <w:r>
+              <w:rPr>
+                <w:noProof/>
+                <w:webHidden/>
+              </w:rPr>
+              <w:instrText xml:space="preserve"> PAGEREF _Toc213004619 \h </w:instrText>
+            </w:r>
+            <w:r>
+              <w:rPr>
+                <w:noProof/>
+                <w:webHidden/>
+              </w:rPr>
+            </w:r>
+            <w:r>
+              <w:rPr>
+                <w:noProof/>
+                <w:webHidden/>
+              </w:rPr>
+              <w:fldChar w:fldCharType="separate"/>
+            </w:r>
+            <w:r>
+              <w:rPr>
+                <w:noProof/>
+                <w:webHidden/>
+              </w:rPr>
+              <w:t>16</w:t>
             </w:r>
             <w:r>
               <w:rPr>
@@ -2472,13 +2758,13 @@
               <w14:ligatures w14:val="standardContextual"/>
             </w:rPr>
           </w:pPr>
-          <w:hyperlink w:anchor="_Toc212933586" w:history="1">
+          <w:hyperlink w:anchor="_Toc213004620" w:history="1">
             <w:r>
               <w:rPr>
                 <w:rStyle w:val="Hyperlink"/>
                 <w:noProof/>
               </w:rPr>
-              <w:t>7</w:t>
+              <w:t>8</w:t>
             </w:r>
             <w:r>
               <w:rPr>
@@ -2516,7 +2802,7 @@
                 <w:noProof/>
                 <w:webHidden/>
               </w:rPr>
-              <w:instrText xml:space="preserve"> PAGEREF _Toc212933586 \h </w:instrText>
+              <w:instrText xml:space="preserve"> PAGEREF _Toc213004620 \h </w:instrText>
             </w:r>
             <w:r>
               <w:rPr>
@@ -2536,7 +2822,7 @@
                 <w:noProof/>
                 <w:webHidden/>
               </w:rPr>
-              <w:t>14</w:t>
+              <w:t>16</w:t>
             </w:r>
             <w:r>
               <w:rPr>
@@ -2562,13 +2848,13 @@
               <w14:ligatures w14:val="standardContextual"/>
             </w:rPr>
           </w:pPr>
-          <w:hyperlink w:anchor="_Toc212933587" w:history="1">
+          <w:hyperlink w:anchor="_Toc213004621" w:history="1">
             <w:r>
               <w:rPr>
                 <w:rStyle w:val="Hyperlink"/>
                 <w:noProof/>
               </w:rPr>
-              <w:t>8</w:t>
+              <w:t>9</w:t>
             </w:r>
             <w:r>
               <w:rPr>
@@ -2606,97 +2892,7 @@
                 <w:noProof/>
                 <w:webHidden/>
               </w:rPr>
-              <w:instrText xml:space="preserve"> PAGEREF _Toc212933587 \h </w:instrText>
-            </w:r>
-            <w:r>
-              <w:rPr>
-                <w:noProof/>
-                <w:webHidden/>
-              </w:rPr>
-            </w:r>
-            <w:r>
-              <w:rPr>
-                <w:noProof/>
-                <w:webHidden/>
-              </w:rPr>
-              <w:fldChar w:fldCharType="separate"/>
-            </w:r>
-            <w:r>
-              <w:rPr>
-                <w:noProof/>
-                <w:webHidden/>
-              </w:rPr>
-              <w:t>14</w:t>
-            </w:r>
-            <w:r>
-              <w:rPr>
-                <w:noProof/>
-                <w:webHidden/>
-              </w:rPr>
-              <w:fldChar w:fldCharType="end"/>
-            </w:r>
-          </w:hyperlink>
-        </w:p>
-        <w:p>
-          <w:pPr>
-            <w:pStyle w:val="TOC1"/>
-            <w:tabs>
-              <w:tab w:val="left" w:pos="400"/>
-              <w:tab w:val="right" w:leader="dot" w:pos="9350"/>
-            </w:tabs>
-            <w:rPr>
-              <w:noProof/>
-              <w:kern w:val="2"/>
-              <w:sz w:val="24"/>
-              <w:szCs w:val="24"/>
-              <w14:ligatures w14:val="standardContextual"/>
-            </w:rPr>
-          </w:pPr>
-          <w:hyperlink w:anchor="_Toc212933588" w:history="1">
-            <w:r>
-              <w:rPr>
-                <w:rStyle w:val="Hyperlink"/>
-                <w:noProof/>
-              </w:rPr>
-              <w:t>9</w:t>
-            </w:r>
-            <w:r>
-              <w:rPr>
-                <w:noProof/>
-                <w:kern w:val="2"/>
-                <w:sz w:val="24"/>
-                <w:szCs w:val="24"/>
-                <w14:ligatures w14:val="standardContextual"/>
-              </w:rPr>
-              <w:tab/>
-            </w:r>
-            <w:r>
-              <w:rPr>
-                <w:rStyle w:val="Hyperlink"/>
-                <w:noProof/>
-              </w:rPr>
-              <w:t>Resources</w:t>
-            </w:r>
-            <w:r>
-              <w:rPr>
-                <w:noProof/>
-                <w:webHidden/>
-              </w:rPr>
-              <w:tab/>
-            </w:r>
-            <w:r>
-              <w:rPr>
-                <w:noProof/>
-                <w:webHidden/>
-              </w:rPr>
-              <w:fldChar w:fldCharType="begin"/>
-            </w:r>
-            <w:r>
-              <w:rPr>
-                <w:noProof/>
-                <w:webHidden/>
-              </w:rPr>
-              <w:instrText xml:space="preserve"> PAGEREF _Toc212933588 \h </w:instrText>
+              <w:instrText xml:space="preserve"> PAGEREF _Toc213004621 \h </w:instrText>
             </w:r>
             <w:r>
               <w:rPr>
@@ -2742,7 +2938,7 @@
               <w14:ligatures w14:val="standardContextual"/>
             </w:rPr>
           </w:pPr>
-          <w:hyperlink w:anchor="_Toc212933589" w:history="1">
+          <w:hyperlink w:anchor="_Toc213004622" w:history="1">
             <w:r>
               <w:rPr>
                 <w:rStyle w:val="Hyperlink"/>
@@ -2765,7 +2961,7 @@
                 <w:rStyle w:val="Hyperlink"/>
                 <w:noProof/>
               </w:rPr>
-              <w:t>Clock in/out hours</w:t>
+              <w:t>Resources</w:t>
             </w:r>
             <w:r>
               <w:rPr>
@@ -2786,7 +2982,7 @@
                 <w:noProof/>
                 <w:webHidden/>
               </w:rPr>
-              <w:instrText xml:space="preserve"> PAGEREF _Toc212933589 \h </w:instrText>
+              <w:instrText xml:space="preserve"> PAGEREF _Toc213004622 \h </w:instrText>
             </w:r>
             <w:r>
               <w:rPr>
@@ -2806,7 +3002,7 @@
                 <w:noProof/>
                 <w:webHidden/>
               </w:rPr>
-              <w:t>17</w:t>
+              <w:t>20</w:t>
             </w:r>
             <w:r>
               <w:rPr>
@@ -2832,7 +3028,7 @@
               <w14:ligatures w14:val="standardContextual"/>
             </w:rPr>
           </w:pPr>
-          <w:hyperlink w:anchor="_Toc212933590" w:history="1">
+          <w:hyperlink w:anchor="_Toc213004623" w:history="1">
             <w:r>
               <w:rPr>
                 <w:rStyle w:val="Hyperlink"/>
@@ -2855,6 +3051,96 @@
                 <w:rStyle w:val="Hyperlink"/>
                 <w:noProof/>
               </w:rPr>
+              <w:t>Clock in/out hours</w:t>
+            </w:r>
+            <w:r>
+              <w:rPr>
+                <w:noProof/>
+                <w:webHidden/>
+              </w:rPr>
+              <w:tab/>
+            </w:r>
+            <w:r>
+              <w:rPr>
+                <w:noProof/>
+                <w:webHidden/>
+              </w:rPr>
+              <w:fldChar w:fldCharType="begin"/>
+            </w:r>
+            <w:r>
+              <w:rPr>
+                <w:noProof/>
+                <w:webHidden/>
+              </w:rPr>
+              <w:instrText xml:space="preserve"> PAGEREF _Toc213004623 \h </w:instrText>
+            </w:r>
+            <w:r>
+              <w:rPr>
+                <w:noProof/>
+                <w:webHidden/>
+              </w:rPr>
+            </w:r>
+            <w:r>
+              <w:rPr>
+                <w:noProof/>
+                <w:webHidden/>
+              </w:rPr>
+              <w:fldChar w:fldCharType="separate"/>
+            </w:r>
+            <w:r>
+              <w:rPr>
+                <w:noProof/>
+                <w:webHidden/>
+              </w:rPr>
+              <w:t>20</w:t>
+            </w:r>
+            <w:r>
+              <w:rPr>
+                <w:noProof/>
+                <w:webHidden/>
+              </w:rPr>
+              <w:fldChar w:fldCharType="end"/>
+            </w:r>
+          </w:hyperlink>
+        </w:p>
+        <w:p>
+          <w:pPr>
+            <w:pStyle w:val="TOC1"/>
+            <w:tabs>
+              <w:tab w:val="left" w:pos="720"/>
+              <w:tab w:val="right" w:leader="dot" w:pos="9350"/>
+            </w:tabs>
+            <w:rPr>
+              <w:noProof/>
+              <w:kern w:val="2"/>
+              <w:sz w:val="24"/>
+              <w:szCs w:val="24"/>
+              <w14:ligatures w14:val="standardContextual"/>
+            </w:rPr>
+          </w:pPr>
+          <w:hyperlink w:anchor="_Toc213004624" w:history="1">
+            <w:r>
+              <w:rPr>
+                <w:rStyle w:val="Hyperlink"/>
+                <w:noProof/>
+              </w:rPr>
+              <w:t>12</w:t>
+            </w:r>
+            <w:r>
+              <w:rPr>
+                <w:noProof/>
+                <w:kern w:val="2"/>
+                <w:sz w:val="24"/>
+                <w:szCs w:val="24"/>
+                <w14:ligatures w14:val="standardContextual"/>
+              </w:rPr>
+              <w:tab/>
+            </w:r>
+            <w:r>
+              <w:rPr>
+                <w:rStyle w:val="Hyperlink"/>
+                <w:noProof/>
+              </w:rPr>
               <w:t>Table of figures</w:t>
             </w:r>
             <w:r>
@@ -2876,7 +3162,7 @@
                 <w:noProof/>
                 <w:webHidden/>
               </w:rPr>
-              <w:instrText xml:space="preserve"> PAGEREF _Toc212933590 \h </w:instrText>
+              <w:instrText xml:space="preserve"> PAGEREF _Toc213004624 \h </w:instrText>
             </w:r>
             <w:r>
               <w:rPr>
@@ -2896,7 +3182,7 @@
                 <w:noProof/>
                 <w:webHidden/>
               </w:rPr>
-              <w:t>17</w:t>
+              <w:t>21</w:t>
             </w:r>
             <w:r>
               <w:rPr>
@@ -2931,7 +3217,7 @@
       <w:pPr>
         <w:pStyle w:val="Heading1"/>
       </w:pPr>
-      <w:bookmarkStart w:id="0" w:name="_Toc212933567"/>
+      <w:bookmarkStart w:id="0" w:name="_Toc213004598"/>
       <w:r>
         <w:t>Tusmuert</w:t>
       </w:r>
@@ -3129,8 +3415,13 @@
         <w:t>/Zig</w:t>
       </w:r>
       <w:r>
-        <w:t xml:space="preserve"> for challenge. NASM assembly for bootloader</w:t>
-      </w:r>
+        <w:t xml:space="preserve"> for challenge. NASM assembly for </w:t>
+      </w:r>
+      <w:proofErr w:type="gramStart"/>
+      <w:r>
+        <w:t>bootloader</w:t>
+      </w:r>
+      <w:proofErr w:type="gramEnd"/>
       <w:r>
         <w:t xml:space="preserve">. </w:t>
       </w:r>
@@ -3383,7 +3674,7 @@
       <w:pPr>
         <w:pStyle w:val="Heading1"/>
       </w:pPr>
-      <w:bookmarkStart w:id="1" w:name="_Toc212933568"/>
+      <w:bookmarkStart w:id="1" w:name="_Toc213004599"/>
       <w:r>
         <w:t>Bootloader</w:t>
       </w:r>
@@ -3447,7 +3738,15 @@
         </w:numPr>
       </w:pPr>
       <w:r>
-        <w:t>2 Stages. Minimal first stage until Protected mode + Second stage to Long mode</w:t>
+        <w:t xml:space="preserve">2 Stages. Minimal first stage until Protected mode + Second stage to </w:t>
+      </w:r>
+      <w:proofErr w:type="gramStart"/>
+      <w:r>
+        <w:t>Long</w:t>
+      </w:r>
+      <w:proofErr w:type="gramEnd"/>
+      <w:r>
+        <w:t xml:space="preserve"> mode</w:t>
       </w:r>
     </w:p>
     <w:p>
@@ -3600,6 +3899,7 @@
           <w:numId w:val="1"/>
         </w:numPr>
       </w:pPr>
+      <w:proofErr w:type="gramStart"/>
       <w:r>
         <w:lastRenderedPageBreak/>
         <w:t>Print early status</w:t>
@@ -3613,6 +3913,7 @@
         </w:rPr>
         <w:t>✅</w:t>
       </w:r>
+      <w:proofErr w:type="gramEnd"/>
     </w:p>
     <w:p>
       <w:pPr>
@@ -3708,7 +4009,15 @@
         </w:numPr>
       </w:pPr>
       <w:r>
-        <w:t>Jump to Protected mode if Stage1 did not change mode.</w:t>
+        <w:t xml:space="preserve">Jump to Protected mode if Stage1 </w:t>
+      </w:r>
+      <w:proofErr w:type="gramStart"/>
+      <w:r>
+        <w:t>did</w:t>
+      </w:r>
+      <w:proofErr w:type="gramEnd"/>
+      <w:r>
+        <w:t xml:space="preserve"> not change mode.</w:t>
       </w:r>
     </w:p>
     <w:p>
@@ -3720,7 +4029,23 @@
         </w:numPr>
       </w:pPr>
       <w:r>
-        <w:t>Enable A20, or at least check. There are multiple strategies for this. Some platforms have fast enable 0x92, or they come with A20 already enable. XXXX</w:t>
+        <w:t xml:space="preserve">Enable </w:t>
+      </w:r>
+      <w:proofErr w:type="gramStart"/>
+      <w:r>
+        <w:t>A20, or</w:t>
+      </w:r>
+      <w:proofErr w:type="gramEnd"/>
+      <w:r>
+        <w:t xml:space="preserve"> at least check. There are multiple strategies for this. Some platforms have fast </w:t>
+      </w:r>
+      <w:proofErr w:type="gramStart"/>
+      <w:r>
+        <w:t>enable</w:t>
+      </w:r>
+      <w:proofErr w:type="gramEnd"/>
+      <w:r>
+        <w:t xml:space="preserve"> 0x92, or they come with A20 already enable. XXXX</w:t>
       </w:r>
     </w:p>
     <w:p>
@@ -3776,7 +4101,15 @@
         </w:numPr>
       </w:pPr>
       <w:r>
-        <w:t>Flat binary: Explore this option, maybe is simpler</w:t>
+        <w:t xml:space="preserve">Flat binary: Explore this option, </w:t>
+      </w:r>
+      <w:proofErr w:type="gramStart"/>
+      <w:r>
+        <w:t>maybe</w:t>
+      </w:r>
+      <w:proofErr w:type="gramEnd"/>
+      <w:r>
+        <w:t xml:space="preserve"> is simpler</w:t>
       </w:r>
     </w:p>
     <w:p>
@@ -3832,7 +4165,15 @@
         </w:numPr>
       </w:pPr>
       <w:r>
-        <w:t>Verify if long mode if possible, for completeness</w:t>
+        <w:t xml:space="preserve">Verify if long </w:t>
+      </w:r>
+      <w:proofErr w:type="gramStart"/>
+      <w:r>
+        <w:t>mode</w:t>
+      </w:r>
+      <w:proofErr w:type="gramEnd"/>
+      <w:r>
+        <w:t xml:space="preserve"> if possible, for completeness</w:t>
       </w:r>
     </w:p>
     <w:p>
@@ -3934,18 +4275,22 @@
       <w:pPr>
         <w:pStyle w:val="Heading1"/>
       </w:pPr>
+      <w:bookmarkStart w:id="2" w:name="_Toc213004600"/>
       <w:r>
         <w:t>Helpers and auxiliary tools</w:t>
       </w:r>
+      <w:bookmarkEnd w:id="2"/>
     </w:p>
     <w:p/>
     <w:p>
       <w:pPr>
         <w:pStyle w:val="Heading2"/>
       </w:pPr>
+      <w:bookmarkStart w:id="3" w:name="_Toc213004601"/>
       <w:r>
         <w:t>FAT32 image creator</w:t>
       </w:r>
+      <w:bookmarkEnd w:id="3"/>
     </w:p>
     <w:p/>
     <w:p>
@@ -3992,7 +4337,15 @@
         </w:numPr>
       </w:pPr>
       <w:r>
-        <w:t>It creates an MBR and VBR(with BPB) to boot and have a FAT12/16/32 structure</w:t>
+        <w:t xml:space="preserve">It creates an MBR and </w:t>
+      </w:r>
+      <w:proofErr w:type="gramStart"/>
+      <w:r>
+        <w:t>VBR(</w:t>
+      </w:r>
+      <w:proofErr w:type="gramEnd"/>
+      <w:r>
+        <w:t>with BPB) to boot and have a FAT12/16/32 structure</w:t>
       </w:r>
     </w:p>
     <w:p>
@@ -4084,34 +4437,34 @@
       <w:pPr>
         <w:pStyle w:val="Heading1"/>
       </w:pPr>
-      <w:bookmarkStart w:id="2" w:name="_Toc212933569"/>
+      <w:bookmarkStart w:id="4" w:name="_Toc213004602"/>
       <w:r>
         <w:lastRenderedPageBreak/>
         <w:t>Misc and notes</w:t>
       </w:r>
-      <w:bookmarkEnd w:id="2"/>
+      <w:bookmarkEnd w:id="4"/>
     </w:p>
     <w:p/>
     <w:p>
       <w:pPr>
         <w:pStyle w:val="Heading2"/>
       </w:pPr>
-      <w:bookmarkStart w:id="3" w:name="_Toc212933570"/>
+      <w:bookmarkStart w:id="5" w:name="_Toc213004603"/>
       <w:r>
         <w:t>Random notes</w:t>
       </w:r>
-      <w:bookmarkEnd w:id="3"/>
+      <w:bookmarkEnd w:id="5"/>
     </w:p>
     <w:p/>
     <w:p>
       <w:pPr>
         <w:pStyle w:val="Heading3"/>
       </w:pPr>
-      <w:bookmarkStart w:id="4" w:name="_Toc212933571"/>
+      <w:bookmarkStart w:id="6" w:name="_Toc213004604"/>
       <w:r>
         <w:t>BOCHS</w:t>
       </w:r>
-      <w:bookmarkEnd w:id="4"/>
+      <w:bookmarkEnd w:id="6"/>
     </w:p>
     <w:p/>
     <w:p>
@@ -5849,12 +6202,12 @@
       <w:pPr>
         <w:pStyle w:val="Heading3"/>
       </w:pPr>
-      <w:bookmarkStart w:id="5" w:name="_Toc212933572"/>
+      <w:bookmarkStart w:id="7" w:name="_Toc213004605"/>
       <w:r>
         <w:lastRenderedPageBreak/>
         <w:t>STORAGE</w:t>
       </w:r>
-      <w:bookmarkEnd w:id="5"/>
+      <w:bookmarkEnd w:id="7"/>
     </w:p>
     <w:p>
       <w:pPr>
@@ -5872,7 +6225,15 @@
         </w:numPr>
       </w:pPr>
       <w:r>
-        <w:t xml:space="preserve">Non-partitioned storage, such as floppy, use VBR. First sector, physical C/H/S 0,0,1 . Note the sector counting </w:t>
+        <w:t>Non-partitioned storage, such as floppy, use VBR. First sector, physical C/H/S 0,0,</w:t>
+      </w:r>
+      <w:proofErr w:type="gramStart"/>
+      <w:r>
+        <w:t>1 .</w:t>
+      </w:r>
+      <w:proofErr w:type="gramEnd"/>
+      <w:r>
+        <w:t xml:space="preserve"> Note the sector counting </w:t>
       </w:r>
       <w:r>
         <w:t>begins</w:t>
@@ -6005,7 +6366,15 @@
         <w:t>, sector 2048 contains the BPB of a partition.</w:t>
       </w:r>
       <w:r>
-        <w:t xml:space="preserve"> Both can be see easily using </w:t>
+        <w:t xml:space="preserve"> Both can be </w:t>
+      </w:r>
+      <w:proofErr w:type="gramStart"/>
+      <w:r>
+        <w:t>see</w:t>
+      </w:r>
+      <w:proofErr w:type="gramEnd"/>
+      <w:r>
+        <w:t xml:space="preserve"> easily using </w:t>
       </w:r>
       <w:proofErr w:type="spellStart"/>
       <w:r>
@@ -6022,7 +6391,15 @@
         </w:numPr>
       </w:pPr>
       <w:r>
-        <w:t xml:space="preserve">Partition information extracted from the 4x16 bytes before the boot magic number. The first value begins at </w:t>
+        <w:t xml:space="preserve">Partition information </w:t>
+      </w:r>
+      <w:proofErr w:type="gramStart"/>
+      <w:r>
+        <w:t>extracted</w:t>
+      </w:r>
+      <w:proofErr w:type="gramEnd"/>
+      <w:r>
+        <w:t xml:space="preserve"> from the 4x16 bytes before the boot magic number. The first value begins at </w:t>
       </w:r>
       <w:r>
         <w:t>0x1BE</w:t>
@@ -6110,7 +6487,7 @@
       <w:pPr>
         <w:pStyle w:val="Caption"/>
       </w:pPr>
-      <w:bookmarkStart w:id="6" w:name="_Toc212932819"/>
+      <w:bookmarkStart w:id="8" w:name="_Toc213004589"/>
       <w:r>
         <w:t xml:space="preserve">Figure </w:t>
       </w:r>
@@ -6125,7 +6502,7 @@
       <w:r>
         <w:t xml:space="preserve"> Example of partition on MBR. 0x80 is bootable</w:t>
       </w:r>
-      <w:bookmarkEnd w:id="6"/>
+      <w:bookmarkEnd w:id="8"/>
     </w:p>
     <w:p/>
     <w:p>
@@ -6178,7 +6555,7 @@
       <w:pPr>
         <w:pStyle w:val="Caption"/>
       </w:pPr>
-      <w:bookmarkStart w:id="7" w:name="_Toc212932820"/>
+      <w:bookmarkStart w:id="9" w:name="_Toc213004590"/>
       <w:r>
         <w:t xml:space="preserve">Figure </w:t>
       </w:r>
@@ -6193,10 +6570,15 @@
       <w:r>
         <w:t xml:space="preserve"> Dissection of the first partition using ChatGPT. </w:t>
       </w:r>
-      <w:r>
-        <w:t>Is correct?</w:t>
-      </w:r>
-      <w:bookmarkEnd w:id="7"/>
+      <w:proofErr w:type="gramStart"/>
+      <w:r>
+        <w:t>Is</w:t>
+      </w:r>
+      <w:proofErr w:type="gramEnd"/>
+      <w:r>
+        <w:t xml:space="preserve"> correct?</w:t>
+      </w:r>
+      <w:bookmarkEnd w:id="9"/>
     </w:p>
     <w:p/>
     <w:p>
@@ -6266,7 +6648,7 @@
           <w:szCs w:val="16"/>
         </w:rPr>
       </w:pPr>
-      <w:bookmarkStart w:id="8" w:name="_Toc212932821"/>
+      <w:bookmarkStart w:id="10" w:name="_Toc213004591"/>
       <w:r>
         <w:t xml:space="preserve">Figure </w:t>
       </w:r>
@@ -6281,7 +6663,7 @@
       <w:r>
         <w:t xml:space="preserve"> FAT formats schema</w:t>
       </w:r>
-      <w:bookmarkEnd w:id="8"/>
+      <w:bookmarkEnd w:id="10"/>
     </w:p>
     <w:p/>
     <w:p>
@@ -6346,14 +6728,14 @@
       <w:pPr>
         <w:pStyle w:val="Heading2"/>
       </w:pPr>
-      <w:bookmarkStart w:id="9" w:name="_Toc212933573"/>
+      <w:bookmarkStart w:id="11" w:name="_Toc213004606"/>
       <w:r>
         <w:t>WSL</w:t>
       </w:r>
       <w:r>
         <w:t xml:space="preserve"> stuff</w:t>
       </w:r>
-      <w:bookmarkEnd w:id="9"/>
+      <w:bookmarkEnd w:id="11"/>
     </w:p>
     <w:p/>
     <w:p>
@@ -6423,6 +6805,7 @@
       <w:r>
         <w:t>Invoke explorer Windows using “</w:t>
       </w:r>
+      <w:proofErr w:type="gramStart"/>
       <w:r>
         <w:rPr>
           <w:b/>
@@ -6430,6 +6813,7 @@
         </w:rPr>
         <w:t>explorer.exe .</w:t>
       </w:r>
+      <w:proofErr w:type="gramEnd"/>
       <w:r>
         <w:t>”</w:t>
       </w:r>
@@ -6571,8 +6955,13 @@
           <w:bCs/>
         </w:rPr>
       </w:pPr>
-      <w:r>
-        <w:t xml:space="preserve">Also you can net use </w:t>
+      <w:proofErr w:type="gramStart"/>
+      <w:r>
+        <w:t>Also</w:t>
+      </w:r>
+      <w:proofErr w:type="gramEnd"/>
+      <w:r>
+        <w:t xml:space="preserve"> you can net use </w:t>
       </w:r>
       <w:r>
         <w:rPr>
@@ -6705,11 +7094,11 @@
       <w:pPr>
         <w:pStyle w:val="Heading2"/>
       </w:pPr>
-      <w:bookmarkStart w:id="10" w:name="_Toc212933574"/>
+      <w:bookmarkStart w:id="12" w:name="_Toc213004607"/>
       <w:r>
         <w:t>Setup build</w:t>
       </w:r>
-      <w:bookmarkEnd w:id="10"/>
+      <w:bookmarkEnd w:id="12"/>
     </w:p>
     <w:p>
       <w:pPr>
@@ -6927,7 +7316,15 @@
       </w:r>
       <w:proofErr w:type="spellEnd"/>
       <w:r>
-        <w:t xml:space="preserve"> = clear(investigate how to make it permanent)</w:t>
+        <w:t xml:space="preserve"> = </w:t>
+      </w:r>
+      <w:proofErr w:type="gramStart"/>
+      <w:r>
+        <w:t>clear(</w:t>
+      </w:r>
+      <w:proofErr w:type="gramEnd"/>
+      <w:r>
+        <w:t>investigate how to make it permanent)</w:t>
       </w:r>
     </w:p>
     <w:p>
@@ -7270,11 +7667,16 @@
           <w:numId w:val="1"/>
         </w:numPr>
       </w:pPr>
+      <w:proofErr w:type="gramStart"/>
       <w:r>
         <w:t>Actually,</w:t>
       </w:r>
       <w:r>
-        <w:t xml:space="preserve"> what worked was [interop] </w:t>
+        <w:t xml:space="preserve"> what</w:t>
+      </w:r>
+      <w:proofErr w:type="gramEnd"/>
+      <w:r>
+        <w:t xml:space="preserve"> worked was [interop] </w:t>
       </w:r>
       <w:r>
         <w:t>appendWindowsPath=false</w:t>
@@ -7313,8 +7715,13 @@
         </w:numPr>
       </w:pPr>
       <w:r>
-        <w:t>Now using code .</w:t>
-      </w:r>
+        <w:t xml:space="preserve">Now using </w:t>
+      </w:r>
+      <w:proofErr w:type="gramStart"/>
+      <w:r>
+        <w:t>code .</w:t>
+      </w:r>
+      <w:proofErr w:type="gramEnd"/>
       <w:r>
         <w:t xml:space="preserve"> will open native, with a warning.</w:t>
       </w:r>
@@ -8256,8 +8663,13 @@
         </w:numPr>
       </w:pPr>
       <w:r>
-        <w:t xml:space="preserve">            "options": {</w:t>
-      </w:r>
+        <w:t xml:space="preserve">            "options</w:t>
+      </w:r>
+      <w:proofErr w:type="gramStart"/>
+      <w:r>
+        <w:t>": {</w:t>
+      </w:r>
+      <w:proofErr w:type="gramEnd"/>
     </w:p>
     <w:p>
       <w:pPr>
@@ -8360,8 +8772,13 @@
         </w:numPr>
       </w:pPr>
       <w:r>
-        <w:t xml:space="preserve">            "group": {</w:t>
-      </w:r>
+        <w:t xml:space="preserve">            "group</w:t>
+      </w:r>
+      <w:proofErr w:type="gramStart"/>
+      <w:r>
+        <w:t>": {</w:t>
+      </w:r>
+      <w:proofErr w:type="gramEnd"/>
     </w:p>
     <w:p>
       <w:pPr>
@@ -8476,18 +8893,23 @@
         </w:numPr>
       </w:pPr>
       <w:r>
-        <w:t>Next setup task. . . ..</w:t>
-      </w:r>
+        <w:t>Next setup task. . .</w:t>
+      </w:r>
+      <w:proofErr w:type="gramStart"/>
+      <w:r>
+        <w:t xml:space="preserve"> ..</w:t>
+      </w:r>
+      <w:proofErr w:type="gramEnd"/>
     </w:p>
     <w:p>
       <w:pPr>
         <w:pStyle w:val="Heading2"/>
       </w:pPr>
-      <w:bookmarkStart w:id="11" w:name="_Toc212933575"/>
+      <w:bookmarkStart w:id="13" w:name="_Toc213004608"/>
       <w:r>
         <w:t>BUILD PROCESS BEFORE MAKE</w:t>
       </w:r>
-      <w:bookmarkEnd w:id="11"/>
+      <w:bookmarkEnd w:id="13"/>
     </w:p>
     <w:p/>
     <w:p/>
@@ -8495,11 +8917,11 @@
       <w:pPr>
         <w:pStyle w:val="Heading2"/>
       </w:pPr>
-      <w:bookmarkStart w:id="12" w:name="_Toc212933576"/>
+      <w:bookmarkStart w:id="14" w:name="_Toc213004609"/>
       <w:r>
         <w:t>BUILD PROCESS AFTER MAKE</w:t>
       </w:r>
-      <w:bookmarkEnd w:id="12"/>
+      <w:bookmarkEnd w:id="14"/>
     </w:p>
     <w:p/>
     <w:p/>
@@ -8509,11 +8931,11 @@
       <w:pPr>
         <w:pStyle w:val="Heading2"/>
       </w:pPr>
-      <w:bookmarkStart w:id="13" w:name="_Toc212933577"/>
+      <w:bookmarkStart w:id="15" w:name="_Toc213004610"/>
       <w:r>
         <w:t>CPU registers</w:t>
       </w:r>
-      <w:bookmarkEnd w:id="13"/>
+      <w:bookmarkEnd w:id="15"/>
     </w:p>
     <w:p/>
     <w:p>
@@ -8650,23 +9072,23 @@
       <w:pPr>
         <w:pStyle w:val="Heading1"/>
       </w:pPr>
-      <w:bookmarkStart w:id="14" w:name="_Toc212933578"/>
+      <w:bookmarkStart w:id="16" w:name="_Toc213004611"/>
       <w:r>
         <w:lastRenderedPageBreak/>
         <w:t>Common Linux and Windows commands</w:t>
       </w:r>
-      <w:bookmarkEnd w:id="14"/>
+      <w:bookmarkEnd w:id="16"/>
     </w:p>
     <w:p/>
     <w:p>
       <w:pPr>
         <w:pStyle w:val="Heading2"/>
       </w:pPr>
-      <w:bookmarkStart w:id="15" w:name="_Toc212933579"/>
+      <w:bookmarkStart w:id="17" w:name="_Toc213004612"/>
       <w:r>
         <w:t>Linux</w:t>
       </w:r>
-      <w:bookmarkEnd w:id="15"/>
+      <w:bookmarkEnd w:id="17"/>
     </w:p>
     <w:p/>
     <w:p>
@@ -8695,7 +9117,23 @@
           <w:b/>
           <w:bCs/>
         </w:rPr>
-        <w:t>/mnt/c/Users/mihe/Dropbox/TusMuertOS-Oct2025</w:t>
+        <w:t>/</w:t>
+      </w:r>
+      <w:proofErr w:type="gramStart"/>
+      <w:r>
+        <w:rPr>
+          <w:b/>
+          <w:bCs/>
+        </w:rPr>
+        <w:t>mnt</w:t>
+      </w:r>
+      <w:proofErr w:type="gramEnd"/>
+      <w:r>
+        <w:rPr>
+          <w:b/>
+          <w:bCs/>
+        </w:rPr>
+        <w:t>/c/Users/mihe/Dropbox/TusMuertOS-Oct2025</w:t>
       </w:r>
     </w:p>
     <w:p>
@@ -8860,7 +9298,15 @@
     <w:p/>
     <w:p>
       <w:r>
-        <w:t xml:space="preserve">Inject the bootloader (512 bytes, One sector if I am not </w:t>
+        <w:t xml:space="preserve">Inject the bootloader (512 bytes, </w:t>
+      </w:r>
+      <w:proofErr w:type="gramStart"/>
+      <w:r>
+        <w:t>One</w:t>
+      </w:r>
+      <w:proofErr w:type="gramEnd"/>
+      <w:r>
+        <w:t xml:space="preserve"> sector if I am not </w:t>
       </w:r>
       <w:proofErr w:type="spellStart"/>
       <w:r>
@@ -8986,11 +9432,11 @@
       <w:pPr>
         <w:pStyle w:val="Heading2"/>
       </w:pPr>
-      <w:bookmarkStart w:id="16" w:name="_Toc212933580"/>
+      <w:bookmarkStart w:id="18" w:name="_Toc213004613"/>
       <w:r>
         <w:t>Windows PowerShell</w:t>
       </w:r>
-      <w:bookmarkEnd w:id="16"/>
+      <w:bookmarkEnd w:id="18"/>
     </w:p>
     <w:p/>
     <w:p>
@@ -9008,7 +9454,23 @@
     </w:p>
     <w:p>
       <w:r>
-        <w:t>qemu-system-i386 -drive format=raw,file=C:\Users\mihe\Dropbox\TusMuertOS-Oct2025\src\build\stage1.bin,if=floppy</w:t>
+        <w:t>qemu-system-i386 -drive format=</w:t>
+      </w:r>
+      <w:proofErr w:type="gramStart"/>
+      <w:r>
+        <w:t>raw,file</w:t>
+      </w:r>
+      <w:proofErr w:type="gramEnd"/>
+      <w:r>
+        <w:t>=</w:t>
+      </w:r>
+      <w:proofErr w:type="gramStart"/>
+      <w:r>
+        <w:t>C:\Users\mihe\Dropbox\TusMuertOS-Oct2025\src\build\stage1.bin,if</w:t>
+      </w:r>
+      <w:proofErr w:type="gramEnd"/>
+      <w:r>
+        <w:t>=floppy</w:t>
       </w:r>
     </w:p>
     <w:p/>
@@ -9075,8 +9537,13 @@
     <w:p>
       <w:r>
         <w:tab/>
-        <w:t>-q: don’t show the configuration screen before start</w:t>
-      </w:r>
+        <w:t xml:space="preserve">-q: don’t show the configuration screen before </w:t>
+      </w:r>
+      <w:proofErr w:type="gramStart"/>
+      <w:r>
+        <w:t>start</w:t>
+      </w:r>
+      <w:proofErr w:type="gramEnd"/>
     </w:p>
     <w:p>
       <w:r>
@@ -9105,8 +9572,13 @@
     <w:p/>
     <w:p>
       <w:r>
-        <w:t>NEXT DAY !!!!!!!!!!!!!!!!!!!!!!!!!!!!!!!!!!!!!!</w:t>
-      </w:r>
+        <w:t xml:space="preserve">NEXT </w:t>
+      </w:r>
+      <w:proofErr w:type="gramStart"/>
+      <w:r>
+        <w:t>DAY !!!!!!!!!!!!!!!!!!!!!!!!!!!!!!!!!!!!!!</w:t>
+      </w:r>
+      <w:proofErr w:type="gramEnd"/>
     </w:p>
     <w:p>
       <w:proofErr w:type="spellStart"/>
@@ -9139,22 +9611,22 @@
       <w:pPr>
         <w:pStyle w:val="Heading1"/>
       </w:pPr>
-      <w:bookmarkStart w:id="17" w:name="_Toc212933581"/>
+      <w:bookmarkStart w:id="19" w:name="_Toc213004614"/>
       <w:r>
         <w:t>Random nuggets of knowledge</w:t>
       </w:r>
-      <w:bookmarkEnd w:id="17"/>
+      <w:bookmarkEnd w:id="19"/>
     </w:p>
     <w:p/>
     <w:p>
       <w:pPr>
         <w:pStyle w:val="Heading2"/>
       </w:pPr>
-      <w:bookmarkStart w:id="18" w:name="_Toc212933582"/>
+      <w:bookmarkStart w:id="20" w:name="_Toc213004615"/>
       <w:r>
         <w:t>How Org directive works in NASM assembly</w:t>
       </w:r>
-      <w:bookmarkEnd w:id="18"/>
+      <w:bookmarkEnd w:id="20"/>
     </w:p>
     <w:p>
       <w:pPr>
@@ -9188,7 +9660,15 @@
         </w:pBdr>
       </w:pPr>
       <w:r>
-        <w:t xml:space="preserve">    mov ax, start      ; imm16 encodes the absolute offset of “start”</w:t>
+        <w:t xml:space="preserve">    mov ax, start    </w:t>
+      </w:r>
+      <w:proofErr w:type="gramStart"/>
+      <w:r>
+        <w:t xml:space="preserve">  ;</w:t>
+      </w:r>
+      <w:proofErr w:type="gramEnd"/>
+      <w:r>
+        <w:t xml:space="preserve"> imm16 encodes the absolute offset of “start”</w:t>
       </w:r>
     </w:p>
     <w:p>
@@ -9220,7 +9700,7 @@
       <w:pPr>
         <w:pStyle w:val="Heading2"/>
       </w:pPr>
-      <w:bookmarkStart w:id="19" w:name="_Toc212933583"/>
+      <w:bookmarkStart w:id="21" w:name="_Toc213004616"/>
       <w:r>
         <w:t xml:space="preserve">WSL Tab autocomplete </w:t>
       </w:r>
@@ -9232,13 +9712,21 @@
       <w:r>
         <w:t xml:space="preserve"> only on windows/system32</w:t>
       </w:r>
-      <w:bookmarkEnd w:id="19"/>
+      <w:bookmarkEnd w:id="21"/>
     </w:p>
     <w:p/>
     <w:p>
       <w:r>
         <w:lastRenderedPageBreak/>
-        <w:t xml:space="preserve">No solution found yet. Tried to add to </w:t>
+        <w:t xml:space="preserve">No solution </w:t>
+      </w:r>
+      <w:proofErr w:type="gramStart"/>
+      <w:r>
+        <w:t>found</w:t>
+      </w:r>
+      <w:proofErr w:type="gramEnd"/>
+      <w:r>
+        <w:t xml:space="preserve"> yet. Tried to add to </w:t>
       </w:r>
       <w:proofErr w:type="spellStart"/>
       <w:r>
@@ -9262,7 +9750,7 @@
       <w:pPr>
         <w:pStyle w:val="Heading2"/>
       </w:pPr>
-      <w:bookmarkStart w:id="20" w:name="_Toc212933584"/>
+      <w:bookmarkStart w:id="22" w:name="_Toc213004617"/>
       <w:r>
         <w:t xml:space="preserve">On bootloader, will mov </w:t>
       </w:r>
@@ -9274,7 +9762,7 @@
       <w:r>
         <w:t>, 0x7C00 make the next push to overwrite the first byte of the bootloader? (Overlap)</w:t>
       </w:r>
-      <w:bookmarkEnd w:id="20"/>
+      <w:bookmarkEnd w:id="22"/>
     </w:p>
     <w:p/>
     <w:p>
@@ -9329,7 +9817,7 @@
       <w:pPr>
         <w:pStyle w:val="Heading2"/>
       </w:pPr>
-      <w:bookmarkStart w:id="21" w:name="_Toc212933585"/>
+      <w:bookmarkStart w:id="23" w:name="_Toc213004618"/>
       <w:r>
         <w:t xml:space="preserve">Full </w:t>
       </w:r>
@@ -9339,7 +9827,7 @@
       <w:r>
         <w:t xml:space="preserve"> history</w:t>
       </w:r>
-      <w:bookmarkEnd w:id="21"/>
+      <w:bookmarkEnd w:id="23"/>
     </w:p>
     <w:p/>
     <w:p>
@@ -9352,9 +9840,11 @@
       <w:pPr>
         <w:pStyle w:val="Heading2"/>
       </w:pPr>
+      <w:bookmarkStart w:id="24" w:name="_Toc213004619"/>
       <w:r>
         <w:t>Git inconsistency between files on the same folder via Windows and WSL on VSCODE</w:t>
       </w:r>
+      <w:bookmarkEnd w:id="24"/>
     </w:p>
     <w:p/>
     <w:p>
@@ -9392,11 +9882,11 @@
       <w:pPr>
         <w:pStyle w:val="Heading1"/>
       </w:pPr>
-      <w:bookmarkStart w:id="22" w:name="_Toc212933586"/>
+      <w:bookmarkStart w:id="25" w:name="_Toc213004620"/>
       <w:r>
         <w:t>Research backlog</w:t>
       </w:r>
-      <w:bookmarkEnd w:id="22"/>
+      <w:bookmarkEnd w:id="25"/>
     </w:p>
     <w:p/>
     <w:p>
@@ -9429,7 +9919,15 @@
         </w:numPr>
       </w:pPr>
       <w:r>
-        <w:t>Partition table on the MBR. I remember seeing adding 4 16bytes reserved structures before 0xAA55</w:t>
+        <w:t>Partition table on the MBR. I remember seeing adding 4 16</w:t>
+      </w:r>
+      <w:proofErr w:type="gramStart"/>
+      <w:r>
+        <w:t>bytes</w:t>
+      </w:r>
+      <w:proofErr w:type="gramEnd"/>
+      <w:r>
+        <w:t xml:space="preserve"> reserved structures before 0xAA55</w:t>
       </w:r>
     </w:p>
     <w:p>
@@ -9441,7 +9939,15 @@
         </w:numPr>
       </w:pPr>
       <w:r>
-        <w:t>I guess this applies if the MBR is for a hard disk, but does not apply for a floppy</w:t>
+        <w:t xml:space="preserve">I guess this applies if the MBR is for a hard </w:t>
+      </w:r>
+      <w:proofErr w:type="gramStart"/>
+      <w:r>
+        <w:t>disk, but</w:t>
+      </w:r>
+      <w:proofErr w:type="gramEnd"/>
+      <w:r>
+        <w:t xml:space="preserve"> does not apply for a floppy</w:t>
       </w:r>
       <w:r>
         <w:t>. This is an educated guess</w:t>
@@ -9457,7 +9963,15 @@
       </w:pPr>
       <w:r>
         <w:lastRenderedPageBreak/>
-        <w:t xml:space="preserve">On floppy, the FAT info at 0 starts with a jump to code, followed by the FAT info. This way both, the bootloader and FAT info can coexist, because there is a jump. Validate this because I got this explained by </w:t>
+        <w:t xml:space="preserve">On floppy, the FAT info at 0 starts with a jump to code, followed by the FAT info. This way </w:t>
+      </w:r>
+      <w:proofErr w:type="gramStart"/>
+      <w:r>
+        <w:t>both,</w:t>
+      </w:r>
+      <w:proofErr w:type="gramEnd"/>
+      <w:r>
+        <w:t xml:space="preserve"> the bootloader and FAT info can coexist, because there is a jump. Validate this because I got this explained by </w:t>
       </w:r>
       <w:r>
         <w:t>ChatGPT. It makes a lot of sense, but still…</w:t>
@@ -9472,7 +9986,15 @@
         </w:numPr>
       </w:pPr>
       <w:r>
-        <w:t>A Disk with multiple partitions, the first byte define if it is bootable 0x80 = bootable.</w:t>
+        <w:t xml:space="preserve">A Disk with multiple partitions, the first byte </w:t>
+      </w:r>
+      <w:proofErr w:type="gramStart"/>
+      <w:r>
+        <w:t>define</w:t>
+      </w:r>
+      <w:proofErr w:type="gramEnd"/>
+      <w:r>
+        <w:t xml:space="preserve"> if it is bootable 0x80 = bootable.</w:t>
       </w:r>
       <w:r>
         <w:t xml:space="preserve"> The first byte on one of those 4 16 bytes partitions at the end of the MBR before the 0xAA55</w:t>
@@ -9487,7 +10009,15 @@
         </w:numPr>
       </w:pPr>
       <w:r>
-        <w:t>Can MBR and BPB be fused together? I found something related to a short jump at the beginning, of BPB ??? Dive deeper into this!</w:t>
+        <w:t xml:space="preserve">Can MBR and BPB be fused together? I found something related to a short jump at the beginning, of </w:t>
+      </w:r>
+      <w:proofErr w:type="gramStart"/>
+      <w:r>
+        <w:t>BPB ???</w:t>
+      </w:r>
+      <w:proofErr w:type="gramEnd"/>
+      <w:r>
+        <w:t xml:space="preserve"> Dive deeper into this!</w:t>
       </w:r>
       <w:r>
         <w:t xml:space="preserve"> I think BPB merged on MBR is for disk without partitions, such as floppy disks. </w:t>
@@ -9556,18 +10086,23 @@
       </w:r>
       <w:proofErr w:type="spellEnd"/>
       <w:r>
-        <w:t xml:space="preserve"> file )</w:t>
-      </w:r>
+        <w:t xml:space="preserve"> </w:t>
+      </w:r>
+      <w:proofErr w:type="gramStart"/>
+      <w:r>
+        <w:t>file )</w:t>
+      </w:r>
+      <w:proofErr w:type="gramEnd"/>
     </w:p>
     <w:p>
       <w:pPr>
         <w:pStyle w:val="Heading1"/>
       </w:pPr>
-      <w:bookmarkStart w:id="23" w:name="_Toc212933587"/>
+      <w:bookmarkStart w:id="26" w:name="_Toc213004621"/>
       <w:r>
         <w:t>Screenshots</w:t>
       </w:r>
-      <w:bookmarkEnd w:id="23"/>
+      <w:bookmarkEnd w:id="26"/>
     </w:p>
     <w:p/>
     <w:p>
@@ -9626,7 +10161,7 @@
       <w:pPr>
         <w:pStyle w:val="Caption"/>
       </w:pPr>
-      <w:bookmarkStart w:id="24" w:name="_Toc212932822"/>
+      <w:bookmarkStart w:id="27" w:name="_Toc213004592"/>
       <w:r>
         <w:t xml:space="preserve">Figure </w:t>
       </w:r>
@@ -9641,7 +10176,7 @@
       <w:r>
         <w:t xml:space="preserve"> Quick and dirt bootloader with ABCD printed</w:t>
       </w:r>
-      <w:bookmarkEnd w:id="24"/>
+      <w:bookmarkEnd w:id="27"/>
     </w:p>
     <w:p/>
     <w:p>
@@ -9693,7 +10228,7 @@
       <w:pPr>
         <w:pStyle w:val="Caption"/>
       </w:pPr>
-      <w:bookmarkStart w:id="25" w:name="_Toc212932823"/>
+      <w:bookmarkStart w:id="28" w:name="_Toc213004593"/>
       <w:r>
         <w:t xml:space="preserve">Figure </w:t>
       </w:r>
@@ -9716,7 +10251,7 @@
       <w:r>
         <w:t xml:space="preserve"> for the bootloader</w:t>
       </w:r>
-      <w:bookmarkEnd w:id="25"/>
+      <w:bookmarkEnd w:id="28"/>
     </w:p>
     <w:p/>
     <w:p>
@@ -9774,7 +10309,7 @@
       <w:pPr>
         <w:pStyle w:val="Caption"/>
       </w:pPr>
-      <w:bookmarkStart w:id="26" w:name="_Toc212932824"/>
+      <w:bookmarkStart w:id="29" w:name="_Toc213004594"/>
       <w:r>
         <w:t xml:space="preserve">Figure </w:t>
       </w:r>
@@ -9804,13 +10339,78 @@
       <w:r>
         <w:t>…</w:t>
       </w:r>
-      <w:bookmarkEnd w:id="26"/>
+      <w:bookmarkEnd w:id="29"/>
     </w:p>
     <w:p/>
     <w:p>
       <w:r>
         <w:t>02-November-2025</w:t>
       </w:r>
+    </w:p>
+    <w:p/>
+    <w:p>
+      <w:pPr>
+        <w:keepNext/>
+      </w:pPr>
+      <w:r>
+        <w:lastRenderedPageBreak/>
+        <w:drawing>
+          <wp:inline distT="0" distB="0" distL="0" distR="0" wp14:anchorId="3269323A" wp14:editId="3178A46E">
+            <wp:extent cx="5943600" cy="7240905"/>
+            <wp:effectExtent l="0" t="0" r="0" b="0"/>
+            <wp:docPr id="1690101478" name="Picture 1" descr="A screenshot of a computer program&#10;&#10;AI-generated content may be incorrect."/>
+            <wp:cNvGraphicFramePr>
+              <a:graphicFrameLocks xmlns:a="http://schemas.openxmlformats.org/drawingml/2006/main" noChangeAspect="1"/>
+            </wp:cNvGraphicFramePr>
+            <a:graphic xmlns:a="http://schemas.openxmlformats.org/drawingml/2006/main">
+              <a:graphicData uri="http://schemas.openxmlformats.org/drawingml/2006/picture">
+                <pic:pic xmlns:pic="http://schemas.openxmlformats.org/drawingml/2006/picture">
+                  <pic:nvPicPr>
+                    <pic:cNvPr id="1690101478" name="Picture 1" descr="A screenshot of a computer program&#10;&#10;AI-generated content may be incorrect."/>
+                    <pic:cNvPicPr/>
+                  </pic:nvPicPr>
+                  <pic:blipFill>
+                    <a:blip r:embed="rId25"/>
+                    <a:stretch>
+                      <a:fillRect/>
+                    </a:stretch>
+                  </pic:blipFill>
+                  <pic:spPr>
+                    <a:xfrm>
+                      <a:off x="0" y="0"/>
+                      <a:ext cx="5943600" cy="7240905"/>
+                    </a:xfrm>
+                    <a:prstGeom prst="rect">
+                      <a:avLst/>
+                    </a:prstGeom>
+                  </pic:spPr>
+                </pic:pic>
+              </a:graphicData>
+            </a:graphic>
+          </wp:inline>
+        </w:drawing>
+      </w:r>
+    </w:p>
+    <w:p>
+      <w:pPr>
+        <w:pStyle w:val="Caption"/>
+      </w:pPr>
+      <w:bookmarkStart w:id="30" w:name="_Toc213004595"/>
+      <w:r>
+        <w:t xml:space="preserve">Figure </w:t>
+      </w:r>
+      <w:fldSimple w:instr=" SEQ Figure \* ARABIC ">
+        <w:r>
+          <w:rPr>
+            <w:noProof/>
+          </w:rPr>
+          <w:t>7</w:t>
+        </w:r>
+      </w:fldSimple>
+      <w:r>
+        <w:t xml:space="preserve"> First steps FAT32 imaging tool</w:t>
+      </w:r>
+      <w:bookmarkEnd w:id="30"/>
     </w:p>
     <w:p/>
     <w:p/>
@@ -9818,12 +10418,12 @@
       <w:pPr>
         <w:pStyle w:val="Heading1"/>
       </w:pPr>
-      <w:bookmarkStart w:id="27" w:name="_Toc212933588"/>
+      <w:bookmarkStart w:id="31" w:name="_Toc213004622"/>
       <w:r>
         <w:lastRenderedPageBreak/>
         <w:t>Resources</w:t>
       </w:r>
-      <w:bookmarkEnd w:id="27"/>
+      <w:bookmarkEnd w:id="31"/>
     </w:p>
     <w:p/>
     <w:tbl>
@@ -9864,7 +10464,7 @@
             <w:tcW w:w="4675" w:type="dxa"/>
           </w:tcPr>
           <w:p>
-            <w:hyperlink r:id="rId25" w:history="1">
+            <w:hyperlink r:id="rId26" w:history="1">
               <w:r>
                 <w:rPr>
                   <w:rStyle w:val="Hyperlink"/>
@@ -9900,7 +10500,7 @@
             <w:tcW w:w="4675" w:type="dxa"/>
           </w:tcPr>
           <w:p>
-            <w:hyperlink r:id="rId26" w:history="1">
+            <w:hyperlink r:id="rId27" w:history="1">
               <w:r>
                 <w:rPr>
                   <w:rStyle w:val="Hyperlink"/>
@@ -9921,55 +10521,6 @@
             <w:r>
               <w:t>FAT Reference from Microsoft. Internet archive</w:t>
             </w:r>
-          </w:p>
-        </w:tc>
-      </w:tr>
-      <w:tr>
-        <w:tc>
-          <w:tcPr>
-            <w:tcW w:w="4675" w:type="dxa"/>
-          </w:tcPr>
-          <w:p>
-            <w:hyperlink r:id="rId27" w:history="1">
-              <w:r>
-                <w:rPr>
-                  <w:rStyle w:val="Hyperlink"/>
-                </w:rPr>
-                <w:t>https://euroassembler.eu/</w:t>
-              </w:r>
-            </w:hyperlink>
-            <w:r>
-              <w:t xml:space="preserve"> </w:t>
-            </w:r>
-          </w:p>
-        </w:tc>
-        <w:tc>
-          <w:tcPr>
-            <w:tcW w:w="4675" w:type="dxa"/>
-          </w:tcPr>
-          <w:p>
-            <w:r>
-              <w:t>Yet another assembler. There is a ton of work behind. The macros</w:t>
-            </w:r>
-            <w:r>
-              <w:t xml:space="preserve"> and projects</w:t>
-            </w:r>
-            <w:r>
-              <w:t xml:space="preserve"> section contain a lot of pre-canned structures and </w:t>
-            </w:r>
-            <w:proofErr w:type="spellStart"/>
-            <w:r>
-              <w:t>asm</w:t>
-            </w:r>
-            <w:proofErr w:type="spellEnd"/>
-            <w:r>
-              <w:t xml:space="preserve"> for </w:t>
-            </w:r>
-            <w:proofErr w:type="spellStart"/>
-            <w:r>
-              <w:t>OsDev</w:t>
-            </w:r>
-            <w:proofErr w:type="spellEnd"/>
           </w:p>
         </w:tc>
       </w:tr>
@@ -9984,7 +10535,7 @@
                 <w:rPr>
                   <w:rStyle w:val="Hyperlink"/>
                 </w:rPr>
-                <w:t>https://elm-chan.org/docs/fat_e.html</w:t>
+                <w:t>https://euroassembler.eu/</w:t>
               </w:r>
             </w:hyperlink>
             <w:r>
@@ -9998,8 +10549,27 @@
           </w:tcPr>
           <w:p>
             <w:r>
-              <w:t>FAT stuff</w:t>
-            </w:r>
+              <w:t>Yet another assembler. There is a ton of work behind. The macros</w:t>
+            </w:r>
+            <w:r>
+              <w:t xml:space="preserve"> and projects</w:t>
+            </w:r>
+            <w:r>
+              <w:t xml:space="preserve"> section contain a lot of pre-canned structures and </w:t>
+            </w:r>
+            <w:proofErr w:type="spellStart"/>
+            <w:r>
+              <w:t>asm</w:t>
+            </w:r>
+            <w:proofErr w:type="spellEnd"/>
+            <w:r>
+              <w:t xml:space="preserve"> for </w:t>
+            </w:r>
+            <w:proofErr w:type="spellStart"/>
+            <w:r>
+              <w:t>OsDev</w:t>
+            </w:r>
+            <w:proofErr w:type="spellEnd"/>
           </w:p>
         </w:tc>
       </w:tr>
@@ -10014,7 +10584,7 @@
                 <w:rPr>
                   <w:rStyle w:val="Hyperlink"/>
                 </w:rPr>
-                <w:t>https://github.com/lukearend/x86-bootloader</w:t>
+                <w:t>https://elm-chan.org/docs/fat_e.html</w:t>
               </w:r>
             </w:hyperlink>
             <w:r>
@@ -10028,7 +10598,92 @@
           </w:tcPr>
           <w:p>
             <w:r>
+              <w:t>FAT stuff</w:t>
+            </w:r>
+          </w:p>
+        </w:tc>
+      </w:tr>
+      <w:tr>
+        <w:tc>
+          <w:tcPr>
+            <w:tcW w:w="4675" w:type="dxa"/>
+          </w:tcPr>
+          <w:p>
+            <w:hyperlink r:id="rId30" w:history="1">
+              <w:r>
+                <w:rPr>
+                  <w:rStyle w:val="Hyperlink"/>
+                </w:rPr>
+                <w:t>https://github.com/lukearend/x86-bootloader</w:t>
+              </w:r>
+            </w:hyperlink>
+            <w:r>
+              <w:t xml:space="preserve"> </w:t>
+            </w:r>
+          </w:p>
+        </w:tc>
+        <w:tc>
+          <w:tcPr>
+            <w:tcW w:w="4675" w:type="dxa"/>
+          </w:tcPr>
+          <w:p>
+            <w:r>
               <w:t>Bootloader assembly, very basic</w:t>
+            </w:r>
+          </w:p>
+        </w:tc>
+      </w:tr>
+      <w:tr>
+        <w:tc>
+          <w:tcPr>
+            <w:tcW w:w="4675" w:type="dxa"/>
+          </w:tcPr>
+          <w:p>
+            <w:hyperlink r:id="rId31" w:history="1">
+              <w:r>
+                <w:rPr>
+                  <w:rStyle w:val="Hyperlink"/>
+                </w:rPr>
+                <w:t>https://en.wikipedia.org/wiki/Master_boot_record</w:t>
+              </w:r>
+            </w:hyperlink>
+            <w:r>
+              <w:t xml:space="preserve"> </w:t>
+            </w:r>
+          </w:p>
+        </w:tc>
+        <w:tc>
+          <w:tcPr>
+            <w:tcW w:w="4675" w:type="dxa"/>
+          </w:tcPr>
+          <w:p>
+            <w:r>
+              <w:t>The sector layout section is a good summary.</w:t>
+            </w:r>
+          </w:p>
+        </w:tc>
+      </w:tr>
+      <w:tr>
+        <w:tc>
+          <w:tcPr>
+            <w:tcW w:w="4675" w:type="dxa"/>
+          </w:tcPr>
+          <w:p>
+            <w:r>
+              <w:t>docs\Reference\FileSystem\FAT-Specification-Microsoft-Aug2005.pdf</w:t>
+            </w:r>
+            <w:r>
+              <w:t xml:space="preserve"> </w:t>
+            </w:r>
+          </w:p>
+        </w:tc>
+        <w:tc>
+          <w:tcPr>
+            <w:tcW w:w="4675" w:type="dxa"/>
+          </w:tcPr>
+          <w:p>
+            <w:r>
+              <w:t>PDF FAT reference</w:t>
             </w:r>
           </w:p>
         </w:tc>
@@ -10043,11 +10698,11 @@
       <w:pPr>
         <w:pStyle w:val="Heading1"/>
       </w:pPr>
-      <w:bookmarkStart w:id="28" w:name="_Toc212933589"/>
+      <w:bookmarkStart w:id="32" w:name="_Toc213004623"/>
       <w:r>
         <w:t>Clock in/out hours</w:t>
       </w:r>
-      <w:bookmarkEnd w:id="28"/>
+      <w:bookmarkEnd w:id="32"/>
     </w:p>
     <w:p/>
     <w:p>
@@ -10123,6 +10778,9 @@
             <w:r>
               <w:t>4</w:t>
             </w:r>
+            <w:r>
+              <w:t xml:space="preserve"> hours</w:t>
+            </w:r>
           </w:p>
         </w:tc>
       </w:tr>
@@ -10145,6 +10803,9 @@
             <w:r>
               <w:t>12</w:t>
             </w:r>
+            <w:r>
+              <w:t xml:space="preserve"> hours</w:t>
+            </w:r>
           </w:p>
         </w:tc>
       </w:tr>
@@ -10153,13 +10814,21 @@
           <w:tcPr>
             <w:tcW w:w="4675" w:type="dxa"/>
           </w:tcPr>
-          <w:p/>
+          <w:p>
+            <w:r>
+              <w:t>02-November-2025</w:t>
+            </w:r>
+          </w:p>
         </w:tc>
         <w:tc>
           <w:tcPr>
             <w:tcW w:w="4675" w:type="dxa"/>
           </w:tcPr>
-          <w:p/>
+          <w:p>
+            <w:r>
+              <w:t>8 hours</w:t>
+            </w:r>
+          </w:p>
         </w:tc>
       </w:tr>
       <w:tr>
@@ -10184,12 +10853,11 @@
       <w:pPr>
         <w:pStyle w:val="Heading1"/>
       </w:pPr>
-      <w:bookmarkStart w:id="29" w:name="_Toc212933590"/>
-      <w:r>
-        <w:lastRenderedPageBreak/>
+      <w:bookmarkStart w:id="33" w:name="_Toc213004624"/>
+      <w:r>
         <w:t>Table of figures</w:t>
       </w:r>
-      <w:bookmarkEnd w:id="29"/>
+      <w:bookmarkEnd w:id="33"/>
     </w:p>
     <w:p/>
     <w:p>
@@ -10215,7 +10883,7 @@
       <w:r>
         <w:fldChar w:fldCharType="separate"/>
       </w:r>
-      <w:hyperlink w:anchor="_Toc212932819" w:history="1">
+      <w:hyperlink w:anchor="_Toc213004589" w:history="1">
         <w:r>
           <w:rPr>
             <w:rStyle w:val="Hyperlink"/>
@@ -10242,79 +10910,7 @@
             <w:noProof/>
             <w:webHidden/>
           </w:rPr>
-          <w:instrText xml:space="preserve"> PAGEREF _Toc212932819 \h </w:instrText>
-        </w:r>
-        <w:r>
-          <w:rPr>
-            <w:noProof/>
-            <w:webHidden/>
-          </w:rPr>
-        </w:r>
-        <w:r>
-          <w:rPr>
-            <w:noProof/>
-            <w:webHidden/>
-          </w:rPr>
-          <w:fldChar w:fldCharType="separate"/>
-        </w:r>
-        <w:r>
-          <w:rPr>
-            <w:noProof/>
-            <w:webHidden/>
-          </w:rPr>
-          <w:t>6</w:t>
-        </w:r>
-        <w:r>
-          <w:rPr>
-            <w:noProof/>
-            <w:webHidden/>
-          </w:rPr>
-          <w:fldChar w:fldCharType="end"/>
-        </w:r>
-      </w:hyperlink>
-    </w:p>
-    <w:p>
-      <w:pPr>
-        <w:pStyle w:val="TableofFigures"/>
-        <w:tabs>
-          <w:tab w:val="right" w:leader="dot" w:pos="9350"/>
-        </w:tabs>
-        <w:rPr>
-          <w:noProof/>
-          <w:kern w:val="2"/>
-          <w:sz w:val="24"/>
-          <w:szCs w:val="24"/>
-          <w14:ligatures w14:val="standardContextual"/>
-        </w:rPr>
-      </w:pPr>
-      <w:hyperlink w:anchor="_Toc212932820" w:history="1">
-        <w:r>
-          <w:rPr>
-            <w:rStyle w:val="Hyperlink"/>
-            <w:noProof/>
-          </w:rPr>
-          <w:t>Figure 2 Dissection of the first partition using ChatGPT. Is correct?</w:t>
-        </w:r>
-        <w:r>
-          <w:rPr>
-            <w:noProof/>
-            <w:webHidden/>
-          </w:rPr>
-          <w:tab/>
-        </w:r>
-        <w:r>
-          <w:rPr>
-            <w:noProof/>
-            <w:webHidden/>
-          </w:rPr>
-          <w:fldChar w:fldCharType="begin"/>
-        </w:r>
-        <w:r>
-          <w:rPr>
-            <w:noProof/>
-            <w:webHidden/>
-          </w:rPr>
-          <w:instrText xml:space="preserve"> PAGEREF _Toc212932820 \h </w:instrText>
+          <w:instrText xml:space="preserve"> PAGEREF _Toc213004589 \h </w:instrText>
         </w:r>
         <w:r>
           <w:rPr>
@@ -10359,13 +10955,13 @@
           <w14:ligatures w14:val="standardContextual"/>
         </w:rPr>
       </w:pPr>
-      <w:hyperlink w:anchor="_Toc212932821" w:history="1">
+      <w:hyperlink w:anchor="_Toc213004590" w:history="1">
         <w:r>
           <w:rPr>
             <w:rStyle w:val="Hyperlink"/>
             <w:noProof/>
           </w:rPr>
-          <w:t>Figure 3 FAT formats schema</w:t>
+          <w:t>Figure 2 Dissection of the first partition using ChatGPT. Is correct?</w:t>
         </w:r>
         <w:r>
           <w:rPr>
@@ -10386,7 +10982,7 @@
             <w:noProof/>
             <w:webHidden/>
           </w:rPr>
-          <w:instrText xml:space="preserve"> PAGEREF _Toc212932821 \h </w:instrText>
+          <w:instrText xml:space="preserve"> PAGEREF _Toc213004590 \h </w:instrText>
         </w:r>
         <w:r>
           <w:rPr>
@@ -10431,7 +11027,79 @@
           <w14:ligatures w14:val="standardContextual"/>
         </w:rPr>
       </w:pPr>
-      <w:hyperlink w:anchor="_Toc212932822" w:history="1">
+      <w:hyperlink w:anchor="_Toc213004591" w:history="1">
+        <w:r>
+          <w:rPr>
+            <w:rStyle w:val="Hyperlink"/>
+            <w:noProof/>
+          </w:rPr>
+          <w:t>Figure 3 FAT formats schema</w:t>
+        </w:r>
+        <w:r>
+          <w:rPr>
+            <w:noProof/>
+            <w:webHidden/>
+          </w:rPr>
+          <w:tab/>
+        </w:r>
+        <w:r>
+          <w:rPr>
+            <w:noProof/>
+            <w:webHidden/>
+          </w:rPr>
+          <w:fldChar w:fldCharType="begin"/>
+        </w:r>
+        <w:r>
+          <w:rPr>
+            <w:noProof/>
+            <w:webHidden/>
+          </w:rPr>
+          <w:instrText xml:space="preserve"> PAGEREF _Toc213004591 \h </w:instrText>
+        </w:r>
+        <w:r>
+          <w:rPr>
+            <w:noProof/>
+            <w:webHidden/>
+          </w:rPr>
+        </w:r>
+        <w:r>
+          <w:rPr>
+            <w:noProof/>
+            <w:webHidden/>
+          </w:rPr>
+          <w:fldChar w:fldCharType="separate"/>
+        </w:r>
+        <w:r>
+          <w:rPr>
+            <w:noProof/>
+            <w:webHidden/>
+          </w:rPr>
+          <w:t>9</w:t>
+        </w:r>
+        <w:r>
+          <w:rPr>
+            <w:noProof/>
+            <w:webHidden/>
+          </w:rPr>
+          <w:fldChar w:fldCharType="end"/>
+        </w:r>
+      </w:hyperlink>
+    </w:p>
+    <w:p>
+      <w:pPr>
+        <w:pStyle w:val="TableofFigures"/>
+        <w:tabs>
+          <w:tab w:val="right" w:leader="dot" w:pos="9350"/>
+        </w:tabs>
+        <w:rPr>
+          <w:noProof/>
+          <w:kern w:val="2"/>
+          <w:sz w:val="24"/>
+          <w:szCs w:val="24"/>
+          <w14:ligatures w14:val="standardContextual"/>
+        </w:rPr>
+      </w:pPr>
+      <w:hyperlink w:anchor="_Toc213004592" w:history="1">
         <w:r>
           <w:rPr>
             <w:rStyle w:val="Hyperlink"/>
@@ -10458,7 +11126,7 @@
             <w:noProof/>
             <w:webHidden/>
           </w:rPr>
-          <w:instrText xml:space="preserve"> PAGEREF _Toc212932822 \h </w:instrText>
+          <w:instrText xml:space="preserve"> PAGEREF _Toc213004592 \h </w:instrText>
         </w:r>
         <w:r>
           <w:rPr>
@@ -10478,7 +11146,7 @@
             <w:noProof/>
             <w:webHidden/>
           </w:rPr>
-          <w:t>15</w:t>
+          <w:t>17</w:t>
         </w:r>
         <w:r>
           <w:rPr>
@@ -10503,7 +11171,7 @@
           <w14:ligatures w14:val="standardContextual"/>
         </w:rPr>
       </w:pPr>
-      <w:hyperlink w:anchor="_Toc212932823" w:history="1">
+      <w:hyperlink w:anchor="_Toc213004593" w:history="1">
         <w:r>
           <w:rPr>
             <w:rStyle w:val="Hyperlink"/>
@@ -10530,7 +11198,7 @@
             <w:noProof/>
             <w:webHidden/>
           </w:rPr>
-          <w:instrText xml:space="preserve"> PAGEREF _Toc212932823 \h </w:instrText>
+          <w:instrText xml:space="preserve"> PAGEREF _Toc213004593 \h </w:instrText>
         </w:r>
         <w:r>
           <w:rPr>
@@ -10550,7 +11218,7 @@
             <w:noProof/>
             <w:webHidden/>
           </w:rPr>
-          <w:t>16</w:t>
+          <w:t>18</w:t>
         </w:r>
         <w:r>
           <w:rPr>
@@ -10575,7 +11243,7 @@
           <w14:ligatures w14:val="standardContextual"/>
         </w:rPr>
       </w:pPr>
-      <w:hyperlink w:anchor="_Toc212932824" w:history="1">
+      <w:hyperlink w:anchor="_Toc213004594" w:history="1">
         <w:r>
           <w:rPr>
             <w:rStyle w:val="Hyperlink"/>
@@ -10602,7 +11270,7 @@
             <w:noProof/>
             <w:webHidden/>
           </w:rPr>
-          <w:instrText xml:space="preserve"> PAGEREF _Toc212932824 \h </w:instrText>
+          <w:instrText xml:space="preserve"> PAGEREF _Toc213004594 \h </w:instrText>
         </w:r>
         <w:r>
           <w:rPr>
@@ -10622,7 +11290,7 @@
             <w:noProof/>
             <w:webHidden/>
           </w:rPr>
-          <w:t>16</w:t>
+          <w:t>18</w:t>
         </w:r>
         <w:r>
           <w:rPr>
@@ -10634,12 +11302,84 @@
       </w:hyperlink>
     </w:p>
     <w:p>
+      <w:pPr>
+        <w:pStyle w:val="TableofFigures"/>
+        <w:tabs>
+          <w:tab w:val="right" w:leader="dot" w:pos="9350"/>
+        </w:tabs>
+        <w:rPr>
+          <w:noProof/>
+          <w:kern w:val="2"/>
+          <w:sz w:val="24"/>
+          <w:szCs w:val="24"/>
+          <w14:ligatures w14:val="standardContextual"/>
+        </w:rPr>
+      </w:pPr>
+      <w:hyperlink w:anchor="_Toc213004595" w:history="1">
+        <w:r>
+          <w:rPr>
+            <w:rStyle w:val="Hyperlink"/>
+            <w:noProof/>
+          </w:rPr>
+          <w:t>Figure 7 First steps FAT32 imaging tool</w:t>
+        </w:r>
+        <w:r>
+          <w:rPr>
+            <w:noProof/>
+            <w:webHidden/>
+          </w:rPr>
+          <w:tab/>
+        </w:r>
+        <w:r>
+          <w:rPr>
+            <w:noProof/>
+            <w:webHidden/>
+          </w:rPr>
+          <w:fldChar w:fldCharType="begin"/>
+        </w:r>
+        <w:r>
+          <w:rPr>
+            <w:noProof/>
+            <w:webHidden/>
+          </w:rPr>
+          <w:instrText xml:space="preserve"> PAGEREF _Toc213004595 \h </w:instrText>
+        </w:r>
+        <w:r>
+          <w:rPr>
+            <w:noProof/>
+            <w:webHidden/>
+          </w:rPr>
+        </w:r>
+        <w:r>
+          <w:rPr>
+            <w:noProof/>
+            <w:webHidden/>
+          </w:rPr>
+          <w:fldChar w:fldCharType="separate"/>
+        </w:r>
+        <w:r>
+          <w:rPr>
+            <w:noProof/>
+            <w:webHidden/>
+          </w:rPr>
+          <w:t>19</w:t>
+        </w:r>
+        <w:r>
+          <w:rPr>
+            <w:noProof/>
+            <w:webHidden/>
+          </w:rPr>
+          <w:fldChar w:fldCharType="end"/>
+        </w:r>
+      </w:hyperlink>
+    </w:p>
+    <w:p>
       <w:r>
         <w:fldChar w:fldCharType="end"/>
       </w:r>
     </w:p>
     <w:sectPr>
-      <w:headerReference w:type="default" r:id="rId30"/>
+      <w:headerReference w:type="default" r:id="rId32"/>
       <w:pgSz w:w="12240" w:h="15840"/>
       <w:pgMar w:top="1440" w:right="1440" w:bottom="1440" w:left="1440" w:header="720" w:footer="720" w:gutter="0"/>
       <w:pgNumType w:start="0"/>
@@ -11998,6 +12738,7 @@
   <w:style w:type="character" w:default="1" w:styleId="DefaultParagraphFont">
     <w:name w:val="Default Paragraph Font"/>
     <w:uiPriority w:val="1"/>
+    <w:semiHidden/>
     <w:unhideWhenUsed/>
   </w:style>
   <w:style w:type="table" w:default="1" w:styleId="TableNormal">

</xml_diff>

<commit_message>
FAT image utility progress. Research about boot chain MBR>VBR
</commit_message>
<xml_diff>
--- a/docs/TusMuertos-v2.0-Design.docx
+++ b/docs/TusMuertos-v2.0-Design.docx
@@ -3415,13 +3415,8 @@
         <w:t>/Zig</w:t>
       </w:r>
       <w:r>
-        <w:t xml:space="preserve"> for challenge. NASM assembly for </w:t>
-      </w:r>
-      <w:proofErr w:type="gramStart"/>
-      <w:r>
-        <w:t>bootloader</w:t>
-      </w:r>
-      <w:proofErr w:type="gramEnd"/>
+        <w:t xml:space="preserve"> for challenge. NASM assembly for bootloader</w:t>
+      </w:r>
       <w:r>
         <w:t xml:space="preserve">. </w:t>
       </w:r>
@@ -3658,15 +3653,7 @@
         </w:numPr>
       </w:pPr>
       <w:r>
-        <w:t xml:space="preserve">Image, bin editor, concatenation, elf info, debug, tracer, </w:t>
-      </w:r>
-      <w:proofErr w:type="spellStart"/>
-      <w:r>
-        <w:t>etc</w:t>
-      </w:r>
-      <w:proofErr w:type="spellEnd"/>
-      <w:r>
-        <w:t>……</w:t>
+        <w:t>Image, bin editor, concatenation, elf info, debug, tracer, etc……</w:t>
       </w:r>
     </w:p>
     <w:p/>
@@ -3738,15 +3725,7 @@
         </w:numPr>
       </w:pPr>
       <w:r>
-        <w:t xml:space="preserve">2 Stages. Minimal first stage until Protected mode + Second stage to </w:t>
-      </w:r>
-      <w:proofErr w:type="gramStart"/>
-      <w:r>
-        <w:t>Long</w:t>
-      </w:r>
-      <w:proofErr w:type="gramEnd"/>
-      <w:r>
-        <w:t xml:space="preserve"> mode</w:t>
+        <w:t>2 Stages. Minimal first stage until Protected mode + Second stage to Long mode</w:t>
       </w:r>
     </w:p>
     <w:p>
@@ -3899,7 +3878,6 @@
           <w:numId w:val="1"/>
         </w:numPr>
       </w:pPr>
-      <w:proofErr w:type="gramStart"/>
       <w:r>
         <w:lastRenderedPageBreak/>
         <w:t>Print early status</w:t>
@@ -3913,7 +3891,6 @@
         </w:rPr>
         <w:t>✅</w:t>
       </w:r>
-      <w:proofErr w:type="gramEnd"/>
     </w:p>
     <w:p>
       <w:pPr>
@@ -4009,15 +3986,7 @@
         </w:numPr>
       </w:pPr>
       <w:r>
-        <w:t xml:space="preserve">Jump to Protected mode if Stage1 </w:t>
-      </w:r>
-      <w:proofErr w:type="gramStart"/>
-      <w:r>
-        <w:t>did</w:t>
-      </w:r>
-      <w:proofErr w:type="gramEnd"/>
-      <w:r>
-        <w:t xml:space="preserve"> not change mode.</w:t>
+        <w:t>Jump to Protected mode if Stage1 did not change mode.</w:t>
       </w:r>
     </w:p>
     <w:p>
@@ -4029,23 +3998,7 @@
         </w:numPr>
       </w:pPr>
       <w:r>
-        <w:t xml:space="preserve">Enable </w:t>
-      </w:r>
-      <w:proofErr w:type="gramStart"/>
-      <w:r>
-        <w:t>A20, or</w:t>
-      </w:r>
-      <w:proofErr w:type="gramEnd"/>
-      <w:r>
-        <w:t xml:space="preserve"> at least check. There are multiple strategies for this. Some platforms have fast </w:t>
-      </w:r>
-      <w:proofErr w:type="gramStart"/>
-      <w:r>
-        <w:t>enable</w:t>
-      </w:r>
-      <w:proofErr w:type="gramEnd"/>
-      <w:r>
-        <w:t xml:space="preserve"> 0x92, or they come with A20 already enable. XXXX</w:t>
+        <w:t>Enable A20, or at least check. There are multiple strategies for this. Some platforms have fast enable 0x92, or they come with A20 already enable. XXXX</w:t>
       </w:r>
     </w:p>
     <w:p>
@@ -4069,15 +4022,7 @@
         </w:numPr>
       </w:pPr>
       <w:r>
-        <w:t xml:space="preserve">Gather info for the kernel: Memory, graphics, bios, </w:t>
-      </w:r>
-      <w:proofErr w:type="spellStart"/>
-      <w:r>
-        <w:t>acpi</w:t>
-      </w:r>
-      <w:proofErr w:type="spellEnd"/>
-      <w:r>
-        <w:t>, others…</w:t>
+        <w:t>Gather info for the kernel: Memory, graphics, bios, acpi, others…</w:t>
       </w:r>
     </w:p>
     <w:p>
@@ -4101,15 +4046,7 @@
         </w:numPr>
       </w:pPr>
       <w:r>
-        <w:t xml:space="preserve">Flat binary: Explore this option, </w:t>
-      </w:r>
-      <w:proofErr w:type="gramStart"/>
-      <w:r>
-        <w:t>maybe</w:t>
-      </w:r>
-      <w:proofErr w:type="gramEnd"/>
-      <w:r>
-        <w:t xml:space="preserve"> is simpler</w:t>
+        <w:t>Flat binary: Explore this option, maybe is simpler</w:t>
       </w:r>
     </w:p>
     <w:p>
@@ -4121,15 +4058,7 @@
         </w:numPr>
       </w:pPr>
       <w:r>
-        <w:t xml:space="preserve">ELF: Parser + segments + </w:t>
-      </w:r>
-      <w:proofErr w:type="spellStart"/>
-      <w:r>
-        <w:t>etc</w:t>
-      </w:r>
-      <w:proofErr w:type="spellEnd"/>
-      <w:r>
-        <w:t>…</w:t>
+        <w:t>ELF: Parser + segments + etc…</w:t>
       </w:r>
     </w:p>
     <w:p>
@@ -4165,15 +4094,7 @@
         </w:numPr>
       </w:pPr>
       <w:r>
-        <w:t xml:space="preserve">Verify if long </w:t>
-      </w:r>
-      <w:proofErr w:type="gramStart"/>
-      <w:r>
-        <w:t>mode</w:t>
-      </w:r>
-      <w:proofErr w:type="gramEnd"/>
-      <w:r>
-        <w:t xml:space="preserve"> if possible, for completeness</w:t>
+        <w:t>Verify if long mode if possible, for completeness</w:t>
       </w:r>
     </w:p>
     <w:p>
@@ -4317,15 +4238,7 @@
         </w:numPr>
       </w:pPr>
       <w:r>
-        <w:t>Automate the process of creating a binary image file to load as floppy/</w:t>
-      </w:r>
-      <w:proofErr w:type="spellStart"/>
-      <w:r>
-        <w:t>usb</w:t>
-      </w:r>
-      <w:proofErr w:type="spellEnd"/>
-      <w:r>
-        <w:t>.</w:t>
+        <w:t>Automate the process of creating a binary image file to load as floppy/usb.</w:t>
       </w:r>
     </w:p>
     <w:p>
@@ -4337,15 +4250,7 @@
         </w:numPr>
       </w:pPr>
       <w:r>
-        <w:t xml:space="preserve">It creates an MBR and </w:t>
-      </w:r>
-      <w:proofErr w:type="gramStart"/>
-      <w:r>
-        <w:t>VBR(</w:t>
-      </w:r>
-      <w:proofErr w:type="gramEnd"/>
-      <w:r>
-        <w:t>with BPB) to boot and have a FAT12/16/32 structure</w:t>
+        <w:t>It creates an MBR and VBR(with BPB) to boot and have a FAT12/16/32 structure</w:t>
       </w:r>
     </w:p>
     <w:p>
@@ -4425,21 +4330,175 @@
         </w:numPr>
       </w:pPr>
       <w:r>
-        <w:t xml:space="preserve">Binary Name: </w:t>
-      </w:r>
-      <w:proofErr w:type="spellStart"/>
-      <w:r>
-        <w:t>fatimagecreator</w:t>
-      </w:r>
-      <w:proofErr w:type="spellEnd"/>
-    </w:p>
+        <w:t>Binary Name: fatimagecreator</w:t>
+      </w:r>
+    </w:p>
+    <w:p>
+      <w:pPr>
+        <w:pStyle w:val="ListParagraph"/>
+        <w:numPr>
+          <w:ilvl w:val="0"/>
+          <w:numId w:val="1"/>
+        </w:numPr>
+      </w:pPr>
+      <w:r>
+        <w:t>CLI</w:t>
+      </w:r>
+    </w:p>
+    <w:p>
+      <w:pPr>
+        <w:pStyle w:val="ListParagraph"/>
+        <w:numPr>
+          <w:ilvl w:val="0"/>
+          <w:numId w:val="1"/>
+        </w:numPr>
+      </w:pPr>
+      <w:r>
+        <w:t>Internals:</w:t>
+      </w:r>
+    </w:p>
+    <w:p>
+      <w:pPr>
+        <w:pStyle w:val="ListParagraph"/>
+        <w:numPr>
+          <w:ilvl w:val="1"/>
+          <w:numId w:val="1"/>
+        </w:numPr>
+      </w:pPr>
+      <w:r>
+        <w:t xml:space="preserve">Take the list of arguments and split it on: </w:t>
+      </w:r>
+      <w:r>
+        <w:t xml:space="preserve">sector0.bit </w:t>
+      </w:r>
+      <w:r>
+        <w:t>files_to_add, output file, floppy or hd</w:t>
+      </w:r>
+      <w:r>
+        <w:t>, sector0.bin</w:t>
+      </w:r>
+    </w:p>
+    <w:p>
+      <w:pPr>
+        <w:pStyle w:val="ListParagraph"/>
+        <w:numPr>
+          <w:ilvl w:val="1"/>
+          <w:numId w:val="1"/>
+        </w:numPr>
+      </w:pPr>
+      <w:r>
+        <w:lastRenderedPageBreak/>
+        <w:t>Create a file in the same folder invoking dd</w:t>
+      </w:r>
+      <w:r>
+        <w:t xml:space="preserve"> with the requested size and zeroed out.</w:t>
+      </w:r>
+    </w:p>
+    <w:p>
+      <w:pPr>
+        <w:pStyle w:val="ListParagraph"/>
+        <w:numPr>
+          <w:ilvl w:val="1"/>
+          <w:numId w:val="1"/>
+        </w:numPr>
+      </w:pPr>
+      <w:r>
+        <w:t>For floppy use FAT12, for HD use FAT32</w:t>
+      </w:r>
+    </w:p>
+    <w:p>
+      <w:pPr>
+        <w:pStyle w:val="ListParagraph"/>
+        <w:numPr>
+          <w:ilvl w:val="1"/>
+          <w:numId w:val="1"/>
+        </w:numPr>
+      </w:pPr>
+      <w:r>
+        <w:t>Forge valid FAT descriptors based on format 12/32</w:t>
+      </w:r>
+    </w:p>
+    <w:p>
+      <w:pPr>
+        <w:pStyle w:val="ListParagraph"/>
+        <w:numPr>
+          <w:ilvl w:val="1"/>
+          <w:numId w:val="1"/>
+        </w:numPr>
+      </w:pPr>
+      <w:r>
+        <w:t>Inject the FAT structure on the disk</w:t>
+      </w:r>
+    </w:p>
+    <w:p>
+      <w:pPr>
+        <w:pStyle w:val="ListParagraph"/>
+        <w:numPr>
+          <w:ilvl w:val="1"/>
+          <w:numId w:val="1"/>
+        </w:numPr>
+      </w:pPr>
+      <w:r>
+        <w:t>Inject the sector0.bin on offset 0x00.</w:t>
+      </w:r>
+    </w:p>
+    <w:p>
+      <w:pPr>
+        <w:pStyle w:val="ListParagraph"/>
+        <w:numPr>
+          <w:ilvl w:val="1"/>
+          <w:numId w:val="1"/>
+        </w:numPr>
+      </w:pPr>
+      <w:r>
+        <w:t>Add the list of files.</w:t>
+      </w:r>
+    </w:p>
+    <w:p>
+      <w:r>
+        <w:t>Operation</w:t>
+      </w:r>
+    </w:p>
+    <w:p>
+      <w:pPr>
+        <w:pStyle w:val="ListParagraph"/>
+        <w:numPr>
+          <w:ilvl w:val="0"/>
+          <w:numId w:val="1"/>
+        </w:numPr>
+      </w:pPr>
+      <w:r>
+        <w:t>Use a list of files as arguments and the last is the output file.</w:t>
+      </w:r>
+    </w:p>
+    <w:p>
+      <w:pPr>
+        <w:pStyle w:val="ListParagraph"/>
+        <w:numPr>
+          <w:ilvl w:val="0"/>
+          <w:numId w:val="1"/>
+        </w:numPr>
+      </w:pPr>
+      <w:r>
+        <w:t>F</w:t>
+      </w:r>
+      <w:r>
+        <w:t>atimagecreator</w:t>
+      </w:r>
+      <w:r>
+        <w:t xml:space="preserve"> file01 file02 file03 file03 outputfile.img floppy/hd size_mb(1.44MB/xxxMB</w:t>
+      </w:r>
+      <w:r>
+        <w:t>) bootloader.bin</w:t>
+      </w:r>
+    </w:p>
+    <w:p/>
     <w:p>
       <w:pPr>
         <w:pStyle w:val="Heading1"/>
       </w:pPr>
       <w:bookmarkStart w:id="4" w:name="_Toc213004602"/>
       <w:r>
-        <w:lastRenderedPageBreak/>
         <w:t>Misc and notes</w:t>
       </w:r>
       <w:bookmarkEnd w:id="4"/>
@@ -4598,197 +4657,12 @@
                                 <w:szCs w:val="16"/>
                               </w:rPr>
                             </w:pPr>
-                            <w:proofErr w:type="spellStart"/>
                             <w:r>
                               <w:rPr>
                                 <w:sz w:val="16"/>
                                 <w:szCs w:val="16"/>
                               </w:rPr>
-                              <w:t>display_library</w:t>
-                            </w:r>
-                            <w:proofErr w:type="spellEnd"/>
-                            <w:r>
-                              <w:rPr>
-                                <w:sz w:val="16"/>
-                                <w:szCs w:val="16"/>
-                              </w:rPr>
-                              <w:t>: win32, options="</w:t>
-                            </w:r>
-                            <w:proofErr w:type="spellStart"/>
-                            <w:r>
-                              <w:rPr>
-                                <w:sz w:val="16"/>
-                                <w:szCs w:val="16"/>
-                              </w:rPr>
-                              <w:t>traphotkeys</w:t>
-                            </w:r>
-                            <w:proofErr w:type="spellEnd"/>
-                            <w:r>
-                              <w:rPr>
-                                <w:sz w:val="16"/>
-                                <w:szCs w:val="16"/>
-                              </w:rPr>
-                              <w:t xml:space="preserve">, </w:t>
-                            </w:r>
-                            <w:proofErr w:type="spellStart"/>
-                            <w:r>
-                              <w:rPr>
-                                <w:sz w:val="16"/>
-                                <w:szCs w:val="16"/>
-                              </w:rPr>
-                              <w:t>autoscale</w:t>
-                            </w:r>
-                            <w:proofErr w:type="spellEnd"/>
-                            <w:r>
-                              <w:rPr>
-                                <w:sz w:val="16"/>
-                                <w:szCs w:val="16"/>
-                              </w:rPr>
-                              <w:t xml:space="preserve">, </w:t>
-                            </w:r>
-                            <w:proofErr w:type="spellStart"/>
-                            <w:r>
-                              <w:rPr>
-                                <w:sz w:val="16"/>
-                                <w:szCs w:val="16"/>
-                              </w:rPr>
-                              <w:t>gui_debug</w:t>
-                            </w:r>
-                            <w:proofErr w:type="spellEnd"/>
-                            <w:r>
-                              <w:rPr>
-                                <w:sz w:val="16"/>
-                                <w:szCs w:val="16"/>
-                              </w:rPr>
-                              <w:t>"</w:t>
-                            </w:r>
-                          </w:p>
-                          <w:p>
-                            <w:pPr>
-                              <w:rPr>
-                                <w:sz w:val="16"/>
-                                <w:szCs w:val="16"/>
-                              </w:rPr>
-                            </w:pPr>
-                            <w:proofErr w:type="spellStart"/>
-                            <w:r>
-                              <w:rPr>
-                                <w:sz w:val="16"/>
-                                <w:szCs w:val="16"/>
-                              </w:rPr>
-                              <w:t>cpu</w:t>
-                            </w:r>
-                            <w:proofErr w:type="spellEnd"/>
-                            <w:r>
-                              <w:rPr>
-                                <w:sz w:val="16"/>
-                                <w:szCs w:val="16"/>
-                              </w:rPr>
-                              <w:t xml:space="preserve">: model=core2_penryn_t9600, count=1, </w:t>
-                            </w:r>
-                            <w:proofErr w:type="spellStart"/>
-                            <w:r>
-                              <w:rPr>
-                                <w:sz w:val="16"/>
-                                <w:szCs w:val="16"/>
-                              </w:rPr>
-                              <w:t>ips</w:t>
-                            </w:r>
-                            <w:proofErr w:type="spellEnd"/>
-                            <w:r>
-                              <w:rPr>
-                                <w:sz w:val="16"/>
-                                <w:szCs w:val="16"/>
-                              </w:rPr>
-                              <w:t xml:space="preserve">=50000000, </w:t>
-                            </w:r>
-                            <w:proofErr w:type="spellStart"/>
-                            <w:r>
-                              <w:rPr>
-                                <w:sz w:val="16"/>
-                                <w:szCs w:val="16"/>
-                              </w:rPr>
-                              <w:t>reset_on_triple_fault</w:t>
-                            </w:r>
-                            <w:proofErr w:type="spellEnd"/>
-                            <w:r>
-                              <w:rPr>
-                                <w:sz w:val="16"/>
-                                <w:szCs w:val="16"/>
-                              </w:rPr>
-                              <w:t xml:space="preserve">=1, </w:t>
-                            </w:r>
-                            <w:proofErr w:type="spellStart"/>
-                            <w:r>
-                              <w:rPr>
-                                <w:sz w:val="16"/>
-                                <w:szCs w:val="16"/>
-                              </w:rPr>
-                              <w:t>ignore_bad_msrs</w:t>
-                            </w:r>
-                            <w:proofErr w:type="spellEnd"/>
-                            <w:r>
-                              <w:rPr>
-                                <w:sz w:val="16"/>
-                                <w:szCs w:val="16"/>
-                              </w:rPr>
-                              <w:t xml:space="preserve">=1, </w:t>
-                            </w:r>
-                            <w:proofErr w:type="spellStart"/>
-                            <w:r>
-                              <w:rPr>
-                                <w:sz w:val="16"/>
-                                <w:szCs w:val="16"/>
-                              </w:rPr>
-                              <w:t>msrs</w:t>
-                            </w:r>
-                            <w:proofErr w:type="spellEnd"/>
-                            <w:r>
-                              <w:rPr>
-                                <w:sz w:val="16"/>
-                                <w:szCs w:val="16"/>
-                              </w:rPr>
-                              <w:t>="msrs.def"</w:t>
-                            </w:r>
-                          </w:p>
-                          <w:p>
-                            <w:pPr>
-                              <w:rPr>
-                                <w:sz w:val="16"/>
-                                <w:szCs w:val="16"/>
-                              </w:rPr>
-                            </w:pPr>
-                            <w:proofErr w:type="spellStart"/>
-                            <w:r>
-                              <w:rPr>
-                                <w:sz w:val="16"/>
-                                <w:szCs w:val="16"/>
-                              </w:rPr>
-                              <w:t>cpu</w:t>
-                            </w:r>
-                            <w:proofErr w:type="spellEnd"/>
-                            <w:r>
-                              <w:rPr>
-                                <w:sz w:val="16"/>
-                                <w:szCs w:val="16"/>
-                              </w:rPr>
-                              <w:t xml:space="preserve">: </w:t>
-                            </w:r>
-                            <w:proofErr w:type="spellStart"/>
-                            <w:r>
-                              <w:rPr>
-                                <w:sz w:val="16"/>
-                                <w:szCs w:val="16"/>
-                              </w:rPr>
-                              <w:t>cpuid_limit_winnt</w:t>
-                            </w:r>
-                            <w:proofErr w:type="spellEnd"/>
-                            <w:r>
-                              <w:rPr>
-                                <w:sz w:val="16"/>
-                                <w:szCs w:val="16"/>
-                              </w:rPr>
-                              <w:t>=0</w:t>
+                              <w:t>display_library: win32, options="traphotkeys, autoscale, gui_debug"</w:t>
                             </w:r>
                           </w:p>
                           <w:p>
@@ -4803,122 +4677,8 @@
                                 <w:sz w:val="16"/>
                                 <w:szCs w:val="16"/>
                               </w:rPr>
-                              <w:t xml:space="preserve">memory: guest=512, host=256, </w:t>
+                              <w:t>cpu: model=core2_penryn_t9600, count=1, ips=50000000, reset_on_triple_fault=1, ignore_bad_msrs=1, msrs="msrs.def"</w:t>
                             </w:r>
-                            <w:proofErr w:type="spellStart"/>
-                            <w:r>
-                              <w:rPr>
-                                <w:sz w:val="16"/>
-                                <w:szCs w:val="16"/>
-                              </w:rPr>
-                              <w:t>block_size</w:t>
-                            </w:r>
-                            <w:proofErr w:type="spellEnd"/>
-                            <w:r>
-                              <w:rPr>
-                                <w:sz w:val="16"/>
-                                <w:szCs w:val="16"/>
-                              </w:rPr>
-                              <w:t>=512</w:t>
-                            </w:r>
-                          </w:p>
-                          <w:p>
-                            <w:pPr>
-                              <w:rPr>
-                                <w:sz w:val="16"/>
-                                <w:szCs w:val="16"/>
-                              </w:rPr>
-                            </w:pPr>
-                            <w:proofErr w:type="spellStart"/>
-                            <w:r>
-                              <w:rPr>
-                                <w:sz w:val="16"/>
-                                <w:szCs w:val="16"/>
-                              </w:rPr>
-                              <w:t>romimage</w:t>
-                            </w:r>
-                            <w:proofErr w:type="spellEnd"/>
-                            <w:r>
-                              <w:rPr>
-                                <w:sz w:val="16"/>
-                                <w:szCs w:val="16"/>
-                              </w:rPr>
-                              <w:t>: file=$BXSHARE/BIOS-</w:t>
-                            </w:r>
-                            <w:proofErr w:type="spellStart"/>
-                            <w:r>
-                              <w:rPr>
-                                <w:sz w:val="16"/>
-                                <w:szCs w:val="16"/>
-                              </w:rPr>
-                              <w:t>bochs</w:t>
-                            </w:r>
-                            <w:proofErr w:type="spellEnd"/>
-                            <w:r>
-                              <w:rPr>
-                                <w:sz w:val="16"/>
-                                <w:szCs w:val="16"/>
-                              </w:rPr>
-                              <w:t>-latest, options=</w:t>
-                            </w:r>
-                            <w:proofErr w:type="spellStart"/>
-                            <w:r>
-                              <w:rPr>
-                                <w:sz w:val="16"/>
-                                <w:szCs w:val="16"/>
-                              </w:rPr>
-                              <w:t>fastboot</w:t>
-                            </w:r>
-                            <w:proofErr w:type="spellEnd"/>
-                          </w:p>
-                          <w:p>
-                            <w:pPr>
-                              <w:rPr>
-                                <w:sz w:val="16"/>
-                                <w:szCs w:val="16"/>
-                              </w:rPr>
-                            </w:pPr>
-                            <w:proofErr w:type="spellStart"/>
-                            <w:r>
-                              <w:rPr>
-                                <w:sz w:val="16"/>
-                                <w:szCs w:val="16"/>
-                              </w:rPr>
-                              <w:t>vgaromimage</w:t>
-                            </w:r>
-                            <w:proofErr w:type="spellEnd"/>
-                            <w:r>
-                              <w:rPr>
-                                <w:sz w:val="16"/>
-                                <w:szCs w:val="16"/>
-                              </w:rPr>
-                              <w:t>: file=$BXSHARE/VGABIOS-</w:t>
-                            </w:r>
-                            <w:proofErr w:type="spellStart"/>
-                            <w:r>
-                              <w:rPr>
-                                <w:sz w:val="16"/>
-                                <w:szCs w:val="16"/>
-                              </w:rPr>
-                              <w:t>lgpl</w:t>
-                            </w:r>
-                            <w:proofErr w:type="spellEnd"/>
-                            <w:r>
-                              <w:rPr>
-                                <w:sz w:val="16"/>
-                                <w:szCs w:val="16"/>
-                              </w:rPr>
-                              <w:t>-</w:t>
-                            </w:r>
-                            <w:proofErr w:type="spellStart"/>
-                            <w:r>
-                              <w:rPr>
-                                <w:sz w:val="16"/>
-                                <w:szCs w:val="16"/>
-                              </w:rPr>
-                              <w:t>latest.bin</w:t>
-                            </w:r>
-                            <w:proofErr w:type="spellEnd"/>
                           </w:p>
                           <w:p>
                             <w:pPr>
@@ -4932,23 +4692,67 @@
                                 <w:sz w:val="16"/>
                                 <w:szCs w:val="16"/>
                               </w:rPr>
-                              <w:t xml:space="preserve">keyboard: type=mf, </w:t>
+                              <w:t>cpu: cpuid_limit_winnt=0</w:t>
                             </w:r>
-                            <w:proofErr w:type="spellStart"/>
+                          </w:p>
+                          <w:p>
+                            <w:pPr>
+                              <w:rPr>
+                                <w:sz w:val="16"/>
+                                <w:szCs w:val="16"/>
+                              </w:rPr>
+                            </w:pPr>
                             <w:r>
                               <w:rPr>
                                 <w:sz w:val="16"/>
                                 <w:szCs w:val="16"/>
                               </w:rPr>
-                              <w:t>serial_delay</w:t>
+                              <w:t>memory: guest=512, host=256, block_size=512</w:t>
                             </w:r>
-                            <w:proofErr w:type="spellEnd"/>
+                          </w:p>
+                          <w:p>
+                            <w:pPr>
+                              <w:rPr>
+                                <w:sz w:val="16"/>
+                                <w:szCs w:val="16"/>
+                              </w:rPr>
+                            </w:pPr>
                             <w:r>
                               <w:rPr>
                                 <w:sz w:val="16"/>
                                 <w:szCs w:val="16"/>
                               </w:rPr>
-                              <w:t>=150</w:t>
+                              <w:t>romimage: file=$BXSHARE/BIOS-bochs-latest, options=fastboot</w:t>
+                            </w:r>
+                          </w:p>
+                          <w:p>
+                            <w:pPr>
+                              <w:rPr>
+                                <w:sz w:val="16"/>
+                                <w:szCs w:val="16"/>
+                              </w:rPr>
+                            </w:pPr>
+                            <w:r>
+                              <w:rPr>
+                                <w:sz w:val="16"/>
+                                <w:szCs w:val="16"/>
+                              </w:rPr>
+                              <w:t>vgaromimage: file=$BXSHARE/VGABIOS-lgpl-latest.bin</w:t>
+                            </w:r>
+                          </w:p>
+                          <w:p>
+                            <w:pPr>
+                              <w:rPr>
+                                <w:sz w:val="16"/>
+                                <w:szCs w:val="16"/>
+                              </w:rPr>
+                            </w:pPr>
+                            <w:r>
+                              <w:rPr>
+                                <w:sz w:val="16"/>
+                                <w:szCs w:val="16"/>
+                              </w:rPr>
+                              <w:t>keyboard: type=mf, serial_delay=150</w:t>
                             </w:r>
                           </w:p>
                           <w:p>
@@ -4973,21 +4777,12 @@
                                 <w:szCs w:val="16"/>
                               </w:rPr>
                             </w:pPr>
-                            <w:proofErr w:type="spellStart"/>
                             <w:r>
                               <w:rPr>
                                 <w:sz w:val="16"/>
                                 <w:szCs w:val="16"/>
                               </w:rPr>
-                              <w:t>pci</w:t>
-                            </w:r>
-                            <w:proofErr w:type="spellEnd"/>
-                            <w:r>
-                              <w:rPr>
-                                <w:sz w:val="16"/>
-                                <w:szCs w:val="16"/>
-                              </w:rPr>
-                              <w:t>: enabled=1, chipset=i440fx</w:t>
+                              <w:t>pci: enabled=1, chipset=i440fx</w:t>
                             </w:r>
                           </w:p>
                           <w:p>
@@ -4997,21 +4792,12 @@
                                 <w:szCs w:val="16"/>
                               </w:rPr>
                             </w:pPr>
-                            <w:proofErr w:type="spellStart"/>
                             <w:r>
                               <w:rPr>
                                 <w:sz w:val="16"/>
                                 <w:szCs w:val="16"/>
                               </w:rPr>
-                              <w:t>private_colormap</w:t>
-                            </w:r>
-                            <w:proofErr w:type="spellEnd"/>
-                            <w:r>
-                              <w:rPr>
-                                <w:sz w:val="16"/>
-                                <w:szCs w:val="16"/>
-                              </w:rPr>
-                              <w:t>: enabled=0</w:t>
+                              <w:t>private_colormap: enabled=0</w:t>
                             </w:r>
                           </w:p>
                           <w:p>
@@ -5021,37 +4807,12 @@
                                 <w:szCs w:val="16"/>
                               </w:rPr>
                             </w:pPr>
-                            <w:proofErr w:type="spellStart"/>
                             <w:r>
                               <w:rPr>
                                 <w:sz w:val="16"/>
                                 <w:szCs w:val="16"/>
                               </w:rPr>
-                              <w:t>floppya</w:t>
-                            </w:r>
-                            <w:proofErr w:type="spellEnd"/>
-                            <w:r>
-                              <w:rPr>
-                                <w:sz w:val="16"/>
-                                <w:szCs w:val="16"/>
-                              </w:rPr>
-                              <w:t xml:space="preserve">: 1_44=C:\Users\mihe\Dropbox\TusMuertOS-Oct2025\src\build\floppy.img, status=inserted, </w:t>
-                            </w:r>
-                            <w:proofErr w:type="spellStart"/>
-                            <w:r>
-                              <w:rPr>
-                                <w:sz w:val="16"/>
-                                <w:szCs w:val="16"/>
-                              </w:rPr>
-                              <w:t>write_protected</w:t>
-                            </w:r>
-                            <w:proofErr w:type="spellEnd"/>
-                            <w:r>
-                              <w:rPr>
-                                <w:sz w:val="16"/>
-                                <w:szCs w:val="16"/>
-                              </w:rPr>
-                              <w:t>=1</w:t>
+                              <w:t>floppya: 1_44=C:\Users\mihe\Dropbox\TusMuertOS-Oct2025\src\build\floppy.img, status=inserted, write_protected=1</w:t>
                             </w:r>
                           </w:p>
                           <w:p>
@@ -5076,21 +4837,12 @@
                                 <w:szCs w:val="16"/>
                               </w:rPr>
                             </w:pPr>
-                            <w:proofErr w:type="spellStart"/>
                             <w:r>
                               <w:rPr>
                                 <w:sz w:val="16"/>
                                 <w:szCs w:val="16"/>
                               </w:rPr>
-                              <w:t>floppy_bootsig_check</w:t>
-                            </w:r>
-                            <w:proofErr w:type="spellEnd"/>
-                            <w:r>
-                              <w:rPr>
-                                <w:sz w:val="16"/>
-                                <w:szCs w:val="16"/>
-                              </w:rPr>
-                              <w:t>: disabled=0</w:t>
+                              <w:t>floppy_bootsig_check: disabled=0</w:t>
                             </w:r>
                           </w:p>
                           <w:p>
@@ -5165,63 +4917,7 @@
                                 <w:sz w:val="16"/>
                                 <w:szCs w:val="16"/>
                               </w:rPr>
-                              <w:t xml:space="preserve">debug: action=ignore, </w:t>
-                            </w:r>
-                            <w:proofErr w:type="spellStart"/>
-                            <w:r>
-                              <w:rPr>
-                                <w:sz w:val="16"/>
-                                <w:szCs w:val="16"/>
-                              </w:rPr>
-                              <w:t>pci</w:t>
-                            </w:r>
-                            <w:proofErr w:type="spellEnd"/>
-                            <w:r>
-                              <w:rPr>
-                                <w:sz w:val="16"/>
-                                <w:szCs w:val="16"/>
-                              </w:rPr>
-                              <w:t>=report # report BX_DEBUG from module '</w:t>
-                            </w:r>
-                            <w:proofErr w:type="spellStart"/>
-                            <w:r>
-                              <w:rPr>
-                                <w:sz w:val="16"/>
-                                <w:szCs w:val="16"/>
-                              </w:rPr>
-                              <w:t>pci</w:t>
-                            </w:r>
-                            <w:proofErr w:type="spellEnd"/>
-                            <w:r>
-                              <w:rPr>
-                                <w:sz w:val="16"/>
-                                <w:szCs w:val="16"/>
-                              </w:rPr>
-                              <w:t>'</w:t>
-                            </w:r>
-                          </w:p>
-                          <w:p>
-                            <w:pPr>
-                              <w:rPr>
-                                <w:sz w:val="16"/>
-                                <w:szCs w:val="16"/>
-                              </w:rPr>
-                            </w:pPr>
-                            <w:proofErr w:type="spellStart"/>
-                            <w:r>
-                              <w:rPr>
-                                <w:sz w:val="16"/>
-                                <w:szCs w:val="16"/>
-                              </w:rPr>
-                              <w:t>debugger_log</w:t>
-                            </w:r>
-                            <w:proofErr w:type="spellEnd"/>
-                            <w:r>
-                              <w:rPr>
-                                <w:sz w:val="16"/>
-                                <w:szCs w:val="16"/>
-                              </w:rPr>
-                              <w:t>: -</w:t>
+                              <w:t>debug: action=ignore, pci=report # report BX_DEBUG from module 'pci'</w:t>
                             </w:r>
                           </w:p>
                           <w:p>
@@ -5236,23 +4932,7 @@
                                 <w:sz w:val="16"/>
                                 <w:szCs w:val="16"/>
                               </w:rPr>
-                              <w:t>parport1: enabled=1, file="</w:t>
-                            </w:r>
-                            <w:proofErr w:type="spellStart"/>
-                            <w:r>
-                              <w:rPr>
-                                <w:sz w:val="16"/>
-                                <w:szCs w:val="16"/>
-                              </w:rPr>
-                              <w:t>parport.out</w:t>
-                            </w:r>
-                            <w:proofErr w:type="spellEnd"/>
-                            <w:r>
-                              <w:rPr>
-                                <w:sz w:val="16"/>
-                                <w:szCs w:val="16"/>
-                              </w:rPr>
-                              <w:t>"</w:t>
+                              <w:t>debugger_log: -</w:t>
                             </w:r>
                           </w:p>
                           <w:p>
@@ -5267,55 +4947,22 @@
                                 <w:sz w:val="16"/>
                                 <w:szCs w:val="16"/>
                               </w:rPr>
-                              <w:t xml:space="preserve">sound: driver=default, </w:t>
+                              <w:t>parport1: enabled=1, file="parport.out"</w:t>
                             </w:r>
-                            <w:proofErr w:type="spellStart"/>
+                          </w:p>
+                          <w:p>
+                            <w:pPr>
+                              <w:rPr>
+                                <w:sz w:val="16"/>
+                                <w:szCs w:val="16"/>
+                              </w:rPr>
+                            </w:pPr>
                             <w:r>
                               <w:rPr>
                                 <w:sz w:val="16"/>
                                 <w:szCs w:val="16"/>
                               </w:rPr>
-                              <w:t>waveout</w:t>
-                            </w:r>
-                            <w:proofErr w:type="spellEnd"/>
-                            <w:r>
-                              <w:rPr>
-                                <w:sz w:val="16"/>
-                                <w:szCs w:val="16"/>
-                              </w:rPr>
-                              <w:t xml:space="preserve">=/dev/dsp. </w:t>
-                            </w:r>
-                            <w:proofErr w:type="spellStart"/>
-                            <w:r>
-                              <w:rPr>
-                                <w:sz w:val="16"/>
-                                <w:szCs w:val="16"/>
-                              </w:rPr>
-                              <w:t>wavein</w:t>
-                            </w:r>
-                            <w:proofErr w:type="spellEnd"/>
-                            <w:r>
-                              <w:rPr>
-                                <w:sz w:val="16"/>
-                                <w:szCs w:val="16"/>
-                              </w:rPr>
-                              <w:t xml:space="preserve">=, </w:t>
-                            </w:r>
-                            <w:proofErr w:type="spellStart"/>
-                            <w:r>
-                              <w:rPr>
-                                <w:sz w:val="16"/>
-                                <w:szCs w:val="16"/>
-                              </w:rPr>
-                              <w:t>midiout</w:t>
-                            </w:r>
-                            <w:proofErr w:type="spellEnd"/>
-                            <w:r>
-                              <w:rPr>
-                                <w:sz w:val="16"/>
-                                <w:szCs w:val="16"/>
-                              </w:rPr>
-                              <w:t>=</w:t>
+                              <w:t>sound: driver=default, waveout=/dev/dsp. wavein=, midiout=</w:t>
                             </w:r>
                           </w:p>
                           <w:p>
@@ -5340,21 +4987,12 @@
                                 <w:szCs w:val="16"/>
                               </w:rPr>
                             </w:pPr>
-                            <w:proofErr w:type="spellStart"/>
                             <w:r>
                               <w:rPr>
                                 <w:sz w:val="16"/>
                                 <w:szCs w:val="16"/>
                               </w:rPr>
-                              <w:t>magic_break</w:t>
-                            </w:r>
-                            <w:proofErr w:type="spellEnd"/>
-                            <w:r>
-                              <w:rPr>
-                                <w:sz w:val="16"/>
-                                <w:szCs w:val="16"/>
-                              </w:rPr>
-                              <w:t>: enabled=1</w:t>
+                              <w:t>magic_break: enabled=1</w:t>
                             </w:r>
                           </w:p>
                           <w:p>
@@ -5398,197 +5036,12 @@
                           <w:szCs w:val="16"/>
                         </w:rPr>
                       </w:pPr>
-                      <w:proofErr w:type="spellStart"/>
                       <w:r>
                         <w:rPr>
                           <w:sz w:val="16"/>
                           <w:szCs w:val="16"/>
                         </w:rPr>
-                        <w:t>display_library</w:t>
-                      </w:r>
-                      <w:proofErr w:type="spellEnd"/>
-                      <w:r>
-                        <w:rPr>
-                          <w:sz w:val="16"/>
-                          <w:szCs w:val="16"/>
-                        </w:rPr>
-                        <w:t>: win32, options="</w:t>
-                      </w:r>
-                      <w:proofErr w:type="spellStart"/>
-                      <w:r>
-                        <w:rPr>
-                          <w:sz w:val="16"/>
-                          <w:szCs w:val="16"/>
-                        </w:rPr>
-                        <w:t>traphotkeys</w:t>
-                      </w:r>
-                      <w:proofErr w:type="spellEnd"/>
-                      <w:r>
-                        <w:rPr>
-                          <w:sz w:val="16"/>
-                          <w:szCs w:val="16"/>
-                        </w:rPr>
-                        <w:t xml:space="preserve">, </w:t>
-                      </w:r>
-                      <w:proofErr w:type="spellStart"/>
-                      <w:r>
-                        <w:rPr>
-                          <w:sz w:val="16"/>
-                          <w:szCs w:val="16"/>
-                        </w:rPr>
-                        <w:t>autoscale</w:t>
-                      </w:r>
-                      <w:proofErr w:type="spellEnd"/>
-                      <w:r>
-                        <w:rPr>
-                          <w:sz w:val="16"/>
-                          <w:szCs w:val="16"/>
-                        </w:rPr>
-                        <w:t xml:space="preserve">, </w:t>
-                      </w:r>
-                      <w:proofErr w:type="spellStart"/>
-                      <w:r>
-                        <w:rPr>
-                          <w:sz w:val="16"/>
-                          <w:szCs w:val="16"/>
-                        </w:rPr>
-                        <w:t>gui_debug</w:t>
-                      </w:r>
-                      <w:proofErr w:type="spellEnd"/>
-                      <w:r>
-                        <w:rPr>
-                          <w:sz w:val="16"/>
-                          <w:szCs w:val="16"/>
-                        </w:rPr>
-                        <w:t>"</w:t>
-                      </w:r>
-                    </w:p>
-                    <w:p>
-                      <w:pPr>
-                        <w:rPr>
-                          <w:sz w:val="16"/>
-                          <w:szCs w:val="16"/>
-                        </w:rPr>
-                      </w:pPr>
-                      <w:proofErr w:type="spellStart"/>
-                      <w:r>
-                        <w:rPr>
-                          <w:sz w:val="16"/>
-                          <w:szCs w:val="16"/>
-                        </w:rPr>
-                        <w:t>cpu</w:t>
-                      </w:r>
-                      <w:proofErr w:type="spellEnd"/>
-                      <w:r>
-                        <w:rPr>
-                          <w:sz w:val="16"/>
-                          <w:szCs w:val="16"/>
-                        </w:rPr>
-                        <w:t xml:space="preserve">: model=core2_penryn_t9600, count=1, </w:t>
-                      </w:r>
-                      <w:proofErr w:type="spellStart"/>
-                      <w:r>
-                        <w:rPr>
-                          <w:sz w:val="16"/>
-                          <w:szCs w:val="16"/>
-                        </w:rPr>
-                        <w:t>ips</w:t>
-                      </w:r>
-                      <w:proofErr w:type="spellEnd"/>
-                      <w:r>
-                        <w:rPr>
-                          <w:sz w:val="16"/>
-                          <w:szCs w:val="16"/>
-                        </w:rPr>
-                        <w:t xml:space="preserve">=50000000, </w:t>
-                      </w:r>
-                      <w:proofErr w:type="spellStart"/>
-                      <w:r>
-                        <w:rPr>
-                          <w:sz w:val="16"/>
-                          <w:szCs w:val="16"/>
-                        </w:rPr>
-                        <w:t>reset_on_triple_fault</w:t>
-                      </w:r>
-                      <w:proofErr w:type="spellEnd"/>
-                      <w:r>
-                        <w:rPr>
-                          <w:sz w:val="16"/>
-                          <w:szCs w:val="16"/>
-                        </w:rPr>
-                        <w:t xml:space="preserve">=1, </w:t>
-                      </w:r>
-                      <w:proofErr w:type="spellStart"/>
-                      <w:r>
-                        <w:rPr>
-                          <w:sz w:val="16"/>
-                          <w:szCs w:val="16"/>
-                        </w:rPr>
-                        <w:t>ignore_bad_msrs</w:t>
-                      </w:r>
-                      <w:proofErr w:type="spellEnd"/>
-                      <w:r>
-                        <w:rPr>
-                          <w:sz w:val="16"/>
-                          <w:szCs w:val="16"/>
-                        </w:rPr>
-                        <w:t xml:space="preserve">=1, </w:t>
-                      </w:r>
-                      <w:proofErr w:type="spellStart"/>
-                      <w:r>
-                        <w:rPr>
-                          <w:sz w:val="16"/>
-                          <w:szCs w:val="16"/>
-                        </w:rPr>
-                        <w:t>msrs</w:t>
-                      </w:r>
-                      <w:proofErr w:type="spellEnd"/>
-                      <w:r>
-                        <w:rPr>
-                          <w:sz w:val="16"/>
-                          <w:szCs w:val="16"/>
-                        </w:rPr>
-                        <w:t>="msrs.def"</w:t>
-                      </w:r>
-                    </w:p>
-                    <w:p>
-                      <w:pPr>
-                        <w:rPr>
-                          <w:sz w:val="16"/>
-                          <w:szCs w:val="16"/>
-                        </w:rPr>
-                      </w:pPr>
-                      <w:proofErr w:type="spellStart"/>
-                      <w:r>
-                        <w:rPr>
-                          <w:sz w:val="16"/>
-                          <w:szCs w:val="16"/>
-                        </w:rPr>
-                        <w:t>cpu</w:t>
-                      </w:r>
-                      <w:proofErr w:type="spellEnd"/>
-                      <w:r>
-                        <w:rPr>
-                          <w:sz w:val="16"/>
-                          <w:szCs w:val="16"/>
-                        </w:rPr>
-                        <w:t xml:space="preserve">: </w:t>
-                      </w:r>
-                      <w:proofErr w:type="spellStart"/>
-                      <w:r>
-                        <w:rPr>
-                          <w:sz w:val="16"/>
-                          <w:szCs w:val="16"/>
-                        </w:rPr>
-                        <w:t>cpuid_limit_winnt</w:t>
-                      </w:r>
-                      <w:proofErr w:type="spellEnd"/>
-                      <w:r>
-                        <w:rPr>
-                          <w:sz w:val="16"/>
-                          <w:szCs w:val="16"/>
-                        </w:rPr>
-                        <w:t>=0</w:t>
+                        <w:t>display_library: win32, options="traphotkeys, autoscale, gui_debug"</w:t>
                       </w:r>
                     </w:p>
                     <w:p>
@@ -5603,122 +5056,8 @@
                           <w:sz w:val="16"/>
                           <w:szCs w:val="16"/>
                         </w:rPr>
-                        <w:t xml:space="preserve">memory: guest=512, host=256, </w:t>
+                        <w:t>cpu: model=core2_penryn_t9600, count=1, ips=50000000, reset_on_triple_fault=1, ignore_bad_msrs=1, msrs="msrs.def"</w:t>
                       </w:r>
-                      <w:proofErr w:type="spellStart"/>
-                      <w:r>
-                        <w:rPr>
-                          <w:sz w:val="16"/>
-                          <w:szCs w:val="16"/>
-                        </w:rPr>
-                        <w:t>block_size</w:t>
-                      </w:r>
-                      <w:proofErr w:type="spellEnd"/>
-                      <w:r>
-                        <w:rPr>
-                          <w:sz w:val="16"/>
-                          <w:szCs w:val="16"/>
-                        </w:rPr>
-                        <w:t>=512</w:t>
-                      </w:r>
-                    </w:p>
-                    <w:p>
-                      <w:pPr>
-                        <w:rPr>
-                          <w:sz w:val="16"/>
-                          <w:szCs w:val="16"/>
-                        </w:rPr>
-                      </w:pPr>
-                      <w:proofErr w:type="spellStart"/>
-                      <w:r>
-                        <w:rPr>
-                          <w:sz w:val="16"/>
-                          <w:szCs w:val="16"/>
-                        </w:rPr>
-                        <w:t>romimage</w:t>
-                      </w:r>
-                      <w:proofErr w:type="spellEnd"/>
-                      <w:r>
-                        <w:rPr>
-                          <w:sz w:val="16"/>
-                          <w:szCs w:val="16"/>
-                        </w:rPr>
-                        <w:t>: file=$BXSHARE/BIOS-</w:t>
-                      </w:r>
-                      <w:proofErr w:type="spellStart"/>
-                      <w:r>
-                        <w:rPr>
-                          <w:sz w:val="16"/>
-                          <w:szCs w:val="16"/>
-                        </w:rPr>
-                        <w:t>bochs</w:t>
-                      </w:r>
-                      <w:proofErr w:type="spellEnd"/>
-                      <w:r>
-                        <w:rPr>
-                          <w:sz w:val="16"/>
-                          <w:szCs w:val="16"/>
-                        </w:rPr>
-                        <w:t>-latest, options=</w:t>
-                      </w:r>
-                      <w:proofErr w:type="spellStart"/>
-                      <w:r>
-                        <w:rPr>
-                          <w:sz w:val="16"/>
-                          <w:szCs w:val="16"/>
-                        </w:rPr>
-                        <w:t>fastboot</w:t>
-                      </w:r>
-                      <w:proofErr w:type="spellEnd"/>
-                    </w:p>
-                    <w:p>
-                      <w:pPr>
-                        <w:rPr>
-                          <w:sz w:val="16"/>
-                          <w:szCs w:val="16"/>
-                        </w:rPr>
-                      </w:pPr>
-                      <w:proofErr w:type="spellStart"/>
-                      <w:r>
-                        <w:rPr>
-                          <w:sz w:val="16"/>
-                          <w:szCs w:val="16"/>
-                        </w:rPr>
-                        <w:t>vgaromimage</w:t>
-                      </w:r>
-                      <w:proofErr w:type="spellEnd"/>
-                      <w:r>
-                        <w:rPr>
-                          <w:sz w:val="16"/>
-                          <w:szCs w:val="16"/>
-                        </w:rPr>
-                        <w:t>: file=$BXSHARE/VGABIOS-</w:t>
-                      </w:r>
-                      <w:proofErr w:type="spellStart"/>
-                      <w:r>
-                        <w:rPr>
-                          <w:sz w:val="16"/>
-                          <w:szCs w:val="16"/>
-                        </w:rPr>
-                        <w:t>lgpl</w:t>
-                      </w:r>
-                      <w:proofErr w:type="spellEnd"/>
-                      <w:r>
-                        <w:rPr>
-                          <w:sz w:val="16"/>
-                          <w:szCs w:val="16"/>
-                        </w:rPr>
-                        <w:t>-</w:t>
-                      </w:r>
-                      <w:proofErr w:type="spellStart"/>
-                      <w:r>
-                        <w:rPr>
-                          <w:sz w:val="16"/>
-                          <w:szCs w:val="16"/>
-                        </w:rPr>
-                        <w:t>latest.bin</w:t>
-                      </w:r>
-                      <w:proofErr w:type="spellEnd"/>
                     </w:p>
                     <w:p>
                       <w:pPr>
@@ -5732,23 +5071,67 @@
                           <w:sz w:val="16"/>
                           <w:szCs w:val="16"/>
                         </w:rPr>
-                        <w:t xml:space="preserve">keyboard: type=mf, </w:t>
+                        <w:t>cpu: cpuid_limit_winnt=0</w:t>
                       </w:r>
-                      <w:proofErr w:type="spellStart"/>
+                    </w:p>
+                    <w:p>
+                      <w:pPr>
+                        <w:rPr>
+                          <w:sz w:val="16"/>
+                          <w:szCs w:val="16"/>
+                        </w:rPr>
+                      </w:pPr>
                       <w:r>
                         <w:rPr>
                           <w:sz w:val="16"/>
                           <w:szCs w:val="16"/>
                         </w:rPr>
-                        <w:t>serial_delay</w:t>
+                        <w:t>memory: guest=512, host=256, block_size=512</w:t>
                       </w:r>
-                      <w:proofErr w:type="spellEnd"/>
+                    </w:p>
+                    <w:p>
+                      <w:pPr>
+                        <w:rPr>
+                          <w:sz w:val="16"/>
+                          <w:szCs w:val="16"/>
+                        </w:rPr>
+                      </w:pPr>
                       <w:r>
                         <w:rPr>
                           <w:sz w:val="16"/>
                           <w:szCs w:val="16"/>
                         </w:rPr>
-                        <w:t>=150</w:t>
+                        <w:t>romimage: file=$BXSHARE/BIOS-bochs-latest, options=fastboot</w:t>
+                      </w:r>
+                    </w:p>
+                    <w:p>
+                      <w:pPr>
+                        <w:rPr>
+                          <w:sz w:val="16"/>
+                          <w:szCs w:val="16"/>
+                        </w:rPr>
+                      </w:pPr>
+                      <w:r>
+                        <w:rPr>
+                          <w:sz w:val="16"/>
+                          <w:szCs w:val="16"/>
+                        </w:rPr>
+                        <w:t>vgaromimage: file=$BXSHARE/VGABIOS-lgpl-latest.bin</w:t>
+                      </w:r>
+                    </w:p>
+                    <w:p>
+                      <w:pPr>
+                        <w:rPr>
+                          <w:sz w:val="16"/>
+                          <w:szCs w:val="16"/>
+                        </w:rPr>
+                      </w:pPr>
+                      <w:r>
+                        <w:rPr>
+                          <w:sz w:val="16"/>
+                          <w:szCs w:val="16"/>
+                        </w:rPr>
+                        <w:t>keyboard: type=mf, serial_delay=150</w:t>
                       </w:r>
                     </w:p>
                     <w:p>
@@ -5773,21 +5156,12 @@
                           <w:szCs w:val="16"/>
                         </w:rPr>
                       </w:pPr>
-                      <w:proofErr w:type="spellStart"/>
                       <w:r>
                         <w:rPr>
                           <w:sz w:val="16"/>
                           <w:szCs w:val="16"/>
                         </w:rPr>
-                        <w:t>pci</w:t>
-                      </w:r>
-                      <w:proofErr w:type="spellEnd"/>
-                      <w:r>
-                        <w:rPr>
-                          <w:sz w:val="16"/>
-                          <w:szCs w:val="16"/>
-                        </w:rPr>
-                        <w:t>: enabled=1, chipset=i440fx</w:t>
+                        <w:t>pci: enabled=1, chipset=i440fx</w:t>
                       </w:r>
                     </w:p>
                     <w:p>
@@ -5797,21 +5171,12 @@
                           <w:szCs w:val="16"/>
                         </w:rPr>
                       </w:pPr>
-                      <w:proofErr w:type="spellStart"/>
                       <w:r>
                         <w:rPr>
                           <w:sz w:val="16"/>
                           <w:szCs w:val="16"/>
                         </w:rPr>
-                        <w:t>private_colormap</w:t>
-                      </w:r>
-                      <w:proofErr w:type="spellEnd"/>
-                      <w:r>
-                        <w:rPr>
-                          <w:sz w:val="16"/>
-                          <w:szCs w:val="16"/>
-                        </w:rPr>
-                        <w:t>: enabled=0</w:t>
+                        <w:t>private_colormap: enabled=0</w:t>
                       </w:r>
                     </w:p>
                     <w:p>
@@ -5821,37 +5186,12 @@
                           <w:szCs w:val="16"/>
                         </w:rPr>
                       </w:pPr>
-                      <w:proofErr w:type="spellStart"/>
                       <w:r>
                         <w:rPr>
                           <w:sz w:val="16"/>
                           <w:szCs w:val="16"/>
                         </w:rPr>
-                        <w:t>floppya</w:t>
-                      </w:r>
-                      <w:proofErr w:type="spellEnd"/>
-                      <w:r>
-                        <w:rPr>
-                          <w:sz w:val="16"/>
-                          <w:szCs w:val="16"/>
-                        </w:rPr>
-                        <w:t xml:space="preserve">: 1_44=C:\Users\mihe\Dropbox\TusMuertOS-Oct2025\src\build\floppy.img, status=inserted, </w:t>
-                      </w:r>
-                      <w:proofErr w:type="spellStart"/>
-                      <w:r>
-                        <w:rPr>
-                          <w:sz w:val="16"/>
-                          <w:szCs w:val="16"/>
-                        </w:rPr>
-                        <w:t>write_protected</w:t>
-                      </w:r>
-                      <w:proofErr w:type="spellEnd"/>
-                      <w:r>
-                        <w:rPr>
-                          <w:sz w:val="16"/>
-                          <w:szCs w:val="16"/>
-                        </w:rPr>
-                        <w:t>=1</w:t>
+                        <w:t>floppya: 1_44=C:\Users\mihe\Dropbox\TusMuertOS-Oct2025\src\build\floppy.img, status=inserted, write_protected=1</w:t>
                       </w:r>
                     </w:p>
                     <w:p>
@@ -5876,21 +5216,12 @@
                           <w:szCs w:val="16"/>
                         </w:rPr>
                       </w:pPr>
-                      <w:proofErr w:type="spellStart"/>
                       <w:r>
                         <w:rPr>
                           <w:sz w:val="16"/>
                           <w:szCs w:val="16"/>
                         </w:rPr>
-                        <w:t>floppy_bootsig_check</w:t>
-                      </w:r>
-                      <w:proofErr w:type="spellEnd"/>
-                      <w:r>
-                        <w:rPr>
-                          <w:sz w:val="16"/>
-                          <w:szCs w:val="16"/>
-                        </w:rPr>
-                        <w:t>: disabled=0</w:t>
+                        <w:t>floppy_bootsig_check: disabled=0</w:t>
                       </w:r>
                     </w:p>
                     <w:p>
@@ -5965,63 +5296,7 @@
                           <w:sz w:val="16"/>
                           <w:szCs w:val="16"/>
                         </w:rPr>
-                        <w:t xml:space="preserve">debug: action=ignore, </w:t>
-                      </w:r>
-                      <w:proofErr w:type="spellStart"/>
-                      <w:r>
-                        <w:rPr>
-                          <w:sz w:val="16"/>
-                          <w:szCs w:val="16"/>
-                        </w:rPr>
-                        <w:t>pci</w:t>
-                      </w:r>
-                      <w:proofErr w:type="spellEnd"/>
-                      <w:r>
-                        <w:rPr>
-                          <w:sz w:val="16"/>
-                          <w:szCs w:val="16"/>
-                        </w:rPr>
-                        <w:t>=report # report BX_DEBUG from module '</w:t>
-                      </w:r>
-                      <w:proofErr w:type="spellStart"/>
-                      <w:r>
-                        <w:rPr>
-                          <w:sz w:val="16"/>
-                          <w:szCs w:val="16"/>
-                        </w:rPr>
-                        <w:t>pci</w:t>
-                      </w:r>
-                      <w:proofErr w:type="spellEnd"/>
-                      <w:r>
-                        <w:rPr>
-                          <w:sz w:val="16"/>
-                          <w:szCs w:val="16"/>
-                        </w:rPr>
-                        <w:t>'</w:t>
-                      </w:r>
-                    </w:p>
-                    <w:p>
-                      <w:pPr>
-                        <w:rPr>
-                          <w:sz w:val="16"/>
-                          <w:szCs w:val="16"/>
-                        </w:rPr>
-                      </w:pPr>
-                      <w:proofErr w:type="spellStart"/>
-                      <w:r>
-                        <w:rPr>
-                          <w:sz w:val="16"/>
-                          <w:szCs w:val="16"/>
-                        </w:rPr>
-                        <w:t>debugger_log</w:t>
-                      </w:r>
-                      <w:proofErr w:type="spellEnd"/>
-                      <w:r>
-                        <w:rPr>
-                          <w:sz w:val="16"/>
-                          <w:szCs w:val="16"/>
-                        </w:rPr>
-                        <w:t>: -</w:t>
+                        <w:t>debug: action=ignore, pci=report # report BX_DEBUG from module 'pci'</w:t>
                       </w:r>
                     </w:p>
                     <w:p>
@@ -6036,23 +5311,7 @@
                           <w:sz w:val="16"/>
                           <w:szCs w:val="16"/>
                         </w:rPr>
-                        <w:t>parport1: enabled=1, file="</w:t>
-                      </w:r>
-                      <w:proofErr w:type="spellStart"/>
-                      <w:r>
-                        <w:rPr>
-                          <w:sz w:val="16"/>
-                          <w:szCs w:val="16"/>
-                        </w:rPr>
-                        <w:t>parport.out</w:t>
-                      </w:r>
-                      <w:proofErr w:type="spellEnd"/>
-                      <w:r>
-                        <w:rPr>
-                          <w:sz w:val="16"/>
-                          <w:szCs w:val="16"/>
-                        </w:rPr>
-                        <w:t>"</w:t>
+                        <w:t>debugger_log: -</w:t>
                       </w:r>
                     </w:p>
                     <w:p>
@@ -6067,55 +5326,22 @@
                           <w:sz w:val="16"/>
                           <w:szCs w:val="16"/>
                         </w:rPr>
-                        <w:t xml:space="preserve">sound: driver=default, </w:t>
+                        <w:t>parport1: enabled=1, file="parport.out"</w:t>
                       </w:r>
-                      <w:proofErr w:type="spellStart"/>
+                    </w:p>
+                    <w:p>
+                      <w:pPr>
+                        <w:rPr>
+                          <w:sz w:val="16"/>
+                          <w:szCs w:val="16"/>
+                        </w:rPr>
+                      </w:pPr>
                       <w:r>
                         <w:rPr>
                           <w:sz w:val="16"/>
                           <w:szCs w:val="16"/>
                         </w:rPr>
-                        <w:t>waveout</w:t>
-                      </w:r>
-                      <w:proofErr w:type="spellEnd"/>
-                      <w:r>
-                        <w:rPr>
-                          <w:sz w:val="16"/>
-                          <w:szCs w:val="16"/>
-                        </w:rPr>
-                        <w:t xml:space="preserve">=/dev/dsp. </w:t>
-                      </w:r>
-                      <w:proofErr w:type="spellStart"/>
-                      <w:r>
-                        <w:rPr>
-                          <w:sz w:val="16"/>
-                          <w:szCs w:val="16"/>
-                        </w:rPr>
-                        <w:t>wavein</w:t>
-                      </w:r>
-                      <w:proofErr w:type="spellEnd"/>
-                      <w:r>
-                        <w:rPr>
-                          <w:sz w:val="16"/>
-                          <w:szCs w:val="16"/>
-                        </w:rPr>
-                        <w:t xml:space="preserve">=, </w:t>
-                      </w:r>
-                      <w:proofErr w:type="spellStart"/>
-                      <w:r>
-                        <w:rPr>
-                          <w:sz w:val="16"/>
-                          <w:szCs w:val="16"/>
-                        </w:rPr>
-                        <w:t>midiout</w:t>
-                      </w:r>
-                      <w:proofErr w:type="spellEnd"/>
-                      <w:r>
-                        <w:rPr>
-                          <w:sz w:val="16"/>
-                          <w:szCs w:val="16"/>
-                        </w:rPr>
-                        <w:t>=</w:t>
+                        <w:t>sound: driver=default, waveout=/dev/dsp. wavein=, midiout=</w:t>
                       </w:r>
                     </w:p>
                     <w:p>
@@ -6140,21 +5366,12 @@
                           <w:szCs w:val="16"/>
                         </w:rPr>
                       </w:pPr>
-                      <w:proofErr w:type="spellStart"/>
                       <w:r>
                         <w:rPr>
                           <w:sz w:val="16"/>
                           <w:szCs w:val="16"/>
                         </w:rPr>
-                        <w:t>magic_break</w:t>
-                      </w:r>
-                      <w:proofErr w:type="spellEnd"/>
-                      <w:r>
-                        <w:rPr>
-                          <w:sz w:val="16"/>
-                          <w:szCs w:val="16"/>
-                        </w:rPr>
-                        <w:t>: enabled=1</w:t>
+                        <w:t>magic_break: enabled=1</w:t>
                       </w:r>
                     </w:p>
                     <w:p>
@@ -6225,15 +5442,7 @@
         </w:numPr>
       </w:pPr>
       <w:r>
-        <w:t>Non-partitioned storage, such as floppy, use VBR. First sector, physical C/H/S 0,0,</w:t>
-      </w:r>
-      <w:proofErr w:type="gramStart"/>
-      <w:r>
-        <w:t>1 .</w:t>
-      </w:r>
-      <w:proofErr w:type="gramEnd"/>
-      <w:r>
-        <w:t xml:space="preserve"> Note the sector counting </w:t>
+        <w:t xml:space="preserve">Non-partitioned storage, such as floppy, use VBR. First sector, physical C/H/S 0,0,1 . Note the sector counting </w:t>
       </w:r>
       <w:r>
         <w:t>begins</w:t>
@@ -6262,13 +5471,8 @@
           <w:numId w:val="1"/>
         </w:numPr>
       </w:pPr>
-      <w:proofErr w:type="spellStart"/>
-      <w:r>
-        <w:t>Formated</w:t>
-      </w:r>
-      <w:proofErr w:type="spellEnd"/>
-      <w:r>
-        <w:t xml:space="preserve"> a USB drive:</w:t>
+      <w:r>
+        <w:t>Formated a USB drive:</w:t>
       </w:r>
     </w:p>
     <w:p>
@@ -6340,15 +5544,7 @@
         </w:numPr>
       </w:pPr>
       <w:r>
-        <w:t xml:space="preserve">Open the Disk using </w:t>
-      </w:r>
-      <w:proofErr w:type="spellStart"/>
-      <w:r>
-        <w:t>HxD</w:t>
-      </w:r>
-      <w:proofErr w:type="spellEnd"/>
-      <w:r>
-        <w:t xml:space="preserve"> (Open disk option is brilliant!)</w:t>
+        <w:t>Open the Disk using HxD (Open disk option is brilliant!)</w:t>
       </w:r>
     </w:p>
     <w:p>
@@ -6366,21 +5562,8 @@
         <w:t>, sector 2048 contains the BPB of a partition.</w:t>
       </w:r>
       <w:r>
-        <w:t xml:space="preserve"> Both can be </w:t>
-      </w:r>
-      <w:proofErr w:type="gramStart"/>
-      <w:r>
-        <w:t>see</w:t>
-      </w:r>
-      <w:proofErr w:type="gramEnd"/>
-      <w:r>
-        <w:t xml:space="preserve"> easily using </w:t>
-      </w:r>
-      <w:proofErr w:type="spellStart"/>
-      <w:r>
-        <w:t>HxD</w:t>
-      </w:r>
-      <w:proofErr w:type="spellEnd"/>
+        <w:t xml:space="preserve"> Both can be see easily using HxD</w:t>
+      </w:r>
     </w:p>
     <w:p>
       <w:pPr>
@@ -6391,15 +5574,7 @@
         </w:numPr>
       </w:pPr>
       <w:r>
-        <w:t xml:space="preserve">Partition information </w:t>
-      </w:r>
-      <w:proofErr w:type="gramStart"/>
-      <w:r>
-        <w:t>extracted</w:t>
-      </w:r>
-      <w:proofErr w:type="gramEnd"/>
-      <w:r>
-        <w:t xml:space="preserve"> from the 4x16 bytes before the boot magic number. The first value begins at </w:t>
+        <w:t xml:space="preserve">Partition information extracted from the 4x16 bytes before the boot magic number. The first value begins at </w:t>
       </w:r>
       <w:r>
         <w:t>0x1BE</w:t>
@@ -6417,23 +5592,7 @@
         </w:numPr>
       </w:pPr>
       <w:r>
-        <w:t xml:space="preserve">Exported first 512 to a file using </w:t>
-      </w:r>
-      <w:proofErr w:type="spellStart"/>
-      <w:r>
-        <w:t>HxD</w:t>
-      </w:r>
-      <w:proofErr w:type="spellEnd"/>
-      <w:r>
-        <w:t xml:space="preserve">, then used </w:t>
-      </w:r>
-      <w:proofErr w:type="spellStart"/>
-      <w:r>
-        <w:t>ImHEx</w:t>
-      </w:r>
-      <w:proofErr w:type="spellEnd"/>
-      <w:r>
-        <w:t xml:space="preserve"> disassembler feature to see the code. 16bits-x86-LitteEndian.</w:t>
+        <w:t>Exported first 512 to a file using HxD, then used ImHEx disassembler feature to see the code. 16bits-x86-LitteEndian.</w:t>
       </w:r>
     </w:p>
     <w:p>
@@ -6570,13 +5729,8 @@
       <w:r>
         <w:t xml:space="preserve"> Dissection of the first partition using ChatGPT. </w:t>
       </w:r>
-      <w:proofErr w:type="gramStart"/>
-      <w:r>
-        <w:t>Is</w:t>
-      </w:r>
-      <w:proofErr w:type="gramEnd"/>
-      <w:r>
-        <w:t xml:space="preserve"> correct?</w:t>
+      <w:r>
+        <w:t>Is correct?</w:t>
       </w:r>
       <w:bookmarkEnd w:id="9"/>
     </w:p>
@@ -6805,7 +5959,6 @@
       <w:r>
         <w:t>Invoke explorer Windows using “</w:t>
       </w:r>
-      <w:proofErr w:type="gramStart"/>
       <w:r>
         <w:rPr>
           <w:b/>
@@ -6813,7 +5966,6 @@
         </w:rPr>
         <w:t>explorer.exe .</w:t>
       </w:r>
-      <w:proofErr w:type="gramEnd"/>
       <w:r>
         <w:t>”</w:t>
       </w:r>
@@ -6955,13 +6107,8 @@
           <w:bCs/>
         </w:rPr>
       </w:pPr>
-      <w:proofErr w:type="gramStart"/>
-      <w:r>
-        <w:t>Also</w:t>
-      </w:r>
-      <w:proofErr w:type="gramEnd"/>
-      <w:r>
-        <w:t xml:space="preserve"> you can net use </w:t>
+      <w:r>
+        <w:t xml:space="preserve">Also you can net use </w:t>
       </w:r>
       <w:r>
         <w:rPr>
@@ -7006,79 +6153,37 @@
       <w:r>
         <w:t>Example: “</w:t>
       </w:r>
-      <w:proofErr w:type="spellStart"/>
       <w:r>
         <w:rPr>
           <w:b/>
           <w:bCs/>
         </w:rPr>
-        <w:t>wsl</w:t>
-      </w:r>
-      <w:proofErr w:type="spellEnd"/>
+        <w:t>wsl ls -la</w:t>
+      </w:r>
+      <w:r>
+        <w:t>”</w:t>
+      </w:r>
+      <w:r>
+        <w:t xml:space="preserve"> will output Windos folder but using Linux ls</w:t>
+      </w:r>
+    </w:p>
+    <w:p>
+      <w:pPr>
+        <w:pStyle w:val="ListParagraph"/>
+        <w:numPr>
+          <w:ilvl w:val="3"/>
+          <w:numId w:val="1"/>
+        </w:numPr>
+      </w:pPr>
+      <w:r>
+        <w:t xml:space="preserve">Example: </w:t>
+      </w:r>
       <w:r>
         <w:rPr>
           <w:b/>
           <w:bCs/>
         </w:rPr>
-        <w:t xml:space="preserve"> ls -la</w:t>
-      </w:r>
-      <w:r>
-        <w:t>”</w:t>
-      </w:r>
-      <w:r>
-        <w:t xml:space="preserve"> will output </w:t>
-      </w:r>
-      <w:proofErr w:type="spellStart"/>
-      <w:r>
-        <w:t>Windos</w:t>
-      </w:r>
-      <w:proofErr w:type="spellEnd"/>
-      <w:r>
-        <w:t xml:space="preserve"> folder but using Linux ls</w:t>
-      </w:r>
-    </w:p>
-    <w:p>
-      <w:pPr>
-        <w:pStyle w:val="ListParagraph"/>
-        <w:numPr>
-          <w:ilvl w:val="3"/>
-          <w:numId w:val="1"/>
-        </w:numPr>
-      </w:pPr>
-      <w:r>
-        <w:t xml:space="preserve">Example: </w:t>
-      </w:r>
-      <w:proofErr w:type="spellStart"/>
-      <w:r>
-        <w:rPr>
-          <w:b/>
-          <w:bCs/>
-        </w:rPr>
-        <w:t>wsl</w:t>
-      </w:r>
-      <w:proofErr w:type="spellEnd"/>
-      <w:r>
-        <w:rPr>
-          <w:b/>
-          <w:bCs/>
-        </w:rPr>
-        <w:t xml:space="preserve"> ls -la | </w:t>
-      </w:r>
-      <w:proofErr w:type="spellStart"/>
-      <w:r>
-        <w:rPr>
-          <w:b/>
-          <w:bCs/>
-        </w:rPr>
-        <w:t>findstr</w:t>
-      </w:r>
-      <w:proofErr w:type="spellEnd"/>
-      <w:r>
-        <w:rPr>
-          <w:b/>
-          <w:bCs/>
-        </w:rPr>
-        <w:t xml:space="preserve"> "git"</w:t>
+        <w:t>wsl ls -la | findstr "git"</w:t>
       </w:r>
     </w:p>
     <w:p>
@@ -7192,15 +6297,7 @@
         </w:numPr>
       </w:pPr>
       <w:r>
-        <w:t xml:space="preserve">sudo apt </w:t>
-      </w:r>
-      <w:proofErr w:type="spellStart"/>
-      <w:r>
-        <w:t>autoremove</w:t>
-      </w:r>
-      <w:proofErr w:type="spellEnd"/>
-      <w:r>
-        <w:t xml:space="preserve"> -y</w:t>
+        <w:t>sudo apt autoremove -y</w:t>
       </w:r>
     </w:p>
     <w:p>
@@ -7227,15 +6324,7 @@
         </w:numPr>
       </w:pPr>
       <w:r>
-        <w:t xml:space="preserve">sudo apt install </w:t>
-      </w:r>
-      <w:proofErr w:type="spellStart"/>
-      <w:r>
-        <w:t>nasm</w:t>
-      </w:r>
-      <w:proofErr w:type="spellEnd"/>
-      <w:r>
-        <w:t xml:space="preserve"> -y</w:t>
+        <w:t>sudo apt install nasm -y</w:t>
       </w:r>
     </w:p>
     <w:p>
@@ -7247,15 +6336,7 @@
         </w:numPr>
       </w:pPr>
       <w:r>
-        <w:t xml:space="preserve">Install </w:t>
-      </w:r>
-      <w:proofErr w:type="spellStart"/>
-      <w:r>
-        <w:t>bximage</w:t>
-      </w:r>
-      <w:proofErr w:type="spellEnd"/>
-      <w:r>
-        <w:t>:</w:t>
+        <w:t>Install bximage:</w:t>
       </w:r>
     </w:p>
     <w:p>
@@ -7267,13 +6348,8 @@
         </w:numPr>
       </w:pPr>
       <w:r>
-        <w:t xml:space="preserve">sudo apt install </w:t>
-      </w:r>
-      <w:proofErr w:type="spellStart"/>
-      <w:r>
-        <w:t>bximage</w:t>
-      </w:r>
-      <w:proofErr w:type="spellEnd"/>
+        <w:t>sudo apt install bximage</w:t>
+      </w:r>
     </w:p>
     <w:p>
       <w:pPr>
@@ -7308,23 +6384,7 @@
         </w:numPr>
       </w:pPr>
       <w:r>
-        <w:t xml:space="preserve">Create a temporary alias for </w:t>
-      </w:r>
-      <w:proofErr w:type="spellStart"/>
-      <w:r>
-        <w:t>cls</w:t>
-      </w:r>
-      <w:proofErr w:type="spellEnd"/>
-      <w:r>
-        <w:t xml:space="preserve"> = </w:t>
-      </w:r>
-      <w:proofErr w:type="gramStart"/>
-      <w:r>
-        <w:t>clear(</w:t>
-      </w:r>
-      <w:proofErr w:type="gramEnd"/>
-      <w:r>
-        <w:t>investigate how to make it permanent)</w:t>
+        <w:t>Create a temporary alias for cls = clear(investigate how to make it permanent)</w:t>
       </w:r>
     </w:p>
     <w:p>
@@ -7336,15 +6396,7 @@
         </w:numPr>
       </w:pPr>
       <w:r>
-        <w:t xml:space="preserve">alias </w:t>
-      </w:r>
-      <w:proofErr w:type="spellStart"/>
-      <w:r>
-        <w:t>cls</w:t>
-      </w:r>
-      <w:proofErr w:type="spellEnd"/>
-      <w:r>
-        <w:t>='clear'</w:t>
+        <w:t>alias cls='clear'</w:t>
       </w:r>
     </w:p>
     <w:p>
@@ -7356,15 +6408,7 @@
         </w:numPr>
       </w:pPr>
       <w:r>
-        <w:t xml:space="preserve">Install </w:t>
-      </w:r>
-      <w:proofErr w:type="spellStart"/>
-      <w:r>
-        <w:t>qemu</w:t>
-      </w:r>
-      <w:proofErr w:type="spellEnd"/>
-      <w:r>
-        <w:t xml:space="preserve"> on Windows: </w:t>
+        <w:t xml:space="preserve">Install qemu on Windows: </w:t>
       </w:r>
       <w:hyperlink r:id="rId15" w:history="1">
         <w:r>
@@ -7448,15 +6492,7 @@
         </w:numPr>
       </w:pPr>
       <w:r>
-        <w:t xml:space="preserve">Install </w:t>
-      </w:r>
-      <w:proofErr w:type="spellStart"/>
-      <w:r>
-        <w:t>gcc</w:t>
-      </w:r>
-      <w:proofErr w:type="spellEnd"/>
-      <w:r>
-        <w:t xml:space="preserve"> on WSL:</w:t>
+        <w:t>Install gcc on WSL:</w:t>
       </w:r>
     </w:p>
     <w:p>
@@ -7468,13 +6504,8 @@
         </w:numPr>
       </w:pPr>
       <w:r>
-        <w:t xml:space="preserve">Sudo apt install </w:t>
-      </w:r>
-      <w:proofErr w:type="spellStart"/>
-      <w:r>
-        <w:t>gcc</w:t>
-      </w:r>
-      <w:proofErr w:type="spellEnd"/>
+        <w:t>Sudo apt install gcc</w:t>
+      </w:r>
     </w:p>
     <w:p>
       <w:pPr>
@@ -7485,15 +6516,7 @@
         </w:numPr>
       </w:pPr>
       <w:r>
-        <w:t xml:space="preserve">Install build-essential and </w:t>
-      </w:r>
-      <w:proofErr w:type="spellStart"/>
-      <w:r>
-        <w:t>gdb</w:t>
-      </w:r>
-      <w:proofErr w:type="spellEnd"/>
-      <w:r>
-        <w:t>:</w:t>
+        <w:t>Install build-essential and gdb:</w:t>
       </w:r>
     </w:p>
     <w:p>
@@ -7505,13 +6528,8 @@
         </w:numPr>
       </w:pPr>
       <w:r>
-        <w:t xml:space="preserve">sudo apt-get install build-essential </w:t>
-      </w:r>
-      <w:proofErr w:type="spellStart"/>
-      <w:r>
-        <w:t>gdb</w:t>
-      </w:r>
-      <w:proofErr w:type="spellEnd"/>
+        <w:t>sudo apt-get install build-essential gdb</w:t>
+      </w:r>
     </w:p>
     <w:p>
       <w:pPr>
@@ -7545,13 +6563,8 @@
           <w:numId w:val="1"/>
         </w:numPr>
       </w:pPr>
-      <w:proofErr w:type="spellStart"/>
-      <w:r>
-        <w:t>wsl</w:t>
-      </w:r>
-      <w:proofErr w:type="spellEnd"/>
-      <w:r>
-        <w:t xml:space="preserve"> </w:t>
+      <w:r>
+        <w:t xml:space="preserve">wsl </w:t>
       </w:r>
       <w:r>
         <w:t>–</w:t>
@@ -7568,13 +6581,8 @@
           <w:numId w:val="1"/>
         </w:numPr>
       </w:pPr>
-      <w:proofErr w:type="spellStart"/>
-      <w:r>
-        <w:t>wsl</w:t>
-      </w:r>
-      <w:proofErr w:type="spellEnd"/>
-      <w:r>
-        <w:t xml:space="preserve"> </w:t>
+      <w:r>
+        <w:t xml:space="preserve">wsl </w:t>
       </w:r>
       <w:r>
         <w:t>–</w:t>
@@ -7667,16 +6675,11 @@
           <w:numId w:val="1"/>
         </w:numPr>
       </w:pPr>
-      <w:proofErr w:type="gramStart"/>
       <w:r>
         <w:t>Actually,</w:t>
       </w:r>
       <w:r>
-        <w:t xml:space="preserve"> what</w:t>
-      </w:r>
-      <w:proofErr w:type="gramEnd"/>
-      <w:r>
-        <w:t xml:space="preserve"> worked was [interop] </w:t>
+        <w:t xml:space="preserve"> what worked was [interop] </w:t>
       </w:r>
       <w:r>
         <w:t>appendWindowsPath=false</w:t>
@@ -7715,13 +6718,8 @@
         </w:numPr>
       </w:pPr>
       <w:r>
-        <w:t xml:space="preserve">Now using </w:t>
-      </w:r>
-      <w:proofErr w:type="gramStart"/>
-      <w:r>
-        <w:t>code .</w:t>
-      </w:r>
-      <w:proofErr w:type="gramEnd"/>
+        <w:t>Now using code .</w:t>
+      </w:r>
       <w:r>
         <w:t xml:space="preserve"> will open native, with a warning.</w:t>
       </w:r>
@@ -7750,31 +6748,10 @@
         </w:numPr>
       </w:pPr>
       <w:r>
-        <w:t xml:space="preserve">sudo apt install -y </w:t>
-      </w:r>
-      <w:proofErr w:type="spellStart"/>
-      <w:r>
-        <w:t>firefox</w:t>
-      </w:r>
-      <w:proofErr w:type="spellEnd"/>
-      <w:r>
-        <w:t xml:space="preserve"> (to complete the </w:t>
-      </w:r>
-      <w:proofErr w:type="spellStart"/>
-      <w:r>
-        <w:t>oauth</w:t>
-      </w:r>
-      <w:proofErr w:type="spellEnd"/>
-      <w:r>
-        <w:t xml:space="preserve"> </w:t>
-      </w:r>
-      <w:proofErr w:type="spellStart"/>
-      <w:r>
-        <w:t>github</w:t>
-      </w:r>
-      <w:proofErr w:type="spellEnd"/>
-      <w:r>
-        <w:t xml:space="preserve"> auth)</w:t>
+        <w:t>sudo apt install -y firefox</w:t>
+      </w:r>
+      <w:r>
+        <w:t xml:space="preserve"> (to complete the oauth github auth)</w:t>
       </w:r>
     </w:p>
     <w:p>
@@ -7786,15 +6763,7 @@
         </w:numPr>
       </w:pPr>
       <w:r>
-        <w:t xml:space="preserve">Prepare </w:t>
-      </w:r>
-      <w:proofErr w:type="spellStart"/>
-      <w:r>
-        <w:t>vscode</w:t>
-      </w:r>
-      <w:proofErr w:type="spellEnd"/>
-      <w:r>
-        <w:t xml:space="preserve"> on Linux for c:</w:t>
+        <w:t>Prepare vscode on Linux for c:</w:t>
       </w:r>
     </w:p>
     <w:p>
@@ -7806,13 +6775,8 @@
         </w:numPr>
       </w:pPr>
       <w:r>
-        <w:t xml:space="preserve">Create a launch and tasks </w:t>
-      </w:r>
-      <w:proofErr w:type="spellStart"/>
-      <w:r>
-        <w:t>jsons</w:t>
-      </w:r>
-      <w:proofErr w:type="spellEnd"/>
+        <w:t>Create a launch and tasks jsons</w:t>
+      </w:r>
       <w:r>
         <w:t>.</w:t>
       </w:r>
@@ -7922,23 +6886,7 @@
         </w:numPr>
       </w:pPr>
       <w:r>
-        <w:t xml:space="preserve">            "</w:t>
-      </w:r>
-      <w:proofErr w:type="spellStart"/>
-      <w:r>
-        <w:t>preLaunchTask</w:t>
-      </w:r>
-      <w:proofErr w:type="spellEnd"/>
-      <w:r>
-        <w:t xml:space="preserve">": "C/C++: </w:t>
-      </w:r>
-      <w:proofErr w:type="spellStart"/>
-      <w:r>
-        <w:t>gcc</w:t>
-      </w:r>
-      <w:proofErr w:type="spellEnd"/>
-      <w:r>
-        <w:t xml:space="preserve"> build active file",</w:t>
+        <w:t xml:space="preserve">            "preLaunchTask": "C/C++: gcc build active file",</w:t>
       </w:r>
     </w:p>
     <w:p>
@@ -7950,15 +6898,7 @@
         </w:numPr>
       </w:pPr>
       <w:r>
-        <w:t xml:space="preserve">            "name": "(</w:t>
-      </w:r>
-      <w:proofErr w:type="spellStart"/>
-      <w:r>
-        <w:t>gdb</w:t>
-      </w:r>
-      <w:proofErr w:type="spellEnd"/>
-      <w:r>
-        <w:t>) Launch",</w:t>
+        <w:t xml:space="preserve">            "name": "(gdb) Launch",</w:t>
       </w:r>
     </w:p>
     <w:p>
@@ -7970,15 +6910,7 @@
         </w:numPr>
       </w:pPr>
       <w:r>
-        <w:t xml:space="preserve">            "type": "</w:t>
-      </w:r>
-      <w:proofErr w:type="spellStart"/>
-      <w:r>
-        <w:t>cppdbg</w:t>
-      </w:r>
-      <w:proofErr w:type="spellEnd"/>
-      <w:r>
-        <w:t>",</w:t>
+        <w:t xml:space="preserve">            "type": "cppdbg",</w:t>
       </w:r>
     </w:p>
     <w:p>
@@ -8002,23 +6934,7 @@
         </w:numPr>
       </w:pPr>
       <w:r>
-        <w:t xml:space="preserve">            "program": "${</w:t>
-      </w:r>
-      <w:proofErr w:type="spellStart"/>
-      <w:r>
-        <w:t>fileDirname</w:t>
-      </w:r>
-      <w:proofErr w:type="spellEnd"/>
-      <w:r>
-        <w:t>}/${</w:t>
-      </w:r>
-      <w:proofErr w:type="spellStart"/>
-      <w:r>
-        <w:t>fileBasenameNoExtension</w:t>
-      </w:r>
-      <w:proofErr w:type="spellEnd"/>
-      <w:r>
-        <w:t>}",</w:t>
+        <w:t xml:space="preserve">            "program": "${fileDirname}/${fileBasenameNoExtension}",</w:t>
       </w:r>
     </w:p>
     <w:p>
@@ -8030,15 +6946,7 @@
         </w:numPr>
       </w:pPr>
       <w:r>
-        <w:t xml:space="preserve">            "</w:t>
-      </w:r>
-      <w:proofErr w:type="spellStart"/>
-      <w:r>
-        <w:t>args</w:t>
-      </w:r>
-      <w:proofErr w:type="spellEnd"/>
-      <w:r>
-        <w:t>": [</w:t>
+        <w:t xml:space="preserve">            "args": [</w:t>
       </w:r>
     </w:p>
     <w:p>
@@ -8050,15 +6958,7 @@
         </w:numPr>
       </w:pPr>
       <w:r>
-        <w:t xml:space="preserve">                "</w:t>
-      </w:r>
-      <w:proofErr w:type="spellStart"/>
-      <w:r>
-        <w:t>aaaaa</w:t>
-      </w:r>
-      <w:proofErr w:type="spellEnd"/>
-      <w:r>
-        <w:t>",</w:t>
+        <w:t xml:space="preserve">                "aaaaa",</w:t>
       </w:r>
     </w:p>
     <w:p>
@@ -8070,15 +6970,7 @@
         </w:numPr>
       </w:pPr>
       <w:r>
-        <w:t xml:space="preserve">                "</w:t>
-      </w:r>
-      <w:proofErr w:type="spellStart"/>
-      <w:r>
-        <w:t>bbbbb</w:t>
-      </w:r>
-      <w:proofErr w:type="spellEnd"/>
-      <w:r>
-        <w:t>",</w:t>
+        <w:t xml:space="preserve">                "bbbbb",</w:t>
       </w:r>
     </w:p>
     <w:p>
@@ -8090,15 +6982,7 @@
         </w:numPr>
       </w:pPr>
       <w:r>
-        <w:t xml:space="preserve">                "</w:t>
-      </w:r>
-      <w:proofErr w:type="spellStart"/>
-      <w:r>
-        <w:t>ccccc</w:t>
-      </w:r>
-      <w:proofErr w:type="spellEnd"/>
-      <w:r>
-        <w:t>"</w:t>
+        <w:t xml:space="preserve">                "ccccc"</w:t>
       </w:r>
     </w:p>
     <w:p>
@@ -8122,15 +7006,7 @@
         </w:numPr>
       </w:pPr>
       <w:r>
-        <w:t xml:space="preserve">            "</w:t>
-      </w:r>
-      <w:proofErr w:type="spellStart"/>
-      <w:r>
-        <w:t>stopAtEntry</w:t>
-      </w:r>
-      <w:proofErr w:type="spellEnd"/>
-      <w:r>
-        <w:t>": false,</w:t>
+        <w:t xml:space="preserve">            "stopAtEntry": false,</w:t>
       </w:r>
     </w:p>
     <w:p>
@@ -8142,23 +7018,7 @@
         </w:numPr>
       </w:pPr>
       <w:r>
-        <w:t xml:space="preserve">            "</w:t>
-      </w:r>
-      <w:proofErr w:type="spellStart"/>
-      <w:r>
-        <w:t>cwd</w:t>
-      </w:r>
-      <w:proofErr w:type="spellEnd"/>
-      <w:r>
-        <w:t>": "${</w:t>
-      </w:r>
-      <w:proofErr w:type="spellStart"/>
-      <w:r>
-        <w:t>fileDirname</w:t>
-      </w:r>
-      <w:proofErr w:type="spellEnd"/>
-      <w:r>
-        <w:t>}",</w:t>
+        <w:t xml:space="preserve">            "cwd": "${fileDirname}",</w:t>
       </w:r>
     </w:p>
     <w:p>
@@ -8182,15 +7042,7 @@
         </w:numPr>
       </w:pPr>
       <w:r>
-        <w:t xml:space="preserve">            "</w:t>
-      </w:r>
-      <w:proofErr w:type="spellStart"/>
-      <w:r>
-        <w:t>externalConsole</w:t>
-      </w:r>
-      <w:proofErr w:type="spellEnd"/>
-      <w:r>
-        <w:t>": false,</w:t>
+        <w:t xml:space="preserve">            "externalConsole": false,</w:t>
       </w:r>
     </w:p>
     <w:p>
@@ -8202,23 +7054,7 @@
         </w:numPr>
       </w:pPr>
       <w:r>
-        <w:t xml:space="preserve">            "</w:t>
-      </w:r>
-      <w:proofErr w:type="spellStart"/>
-      <w:r>
-        <w:t>MIMode</w:t>
-      </w:r>
-      <w:proofErr w:type="spellEnd"/>
-      <w:r>
-        <w:t>": "</w:t>
-      </w:r>
-      <w:proofErr w:type="spellStart"/>
-      <w:r>
-        <w:t>gdb</w:t>
-      </w:r>
-      <w:proofErr w:type="spellEnd"/>
-      <w:r>
-        <w:t>",</w:t>
+        <w:t xml:space="preserve">            "MIMode": "gdb",</w:t>
       </w:r>
     </w:p>
     <w:p>
@@ -8230,15 +7066,7 @@
         </w:numPr>
       </w:pPr>
       <w:r>
-        <w:t xml:space="preserve">            "</w:t>
-      </w:r>
-      <w:proofErr w:type="spellStart"/>
-      <w:r>
-        <w:t>setupCommands</w:t>
-      </w:r>
-      <w:proofErr w:type="spellEnd"/>
-      <w:r>
-        <w:t>": [</w:t>
+        <w:t xml:space="preserve">            "setupCommands": [</w:t>
       </w:r>
     </w:p>
     <w:p>
@@ -8262,15 +7090,7 @@
         </w:numPr>
       </w:pPr>
       <w:r>
-        <w:t xml:space="preserve">                    "description": "Enable pretty-printing for </w:t>
-      </w:r>
-      <w:proofErr w:type="spellStart"/>
-      <w:r>
-        <w:t>gdb</w:t>
-      </w:r>
-      <w:proofErr w:type="spellEnd"/>
-      <w:r>
-        <w:t>",</w:t>
+        <w:t xml:space="preserve">                    "description": "Enable pretty-printing for gdb",</w:t>
       </w:r>
     </w:p>
     <w:p>
@@ -8294,15 +7114,7 @@
         </w:numPr>
       </w:pPr>
       <w:r>
-        <w:t xml:space="preserve">                    "</w:t>
-      </w:r>
-      <w:proofErr w:type="spellStart"/>
-      <w:r>
-        <w:t>ignoreFailures</w:t>
-      </w:r>
-      <w:proofErr w:type="spellEnd"/>
-      <w:r>
-        <w:t>": true</w:t>
+        <w:t xml:space="preserve">                    "ignoreFailures": true</w:t>
       </w:r>
     </w:p>
     <w:p>
@@ -8350,15 +7162,7 @@
         </w:numPr>
       </w:pPr>
       <w:r>
-        <w:t xml:space="preserve">                    "text": "-</w:t>
-      </w:r>
-      <w:proofErr w:type="spellStart"/>
-      <w:r>
-        <w:t>gdb</w:t>
-      </w:r>
-      <w:proofErr w:type="spellEnd"/>
-      <w:r>
-        <w:t>-set disassembly-flavor intel",</w:t>
+        <w:t xml:space="preserve">                    "text": "-gdb-set disassembly-flavor intel",</w:t>
       </w:r>
     </w:p>
     <w:p>
@@ -8370,15 +7174,7 @@
         </w:numPr>
       </w:pPr>
       <w:r>
-        <w:t xml:space="preserve">                    "</w:t>
-      </w:r>
-      <w:proofErr w:type="spellStart"/>
-      <w:r>
-        <w:t>ignoreFailures</w:t>
-      </w:r>
-      <w:proofErr w:type="spellEnd"/>
-      <w:r>
-        <w:t>": true</w:t>
+        <w:t xml:space="preserve">                    "ignoreFailures": true</w:t>
       </w:r>
     </w:p>
     <w:p>
@@ -8487,15 +7283,7 @@
         </w:numPr>
       </w:pPr>
       <w:r>
-        <w:t xml:space="preserve">            "type": "</w:t>
-      </w:r>
-      <w:proofErr w:type="spellStart"/>
-      <w:r>
-        <w:t>cppbuild</w:t>
-      </w:r>
-      <w:proofErr w:type="spellEnd"/>
-      <w:r>
-        <w:t>",</w:t>
+        <w:t xml:space="preserve">            "type": "cppbuild",</w:t>
       </w:r>
     </w:p>
     <w:p>
@@ -8507,15 +7295,7 @@
         </w:numPr>
       </w:pPr>
       <w:r>
-        <w:t xml:space="preserve">            "label": "C/C++: </w:t>
-      </w:r>
-      <w:proofErr w:type="spellStart"/>
-      <w:r>
-        <w:t>gcc</w:t>
-      </w:r>
-      <w:proofErr w:type="spellEnd"/>
-      <w:r>
-        <w:t xml:space="preserve"> build active file",</w:t>
+        <w:t xml:space="preserve">            "label": "C/C++: gcc build active file",</w:t>
       </w:r>
     </w:p>
     <w:p>
@@ -8527,15 +7307,7 @@
         </w:numPr>
       </w:pPr>
       <w:r>
-        <w:t xml:space="preserve">            "command": "/usr/bin/</w:t>
-      </w:r>
-      <w:proofErr w:type="spellStart"/>
-      <w:r>
-        <w:t>gcc</w:t>
-      </w:r>
-      <w:proofErr w:type="spellEnd"/>
-      <w:r>
-        <w:t>",</w:t>
+        <w:t xml:space="preserve">            "command": "/usr/bin/gcc",</w:t>
       </w:r>
     </w:p>
     <w:p>
@@ -8547,15 +7319,7 @@
         </w:numPr>
       </w:pPr>
       <w:r>
-        <w:t xml:space="preserve">            "</w:t>
-      </w:r>
-      <w:proofErr w:type="spellStart"/>
-      <w:r>
-        <w:t>args</w:t>
-      </w:r>
-      <w:proofErr w:type="spellEnd"/>
-      <w:r>
-        <w:t>": [</w:t>
+        <w:t xml:space="preserve">            "args": [</w:t>
       </w:r>
     </w:p>
     <w:p>
@@ -8567,15 +7331,7 @@
         </w:numPr>
       </w:pPr>
       <w:r>
-        <w:t xml:space="preserve">                "-</w:t>
-      </w:r>
-      <w:proofErr w:type="spellStart"/>
-      <w:r>
-        <w:t>fdiagnostics</w:t>
-      </w:r>
-      <w:proofErr w:type="spellEnd"/>
-      <w:r>
-        <w:t>-color=always",</w:t>
+        <w:t xml:space="preserve">                "-fdiagnostics-color=always",</w:t>
       </w:r>
     </w:p>
     <w:p>
@@ -8623,23 +7379,7 @@
         </w:numPr>
       </w:pPr>
       <w:r>
-        <w:t xml:space="preserve">                "${</w:t>
-      </w:r>
-      <w:proofErr w:type="spellStart"/>
-      <w:r>
-        <w:t>fileDirname</w:t>
-      </w:r>
-      <w:proofErr w:type="spellEnd"/>
-      <w:r>
-        <w:t>}/${</w:t>
-      </w:r>
-      <w:proofErr w:type="spellStart"/>
-      <w:r>
-        <w:t>fileBasenameNoExtension</w:t>
-      </w:r>
-      <w:proofErr w:type="spellEnd"/>
-      <w:r>
-        <w:t>}"</w:t>
+        <w:t xml:space="preserve">                "${fileDirname}/${fileBasenameNoExtension}"</w:t>
       </w:r>
     </w:p>
     <w:p>
@@ -8663,13 +7403,8 @@
         </w:numPr>
       </w:pPr>
       <w:r>
-        <w:t xml:space="preserve">            "options</w:t>
-      </w:r>
-      <w:proofErr w:type="gramStart"/>
-      <w:r>
-        <w:t>": {</w:t>
-      </w:r>
-      <w:proofErr w:type="gramEnd"/>
+        <w:t xml:space="preserve">            "options": {</w:t>
+      </w:r>
     </w:p>
     <w:p>
       <w:pPr>
@@ -8680,23 +7415,7 @@
         </w:numPr>
       </w:pPr>
       <w:r>
-        <w:t xml:space="preserve">                "</w:t>
-      </w:r>
-      <w:proofErr w:type="spellStart"/>
-      <w:r>
-        <w:t>cwd</w:t>
-      </w:r>
-      <w:proofErr w:type="spellEnd"/>
-      <w:r>
-        <w:t>": "${</w:t>
-      </w:r>
-      <w:proofErr w:type="spellStart"/>
-      <w:r>
-        <w:t>fileDirname</w:t>
-      </w:r>
-      <w:proofErr w:type="spellEnd"/>
-      <w:r>
-        <w:t>}"</w:t>
+        <w:t xml:space="preserve">                "cwd": "${fileDirname}"</w:t>
       </w:r>
     </w:p>
     <w:p>
@@ -8720,15 +7439,7 @@
         </w:numPr>
       </w:pPr>
       <w:r>
-        <w:t xml:space="preserve">            "</w:t>
-      </w:r>
-      <w:proofErr w:type="spellStart"/>
-      <w:r>
-        <w:t>problemMatcher</w:t>
-      </w:r>
-      <w:proofErr w:type="spellEnd"/>
-      <w:r>
-        <w:t>": [</w:t>
+        <w:t xml:space="preserve">            "problemMatcher": [</w:t>
       </w:r>
     </w:p>
     <w:p>
@@ -8740,15 +7451,7 @@
         </w:numPr>
       </w:pPr>
       <w:r>
-        <w:t xml:space="preserve">                "$</w:t>
-      </w:r>
-      <w:proofErr w:type="spellStart"/>
-      <w:r>
-        <w:t>gcc</w:t>
-      </w:r>
-      <w:proofErr w:type="spellEnd"/>
-      <w:r>
-        <w:t>"</w:t>
+        <w:t xml:space="preserve">                "$gcc"</w:t>
       </w:r>
     </w:p>
     <w:p>
@@ -8772,13 +7475,8 @@
         </w:numPr>
       </w:pPr>
       <w:r>
-        <w:t xml:space="preserve">            "group</w:t>
-      </w:r>
-      <w:proofErr w:type="gramStart"/>
-      <w:r>
-        <w:t>": {</w:t>
-      </w:r>
-      <w:proofErr w:type="gramEnd"/>
+        <w:t xml:space="preserve">            "group": {</w:t>
+      </w:r>
     </w:p>
     <w:p>
       <w:pPr>
@@ -8801,15 +7499,7 @@
         </w:numPr>
       </w:pPr>
       <w:r>
-        <w:t xml:space="preserve">                "</w:t>
-      </w:r>
-      <w:proofErr w:type="spellStart"/>
-      <w:r>
-        <w:t>isDefault</w:t>
-      </w:r>
-      <w:proofErr w:type="spellEnd"/>
-      <w:r>
-        <w:t>": true</w:t>
+        <w:t xml:space="preserve">                "isDefault": true</w:t>
       </w:r>
     </w:p>
     <w:p>
@@ -8893,13 +7583,8 @@
         </w:numPr>
       </w:pPr>
       <w:r>
-        <w:t>Next setup task. . .</w:t>
-      </w:r>
-      <w:proofErr w:type="gramStart"/>
-      <w:r>
-        <w:t xml:space="preserve"> ..</w:t>
-      </w:r>
-      <w:proofErr w:type="gramEnd"/>
+        <w:t>Next setup task. . . ..</w:t>
+      </w:r>
     </w:p>
     <w:p>
       <w:pPr>
@@ -9093,15 +7778,7 @@
     <w:p/>
     <w:p>
       <w:r>
-        <w:t xml:space="preserve">Build binary from </w:t>
-      </w:r>
-      <w:proofErr w:type="spellStart"/>
-      <w:r>
-        <w:t>asm</w:t>
-      </w:r>
-      <w:proofErr w:type="spellEnd"/>
-      <w:r>
-        <w:t xml:space="preserve"> file using NASM. Relative path, the full path for this is: </w:t>
+        <w:t xml:space="preserve">Build binary from asm file using NASM. Relative path, the full path for this is: </w:t>
       </w:r>
     </w:p>
     <w:p>
@@ -9117,23 +7794,7 @@
           <w:b/>
           <w:bCs/>
         </w:rPr>
-        <w:t>/</w:t>
-      </w:r>
-      <w:proofErr w:type="gramStart"/>
-      <w:r>
-        <w:rPr>
-          <w:b/>
-          <w:bCs/>
-        </w:rPr>
-        <w:t>mnt</w:t>
-      </w:r>
-      <w:proofErr w:type="gramEnd"/>
-      <w:r>
-        <w:rPr>
-          <w:b/>
-          <w:bCs/>
-        </w:rPr>
-        <w:t>/c/Users/mihe/Dropbox/TusMuertOS-Oct2025</w:t>
+        <w:t>/mnt/c/Users/mihe/Dropbox/TusMuertOS-Oct2025</w:t>
       </w:r>
     </w:p>
     <w:p>
@@ -9149,72 +7810,18 @@
           <w:bCs/>
         </w:rPr>
       </w:pPr>
-      <w:proofErr w:type="spellStart"/>
       <w:r>
         <w:rPr>
           <w:b/>
           <w:bCs/>
         </w:rPr>
-        <w:t>nasm</w:t>
-      </w:r>
-      <w:proofErr w:type="spellEnd"/>
-      <w:r>
-        <w:rPr>
-          <w:b/>
-          <w:bCs/>
-        </w:rPr>
-        <w:t xml:space="preserve"> -f bin </w:t>
-      </w:r>
-      <w:proofErr w:type="spellStart"/>
-      <w:r>
-        <w:rPr>
-          <w:b/>
-          <w:bCs/>
-        </w:rPr>
-        <w:t>src</w:t>
-      </w:r>
-      <w:proofErr w:type="spellEnd"/>
-      <w:r>
-        <w:rPr>
-          <w:b/>
-          <w:bCs/>
-        </w:rPr>
-        <w:t xml:space="preserve">/bootloader/stage1.asm -o </w:t>
-      </w:r>
-      <w:proofErr w:type="spellStart"/>
-      <w:r>
-        <w:rPr>
-          <w:b/>
-          <w:bCs/>
-        </w:rPr>
-        <w:t>src</w:t>
-      </w:r>
-      <w:proofErr w:type="spellEnd"/>
-      <w:r>
-        <w:rPr>
-          <w:b/>
-          <w:bCs/>
-        </w:rPr>
-        <w:t>/build/stage1.bin</w:t>
+        <w:t>nasm -f bin src/bootloader/stage1.asm -o src/build/stage1.bin</w:t>
       </w:r>
     </w:p>
     <w:p/>
     <w:p>
-      <w:proofErr w:type="spellStart"/>
-      <w:r>
-        <w:t>bximage</w:t>
-      </w:r>
-      <w:proofErr w:type="spellEnd"/>
-      <w:r>
-        <w:t xml:space="preserve"> to create an empty floppy disk. It is an interactive tool with a menu. It shows this info after execution: The following line should appear in your </w:t>
-      </w:r>
-      <w:proofErr w:type="spellStart"/>
-      <w:r>
-        <w:t>bochsrc</w:t>
-      </w:r>
-      <w:proofErr w:type="spellEnd"/>
-      <w:r>
-        <w:t>:</w:t>
+      <w:r>
+        <w:t>bximage to create an empty floppy disk. It is an interactive tool with a menu. It shows this info after execution: The following line should appear in your bochsrc:</w:t>
       </w:r>
     </w:p>
     <w:p>
@@ -9225,37 +7832,12 @@
           <w:bCs/>
         </w:rPr>
       </w:pPr>
-      <w:proofErr w:type="spellStart"/>
       <w:r>
         <w:rPr>
           <w:b/>
           <w:bCs/>
         </w:rPr>
-        <w:t>floppya</w:t>
-      </w:r>
-      <w:proofErr w:type="spellEnd"/>
-      <w:r>
-        <w:rPr>
-          <w:b/>
-          <w:bCs/>
-        </w:rPr>
-        <w:t>: image="</w:t>
-      </w:r>
-      <w:proofErr w:type="spellStart"/>
-      <w:r>
-        <w:rPr>
-          <w:b/>
-          <w:bCs/>
-        </w:rPr>
-        <w:t>floppy.img</w:t>
-      </w:r>
-      <w:proofErr w:type="spellEnd"/>
-      <w:r>
-        <w:rPr>
-          <w:b/>
-          <w:bCs/>
-        </w:rPr>
-        <w:t>", status=inserted</w:t>
+        <w:t>floppya: image="floppy.img", status=inserted</w:t>
       </w:r>
     </w:p>
     <w:p>
@@ -9276,115 +7858,26 @@
           <w:b/>
           <w:bCs/>
         </w:rPr>
-        <w:t>dd if=/dev/zero of=</w:t>
-      </w:r>
-      <w:proofErr w:type="spellStart"/>
+        <w:t>dd if=/dev/zero of=teaching.img bs=512 count=2880</w:t>
+      </w:r>
+    </w:p>
+    <w:p/>
+    <w:p>
+      <w:r>
+        <w:t>Inject the bootloader (512 bytes, One sector if I am not mistaketn) at the beginning of the empty disk image:</w:t>
+      </w:r>
+    </w:p>
+    <w:p>
+      <w:pPr>
+        <w:ind w:firstLine="720"/>
+      </w:pPr>
       <w:r>
         <w:rPr>
           <w:b/>
           <w:bCs/>
         </w:rPr>
-        <w:t>teaching.img</w:t>
-      </w:r>
-      <w:proofErr w:type="spellEnd"/>
-      <w:r>
-        <w:rPr>
-          <w:b/>
-          <w:bCs/>
-        </w:rPr>
-        <w:t xml:space="preserve"> bs=512 count=2880</w:t>
-      </w:r>
-    </w:p>
-    <w:p/>
-    <w:p>
-      <w:r>
-        <w:t xml:space="preserve">Inject the bootloader (512 bytes, </w:t>
-      </w:r>
-      <w:proofErr w:type="gramStart"/>
-      <w:r>
-        <w:t>One</w:t>
-      </w:r>
-      <w:proofErr w:type="gramEnd"/>
-      <w:r>
-        <w:t xml:space="preserve"> sector if I am not </w:t>
-      </w:r>
-      <w:proofErr w:type="spellStart"/>
-      <w:r>
-        <w:t>mistaketn</w:t>
-      </w:r>
-      <w:proofErr w:type="spellEnd"/>
-      <w:r>
-        <w:t>) at the beginning of the empty disk image:</w:t>
-      </w:r>
-    </w:p>
-    <w:p>
-      <w:pPr>
-        <w:ind w:firstLine="720"/>
-      </w:pPr>
-      <w:r>
-        <w:rPr>
-          <w:b/>
-          <w:bCs/>
-        </w:rPr>
-        <w:t>dd if=</w:t>
-      </w:r>
-      <w:proofErr w:type="spellStart"/>
-      <w:r>
-        <w:rPr>
-          <w:b/>
-          <w:bCs/>
-        </w:rPr>
-        <w:t>src</w:t>
-      </w:r>
-      <w:proofErr w:type="spellEnd"/>
-      <w:r>
-        <w:rPr>
-          <w:b/>
-          <w:bCs/>
-        </w:rPr>
-        <w:t>/build/stage1.bin of=</w:t>
-      </w:r>
-      <w:proofErr w:type="spellStart"/>
-      <w:r>
-        <w:rPr>
-          <w:b/>
-          <w:bCs/>
-        </w:rPr>
-        <w:t>src</w:t>
-      </w:r>
-      <w:proofErr w:type="spellEnd"/>
-      <w:r>
-        <w:rPr>
-          <w:b/>
-          <w:bCs/>
-        </w:rPr>
-        <w:t>/build/</w:t>
-      </w:r>
-      <w:proofErr w:type="spellStart"/>
-      <w:r>
-        <w:rPr>
-          <w:b/>
-          <w:bCs/>
-        </w:rPr>
-        <w:t>floppy.img</w:t>
-      </w:r>
-      <w:proofErr w:type="spellEnd"/>
-      <w:r>
-        <w:rPr>
-          <w:b/>
-          <w:bCs/>
-        </w:rPr>
-        <w:t xml:space="preserve"> bs=512 count=1 conv=</w:t>
-      </w:r>
-      <w:proofErr w:type="spellStart"/>
-      <w:r>
-        <w:rPr>
-          <w:b/>
-          <w:bCs/>
-        </w:rPr>
-        <w:t>notrunc</w:t>
-      </w:r>
-      <w:proofErr w:type="spellEnd"/>
+        <w:t>dd if=src/build/stage1.bin of=src/build/floppy.img bs=512 count=1 conv=notrunc</w:t>
+      </w:r>
     </w:p>
     <w:p/>
     <w:p>
@@ -9400,31 +7893,13 @@
           <w:bCs/>
         </w:rPr>
       </w:pPr>
-      <w:proofErr w:type="spellStart"/>
       <w:r>
         <w:rPr>
           <w:b/>
           <w:bCs/>
         </w:rPr>
-        <w:t>xxd</w:t>
-      </w:r>
-      <w:proofErr w:type="spellEnd"/>
-      <w:r>
-        <w:rPr>
-          <w:b/>
-          <w:bCs/>
-        </w:rPr>
-        <w:t xml:space="preserve"> -l 512 </w:t>
-      </w:r>
-      <w:proofErr w:type="spellStart"/>
-      <w:r>
-        <w:rPr>
-          <w:b/>
-          <w:bCs/>
-        </w:rPr>
-        <w:t>floppy.img</w:t>
-      </w:r>
-      <w:proofErr w:type="spellEnd"/>
+        <w:t>xxd -l 512 floppy.img</w:t>
+      </w:r>
     </w:p>
     <w:p/>
     <w:p/>
@@ -9441,36 +7916,12 @@
     <w:p/>
     <w:p>
       <w:r>
-        <w:t xml:space="preserve">Run </w:t>
-      </w:r>
-      <w:proofErr w:type="spellStart"/>
-      <w:r>
-        <w:t>qemu</w:t>
-      </w:r>
-      <w:proofErr w:type="spellEnd"/>
-      <w:r>
-        <w:t xml:space="preserve"> with the bootloader bin</w:t>
-      </w:r>
-    </w:p>
-    <w:p>
-      <w:r>
-        <w:t>qemu-system-i386 -drive format=</w:t>
-      </w:r>
-      <w:proofErr w:type="gramStart"/>
-      <w:r>
-        <w:t>raw,file</w:t>
-      </w:r>
-      <w:proofErr w:type="gramEnd"/>
-      <w:r>
-        <w:t>=</w:t>
-      </w:r>
-      <w:proofErr w:type="gramStart"/>
-      <w:r>
-        <w:t>C:\Users\mihe\Dropbox\TusMuertOS-Oct2025\src\build\stage1.bin,if</w:t>
-      </w:r>
-      <w:proofErr w:type="gramEnd"/>
-      <w:r>
-        <w:t>=floppy</w:t>
+        <w:t>Run qemu with the bootloader bin</w:t>
+      </w:r>
+    </w:p>
+    <w:p>
+      <w:r>
+        <w:t>qemu-system-i386 -drive format=raw,file=C:\Users\mihe\Dropbox\TusMuertOS-Oct2025\src\build\stage1.bin,if=floppy</w:t>
       </w:r>
     </w:p>
     <w:p/>
@@ -9491,119 +7942,46 @@
     </w:p>
     <w:p>
       <w:r>
-        <w:t xml:space="preserve">Copy the template where the </w:t>
-      </w:r>
-      <w:proofErr w:type="spellStart"/>
-      <w:r>
-        <w:t>img</w:t>
-      </w:r>
-      <w:proofErr w:type="spellEnd"/>
-      <w:r>
-        <w:t xml:space="preserve"> is (in the file you also use full path or relative to the .</w:t>
-      </w:r>
-      <w:proofErr w:type="spellStart"/>
-      <w:r>
-        <w:t>img</w:t>
-      </w:r>
-      <w:proofErr w:type="spellEnd"/>
-      <w:r>
-        <w:t xml:space="preserve"> and output logs).</w:t>
-      </w:r>
-    </w:p>
-    <w:p>
-      <w:r>
-        <w:t xml:space="preserve">Run this: </w:t>
-      </w:r>
-      <w:proofErr w:type="spellStart"/>
-      <w:r>
-        <w:t>bochs</w:t>
-      </w:r>
-      <w:proofErr w:type="spellEnd"/>
-      <w:r>
-        <w:t xml:space="preserve"> -f .\bochsrc-runtime.txt -q -debugger</w:t>
+        <w:t>Copy the template where the img is (in the file you also use full path or relative to the .img and output logs).</w:t>
+      </w:r>
+    </w:p>
+    <w:p>
+      <w:r>
+        <w:t>Run this: bochs -f .\bochsrc-runtime.txt -q -debugger</w:t>
       </w:r>
     </w:p>
     <w:p>
       <w:r>
         <w:tab/>
-        <w:t xml:space="preserve">-f: </w:t>
-      </w:r>
-      <w:proofErr w:type="spellStart"/>
-      <w:r>
-        <w:t>configfile</w:t>
-      </w:r>
-      <w:proofErr w:type="spellEnd"/>
+        <w:t>-f: configfile</w:t>
+      </w:r>
     </w:p>
     <w:p>
       <w:r>
         <w:tab/>
-        <w:t xml:space="preserve">-q: don’t show the configuration screen before </w:t>
-      </w:r>
-      <w:proofErr w:type="gramStart"/>
-      <w:r>
-        <w:t>start</w:t>
-      </w:r>
-      <w:proofErr w:type="gramEnd"/>
+        <w:t>-q: don’t show the configuration screen before start</w:t>
+      </w:r>
     </w:p>
     <w:p>
       <w:r>
         <w:tab/>
-        <w:t xml:space="preserve">-debugger: memory, registers, </w:t>
-      </w:r>
-      <w:proofErr w:type="spellStart"/>
-      <w:r>
-        <w:t>etc</w:t>
-      </w:r>
-      <w:proofErr w:type="spellEnd"/>
-      <w:r>
-        <w:t>…</w:t>
-      </w:r>
-    </w:p>
-    <w:p>
-      <w:proofErr w:type="spellStart"/>
-      <w:r>
-        <w:t>bochs</w:t>
-      </w:r>
-      <w:proofErr w:type="spellEnd"/>
-      <w:r>
-        <w:t xml:space="preserve"> -f .\bochsrc-runtime.txt -q -debugger</w:t>
+        <w:t>-debugger: memory, registers, etc…</w:t>
+      </w:r>
+    </w:p>
+    <w:p>
+      <w:r>
+        <w:t>bochs -f .\bochsrc-runtime.txt -q -debugger</w:t>
       </w:r>
     </w:p>
     <w:p/>
     <w:p>
       <w:r>
-        <w:t xml:space="preserve">NEXT </w:t>
-      </w:r>
-      <w:proofErr w:type="gramStart"/>
-      <w:r>
-        <w:t>DAY !!!!!!!!!!!!!!!!!!!!!!!!!!!!!!!!!!!!!!</w:t>
-      </w:r>
-      <w:proofErr w:type="gramEnd"/>
-    </w:p>
-    <w:p>
-      <w:proofErr w:type="spellStart"/>
-      <w:r>
-        <w:t>bochs</w:t>
-      </w:r>
-      <w:proofErr w:type="spellEnd"/>
-      <w:r>
-        <w:t xml:space="preserve"> -f .\bochsrc-runtime.txt -q -debugger -</w:t>
-      </w:r>
-      <w:proofErr w:type="spellStart"/>
-      <w:r>
-        <w:t>rc</w:t>
-      </w:r>
-      <w:proofErr w:type="spellEnd"/>
-      <w:r>
-        <w:t xml:space="preserve"> .\</w:t>
-      </w:r>
-      <w:proofErr w:type="spellStart"/>
-      <w:r>
-        <w:t>bochs.cmds</w:t>
-      </w:r>
-      <w:proofErr w:type="spellEnd"/>
-      <w:r>
-        <w:t xml:space="preserve"> try to enable automatic breakpoint, without magic breakpoints, which take space from the bootloader.</w:t>
+        <w:t>NEXT DAY !!!!!!!!!!!!!!!!!!!!!!!!!!!!!!!!!!!!!!</w:t>
+      </w:r>
+    </w:p>
+    <w:p>
+      <w:r>
+        <w:t>bochs -f .\bochsrc-runtime.txt -q -debugger -rc .\bochs.cmds try to enable automatic breakpoint, without magic breakpoints, which take space from the bootloader.</w:t>
       </w:r>
     </w:p>
     <w:p/>
@@ -9660,15 +8038,7 @@
         </w:pBdr>
       </w:pPr>
       <w:r>
-        <w:t xml:space="preserve">    mov ax, start    </w:t>
-      </w:r>
-      <w:proofErr w:type="gramStart"/>
-      <w:r>
-        <w:t xml:space="preserve">  ;</w:t>
-      </w:r>
-      <w:proofErr w:type="gramEnd"/>
-      <w:r>
-        <w:t xml:space="preserve"> imm16 encodes the absolute offset of “start”</w:t>
+        <w:t xml:space="preserve">    mov ax, start      ; imm16 encodes the absolute offset of “start”</w:t>
       </w:r>
     </w:p>
     <w:p>
@@ -9704,11 +8074,9 @@
       <w:r>
         <w:t xml:space="preserve">WSL Tab autocomplete </w:t>
       </w:r>
-      <w:proofErr w:type="spellStart"/>
       <w:r>
         <w:t>searchs</w:t>
       </w:r>
-      <w:proofErr w:type="spellEnd"/>
       <w:r>
         <w:t xml:space="preserve"> only on windows/system32</w:t>
       </w:r>
@@ -9718,31 +8086,7 @@
     <w:p>
       <w:r>
         <w:lastRenderedPageBreak/>
-        <w:t xml:space="preserve">No solution </w:t>
-      </w:r>
-      <w:proofErr w:type="gramStart"/>
-      <w:r>
-        <w:t>found</w:t>
-      </w:r>
-      <w:proofErr w:type="gramEnd"/>
-      <w:r>
-        <w:t xml:space="preserve"> yet. Tried to add to </w:t>
-      </w:r>
-      <w:proofErr w:type="spellStart"/>
-      <w:r>
-        <w:t>etc</w:t>
-      </w:r>
-      <w:proofErr w:type="spellEnd"/>
-      <w:r>
-        <w:t>/</w:t>
-      </w:r>
-      <w:proofErr w:type="spellStart"/>
-      <w:r>
-        <w:t>wsl.conf</w:t>
-      </w:r>
-      <w:proofErr w:type="spellEnd"/>
-      <w:r>
-        <w:t xml:space="preserve"> this appendWindowsPath=false</w:t>
+        <w:t>No solution found yet. Tried to add to etc/wsl.conf this appendWindowsPath=false</w:t>
       </w:r>
     </w:p>
     <w:p/>
@@ -9752,15 +8096,7 @@
       </w:pPr>
       <w:bookmarkStart w:id="22" w:name="_Toc213004617"/>
       <w:r>
-        <w:t xml:space="preserve">On bootloader, will mov </w:t>
-      </w:r>
-      <w:proofErr w:type="spellStart"/>
-      <w:r>
-        <w:t>sp</w:t>
-      </w:r>
-      <w:proofErr w:type="spellEnd"/>
-      <w:r>
-        <w:t>, 0x7C00 make the next push to overwrite the first byte of the bootloader? (Overlap)</w:t>
+        <w:t>On bootloader, will mov sp, 0x7C00 make the next push to overwrite the first byte of the bootloader? (Overlap)</w:t>
       </w:r>
       <w:bookmarkEnd w:id="22"/>
     </w:p>
@@ -9852,18 +8188,9 @@
         <w:t>It is related to the LF vs CRLF line-endings differences.</w:t>
       </w:r>
     </w:p>
-    <w:p/>
-    <w:p>
-      <w:r>
-        <w:t>The easiest way to resolve this would be to add .</w:t>
-      </w:r>
-      <w:proofErr w:type="spellStart"/>
-      <w:r>
-        <w:t>gitattributes</w:t>
-      </w:r>
-      <w:proofErr w:type="spellEnd"/>
-      <w:r>
-        <w:t> file with a * text=auto line. This should normalize the line endings and prevent this issue within this specific repository. See </w:t>
+    <w:p>
+      <w:r>
+        <w:t>The easiest way to resolve this would be to add .gitattributes file with a * text=auto line. This should normalize the line endings and prevent this issue within this specific repository. See </w:t>
       </w:r>
       <w:hyperlink r:id="rId21" w:anchor="per-repository-settings" w:history="1">
         <w:r>
@@ -9877,249 +8204,283 @@
         <w:t>. Let me know if you have any other questions</w:t>
       </w:r>
     </w:p>
+    <w:p>
+      <w:pPr>
+        <w:pStyle w:val="Heading2"/>
+      </w:pPr>
+      <w:r>
+        <w:t>Hint C debugger that a buffer is of a particular size</w:t>
+      </w:r>
+    </w:p>
     <w:p/>
     <w:p>
-      <w:pPr>
-        <w:pStyle w:val="Heading1"/>
-      </w:pPr>
-      <w:bookmarkStart w:id="25" w:name="_Toc213004620"/>
-      <w:r>
-        <w:t>Research backlog</w:t>
-      </w:r>
-      <w:bookmarkEnd w:id="25"/>
+      <w:r>
+        <w:t xml:space="preserve">buf is a pointer to uint8_t, meaning it points to a sequence of bytes (each an unsigned 8-bit value); to inspect the entire 512-byte region it references, add buf,512 to the </w:t>
+      </w:r>
+      <w:r>
+        <w:rPr>
+          <w:b/>
+          <w:bCs/>
+        </w:rPr>
+        <w:t>Watch</w:t>
+      </w:r>
+      <w:r>
+        <w:t xml:space="preserve"> panel in VS Code so the debugger shows it as an array of bytes instead of a single uint8_t.</w:t>
+      </w:r>
     </w:p>
     <w:p/>
     <w:p>
       <w:pPr>
-        <w:pStyle w:val="ListParagraph"/>
-        <w:numPr>
-          <w:ilvl w:val="0"/>
-          <w:numId w:val="1"/>
-        </w:numPr>
-      </w:pPr>
-      <w:r>
-        <w:t>Disk formats FAT12/</w:t>
-      </w:r>
-      <w:r>
-        <w:t>16/</w:t>
-      </w:r>
-      <w:r>
-        <w:t>32</w:t>
-      </w:r>
-      <w:r>
-        <w:t xml:space="preserve"> </w:t>
-      </w:r>
-    </w:p>
-    <w:p>
-      <w:pPr>
-        <w:pStyle w:val="ListParagraph"/>
-        <w:numPr>
-          <w:ilvl w:val="0"/>
-          <w:numId w:val="1"/>
-        </w:numPr>
-      </w:pPr>
-      <w:r>
-        <w:t>Partition table on the MBR. I remember seeing adding 4 16</w:t>
-      </w:r>
-      <w:proofErr w:type="gramStart"/>
-      <w:r>
-        <w:t>bytes</w:t>
-      </w:r>
-      <w:proofErr w:type="gramEnd"/>
-      <w:r>
-        <w:t xml:space="preserve"> reserved structures before 0xAA55</w:t>
-      </w:r>
-    </w:p>
-    <w:p>
-      <w:pPr>
-        <w:pStyle w:val="ListParagraph"/>
-        <w:numPr>
-          <w:ilvl w:val="1"/>
-          <w:numId w:val="1"/>
-        </w:numPr>
-      </w:pPr>
-      <w:r>
-        <w:t xml:space="preserve">I guess this applies if the MBR is for a hard </w:t>
-      </w:r>
-      <w:proofErr w:type="gramStart"/>
-      <w:r>
-        <w:t>disk, but</w:t>
-      </w:r>
-      <w:proofErr w:type="gramEnd"/>
-      <w:r>
-        <w:t xml:space="preserve"> does not apply for a floppy</w:t>
-      </w:r>
-      <w:r>
-        <w:t>. This is an educated guess</w:t>
-      </w:r>
-    </w:p>
-    <w:p>
-      <w:pPr>
-        <w:pStyle w:val="ListParagraph"/>
-        <w:numPr>
-          <w:ilvl w:val="1"/>
-          <w:numId w:val="1"/>
-        </w:numPr>
+        <w:pStyle w:val="Heading2"/>
       </w:pPr>
       <w:r>
         <w:lastRenderedPageBreak/>
-        <w:t xml:space="preserve">On floppy, the FAT info at 0 starts with a jump to code, followed by the FAT info. This way </w:t>
-      </w:r>
-      <w:proofErr w:type="gramStart"/>
-      <w:r>
-        <w:t>both,</w:t>
-      </w:r>
-      <w:proofErr w:type="gramEnd"/>
-      <w:r>
-        <w:t xml:space="preserve"> the bootloader and FAT info can coexist, because there is a jump. Validate this because I got this explained by </w:t>
-      </w:r>
-      <w:r>
-        <w:t>ChatGPT. It makes a lot of sense, but still…</w:t>
-      </w:r>
-    </w:p>
-    <w:p>
-      <w:pPr>
-        <w:pStyle w:val="ListParagraph"/>
-        <w:numPr>
-          <w:ilvl w:val="1"/>
-          <w:numId w:val="1"/>
-        </w:numPr>
-      </w:pPr>
-      <w:r>
-        <w:t xml:space="preserve">A Disk with multiple partitions, the first byte </w:t>
-      </w:r>
-      <w:proofErr w:type="gramStart"/>
-      <w:r>
-        <w:t>define</w:t>
-      </w:r>
-      <w:proofErr w:type="gramEnd"/>
-      <w:r>
-        <w:t xml:space="preserve"> if it is bootable 0x80 = bootable.</w:t>
-      </w:r>
-      <w:r>
-        <w:t xml:space="preserve"> The first byte on one of those 4 16 bytes partitions at the end of the MBR before the 0xAA55</w:t>
-      </w:r>
-    </w:p>
-    <w:p>
-      <w:pPr>
-        <w:pStyle w:val="ListParagraph"/>
-        <w:numPr>
-          <w:ilvl w:val="0"/>
-          <w:numId w:val="1"/>
-        </w:numPr>
-      </w:pPr>
-      <w:r>
-        <w:t xml:space="preserve">Can MBR and BPB be fused together? I found something related to a short jump at the beginning, of </w:t>
-      </w:r>
-      <w:proofErr w:type="gramStart"/>
-      <w:r>
-        <w:t>BPB ???</w:t>
-      </w:r>
-      <w:proofErr w:type="gramEnd"/>
-      <w:r>
-        <w:t xml:space="preserve"> Dive deeper into this!</w:t>
-      </w:r>
-      <w:r>
-        <w:t xml:space="preserve"> I think BPB merged on MBR is for disk without partitions, such as floppy disks. </w:t>
-      </w:r>
-    </w:p>
-    <w:p>
-      <w:pPr>
-        <w:pStyle w:val="ListParagraph"/>
-        <w:numPr>
-          <w:ilvl w:val="0"/>
-          <w:numId w:val="1"/>
-        </w:numPr>
-      </w:pPr>
-      <w:r>
-        <w:t>Inject breakpoints on Bochs without magic breakpoints, via commands file on startup</w:t>
-      </w:r>
-    </w:p>
-    <w:p>
-      <w:pPr>
-        <w:pStyle w:val="ListParagraph"/>
-        <w:numPr>
-          <w:ilvl w:val="0"/>
-          <w:numId w:val="1"/>
-        </w:numPr>
-      </w:pPr>
-      <w:r>
-        <w:t xml:space="preserve">How to change Bochs </w:t>
-      </w:r>
-      <w:r>
-        <w:t xml:space="preserve">display </w:t>
-      </w:r>
-      <w:r>
-        <w:t>resolution.</w:t>
-      </w:r>
-    </w:p>
-    <w:p>
-      <w:pPr>
-        <w:pStyle w:val="ListParagraph"/>
-        <w:numPr>
-          <w:ilvl w:val="0"/>
-          <w:numId w:val="1"/>
-        </w:numPr>
-      </w:pPr>
-      <w:r>
-        <w:t xml:space="preserve">Change the path order (open first code from </w:t>
-      </w:r>
-      <w:proofErr w:type="spellStart"/>
-      <w:r>
-        <w:t>linux</w:t>
-      </w:r>
-      <w:proofErr w:type="spellEnd"/>
-      <w:r>
-        <w:t xml:space="preserve"> instead of windows, without removing the windows path via </w:t>
-      </w:r>
-      <w:proofErr w:type="spellStart"/>
-      <w:r>
-        <w:t>etc</w:t>
-      </w:r>
-      <w:proofErr w:type="spellEnd"/>
-      <w:r>
-        <w:t>/</w:t>
-      </w:r>
-      <w:proofErr w:type="spellStart"/>
-      <w:r>
-        <w:t>wsl.conf</w:t>
-      </w:r>
-      <w:proofErr w:type="spellEnd"/>
-      <w:r>
-        <w:t xml:space="preserve"> </w:t>
-      </w:r>
-      <w:proofErr w:type="gramStart"/>
-      <w:r>
-        <w:t>file )</w:t>
-      </w:r>
-      <w:proofErr w:type="gramEnd"/>
-    </w:p>
-    <w:p>
-      <w:pPr>
-        <w:pStyle w:val="Heading1"/>
-      </w:pPr>
-      <w:bookmarkStart w:id="26" w:name="_Toc213004621"/>
-      <w:r>
-        <w:t>Screenshots</w:t>
-      </w:r>
-      <w:bookmarkEnd w:id="26"/>
-    </w:p>
-    <w:p/>
-    <w:p>
-      <w:r>
-        <w:t>31-October-2025</w:t>
-      </w:r>
-    </w:p>
-    <w:p/>
-    <w:p/>
-    <w:p>
-      <w:pPr>
-        <w:keepNext/>
-      </w:pPr>
+        <w:t>Frame-Pointer Omission</w:t>
+      </w:r>
+    </w:p>
+    <w:p>
+      <w:r>
+        <w:t xml:space="preserve">Allows the compiler to use RBP (Stack Base Pointer) as general register for “optimization”, so less offset calculations and freeing other general registers on long functions. On gcc: </w:t>
+      </w:r>
+      <w:r>
+        <w:t>-fno-omit-frame-pointer</w:t>
+      </w:r>
+    </w:p>
+    <w:p>
+      <w:r>
+        <w:t>Example of a prologue where a parameter coming on RDI is just saved on RBP. It may help performance, but it is difficult to reason about while reading the disassembled code.</w:t>
+      </w:r>
+    </w:p>
+    <w:p>
       <w:r>
         <w:rPr>
           <w:noProof/>
         </w:rPr>
+        <w:drawing>
+          <wp:inline distT="0" distB="0" distL="0" distR="0" wp14:anchorId="12A11895" wp14:editId="2379F3B2">
+            <wp:extent cx="2143424" cy="743054"/>
+            <wp:effectExtent l="0" t="0" r="0" b="0"/>
+            <wp:docPr id="955014729" name="Picture 1" descr="A screenshot of a computer&#10;&#10;AI-generated content may be incorrect."/>
+            <wp:cNvGraphicFramePr>
+              <a:graphicFrameLocks xmlns:a="http://schemas.openxmlformats.org/drawingml/2006/main" noChangeAspect="1"/>
+            </wp:cNvGraphicFramePr>
+            <a:graphic xmlns:a="http://schemas.openxmlformats.org/drawingml/2006/main">
+              <a:graphicData uri="http://schemas.openxmlformats.org/drawingml/2006/picture">
+                <pic:pic xmlns:pic="http://schemas.openxmlformats.org/drawingml/2006/picture">
+                  <pic:nvPicPr>
+                    <pic:cNvPr id="955014729" name="Picture 1" descr="A screenshot of a computer&#10;&#10;AI-generated content may be incorrect."/>
+                    <pic:cNvPicPr/>
+                  </pic:nvPicPr>
+                  <pic:blipFill>
+                    <a:blip r:embed="rId22"/>
+                    <a:stretch>
+                      <a:fillRect/>
+                    </a:stretch>
+                  </pic:blipFill>
+                  <pic:spPr>
+                    <a:xfrm>
+                      <a:off x="0" y="0"/>
+                      <a:ext cx="2143424" cy="743054"/>
+                    </a:xfrm>
+                    <a:prstGeom prst="rect">
+                      <a:avLst/>
+                    </a:prstGeom>
+                  </pic:spPr>
+                </pic:pic>
+              </a:graphicData>
+            </a:graphic>
+          </wp:inline>
+        </w:drawing>
+      </w:r>
+    </w:p>
+    <w:p>
+      <w:pPr>
+        <w:pStyle w:val="Heading1"/>
+      </w:pPr>
+      <w:bookmarkStart w:id="25" w:name="_Toc213004620"/>
+      <w:r>
+        <w:t>Research backlog</w:t>
+      </w:r>
+      <w:bookmarkEnd w:id="25"/>
+    </w:p>
+    <w:p/>
+    <w:p>
+      <w:pPr>
+        <w:pStyle w:val="ListParagraph"/>
+        <w:numPr>
+          <w:ilvl w:val="0"/>
+          <w:numId w:val="1"/>
+        </w:numPr>
+      </w:pPr>
+      <w:r>
+        <w:t>Disk formats FAT12/</w:t>
+      </w:r>
+      <w:r>
+        <w:t>16/</w:t>
+      </w:r>
+      <w:r>
+        <w:t>32</w:t>
+      </w:r>
+      <w:r>
+        <w:t xml:space="preserve"> </w:t>
+      </w:r>
+    </w:p>
+    <w:p>
+      <w:pPr>
+        <w:pStyle w:val="ListParagraph"/>
+        <w:numPr>
+          <w:ilvl w:val="0"/>
+          <w:numId w:val="1"/>
+        </w:numPr>
+      </w:pPr>
+      <w:r>
+        <w:t>Partition table on the MBR. I remember seeing adding 4 16bytes reserved structures before 0xAA55</w:t>
+      </w:r>
+    </w:p>
+    <w:p>
+      <w:pPr>
+        <w:pStyle w:val="ListParagraph"/>
+        <w:numPr>
+          <w:ilvl w:val="1"/>
+          <w:numId w:val="1"/>
+        </w:numPr>
+      </w:pPr>
+      <w:r>
+        <w:t>I guess this applies if the MBR is for a hard disk, but does not apply for a floppy</w:t>
+      </w:r>
+      <w:r>
+        <w:t>. This is an educated guess</w:t>
+      </w:r>
+    </w:p>
+    <w:p>
+      <w:pPr>
+        <w:pStyle w:val="ListParagraph"/>
+        <w:numPr>
+          <w:ilvl w:val="1"/>
+          <w:numId w:val="1"/>
+        </w:numPr>
+      </w:pPr>
+      <w:r>
+        <w:t xml:space="preserve">On floppy, the FAT info at 0 starts with a jump to code, followed by the FAT info. This way both, the bootloader and FAT info can coexist, because there is a jump. Validate this because I got this explained by </w:t>
+      </w:r>
+      <w:r>
+        <w:t>ChatGPT. It makes a lot of sense, but still…</w:t>
+      </w:r>
+    </w:p>
+    <w:p>
+      <w:pPr>
+        <w:pStyle w:val="ListParagraph"/>
+        <w:numPr>
+          <w:ilvl w:val="1"/>
+          <w:numId w:val="1"/>
+        </w:numPr>
+      </w:pPr>
+      <w:r>
+        <w:t>A Disk with multiple partitions, the first byte define if it is bootable 0x80 = bootable.</w:t>
+      </w:r>
+      <w:r>
+        <w:t xml:space="preserve"> The first byte on one of those 4 16 bytes partitions at the end of the MBR before the 0xAA55</w:t>
+      </w:r>
+    </w:p>
+    <w:p>
+      <w:pPr>
+        <w:pStyle w:val="ListParagraph"/>
+        <w:numPr>
+          <w:ilvl w:val="0"/>
+          <w:numId w:val="1"/>
+        </w:numPr>
+      </w:pPr>
+      <w:r>
+        <w:t>Can MBR and BPB be fused together? I found something related to a short jump at the beginning, of BPB ??? Dive deeper into this!</w:t>
+      </w:r>
+      <w:r>
+        <w:t xml:space="preserve"> I think BPB merged on MBR is for disk without partitions, such as floppy disks. </w:t>
+      </w:r>
+    </w:p>
+    <w:p>
+      <w:pPr>
+        <w:pStyle w:val="ListParagraph"/>
+        <w:numPr>
+          <w:ilvl w:val="0"/>
+          <w:numId w:val="1"/>
+        </w:numPr>
+      </w:pPr>
+      <w:r>
+        <w:t>Inject breakpoints on Bochs without magic breakpoints, via commands file on startup</w:t>
+      </w:r>
+    </w:p>
+    <w:p>
+      <w:pPr>
+        <w:pStyle w:val="ListParagraph"/>
+        <w:numPr>
+          <w:ilvl w:val="0"/>
+          <w:numId w:val="1"/>
+        </w:numPr>
+      </w:pPr>
+      <w:r>
+        <w:t xml:space="preserve">How to change Bochs </w:t>
+      </w:r>
+      <w:r>
+        <w:t xml:space="preserve">display </w:t>
+      </w:r>
+      <w:r>
+        <w:t>resolution.</w:t>
+      </w:r>
+    </w:p>
+    <w:p>
+      <w:pPr>
+        <w:pStyle w:val="ListParagraph"/>
+        <w:numPr>
+          <w:ilvl w:val="0"/>
+          <w:numId w:val="1"/>
+        </w:numPr>
+      </w:pPr>
+      <w:r>
+        <w:t>Change the path order (open first code from linux instead of windows, without removing the windows path via etc/wsl.conf file )</w:t>
+      </w:r>
+    </w:p>
+    <w:p>
+      <w:pPr>
+        <w:pStyle w:val="ListParagraph"/>
+        <w:numPr>
+          <w:ilvl w:val="0"/>
+          <w:numId w:val="1"/>
+        </w:numPr>
+      </w:pPr>
+      <w:r>
+        <w:t>Tools for disks, the old MSDOS debug, and diskedit</w:t>
+      </w:r>
+      <w:r>
+        <w:t>. AccessData FTK Imager, now with a new name Exterro FTK imager.</w:t>
+      </w:r>
+    </w:p>
+    <w:p>
+      <w:pPr>
+        <w:pStyle w:val="Heading1"/>
+      </w:pPr>
+      <w:bookmarkStart w:id="26" w:name="_Toc213004621"/>
+      <w:r>
+        <w:t>Screenshots</w:t>
+      </w:r>
+      <w:bookmarkEnd w:id="26"/>
+    </w:p>
+    <w:p/>
+    <w:p>
+      <w:r>
+        <w:t>31-October-2025</w:t>
+      </w:r>
+    </w:p>
+    <w:p/>
+    <w:p/>
+    <w:p>
+      <w:pPr>
+        <w:keepNext/>
+      </w:pPr>
+      <w:r>
+        <w:rPr>
+          <w:noProof/>
+        </w:rPr>
+        <w:lastRenderedPageBreak/>
         <w:drawing>
           <wp:inline distT="0" distB="0" distL="0" distR="0" wp14:anchorId="13B72F9A" wp14:editId="3497B51B">
             <wp:extent cx="5943600" cy="3763645"/>
@@ -10136,7 +8497,7 @@
                     <pic:cNvPicPr/>
                   </pic:nvPicPr>
                   <pic:blipFill>
-                    <a:blip r:embed="rId22"/>
+                    <a:blip r:embed="rId23"/>
                     <a:stretch>
                       <a:fillRect/>
                     </a:stretch>
@@ -10187,6 +8548,7 @@
         <w:rPr>
           <w:noProof/>
         </w:rPr>
+        <w:lastRenderedPageBreak/>
         <w:drawing>
           <wp:inline distT="0" distB="0" distL="0" distR="0" wp14:anchorId="32D8F6A5" wp14:editId="7ECDF19D">
             <wp:extent cx="5943600" cy="4198620"/>
@@ -10203,7 +8565,7 @@
                     <pic:cNvPicPr/>
                   </pic:nvPicPr>
                   <pic:blipFill>
-                    <a:blip r:embed="rId23"/>
+                    <a:blip r:embed="rId24"/>
                     <a:stretch>
                       <a:fillRect/>
                     </a:stretch>
@@ -10241,15 +8603,7 @@
         </w:r>
       </w:fldSimple>
       <w:r>
-        <w:t xml:space="preserve"> Early </w:t>
-      </w:r>
-      <w:proofErr w:type="spellStart"/>
-      <w:r>
-        <w:t>makefile</w:t>
-      </w:r>
-      <w:proofErr w:type="spellEnd"/>
-      <w:r>
-        <w:t xml:space="preserve"> for the bootloader</w:t>
+        <w:t xml:space="preserve"> Early makefile for the bootloader</w:t>
       </w:r>
       <w:bookmarkEnd w:id="28"/>
     </w:p>
@@ -10284,7 +8638,7 @@
                     <pic:cNvPicPr/>
                   </pic:nvPicPr>
                   <pic:blipFill>
-                    <a:blip r:embed="rId24"/>
+                    <a:blip r:embed="rId25"/>
                     <a:stretch>
                       <a:fillRect/>
                     </a:stretch>
@@ -10353,6 +8707,9 @@
         <w:keepNext/>
       </w:pPr>
       <w:r>
+        <w:rPr>
+          <w:noProof/>
+        </w:rPr>
         <w:lastRenderedPageBreak/>
         <w:drawing>
           <wp:inline distT="0" distB="0" distL="0" distR="0" wp14:anchorId="3269323A" wp14:editId="3178A46E">
@@ -10370,7 +8727,7 @@
                     <pic:cNvPicPr/>
                   </pic:nvPicPr>
                   <pic:blipFill>
-                    <a:blip r:embed="rId25"/>
+                    <a:blip r:embed="rId26"/>
                     <a:stretch>
                       <a:fillRect/>
                     </a:stretch>
@@ -10464,7 +8821,7 @@
             <w:tcW w:w="4675" w:type="dxa"/>
           </w:tcPr>
           <w:p>
-            <w:hyperlink r:id="rId26" w:history="1">
+            <w:hyperlink r:id="rId27" w:history="1">
               <w:r>
                 <w:rPr>
                   <w:rStyle w:val="Hyperlink"/>
@@ -10483,43 +8840,11 @@
             <w:r>
               <w:t xml:space="preserve">bootloader made in assembly. </w:t>
             </w:r>
-            <w:proofErr w:type="spellStart"/>
             <w:r>
               <w:t>diskwrite.c</w:t>
             </w:r>
-            <w:proofErr w:type="spellEnd"/>
             <w:r>
               <w:t>, it looks like a custom FAT32 image writer, which is an idea I am toying with.</w:t>
-            </w:r>
-          </w:p>
-        </w:tc>
-      </w:tr>
-      <w:tr>
-        <w:tc>
-          <w:tcPr>
-            <w:tcW w:w="4675" w:type="dxa"/>
-          </w:tcPr>
-          <w:p>
-            <w:hyperlink r:id="rId27" w:history="1">
-              <w:r>
-                <w:rPr>
-                  <w:rStyle w:val="Hyperlink"/>
-                </w:rPr>
-                <w:t>https://archive.org/details/FAT_Specification/mode/1up</w:t>
-              </w:r>
-            </w:hyperlink>
-            <w:r>
-              <w:t xml:space="preserve"> </w:t>
-            </w:r>
-          </w:p>
-        </w:tc>
-        <w:tc>
-          <w:tcPr>
-            <w:tcW w:w="4675" w:type="dxa"/>
-          </w:tcPr>
-          <w:p>
-            <w:r>
-              <w:t>FAT Reference from Microsoft. Internet archive</w:t>
             </w:r>
           </w:p>
         </w:tc>
@@ -10535,7 +8860,7 @@
                 <w:rPr>
                   <w:rStyle w:val="Hyperlink"/>
                 </w:rPr>
-                <w:t>https://euroassembler.eu/</w:t>
+                <w:t>https://archive.org/details/FAT_Specification/mode/1up</w:t>
               </w:r>
             </w:hyperlink>
             <w:r>
@@ -10549,27 +8874,8 @@
           </w:tcPr>
           <w:p>
             <w:r>
-              <w:t>Yet another assembler. There is a ton of work behind. The macros</w:t>
-            </w:r>
-            <w:r>
-              <w:t xml:space="preserve"> and projects</w:t>
-            </w:r>
-            <w:r>
-              <w:t xml:space="preserve"> section contain a lot of pre-canned structures and </w:t>
-            </w:r>
-            <w:proofErr w:type="spellStart"/>
-            <w:r>
-              <w:t>asm</w:t>
-            </w:r>
-            <w:proofErr w:type="spellEnd"/>
-            <w:r>
-              <w:t xml:space="preserve"> for </w:t>
-            </w:r>
-            <w:proofErr w:type="spellStart"/>
-            <w:r>
-              <w:t>OsDev</w:t>
-            </w:r>
-            <w:proofErr w:type="spellEnd"/>
+              <w:t>FAT Reference from Microsoft. Internet archive</w:t>
+            </w:r>
           </w:p>
         </w:tc>
       </w:tr>
@@ -10584,7 +8890,7 @@
                 <w:rPr>
                   <w:rStyle w:val="Hyperlink"/>
                 </w:rPr>
-                <w:t>https://elm-chan.org/docs/fat_e.html</w:t>
+                <w:t>https://euroassembler.eu/</w:t>
               </w:r>
             </w:hyperlink>
             <w:r>
@@ -10598,7 +8904,13 @@
           </w:tcPr>
           <w:p>
             <w:r>
-              <w:t>FAT stuff</w:t>
+              <w:t>Yet another assembler. There is a ton of work behind. The macros</w:t>
+            </w:r>
+            <w:r>
+              <w:t xml:space="preserve"> and projects</w:t>
+            </w:r>
+            <w:r>
+              <w:t xml:space="preserve"> section contain a lot of pre-canned structures and asm for OsDev</w:t>
             </w:r>
           </w:p>
         </w:tc>
@@ -10614,7 +8926,7 @@
                 <w:rPr>
                   <w:rStyle w:val="Hyperlink"/>
                 </w:rPr>
-                <w:t>https://github.com/lukearend/x86-bootloader</w:t>
+                <w:t>https://elm-chan.org/docs/fat_e.html</w:t>
               </w:r>
             </w:hyperlink>
             <w:r>
@@ -10628,7 +8940,7 @@
           </w:tcPr>
           <w:p>
             <w:r>
-              <w:t>Bootloader assembly, very basic</w:t>
+              <w:t>FAT stuff</w:t>
             </w:r>
           </w:p>
         </w:tc>
@@ -10644,7 +8956,7 @@
                 <w:rPr>
                   <w:rStyle w:val="Hyperlink"/>
                 </w:rPr>
-                <w:t>https://en.wikipedia.org/wiki/Master_boot_record</w:t>
+                <w:t>https://github.com/lukearend/x86-bootloader</w:t>
               </w:r>
             </w:hyperlink>
             <w:r>
@@ -10658,7 +8970,7 @@
           </w:tcPr>
           <w:p>
             <w:r>
-              <w:t>The sector layout section is a good summary.</w:t>
+              <w:t>Bootloader assembly, very basic</w:t>
             </w:r>
           </w:p>
         </w:tc>
@@ -10669,9 +8981,14 @@
             <w:tcW w:w="4675" w:type="dxa"/>
           </w:tcPr>
           <w:p>
-            <w:r>
-              <w:t>docs\Reference\FileSystem\FAT-Specification-Microsoft-Aug2005.pdf</w:t>
-            </w:r>
+            <w:hyperlink r:id="rId32" w:history="1">
+              <w:r>
+                <w:rPr>
+                  <w:rStyle w:val="Hyperlink"/>
+                </w:rPr>
+                <w:t>https://en.wikipedia.org/wiki/Master_boot_record</w:t>
+              </w:r>
+            </w:hyperlink>
             <w:r>
               <w:t xml:space="preserve"> </w:t>
             </w:r>
@@ -10683,78 +9000,7 @@
           </w:tcPr>
           <w:p>
             <w:r>
-              <w:t>PDF FAT reference</w:t>
-            </w:r>
-          </w:p>
-        </w:tc>
-      </w:tr>
-    </w:tbl>
-    <w:p>
-      <w:r>
-        <w:tab/>
-      </w:r>
-    </w:p>
-    <w:p>
-      <w:pPr>
-        <w:pStyle w:val="Heading1"/>
-      </w:pPr>
-      <w:bookmarkStart w:id="32" w:name="_Toc213004623"/>
-      <w:r>
-        <w:t>Clock in/out hours</w:t>
-      </w:r>
-      <w:bookmarkEnd w:id="32"/>
-    </w:p>
-    <w:p/>
-    <w:p>
-      <w:r>
-        <w:t xml:space="preserve">Hours clocked-in includes, coding, research, testing, reading, documenting, </w:t>
-      </w:r>
-      <w:proofErr w:type="spellStart"/>
-      <w:r>
-        <w:t>etc</w:t>
-      </w:r>
-      <w:proofErr w:type="spellEnd"/>
-      <w:r>
-        <w:t>…</w:t>
-      </w:r>
-    </w:p>
-    <w:p/>
-    <w:tbl>
-      <w:tblPr>
-        <w:tblStyle w:val="TableGrid"/>
-        <w:tblW w:w="0" w:type="auto"/>
-        <w:tblLook w:val="04A0" w:firstRow="1" w:lastRow="0" w:firstColumn="1" w:lastColumn="0" w:noHBand="0" w:noVBand="1"/>
-      </w:tblPr>
-      <w:tblGrid>
-        <w:gridCol w:w="4675"/>
-        <w:gridCol w:w="4675"/>
-      </w:tblGrid>
-      <w:tr>
-        <w:tc>
-          <w:tcPr>
-            <w:tcW w:w="4675" w:type="dxa"/>
-          </w:tcPr>
-          <w:p>
-            <w:r>
-              <w:t>Day</w:t>
-            </w:r>
-          </w:p>
-        </w:tc>
-        <w:tc>
-          <w:tcPr>
-            <w:tcW w:w="4675" w:type="dxa"/>
-          </w:tcPr>
-          <w:p>
-            <w:r>
-              <w:t xml:space="preserve">Hours </w:t>
-            </w:r>
-            <w:proofErr w:type="spellStart"/>
-            <w:r>
-              <w:t>aprox</w:t>
-            </w:r>
-            <w:proofErr w:type="spellEnd"/>
-            <w:r>
-              <w:t>.</w:t>
+              <w:t>The sector layout section is a good summary.</w:t>
             </w:r>
           </w:p>
         </w:tc>
@@ -10766,7 +9012,10 @@
           </w:tcPr>
           <w:p>
             <w:r>
-              <w:t>31-October-2025</w:t>
+              <w:t>docs\Reference\FileSystem\FAT-Specification-Microsoft-Aug2005.pdf</w:t>
+            </w:r>
+            <w:r>
+              <w:t xml:space="preserve"> </w:t>
             </w:r>
           </w:p>
         </w:tc>
@@ -10776,22 +9025,62 @@
           </w:tcPr>
           <w:p>
             <w:r>
-              <w:t>4</w:t>
-            </w:r>
-            <w:r>
-              <w:t xml:space="preserve"> hours</w:t>
+              <w:t>PDF FAT reference</w:t>
             </w:r>
           </w:p>
         </w:tc>
       </w:tr>
+    </w:tbl>
+    <w:p>
+      <w:r>
+        <w:tab/>
+      </w:r>
+    </w:p>
+    <w:p>
+      <w:pPr>
+        <w:pStyle w:val="Heading1"/>
+      </w:pPr>
+      <w:bookmarkStart w:id="32" w:name="_Toc213004623"/>
+      <w:r>
+        <w:t>Clock</w:t>
+      </w:r>
+      <w:r>
+        <w:t>ed-</w:t>
+      </w:r>
+      <w:r>
+        <w:t>in hours</w:t>
+      </w:r>
+      <w:bookmarkEnd w:id="32"/>
+    </w:p>
+    <w:p/>
+    <w:p>
+      <w:r>
+        <w:t>Hours clocked-in includes, coding, research, testing, reading, documenting, etc…</w:t>
+      </w:r>
+    </w:p>
+    <w:p/>
+    <w:tbl>
+      <w:tblPr>
+        <w:tblStyle w:val="ListTable4"/>
+        <w:tblW w:w="0" w:type="auto"/>
+        <w:tblLook w:val="04A0" w:firstRow="1" w:lastRow="0" w:firstColumn="1" w:lastColumn="0" w:noHBand="0" w:noVBand="1"/>
+      </w:tblPr>
+      <w:tblGrid>
+        <w:gridCol w:w="4675"/>
+        <w:gridCol w:w="4675"/>
+      </w:tblGrid>
       <w:tr>
+        <w:trPr>
+          <w:cnfStyle w:val="100000000000" w:firstRow="1" w:lastRow="0" w:firstColumn="0" w:lastColumn="0" w:oddVBand="0" w:evenVBand="0" w:oddHBand="0" w:evenHBand="0" w:firstRowFirstColumn="0" w:firstRowLastColumn="0" w:lastRowFirstColumn="0" w:lastRowLastColumn="0"/>
+        </w:trPr>
         <w:tc>
           <w:tcPr>
+            <w:cnfStyle w:val="001000000000" w:firstRow="0" w:lastRow="0" w:firstColumn="1" w:lastColumn="0" w:oddVBand="0" w:evenVBand="0" w:oddHBand="0" w:evenHBand="0" w:firstRowFirstColumn="0" w:firstRowLastColumn="0" w:lastRowFirstColumn="0" w:lastRowLastColumn="0"/>
             <w:tcW w:w="4675" w:type="dxa"/>
           </w:tcPr>
           <w:p>
             <w:r>
-              <w:t>01-November-2025</w:t>
+              <w:t>Day</w:t>
             </w:r>
           </w:p>
         </w:tc>
@@ -10800,23 +9089,27 @@
             <w:tcW w:w="4675" w:type="dxa"/>
           </w:tcPr>
           <w:p>
-            <w:r>
-              <w:t>12</w:t>
-            </w:r>
-            <w:r>
-              <w:t xml:space="preserve"> hours</w:t>
+            <w:pPr>
+              <w:cnfStyle w:val="100000000000" w:firstRow="1" w:lastRow="0" w:firstColumn="0" w:lastColumn="0" w:oddVBand="0" w:evenVBand="0" w:oddHBand="0" w:evenHBand="0" w:firstRowFirstColumn="0" w:firstRowLastColumn="0" w:lastRowFirstColumn="0" w:lastRowLastColumn="0"/>
+            </w:pPr>
+            <w:r>
+              <w:t>Hours aprox.</w:t>
             </w:r>
           </w:p>
         </w:tc>
       </w:tr>
       <w:tr>
+        <w:trPr>
+          <w:cnfStyle w:val="000000100000" w:firstRow="0" w:lastRow="0" w:firstColumn="0" w:lastColumn="0" w:oddVBand="0" w:evenVBand="0" w:oddHBand="1" w:evenHBand="0" w:firstRowFirstColumn="0" w:firstRowLastColumn="0" w:lastRowFirstColumn="0" w:lastRowLastColumn="0"/>
+        </w:trPr>
         <w:tc>
           <w:tcPr>
+            <w:cnfStyle w:val="001000000000" w:firstRow="0" w:lastRow="0" w:firstColumn="1" w:lastColumn="0" w:oddVBand="0" w:evenVBand="0" w:oddHBand="0" w:evenHBand="0" w:firstRowFirstColumn="0" w:firstRowLastColumn="0" w:lastRowFirstColumn="0" w:lastRowLastColumn="0"/>
             <w:tcW w:w="4675" w:type="dxa"/>
           </w:tcPr>
           <w:p>
             <w:r>
-              <w:t>02-November-2025</w:t>
+              <w:t>31-October-2025</w:t>
             </w:r>
           </w:p>
         </w:tc>
@@ -10825,8 +9118,14 @@
             <w:tcW w:w="4675" w:type="dxa"/>
           </w:tcPr>
           <w:p>
-            <w:r>
-              <w:t>8 hours</w:t>
+            <w:pPr>
+              <w:cnfStyle w:val="000000100000" w:firstRow="0" w:lastRow="0" w:firstColumn="0" w:lastColumn="0" w:oddVBand="0" w:evenVBand="0" w:oddHBand="1" w:evenHBand="0" w:firstRowFirstColumn="0" w:firstRowLastColumn="0" w:lastRowFirstColumn="0" w:lastRowLastColumn="0"/>
+            </w:pPr>
+            <w:r>
+              <w:t>4</w:t>
+            </w:r>
+            <w:r>
+              <w:t xml:space="preserve"> hours</w:t>
             </w:r>
           </w:p>
         </w:tc>
@@ -10834,15 +9133,88 @@
       <w:tr>
         <w:tc>
           <w:tcPr>
+            <w:cnfStyle w:val="001000000000" w:firstRow="0" w:lastRow="0" w:firstColumn="1" w:lastColumn="0" w:oddVBand="0" w:evenVBand="0" w:oddHBand="0" w:evenHBand="0" w:firstRowFirstColumn="0" w:firstRowLastColumn="0" w:lastRowFirstColumn="0" w:lastRowLastColumn="0"/>
             <w:tcW w:w="4675" w:type="dxa"/>
           </w:tcPr>
-          <w:p/>
+          <w:p>
+            <w:r>
+              <w:t>01-November-2025</w:t>
+            </w:r>
+          </w:p>
         </w:tc>
         <w:tc>
           <w:tcPr>
             <w:tcW w:w="4675" w:type="dxa"/>
           </w:tcPr>
-          <w:p/>
+          <w:p>
+            <w:pPr>
+              <w:cnfStyle w:val="000000000000" w:firstRow="0" w:lastRow="0" w:firstColumn="0" w:lastColumn="0" w:oddVBand="0" w:evenVBand="0" w:oddHBand="0" w:evenHBand="0" w:firstRowFirstColumn="0" w:firstRowLastColumn="0" w:lastRowFirstColumn="0" w:lastRowLastColumn="0"/>
+            </w:pPr>
+            <w:r>
+              <w:t>12</w:t>
+            </w:r>
+            <w:r>
+              <w:t xml:space="preserve"> hours</w:t>
+            </w:r>
+          </w:p>
+        </w:tc>
+      </w:tr>
+      <w:tr>
+        <w:trPr>
+          <w:cnfStyle w:val="000000100000" w:firstRow="0" w:lastRow="0" w:firstColumn="0" w:lastColumn="0" w:oddVBand="0" w:evenVBand="0" w:oddHBand="1" w:evenHBand="0" w:firstRowFirstColumn="0" w:firstRowLastColumn="0" w:lastRowFirstColumn="0" w:lastRowLastColumn="0"/>
+        </w:trPr>
+        <w:tc>
+          <w:tcPr>
+            <w:cnfStyle w:val="001000000000" w:firstRow="0" w:lastRow="0" w:firstColumn="1" w:lastColumn="0" w:oddVBand="0" w:evenVBand="0" w:oddHBand="0" w:evenHBand="0" w:firstRowFirstColumn="0" w:firstRowLastColumn="0" w:lastRowFirstColumn="0" w:lastRowLastColumn="0"/>
+            <w:tcW w:w="4675" w:type="dxa"/>
+          </w:tcPr>
+          <w:p>
+            <w:r>
+              <w:t>02-November-2025</w:t>
+            </w:r>
+          </w:p>
+        </w:tc>
+        <w:tc>
+          <w:tcPr>
+            <w:tcW w:w="4675" w:type="dxa"/>
+          </w:tcPr>
+          <w:p>
+            <w:pPr>
+              <w:cnfStyle w:val="000000100000" w:firstRow="0" w:lastRow="0" w:firstColumn="0" w:lastColumn="0" w:oddVBand="0" w:evenVBand="0" w:oddHBand="1" w:evenHBand="0" w:firstRowFirstColumn="0" w:firstRowLastColumn="0" w:lastRowFirstColumn="0" w:lastRowLastColumn="0"/>
+            </w:pPr>
+            <w:r>
+              <w:t>8 hours</w:t>
+            </w:r>
+          </w:p>
+        </w:tc>
+      </w:tr>
+      <w:tr>
+        <w:tc>
+          <w:tcPr>
+            <w:cnfStyle w:val="001000000000" w:firstRow="0" w:lastRow="0" w:firstColumn="1" w:lastColumn="0" w:oddVBand="0" w:evenVBand="0" w:oddHBand="0" w:evenHBand="0" w:firstRowFirstColumn="0" w:firstRowLastColumn="0" w:lastRowFirstColumn="0" w:lastRowLastColumn="0"/>
+            <w:tcW w:w="4675" w:type="dxa"/>
+          </w:tcPr>
+          <w:p>
+            <w:r>
+              <w:t>03-November-2025</w:t>
+            </w:r>
+          </w:p>
+        </w:tc>
+        <w:tc>
+          <w:tcPr>
+            <w:tcW w:w="4675" w:type="dxa"/>
+          </w:tcPr>
+          <w:p>
+            <w:pPr>
+              <w:cnfStyle w:val="000000000000" w:firstRow="0" w:lastRow="0" w:firstColumn="0" w:lastColumn="0" w:oddVBand="0" w:evenVBand="0" w:oddHBand="0" w:evenHBand="0" w:firstRowFirstColumn="0" w:firstRowLastColumn="0" w:lastRowFirstColumn="0" w:lastRowLastColumn="0"/>
+            </w:pPr>
+            <w:r>
+              <w:t>2</w:t>
+            </w:r>
+            <w:r>
+              <w:t xml:space="preserve"> hours</w:t>
+            </w:r>
+          </w:p>
         </w:tc>
       </w:tr>
     </w:tbl>
@@ -11379,7 +9751,7 @@
       </w:r>
     </w:p>
     <w:sectPr>
-      <w:headerReference w:type="default" r:id="rId32"/>
+      <w:headerReference w:type="default" r:id="rId33"/>
       <w:pgSz w:w="12240" w:h="15840"/>
       <w:pgMar w:top="1440" w:right="1440" w:bottom="1440" w:left="1440" w:header="720" w:footer="720" w:gutter="0"/>
       <w:pgNumType w:start="0"/>
@@ -12081,6 +10453,12 @@
   </w:num>
   <w:num w:numId="35" w16cid:durableId="1390111797">
     <w:abstractNumId w:val="1"/>
+  </w:num>
+  <w:num w:numId="36" w16cid:durableId="701248411">
+    <w:abstractNumId w:val="0"/>
+  </w:num>
+  <w:num w:numId="37" w16cid:durableId="1080831022">
+    <w:abstractNumId w:val="0"/>
   </w:num>
 </w:numbering>
 </file>
@@ -13320,6 +11698,186 @@
       <w:u w:val="single"/>
     </w:rPr>
   </w:style>
+  <w:style w:type="table" w:styleId="GridTable5Dark-Accent1">
+    <w:name w:val="Grid Table 5 Dark Accent 1"/>
+    <w:basedOn w:val="TableNormal"/>
+    <w:uiPriority w:val="50"/>
+    <w:rsid w:val="00D123CF"/>
+    <w:pPr>
+      <w:spacing w:after="0" w:line="240" w:lineRule="auto"/>
+    </w:pPr>
+    <w:tblPr>
+      <w:tblStyleRowBandSize w:val="1"/>
+      <w:tblStyleColBandSize w:val="1"/>
+      <w:tblBorders>
+        <w:top w:val="single" w:sz="4" w:space="0" w:color="FFFFFF" w:themeColor="background1"/>
+        <w:left w:val="single" w:sz="4" w:space="0" w:color="FFFFFF" w:themeColor="background1"/>
+        <w:bottom w:val="single" w:sz="4" w:space="0" w:color="FFFFFF" w:themeColor="background1"/>
+        <w:right w:val="single" w:sz="4" w:space="0" w:color="FFFFFF" w:themeColor="background1"/>
+        <w:insideH w:val="single" w:sz="4" w:space="0" w:color="FFFFFF" w:themeColor="background1"/>
+        <w:insideV w:val="single" w:sz="4" w:space="0" w:color="FFFFFF" w:themeColor="background1"/>
+      </w:tblBorders>
+    </w:tblPr>
+    <w:tcPr>
+      <w:shd w:val="clear" w:color="auto" w:fill="FDE5CC" w:themeFill="accent1" w:themeFillTint="33"/>
+    </w:tcPr>
+    <w:tblStylePr w:type="firstRow">
+      <w:rPr>
+        <w:b/>
+        <w:bCs/>
+        <w:color w:val="FFFFFF" w:themeColor="background1"/>
+      </w:rPr>
+      <w:tblPr/>
+      <w:tcPr>
+        <w:tcBorders>
+          <w:top w:val="single" w:sz="4" w:space="0" w:color="FFFFFF" w:themeColor="background1"/>
+          <w:left w:val="single" w:sz="4" w:space="0" w:color="FFFFFF" w:themeColor="background1"/>
+          <w:right w:val="single" w:sz="4" w:space="0" w:color="FFFFFF" w:themeColor="background1"/>
+          <w:insideH w:val="nil"/>
+          <w:insideV w:val="nil"/>
+        </w:tcBorders>
+        <w:shd w:val="clear" w:color="auto" w:fill="F07F09" w:themeFill="accent1"/>
+      </w:tcPr>
+    </w:tblStylePr>
+    <w:tblStylePr w:type="lastRow">
+      <w:rPr>
+        <w:b/>
+        <w:bCs/>
+        <w:color w:val="FFFFFF" w:themeColor="background1"/>
+      </w:rPr>
+      <w:tblPr/>
+      <w:tcPr>
+        <w:tcBorders>
+          <w:left w:val="single" w:sz="4" w:space="0" w:color="FFFFFF" w:themeColor="background1"/>
+          <w:bottom w:val="single" w:sz="4" w:space="0" w:color="FFFFFF" w:themeColor="background1"/>
+          <w:right w:val="single" w:sz="4" w:space="0" w:color="FFFFFF" w:themeColor="background1"/>
+          <w:insideH w:val="nil"/>
+          <w:insideV w:val="nil"/>
+        </w:tcBorders>
+        <w:shd w:val="clear" w:color="auto" w:fill="F07F09" w:themeFill="accent1"/>
+      </w:tcPr>
+    </w:tblStylePr>
+    <w:tblStylePr w:type="firstCol">
+      <w:rPr>
+        <w:b/>
+        <w:bCs/>
+        <w:color w:val="FFFFFF" w:themeColor="background1"/>
+      </w:rPr>
+      <w:tblPr/>
+      <w:tcPr>
+        <w:tcBorders>
+          <w:top w:val="single" w:sz="4" w:space="0" w:color="FFFFFF" w:themeColor="background1"/>
+          <w:left w:val="single" w:sz="4" w:space="0" w:color="FFFFFF" w:themeColor="background1"/>
+          <w:bottom w:val="single" w:sz="4" w:space="0" w:color="FFFFFF" w:themeColor="background1"/>
+          <w:insideV w:val="nil"/>
+        </w:tcBorders>
+        <w:shd w:val="clear" w:color="auto" w:fill="F07F09" w:themeFill="accent1"/>
+      </w:tcPr>
+    </w:tblStylePr>
+    <w:tblStylePr w:type="lastCol">
+      <w:rPr>
+        <w:b/>
+        <w:bCs/>
+        <w:color w:val="FFFFFF" w:themeColor="background1"/>
+      </w:rPr>
+      <w:tblPr/>
+      <w:tcPr>
+        <w:tcBorders>
+          <w:top w:val="single" w:sz="4" w:space="0" w:color="FFFFFF" w:themeColor="background1"/>
+          <w:bottom w:val="single" w:sz="4" w:space="0" w:color="FFFFFF" w:themeColor="background1"/>
+          <w:right w:val="single" w:sz="4" w:space="0" w:color="FFFFFF" w:themeColor="background1"/>
+          <w:insideV w:val="nil"/>
+        </w:tcBorders>
+        <w:shd w:val="clear" w:color="auto" w:fill="F07F09" w:themeFill="accent1"/>
+      </w:tcPr>
+    </w:tblStylePr>
+    <w:tblStylePr w:type="band1Vert">
+      <w:tblPr/>
+      <w:tcPr>
+        <w:shd w:val="clear" w:color="auto" w:fill="FBCB9A" w:themeFill="accent1" w:themeFillTint="66"/>
+      </w:tcPr>
+    </w:tblStylePr>
+    <w:tblStylePr w:type="band1Horz">
+      <w:tblPr/>
+      <w:tcPr>
+        <w:shd w:val="clear" w:color="auto" w:fill="FBCB9A" w:themeFill="accent1" w:themeFillTint="66"/>
+      </w:tcPr>
+    </w:tblStylePr>
+  </w:style>
+  <w:style w:type="table" w:styleId="ListTable4">
+    <w:name w:val="List Table 4"/>
+    <w:basedOn w:val="TableNormal"/>
+    <w:uiPriority w:val="49"/>
+    <w:rsid w:val="00D123CF"/>
+    <w:pPr>
+      <w:spacing w:after="0" w:line="240" w:lineRule="auto"/>
+    </w:pPr>
+    <w:tblPr>
+      <w:tblStyleRowBandSize w:val="1"/>
+      <w:tblStyleColBandSize w:val="1"/>
+      <w:tblBorders>
+        <w:top w:val="single" w:sz="4" w:space="0" w:color="666666" w:themeColor="text1" w:themeTint="99"/>
+        <w:left w:val="single" w:sz="4" w:space="0" w:color="666666" w:themeColor="text1" w:themeTint="99"/>
+        <w:bottom w:val="single" w:sz="4" w:space="0" w:color="666666" w:themeColor="text1" w:themeTint="99"/>
+        <w:right w:val="single" w:sz="4" w:space="0" w:color="666666" w:themeColor="text1" w:themeTint="99"/>
+        <w:insideH w:val="single" w:sz="4" w:space="0" w:color="666666" w:themeColor="text1" w:themeTint="99"/>
+      </w:tblBorders>
+    </w:tblPr>
+    <w:tblStylePr w:type="firstRow">
+      <w:rPr>
+        <w:b/>
+        <w:bCs/>
+        <w:color w:val="FFFFFF" w:themeColor="background1"/>
+      </w:rPr>
+      <w:tblPr/>
+      <w:tcPr>
+        <w:tcBorders>
+          <w:top w:val="single" w:sz="4" w:space="0" w:color="000000" w:themeColor="text1"/>
+          <w:left w:val="single" w:sz="4" w:space="0" w:color="000000" w:themeColor="text1"/>
+          <w:bottom w:val="single" w:sz="4" w:space="0" w:color="000000" w:themeColor="text1"/>
+          <w:right w:val="single" w:sz="4" w:space="0" w:color="000000" w:themeColor="text1"/>
+          <w:insideH w:val="nil"/>
+        </w:tcBorders>
+        <w:shd w:val="clear" w:color="auto" w:fill="000000" w:themeFill="text1"/>
+      </w:tcPr>
+    </w:tblStylePr>
+    <w:tblStylePr w:type="lastRow">
+      <w:rPr>
+        <w:b/>
+        <w:bCs/>
+      </w:rPr>
+      <w:tblPr/>
+      <w:tcPr>
+        <w:tcBorders>
+          <w:top w:val="double" w:sz="4" w:space="0" w:color="666666" w:themeColor="text1" w:themeTint="99"/>
+        </w:tcBorders>
+      </w:tcPr>
+    </w:tblStylePr>
+    <w:tblStylePr w:type="firstCol">
+      <w:rPr>
+        <w:b/>
+        <w:bCs/>
+      </w:rPr>
+    </w:tblStylePr>
+    <w:tblStylePr w:type="lastCol">
+      <w:rPr>
+        <w:b/>
+        <w:bCs/>
+      </w:rPr>
+    </w:tblStylePr>
+    <w:tblStylePr w:type="band1Vert">
+      <w:tblPr/>
+      <w:tcPr>
+        <w:shd w:val="clear" w:color="auto" w:fill="CCCCCC" w:themeFill="text1" w:themeFillTint="33"/>
+      </w:tcPr>
+    </w:tblStylePr>
+    <w:tblStylePr w:type="band1Horz">
+      <w:tblPr/>
+      <w:tcPr>
+        <w:shd w:val="clear" w:color="auto" w:fill="CCCCCC" w:themeFill="text1" w:themeFillTint="33"/>
+      </w:tcPr>
+    </w:tblStylePr>
+  </w:style>
 </w:styles>
 </file>
 

</xml_diff>

<commit_message>
emptydisk01 tool completed. No commits breadcrum because the filesystem now is on WSL
</commit_message>
<xml_diff>
--- a/docs/TusMuertos-v2.0-Design.docx
+++ b/docs/TusMuertos-v2.0-Design.docx
@@ -3865,8 +3865,13 @@
         <w:t>/Zig</w:t>
       </w:r>
       <w:r>
-        <w:t xml:space="preserve"> for challenge. NASM assembly for bootloader</w:t>
-      </w:r>
+        <w:t xml:space="preserve"> for challenge. NASM assembly for </w:t>
+      </w:r>
+      <w:proofErr w:type="gramStart"/>
+      <w:r>
+        <w:t>bootloader</w:t>
+      </w:r>
+      <w:proofErr w:type="gramEnd"/>
       <w:r>
         <w:t xml:space="preserve">. </w:t>
       </w:r>
@@ -4103,7 +4108,15 @@
         </w:numPr>
       </w:pPr>
       <w:r>
-        <w:t>Image, bin editor, concatenation, elf info, debug, tracer, etc……</w:t>
+        <w:t xml:space="preserve">Image, bin editor, concatenation, elf info, debug, tracer, </w:t>
+      </w:r>
+      <w:proofErr w:type="spellStart"/>
+      <w:r>
+        <w:t>etc</w:t>
+      </w:r>
+      <w:proofErr w:type="spellEnd"/>
+      <w:r>
+        <w:t>……</w:t>
       </w:r>
     </w:p>
     <w:p/>
@@ -4175,7 +4188,15 @@
         </w:numPr>
       </w:pPr>
       <w:r>
-        <w:t>2 Stages. Minimal first stage until Protected mode + Second stage to Long mode</w:t>
+        <w:t xml:space="preserve">2 Stages. Minimal first stage until Protected mode + Second stage to </w:t>
+      </w:r>
+      <w:proofErr w:type="gramStart"/>
+      <w:r>
+        <w:t>Long</w:t>
+      </w:r>
+      <w:proofErr w:type="gramEnd"/>
+      <w:r>
+        <w:t xml:space="preserve"> mode</w:t>
       </w:r>
     </w:p>
     <w:p>
@@ -4338,6 +4359,7 @@
           <w:numId w:val="1"/>
         </w:numPr>
       </w:pPr>
+      <w:proofErr w:type="gramStart"/>
       <w:r>
         <w:t>Print early status</w:t>
       </w:r>
@@ -4350,6 +4372,7 @@
         </w:rPr>
         <w:t>✅</w:t>
       </w:r>
+      <w:proofErr w:type="gramEnd"/>
     </w:p>
     <w:p>
       <w:pPr>
@@ -4445,7 +4468,15 @@
         </w:numPr>
       </w:pPr>
       <w:r>
-        <w:t>Jump to Protected mode if Stage1 did not change mode.</w:t>
+        <w:t xml:space="preserve">Jump to Protected mode if Stage1 </w:t>
+      </w:r>
+      <w:proofErr w:type="gramStart"/>
+      <w:r>
+        <w:t>did</w:t>
+      </w:r>
+      <w:proofErr w:type="gramEnd"/>
+      <w:r>
+        <w:t xml:space="preserve"> not change mode.</w:t>
       </w:r>
     </w:p>
     <w:p>
@@ -4457,7 +4488,23 @@
         </w:numPr>
       </w:pPr>
       <w:r>
-        <w:t>Enable A20, or at least check. There are multiple strategies for this. Some platforms have fast enable 0x92, or they come with A20 already enable. XXXX</w:t>
+        <w:t xml:space="preserve">Enable </w:t>
+      </w:r>
+      <w:proofErr w:type="gramStart"/>
+      <w:r>
+        <w:t>A20, or</w:t>
+      </w:r>
+      <w:proofErr w:type="gramEnd"/>
+      <w:r>
+        <w:t xml:space="preserve"> at least check. There are multiple strategies for this. Some platforms have fast </w:t>
+      </w:r>
+      <w:proofErr w:type="gramStart"/>
+      <w:r>
+        <w:t>enable</w:t>
+      </w:r>
+      <w:proofErr w:type="gramEnd"/>
+      <w:r>
+        <w:t xml:space="preserve"> 0x92, or they come with A20 already enable. XXXX</w:t>
       </w:r>
     </w:p>
     <w:p>
@@ -4481,7 +4528,15 @@
         </w:numPr>
       </w:pPr>
       <w:r>
-        <w:t>Gather info for the kernel: Memory, graphics, bios, acpi, others…</w:t>
+        <w:t xml:space="preserve">Gather info for the kernel: Memory, graphics, bios, </w:t>
+      </w:r>
+      <w:proofErr w:type="spellStart"/>
+      <w:r>
+        <w:t>acpi</w:t>
+      </w:r>
+      <w:proofErr w:type="spellEnd"/>
+      <w:r>
+        <w:t>, others…</w:t>
       </w:r>
     </w:p>
     <w:p>
@@ -4505,7 +4560,15 @@
         </w:numPr>
       </w:pPr>
       <w:r>
-        <w:t>Flat binary: Explore this option, maybe is simpler</w:t>
+        <w:t xml:space="preserve">Flat binary: Explore this option, </w:t>
+      </w:r>
+      <w:proofErr w:type="gramStart"/>
+      <w:r>
+        <w:t>maybe</w:t>
+      </w:r>
+      <w:proofErr w:type="gramEnd"/>
+      <w:r>
+        <w:t xml:space="preserve"> is simpler</w:t>
       </w:r>
     </w:p>
     <w:p>
@@ -4517,7 +4580,15 @@
         </w:numPr>
       </w:pPr>
       <w:r>
-        <w:t>ELF: Parser + segments + etc…</w:t>
+        <w:t xml:space="preserve">ELF: Parser + segments + </w:t>
+      </w:r>
+      <w:proofErr w:type="spellStart"/>
+      <w:r>
+        <w:t>etc</w:t>
+      </w:r>
+      <w:proofErr w:type="spellEnd"/>
+      <w:r>
+        <w:t>…</w:t>
       </w:r>
     </w:p>
     <w:p>
@@ -4553,7 +4624,15 @@
         </w:numPr>
       </w:pPr>
       <w:r>
-        <w:t>Verify if long mode if possible, for completeness</w:t>
+        <w:t xml:space="preserve">Verify if long </w:t>
+      </w:r>
+      <w:proofErr w:type="gramStart"/>
+      <w:r>
+        <w:t>mode</w:t>
+      </w:r>
+      <w:proofErr w:type="gramEnd"/>
+      <w:r>
+        <w:t xml:space="preserve"> if possible, for completeness</w:t>
       </w:r>
     </w:p>
     <w:p>
@@ -4699,7 +4778,15 @@
         </w:numPr>
       </w:pPr>
       <w:r>
-        <w:t>FAT32 formater (with the idea to include FAT12/16, HD/Floppy)</w:t>
+        <w:t xml:space="preserve">FAT32 </w:t>
+      </w:r>
+      <w:proofErr w:type="spellStart"/>
+      <w:r>
+        <w:t>formater</w:t>
+      </w:r>
+      <w:proofErr w:type="spellEnd"/>
+      <w:r>
+        <w:t xml:space="preserve"> (with the idea to include FAT12/16, HD/Floppy)</w:t>
       </w:r>
     </w:p>
     <w:p>
@@ -4750,7 +4837,15 @@
         </w:numPr>
       </w:pPr>
       <w:r>
-        <w:t>Automate the process of creating a binary image file to load as floppy/usb.</w:t>
+        <w:t>Automate the process of creating a binary image file to load as floppy/</w:t>
+      </w:r>
+      <w:proofErr w:type="spellStart"/>
+      <w:r>
+        <w:t>usb</w:t>
+      </w:r>
+      <w:proofErr w:type="spellEnd"/>
+      <w:r>
+        <w:t>.</w:t>
       </w:r>
     </w:p>
     <w:p>
@@ -4762,7 +4857,15 @@
         </w:numPr>
       </w:pPr>
       <w:r>
-        <w:t>It creates an MBR and VBR(with BPB) to boot and have a FAT12/16/32 structure</w:t>
+        <w:t xml:space="preserve">It creates an MBR and </w:t>
+      </w:r>
+      <w:proofErr w:type="gramStart"/>
+      <w:r>
+        <w:t>VBR(</w:t>
+      </w:r>
+      <w:proofErr w:type="gramEnd"/>
+      <w:r>
+        <w:t>with BPB) to boot and have a FAT12/16/32 structure</w:t>
       </w:r>
     </w:p>
     <w:p>
@@ -4846,8 +4949,13 @@
         </w:numPr>
       </w:pPr>
       <w:r>
-        <w:t>Binary Name: fatimagecreator</w:t>
-      </w:r>
+        <w:t xml:space="preserve">Binary Name: </w:t>
+      </w:r>
+      <w:proofErr w:type="spellStart"/>
+      <w:r>
+        <w:t>fatimagecreator</w:t>
+      </w:r>
+      <w:proofErr w:type="spellEnd"/>
     </w:p>
     <w:p>
       <w:pPr>
@@ -4926,9 +5034,19 @@
       <w:r>
         <w:t xml:space="preserve">sector0.bit </w:t>
       </w:r>
-      <w:r>
-        <w:t>files_to_add, output file, floppy or hd</w:t>
-      </w:r>
+      <w:proofErr w:type="spellStart"/>
+      <w:r>
+        <w:t>files_to_add</w:t>
+      </w:r>
+      <w:proofErr w:type="spellEnd"/>
+      <w:r>
+        <w:t xml:space="preserve">, output file, floppy or </w:t>
+      </w:r>
+      <w:proofErr w:type="spellStart"/>
+      <w:r>
+        <w:t>hd</w:t>
+      </w:r>
+      <w:proofErr w:type="spellEnd"/>
       <w:r>
         <w:t>, sector0.bin</w:t>
       </w:r>
@@ -4981,7 +5099,15 @@
         </w:numPr>
       </w:pPr>
       <w:r>
-        <w:t>Inject the FAT structure on the disk</w:t>
+        <w:t xml:space="preserve">Inject the FAT structure </w:t>
+      </w:r>
+      <w:proofErr w:type="gramStart"/>
+      <w:r>
+        <w:t>on</w:t>
+      </w:r>
+      <w:proofErr w:type="gramEnd"/>
+      <w:r>
+        <w:t xml:space="preserve"> the disk</w:t>
       </w:r>
     </w:p>
     <w:p>
@@ -4993,7 +5119,15 @@
         </w:numPr>
       </w:pPr>
       <w:r>
-        <w:t>Inject the sector0.bin on offset 0x00.</w:t>
+        <w:t xml:space="preserve">Inject the sector0.bin </w:t>
+      </w:r>
+      <w:proofErr w:type="gramStart"/>
+      <w:r>
+        <w:t>on</w:t>
+      </w:r>
+      <w:proofErr w:type="gramEnd"/>
+      <w:r>
+        <w:t xml:space="preserve"> offset 0x00.</w:t>
       </w:r>
     </w:p>
     <w:p>
@@ -5043,12 +5177,59 @@
           <w:numId w:val="1"/>
         </w:numPr>
       </w:pPr>
-      <w:r>
-        <w:t>Fatimagecreator file01 file02 file03 file03 outputfile.img floppy/hd size_mb(1.44MB/xxxMB</w:t>
-      </w:r>
-      <w:r>
-        <w:t>) bootloader.bin</w:t>
-      </w:r>
+      <w:proofErr w:type="spellStart"/>
+      <w:r>
+        <w:t>Fatimagecreator</w:t>
+      </w:r>
+      <w:proofErr w:type="spellEnd"/>
+      <w:r>
+        <w:t xml:space="preserve"> file01 file02 file03 </w:t>
+      </w:r>
+      <w:proofErr w:type="spellStart"/>
+      <w:r>
+        <w:t>file03</w:t>
+      </w:r>
+      <w:proofErr w:type="spellEnd"/>
+      <w:r>
+        <w:t xml:space="preserve"> </w:t>
+      </w:r>
+      <w:proofErr w:type="spellStart"/>
+      <w:r>
+        <w:t>outputfile.img</w:t>
+      </w:r>
+      <w:proofErr w:type="spellEnd"/>
+      <w:r>
+        <w:t xml:space="preserve"> floppy/</w:t>
+      </w:r>
+      <w:proofErr w:type="spellStart"/>
+      <w:r>
+        <w:t>hd</w:t>
+      </w:r>
+      <w:proofErr w:type="spellEnd"/>
+      <w:r>
+        <w:t xml:space="preserve"> </w:t>
+      </w:r>
+      <w:proofErr w:type="spellStart"/>
+      <w:r>
+        <w:t>size_mb</w:t>
+      </w:r>
+      <w:proofErr w:type="spellEnd"/>
+      <w:r>
+        <w:t>(1.44MB/</w:t>
+      </w:r>
+      <w:proofErr w:type="spellStart"/>
+      <w:r>
+        <w:t>xxxMB</w:t>
+      </w:r>
+      <w:proofErr w:type="spellEnd"/>
+      <w:r>
+        <w:t xml:space="preserve">) </w:t>
+      </w:r>
+      <w:proofErr w:type="spellStart"/>
+      <w:r>
+        <w:t>bootloader.bin</w:t>
+      </w:r>
+      <w:proofErr w:type="spellEnd"/>
     </w:p>
     <w:p/>
     <w:p/>
@@ -5391,6 +5572,7 @@
                 <w:szCs w:val="16"/>
               </w:rPr>
             </w:pPr>
+            <w:proofErr w:type="spellStart"/>
             <w:r>
               <w:rPr>
                 <w:sz w:val="16"/>
@@ -5398,6 +5580,7 @@
               </w:rPr>
               <w:t>xxxxxxxxxxxxxxxxxx</w:t>
             </w:r>
+            <w:proofErr w:type="spellEnd"/>
           </w:p>
         </w:tc>
       </w:tr>
@@ -6412,6 +6595,7 @@
                 <w:szCs w:val="16"/>
               </w:rPr>
             </w:pPr>
+            <w:proofErr w:type="spellStart"/>
             <w:r>
               <w:rPr>
                 <w:sz w:val="16"/>
@@ -6419,6 +6603,7 @@
               </w:rPr>
               <w:t>xxxxxxxxxxxxxxxxxx</w:t>
             </w:r>
+            <w:proofErr w:type="spellEnd"/>
           </w:p>
         </w:tc>
       </w:tr>
@@ -7780,6 +7965,7 @@
                 <w:szCs w:val="16"/>
               </w:rPr>
             </w:pPr>
+            <w:proofErr w:type="spellStart"/>
             <w:r>
               <w:rPr>
                 <w:sz w:val="16"/>
@@ -7787,6 +7973,7 @@
               </w:rPr>
               <w:t>xxxxxxxxxxxxxxxxxx</w:t>
             </w:r>
+            <w:proofErr w:type="spellEnd"/>
           </w:p>
         </w:tc>
       </w:tr>
@@ -9325,7 +9512,15 @@
         </w:numPr>
       </w:pPr>
       <w:r>
-        <w:t xml:space="preserve">Non-partitioned storage, such as floppy, use VBR. First sector, physical C/H/S 0,0,1 . Note the sector counting </w:t>
+        <w:t>Non-partitioned storage, such as floppy, use VBR. First sector, physical C/H/S 0,0,</w:t>
+      </w:r>
+      <w:proofErr w:type="gramStart"/>
+      <w:r>
+        <w:t>1 .</w:t>
+      </w:r>
+      <w:proofErr w:type="gramEnd"/>
+      <w:r>
+        <w:t xml:space="preserve"> Note the sector counting </w:t>
       </w:r>
       <w:r>
         <w:t>begins</w:t>
@@ -9354,8 +9549,13 @@
           <w:numId w:val="1"/>
         </w:numPr>
       </w:pPr>
-      <w:r>
-        <w:t>Formated a USB drive:</w:t>
+      <w:proofErr w:type="spellStart"/>
+      <w:r>
+        <w:t>Formated</w:t>
+      </w:r>
+      <w:proofErr w:type="spellEnd"/>
+      <w:r>
+        <w:t xml:space="preserve"> a USB drive:</w:t>
       </w:r>
     </w:p>
     <w:p>
@@ -9427,7 +9627,15 @@
         </w:numPr>
       </w:pPr>
       <w:r>
-        <w:t>Open the Disk using HxD (Open disk option is brilliant!)</w:t>
+        <w:t xml:space="preserve">Open the Disk using </w:t>
+      </w:r>
+      <w:proofErr w:type="spellStart"/>
+      <w:r>
+        <w:t>HxD</w:t>
+      </w:r>
+      <w:proofErr w:type="spellEnd"/>
+      <w:r>
+        <w:t xml:space="preserve"> (Open disk option is brilliant!)</w:t>
       </w:r>
     </w:p>
     <w:p>
@@ -9445,8 +9653,21 @@
         <w:t>, sector 2048 contains the BPB of a partition.</w:t>
       </w:r>
       <w:r>
-        <w:t xml:space="preserve"> Both can be see easily using HxD</w:t>
-      </w:r>
+        <w:t xml:space="preserve"> Both can be </w:t>
+      </w:r>
+      <w:proofErr w:type="gramStart"/>
+      <w:r>
+        <w:t>see</w:t>
+      </w:r>
+      <w:proofErr w:type="gramEnd"/>
+      <w:r>
+        <w:t xml:space="preserve"> easily using </w:t>
+      </w:r>
+      <w:proofErr w:type="spellStart"/>
+      <w:r>
+        <w:t>HxD</w:t>
+      </w:r>
+      <w:proofErr w:type="spellEnd"/>
     </w:p>
     <w:p>
       <w:pPr>
@@ -9457,7 +9678,15 @@
         </w:numPr>
       </w:pPr>
       <w:r>
-        <w:t xml:space="preserve">Partition information extracted from the 4x16 bytes before the boot magic number. The first value begins at </w:t>
+        <w:t xml:space="preserve">Partition information </w:t>
+      </w:r>
+      <w:proofErr w:type="gramStart"/>
+      <w:r>
+        <w:t>extracted</w:t>
+      </w:r>
+      <w:proofErr w:type="gramEnd"/>
+      <w:r>
+        <w:t xml:space="preserve"> from the 4x16 bytes before the boot magic number. The first value begins at </w:t>
       </w:r>
       <w:r>
         <w:t>0x1BE</w:t>
@@ -9475,7 +9704,23 @@
         </w:numPr>
       </w:pPr>
       <w:r>
-        <w:t>Exported first 512 to a file using HxD, then used ImHEx disassembler feature to see the code. 16bits-x86-LitteEndian.</w:t>
+        <w:t xml:space="preserve">Exported first 512 to a file using </w:t>
+      </w:r>
+      <w:proofErr w:type="spellStart"/>
+      <w:r>
+        <w:t>HxD</w:t>
+      </w:r>
+      <w:proofErr w:type="spellEnd"/>
+      <w:r>
+        <w:t xml:space="preserve">, then used </w:t>
+      </w:r>
+      <w:proofErr w:type="spellStart"/>
+      <w:r>
+        <w:t>ImHEx</w:t>
+      </w:r>
+      <w:proofErr w:type="spellEnd"/>
+      <w:r>
+        <w:t xml:space="preserve"> disassembler feature to see the code. 16bits-x86-LitteEndian.</w:t>
       </w:r>
     </w:p>
     <w:p>
@@ -9612,8 +9857,13 @@
       <w:r>
         <w:t xml:space="preserve"> Dissection of the first partition using ChatGPT. </w:t>
       </w:r>
-      <w:r>
-        <w:t>Is correct?</w:t>
+      <w:proofErr w:type="gramStart"/>
+      <w:r>
+        <w:t>Is</w:t>
+      </w:r>
+      <w:proofErr w:type="gramEnd"/>
+      <w:r>
+        <w:t xml:space="preserve"> correct?</w:t>
       </w:r>
       <w:bookmarkEnd w:id="10"/>
     </w:p>
@@ -9921,6 +10171,7 @@
       <w:r>
         <w:t>Invoke explorer Windows using “</w:t>
       </w:r>
+      <w:proofErr w:type="gramStart"/>
       <w:r>
         <w:rPr>
           <w:b/>
@@ -9928,6 +10179,7 @@
         </w:rPr>
         <w:t>explorer.exe .</w:t>
       </w:r>
+      <w:proofErr w:type="gramEnd"/>
       <w:r>
         <w:t>”</w:t>
       </w:r>
@@ -10069,8 +10321,13 @@
           <w:bCs/>
         </w:rPr>
       </w:pPr>
-      <w:r>
-        <w:t xml:space="preserve">Also you can net use </w:t>
+      <w:proofErr w:type="gramStart"/>
+      <w:r>
+        <w:t>Also</w:t>
+      </w:r>
+      <w:proofErr w:type="gramEnd"/>
+      <w:r>
+        <w:t xml:space="preserve"> you can net use </w:t>
       </w:r>
       <w:r>
         <w:rPr>
@@ -10115,37 +10372,79 @@
       <w:r>
         <w:t>Example: “</w:t>
       </w:r>
+      <w:proofErr w:type="spellStart"/>
       <w:r>
         <w:rPr>
           <w:b/>
           <w:bCs/>
         </w:rPr>
-        <w:t>wsl ls -la</w:t>
-      </w:r>
-      <w:r>
-        <w:t>”</w:t>
-      </w:r>
-      <w:r>
-        <w:t xml:space="preserve"> will output Windos folder but using Linux ls</w:t>
-      </w:r>
-    </w:p>
-    <w:p>
-      <w:pPr>
-        <w:pStyle w:val="ListParagraph"/>
-        <w:numPr>
-          <w:ilvl w:val="3"/>
-          <w:numId w:val="1"/>
-        </w:numPr>
-      </w:pPr>
-      <w:r>
-        <w:t xml:space="preserve">Example: </w:t>
-      </w:r>
+        <w:t>wsl</w:t>
+      </w:r>
+      <w:proofErr w:type="spellEnd"/>
       <w:r>
         <w:rPr>
           <w:b/>
           <w:bCs/>
         </w:rPr>
-        <w:t>wsl ls -la | findstr "git"</w:t>
+        <w:t xml:space="preserve"> ls -la</w:t>
+      </w:r>
+      <w:r>
+        <w:t>”</w:t>
+      </w:r>
+      <w:r>
+        <w:t xml:space="preserve"> will output </w:t>
+      </w:r>
+      <w:proofErr w:type="spellStart"/>
+      <w:r>
+        <w:t>Windos</w:t>
+      </w:r>
+      <w:proofErr w:type="spellEnd"/>
+      <w:r>
+        <w:t xml:space="preserve"> folder but using Linux ls</w:t>
+      </w:r>
+    </w:p>
+    <w:p>
+      <w:pPr>
+        <w:pStyle w:val="ListParagraph"/>
+        <w:numPr>
+          <w:ilvl w:val="3"/>
+          <w:numId w:val="1"/>
+        </w:numPr>
+      </w:pPr>
+      <w:r>
+        <w:t xml:space="preserve">Example: </w:t>
+      </w:r>
+      <w:proofErr w:type="spellStart"/>
+      <w:r>
+        <w:rPr>
+          <w:b/>
+          <w:bCs/>
+        </w:rPr>
+        <w:t>wsl</w:t>
+      </w:r>
+      <w:proofErr w:type="spellEnd"/>
+      <w:r>
+        <w:rPr>
+          <w:b/>
+          <w:bCs/>
+        </w:rPr>
+        <w:t xml:space="preserve"> ls -la | </w:t>
+      </w:r>
+      <w:proofErr w:type="spellStart"/>
+      <w:r>
+        <w:rPr>
+          <w:b/>
+          <w:bCs/>
+        </w:rPr>
+        <w:t>findstr</w:t>
+      </w:r>
+      <w:proofErr w:type="spellEnd"/>
+      <w:r>
+        <w:rPr>
+          <w:b/>
+          <w:bCs/>
+        </w:rPr>
+        <w:t xml:space="preserve"> "git"</w:t>
       </w:r>
     </w:p>
     <w:p>
@@ -10259,7 +10558,15 @@
         </w:numPr>
       </w:pPr>
       <w:r>
-        <w:t>sudo apt autoremove -y</w:t>
+        <w:t xml:space="preserve">sudo apt </w:t>
+      </w:r>
+      <w:proofErr w:type="spellStart"/>
+      <w:r>
+        <w:t>autoremove</w:t>
+      </w:r>
+      <w:proofErr w:type="spellEnd"/>
+      <w:r>
+        <w:t xml:space="preserve"> -y</w:t>
       </w:r>
     </w:p>
     <w:p>
@@ -10287,7 +10594,15 @@
         </w:numPr>
       </w:pPr>
       <w:r>
-        <w:t>sudo apt install nasm -y</w:t>
+        <w:t xml:space="preserve">sudo apt install </w:t>
+      </w:r>
+      <w:proofErr w:type="spellStart"/>
+      <w:r>
+        <w:t>nasm</w:t>
+      </w:r>
+      <w:proofErr w:type="spellEnd"/>
+      <w:r>
+        <w:t xml:space="preserve"> -y</w:t>
       </w:r>
     </w:p>
     <w:p>
@@ -10299,7 +10614,15 @@
         </w:numPr>
       </w:pPr>
       <w:r>
-        <w:t>Install bximage:</w:t>
+        <w:t xml:space="preserve">Install </w:t>
+      </w:r>
+      <w:proofErr w:type="spellStart"/>
+      <w:r>
+        <w:t>bximage</w:t>
+      </w:r>
+      <w:proofErr w:type="spellEnd"/>
+      <w:r>
+        <w:t>:</w:t>
       </w:r>
     </w:p>
     <w:p>
@@ -10311,8 +10634,13 @@
         </w:numPr>
       </w:pPr>
       <w:r>
-        <w:t>sudo apt install bximage</w:t>
-      </w:r>
+        <w:t xml:space="preserve">sudo apt install </w:t>
+      </w:r>
+      <w:proofErr w:type="spellStart"/>
+      <w:r>
+        <w:t>bximage</w:t>
+      </w:r>
+      <w:proofErr w:type="spellEnd"/>
     </w:p>
     <w:p>
       <w:pPr>
@@ -10347,7 +10675,23 @@
         </w:numPr>
       </w:pPr>
       <w:r>
-        <w:t>Create a temporary alias for cls = clear(investigate how to make it permanent)</w:t>
+        <w:t xml:space="preserve">Create a temporary alias for </w:t>
+      </w:r>
+      <w:proofErr w:type="spellStart"/>
+      <w:r>
+        <w:t>cls</w:t>
+      </w:r>
+      <w:proofErr w:type="spellEnd"/>
+      <w:r>
+        <w:t xml:space="preserve"> = </w:t>
+      </w:r>
+      <w:proofErr w:type="gramStart"/>
+      <w:r>
+        <w:t>clear(</w:t>
+      </w:r>
+      <w:proofErr w:type="gramEnd"/>
+      <w:r>
+        <w:t>investigate how to make it permanent)</w:t>
       </w:r>
     </w:p>
     <w:p>
@@ -10359,7 +10703,15 @@
         </w:numPr>
       </w:pPr>
       <w:r>
-        <w:t>alias cls='clear'</w:t>
+        <w:t xml:space="preserve">alias </w:t>
+      </w:r>
+      <w:proofErr w:type="spellStart"/>
+      <w:r>
+        <w:t>cls</w:t>
+      </w:r>
+      <w:proofErr w:type="spellEnd"/>
+      <w:r>
+        <w:t>='clear'</w:t>
       </w:r>
     </w:p>
     <w:p>
@@ -10371,7 +10723,15 @@
         </w:numPr>
       </w:pPr>
       <w:r>
-        <w:t xml:space="preserve">Install qemu on Windows: </w:t>
+        <w:t xml:space="preserve">Install </w:t>
+      </w:r>
+      <w:proofErr w:type="spellStart"/>
+      <w:r>
+        <w:t>qemu</w:t>
+      </w:r>
+      <w:proofErr w:type="spellEnd"/>
+      <w:r>
+        <w:t xml:space="preserve"> on Windows: </w:t>
       </w:r>
       <w:hyperlink r:id="rId17" w:history="1">
         <w:r>
@@ -10455,7 +10815,15 @@
         </w:numPr>
       </w:pPr>
       <w:r>
-        <w:t>Install gcc on WSL:</w:t>
+        <w:t xml:space="preserve">Install </w:t>
+      </w:r>
+      <w:proofErr w:type="spellStart"/>
+      <w:r>
+        <w:t>gcc</w:t>
+      </w:r>
+      <w:proofErr w:type="spellEnd"/>
+      <w:r>
+        <w:t xml:space="preserve"> on WSL:</w:t>
       </w:r>
     </w:p>
     <w:p>
@@ -10467,8 +10835,13 @@
         </w:numPr>
       </w:pPr>
       <w:r>
-        <w:t>Sudo apt install gcc</w:t>
-      </w:r>
+        <w:t xml:space="preserve">Sudo apt install </w:t>
+      </w:r>
+      <w:proofErr w:type="spellStart"/>
+      <w:r>
+        <w:t>gcc</w:t>
+      </w:r>
+      <w:proofErr w:type="spellEnd"/>
     </w:p>
     <w:p>
       <w:pPr>
@@ -10479,7 +10852,15 @@
         </w:numPr>
       </w:pPr>
       <w:r>
-        <w:t>Install build-essential and gdb:</w:t>
+        <w:t xml:space="preserve">Install build-essential and </w:t>
+      </w:r>
+      <w:proofErr w:type="spellStart"/>
+      <w:r>
+        <w:t>gdb</w:t>
+      </w:r>
+      <w:proofErr w:type="spellEnd"/>
+      <w:r>
+        <w:t>:</w:t>
       </w:r>
     </w:p>
     <w:p>
@@ -10491,8 +10872,13 @@
         </w:numPr>
       </w:pPr>
       <w:r>
-        <w:t>sudo apt-get install build-essential gdb</w:t>
-      </w:r>
+        <w:t xml:space="preserve">sudo apt-get install build-essential </w:t>
+      </w:r>
+      <w:proofErr w:type="spellStart"/>
+      <w:r>
+        <w:t>gdb</w:t>
+      </w:r>
+      <w:proofErr w:type="spellEnd"/>
     </w:p>
     <w:p>
       <w:pPr>
@@ -10526,8 +10912,13 @@
           <w:numId w:val="1"/>
         </w:numPr>
       </w:pPr>
-      <w:r>
-        <w:t xml:space="preserve">wsl </w:t>
+      <w:proofErr w:type="spellStart"/>
+      <w:r>
+        <w:t>wsl</w:t>
+      </w:r>
+      <w:proofErr w:type="spellEnd"/>
+      <w:r>
+        <w:t xml:space="preserve"> </w:t>
       </w:r>
       <w:r>
         <w:t>–</w:t>
@@ -10544,8 +10935,13 @@
           <w:numId w:val="1"/>
         </w:numPr>
       </w:pPr>
-      <w:r>
-        <w:t xml:space="preserve">wsl </w:t>
+      <w:proofErr w:type="spellStart"/>
+      <w:r>
+        <w:t>wsl</w:t>
+      </w:r>
+      <w:proofErr w:type="spellEnd"/>
+      <w:r>
+        <w:t xml:space="preserve"> </w:t>
       </w:r>
       <w:r>
         <w:t>–</w:t>
@@ -10637,11 +11033,16 @@
           <w:numId w:val="1"/>
         </w:numPr>
       </w:pPr>
+      <w:proofErr w:type="gramStart"/>
       <w:r>
         <w:t>Actually,</w:t>
       </w:r>
       <w:r>
-        <w:t xml:space="preserve"> what worked was [interop] </w:t>
+        <w:t xml:space="preserve"> what</w:t>
+      </w:r>
+      <w:proofErr w:type="gramEnd"/>
+      <w:r>
+        <w:t xml:space="preserve"> worked was [interop] </w:t>
       </w:r>
       <w:r>
         <w:t>appendWindowsPath=false</w:t>
@@ -10680,8 +11081,13 @@
         </w:numPr>
       </w:pPr>
       <w:r>
-        <w:t>Now using code .</w:t>
-      </w:r>
+        <w:t xml:space="preserve">Now using </w:t>
+      </w:r>
+      <w:proofErr w:type="gramStart"/>
+      <w:r>
+        <w:t>code .</w:t>
+      </w:r>
+      <w:proofErr w:type="gramEnd"/>
       <w:r>
         <w:t xml:space="preserve"> will open native, with a warning.</w:t>
       </w:r>
@@ -10710,10 +11116,31 @@
         </w:numPr>
       </w:pPr>
       <w:r>
-        <w:t>sudo apt install -y firefox</w:t>
-      </w:r>
-      <w:r>
-        <w:t xml:space="preserve"> (to complete the oauth github auth)</w:t>
+        <w:t xml:space="preserve">sudo apt install -y </w:t>
+      </w:r>
+      <w:proofErr w:type="spellStart"/>
+      <w:r>
+        <w:t>firefox</w:t>
+      </w:r>
+      <w:proofErr w:type="spellEnd"/>
+      <w:r>
+        <w:t xml:space="preserve"> (to complete the </w:t>
+      </w:r>
+      <w:proofErr w:type="spellStart"/>
+      <w:r>
+        <w:t>oauth</w:t>
+      </w:r>
+      <w:proofErr w:type="spellEnd"/>
+      <w:r>
+        <w:t xml:space="preserve"> </w:t>
+      </w:r>
+      <w:proofErr w:type="spellStart"/>
+      <w:r>
+        <w:t>github</w:t>
+      </w:r>
+      <w:proofErr w:type="spellEnd"/>
+      <w:r>
+        <w:t xml:space="preserve"> auth)</w:t>
       </w:r>
     </w:p>
     <w:p>
@@ -10725,7 +11152,15 @@
         </w:numPr>
       </w:pPr>
       <w:r>
-        <w:t>Prepare vscode on Linux for c:</w:t>
+        <w:t xml:space="preserve">Prepare </w:t>
+      </w:r>
+      <w:proofErr w:type="spellStart"/>
+      <w:r>
+        <w:t>vscode</w:t>
+      </w:r>
+      <w:proofErr w:type="spellEnd"/>
+      <w:r>
+        <w:t xml:space="preserve"> on Linux for c:</w:t>
       </w:r>
     </w:p>
     <w:p>
@@ -10737,8 +11172,13 @@
         </w:numPr>
       </w:pPr>
       <w:r>
-        <w:t>Create a launch and tasks jsons</w:t>
-      </w:r>
+        <w:t xml:space="preserve">Create a launch and tasks </w:t>
+      </w:r>
+      <w:proofErr w:type="spellStart"/>
+      <w:r>
+        <w:t>jsons</w:t>
+      </w:r>
+      <w:proofErr w:type="spellEnd"/>
       <w:r>
         <w:t>.</w:t>
       </w:r>
@@ -10848,7 +11288,23 @@
         </w:numPr>
       </w:pPr>
       <w:r>
-        <w:t xml:space="preserve">            "preLaunchTask": "C/C++: gcc build active file",</w:t>
+        <w:t xml:space="preserve">            "</w:t>
+      </w:r>
+      <w:proofErr w:type="spellStart"/>
+      <w:r>
+        <w:t>preLaunchTask</w:t>
+      </w:r>
+      <w:proofErr w:type="spellEnd"/>
+      <w:r>
+        <w:t xml:space="preserve">": "C/C++: </w:t>
+      </w:r>
+      <w:proofErr w:type="spellStart"/>
+      <w:r>
+        <w:t>gcc</w:t>
+      </w:r>
+      <w:proofErr w:type="spellEnd"/>
+      <w:r>
+        <w:t xml:space="preserve"> build active file",</w:t>
       </w:r>
     </w:p>
     <w:p>
@@ -10860,7 +11316,15 @@
         </w:numPr>
       </w:pPr>
       <w:r>
-        <w:t xml:space="preserve">            "name": "(gdb) Launch",</w:t>
+        <w:t xml:space="preserve">            "name": "(</w:t>
+      </w:r>
+      <w:proofErr w:type="spellStart"/>
+      <w:r>
+        <w:t>gdb</w:t>
+      </w:r>
+      <w:proofErr w:type="spellEnd"/>
+      <w:r>
+        <w:t>) Launch",</w:t>
       </w:r>
     </w:p>
     <w:p>
@@ -10872,7 +11336,15 @@
         </w:numPr>
       </w:pPr>
       <w:r>
-        <w:t xml:space="preserve">            "type": "cppdbg",</w:t>
+        <w:t xml:space="preserve">            "type": "</w:t>
+      </w:r>
+      <w:proofErr w:type="spellStart"/>
+      <w:r>
+        <w:t>cppdbg</w:t>
+      </w:r>
+      <w:proofErr w:type="spellEnd"/>
+      <w:r>
+        <w:t>",</w:t>
       </w:r>
     </w:p>
     <w:p>
@@ -10896,7 +11368,23 @@
         </w:numPr>
       </w:pPr>
       <w:r>
-        <w:t xml:space="preserve">            "program": "${fileDirname}/${fileBasenameNoExtension}",</w:t>
+        <w:t xml:space="preserve">            "program": "${</w:t>
+      </w:r>
+      <w:proofErr w:type="spellStart"/>
+      <w:r>
+        <w:t>fileDirname</w:t>
+      </w:r>
+      <w:proofErr w:type="spellEnd"/>
+      <w:r>
+        <w:t>}/${</w:t>
+      </w:r>
+      <w:proofErr w:type="spellStart"/>
+      <w:r>
+        <w:t>fileBasenameNoExtension</w:t>
+      </w:r>
+      <w:proofErr w:type="spellEnd"/>
+      <w:r>
+        <w:t>}",</w:t>
       </w:r>
     </w:p>
     <w:p>
@@ -10908,7 +11396,15 @@
         </w:numPr>
       </w:pPr>
       <w:r>
-        <w:t xml:space="preserve">            "args": [</w:t>
+        <w:t xml:space="preserve">            "</w:t>
+      </w:r>
+      <w:proofErr w:type="spellStart"/>
+      <w:r>
+        <w:t>args</w:t>
+      </w:r>
+      <w:proofErr w:type="spellEnd"/>
+      <w:r>
+        <w:t>": [</w:t>
       </w:r>
     </w:p>
     <w:p>
@@ -10921,7 +11417,15 @@
       </w:pPr>
       <w:r>
         <w:lastRenderedPageBreak/>
-        <w:t xml:space="preserve">                "aaaaa",</w:t>
+        <w:t xml:space="preserve">                "</w:t>
+      </w:r>
+      <w:proofErr w:type="spellStart"/>
+      <w:r>
+        <w:t>aaaaa</w:t>
+      </w:r>
+      <w:proofErr w:type="spellEnd"/>
+      <w:r>
+        <w:t>",</w:t>
       </w:r>
     </w:p>
     <w:p>
@@ -10933,7 +11437,15 @@
         </w:numPr>
       </w:pPr>
       <w:r>
-        <w:t xml:space="preserve">                "bbbbb",</w:t>
+        <w:t xml:space="preserve">                "</w:t>
+      </w:r>
+      <w:proofErr w:type="spellStart"/>
+      <w:r>
+        <w:t>bbbbb</w:t>
+      </w:r>
+      <w:proofErr w:type="spellEnd"/>
+      <w:r>
+        <w:t>",</w:t>
       </w:r>
     </w:p>
     <w:p>
@@ -10945,7 +11457,15 @@
         </w:numPr>
       </w:pPr>
       <w:r>
-        <w:t xml:space="preserve">                "ccccc"</w:t>
+        <w:t xml:space="preserve">                "</w:t>
+      </w:r>
+      <w:proofErr w:type="spellStart"/>
+      <w:r>
+        <w:t>ccccc</w:t>
+      </w:r>
+      <w:proofErr w:type="spellEnd"/>
+      <w:r>
+        <w:t>"</w:t>
       </w:r>
     </w:p>
     <w:p>
@@ -10969,7 +11489,15 @@
         </w:numPr>
       </w:pPr>
       <w:r>
-        <w:t xml:space="preserve">            "stopAtEntry": false,</w:t>
+        <w:t xml:space="preserve">            "</w:t>
+      </w:r>
+      <w:proofErr w:type="spellStart"/>
+      <w:r>
+        <w:t>stopAtEntry</w:t>
+      </w:r>
+      <w:proofErr w:type="spellEnd"/>
+      <w:r>
+        <w:t>": false,</w:t>
       </w:r>
     </w:p>
     <w:p>
@@ -10981,7 +11509,23 @@
         </w:numPr>
       </w:pPr>
       <w:r>
-        <w:t xml:space="preserve">            "cwd": "${fileDirname}",</w:t>
+        <w:t xml:space="preserve">            "</w:t>
+      </w:r>
+      <w:proofErr w:type="spellStart"/>
+      <w:r>
+        <w:t>cwd</w:t>
+      </w:r>
+      <w:proofErr w:type="spellEnd"/>
+      <w:r>
+        <w:t>": "${</w:t>
+      </w:r>
+      <w:proofErr w:type="spellStart"/>
+      <w:r>
+        <w:t>fileDirname</w:t>
+      </w:r>
+      <w:proofErr w:type="spellEnd"/>
+      <w:r>
+        <w:t>}",</w:t>
       </w:r>
     </w:p>
     <w:p>
@@ -11005,7 +11549,15 @@
         </w:numPr>
       </w:pPr>
       <w:r>
-        <w:t xml:space="preserve">            "externalConsole": false,</w:t>
+        <w:t xml:space="preserve">            "</w:t>
+      </w:r>
+      <w:proofErr w:type="spellStart"/>
+      <w:r>
+        <w:t>externalConsole</w:t>
+      </w:r>
+      <w:proofErr w:type="spellEnd"/>
+      <w:r>
+        <w:t>": false,</w:t>
       </w:r>
     </w:p>
     <w:p>
@@ -11017,7 +11569,23 @@
         </w:numPr>
       </w:pPr>
       <w:r>
-        <w:t xml:space="preserve">            "MIMode": "gdb",</w:t>
+        <w:t xml:space="preserve">            "</w:t>
+      </w:r>
+      <w:proofErr w:type="spellStart"/>
+      <w:r>
+        <w:t>MIMode</w:t>
+      </w:r>
+      <w:proofErr w:type="spellEnd"/>
+      <w:r>
+        <w:t>": "</w:t>
+      </w:r>
+      <w:proofErr w:type="spellStart"/>
+      <w:r>
+        <w:t>gdb</w:t>
+      </w:r>
+      <w:proofErr w:type="spellEnd"/>
+      <w:r>
+        <w:t>",</w:t>
       </w:r>
     </w:p>
     <w:p>
@@ -11029,7 +11597,15 @@
         </w:numPr>
       </w:pPr>
       <w:r>
-        <w:t xml:space="preserve">            "setupCommands": [</w:t>
+        <w:t xml:space="preserve">            "</w:t>
+      </w:r>
+      <w:proofErr w:type="spellStart"/>
+      <w:r>
+        <w:t>setupCommands</w:t>
+      </w:r>
+      <w:proofErr w:type="spellEnd"/>
+      <w:r>
+        <w:t>": [</w:t>
       </w:r>
     </w:p>
     <w:p>
@@ -11053,7 +11629,15 @@
         </w:numPr>
       </w:pPr>
       <w:r>
-        <w:t xml:space="preserve">                    "description": "Enable pretty-printing for gdb",</w:t>
+        <w:t xml:space="preserve">                    "description": "Enable pretty-printing for </w:t>
+      </w:r>
+      <w:proofErr w:type="spellStart"/>
+      <w:r>
+        <w:t>gdb</w:t>
+      </w:r>
+      <w:proofErr w:type="spellEnd"/>
+      <w:r>
+        <w:t>",</w:t>
       </w:r>
     </w:p>
     <w:p>
@@ -11077,7 +11661,15 @@
         </w:numPr>
       </w:pPr>
       <w:r>
-        <w:t xml:space="preserve">                    "ignoreFailures": true</w:t>
+        <w:t xml:space="preserve">                    "</w:t>
+      </w:r>
+      <w:proofErr w:type="spellStart"/>
+      <w:r>
+        <w:t>ignoreFailures</w:t>
+      </w:r>
+      <w:proofErr w:type="spellEnd"/>
+      <w:r>
+        <w:t>": true</w:t>
       </w:r>
     </w:p>
     <w:p>
@@ -11125,7 +11717,15 @@
         </w:numPr>
       </w:pPr>
       <w:r>
-        <w:t xml:space="preserve">                    "text": "-gdb-set disassembly-flavor intel",</w:t>
+        <w:t xml:space="preserve">                    "text": "-</w:t>
+      </w:r>
+      <w:proofErr w:type="spellStart"/>
+      <w:r>
+        <w:t>gdb</w:t>
+      </w:r>
+      <w:proofErr w:type="spellEnd"/>
+      <w:r>
+        <w:t>-set disassembly-flavor intel",</w:t>
       </w:r>
     </w:p>
     <w:p>
@@ -11137,7 +11737,15 @@
         </w:numPr>
       </w:pPr>
       <w:r>
-        <w:t xml:space="preserve">                    "ignoreFailures": true</w:t>
+        <w:t xml:space="preserve">                    "</w:t>
+      </w:r>
+      <w:proofErr w:type="spellStart"/>
+      <w:r>
+        <w:t>ignoreFailures</w:t>
+      </w:r>
+      <w:proofErr w:type="spellEnd"/>
+      <w:r>
+        <w:t>": true</w:t>
       </w:r>
     </w:p>
     <w:p>
@@ -11245,7 +11853,15 @@
         </w:numPr>
       </w:pPr>
       <w:r>
-        <w:t xml:space="preserve">            "type": "cppbuild",</w:t>
+        <w:t xml:space="preserve">            "type": "</w:t>
+      </w:r>
+      <w:proofErr w:type="spellStart"/>
+      <w:r>
+        <w:t>cppbuild</w:t>
+      </w:r>
+      <w:proofErr w:type="spellEnd"/>
+      <w:r>
+        <w:t>",</w:t>
       </w:r>
     </w:p>
     <w:p>
@@ -11257,7 +11873,15 @@
         </w:numPr>
       </w:pPr>
       <w:r>
-        <w:t xml:space="preserve">            "label": "C/C++: gcc build active file",</w:t>
+        <w:t xml:space="preserve">            "label": "C/C++: </w:t>
+      </w:r>
+      <w:proofErr w:type="spellStart"/>
+      <w:r>
+        <w:t>gcc</w:t>
+      </w:r>
+      <w:proofErr w:type="spellEnd"/>
+      <w:r>
+        <w:t xml:space="preserve"> build active file",</w:t>
       </w:r>
     </w:p>
     <w:p>
@@ -11269,7 +11893,15 @@
         </w:numPr>
       </w:pPr>
       <w:r>
-        <w:t xml:space="preserve">            "command": "/usr/bin/gcc",</w:t>
+        <w:t xml:space="preserve">            "command": "/usr/bin/</w:t>
+      </w:r>
+      <w:proofErr w:type="spellStart"/>
+      <w:r>
+        <w:t>gcc</w:t>
+      </w:r>
+      <w:proofErr w:type="spellEnd"/>
+      <w:r>
+        <w:t>",</w:t>
       </w:r>
     </w:p>
     <w:p>
@@ -11281,7 +11913,15 @@
         </w:numPr>
       </w:pPr>
       <w:r>
-        <w:t xml:space="preserve">            "args": [</w:t>
+        <w:t xml:space="preserve">            "</w:t>
+      </w:r>
+      <w:proofErr w:type="spellStart"/>
+      <w:r>
+        <w:t>args</w:t>
+      </w:r>
+      <w:proofErr w:type="spellEnd"/>
+      <w:r>
+        <w:t>": [</w:t>
       </w:r>
     </w:p>
     <w:p>
@@ -11293,7 +11933,15 @@
         </w:numPr>
       </w:pPr>
       <w:r>
-        <w:t xml:space="preserve">                "-fdiagnostics-color=always",</w:t>
+        <w:t xml:space="preserve">                "-</w:t>
+      </w:r>
+      <w:proofErr w:type="spellStart"/>
+      <w:r>
+        <w:t>fdiagnostics</w:t>
+      </w:r>
+      <w:proofErr w:type="spellEnd"/>
+      <w:r>
+        <w:t>-color=always",</w:t>
       </w:r>
     </w:p>
     <w:p>
@@ -11341,7 +11989,23 @@
         </w:numPr>
       </w:pPr>
       <w:r>
-        <w:t xml:space="preserve">                "${fileDirname}/${fileBasenameNoExtension}"</w:t>
+        <w:t xml:space="preserve">                "${</w:t>
+      </w:r>
+      <w:proofErr w:type="spellStart"/>
+      <w:r>
+        <w:t>fileDirname</w:t>
+      </w:r>
+      <w:proofErr w:type="spellEnd"/>
+      <w:r>
+        <w:t>}/${</w:t>
+      </w:r>
+      <w:proofErr w:type="spellStart"/>
+      <w:r>
+        <w:t>fileBasenameNoExtension</w:t>
+      </w:r>
+      <w:proofErr w:type="spellEnd"/>
+      <w:r>
+        <w:t>}"</w:t>
       </w:r>
     </w:p>
     <w:p>
@@ -11365,8 +12029,13 @@
         </w:numPr>
       </w:pPr>
       <w:r>
-        <w:t xml:space="preserve">            "options": {</w:t>
-      </w:r>
+        <w:t xml:space="preserve">            "options</w:t>
+      </w:r>
+      <w:proofErr w:type="gramStart"/>
+      <w:r>
+        <w:t>": {</w:t>
+      </w:r>
+      <w:proofErr w:type="gramEnd"/>
     </w:p>
     <w:p>
       <w:pPr>
@@ -11377,7 +12046,23 @@
         </w:numPr>
       </w:pPr>
       <w:r>
-        <w:t xml:space="preserve">                "cwd": "${fileDirname}"</w:t>
+        <w:t xml:space="preserve">                "</w:t>
+      </w:r>
+      <w:proofErr w:type="spellStart"/>
+      <w:r>
+        <w:t>cwd</w:t>
+      </w:r>
+      <w:proofErr w:type="spellEnd"/>
+      <w:r>
+        <w:t>": "${</w:t>
+      </w:r>
+      <w:proofErr w:type="spellStart"/>
+      <w:r>
+        <w:t>fileDirname</w:t>
+      </w:r>
+      <w:proofErr w:type="spellEnd"/>
+      <w:r>
+        <w:t>}"</w:t>
       </w:r>
     </w:p>
     <w:p>
@@ -11401,7 +12086,15 @@
         </w:numPr>
       </w:pPr>
       <w:r>
-        <w:t xml:space="preserve">            "problemMatcher": [</w:t>
+        <w:t xml:space="preserve">            "</w:t>
+      </w:r>
+      <w:proofErr w:type="spellStart"/>
+      <w:r>
+        <w:t>problemMatcher</w:t>
+      </w:r>
+      <w:proofErr w:type="spellEnd"/>
+      <w:r>
+        <w:t>": [</w:t>
       </w:r>
     </w:p>
     <w:p>
@@ -11413,7 +12106,15 @@
         </w:numPr>
       </w:pPr>
       <w:r>
-        <w:t xml:space="preserve">                "$gcc"</w:t>
+        <w:t xml:space="preserve">                "$</w:t>
+      </w:r>
+      <w:proofErr w:type="spellStart"/>
+      <w:r>
+        <w:t>gcc</w:t>
+      </w:r>
+      <w:proofErr w:type="spellEnd"/>
+      <w:r>
+        <w:t>"</w:t>
       </w:r>
     </w:p>
     <w:p>
@@ -11437,8 +12138,13 @@
         </w:numPr>
       </w:pPr>
       <w:r>
-        <w:t xml:space="preserve">            "group": {</w:t>
-      </w:r>
+        <w:t xml:space="preserve">            "group</w:t>
+      </w:r>
+      <w:proofErr w:type="gramStart"/>
+      <w:r>
+        <w:t>": {</w:t>
+      </w:r>
+      <w:proofErr w:type="gramEnd"/>
     </w:p>
     <w:p>
       <w:pPr>
@@ -11461,7 +12167,15 @@
         </w:numPr>
       </w:pPr>
       <w:r>
-        <w:t xml:space="preserve">                "isDefault": true</w:t>
+        <w:t xml:space="preserve">                "</w:t>
+      </w:r>
+      <w:proofErr w:type="spellStart"/>
+      <w:r>
+        <w:t>isDefault</w:t>
+      </w:r>
+      <w:proofErr w:type="spellEnd"/>
+      <w:r>
+        <w:t>": true</w:t>
       </w:r>
     </w:p>
     <w:p>
@@ -11545,7 +12259,15 @@
         </w:numPr>
       </w:pPr>
       <w:r>
-        <w:t>Install Mtools for FAT image management:</w:t>
+        <w:t xml:space="preserve">Install </w:t>
+      </w:r>
+      <w:proofErr w:type="spellStart"/>
+      <w:r>
+        <w:t>Mtools</w:t>
+      </w:r>
+      <w:proofErr w:type="spellEnd"/>
+      <w:r>
+        <w:t xml:space="preserve"> for FAT image management:</w:t>
       </w:r>
     </w:p>
     <w:p>
@@ -11557,8 +12279,13 @@
         </w:numPr>
       </w:pPr>
       <w:r>
-        <w:t>Sudo apt install mtools</w:t>
-      </w:r>
+        <w:t xml:space="preserve">Sudo apt install </w:t>
+      </w:r>
+      <w:proofErr w:type="spellStart"/>
+      <w:r>
+        <w:t>mtools</w:t>
+      </w:r>
+      <w:proofErr w:type="spellEnd"/>
     </w:p>
     <w:p>
       <w:pPr>
@@ -11594,7 +12321,145 @@
         <w:rPr>
           <w:lang w:val="es-ES"/>
         </w:rPr>
-        <w:t>udo curl --proto '=https' --tlsv1.2 -sSf https://sh.rustup.rs | sh</w:t>
+        <w:t xml:space="preserve">udo </w:t>
+      </w:r>
+      <w:proofErr w:type="spellStart"/>
+      <w:r>
+        <w:rPr>
+          <w:lang w:val="es-ES"/>
+        </w:rPr>
+        <w:t>curl</w:t>
+      </w:r>
+      <w:proofErr w:type="spellEnd"/>
+      <w:r>
+        <w:rPr>
+          <w:lang w:val="es-ES"/>
+        </w:rPr>
+        <w:t xml:space="preserve"> --proto '=https' --tlsv1.2 -</w:t>
+      </w:r>
+      <w:proofErr w:type="spellStart"/>
+      <w:r>
+        <w:rPr>
+          <w:lang w:val="es-ES"/>
+        </w:rPr>
+        <w:t>sSf</w:t>
+      </w:r>
+      <w:proofErr w:type="spellEnd"/>
+      <w:r>
+        <w:rPr>
+          <w:lang w:val="es-ES"/>
+        </w:rPr>
+        <w:t xml:space="preserve"> https://sh.rustup.rs | </w:t>
+      </w:r>
+      <w:proofErr w:type="spellStart"/>
+      <w:r>
+        <w:rPr>
+          <w:lang w:val="es-ES"/>
+        </w:rPr>
+        <w:t>sh</w:t>
+      </w:r>
+      <w:proofErr w:type="spellEnd"/>
+    </w:p>
+    <w:p>
+      <w:pPr>
+        <w:pStyle w:val="ListParagraph"/>
+        <w:numPr>
+          <w:ilvl w:val="0"/>
+          <w:numId w:val="1"/>
+        </w:numPr>
+      </w:pPr>
+      <w:r>
+        <w:t>To avoid issues compiling r</w:t>
+      </w:r>
+      <w:r>
+        <w:t xml:space="preserve">ust on a windows folder with </w:t>
+      </w:r>
+      <w:proofErr w:type="spellStart"/>
+      <w:r>
+        <w:t>dropbox</w:t>
+      </w:r>
+      <w:proofErr w:type="spellEnd"/>
+      <w:r>
+        <w:t xml:space="preserve"> mounted on WSL I have moved everything to Linux, but the git operations happen only on windows. I am just </w:t>
+      </w:r>
+      <w:proofErr w:type="spellStart"/>
+      <w:r>
+        <w:t>robocopying</w:t>
+      </w:r>
+      <w:proofErr w:type="spellEnd"/>
+      <w:r>
+        <w:t xml:space="preserve"> the files from time to time.</w:t>
+      </w:r>
+    </w:p>
+    <w:p>
+      <w:pPr>
+        <w:pStyle w:val="ListParagraph"/>
+        <w:numPr>
+          <w:ilvl w:val="1"/>
+          <w:numId w:val="1"/>
+        </w:numPr>
+      </w:pPr>
+      <w:proofErr w:type="gramStart"/>
+      <w:r>
+        <w:t>RoboCopy.exe  "</w:t>
+      </w:r>
+      <w:proofErr w:type="gramEnd"/>
+      <w:r>
+        <w:t xml:space="preserve">Z:\home\mihe\codebox" "C:\Users\mihe\Dropbox\TusMuertOS-Oct2025\src\helpers" </w:t>
+      </w:r>
+      <w:proofErr w:type="gramStart"/>
+      <w:r>
+        <w:t>*.*</w:t>
+      </w:r>
+      <w:proofErr w:type="gramEnd"/>
+      <w:r>
+        <w:t xml:space="preserve"> /E</w:t>
+      </w:r>
+    </w:p>
+    <w:p>
+      <w:pPr>
+        <w:pStyle w:val="ListParagraph"/>
+        <w:numPr>
+          <w:ilvl w:val="1"/>
+          <w:numId w:val="1"/>
+        </w:numPr>
+      </w:pPr>
+      <w:r>
+        <w:drawing>
+          <wp:inline distT="0" distB="0" distL="0" distR="0" wp14:anchorId="32C622A2" wp14:editId="1D521CD8">
+            <wp:extent cx="4449055" cy="1923518"/>
+            <wp:effectExtent l="0" t="0" r="8890" b="635"/>
+            <wp:docPr id="764176611" name="Picture 1" descr="A screenshot of a computer&#10;&#10;AI-generated content may be incorrect."/>
+            <wp:cNvGraphicFramePr>
+              <a:graphicFrameLocks xmlns:a="http://schemas.openxmlformats.org/drawingml/2006/main" noChangeAspect="1"/>
+            </wp:cNvGraphicFramePr>
+            <a:graphic xmlns:a="http://schemas.openxmlformats.org/drawingml/2006/main">
+              <a:graphicData uri="http://schemas.openxmlformats.org/drawingml/2006/picture">
+                <pic:pic xmlns:pic="http://schemas.openxmlformats.org/drawingml/2006/picture">
+                  <pic:nvPicPr>
+                    <pic:cNvPr id="764176611" name="Picture 1" descr="A screenshot of a computer&#10;&#10;AI-generated content may be incorrect."/>
+                    <pic:cNvPicPr/>
+                  </pic:nvPicPr>
+                  <pic:blipFill>
+                    <a:blip r:embed="rId20"/>
+                    <a:stretch>
+                      <a:fillRect/>
+                    </a:stretch>
+                  </pic:blipFill>
+                  <pic:spPr>
+                    <a:xfrm>
+                      <a:off x="0" y="0"/>
+                      <a:ext cx="4456288" cy="1926645"/>
+                    </a:xfrm>
+                    <a:prstGeom prst="rect">
+                      <a:avLst/>
+                    </a:prstGeom>
+                  </pic:spPr>
+                </pic:pic>
+              </a:graphicData>
+            </a:graphic>
+          </wp:inline>
+        </w:drawing>
       </w:r>
     </w:p>
     <w:p>
@@ -11617,8 +12482,15 @@
         </w:numPr>
       </w:pPr>
       <w:r>
-        <w:t>Compile the bootloader stage1 that goes on MBR to mbr.bin</w:t>
-      </w:r>
+        <w:t xml:space="preserve">Compile the bootloader stage1 that goes on MBR to </w:t>
+      </w:r>
+      <w:proofErr w:type="spellStart"/>
+      <w:proofErr w:type="gramStart"/>
+      <w:r>
+        <w:t>mbr.bin</w:t>
+      </w:r>
+      <w:proofErr w:type="spellEnd"/>
+      <w:proofErr w:type="gramEnd"/>
     </w:p>
     <w:p>
       <w:pPr>
@@ -11629,8 +12501,13 @@
         </w:numPr>
       </w:pPr>
       <w:r>
-        <w:t>Compile the bootloader stage2 that goes on VBR to vbr.bin</w:t>
-      </w:r>
+        <w:t xml:space="preserve">Compile the bootloader stage2 that goes on VBR to </w:t>
+      </w:r>
+      <w:proofErr w:type="spellStart"/>
+      <w:r>
+        <w:t>vbr.bin</w:t>
+      </w:r>
+      <w:proofErr w:type="spellEnd"/>
     </w:p>
     <w:p>
       <w:pPr>
@@ -11641,8 +12518,13 @@
         </w:numPr>
       </w:pPr>
       <w:r>
-        <w:t>Compile the Kernel to kernel.bin</w:t>
-      </w:r>
+        <w:t xml:space="preserve">Compile the Kernel to </w:t>
+      </w:r>
+      <w:proofErr w:type="spellStart"/>
+      <w:r>
+        <w:t>kernel.bin</w:t>
+      </w:r>
+      <w:proofErr w:type="spellEnd"/>
     </w:p>
     <w:p>
       <w:pPr>
@@ -11677,7 +12559,15 @@
         </w:numPr>
       </w:pPr>
       <w:r>
-        <w:t>Inject mbr.bin on the disk MBR at sector 0</w:t>
+        <w:t xml:space="preserve">Inject </w:t>
+      </w:r>
+      <w:proofErr w:type="spellStart"/>
+      <w:r>
+        <w:t>mbr.bin</w:t>
+      </w:r>
+      <w:proofErr w:type="spellEnd"/>
+      <w:r>
+        <w:t xml:space="preserve"> on the disk MBR at sector 0</w:t>
       </w:r>
     </w:p>
     <w:p>
@@ -11689,7 +12579,15 @@
         </w:numPr>
       </w:pPr>
       <w:r>
-        <w:t>Inject vbr.bin on the disk at sector after the MBR + reserved gap.</w:t>
+        <w:t xml:space="preserve">Inject </w:t>
+      </w:r>
+      <w:proofErr w:type="spellStart"/>
+      <w:r>
+        <w:t>vbr.bin</w:t>
+      </w:r>
+      <w:proofErr w:type="spellEnd"/>
+      <w:r>
+        <w:t xml:space="preserve"> on the disk at sector after the MBR + reserved gap.</w:t>
       </w:r>
     </w:p>
     <w:p>
@@ -11701,7 +12599,15 @@
         </w:numPr>
       </w:pPr>
       <w:r>
-        <w:t>Add, as file on the file system FAT32 the file kernel.bin directly on the disk root</w:t>
+        <w:t xml:space="preserve">Add, as file on the file system FAT32 the file </w:t>
+      </w:r>
+      <w:proofErr w:type="spellStart"/>
+      <w:r>
+        <w:t>kernel.bin</w:t>
+      </w:r>
+      <w:proofErr w:type="spellEnd"/>
+      <w:r>
+        <w:t xml:space="preserve"> directly on the disk root</w:t>
       </w:r>
     </w:p>
     <w:p>
@@ -11759,6 +12665,7 @@
         <w:rPr>
           <w:noProof/>
         </w:rPr>
+        <w:lastRenderedPageBreak/>
         <w:drawing>
           <wp:inline distT="0" distB="0" distL="0" distR="0" wp14:anchorId="214DE4BB" wp14:editId="7F8C982B">
             <wp:extent cx="5943600" cy="2092960"/>
@@ -11777,7 +12684,7 @@
                     </pic:cNvPicPr>
                   </pic:nvPicPr>
                   <pic:blipFill>
-                    <a:blip r:embed="rId20">
+                    <a:blip r:embed="rId21">
                       <a:extLst>
                         <a:ext uri="{28A0092B-C50C-407E-A947-70E740481C1C}">
                           <a14:useLocalDpi xmlns:a14="http://schemas.microsoft.com/office/drawing/2010/main" val="0"/>
@@ -11830,7 +12737,6 @@
         <w:rPr>
           <w:noProof/>
         </w:rPr>
-        <w:lastRenderedPageBreak/>
         <w:drawing>
           <wp:inline distT="0" distB="0" distL="0" distR="0" wp14:anchorId="3FBA7AED" wp14:editId="7B4321D9">
             <wp:extent cx="5943600" cy="4516755"/>
@@ -11847,7 +12753,7 @@
                     <pic:cNvPicPr/>
                   </pic:nvPicPr>
                   <pic:blipFill>
-                    <a:blip r:embed="rId21"/>
+                    <a:blip r:embed="rId22"/>
                     <a:stretch>
                       <a:fillRect/>
                     </a:stretch>
@@ -11875,6 +12781,7 @@
         <w:pStyle w:val="Heading2"/>
       </w:pPr>
       <w:r>
+        <w:lastRenderedPageBreak/>
         <w:t>Rust notes</w:t>
       </w:r>
     </w:p>
@@ -12038,28 +12945,70 @@
     <w:p/>
     <w:p>
       <w:r>
-        <w:lastRenderedPageBreak/>
-        <w:t>  "editor.semanticHighlighting.enabled": true,</w:t>
-      </w:r>
-    </w:p>
-    <w:p>
-      <w:r>
-        <w:t>  "editor.semanticTokenColorCustomizations": {</w:t>
-      </w:r>
-    </w:p>
-    <w:p>
-      <w:r>
-        <w:t>    "rules": {</w:t>
-      </w:r>
-    </w:p>
-    <w:p>
-      <w:r>
-        <w:t>      "operator.controlFlow": {</w:t>
-      </w:r>
-    </w:p>
-    <w:p>
-      <w:r>
-        <w:t>        "foreground": "#ff5100",</w:t>
+        <w:t>  "</w:t>
+      </w:r>
+      <w:proofErr w:type="spellStart"/>
+      <w:proofErr w:type="gramStart"/>
+      <w:r>
+        <w:t>editor.semanticHighlighting.enabled</w:t>
+      </w:r>
+      <w:proofErr w:type="spellEnd"/>
+      <w:proofErr w:type="gramEnd"/>
+      <w:r>
+        <w:t>": true,</w:t>
+      </w:r>
+    </w:p>
+    <w:p>
+      <w:r>
+        <w:t>  "</w:t>
+      </w:r>
+      <w:proofErr w:type="spellStart"/>
+      <w:proofErr w:type="gramStart"/>
+      <w:r>
+        <w:t>editor.semanticTokenColorCustomizations</w:t>
+      </w:r>
+      <w:proofErr w:type="spellEnd"/>
+      <w:proofErr w:type="gramEnd"/>
+      <w:r>
+        <w:t>": {</w:t>
+      </w:r>
+    </w:p>
+    <w:p>
+      <w:r>
+        <w:t>    "rules</w:t>
+      </w:r>
+      <w:proofErr w:type="gramStart"/>
+      <w:r>
+        <w:t>": {</w:t>
+      </w:r>
+      <w:proofErr w:type="gramEnd"/>
+    </w:p>
+    <w:p>
+      <w:r>
+        <w:t>      "</w:t>
+      </w:r>
+      <w:proofErr w:type="spellStart"/>
+      <w:proofErr w:type="gramStart"/>
+      <w:r>
+        <w:t>operator.controlFlow</w:t>
+      </w:r>
+      <w:proofErr w:type="spellEnd"/>
+      <w:r>
+        <w:t>": {</w:t>
+      </w:r>
+      <w:proofErr w:type="gramEnd"/>
+    </w:p>
+    <w:p>
+      <w:r>
+        <w:t>        "foreground"</w:t>
+      </w:r>
+      <w:proofErr w:type="gramStart"/>
+      <w:r>
+        <w:t>: "#</w:t>
+      </w:r>
+      <w:proofErr w:type="gramEnd"/>
+      <w:r>
+        <w:t>ff5100",</w:t>
       </w:r>
     </w:p>
     <w:p>
@@ -12112,7 +13061,15 @@
     <w:p/>
     <w:p>
       <w:r>
-        <w:t xml:space="preserve">Build binary from asm file using NASM. Relative path, the full path for this is: </w:t>
+        <w:t xml:space="preserve">Build binary from </w:t>
+      </w:r>
+      <w:proofErr w:type="spellStart"/>
+      <w:r>
+        <w:t>asm</w:t>
+      </w:r>
+      <w:proofErr w:type="spellEnd"/>
+      <w:r>
+        <w:t xml:space="preserve"> file using NASM. Relative path, the full path for this is: </w:t>
       </w:r>
     </w:p>
     <w:p>
@@ -12128,7 +13085,23 @@
           <w:b/>
           <w:bCs/>
         </w:rPr>
-        <w:t>/mnt/c/Users/mihe/Dropbox/TusMuertOS-Oct2025</w:t>
+        <w:t>/</w:t>
+      </w:r>
+      <w:proofErr w:type="gramStart"/>
+      <w:r>
+        <w:rPr>
+          <w:b/>
+          <w:bCs/>
+        </w:rPr>
+        <w:t>mnt</w:t>
+      </w:r>
+      <w:proofErr w:type="gramEnd"/>
+      <w:r>
+        <w:rPr>
+          <w:b/>
+          <w:bCs/>
+        </w:rPr>
+        <w:t>/c/Users/mihe/Dropbox/TusMuertOS-Oct2025</w:t>
       </w:r>
     </w:p>
     <w:p>
@@ -12144,18 +13117,73 @@
           <w:bCs/>
         </w:rPr>
       </w:pPr>
+      <w:proofErr w:type="spellStart"/>
       <w:r>
         <w:rPr>
           <w:b/>
           <w:bCs/>
         </w:rPr>
-        <w:t>nasm -f bin src/bootloader/stage1.asm -o src/build/stage1.bin</w:t>
+        <w:lastRenderedPageBreak/>
+        <w:t>nasm</w:t>
+      </w:r>
+      <w:proofErr w:type="spellEnd"/>
+      <w:r>
+        <w:rPr>
+          <w:b/>
+          <w:bCs/>
+        </w:rPr>
+        <w:t xml:space="preserve"> -f bin </w:t>
+      </w:r>
+      <w:proofErr w:type="spellStart"/>
+      <w:r>
+        <w:rPr>
+          <w:b/>
+          <w:bCs/>
+        </w:rPr>
+        <w:t>src</w:t>
+      </w:r>
+      <w:proofErr w:type="spellEnd"/>
+      <w:r>
+        <w:rPr>
+          <w:b/>
+          <w:bCs/>
+        </w:rPr>
+        <w:t xml:space="preserve">/bootloader/stage1.asm -o </w:t>
+      </w:r>
+      <w:proofErr w:type="spellStart"/>
+      <w:r>
+        <w:rPr>
+          <w:b/>
+          <w:bCs/>
+        </w:rPr>
+        <w:t>src</w:t>
+      </w:r>
+      <w:proofErr w:type="spellEnd"/>
+      <w:r>
+        <w:rPr>
+          <w:b/>
+          <w:bCs/>
+        </w:rPr>
+        <w:t>/build/stage1.bin</w:t>
       </w:r>
     </w:p>
     <w:p/>
     <w:p>
-      <w:r>
-        <w:t>bximage to create an empty floppy disk. It is an interactive tool with a menu. It shows this info after execution: The following line should appear in your bochsrc:</w:t>
+      <w:proofErr w:type="spellStart"/>
+      <w:r>
+        <w:t>bximage</w:t>
+      </w:r>
+      <w:proofErr w:type="spellEnd"/>
+      <w:r>
+        <w:t xml:space="preserve"> to create an empty floppy disk. It is an interactive tool with a menu. It shows this info after execution: The following line should appear in your </w:t>
+      </w:r>
+      <w:proofErr w:type="spellStart"/>
+      <w:r>
+        <w:t>bochsrc</w:t>
+      </w:r>
+      <w:proofErr w:type="spellEnd"/>
+      <w:r>
+        <w:t>:</w:t>
       </w:r>
     </w:p>
     <w:p>
@@ -12166,12 +13194,37 @@
           <w:bCs/>
         </w:rPr>
       </w:pPr>
+      <w:proofErr w:type="spellStart"/>
       <w:r>
         <w:rPr>
           <w:b/>
           <w:bCs/>
         </w:rPr>
-        <w:t>floppya: image="floppy.img", status=inserted</w:t>
+        <w:t>floppya</w:t>
+      </w:r>
+      <w:proofErr w:type="spellEnd"/>
+      <w:r>
+        <w:rPr>
+          <w:b/>
+          <w:bCs/>
+        </w:rPr>
+        <w:t>: image="</w:t>
+      </w:r>
+      <w:proofErr w:type="spellStart"/>
+      <w:r>
+        <w:rPr>
+          <w:b/>
+          <w:bCs/>
+        </w:rPr>
+        <w:t>floppy.img</w:t>
+      </w:r>
+      <w:proofErr w:type="spellEnd"/>
+      <w:r>
+        <w:rPr>
+          <w:b/>
+          <w:bCs/>
+        </w:rPr>
+        <w:t>", status=inserted</w:t>
       </w:r>
     </w:p>
     <w:p>
@@ -12192,27 +13245,115 @@
           <w:b/>
           <w:bCs/>
         </w:rPr>
-        <w:t>dd if=/dev/zero of=teaching.img bs=512 count=2880</w:t>
-      </w:r>
-    </w:p>
-    <w:p/>
-    <w:p>
-      <w:r>
-        <w:t>Inject the bootloader (512 bytes, One sector if I am not mistaketn) at the beginning of the empty disk image:</w:t>
-      </w:r>
-    </w:p>
-    <w:p>
-      <w:pPr>
-        <w:ind w:firstLine="720"/>
-      </w:pPr>
+        <w:t>dd if=/dev/zero of=</w:t>
+      </w:r>
+      <w:proofErr w:type="spellStart"/>
       <w:r>
         <w:rPr>
           <w:b/>
           <w:bCs/>
         </w:rPr>
-        <w:lastRenderedPageBreak/>
-        <w:t>dd if=src/build/stage1.bin of=src/build/floppy.img bs=512 count=1 conv=notrunc</w:t>
-      </w:r>
+        <w:t>teaching.img</w:t>
+      </w:r>
+      <w:proofErr w:type="spellEnd"/>
+      <w:r>
+        <w:rPr>
+          <w:b/>
+          <w:bCs/>
+        </w:rPr>
+        <w:t xml:space="preserve"> bs=512 count=2880</w:t>
+      </w:r>
+    </w:p>
+    <w:p/>
+    <w:p>
+      <w:r>
+        <w:t xml:space="preserve">Inject the bootloader (512 bytes, </w:t>
+      </w:r>
+      <w:proofErr w:type="gramStart"/>
+      <w:r>
+        <w:t>One</w:t>
+      </w:r>
+      <w:proofErr w:type="gramEnd"/>
+      <w:r>
+        <w:t xml:space="preserve"> sector if I am not </w:t>
+      </w:r>
+      <w:proofErr w:type="spellStart"/>
+      <w:r>
+        <w:t>mistaketn</w:t>
+      </w:r>
+      <w:proofErr w:type="spellEnd"/>
+      <w:r>
+        <w:t>) at the beginning of the empty disk image:</w:t>
+      </w:r>
+    </w:p>
+    <w:p>
+      <w:pPr>
+        <w:ind w:firstLine="720"/>
+      </w:pPr>
+      <w:r>
+        <w:rPr>
+          <w:b/>
+          <w:bCs/>
+        </w:rPr>
+        <w:t>dd if=</w:t>
+      </w:r>
+      <w:proofErr w:type="spellStart"/>
+      <w:r>
+        <w:rPr>
+          <w:b/>
+          <w:bCs/>
+        </w:rPr>
+        <w:t>src</w:t>
+      </w:r>
+      <w:proofErr w:type="spellEnd"/>
+      <w:r>
+        <w:rPr>
+          <w:b/>
+          <w:bCs/>
+        </w:rPr>
+        <w:t>/build/stage1.bin of=</w:t>
+      </w:r>
+      <w:proofErr w:type="spellStart"/>
+      <w:r>
+        <w:rPr>
+          <w:b/>
+          <w:bCs/>
+        </w:rPr>
+        <w:t>src</w:t>
+      </w:r>
+      <w:proofErr w:type="spellEnd"/>
+      <w:r>
+        <w:rPr>
+          <w:b/>
+          <w:bCs/>
+        </w:rPr>
+        <w:t>/build/</w:t>
+      </w:r>
+      <w:proofErr w:type="spellStart"/>
+      <w:r>
+        <w:rPr>
+          <w:b/>
+          <w:bCs/>
+        </w:rPr>
+        <w:t>floppy.img</w:t>
+      </w:r>
+      <w:proofErr w:type="spellEnd"/>
+      <w:r>
+        <w:rPr>
+          <w:b/>
+          <w:bCs/>
+        </w:rPr>
+        <w:t xml:space="preserve"> bs=512 count=1 conv=</w:t>
+      </w:r>
+      <w:proofErr w:type="spellStart"/>
+      <w:r>
+        <w:rPr>
+          <w:b/>
+          <w:bCs/>
+        </w:rPr>
+        <w:t>notrunc</w:t>
+      </w:r>
+      <w:proofErr w:type="spellEnd"/>
     </w:p>
     <w:p/>
     <w:p>
@@ -12228,13 +13369,31 @@
           <w:bCs/>
         </w:rPr>
       </w:pPr>
+      <w:proofErr w:type="spellStart"/>
       <w:r>
         <w:rPr>
           <w:b/>
           <w:bCs/>
         </w:rPr>
-        <w:t>xxd -l 512 floppy.img</w:t>
-      </w:r>
+        <w:t>xxd</w:t>
+      </w:r>
+      <w:proofErr w:type="spellEnd"/>
+      <w:r>
+        <w:rPr>
+          <w:b/>
+          <w:bCs/>
+        </w:rPr>
+        <w:t xml:space="preserve"> -l 512 </w:t>
+      </w:r>
+      <w:proofErr w:type="spellStart"/>
+      <w:r>
+        <w:rPr>
+          <w:b/>
+          <w:bCs/>
+        </w:rPr>
+        <w:t>floppy.img</w:t>
+      </w:r>
+      <w:proofErr w:type="spellEnd"/>
     </w:p>
     <w:p/>
     <w:p/>
@@ -12251,12 +13410,36 @@
     <w:p/>
     <w:p>
       <w:r>
-        <w:t>Run qemu with the bootloader bin</w:t>
-      </w:r>
-    </w:p>
-    <w:p>
-      <w:r>
-        <w:t>qemu-system-i386 -drive format=raw,file=C:\Users\mihe\Dropbox\TusMuertOS-Oct2025\src\build\stage1.bin,if=floppy</w:t>
+        <w:t xml:space="preserve">Run </w:t>
+      </w:r>
+      <w:proofErr w:type="spellStart"/>
+      <w:r>
+        <w:t>qemu</w:t>
+      </w:r>
+      <w:proofErr w:type="spellEnd"/>
+      <w:r>
+        <w:t xml:space="preserve"> with the bootloader bin</w:t>
+      </w:r>
+    </w:p>
+    <w:p>
+      <w:r>
+        <w:t>qemu-system-i386 -drive format=</w:t>
+      </w:r>
+      <w:proofErr w:type="gramStart"/>
+      <w:r>
+        <w:t>raw,file</w:t>
+      </w:r>
+      <w:proofErr w:type="gramEnd"/>
+      <w:r>
+        <w:t>=</w:t>
+      </w:r>
+      <w:proofErr w:type="gramStart"/>
+      <w:r>
+        <w:t>C:\Users\mihe\Dropbox\TusMuertOS-Oct2025\src\build\stage1.bin,if</w:t>
+      </w:r>
+      <w:proofErr w:type="gramEnd"/>
+      <w:r>
+        <w:t>=floppy</w:t>
       </w:r>
     </w:p>
     <w:p/>
@@ -12277,46 +13460,120 @@
     </w:p>
     <w:p>
       <w:r>
-        <w:t>Copy the template where the img is (in the file you also use full path or relative to the .img and output logs).</w:t>
-      </w:r>
-    </w:p>
-    <w:p>
-      <w:r>
-        <w:t>Run this: bochs -f .\bochsrc-runtime.txt -q -debugger</w:t>
+        <w:t xml:space="preserve">Copy the template where the </w:t>
+      </w:r>
+      <w:proofErr w:type="spellStart"/>
+      <w:r>
+        <w:t>img</w:t>
+      </w:r>
+      <w:proofErr w:type="spellEnd"/>
+      <w:r>
+        <w:t xml:space="preserve"> is (in the file you also use full path or relative to the .</w:t>
+      </w:r>
+      <w:proofErr w:type="spellStart"/>
+      <w:r>
+        <w:t>img</w:t>
+      </w:r>
+      <w:proofErr w:type="spellEnd"/>
+      <w:r>
+        <w:t xml:space="preserve"> and output logs).</w:t>
+      </w:r>
+    </w:p>
+    <w:p>
+      <w:r>
+        <w:t xml:space="preserve">Run this: </w:t>
+      </w:r>
+      <w:proofErr w:type="spellStart"/>
+      <w:r>
+        <w:t>bochs</w:t>
+      </w:r>
+      <w:proofErr w:type="spellEnd"/>
+      <w:r>
+        <w:t xml:space="preserve"> -f .\bochsrc-runtime.txt -q -debugger</w:t>
       </w:r>
     </w:p>
     <w:p>
       <w:r>
         <w:tab/>
-        <w:t>-f: configfile</w:t>
-      </w:r>
+        <w:t xml:space="preserve">-f: </w:t>
+      </w:r>
+      <w:proofErr w:type="spellStart"/>
+      <w:r>
+        <w:t>configfile</w:t>
+      </w:r>
+      <w:proofErr w:type="spellEnd"/>
     </w:p>
     <w:p>
       <w:r>
         <w:tab/>
-        <w:t>-q: don’t show the configuration screen before start</w:t>
-      </w:r>
-    </w:p>
-    <w:p>
-      <w:r>
+        <w:t xml:space="preserve">-q: don’t show the configuration screen before </w:t>
+      </w:r>
+      <w:proofErr w:type="gramStart"/>
+      <w:r>
+        <w:t>start</w:t>
+      </w:r>
+      <w:proofErr w:type="gramEnd"/>
+    </w:p>
+    <w:p>
+      <w:r>
+        <w:lastRenderedPageBreak/>
         <w:tab/>
-        <w:t>-debugger: memory, registers, etc…</w:t>
-      </w:r>
-    </w:p>
-    <w:p>
-      <w:r>
-        <w:t>bochs -f .\bochsrc-runtime.txt -q -debugger</w:t>
+        <w:t xml:space="preserve">-debugger: memory, registers, </w:t>
+      </w:r>
+      <w:proofErr w:type="spellStart"/>
+      <w:r>
+        <w:t>etc</w:t>
+      </w:r>
+      <w:proofErr w:type="spellEnd"/>
+      <w:r>
+        <w:t>…</w:t>
+      </w:r>
+    </w:p>
+    <w:p>
+      <w:proofErr w:type="spellStart"/>
+      <w:r>
+        <w:t>bochs</w:t>
+      </w:r>
+      <w:proofErr w:type="spellEnd"/>
+      <w:r>
+        <w:t xml:space="preserve"> -f .\bochsrc-runtime.txt -q -debugger</w:t>
       </w:r>
     </w:p>
     <w:p/>
     <w:p>
       <w:r>
-        <w:t>NEXT DAY !!!!!!!!!!!!!!!!!!!!!!!!!!!!!!!!!!!!!!</w:t>
-      </w:r>
-    </w:p>
-    <w:p>
-      <w:r>
-        <w:t>bochs -f .\bochsrc-runtime.txt -q -debugger -rc .\bochs.cmds try to enable automatic breakpoint, without magic breakpoints, which take space from the bootloader.</w:t>
+        <w:t xml:space="preserve">NEXT </w:t>
+      </w:r>
+      <w:proofErr w:type="gramStart"/>
+      <w:r>
+        <w:t>DAY !!!!!!!!!!!!!!!!!!!!!!!!!!!!!!!!!!!!!!</w:t>
+      </w:r>
+      <w:proofErr w:type="gramEnd"/>
+    </w:p>
+    <w:p>
+      <w:proofErr w:type="spellStart"/>
+      <w:r>
+        <w:t>bochs</w:t>
+      </w:r>
+      <w:proofErr w:type="spellEnd"/>
+      <w:r>
+        <w:t xml:space="preserve"> -f .\bochsrc-runtime.txt -q -debugger -</w:t>
+      </w:r>
+      <w:proofErr w:type="spellStart"/>
+      <w:r>
+        <w:t>rc</w:t>
+      </w:r>
+      <w:proofErr w:type="spellEnd"/>
+      <w:r>
+        <w:t xml:space="preserve"> .\</w:t>
+      </w:r>
+      <w:proofErr w:type="spellStart"/>
+      <w:r>
+        <w:t>bochs.cmds</w:t>
+      </w:r>
+      <w:proofErr w:type="spellEnd"/>
+      <w:r>
+        <w:t xml:space="preserve"> try to enable automatic breakpoint, without magic breakpoints, which take space from the bootloader.</w:t>
       </w:r>
     </w:p>
     <w:p/>
@@ -12337,7 +13594,6 @@
       </w:pPr>
       <w:bookmarkStart w:id="22" w:name="_Toc213174195"/>
       <w:r>
-        <w:lastRenderedPageBreak/>
         <w:t>How Org directive works in NASM assembly</w:t>
       </w:r>
       <w:bookmarkEnd w:id="22"/>
@@ -12374,7 +13630,15 @@
         </w:pBdr>
       </w:pPr>
       <w:r>
-        <w:t xml:space="preserve">    mov ax, start      ; imm16 encodes the absolute offset of “start”</w:t>
+        <w:t xml:space="preserve">    mov ax, start    </w:t>
+      </w:r>
+      <w:proofErr w:type="gramStart"/>
+      <w:r>
+        <w:t xml:space="preserve">  ;</w:t>
+      </w:r>
+      <w:proofErr w:type="gramEnd"/>
+      <w:r>
+        <w:t xml:space="preserve"> imm16 encodes the absolute offset of “start”</w:t>
       </w:r>
     </w:p>
     <w:p>
@@ -12410,9 +13674,11 @@
       <w:r>
         <w:t xml:space="preserve">WSL Tab autocomplete </w:t>
       </w:r>
+      <w:proofErr w:type="spellStart"/>
       <w:r>
         <w:t>searchs</w:t>
       </w:r>
+      <w:proofErr w:type="spellEnd"/>
       <w:r>
         <w:t xml:space="preserve"> only on windows/system32</w:t>
       </w:r>
@@ -12421,7 +13687,31 @@
     <w:p/>
     <w:p>
       <w:r>
-        <w:t>No solution found yet. Tried to add to etc/wsl.conf this appendWindowsPath=false</w:t>
+        <w:t xml:space="preserve">No solution </w:t>
+      </w:r>
+      <w:proofErr w:type="gramStart"/>
+      <w:r>
+        <w:t>found</w:t>
+      </w:r>
+      <w:proofErr w:type="gramEnd"/>
+      <w:r>
+        <w:t xml:space="preserve"> yet. Tried to add to </w:t>
+      </w:r>
+      <w:proofErr w:type="spellStart"/>
+      <w:r>
+        <w:t>etc</w:t>
+      </w:r>
+      <w:proofErr w:type="spellEnd"/>
+      <w:r>
+        <w:t>/</w:t>
+      </w:r>
+      <w:proofErr w:type="spellStart"/>
+      <w:r>
+        <w:t>wsl.conf</w:t>
+      </w:r>
+      <w:proofErr w:type="spellEnd"/>
+      <w:r>
+        <w:t xml:space="preserve"> this appendWindowsPath=false</w:t>
       </w:r>
     </w:p>
     <w:p/>
@@ -12431,7 +13721,15 @@
       </w:pPr>
       <w:bookmarkStart w:id="24" w:name="_Toc213174197"/>
       <w:r>
-        <w:t>On bootloader, will mov sp, 0x7C00 make the next push to overwrite the first byte of the bootloader? (Overlap)</w:t>
+        <w:t xml:space="preserve">On bootloader, will mov </w:t>
+      </w:r>
+      <w:proofErr w:type="spellStart"/>
+      <w:r>
+        <w:t>sp</w:t>
+      </w:r>
+      <w:proofErr w:type="spellEnd"/>
+      <w:r>
+        <w:t>, 0x7C00 make the next push to overwrite the first byte of the bootloader? (Overlap)</w:t>
       </w:r>
       <w:bookmarkEnd w:id="24"/>
     </w:p>
@@ -12446,6 +13744,7 @@
         <w:rPr>
           <w:noProof/>
         </w:rPr>
+        <w:lastRenderedPageBreak/>
         <w:drawing>
           <wp:inline distT="0" distB="0" distL="0" distR="0" wp14:anchorId="75A5051F" wp14:editId="273E6B6E">
             <wp:extent cx="5943600" cy="762635"/>
@@ -12462,7 +13761,7 @@
                     <pic:cNvPicPr/>
                   </pic:nvPicPr>
                   <pic:blipFill>
-                    <a:blip r:embed="rId22"/>
+                    <a:blip r:embed="rId23"/>
                     <a:stretch>
                       <a:fillRect/>
                     </a:stretch>
@@ -12525,10 +13824,17 @@
     </w:p>
     <w:p>
       <w:r>
-        <w:lastRenderedPageBreak/>
-        <w:t>The easiest way to resolve this would be to add .gitattributes file with a * text=auto line. This should normalize the line endings and prevent this issue within this specific repository. See </w:t>
-      </w:r>
-      <w:hyperlink r:id="rId23" w:anchor="per-repository-settings" w:history="1">
+        <w:t>The easiest way to resolve this would be to add .</w:t>
+      </w:r>
+      <w:proofErr w:type="spellStart"/>
+      <w:r>
+        <w:t>gitattributes</w:t>
+      </w:r>
+      <w:proofErr w:type="spellEnd"/>
+      <w:r>
+        <w:t> file with a * text=auto line. This should normalize the line endings and prevent this issue within this specific repository. See </w:t>
+      </w:r>
+      <w:hyperlink r:id="rId24" w:anchor="per-repository-settings" w:history="1">
         <w:r>
           <w:rPr>
             <w:rStyle w:val="Hyperlink"/>
@@ -12552,8 +13858,13 @@
     </w:p>
     <w:p/>
     <w:p>
-      <w:r>
-        <w:t xml:space="preserve">buf is a pointer to uint8_t, meaning it points to a sequence of bytes (each an unsigned 8-bit value); to inspect the entire 512-byte region it references, add buf,512 to the </w:t>
+      <w:proofErr w:type="spellStart"/>
+      <w:r>
+        <w:t>buf</w:t>
+      </w:r>
+      <w:proofErr w:type="spellEnd"/>
+      <w:r>
+        <w:t xml:space="preserve"> is a pointer to uint8_t, meaning it points to a sequence of bytes (each an unsigned 8-bit value); to inspect the entire 512-byte region it references, add buf,512 to the </w:t>
       </w:r>
       <w:r>
         <w:rPr>
@@ -12579,15 +13890,41 @@
     </w:p>
     <w:p>
       <w:r>
-        <w:t xml:space="preserve">Allows the compiler to use RBP (Stack Base Pointer) as general register for “optimization”, so less offset calculations and freeing other general registers on long functions. On gcc: </w:t>
-      </w:r>
-      <w:r>
-        <w:t>-fno-omit-frame-pointer</w:t>
-      </w:r>
-    </w:p>
-    <w:p>
-      <w:r>
-        <w:t>Example of a prologue where a parameter coming on RDI is just saved on RBP. It may help performance, but it is difficult to reason about while reading the disassembled code.</w:t>
+        <w:t xml:space="preserve">Allows the compiler to use RBP (Stack Base Pointer) as general register for “optimization”, so less offset calculations and freeing other general registers on long functions. On </w:t>
+      </w:r>
+      <w:proofErr w:type="spellStart"/>
+      <w:r>
+        <w:t>gcc</w:t>
+      </w:r>
+      <w:proofErr w:type="spellEnd"/>
+      <w:r>
+        <w:t xml:space="preserve">: </w:t>
+      </w:r>
+      <w:r>
+        <w:t>-</w:t>
+      </w:r>
+      <w:proofErr w:type="spellStart"/>
+      <w:proofErr w:type="gramStart"/>
+      <w:r>
+        <w:t>fno</w:t>
+      </w:r>
+      <w:proofErr w:type="spellEnd"/>
+      <w:proofErr w:type="gramEnd"/>
+      <w:r>
+        <w:t>-omit-frame-pointer</w:t>
+      </w:r>
+    </w:p>
+    <w:p>
+      <w:r>
+        <w:t xml:space="preserve">Example of a prologue where a parameter coming on RDI is just saved on RBP. It may help performance, but it is difficult to </w:t>
+      </w:r>
+      <w:proofErr w:type="gramStart"/>
+      <w:r>
+        <w:t>reason about</w:t>
+      </w:r>
+      <w:proofErr w:type="gramEnd"/>
+      <w:r>
+        <w:t xml:space="preserve"> while reading the disassembled code.</w:t>
       </w:r>
     </w:p>
     <w:p>
@@ -12595,6 +13932,7 @@
         <w:rPr>
           <w:noProof/>
         </w:rPr>
+        <w:lastRenderedPageBreak/>
         <w:drawing>
           <wp:inline distT="0" distB="0" distL="0" distR="0" wp14:anchorId="12A11895" wp14:editId="2379F3B2">
             <wp:extent cx="2143424" cy="743054"/>
@@ -12611,7 +13949,7 @@
                     <pic:cNvPicPr/>
                   </pic:nvPicPr>
                   <pic:blipFill>
-                    <a:blip r:embed="rId24"/>
+                    <a:blip r:embed="rId25"/>
                     <a:stretch>
                       <a:fillRect/>
                     </a:stretch>
@@ -12692,8 +14030,21 @@
         </w:numPr>
       </w:pPr>
       <w:r>
-        <w:t>sudo parted hd16mbfat32.img mklabel msdos</w:t>
-      </w:r>
+        <w:t xml:space="preserve">sudo parted hd16mbfat32.img </w:t>
+      </w:r>
+      <w:proofErr w:type="spellStart"/>
+      <w:r>
+        <w:t>mklabel</w:t>
+      </w:r>
+      <w:proofErr w:type="spellEnd"/>
+      <w:r>
+        <w:t xml:space="preserve"> </w:t>
+      </w:r>
+      <w:proofErr w:type="spellStart"/>
+      <w:r>
+        <w:t>msdos</w:t>
+      </w:r>
+      <w:proofErr w:type="spellEnd"/>
       <w:r>
         <w:tab/>
       </w:r>
@@ -12707,12 +14058,28 @@
         </w:numPr>
       </w:pPr>
       <w:r>
-        <w:t>There are only a valid list of mklabel.</w:t>
+        <w:t xml:space="preserve">There </w:t>
+      </w:r>
+      <w:proofErr w:type="gramStart"/>
+      <w:r>
+        <w:t>are</w:t>
+      </w:r>
+      <w:proofErr w:type="gramEnd"/>
+      <w:r>
+        <w:t xml:space="preserve"> only a valid list of </w:t>
+      </w:r>
+      <w:proofErr w:type="spellStart"/>
+      <w:r>
+        <w:t>mklabel</w:t>
+      </w:r>
+      <w:proofErr w:type="spellEnd"/>
+      <w:r>
+        <w:t>.</w:t>
       </w:r>
       <w:r>
         <w:t xml:space="preserve"> </w:t>
       </w:r>
-      <w:hyperlink r:id="rId25" w:anchor="mklabel" w:history="1">
+      <w:hyperlink r:id="rId26" w:anchor="mklabel" w:history="1">
         <w:r>
           <w:rPr>
             <w:rStyle w:val="Hyperlink"/>
@@ -12739,8 +14106,13 @@
         <w:t>disassembled</w:t>
       </w:r>
       <w:r>
-        <w:t xml:space="preserve"> using ImHex</w:t>
-      </w:r>
+        <w:t xml:space="preserve"> using </w:t>
+      </w:r>
+      <w:proofErr w:type="spellStart"/>
+      <w:r>
+        <w:t>ImHex</w:t>
+      </w:r>
+      <w:proofErr w:type="spellEnd"/>
       <w:r>
         <w:t>.</w:t>
       </w:r>
@@ -12774,7 +14146,7 @@
                     <pic:cNvPicPr/>
                   </pic:nvPicPr>
                   <pic:blipFill>
-                    <a:blip r:embed="rId26"/>
+                    <a:blip r:embed="rId27"/>
                     <a:stretch>
                       <a:fillRect/>
                     </a:stretch>
@@ -12804,7 +14176,23 @@
         </w:numPr>
       </w:pPr>
       <w:r>
-        <w:t>Before continuing, only with the mklabel msdos the MBR has few strange characters before the partitions table. Some kind of signature…</w:t>
+        <w:t xml:space="preserve">Before continuing, only with the </w:t>
+      </w:r>
+      <w:proofErr w:type="spellStart"/>
+      <w:r>
+        <w:t>mklabel</w:t>
+      </w:r>
+      <w:proofErr w:type="spellEnd"/>
+      <w:r>
+        <w:t xml:space="preserve"> </w:t>
+      </w:r>
+      <w:proofErr w:type="spellStart"/>
+      <w:r>
+        <w:t>msdos</w:t>
+      </w:r>
+      <w:proofErr w:type="spellEnd"/>
+      <w:r>
+        <w:t xml:space="preserve"> the MBR has few strange characters before the partitions table. Some kind of signature…</w:t>
       </w:r>
       <w:r>
         <w:t xml:space="preserve"> 4 bytes, little Indian. This is a Microsoft thing BTW.</w:t>
@@ -12838,7 +14226,7 @@
                     <pic:cNvPicPr/>
                   </pic:nvPicPr>
                   <pic:blipFill>
-                    <a:blip r:embed="rId27"/>
+                    <a:blip r:embed="rId28"/>
                     <a:stretch>
                       <a:fillRect/>
                     </a:stretch>
@@ -12868,7 +14256,15 @@
         </w:numPr>
       </w:pPr>
       <w:r>
-        <w:t>sudo parted hd16mbfat32.img --script mkpart primary fat32 1MiB 100%</w:t>
+        <w:t xml:space="preserve">sudo parted hd16mbfat32.img --script </w:t>
+      </w:r>
+      <w:proofErr w:type="spellStart"/>
+      <w:r>
+        <w:t>mkpart</w:t>
+      </w:r>
+      <w:proofErr w:type="spellEnd"/>
+      <w:r>
+        <w:t xml:space="preserve"> primary fat32 1MiB 100%</w:t>
       </w:r>
     </w:p>
     <w:p>
@@ -12879,8 +14275,13 @@
           <w:numId w:val="1"/>
         </w:numPr>
       </w:pPr>
-      <w:r>
-        <w:t xml:space="preserve">mkpart = make partition </w:t>
+      <w:proofErr w:type="spellStart"/>
+      <w:r>
+        <w:t>mkpart</w:t>
+      </w:r>
+      <w:proofErr w:type="spellEnd"/>
+      <w:r>
+        <w:t xml:space="preserve"> = make partition </w:t>
       </w:r>
     </w:p>
     <w:p>
@@ -12963,7 +14364,7 @@
                     <pic:cNvPicPr/>
                   </pic:nvPicPr>
                   <pic:blipFill>
-                    <a:blip r:embed="rId28"/>
+                    <a:blip r:embed="rId29"/>
                     <a:stretch>
                       <a:fillRect/>
                     </a:stretch>
@@ -12992,8 +14393,29 @@
           <w:numId w:val="1"/>
         </w:numPr>
       </w:pPr>
-      <w:r>
-        <w:t>mformat -i hd16mbfat32.img@@1048576 -F ::</w:t>
+      <w:proofErr w:type="spellStart"/>
+      <w:r>
+        <w:t>mformat</w:t>
+      </w:r>
+      <w:proofErr w:type="spellEnd"/>
+      <w:r>
+        <w:t xml:space="preserve"> -</w:t>
+      </w:r>
+      <w:proofErr w:type="spellStart"/>
+      <w:r>
+        <w:t>i</w:t>
+      </w:r>
+      <w:proofErr w:type="spellEnd"/>
+      <w:r>
+        <w:t xml:space="preserve"> hd16mbfat32.img@@1048576 -</w:t>
+      </w:r>
+      <w:proofErr w:type="gramStart"/>
+      <w:r>
+        <w:t>F :</w:t>
+      </w:r>
+      <w:proofErr w:type="gramEnd"/>
+      <w:r>
+        <w:t>:</w:t>
       </w:r>
     </w:p>
     <w:p>
@@ -13016,8 +14438,13 @@
           <w:numId w:val="1"/>
         </w:numPr>
       </w:pPr>
-      <w:r>
-        <w:t>@@Start (from the parted output)</w:t>
+      <w:proofErr w:type="gramStart"/>
+      <w:r>
+        <w:t>@@Start</w:t>
+      </w:r>
+      <w:proofErr w:type="gramEnd"/>
+      <w:r>
+        <w:t xml:space="preserve"> (from the parted output)</w:t>
       </w:r>
     </w:p>
     <w:p>
@@ -13040,8 +14467,13 @@
           <w:numId w:val="1"/>
         </w:numPr>
       </w:pPr>
-      <w:r>
-        <w:t>:: Root directory of the image</w:t>
+      <w:proofErr w:type="gramStart"/>
+      <w:r>
+        <w:t>::</w:t>
+      </w:r>
+      <w:proofErr w:type="gramEnd"/>
+      <w:r>
+        <w:t xml:space="preserve"> Root directory of the image</w:t>
       </w:r>
     </w:p>
     <w:p>
@@ -13072,7 +14504,7 @@
                     <pic:cNvPicPr/>
                   </pic:nvPicPr>
                   <pic:blipFill>
-                    <a:blip r:embed="rId29"/>
+                    <a:blip r:embed="rId30"/>
                     <a:stretch>
                       <a:fillRect/>
                     </a:stretch>
@@ -13102,7 +14534,23 @@
         </w:numPr>
       </w:pPr>
       <w:r>
-        <w:t>If you open it with ImHex or Exterro FTK Imager or HxD, the FAT partition begins at 0x</w:t>
+        <w:t xml:space="preserve">If you open it with </w:t>
+      </w:r>
+      <w:proofErr w:type="spellStart"/>
+      <w:r>
+        <w:t>ImHex</w:t>
+      </w:r>
+      <w:proofErr w:type="spellEnd"/>
+      <w:r>
+        <w:t xml:space="preserve"> or Exterro FTK Imager or </w:t>
+      </w:r>
+      <w:proofErr w:type="spellStart"/>
+      <w:r>
+        <w:t>HxD</w:t>
+      </w:r>
+      <w:proofErr w:type="spellEnd"/>
+      <w:r>
+        <w:t>, the FAT partition begins at 0x</w:t>
       </w:r>
       <w:r>
         <w:t>00100000</w:t>
@@ -13137,7 +14585,7 @@
                     <pic:cNvPicPr/>
                   </pic:nvPicPr>
                   <pic:blipFill>
-                    <a:blip r:embed="rId30"/>
+                    <a:blip r:embed="rId31"/>
                     <a:stretch>
                       <a:fillRect/>
                     </a:stretch>
@@ -13167,7 +14615,23 @@
         </w:numPr>
       </w:pPr>
       <w:r>
-        <w:t xml:space="preserve">52 52 61 41 RRaR is the FSInfo </w:t>
+        <w:t xml:space="preserve">52 52 61 41 </w:t>
+      </w:r>
+      <w:proofErr w:type="spellStart"/>
+      <w:r>
+        <w:t>RRaR</w:t>
+      </w:r>
+      <w:proofErr w:type="spellEnd"/>
+      <w:r>
+        <w:t xml:space="preserve"> is the </w:t>
+      </w:r>
+      <w:proofErr w:type="spellStart"/>
+      <w:r>
+        <w:t>FSInfo</w:t>
+      </w:r>
+      <w:proofErr w:type="spellEnd"/>
+      <w:r>
+        <w:t xml:space="preserve"> </w:t>
       </w:r>
     </w:p>
     <w:p>
@@ -13196,8 +14660,29 @@
           <w:numId w:val="1"/>
         </w:numPr>
       </w:pPr>
-      <w:r>
-        <w:t>mcopy -i disk16mb.img@@1048576 myfile.txt ::</w:t>
+      <w:proofErr w:type="spellStart"/>
+      <w:r>
+        <w:t>mcopy</w:t>
+      </w:r>
+      <w:proofErr w:type="spellEnd"/>
+      <w:r>
+        <w:t xml:space="preserve"> -</w:t>
+      </w:r>
+      <w:proofErr w:type="spellStart"/>
+      <w:r>
+        <w:t>i</w:t>
+      </w:r>
+      <w:proofErr w:type="spellEnd"/>
+      <w:r>
+        <w:t xml:space="preserve"> disk16mb.img@@1048576 </w:t>
+      </w:r>
+      <w:proofErr w:type="gramStart"/>
+      <w:r>
+        <w:t>myfile.txt :</w:t>
+      </w:r>
+      <w:proofErr w:type="gramEnd"/>
+      <w:r>
+        <w:t>:</w:t>
       </w:r>
     </w:p>
     <w:p>
@@ -13209,7 +14694,23 @@
         </w:numPr>
       </w:pPr>
       <w:r>
-        <w:t>mmd -i disk16mb.img@@1048576 ::/boot</w:t>
+        <w:t>mmd -</w:t>
+      </w:r>
+      <w:proofErr w:type="spellStart"/>
+      <w:r>
+        <w:t>i</w:t>
+      </w:r>
+      <w:proofErr w:type="spellEnd"/>
+      <w:r>
+        <w:t xml:space="preserve"> disk16mb.img@@</w:t>
+      </w:r>
+      <w:proofErr w:type="gramStart"/>
+      <w:r>
+        <w:t>1048576 :</w:t>
+      </w:r>
+      <w:proofErr w:type="gramEnd"/>
+      <w:r>
+        <w:t>:/boot</w:t>
       </w:r>
     </w:p>
     <w:p>
@@ -13220,8 +14721,34 @@
           <w:numId w:val="1"/>
         </w:numPr>
       </w:pPr>
-      <w:r>
-        <w:t>mcopy -i disk16mb.img@@1048576 kernel.bin ::/boot</w:t>
+      <w:proofErr w:type="spellStart"/>
+      <w:r>
+        <w:t>mcopy</w:t>
+      </w:r>
+      <w:proofErr w:type="spellEnd"/>
+      <w:r>
+        <w:t xml:space="preserve"> -</w:t>
+      </w:r>
+      <w:proofErr w:type="spellStart"/>
+      <w:r>
+        <w:t>i</w:t>
+      </w:r>
+      <w:proofErr w:type="spellEnd"/>
+      <w:r>
+        <w:t xml:space="preserve"> disk16mb.img@@1048576 </w:t>
+      </w:r>
+      <w:proofErr w:type="spellStart"/>
+      <w:proofErr w:type="gramStart"/>
+      <w:r>
+        <w:t>kernel.bin</w:t>
+      </w:r>
+      <w:proofErr w:type="spellEnd"/>
+      <w:r>
+        <w:t xml:space="preserve"> :</w:t>
+      </w:r>
+      <w:proofErr w:type="gramEnd"/>
+      <w:r>
+        <w:t>:/boot</w:t>
       </w:r>
     </w:p>
     <w:p>
@@ -13232,8 +14759,29 @@
           <w:numId w:val="1"/>
         </w:numPr>
       </w:pPr>
-      <w:r>
-        <w:t>mdir -i hd16mbfat32.img@@1048576 ::</w:t>
+      <w:proofErr w:type="spellStart"/>
+      <w:r>
+        <w:t>mdir</w:t>
+      </w:r>
+      <w:proofErr w:type="spellEnd"/>
+      <w:r>
+        <w:t xml:space="preserve"> -</w:t>
+      </w:r>
+      <w:proofErr w:type="spellStart"/>
+      <w:r>
+        <w:t>i</w:t>
+      </w:r>
+      <w:proofErr w:type="spellEnd"/>
+      <w:r>
+        <w:t xml:space="preserve"> hd16mbfat32.img@@</w:t>
+      </w:r>
+      <w:proofErr w:type="gramStart"/>
+      <w:r>
+        <w:t>1048576 :</w:t>
+      </w:r>
+      <w:proofErr w:type="gramEnd"/>
+      <w:r>
+        <w:t>:</w:t>
       </w:r>
     </w:p>
     <w:p>
@@ -13264,7 +14812,7 @@
                     <pic:cNvPicPr/>
                   </pic:nvPicPr>
                   <pic:blipFill>
-                    <a:blip r:embed="rId31"/>
+                    <a:blip r:embed="rId32"/>
                     <a:stretch>
                       <a:fillRect/>
                     </a:stretch>
@@ -13294,7 +14842,15 @@
         </w:numPr>
       </w:pPr>
       <w:r>
-        <w:t>sudo losetup --offset 1048576 --find --show hd16mbfat32.img</w:t>
+        <w:t xml:space="preserve">sudo </w:t>
+      </w:r>
+      <w:proofErr w:type="spellStart"/>
+      <w:r>
+        <w:t>losetup</w:t>
+      </w:r>
+      <w:proofErr w:type="spellEnd"/>
+      <w:r>
+        <w:t xml:space="preserve"> --offset 1048576 --find --show hd16mbfat32.img</w:t>
       </w:r>
     </w:p>
     <w:p>
@@ -13305,9 +14861,11 @@
           <w:numId w:val="1"/>
         </w:numPr>
       </w:pPr>
+      <w:proofErr w:type="spellStart"/>
       <w:r>
         <w:t>losetup</w:t>
       </w:r>
+      <w:proofErr w:type="spellEnd"/>
     </w:p>
     <w:p>
       <w:pPr>
@@ -13317,8 +14875,13 @@
           <w:numId w:val="1"/>
         </w:numPr>
       </w:pPr>
-      <w:r>
-        <w:t>losetup --all</w:t>
+      <w:proofErr w:type="spellStart"/>
+      <w:r>
+        <w:t>losetup</w:t>
+      </w:r>
+      <w:proofErr w:type="spellEnd"/>
+      <w:r>
+        <w:t xml:space="preserve"> --all</w:t>
       </w:r>
     </w:p>
     <w:p>
@@ -13350,7 +14913,7 @@
                     <pic:cNvPicPr/>
                   </pic:nvPicPr>
                   <pic:blipFill>
-                    <a:blip r:embed="rId32"/>
+                    <a:blip r:embed="rId33"/>
                     <a:stretch>
                       <a:fillRect/>
                     </a:stretch>
@@ -13392,8 +14955,29 @@
         </w:numPr>
       </w:pPr>
       <w:r>
-        <w:t>sudo mkdir -p /tmp/diskimg</w:t>
-      </w:r>
+        <w:t xml:space="preserve">sudo </w:t>
+      </w:r>
+      <w:proofErr w:type="spellStart"/>
+      <w:r>
+        <w:t>mkdir</w:t>
+      </w:r>
+      <w:proofErr w:type="spellEnd"/>
+      <w:r>
+        <w:t xml:space="preserve"> -p /</w:t>
+      </w:r>
+      <w:proofErr w:type="spellStart"/>
+      <w:r>
+        <w:t>tmp</w:t>
+      </w:r>
+      <w:proofErr w:type="spellEnd"/>
+      <w:r>
+        <w:t>/</w:t>
+      </w:r>
+      <w:proofErr w:type="spellStart"/>
+      <w:r>
+        <w:t>diskimg</w:t>
+      </w:r>
+      <w:proofErr w:type="spellEnd"/>
     </w:p>
     <w:p>
       <w:pPr>
@@ -13404,7 +14988,15 @@
         </w:numPr>
       </w:pPr>
       <w:r>
-        <w:t>sudo losetup --offset 1048576 --find --show hd16mbfat32.img</w:t>
+        <w:t xml:space="preserve">sudo </w:t>
+      </w:r>
+      <w:proofErr w:type="spellStart"/>
+      <w:r>
+        <w:t>losetup</w:t>
+      </w:r>
+      <w:proofErr w:type="spellEnd"/>
+      <w:r>
+        <w:t xml:space="preserve"> --offset 1048576 --find --show hd16mbfat32.img</w:t>
       </w:r>
     </w:p>
     <w:p>
@@ -13416,7 +15008,23 @@
         </w:numPr>
       </w:pPr>
       <w:r>
-        <w:t>ls /tmp/diskimg/</w:t>
+        <w:t>ls /</w:t>
+      </w:r>
+      <w:proofErr w:type="spellStart"/>
+      <w:r>
+        <w:t>tmp</w:t>
+      </w:r>
+      <w:proofErr w:type="spellEnd"/>
+      <w:r>
+        <w:t>/</w:t>
+      </w:r>
+      <w:proofErr w:type="spellStart"/>
+      <w:r>
+        <w:t>diskimg</w:t>
+      </w:r>
+      <w:proofErr w:type="spellEnd"/>
+      <w:r>
+        <w:t>/</w:t>
       </w:r>
     </w:p>
     <w:p>
@@ -13447,7 +15055,7 @@
                     <pic:cNvPicPr/>
                   </pic:nvPicPr>
                   <pic:blipFill>
-                    <a:blip r:embed="rId33"/>
+                    <a:blip r:embed="rId34"/>
                     <a:stretch>
                       <a:fillRect/>
                     </a:stretch>
@@ -13477,8 +15085,21 @@
         </w:numPr>
       </w:pPr>
       <w:r>
-        <w:t>Explore the idea of permanent mounting via /etc/fstab</w:t>
-      </w:r>
+        <w:t>Explore the idea of permanent mounting via /</w:t>
+      </w:r>
+      <w:proofErr w:type="spellStart"/>
+      <w:r>
+        <w:t>etc</w:t>
+      </w:r>
+      <w:proofErr w:type="spellEnd"/>
+      <w:r>
+        <w:t>/</w:t>
+      </w:r>
+      <w:proofErr w:type="spellStart"/>
+      <w:r>
+        <w:t>fstab</w:t>
+      </w:r>
+      <w:proofErr w:type="spellEnd"/>
     </w:p>
     <w:p/>
     <w:p/>
@@ -13490,9 +15111,14 @@
       </w:pPr>
       <w:bookmarkStart w:id="30" w:name="_Toc213174203"/>
       <w:r>
-        <w:t>Return to the last working directory. Windows and linux</w:t>
+        <w:t xml:space="preserve">Return to the last working directory. Windows and </w:t>
+      </w:r>
+      <w:proofErr w:type="spellStart"/>
+      <w:r>
+        <w:t>linux</w:t>
       </w:r>
       <w:bookmarkEnd w:id="30"/>
+      <w:proofErr w:type="spellEnd"/>
     </w:p>
     <w:p/>
     <w:p>
@@ -13516,8 +15142,21 @@
         </w:numPr>
       </w:pPr>
       <w:r>
-        <w:t>“cd –“</w:t>
-      </w:r>
+        <w:t>“</w:t>
+      </w:r>
+      <w:proofErr w:type="gramStart"/>
+      <w:r>
+        <w:t>cd</w:t>
+      </w:r>
+      <w:proofErr w:type="gramEnd"/>
+      <w:r>
+        <w:t xml:space="preserve"> </w:t>
+      </w:r>
+      <w:proofErr w:type="gramStart"/>
+      <w:r>
+        <w:t>–“</w:t>
+      </w:r>
+      <w:proofErr w:type="gramEnd"/>
     </w:p>
     <w:p>
       <w:pPr>
@@ -13539,8 +15178,13 @@
           <w:numId w:val="1"/>
         </w:numPr>
       </w:pPr>
-      <w:r>
-        <w:t>Pushd or push-location</w:t>
+      <w:proofErr w:type="spellStart"/>
+      <w:r>
+        <w:t>Pushd</w:t>
+      </w:r>
+      <w:proofErr w:type="spellEnd"/>
+      <w:r>
+        <w:t xml:space="preserve"> or push-location</w:t>
       </w:r>
     </w:p>
     <w:p>
@@ -13563,8 +15207,13 @@
           <w:numId w:val="1"/>
         </w:numPr>
       </w:pPr>
-      <w:r>
-        <w:t>Popd or pop-location</w:t>
+      <w:proofErr w:type="spellStart"/>
+      <w:r>
+        <w:t>Popd</w:t>
+      </w:r>
+      <w:proofErr w:type="spellEnd"/>
+      <w:r>
+        <w:t xml:space="preserve"> or pop-location</w:t>
       </w:r>
     </w:p>
     <w:p/>
@@ -13635,7 +15284,15 @@
         </w:numPr>
       </w:pPr>
       <w:r>
-        <w:t>Partition table on the MBR. I remember seeing adding 4 16bytes reserved structures before 0xAA55</w:t>
+        <w:t>Partition table on the MBR. I remember seeing adding 4 16</w:t>
+      </w:r>
+      <w:proofErr w:type="gramStart"/>
+      <w:r>
+        <w:t>bytes</w:t>
+      </w:r>
+      <w:proofErr w:type="gramEnd"/>
+      <w:r>
+        <w:t xml:space="preserve"> reserved structures before 0xAA55</w:t>
       </w:r>
     </w:p>
     <w:p>
@@ -13648,7 +15305,15 @@
       </w:pPr>
       <w:r>
         <w:lastRenderedPageBreak/>
-        <w:t>I guess this applies if the MBR is for a hard disk, but does not apply for a floppy</w:t>
+        <w:t xml:space="preserve">I guess this applies if the MBR is for a hard </w:t>
+      </w:r>
+      <w:proofErr w:type="gramStart"/>
+      <w:r>
+        <w:t>disk, but</w:t>
+      </w:r>
+      <w:proofErr w:type="gramEnd"/>
+      <w:r>
+        <w:t xml:space="preserve"> does not apply for a floppy</w:t>
       </w:r>
       <w:r>
         <w:t>. This is an educated guess</w:t>
@@ -13663,7 +15328,15 @@
         </w:numPr>
       </w:pPr>
       <w:r>
-        <w:t xml:space="preserve">On floppy, the FAT info at 0 starts with a jump to code, followed by the FAT info. This way both, the bootloader and FAT info can coexist, because there is a jump. Validate this because I got this explained by </w:t>
+        <w:t xml:space="preserve">On floppy, the FAT info at 0 starts with a jump to code, followed by the FAT info. This way </w:t>
+      </w:r>
+      <w:proofErr w:type="gramStart"/>
+      <w:r>
+        <w:t>both,</w:t>
+      </w:r>
+      <w:proofErr w:type="gramEnd"/>
+      <w:r>
+        <w:t xml:space="preserve"> the bootloader and FAT info can coexist, because there is a jump. Validate this because I got this explained by </w:t>
       </w:r>
       <w:r>
         <w:t>ChatGPT. It makes a lot of sense, but still…</w:t>
@@ -13678,7 +15351,15 @@
         </w:numPr>
       </w:pPr>
       <w:r>
-        <w:t>A Disk with multiple partitions, the first byte define if it is bootable 0x80 = bootable.</w:t>
+        <w:t xml:space="preserve">A Disk with multiple partitions, the first byte </w:t>
+      </w:r>
+      <w:proofErr w:type="gramStart"/>
+      <w:r>
+        <w:t>define</w:t>
+      </w:r>
+      <w:proofErr w:type="gramEnd"/>
+      <w:r>
+        <w:t xml:space="preserve"> if it is bootable 0x80 = bootable.</w:t>
       </w:r>
       <w:r>
         <w:t xml:space="preserve"> The first byte on one of those 4 16 bytes partitions at the end of the MBR before the 0xAA55</w:t>
@@ -13693,7 +15374,15 @@
         </w:numPr>
       </w:pPr>
       <w:r>
-        <w:t>Can MBR and BPB be fused together? I found something related to a short jump at the beginning, of BPB ??? Dive deeper into this!</w:t>
+        <w:t xml:space="preserve">Can MBR and BPB be fused together? I found something related to a short jump at the beginning, of </w:t>
+      </w:r>
+      <w:proofErr w:type="gramStart"/>
+      <w:r>
+        <w:t>BPB ???</w:t>
+      </w:r>
+      <w:proofErr w:type="gramEnd"/>
+      <w:r>
+        <w:t xml:space="preserve"> Dive deeper into this!</w:t>
       </w:r>
       <w:r>
         <w:t xml:space="preserve"> I think BPB merged on MBR is for disk without partitions, such as floppy disks. </w:t>
@@ -13738,8 +15427,37 @@
         </w:numPr>
       </w:pPr>
       <w:r>
-        <w:t>Change the path order (open first code from linux instead of windows, without removing the windows path via etc/wsl.conf file )</w:t>
-      </w:r>
+        <w:t xml:space="preserve">Change the path order (open first code from </w:t>
+      </w:r>
+      <w:proofErr w:type="spellStart"/>
+      <w:r>
+        <w:t>linux</w:t>
+      </w:r>
+      <w:proofErr w:type="spellEnd"/>
+      <w:r>
+        <w:t xml:space="preserve"> instead of windows, without removing the windows path via </w:t>
+      </w:r>
+      <w:proofErr w:type="spellStart"/>
+      <w:r>
+        <w:t>etc</w:t>
+      </w:r>
+      <w:proofErr w:type="spellEnd"/>
+      <w:r>
+        <w:t>/</w:t>
+      </w:r>
+      <w:proofErr w:type="spellStart"/>
+      <w:r>
+        <w:t>wsl.conf</w:t>
+      </w:r>
+      <w:proofErr w:type="spellEnd"/>
+      <w:r>
+        <w:t xml:space="preserve"> </w:t>
+      </w:r>
+      <w:proofErr w:type="gramStart"/>
+      <w:r>
+        <w:t>file )</w:t>
+      </w:r>
+      <w:proofErr w:type="gramEnd"/>
     </w:p>
     <w:p>
       <w:pPr>
@@ -13750,10 +15468,23 @@
         </w:numPr>
       </w:pPr>
       <w:r>
-        <w:t>Tools for disks, the old MSDOS debug, and diskedit</w:t>
-      </w:r>
-      <w:r>
-        <w:t>. AccessData FTK Imager, now with a new name Exterro FTK imager.</w:t>
+        <w:t xml:space="preserve">Tools for disks, the old MSDOS debug, and </w:t>
+      </w:r>
+      <w:proofErr w:type="spellStart"/>
+      <w:r>
+        <w:t>diskedit</w:t>
+      </w:r>
+      <w:proofErr w:type="spellEnd"/>
+      <w:r>
+        <w:t xml:space="preserve">. </w:t>
+      </w:r>
+      <w:proofErr w:type="spellStart"/>
+      <w:r>
+        <w:t>AccessData</w:t>
+      </w:r>
+      <w:proofErr w:type="spellEnd"/>
+      <w:r>
+        <w:t xml:space="preserve"> FTK Imager, now with a new name Exterro FTK imager.</w:t>
       </w:r>
     </w:p>
     <w:p/>
@@ -13800,7 +15531,7 @@
                     <pic:cNvPicPr/>
                   </pic:nvPicPr>
                   <pic:blipFill>
-                    <a:blip r:embed="rId34"/>
+                    <a:blip r:embed="rId35"/>
                     <a:stretch>
                       <a:fillRect/>
                     </a:stretch>
@@ -13868,7 +15599,7 @@
                     <pic:cNvPicPr/>
                   </pic:nvPicPr>
                   <pic:blipFill>
-                    <a:blip r:embed="rId35"/>
+                    <a:blip r:embed="rId36"/>
                     <a:stretch>
                       <a:fillRect/>
                     </a:stretch>
@@ -13906,7 +15637,15 @@
         </w:r>
       </w:fldSimple>
       <w:r>
-        <w:t xml:space="preserve"> Early makefile for the bootloader</w:t>
+        <w:t xml:space="preserve"> Early </w:t>
+      </w:r>
+      <w:proofErr w:type="spellStart"/>
+      <w:r>
+        <w:t>makefile</w:t>
+      </w:r>
+      <w:proofErr w:type="spellEnd"/>
+      <w:r>
+        <w:t xml:space="preserve"> for the bootloader</w:t>
       </w:r>
       <w:bookmarkEnd w:id="35"/>
     </w:p>
@@ -13941,7 +15680,7 @@
                     <pic:cNvPicPr/>
                   </pic:nvPicPr>
                   <pic:blipFill>
-                    <a:blip r:embed="rId36"/>
+                    <a:blip r:embed="rId37"/>
                     <a:stretch>
                       <a:fillRect/>
                     </a:stretch>
@@ -14030,7 +15769,7 @@
                     <pic:cNvPicPr/>
                   </pic:nvPicPr>
                   <pic:blipFill>
-                    <a:blip r:embed="rId37"/>
+                    <a:blip r:embed="rId38"/>
                     <a:stretch>
                       <a:fillRect/>
                     </a:stretch>
@@ -14103,7 +15842,7 @@
                     <pic:cNvPicPr/>
                   </pic:nvPicPr>
                   <pic:blipFill>
-                    <a:blip r:embed="rId38"/>
+                    <a:blip r:embed="rId39"/>
                     <a:stretch>
                       <a:fillRect/>
                     </a:stretch>
@@ -14170,7 +15909,7 @@
                     <pic:cNvPicPr/>
                   </pic:nvPicPr>
                   <pic:blipFill>
-                    <a:blip r:embed="rId39"/>
+                    <a:blip r:embed="rId40"/>
                     <a:stretch>
                       <a:fillRect/>
                     </a:stretch>
@@ -14244,7 +15983,7 @@
                     <pic:cNvPicPr/>
                   </pic:nvPicPr>
                   <pic:blipFill>
-                    <a:blip r:embed="rId40"/>
+                    <a:blip r:embed="rId41"/>
                     <a:stretch>
                       <a:fillRect/>
                     </a:stretch>
@@ -14297,6 +16036,9 @@
         <w:keepNext/>
       </w:pPr>
       <w:r>
+        <w:rPr>
+          <w:noProof/>
+        </w:rPr>
         <w:lastRenderedPageBreak/>
         <w:drawing>
           <wp:inline distT="0" distB="0" distL="0" distR="0" wp14:anchorId="2C745833" wp14:editId="658EFFF9">
@@ -14314,7 +16056,7 @@
                     <pic:cNvPicPr/>
                   </pic:nvPicPr>
                   <pic:blipFill>
-                    <a:blip r:embed="rId41"/>
+                    <a:blip r:embed="rId42"/>
                     <a:stretch>
                       <a:fillRect/>
                     </a:stretch>
@@ -14403,7 +16145,7 @@
             <w:tcW w:w="4675" w:type="dxa"/>
           </w:tcPr>
           <w:p>
-            <w:hyperlink r:id="rId42" w:history="1">
+            <w:hyperlink r:id="rId43" w:history="1">
               <w:r>
                 <w:rPr>
                   <w:rStyle w:val="Hyperlink"/>
@@ -14422,41 +16164,13 @@
             <w:r>
               <w:t xml:space="preserve">bootloader made in assembly. </w:t>
             </w:r>
+            <w:proofErr w:type="spellStart"/>
             <w:r>
               <w:t>diskwrite.c</w:t>
             </w:r>
+            <w:proofErr w:type="spellEnd"/>
             <w:r>
               <w:t>, it looks like a custom FAT32 image writer, which is an idea I am toying with.</w:t>
-            </w:r>
-          </w:p>
-        </w:tc>
-      </w:tr>
-      <w:tr>
-        <w:tc>
-          <w:tcPr>
-            <w:tcW w:w="4675" w:type="dxa"/>
-          </w:tcPr>
-          <w:p>
-            <w:hyperlink r:id="rId43" w:history="1">
-              <w:r>
-                <w:rPr>
-                  <w:rStyle w:val="Hyperlink"/>
-                </w:rPr>
-                <w:t>https://archive.org/details/FAT_Specification/mode/1up</w:t>
-              </w:r>
-            </w:hyperlink>
-            <w:r>
-              <w:t xml:space="preserve"> </w:t>
-            </w:r>
-          </w:p>
-        </w:tc>
-        <w:tc>
-          <w:tcPr>
-            <w:tcW w:w="4675" w:type="dxa"/>
-          </w:tcPr>
-          <w:p>
-            <w:r>
-              <w:t>FAT Reference from Microsoft. Internet archive</w:t>
             </w:r>
           </w:p>
         </w:tc>
@@ -14472,7 +16186,7 @@
                 <w:rPr>
                   <w:rStyle w:val="Hyperlink"/>
                 </w:rPr>
-                <w:t>https://euroassembler.eu/</w:t>
+                <w:t>https://archive.org/details/FAT_Specification/mode/1up</w:t>
               </w:r>
             </w:hyperlink>
             <w:r>
@@ -14486,13 +16200,7 @@
           </w:tcPr>
           <w:p>
             <w:r>
-              <w:t>Yet another assembler. There is a ton of work behind. The macros</w:t>
-            </w:r>
-            <w:r>
-              <w:t xml:space="preserve"> and projects</w:t>
-            </w:r>
-            <w:r>
-              <w:t xml:space="preserve"> section contain a lot of pre-canned structures and asm for OsDev</w:t>
+              <w:t>FAT Reference from Microsoft. Internet archive</w:t>
             </w:r>
           </w:p>
         </w:tc>
@@ -14508,7 +16216,7 @@
                 <w:rPr>
                   <w:rStyle w:val="Hyperlink"/>
                 </w:rPr>
-                <w:t>https://elm-chan.org/docs/fat_e.html</w:t>
+                <w:t>https://euroassembler.eu/</w:t>
               </w:r>
             </w:hyperlink>
             <w:r>
@@ -14522,8 +16230,27 @@
           </w:tcPr>
           <w:p>
             <w:r>
-              <w:t>FAT stuff</w:t>
-            </w:r>
+              <w:t>Yet another assembler. There is a ton of work behind. The macros</w:t>
+            </w:r>
+            <w:r>
+              <w:t xml:space="preserve"> and projects</w:t>
+            </w:r>
+            <w:r>
+              <w:t xml:space="preserve"> section contain a lot of pre-canned structures and </w:t>
+            </w:r>
+            <w:proofErr w:type="spellStart"/>
+            <w:r>
+              <w:t>asm</w:t>
+            </w:r>
+            <w:proofErr w:type="spellEnd"/>
+            <w:r>
+              <w:t xml:space="preserve"> for </w:t>
+            </w:r>
+            <w:proofErr w:type="spellStart"/>
+            <w:r>
+              <w:t>OsDev</w:t>
+            </w:r>
+            <w:proofErr w:type="spellEnd"/>
           </w:p>
         </w:tc>
       </w:tr>
@@ -14538,7 +16265,7 @@
                 <w:rPr>
                   <w:rStyle w:val="Hyperlink"/>
                 </w:rPr>
-                <w:t>https://github.com/lukearend/x86-bootloader</w:t>
+                <w:t>https://elm-chan.org/docs/fat_e.html</w:t>
               </w:r>
             </w:hyperlink>
             <w:r>
@@ -14552,7 +16279,7 @@
           </w:tcPr>
           <w:p>
             <w:r>
-              <w:t>Bootloader assembly, very basic</w:t>
+              <w:t>FAT stuff</w:t>
             </w:r>
           </w:p>
         </w:tc>
@@ -14568,7 +16295,7 @@
                 <w:rPr>
                   <w:rStyle w:val="Hyperlink"/>
                 </w:rPr>
-                <w:t>https://en.wikipedia.org/wiki/Master_boot_record</w:t>
+                <w:t>https://github.com/lukearend/x86-bootloader</w:t>
               </w:r>
             </w:hyperlink>
             <w:r>
@@ -14582,32 +16309,7 @@
           </w:tcPr>
           <w:p>
             <w:r>
-              <w:t>The sector layout section is a good summary.</w:t>
-            </w:r>
-          </w:p>
-        </w:tc>
-      </w:tr>
-      <w:tr>
-        <w:tc>
-          <w:tcPr>
-            <w:tcW w:w="4675" w:type="dxa"/>
-          </w:tcPr>
-          <w:p>
-            <w:r>
-              <w:t>docs\Reference\FileSystem\FAT-Specification-Microsoft-Aug2005.pdf</w:t>
-            </w:r>
-            <w:r>
-              <w:t xml:space="preserve"> </w:t>
-            </w:r>
-          </w:p>
-        </w:tc>
-        <w:tc>
-          <w:tcPr>
-            <w:tcW w:w="4675" w:type="dxa"/>
-          </w:tcPr>
-          <w:p>
-            <w:r>
-              <w:t>PDF FAT reference</w:t>
+              <w:t>Bootloader assembly, very basic</w:t>
             </w:r>
           </w:p>
         </w:tc>
@@ -14623,9 +16325,12 @@
                 <w:rPr>
                   <w:rStyle w:val="Hyperlink"/>
                 </w:rPr>
-                <w:t>https://www.easeus.com/resource/fat32-disk-structure.html?srsltid=AfmBOorykOEYj97O-GVlZWgVod0F3h0Jx9gLmAidlQA_ZXAyrPXHGyzE</w:t>
+                <w:t>https://en.wikipedia.org/wiki/Master_boot_record</w:t>
               </w:r>
             </w:hyperlink>
+            <w:r>
+              <w:t xml:space="preserve"> </w:t>
+            </w:r>
           </w:p>
         </w:tc>
         <w:tc>
@@ -14634,13 +16339,32 @@
           </w:tcPr>
           <w:p>
             <w:r>
-              <w:t>Clear and concise FAT</w:t>
-            </w:r>
-            <w:r>
-              <w:t>32</w:t>
-            </w:r>
-            <w:r>
-              <w:t xml:space="preserve"> structures</w:t>
+              <w:t>The sector layout section is a good summary.</w:t>
+            </w:r>
+          </w:p>
+        </w:tc>
+      </w:tr>
+      <w:tr>
+        <w:tc>
+          <w:tcPr>
+            <w:tcW w:w="4675" w:type="dxa"/>
+          </w:tcPr>
+          <w:p>
+            <w:r>
+              <w:t>docs\Reference\FileSystem\FAT-Specification-Microsoft-Aug2005.pdf</w:t>
+            </w:r>
+            <w:r>
+              <w:t xml:space="preserve"> </w:t>
+            </w:r>
+          </w:p>
+        </w:tc>
+        <w:tc>
+          <w:tcPr>
+            <w:tcW w:w="4675" w:type="dxa"/>
+          </w:tcPr>
+          <w:p>
+            <w:r>
+              <w:t>PDF FAT reference</w:t>
             </w:r>
           </w:p>
         </w:tc>
@@ -14656,7 +16380,7 @@
                 <w:rPr>
                   <w:rStyle w:val="Hyperlink"/>
                 </w:rPr>
-                <w:t>https://oort.rs</w:t>
+                <w:t>https://www.easeus.com/resource/fat32-disk-structure.html?srsltid=AfmBOorykOEYj97O-GVlZWgVod0F3h0Jx9gLmAidlQA_ZXAyrPXHGyzE</w:t>
               </w:r>
             </w:hyperlink>
           </w:p>
@@ -14667,7 +16391,13 @@
           </w:tcPr>
           <w:p>
             <w:r>
-              <w:t>Dust off your rust</w:t>
+              <w:t>Clear and concise FAT</w:t>
+            </w:r>
+            <w:r>
+              <w:t>32</w:t>
+            </w:r>
+            <w:r>
+              <w:t xml:space="preserve"> structures</w:t>
             </w:r>
           </w:p>
         </w:tc>
@@ -14683,12 +16413,9 @@
                 <w:rPr>
                   <w:rStyle w:val="Hyperlink"/>
                 </w:rPr>
-                <w:t>https://github.com/usagi/rust-memory-container-cs/blob/master/3840x2160/rust-memory-container-cs-3840x2160-dark-back.png</w:t>
+                <w:t>https://oort.rs</w:t>
               </w:r>
             </w:hyperlink>
-            <w:r>
-              <w:t xml:space="preserve"> </w:t>
-            </w:r>
           </w:p>
         </w:tc>
         <w:tc>
@@ -14697,6 +16424,36 @@
           </w:tcPr>
           <w:p>
             <w:r>
+              <w:t>Dust off your rust</w:t>
+            </w:r>
+          </w:p>
+        </w:tc>
+      </w:tr>
+      <w:tr>
+        <w:tc>
+          <w:tcPr>
+            <w:tcW w:w="4675" w:type="dxa"/>
+          </w:tcPr>
+          <w:p>
+            <w:hyperlink r:id="rId51" w:history="1">
+              <w:r>
+                <w:rPr>
+                  <w:rStyle w:val="Hyperlink"/>
+                </w:rPr>
+                <w:t>https://github.com/usagi/rust-memory-container-cs/blob/master/3840x2160/rust-memory-container-cs-3840x2160-dark-back.png</w:t>
+              </w:r>
+            </w:hyperlink>
+            <w:r>
+              <w:t xml:space="preserve"> </w:t>
+            </w:r>
+          </w:p>
+        </w:tc>
+        <w:tc>
+          <w:tcPr>
+            <w:tcW w:w="4675" w:type="dxa"/>
+          </w:tcPr>
+          <w:p>
+            <w:r>
               <w:t xml:space="preserve">Rosetta stone to Rust memory </w:t>
             </w:r>
           </w:p>
@@ -14733,7 +16490,15 @@
     <w:p/>
     <w:p>
       <w:r>
-        <w:t>Hours clocked-in includes, coding, research, testing, reading, documenting, etc…</w:t>
+        <w:t xml:space="preserve">Hours clocked-in includes, coding, research, testing, reading, documenting, </w:t>
+      </w:r>
+      <w:proofErr w:type="spellStart"/>
+      <w:r>
+        <w:t>etc</w:t>
+      </w:r>
+      <w:proofErr w:type="spellEnd"/>
+      <w:r>
+        <w:t>…</w:t>
       </w:r>
     </w:p>
     <w:p/>
@@ -14771,7 +16536,15 @@
               <w:cnfStyle w:val="100000000000" w:firstRow="1" w:lastRow="0" w:firstColumn="0" w:lastColumn="0" w:oddVBand="0" w:evenVBand="0" w:oddHBand="0" w:evenHBand="0" w:firstRowFirstColumn="0" w:firstRowLastColumn="0" w:lastRowFirstColumn="0" w:lastRowLastColumn="0"/>
             </w:pPr>
             <w:r>
-              <w:t>Hours aprox.</w:t>
+              <w:t xml:space="preserve">Hours </w:t>
+            </w:r>
+            <w:proofErr w:type="spellStart"/>
+            <w:r>
+              <w:t>aprox</w:t>
+            </w:r>
+            <w:proofErr w:type="spellEnd"/>
+            <w:r>
+              <w:t>.</w:t>
             </w:r>
           </w:p>
         </w:tc>
@@ -15863,7 +17636,7 @@
       </w:r>
     </w:p>
     <w:sectPr>
-      <w:headerReference w:type="default" r:id="rId51"/>
+      <w:headerReference w:type="default" r:id="rId52"/>
       <w:pgSz w:w="12240" w:h="15840"/>
       <w:pgMar w:top="1440" w:right="1440" w:bottom="1440" w:left="1440" w:header="720" w:footer="720" w:gutter="0"/>
       <w:pgNumType w:start="0"/>
@@ -17240,6 +19013,7 @@
   <w:style w:type="character" w:default="1" w:styleId="DefaultParagraphFont">
     <w:name w:val="Default Paragraph Font"/>
     <w:uiPriority w:val="1"/>
+    <w:semiHidden/>
     <w:unhideWhenUsed/>
   </w:style>
   <w:style w:type="table" w:default="1" w:styleId="TableNormal">

</xml_diff>

<commit_message>
fatstructure02 tool almost complete. Only works on 34MB images. It injects the partition table and the magic boot
</commit_message>
<xml_diff>
--- a/docs/TusMuertos-v2.0-Design.docx
+++ b/docs/TusMuertos-v2.0-Design.docx
@@ -3865,13 +3865,8 @@
         <w:t>/Zig</w:t>
       </w:r>
       <w:r>
-        <w:t xml:space="preserve"> for challenge. NASM assembly for </w:t>
-      </w:r>
-      <w:proofErr w:type="gramStart"/>
-      <w:r>
-        <w:t>bootloader</w:t>
-      </w:r>
-      <w:proofErr w:type="gramEnd"/>
+        <w:t xml:space="preserve"> for challenge. NASM assembly for bootloader</w:t>
+      </w:r>
       <w:r>
         <w:t xml:space="preserve">. </w:t>
       </w:r>
@@ -4188,15 +4183,7 @@
         </w:numPr>
       </w:pPr>
       <w:r>
-        <w:t xml:space="preserve">2 Stages. Minimal first stage until Protected mode + Second stage to </w:t>
-      </w:r>
-      <w:proofErr w:type="gramStart"/>
-      <w:r>
-        <w:t>Long</w:t>
-      </w:r>
-      <w:proofErr w:type="gramEnd"/>
-      <w:r>
-        <w:t xml:space="preserve"> mode</w:t>
+        <w:t>2 Stages. Minimal first stage until Protected mode + Second stage to Long mode</w:t>
       </w:r>
     </w:p>
     <w:p>
@@ -4359,7 +4346,6 @@
           <w:numId w:val="1"/>
         </w:numPr>
       </w:pPr>
-      <w:proofErr w:type="gramStart"/>
       <w:r>
         <w:t>Print early status</w:t>
       </w:r>
@@ -4372,7 +4358,6 @@
         </w:rPr>
         <w:t>✅</w:t>
       </w:r>
-      <w:proofErr w:type="gramEnd"/>
     </w:p>
     <w:p>
       <w:pPr>
@@ -4468,15 +4453,7 @@
         </w:numPr>
       </w:pPr>
       <w:r>
-        <w:t xml:space="preserve">Jump to Protected mode if Stage1 </w:t>
-      </w:r>
-      <w:proofErr w:type="gramStart"/>
-      <w:r>
-        <w:t>did</w:t>
-      </w:r>
-      <w:proofErr w:type="gramEnd"/>
-      <w:r>
-        <w:t xml:space="preserve"> not change mode.</w:t>
+        <w:t>Jump to Protected mode if Stage1 did not change mode.</w:t>
       </w:r>
     </w:p>
     <w:p>
@@ -4488,23 +4465,7 @@
         </w:numPr>
       </w:pPr>
       <w:r>
-        <w:t xml:space="preserve">Enable </w:t>
-      </w:r>
-      <w:proofErr w:type="gramStart"/>
-      <w:r>
-        <w:t>A20, or</w:t>
-      </w:r>
-      <w:proofErr w:type="gramEnd"/>
-      <w:r>
-        <w:t xml:space="preserve"> at least check. There are multiple strategies for this. Some platforms have fast </w:t>
-      </w:r>
-      <w:proofErr w:type="gramStart"/>
-      <w:r>
-        <w:t>enable</w:t>
-      </w:r>
-      <w:proofErr w:type="gramEnd"/>
-      <w:r>
-        <w:t xml:space="preserve"> 0x92, or they come with A20 already enable. XXXX</w:t>
+        <w:t>Enable A20, or at least check. There are multiple strategies for this. Some platforms have fast enable 0x92, or they come with A20 already enable. XXXX</w:t>
       </w:r>
     </w:p>
     <w:p>
@@ -4560,15 +4521,7 @@
         </w:numPr>
       </w:pPr>
       <w:r>
-        <w:t xml:space="preserve">Flat binary: Explore this option, </w:t>
-      </w:r>
-      <w:proofErr w:type="gramStart"/>
-      <w:r>
-        <w:t>maybe</w:t>
-      </w:r>
-      <w:proofErr w:type="gramEnd"/>
-      <w:r>
-        <w:t xml:space="preserve"> is simpler</w:t>
+        <w:t>Flat binary: Explore this option, maybe is simpler</w:t>
       </w:r>
     </w:p>
     <w:p>
@@ -4624,15 +4577,7 @@
         </w:numPr>
       </w:pPr>
       <w:r>
-        <w:t xml:space="preserve">Verify if long </w:t>
-      </w:r>
-      <w:proofErr w:type="gramStart"/>
-      <w:r>
-        <w:t>mode</w:t>
-      </w:r>
-      <w:proofErr w:type="gramEnd"/>
-      <w:r>
-        <w:t xml:space="preserve"> if possible, for completeness</w:t>
+        <w:t>Verify if long mode if possible, for completeness</w:t>
       </w:r>
     </w:p>
     <w:p>
@@ -4857,15 +4802,7 @@
         </w:numPr>
       </w:pPr>
       <w:r>
-        <w:t xml:space="preserve">It creates an MBR and </w:t>
-      </w:r>
-      <w:proofErr w:type="gramStart"/>
-      <w:r>
-        <w:t>VBR(</w:t>
-      </w:r>
-      <w:proofErr w:type="gramEnd"/>
-      <w:r>
-        <w:t>with BPB) to boot and have a FAT12/16/32 structure</w:t>
+        <w:t>It creates an MBR and VBR(with BPB) to boot and have a FAT12/16/32 structure</w:t>
       </w:r>
     </w:p>
     <w:p>
@@ -5099,15 +5036,7 @@
         </w:numPr>
       </w:pPr>
       <w:r>
-        <w:t xml:space="preserve">Inject the FAT structure </w:t>
-      </w:r>
-      <w:proofErr w:type="gramStart"/>
-      <w:r>
-        <w:t>on</w:t>
-      </w:r>
-      <w:proofErr w:type="gramEnd"/>
-      <w:r>
-        <w:t xml:space="preserve"> the disk</w:t>
+        <w:t>Inject the FAT structure on the disk</w:t>
       </w:r>
     </w:p>
     <w:p>
@@ -5119,15 +5048,7 @@
         </w:numPr>
       </w:pPr>
       <w:r>
-        <w:t xml:space="preserve">Inject the sector0.bin </w:t>
-      </w:r>
-      <w:proofErr w:type="gramStart"/>
-      <w:r>
-        <w:t>on</w:t>
-      </w:r>
-      <w:proofErr w:type="gramEnd"/>
-      <w:r>
-        <w:t xml:space="preserve"> offset 0x00.</w:t>
+        <w:t>Inject the sector0.bin on offset 0x00.</w:t>
       </w:r>
     </w:p>
     <w:p>
@@ -9512,15 +9433,7 @@
         </w:numPr>
       </w:pPr>
       <w:r>
-        <w:t>Non-partitioned storage, such as floppy, use VBR. First sector, physical C/H/S 0,0,</w:t>
-      </w:r>
-      <w:proofErr w:type="gramStart"/>
-      <w:r>
-        <w:t>1 .</w:t>
-      </w:r>
-      <w:proofErr w:type="gramEnd"/>
-      <w:r>
-        <w:t xml:space="preserve"> Note the sector counting </w:t>
+        <w:t xml:space="preserve">Non-partitioned storage, such as floppy, use VBR. First sector, physical C/H/S 0,0,1 . Note the sector counting </w:t>
       </w:r>
       <w:r>
         <w:t>begins</w:t>
@@ -9653,15 +9566,7 @@
         <w:t>, sector 2048 contains the BPB of a partition.</w:t>
       </w:r>
       <w:r>
-        <w:t xml:space="preserve"> Both can be </w:t>
-      </w:r>
-      <w:proofErr w:type="gramStart"/>
-      <w:r>
-        <w:t>see</w:t>
-      </w:r>
-      <w:proofErr w:type="gramEnd"/>
-      <w:r>
-        <w:t xml:space="preserve"> easily using </w:t>
+        <w:t xml:space="preserve"> Both can be see easily using </w:t>
       </w:r>
       <w:proofErr w:type="spellStart"/>
       <w:r>
@@ -9678,15 +9583,7 @@
         </w:numPr>
       </w:pPr>
       <w:r>
-        <w:t xml:space="preserve">Partition information </w:t>
-      </w:r>
-      <w:proofErr w:type="gramStart"/>
-      <w:r>
-        <w:t>extracted</w:t>
-      </w:r>
-      <w:proofErr w:type="gramEnd"/>
-      <w:r>
-        <w:t xml:space="preserve"> from the 4x16 bytes before the boot magic number. The first value begins at </w:t>
+        <w:t xml:space="preserve">Partition information extracted from the 4x16 bytes before the boot magic number. The first value begins at </w:t>
       </w:r>
       <w:r>
         <w:t>0x1BE</w:t>
@@ -9857,13 +9754,8 @@
       <w:r>
         <w:t xml:space="preserve"> Dissection of the first partition using ChatGPT. </w:t>
       </w:r>
-      <w:proofErr w:type="gramStart"/>
-      <w:r>
-        <w:t>Is</w:t>
-      </w:r>
-      <w:proofErr w:type="gramEnd"/>
-      <w:r>
-        <w:t xml:space="preserve"> correct?</w:t>
+      <w:r>
+        <w:t>Is correct?</w:t>
       </w:r>
       <w:bookmarkEnd w:id="10"/>
     </w:p>
@@ -10171,7 +10063,6 @@
       <w:r>
         <w:t>Invoke explorer Windows using “</w:t>
       </w:r>
-      <w:proofErr w:type="gramStart"/>
       <w:r>
         <w:rPr>
           <w:b/>
@@ -10179,7 +10070,6 @@
         </w:rPr>
         <w:t>explorer.exe .</w:t>
       </w:r>
-      <w:proofErr w:type="gramEnd"/>
       <w:r>
         <w:t>”</w:t>
       </w:r>
@@ -10321,13 +10211,8 @@
           <w:bCs/>
         </w:rPr>
       </w:pPr>
-      <w:proofErr w:type="gramStart"/>
-      <w:r>
-        <w:t>Also</w:t>
-      </w:r>
-      <w:proofErr w:type="gramEnd"/>
-      <w:r>
-        <w:t xml:space="preserve"> you can net use </w:t>
+      <w:r>
+        <w:t xml:space="preserve">Also you can net use </w:t>
       </w:r>
       <w:r>
         <w:rPr>
@@ -10683,15 +10568,7 @@
       </w:r>
       <w:proofErr w:type="spellEnd"/>
       <w:r>
-        <w:t xml:space="preserve"> = </w:t>
-      </w:r>
-      <w:proofErr w:type="gramStart"/>
-      <w:r>
-        <w:t>clear(</w:t>
-      </w:r>
-      <w:proofErr w:type="gramEnd"/>
-      <w:r>
-        <w:t>investigate how to make it permanent)</w:t>
+        <w:t xml:space="preserve"> = clear(investigate how to make it permanent)</w:t>
       </w:r>
     </w:p>
     <w:p>
@@ -11033,16 +10910,11 @@
           <w:numId w:val="1"/>
         </w:numPr>
       </w:pPr>
-      <w:proofErr w:type="gramStart"/>
       <w:r>
         <w:t>Actually,</w:t>
       </w:r>
       <w:r>
-        <w:t xml:space="preserve"> what</w:t>
-      </w:r>
-      <w:proofErr w:type="gramEnd"/>
-      <w:r>
-        <w:t xml:space="preserve"> worked was [interop] </w:t>
+        <w:t xml:space="preserve"> what worked was [interop] </w:t>
       </w:r>
       <w:r>
         <w:t>appendWindowsPath=false</w:t>
@@ -11081,13 +10953,8 @@
         </w:numPr>
       </w:pPr>
       <w:r>
-        <w:t xml:space="preserve">Now using </w:t>
-      </w:r>
-      <w:proofErr w:type="gramStart"/>
-      <w:r>
-        <w:t>code .</w:t>
-      </w:r>
-      <w:proofErr w:type="gramEnd"/>
+        <w:t>Now using code .</w:t>
+      </w:r>
       <w:r>
         <w:t xml:space="preserve"> will open native, with a warning.</w:t>
       </w:r>
@@ -12029,13 +11896,8 @@
         </w:numPr>
       </w:pPr>
       <w:r>
-        <w:t xml:space="preserve">            "options</w:t>
-      </w:r>
-      <w:proofErr w:type="gramStart"/>
-      <w:r>
-        <w:t>": {</w:t>
-      </w:r>
-      <w:proofErr w:type="gramEnd"/>
+        <w:t xml:space="preserve">            "options": {</w:t>
+      </w:r>
     </w:p>
     <w:p>
       <w:pPr>
@@ -12138,13 +12000,8 @@
         </w:numPr>
       </w:pPr>
       <w:r>
-        <w:t xml:space="preserve">            "group</w:t>
-      </w:r>
-      <w:proofErr w:type="gramStart"/>
-      <w:r>
-        <w:t>": {</w:t>
-      </w:r>
-      <w:proofErr w:type="gramEnd"/>
+        <w:t xml:space="preserve">            "group": {</w:t>
+      </w:r>
     </w:p>
     <w:p>
       <w:pPr>
@@ -12399,21 +12256,8 @@
           <w:numId w:val="1"/>
         </w:numPr>
       </w:pPr>
-      <w:proofErr w:type="gramStart"/>
-      <w:r>
-        <w:t>RoboCopy.exe  "</w:t>
-      </w:r>
-      <w:proofErr w:type="gramEnd"/>
-      <w:r>
-        <w:t xml:space="preserve">Z:\home\mihe\codebox" "C:\Users\mihe\Dropbox\TusMuertOS-Oct2025\src\helpers" </w:t>
-      </w:r>
-      <w:proofErr w:type="gramStart"/>
-      <w:r>
-        <w:t>*.*</w:t>
-      </w:r>
-      <w:proofErr w:type="gramEnd"/>
-      <w:r>
-        <w:t xml:space="preserve"> /E</w:t>
+      <w:r>
+        <w:t>RoboCopy.exe  "Z:\home\mihe\codebox" "C:\Users\mihe\Dropbox\TusMuertOS-Oct2025\src\helpers" *.* /E</w:t>
       </w:r>
     </w:p>
     <w:p>
@@ -12425,6 +12269,9 @@
         </w:numPr>
       </w:pPr>
       <w:r>
+        <w:rPr>
+          <w:noProof/>
+        </w:rPr>
         <w:drawing>
           <wp:inline distT="0" distB="0" distL="0" distR="0" wp14:anchorId="32C622A2" wp14:editId="1D521CD8">
             <wp:extent cx="4449055" cy="1923518"/>
@@ -12485,12 +12332,10 @@
         <w:t xml:space="preserve">Compile the bootloader stage1 that goes on MBR to </w:t>
       </w:r>
       <w:proofErr w:type="spellStart"/>
-      <w:proofErr w:type="gramStart"/>
       <w:r>
         <w:t>mbr.bin</w:t>
       </w:r>
       <w:proofErr w:type="spellEnd"/>
-      <w:proofErr w:type="gramEnd"/>
     </w:p>
     <w:p>
       <w:pPr>
@@ -12948,12 +12793,10 @@
         <w:t>  "</w:t>
       </w:r>
       <w:proofErr w:type="spellStart"/>
-      <w:proofErr w:type="gramStart"/>
       <w:r>
         <w:t>editor.semanticHighlighting.enabled</w:t>
       </w:r>
       <w:proofErr w:type="spellEnd"/>
-      <w:proofErr w:type="gramEnd"/>
       <w:r>
         <w:t>": true,</w:t>
       </w:r>
@@ -12963,74 +12806,122 @@
         <w:t>  "</w:t>
       </w:r>
       <w:proofErr w:type="spellStart"/>
-      <w:proofErr w:type="gramStart"/>
       <w:r>
         <w:t>editor.semanticTokenColorCustomizations</w:t>
       </w:r>
       <w:proofErr w:type="spellEnd"/>
-      <w:proofErr w:type="gramEnd"/>
       <w:r>
         <w:t>": {</w:t>
       </w:r>
     </w:p>
     <w:p>
       <w:r>
-        <w:t>    "rules</w:t>
-      </w:r>
-      <w:proofErr w:type="gramStart"/>
+        <w:t>    "rules": {</w:t>
+      </w:r>
+    </w:p>
+    <w:p>
+      <w:r>
+        <w:t>      "</w:t>
+      </w:r>
+      <w:proofErr w:type="spellStart"/>
+      <w:r>
+        <w:t>operator.controlFlow</w:t>
+      </w:r>
+      <w:proofErr w:type="spellEnd"/>
       <w:r>
         <w:t>": {</w:t>
       </w:r>
-      <w:proofErr w:type="gramEnd"/>
-    </w:p>
-    <w:p>
-      <w:r>
-        <w:t>      "</w:t>
+    </w:p>
+    <w:p>
+      <w:r>
+        <w:t>        "foreground": "#ff5100",</w:t>
+      </w:r>
+    </w:p>
+    <w:p>
+      <w:r>
+        <w:t>        "bold": true</w:t>
+      </w:r>
+    </w:p>
+    <w:p>
+      <w:r>
+        <w:t>      }</w:t>
+      </w:r>
+    </w:p>
+    <w:p>
+      <w:r>
+        <w:t>    }</w:t>
+      </w:r>
+    </w:p>
+    <w:p>
+      <w:r>
+        <w:t>  },</w:t>
+      </w:r>
+    </w:p>
+    <w:p/>
+    <w:p/>
+    <w:p>
+      <w:r>
+        <w:t>.</w:t>
       </w:r>
       <w:proofErr w:type="spellStart"/>
-      <w:proofErr w:type="gramStart"/>
-      <w:r>
-        <w:t>operator.controlFlow</w:t>
+      <w:r>
+        <w:t>rustfmt.toml</w:t>
       </w:r>
       <w:proofErr w:type="spellEnd"/>
       <w:r>
-        <w:t>": {</w:t>
-      </w:r>
-      <w:proofErr w:type="gramEnd"/>
-    </w:p>
-    <w:p>
-      <w:r>
-        <w:t>        "foreground"</w:t>
-      </w:r>
-      <w:proofErr w:type="gramStart"/>
-      <w:r>
-        <w:t>: "#</w:t>
-      </w:r>
-      <w:proofErr w:type="gramEnd"/>
-      <w:r>
-        <w:t>ff5100",</w:t>
-      </w:r>
-    </w:p>
-    <w:p>
-      <w:r>
-        <w:t>        "bold": true</w:t>
-      </w:r>
-    </w:p>
-    <w:p>
-      <w:r>
-        <w:t>      }</w:t>
-      </w:r>
-    </w:p>
-    <w:p>
-      <w:r>
-        <w:t>    }</w:t>
-      </w:r>
-    </w:p>
-    <w:p>
-      <w:r>
-        <w:t>  },</w:t>
-      </w:r>
-    </w:p>
+        <w:t xml:space="preserve"> (sane values):</w:t>
+      </w:r>
+    </w:p>
+    <w:p>
+      <w:r>
+        <w:t xml:space="preserve"># Increase how long a line can be before </w:t>
+      </w:r>
+      <w:proofErr w:type="spellStart"/>
+      <w:r>
+        <w:t>rustfmt</w:t>
+      </w:r>
+      <w:proofErr w:type="spellEnd"/>
+      <w:r>
+        <w:t xml:space="preserve"> wraps it</w:t>
+      </w:r>
+    </w:p>
+    <w:p>
+      <w:proofErr w:type="spellStart"/>
+      <w:r>
+        <w:t>max_width</w:t>
+      </w:r>
+      <w:proofErr w:type="spellEnd"/>
+      <w:r>
+        <w:t xml:space="preserve"> = 150</w:t>
+      </w:r>
+    </w:p>
+    <w:p/>
+    <w:p>
+      <w:r>
+        <w:t># Prevent aggressive wrapping of function and macro arguments</w:t>
+      </w:r>
+    </w:p>
+    <w:p>
+      <w:proofErr w:type="spellStart"/>
+      <w:r>
+        <w:t>fn_call_width</w:t>
+      </w:r>
+      <w:proofErr w:type="spellEnd"/>
+      <w:r>
+        <w:t xml:space="preserve"> = 100</w:t>
+      </w:r>
+    </w:p>
+    <w:p>
+      <w:proofErr w:type="spellStart"/>
+      <w:r>
+        <w:t>chain_width</w:t>
+      </w:r>
+      <w:proofErr w:type="spellEnd"/>
+      <w:r>
+        <w:t xml:space="preserve"> = 100</w:t>
+      </w:r>
+    </w:p>
+    <w:p/>
     <w:p/>
     <w:p/>
     <w:p>
@@ -13085,23 +12976,7 @@
           <w:b/>
           <w:bCs/>
         </w:rPr>
-        <w:t>/</w:t>
-      </w:r>
-      <w:proofErr w:type="gramStart"/>
-      <w:r>
-        <w:rPr>
-          <w:b/>
-          <w:bCs/>
-        </w:rPr>
-        <w:t>mnt</w:t>
-      </w:r>
-      <w:proofErr w:type="gramEnd"/>
-      <w:r>
-        <w:rPr>
-          <w:b/>
-          <w:bCs/>
-        </w:rPr>
-        <w:t>/c/Users/mihe/Dropbox/TusMuertOS-Oct2025</w:t>
+        <w:t>/mnt/c/Users/mihe/Dropbox/TusMuertOS-Oct2025</w:t>
       </w:r>
     </w:p>
     <w:p>
@@ -13123,7 +12998,6 @@
           <w:b/>
           <w:bCs/>
         </w:rPr>
-        <w:lastRenderedPageBreak/>
         <w:t>nasm</w:t>
       </w:r>
       <w:proofErr w:type="spellEnd"/>
@@ -13267,15 +13141,7 @@
     <w:p/>
     <w:p>
       <w:r>
-        <w:t xml:space="preserve">Inject the bootloader (512 bytes, </w:t>
-      </w:r>
-      <w:proofErr w:type="gramStart"/>
-      <w:r>
-        <w:t>One</w:t>
-      </w:r>
-      <w:proofErr w:type="gramEnd"/>
-      <w:r>
-        <w:t xml:space="preserve"> sector if I am not </w:t>
+        <w:t xml:space="preserve">Inject the bootloader (512 bytes, One sector if I am not </w:t>
       </w:r>
       <w:proofErr w:type="spellStart"/>
       <w:r>
@@ -13423,23 +13289,8 @@
     </w:p>
     <w:p>
       <w:r>
-        <w:t>qemu-system-i386 -drive format=</w:t>
-      </w:r>
-      <w:proofErr w:type="gramStart"/>
-      <w:r>
-        <w:t>raw,file</w:t>
-      </w:r>
-      <w:proofErr w:type="gramEnd"/>
-      <w:r>
-        <w:t>=</w:t>
-      </w:r>
-      <w:proofErr w:type="gramStart"/>
-      <w:r>
-        <w:t>C:\Users\mihe\Dropbox\TusMuertOS-Oct2025\src\build\stage1.bin,if</w:t>
-      </w:r>
-      <w:proofErr w:type="gramEnd"/>
-      <w:r>
-        <w:t>=floppy</w:t>
+        <w:lastRenderedPageBreak/>
+        <w:t>qemu-system-i386 -drive format=raw,file=C:\Users\mihe\Dropbox\TusMuertOS-Oct2025\src\build\stage1.bin,if=floppy</w:t>
       </w:r>
     </w:p>
     <w:p/>
@@ -13506,17 +13357,11 @@
     <w:p>
       <w:r>
         <w:tab/>
-        <w:t xml:space="preserve">-q: don’t show the configuration screen before </w:t>
-      </w:r>
-      <w:proofErr w:type="gramStart"/>
-      <w:r>
-        <w:t>start</w:t>
-      </w:r>
-      <w:proofErr w:type="gramEnd"/>
-    </w:p>
-    <w:p>
-      <w:r>
-        <w:lastRenderedPageBreak/>
+        <w:t>-q: don’t show the configuration screen before start</w:t>
+      </w:r>
+    </w:p>
+    <w:p>
+      <w:r>
         <w:tab/>
         <w:t xml:space="preserve">-debugger: memory, registers, </w:t>
       </w:r>
@@ -13542,13 +13387,8 @@
     <w:p/>
     <w:p>
       <w:r>
-        <w:t xml:space="preserve">NEXT </w:t>
-      </w:r>
-      <w:proofErr w:type="gramStart"/>
-      <w:r>
-        <w:t>DAY !!!!!!!!!!!!!!!!!!!!!!!!!!!!!!!!!!!!!!</w:t>
-      </w:r>
-      <w:proofErr w:type="gramEnd"/>
+        <w:t>NEXT DAY !!!!!!!!!!!!!!!!!!!!!!!!!!!!!!!!!!!!!!</w:t>
+      </w:r>
     </w:p>
     <w:p>
       <w:proofErr w:type="spellStart"/>
@@ -13630,15 +13470,7 @@
         </w:pBdr>
       </w:pPr>
       <w:r>
-        <w:t xml:space="preserve">    mov ax, start    </w:t>
-      </w:r>
-      <w:proofErr w:type="gramStart"/>
-      <w:r>
-        <w:t xml:space="preserve">  ;</w:t>
-      </w:r>
-      <w:proofErr w:type="gramEnd"/>
-      <w:r>
-        <w:t xml:space="preserve"> imm16 encodes the absolute offset of “start”</w:t>
+        <w:t xml:space="preserve">    mov ax, start      ; imm16 encodes the absolute offset of “start”</w:t>
       </w:r>
     </w:p>
     <w:p>
@@ -13672,6 +13504,7 @@
       </w:pPr>
       <w:bookmarkStart w:id="23" w:name="_Toc213174196"/>
       <w:r>
+        <w:lastRenderedPageBreak/>
         <w:t xml:space="preserve">WSL Tab autocomplete </w:t>
       </w:r>
       <w:proofErr w:type="spellStart"/>
@@ -13687,15 +13520,7 @@
     <w:p/>
     <w:p>
       <w:r>
-        <w:t xml:space="preserve">No solution </w:t>
-      </w:r>
-      <w:proofErr w:type="gramStart"/>
-      <w:r>
-        <w:t>found</w:t>
-      </w:r>
-      <w:proofErr w:type="gramEnd"/>
-      <w:r>
-        <w:t xml:space="preserve"> yet. Tried to add to </w:t>
+        <w:t xml:space="preserve">No solution found yet. Tried to add to </w:t>
       </w:r>
       <w:proofErr w:type="spellStart"/>
       <w:r>
@@ -13744,7 +13569,6 @@
         <w:rPr>
           <w:noProof/>
         </w:rPr>
-        <w:lastRenderedPageBreak/>
         <w:drawing>
           <wp:inline distT="0" distB="0" distL="0" distR="0" wp14:anchorId="75A5051F" wp14:editId="273E6B6E">
             <wp:extent cx="5943600" cy="762635"/>
@@ -13884,6 +13708,7 @@
       </w:pPr>
       <w:bookmarkStart w:id="28" w:name="_Toc213174201"/>
       <w:r>
+        <w:lastRenderedPageBreak/>
         <w:t>Frame-Pointer Omission</w:t>
       </w:r>
       <w:bookmarkEnd w:id="28"/>
@@ -13904,27 +13729,17 @@
         <w:t>-</w:t>
       </w:r>
       <w:proofErr w:type="spellStart"/>
-      <w:proofErr w:type="gramStart"/>
       <w:r>
         <w:t>fno</w:t>
       </w:r>
       <w:proofErr w:type="spellEnd"/>
-      <w:proofErr w:type="gramEnd"/>
       <w:r>
         <w:t>-omit-frame-pointer</w:t>
       </w:r>
     </w:p>
     <w:p>
       <w:r>
-        <w:t xml:space="preserve">Example of a prologue where a parameter coming on RDI is just saved on RBP. It may help performance, but it is difficult to </w:t>
-      </w:r>
-      <w:proofErr w:type="gramStart"/>
-      <w:r>
-        <w:t>reason about</w:t>
-      </w:r>
-      <w:proofErr w:type="gramEnd"/>
-      <w:r>
-        <w:t xml:space="preserve"> while reading the disassembled code.</w:t>
+        <w:t>Example of a prologue where a parameter coming on RDI is just saved on RBP. It may help performance, but it is difficult to reason about while reading the disassembled code.</w:t>
       </w:r>
     </w:p>
     <w:p>
@@ -13932,7 +13747,6 @@
         <w:rPr>
           <w:noProof/>
         </w:rPr>
-        <w:lastRenderedPageBreak/>
         <w:drawing>
           <wp:inline distT="0" distB="0" distL="0" distR="0" wp14:anchorId="12A11895" wp14:editId="2379F3B2">
             <wp:extent cx="2143424" cy="743054"/>
@@ -14058,15 +13872,7 @@
         </w:numPr>
       </w:pPr>
       <w:r>
-        <w:t xml:space="preserve">There </w:t>
-      </w:r>
-      <w:proofErr w:type="gramStart"/>
-      <w:r>
-        <w:t>are</w:t>
-      </w:r>
-      <w:proofErr w:type="gramEnd"/>
-      <w:r>
-        <w:t xml:space="preserve"> only a valid list of </w:t>
+        <w:t xml:space="preserve">There are only a valid list of </w:t>
       </w:r>
       <w:proofErr w:type="spellStart"/>
       <w:r>
@@ -14407,15 +14213,7 @@
       </w:r>
       <w:proofErr w:type="spellEnd"/>
       <w:r>
-        <w:t xml:space="preserve"> hd16mbfat32.img@@1048576 -</w:t>
-      </w:r>
-      <w:proofErr w:type="gramStart"/>
-      <w:r>
-        <w:t>F :</w:t>
-      </w:r>
-      <w:proofErr w:type="gramEnd"/>
-      <w:r>
-        <w:t>:</w:t>
+        <w:t xml:space="preserve"> hd16mbfat32.img@@1048576 -F ::</w:t>
       </w:r>
     </w:p>
     <w:p>
@@ -14438,13 +14236,8 @@
           <w:numId w:val="1"/>
         </w:numPr>
       </w:pPr>
-      <w:proofErr w:type="gramStart"/>
-      <w:r>
-        <w:t>@@Start</w:t>
-      </w:r>
-      <w:proofErr w:type="gramEnd"/>
-      <w:r>
-        <w:t xml:space="preserve"> (from the parted output)</w:t>
+      <w:r>
+        <w:t>@@Start (from the parted output)</w:t>
       </w:r>
     </w:p>
     <w:p>
@@ -14467,13 +14260,8 @@
           <w:numId w:val="1"/>
         </w:numPr>
       </w:pPr>
-      <w:proofErr w:type="gramStart"/>
-      <w:r>
-        <w:t>::</w:t>
-      </w:r>
-      <w:proofErr w:type="gramEnd"/>
-      <w:r>
-        <w:t xml:space="preserve"> Root directory of the image</w:t>
+      <w:r>
+        <w:t>:: Root directory of the image</w:t>
       </w:r>
     </w:p>
     <w:p>
@@ -14674,114 +14462,85 @@
       </w:r>
       <w:proofErr w:type="spellEnd"/>
       <w:r>
+        <w:t xml:space="preserve"> disk16mb.img@@1048576 myfile.txt ::</w:t>
+      </w:r>
+    </w:p>
+    <w:p>
+      <w:pPr>
+        <w:pStyle w:val="ListParagraph"/>
+        <w:numPr>
+          <w:ilvl w:val="2"/>
+          <w:numId w:val="1"/>
+        </w:numPr>
+      </w:pPr>
+      <w:r>
+        <w:t>mmd -</w:t>
+      </w:r>
+      <w:proofErr w:type="spellStart"/>
+      <w:r>
+        <w:t>i</w:t>
+      </w:r>
+      <w:proofErr w:type="spellEnd"/>
+      <w:r>
+        <w:t xml:space="preserve"> disk16mb.img@@1048576 ::/boot</w:t>
+      </w:r>
+    </w:p>
+    <w:p>
+      <w:pPr>
+        <w:pStyle w:val="ListParagraph"/>
+        <w:numPr>
+          <w:ilvl w:val="2"/>
+          <w:numId w:val="1"/>
+        </w:numPr>
+      </w:pPr>
+      <w:proofErr w:type="spellStart"/>
+      <w:r>
+        <w:t>mcopy</w:t>
+      </w:r>
+      <w:proofErr w:type="spellEnd"/>
+      <w:r>
+        <w:t xml:space="preserve"> -</w:t>
+      </w:r>
+      <w:proofErr w:type="spellStart"/>
+      <w:r>
+        <w:t>i</w:t>
+      </w:r>
+      <w:proofErr w:type="spellEnd"/>
+      <w:r>
         <w:t xml:space="preserve"> disk16mb.img@@1048576 </w:t>
       </w:r>
-      <w:proofErr w:type="gramStart"/>
-      <w:r>
-        <w:t>myfile.txt :</w:t>
-      </w:r>
-      <w:proofErr w:type="gramEnd"/>
-      <w:r>
-        <w:t>:</w:t>
-      </w:r>
-    </w:p>
-    <w:p>
-      <w:pPr>
-        <w:pStyle w:val="ListParagraph"/>
-        <w:numPr>
-          <w:ilvl w:val="2"/>
-          <w:numId w:val="1"/>
-        </w:numPr>
-      </w:pPr>
-      <w:r>
-        <w:t>mmd -</w:t>
-      </w:r>
       <w:proofErr w:type="spellStart"/>
       <w:r>
+        <w:t>kernel.bin</w:t>
+      </w:r>
+      <w:proofErr w:type="spellEnd"/>
+      <w:r>
+        <w:t xml:space="preserve"> ::/boot</w:t>
+      </w:r>
+    </w:p>
+    <w:p>
+      <w:pPr>
+        <w:pStyle w:val="ListParagraph"/>
+        <w:numPr>
+          <w:ilvl w:val="1"/>
+          <w:numId w:val="1"/>
+        </w:numPr>
+      </w:pPr>
+      <w:proofErr w:type="spellStart"/>
+      <w:r>
+        <w:t>mdir</w:t>
+      </w:r>
+      <w:proofErr w:type="spellEnd"/>
+      <w:r>
+        <w:t xml:space="preserve"> -</w:t>
+      </w:r>
+      <w:proofErr w:type="spellStart"/>
+      <w:r>
         <w:t>i</w:t>
       </w:r>
       <w:proofErr w:type="spellEnd"/>
       <w:r>
-        <w:t xml:space="preserve"> disk16mb.img@@</w:t>
-      </w:r>
-      <w:proofErr w:type="gramStart"/>
-      <w:r>
-        <w:t>1048576 :</w:t>
-      </w:r>
-      <w:proofErr w:type="gramEnd"/>
-      <w:r>
-        <w:t>:/boot</w:t>
-      </w:r>
-    </w:p>
-    <w:p>
-      <w:pPr>
-        <w:pStyle w:val="ListParagraph"/>
-        <w:numPr>
-          <w:ilvl w:val="2"/>
-          <w:numId w:val="1"/>
-        </w:numPr>
-      </w:pPr>
-      <w:proofErr w:type="spellStart"/>
-      <w:r>
-        <w:t>mcopy</w:t>
-      </w:r>
-      <w:proofErr w:type="spellEnd"/>
-      <w:r>
-        <w:t xml:space="preserve"> -</w:t>
-      </w:r>
-      <w:proofErr w:type="spellStart"/>
-      <w:r>
-        <w:t>i</w:t>
-      </w:r>
-      <w:proofErr w:type="spellEnd"/>
-      <w:r>
-        <w:t xml:space="preserve"> disk16mb.img@@1048576 </w:t>
-      </w:r>
-      <w:proofErr w:type="spellStart"/>
-      <w:proofErr w:type="gramStart"/>
-      <w:r>
-        <w:t>kernel.bin</w:t>
-      </w:r>
-      <w:proofErr w:type="spellEnd"/>
-      <w:r>
-        <w:t xml:space="preserve"> :</w:t>
-      </w:r>
-      <w:proofErr w:type="gramEnd"/>
-      <w:r>
-        <w:t>:/boot</w:t>
-      </w:r>
-    </w:p>
-    <w:p>
-      <w:pPr>
-        <w:pStyle w:val="ListParagraph"/>
-        <w:numPr>
-          <w:ilvl w:val="1"/>
-          <w:numId w:val="1"/>
-        </w:numPr>
-      </w:pPr>
-      <w:proofErr w:type="spellStart"/>
-      <w:r>
-        <w:t>mdir</w:t>
-      </w:r>
-      <w:proofErr w:type="spellEnd"/>
-      <w:r>
-        <w:t xml:space="preserve"> -</w:t>
-      </w:r>
-      <w:proofErr w:type="spellStart"/>
-      <w:r>
-        <w:t>i</w:t>
-      </w:r>
-      <w:proofErr w:type="spellEnd"/>
-      <w:r>
-        <w:t xml:space="preserve"> hd16mbfat32.img@@</w:t>
-      </w:r>
-      <w:proofErr w:type="gramStart"/>
-      <w:r>
-        <w:t>1048576 :</w:t>
-      </w:r>
-      <w:proofErr w:type="gramEnd"/>
-      <w:r>
-        <w:t>:</w:t>
+        <w:t xml:space="preserve"> hd16mbfat32.img@@1048576 ::</w:t>
       </w:r>
     </w:p>
     <w:p>
@@ -15142,21 +14901,125 @@
         </w:numPr>
       </w:pPr>
       <w:r>
-        <w:t>“</w:t>
-      </w:r>
-      <w:proofErr w:type="gramStart"/>
-      <w:r>
-        <w:t>cd</w:t>
-      </w:r>
-      <w:proofErr w:type="gramEnd"/>
+        <w:t>“cd –“</w:t>
+      </w:r>
+    </w:p>
+    <w:p>
+      <w:pPr>
+        <w:pStyle w:val="ListParagraph"/>
+        <w:numPr>
+          <w:ilvl w:val="0"/>
+          <w:numId w:val="1"/>
+        </w:numPr>
+      </w:pPr>
+      <w:r>
+        <w:t>Windows:</w:t>
+      </w:r>
+    </w:p>
+    <w:p>
+      <w:pPr>
+        <w:pStyle w:val="ListParagraph"/>
+        <w:numPr>
+          <w:ilvl w:val="1"/>
+          <w:numId w:val="1"/>
+        </w:numPr>
+      </w:pPr>
+      <w:proofErr w:type="spellStart"/>
+      <w:r>
+        <w:t>Pushd</w:t>
+      </w:r>
+      <w:proofErr w:type="spellEnd"/>
+      <w:r>
+        <w:t xml:space="preserve"> or push-location</w:t>
+      </w:r>
+    </w:p>
+    <w:p>
+      <w:pPr>
+        <w:pStyle w:val="ListParagraph"/>
+        <w:numPr>
+          <w:ilvl w:val="1"/>
+          <w:numId w:val="1"/>
+        </w:numPr>
+      </w:pPr>
+      <w:r>
+        <w:t xml:space="preserve">Move </w:t>
+      </w:r>
+    </w:p>
+    <w:p>
+      <w:pPr>
+        <w:pStyle w:val="ListParagraph"/>
+        <w:numPr>
+          <w:ilvl w:val="1"/>
+          <w:numId w:val="1"/>
+        </w:numPr>
+      </w:pPr>
+      <w:proofErr w:type="spellStart"/>
+      <w:r>
+        <w:t>Popd</w:t>
+      </w:r>
+      <w:proofErr w:type="spellEnd"/>
+      <w:r>
+        <w:t xml:space="preserve"> or pop-location</w:t>
+      </w:r>
+    </w:p>
+    <w:p/>
+    <w:p>
+      <w:pPr>
+        <w:pStyle w:val="Heading2"/>
+      </w:pPr>
+      <w:bookmarkStart w:id="31" w:name="_Toc213174204"/>
+      <w:r>
+        <w:t>Forcing a pointer to be interpreted as a type does have a name: Type punning</w:t>
+      </w:r>
+      <w:bookmarkEnd w:id="31"/>
+    </w:p>
+    <w:p/>
+    <w:p>
+      <w:pPr>
+        <w:pStyle w:val="ListParagraph"/>
+        <w:numPr>
+          <w:ilvl w:val="0"/>
+          <w:numId w:val="1"/>
+        </w:numPr>
+      </w:pPr>
+      <w:r>
+        <w:t>Seriously</w:t>
+      </w:r>
+      <w:r>
+        <w:t>…?</w:t>
+      </w:r>
+    </w:p>
+    <w:p>
+      <w:pPr>
+        <w:pStyle w:val="Heading1"/>
+      </w:pPr>
+      <w:bookmarkStart w:id="32" w:name="_Toc213174205"/>
+      <w:r>
+        <w:t>Research backlog</w:t>
+      </w:r>
+      <w:bookmarkEnd w:id="32"/>
+    </w:p>
+    <w:p/>
+    <w:p>
+      <w:pPr>
+        <w:pStyle w:val="ListParagraph"/>
+        <w:numPr>
+          <w:ilvl w:val="0"/>
+          <w:numId w:val="1"/>
+        </w:numPr>
+      </w:pPr>
+      <w:r>
+        <w:t>Disk formats FAT12/</w:t>
+      </w:r>
+      <w:r>
+        <w:t>16/</w:t>
+      </w:r>
+      <w:r>
+        <w:t>32</w:t>
+      </w:r>
       <w:r>
         <w:t xml:space="preserve"> </w:t>
       </w:r>
-      <w:proofErr w:type="gramStart"/>
-      <w:r>
-        <w:t>–“</w:t>
-      </w:r>
-      <w:proofErr w:type="gramEnd"/>
     </w:p>
     <w:p>
       <w:pPr>
@@ -15167,7 +15030,7 @@
         </w:numPr>
       </w:pPr>
       <w:r>
-        <w:t>Windows:</w:t>
+        <w:t>Partition table on the MBR. I remember seeing adding 4 16bytes reserved structures before 0xAA55</w:t>
       </w:r>
     </w:p>
     <w:p>
@@ -15178,286 +15041,124 @@
           <w:numId w:val="1"/>
         </w:numPr>
       </w:pPr>
+      <w:r>
+        <w:lastRenderedPageBreak/>
+        <w:t>I guess this applies if the MBR is for a hard disk, but does not apply for a floppy</w:t>
+      </w:r>
+      <w:r>
+        <w:t>. This is an educated guess</w:t>
+      </w:r>
+    </w:p>
+    <w:p>
+      <w:pPr>
+        <w:pStyle w:val="ListParagraph"/>
+        <w:numPr>
+          <w:ilvl w:val="1"/>
+          <w:numId w:val="1"/>
+        </w:numPr>
+      </w:pPr>
+      <w:r>
+        <w:t xml:space="preserve">On floppy, the FAT info at 0 starts with a jump to code, followed by the FAT info. This way both, the bootloader and FAT info can coexist, because there is a jump. Validate this because I got this explained by </w:t>
+      </w:r>
+      <w:r>
+        <w:t>ChatGPT. It makes a lot of sense, but still…</w:t>
+      </w:r>
+    </w:p>
+    <w:p>
+      <w:pPr>
+        <w:pStyle w:val="ListParagraph"/>
+        <w:numPr>
+          <w:ilvl w:val="1"/>
+          <w:numId w:val="1"/>
+        </w:numPr>
+      </w:pPr>
+      <w:r>
+        <w:t>A Disk with multiple partitions, the first byte define if it is bootable 0x80 = bootable.</w:t>
+      </w:r>
+      <w:r>
+        <w:t xml:space="preserve"> The first byte on one of those 4 16 bytes partitions at the end of the MBR before the 0xAA55</w:t>
+      </w:r>
+    </w:p>
+    <w:p>
+      <w:pPr>
+        <w:pStyle w:val="ListParagraph"/>
+        <w:numPr>
+          <w:ilvl w:val="0"/>
+          <w:numId w:val="1"/>
+        </w:numPr>
+      </w:pPr>
+      <w:r>
+        <w:t>Can MBR and BPB be fused together? I found something related to a short jump at the beginning, of BPB ??? Dive deeper into this!</w:t>
+      </w:r>
+      <w:r>
+        <w:t xml:space="preserve"> I think BPB merged on MBR is for disk without partitions, such as floppy disks. </w:t>
+      </w:r>
+    </w:p>
+    <w:p>
+      <w:pPr>
+        <w:pStyle w:val="ListParagraph"/>
+        <w:numPr>
+          <w:ilvl w:val="0"/>
+          <w:numId w:val="1"/>
+        </w:numPr>
+      </w:pPr>
+      <w:r>
+        <w:t>Inject breakpoints on Bochs without magic breakpoints, via commands file on startup</w:t>
+      </w:r>
+    </w:p>
+    <w:p>
+      <w:pPr>
+        <w:pStyle w:val="ListParagraph"/>
+        <w:numPr>
+          <w:ilvl w:val="0"/>
+          <w:numId w:val="1"/>
+        </w:numPr>
+      </w:pPr>
+      <w:r>
+        <w:t xml:space="preserve">How to change Bochs </w:t>
+      </w:r>
+      <w:r>
+        <w:t xml:space="preserve">display </w:t>
+      </w:r>
+      <w:r>
+        <w:t>resolution.</w:t>
+      </w:r>
+    </w:p>
+    <w:p>
+      <w:pPr>
+        <w:pStyle w:val="ListParagraph"/>
+        <w:numPr>
+          <w:ilvl w:val="0"/>
+          <w:numId w:val="1"/>
+        </w:numPr>
+      </w:pPr>
+      <w:r>
+        <w:t xml:space="preserve">Change the path order (open first code from </w:t>
+      </w:r>
       <w:proofErr w:type="spellStart"/>
       <w:r>
-        <w:t>Pushd</w:t>
+        <w:t>linux</w:t>
       </w:r>
       <w:proofErr w:type="spellEnd"/>
       <w:r>
-        <w:t xml:space="preserve"> or push-location</w:t>
-      </w:r>
-    </w:p>
-    <w:p>
-      <w:pPr>
-        <w:pStyle w:val="ListParagraph"/>
-        <w:numPr>
-          <w:ilvl w:val="1"/>
-          <w:numId w:val="1"/>
-        </w:numPr>
-      </w:pPr>
-      <w:r>
-        <w:t xml:space="preserve">Move </w:t>
-      </w:r>
-    </w:p>
-    <w:p>
-      <w:pPr>
-        <w:pStyle w:val="ListParagraph"/>
-        <w:numPr>
-          <w:ilvl w:val="1"/>
-          <w:numId w:val="1"/>
-        </w:numPr>
-      </w:pPr>
+        <w:t xml:space="preserve"> instead of windows, without removing the windows path via </w:t>
+      </w:r>
       <w:proofErr w:type="spellStart"/>
       <w:r>
-        <w:t>Popd</w:t>
+        <w:t>etc</w:t>
       </w:r>
       <w:proofErr w:type="spellEnd"/>
       <w:r>
-        <w:t xml:space="preserve"> or pop-location</w:t>
-      </w:r>
-    </w:p>
-    <w:p/>
-    <w:p>
-      <w:pPr>
-        <w:pStyle w:val="Heading2"/>
-      </w:pPr>
-      <w:bookmarkStart w:id="31" w:name="_Toc213174204"/>
-      <w:r>
-        <w:t>Forcing a pointer to be interpreted as a type does have a name: Type punning</w:t>
-      </w:r>
-      <w:bookmarkEnd w:id="31"/>
-    </w:p>
-    <w:p/>
-    <w:p>
-      <w:pPr>
-        <w:pStyle w:val="ListParagraph"/>
-        <w:numPr>
-          <w:ilvl w:val="0"/>
-          <w:numId w:val="1"/>
-        </w:numPr>
-      </w:pPr>
-      <w:r>
-        <w:t>Seriously</w:t>
-      </w:r>
-      <w:r>
-        <w:t>…?</w:t>
-      </w:r>
-    </w:p>
-    <w:p>
-      <w:pPr>
-        <w:pStyle w:val="Heading1"/>
-      </w:pPr>
-      <w:bookmarkStart w:id="32" w:name="_Toc213174205"/>
-      <w:r>
-        <w:t>Research backlog</w:t>
-      </w:r>
-      <w:bookmarkEnd w:id="32"/>
-    </w:p>
-    <w:p/>
-    <w:p>
-      <w:pPr>
-        <w:pStyle w:val="ListParagraph"/>
-        <w:numPr>
-          <w:ilvl w:val="0"/>
-          <w:numId w:val="1"/>
-        </w:numPr>
-      </w:pPr>
-      <w:r>
-        <w:t>Disk formats FAT12/</w:t>
-      </w:r>
-      <w:r>
-        <w:t>16/</w:t>
-      </w:r>
-      <w:r>
-        <w:t>32</w:t>
-      </w:r>
-      <w:r>
-        <w:t xml:space="preserve"> </w:t>
-      </w:r>
-    </w:p>
-    <w:p>
-      <w:pPr>
-        <w:pStyle w:val="ListParagraph"/>
-        <w:numPr>
-          <w:ilvl w:val="0"/>
-          <w:numId w:val="1"/>
-        </w:numPr>
-      </w:pPr>
-      <w:r>
-        <w:t>Partition table on the MBR. I remember seeing adding 4 16</w:t>
-      </w:r>
-      <w:proofErr w:type="gramStart"/>
-      <w:r>
-        <w:t>bytes</w:t>
-      </w:r>
-      <w:proofErr w:type="gramEnd"/>
-      <w:r>
-        <w:t xml:space="preserve"> reserved structures before 0xAA55</w:t>
-      </w:r>
-    </w:p>
-    <w:p>
-      <w:pPr>
-        <w:pStyle w:val="ListParagraph"/>
-        <w:numPr>
-          <w:ilvl w:val="1"/>
-          <w:numId w:val="1"/>
-        </w:numPr>
-      </w:pPr>
-      <w:r>
-        <w:lastRenderedPageBreak/>
-        <w:t xml:space="preserve">I guess this applies if the MBR is for a hard </w:t>
-      </w:r>
-      <w:proofErr w:type="gramStart"/>
-      <w:r>
-        <w:t>disk, but</w:t>
-      </w:r>
-      <w:proofErr w:type="gramEnd"/>
-      <w:r>
-        <w:t xml:space="preserve"> does not apply for a floppy</w:t>
-      </w:r>
-      <w:r>
-        <w:t>. This is an educated guess</w:t>
-      </w:r>
-    </w:p>
-    <w:p>
-      <w:pPr>
-        <w:pStyle w:val="ListParagraph"/>
-        <w:numPr>
-          <w:ilvl w:val="1"/>
-          <w:numId w:val="1"/>
-        </w:numPr>
-      </w:pPr>
-      <w:r>
-        <w:t xml:space="preserve">On floppy, the FAT info at 0 starts with a jump to code, followed by the FAT info. This way </w:t>
-      </w:r>
-      <w:proofErr w:type="gramStart"/>
-      <w:r>
-        <w:t>both,</w:t>
-      </w:r>
-      <w:proofErr w:type="gramEnd"/>
-      <w:r>
-        <w:t xml:space="preserve"> the bootloader and FAT info can coexist, because there is a jump. Validate this because I got this explained by </w:t>
-      </w:r>
-      <w:r>
-        <w:t>ChatGPT. It makes a lot of sense, but still…</w:t>
-      </w:r>
-    </w:p>
-    <w:p>
-      <w:pPr>
-        <w:pStyle w:val="ListParagraph"/>
-        <w:numPr>
-          <w:ilvl w:val="1"/>
-          <w:numId w:val="1"/>
-        </w:numPr>
-      </w:pPr>
-      <w:r>
-        <w:t xml:space="preserve">A Disk with multiple partitions, the first byte </w:t>
-      </w:r>
-      <w:proofErr w:type="gramStart"/>
-      <w:r>
-        <w:t>define</w:t>
-      </w:r>
-      <w:proofErr w:type="gramEnd"/>
-      <w:r>
-        <w:t xml:space="preserve"> if it is bootable 0x80 = bootable.</w:t>
-      </w:r>
-      <w:r>
-        <w:t xml:space="preserve"> The first byte on one of those 4 16 bytes partitions at the end of the MBR before the 0xAA55</w:t>
-      </w:r>
-    </w:p>
-    <w:p>
-      <w:pPr>
-        <w:pStyle w:val="ListParagraph"/>
-        <w:numPr>
-          <w:ilvl w:val="0"/>
-          <w:numId w:val="1"/>
-        </w:numPr>
-      </w:pPr>
-      <w:r>
-        <w:t xml:space="preserve">Can MBR and BPB be fused together? I found something related to a short jump at the beginning, of </w:t>
-      </w:r>
-      <w:proofErr w:type="gramStart"/>
-      <w:r>
-        <w:t>BPB ???</w:t>
-      </w:r>
-      <w:proofErr w:type="gramEnd"/>
-      <w:r>
-        <w:t xml:space="preserve"> Dive deeper into this!</w:t>
-      </w:r>
-      <w:r>
-        <w:t xml:space="preserve"> I think BPB merged on MBR is for disk without partitions, such as floppy disks. </w:t>
-      </w:r>
-    </w:p>
-    <w:p>
-      <w:pPr>
-        <w:pStyle w:val="ListParagraph"/>
-        <w:numPr>
-          <w:ilvl w:val="0"/>
-          <w:numId w:val="1"/>
-        </w:numPr>
-      </w:pPr>
-      <w:r>
-        <w:t>Inject breakpoints on Bochs without magic breakpoints, via commands file on startup</w:t>
-      </w:r>
-    </w:p>
-    <w:p>
-      <w:pPr>
-        <w:pStyle w:val="ListParagraph"/>
-        <w:numPr>
-          <w:ilvl w:val="0"/>
-          <w:numId w:val="1"/>
-        </w:numPr>
-      </w:pPr>
-      <w:r>
-        <w:t xml:space="preserve">How to change Bochs </w:t>
-      </w:r>
-      <w:r>
-        <w:t xml:space="preserve">display </w:t>
-      </w:r>
-      <w:r>
-        <w:t>resolution.</w:t>
-      </w:r>
-    </w:p>
-    <w:p>
-      <w:pPr>
-        <w:pStyle w:val="ListParagraph"/>
-        <w:numPr>
-          <w:ilvl w:val="0"/>
-          <w:numId w:val="1"/>
-        </w:numPr>
-      </w:pPr>
-      <w:r>
-        <w:t xml:space="preserve">Change the path order (open first code from </w:t>
+        <w:t>/</w:t>
       </w:r>
       <w:proofErr w:type="spellStart"/>
       <w:r>
-        <w:t>linux</w:t>
+        <w:t>wsl.conf</w:t>
       </w:r>
       <w:proofErr w:type="spellEnd"/>
       <w:r>
-        <w:t xml:space="preserve"> instead of windows, without removing the windows path via </w:t>
-      </w:r>
-      <w:proofErr w:type="spellStart"/>
-      <w:r>
-        <w:t>etc</w:t>
-      </w:r>
-      <w:proofErr w:type="spellEnd"/>
-      <w:r>
-        <w:t>/</w:t>
-      </w:r>
-      <w:proofErr w:type="spellStart"/>
-      <w:r>
-        <w:t>wsl.conf</w:t>
-      </w:r>
-      <w:proofErr w:type="spellEnd"/>
-      <w:r>
-        <w:t xml:space="preserve"> </w:t>
-      </w:r>
-      <w:proofErr w:type="gramStart"/>
-      <w:r>
-        <w:t>file )</w:t>
-      </w:r>
-      <w:proofErr w:type="gramEnd"/>
+        <w:t xml:space="preserve"> file )</w:t>
+      </w:r>
     </w:p>
     <w:p>
       <w:pPr>
@@ -19013,7 +18714,6 @@
   <w:style w:type="character" w:default="1" w:styleId="DefaultParagraphFont">
     <w:name w:val="Default Paragraph Font"/>
     <w:uiPriority w:val="1"/>
-    <w:semiHidden/>
     <w:unhideWhenUsed/>
   </w:style>
   <w:style w:type="table" w:default="1" w:styleId="TableNormal">

</xml_diff>

<commit_message>
Update and clean of FAT 32 image creation section
</commit_message>
<xml_diff>
--- a/docs/TusMuertos-v2.0-Design.docx
+++ b/docs/TusMuertos-v2.0-Design.docx
@@ -3955,13 +3955,8 @@
         <w:t>/Zig</w:t>
       </w:r>
       <w:r>
-        <w:t xml:space="preserve"> for challenge. NASM assembly for </w:t>
-      </w:r>
-      <w:proofErr w:type="gramStart"/>
-      <w:r>
-        <w:t>bootloader</w:t>
-      </w:r>
-      <w:proofErr w:type="gramEnd"/>
+        <w:t xml:space="preserve"> for challenge. NASM assembly for bootloader</w:t>
+      </w:r>
       <w:r>
         <w:t xml:space="preserve">. </w:t>
       </w:r>
@@ -4278,15 +4273,7 @@
         </w:numPr>
       </w:pPr>
       <w:r>
-        <w:t xml:space="preserve">2 Stages. Minimal first stage until Protected mode + Second stage to </w:t>
-      </w:r>
-      <w:proofErr w:type="gramStart"/>
-      <w:r>
-        <w:t>Long</w:t>
-      </w:r>
-      <w:proofErr w:type="gramEnd"/>
-      <w:r>
-        <w:t xml:space="preserve"> mode</w:t>
+        <w:t>2 Stages. Minimal first stage until Protected mode + Second stage to Long mode</w:t>
       </w:r>
     </w:p>
     <w:p>
@@ -4449,7 +4436,6 @@
           <w:numId w:val="1"/>
         </w:numPr>
       </w:pPr>
-      <w:proofErr w:type="gramStart"/>
       <w:r>
         <w:t>Print early status</w:t>
       </w:r>
@@ -4462,7 +4448,6 @@
         </w:rPr>
         <w:t>✅</w:t>
       </w:r>
-      <w:proofErr w:type="gramEnd"/>
     </w:p>
     <w:p>
       <w:pPr>
@@ -4558,15 +4543,7 @@
         </w:numPr>
       </w:pPr>
       <w:r>
-        <w:t xml:space="preserve">Jump to Protected mode if Stage1 </w:t>
-      </w:r>
-      <w:proofErr w:type="gramStart"/>
-      <w:r>
-        <w:t>did</w:t>
-      </w:r>
-      <w:proofErr w:type="gramEnd"/>
-      <w:r>
-        <w:t xml:space="preserve"> not change mode.</w:t>
+        <w:t>Jump to Protected mode if Stage1 did not change mode.</w:t>
       </w:r>
     </w:p>
     <w:p>
@@ -4578,23 +4555,7 @@
         </w:numPr>
       </w:pPr>
       <w:r>
-        <w:t xml:space="preserve">Enable </w:t>
-      </w:r>
-      <w:proofErr w:type="gramStart"/>
-      <w:r>
-        <w:t>A20, or</w:t>
-      </w:r>
-      <w:proofErr w:type="gramEnd"/>
-      <w:r>
-        <w:t xml:space="preserve"> at least check. There are multiple strategies for this. Some platforms have fast </w:t>
-      </w:r>
-      <w:proofErr w:type="gramStart"/>
-      <w:r>
-        <w:t>enable</w:t>
-      </w:r>
-      <w:proofErr w:type="gramEnd"/>
-      <w:r>
-        <w:t xml:space="preserve"> 0x92, or they come with A20 already enable. XXXX</w:t>
+        <w:t>Enable A20, or at least check. There are multiple strategies for this. Some platforms have fast enable 0x92, or they come with A20 already enable. XXXX</w:t>
       </w:r>
     </w:p>
     <w:p>
@@ -4650,15 +4611,7 @@
         </w:numPr>
       </w:pPr>
       <w:r>
-        <w:t xml:space="preserve">Flat binary: Explore this option, </w:t>
-      </w:r>
-      <w:proofErr w:type="gramStart"/>
-      <w:r>
-        <w:t>maybe</w:t>
-      </w:r>
-      <w:proofErr w:type="gramEnd"/>
-      <w:r>
-        <w:t xml:space="preserve"> is simpler</w:t>
+        <w:t>Flat binary: Explore this option, maybe is simpler</w:t>
       </w:r>
     </w:p>
     <w:p>
@@ -4714,15 +4667,7 @@
         </w:numPr>
       </w:pPr>
       <w:r>
-        <w:t xml:space="preserve">Verify if long </w:t>
-      </w:r>
-      <w:proofErr w:type="gramStart"/>
-      <w:r>
-        <w:t>mode</w:t>
-      </w:r>
-      <w:proofErr w:type="gramEnd"/>
-      <w:r>
-        <w:t xml:space="preserve"> if possible, for completeness</w:t>
+        <w:t>Verify if long mode if possible, for completeness</w:t>
       </w:r>
     </w:p>
     <w:p>
@@ -4947,15 +4892,7 @@
         </w:numPr>
       </w:pPr>
       <w:r>
-        <w:t xml:space="preserve">It creates an MBR and </w:t>
-      </w:r>
-      <w:proofErr w:type="gramStart"/>
-      <w:r>
-        <w:t>VBR(</w:t>
-      </w:r>
-      <w:proofErr w:type="gramEnd"/>
-      <w:r>
-        <w:t>with BPB) to boot and have a FAT12/16/32 structure</w:t>
+        <w:t>It creates an MBR and VBR(with BPB) to boot and have a FAT12/16/32 structure</w:t>
       </w:r>
     </w:p>
     <w:p>
@@ -5189,15 +5126,7 @@
         </w:numPr>
       </w:pPr>
       <w:r>
-        <w:t xml:space="preserve">Inject the FAT structure </w:t>
-      </w:r>
-      <w:proofErr w:type="gramStart"/>
-      <w:r>
-        <w:t>on</w:t>
-      </w:r>
-      <w:proofErr w:type="gramEnd"/>
-      <w:r>
-        <w:t xml:space="preserve"> the disk</w:t>
+        <w:t>Inject the FAT structure on the disk</w:t>
       </w:r>
     </w:p>
     <w:p>
@@ -5209,15 +5138,7 @@
         </w:numPr>
       </w:pPr>
       <w:r>
-        <w:t xml:space="preserve">Inject the sector0.bin </w:t>
-      </w:r>
-      <w:proofErr w:type="gramStart"/>
-      <w:r>
-        <w:t>on</w:t>
-      </w:r>
-      <w:proofErr w:type="gramEnd"/>
-      <w:r>
-        <w:t xml:space="preserve"> offset 0x00.</w:t>
+        <w:t>Inject the sector0.bin on offset 0x00.</w:t>
       </w:r>
     </w:p>
     <w:p>
@@ -5321,7 +5242,6 @@
       </w:r>
       <w:proofErr w:type="spellEnd"/>
     </w:p>
-    <w:p/>
     <w:p/>
     <w:p>
       <w:pPr>
@@ -5807,6 +5727,13 @@
                 <w:szCs w:val="16"/>
               </w:rPr>
             </w:pPr>
+            <w:r>
+              <w:rPr>
+                <w:sz w:val="16"/>
+                <w:szCs w:val="16"/>
+              </w:rPr>
+              <w:t>See table below</w:t>
+            </w:r>
           </w:p>
         </w:tc>
       </w:tr>
@@ -6380,7 +6307,21 @@
         <w:t>:</w:t>
       </w:r>
     </w:p>
-    <w:p/>
+    <w:p>
+      <w:r>
+        <w:t>Example FAT32 34MB</w:t>
+      </w:r>
+    </w:p>
+    <w:p>
+      <w:r>
+        <w:t>80 00 01 10 0C 03 A0 1F 00 08 00 00 00 08 01 00</w:t>
+      </w:r>
+    </w:p>
+    <w:p>
+      <w:r>
+        <w:t>Remember the multibyte values are little endian</w:t>
+      </w:r>
+    </w:p>
     <w:tbl>
       <w:tblPr>
         <w:tblStyle w:val="TableGrid"/>
@@ -6393,9 +6334,9 @@
         <w:gridCol w:w="1251"/>
         <w:gridCol w:w="1559"/>
         <w:gridCol w:w="709"/>
-        <w:gridCol w:w="1201"/>
-        <w:gridCol w:w="2436"/>
-        <w:gridCol w:w="1989"/>
+        <w:gridCol w:w="838"/>
+        <w:gridCol w:w="2520"/>
+        <w:gridCol w:w="2268"/>
       </w:tblGrid>
       <w:tr>
         <w:tc>
@@ -6480,7 +6421,7 @@
         </w:tc>
         <w:tc>
           <w:tcPr>
-            <w:tcW w:w="1201" w:type="dxa"/>
+            <w:tcW w:w="838" w:type="dxa"/>
           </w:tcPr>
           <w:p>
             <w:pPr>
@@ -6514,7 +6455,7 @@
         </w:tc>
         <w:tc>
           <w:tcPr>
-            <w:tcW w:w="2436" w:type="dxa"/>
+            <w:tcW w:w="2520" w:type="dxa"/>
           </w:tcPr>
           <w:p>
             <w:pPr>
@@ -6534,7 +6475,7 @@
         </w:tc>
         <w:tc>
           <w:tcPr>
-            <w:tcW w:w="1989" w:type="dxa"/>
+            <w:tcW w:w="2268" w:type="dxa"/>
           </w:tcPr>
           <w:p>
             <w:pPr>
@@ -6636,7 +6577,7 @@
         </w:tc>
         <w:tc>
           <w:tcPr>
-            <w:tcW w:w="1201" w:type="dxa"/>
+            <w:tcW w:w="838" w:type="dxa"/>
           </w:tcPr>
           <w:p>
             <w:pPr>
@@ -6656,7 +6597,7 @@
         </w:tc>
         <w:tc>
           <w:tcPr>
-            <w:tcW w:w="2436" w:type="dxa"/>
+            <w:tcW w:w="2520" w:type="dxa"/>
           </w:tcPr>
           <w:p>
             <w:pPr>
@@ -6676,7 +6617,7 @@
         </w:tc>
         <w:tc>
           <w:tcPr>
-            <w:tcW w:w="1989" w:type="dxa"/>
+            <w:tcW w:w="2268" w:type="dxa"/>
           </w:tcPr>
           <w:p>
             <w:pPr>
@@ -6685,15 +6626,13 @@
                 <w:szCs w:val="16"/>
               </w:rPr>
             </w:pPr>
-            <w:proofErr w:type="spellStart"/>
-            <w:r>
-              <w:rPr>
-                <w:sz w:val="16"/>
-                <w:szCs w:val="16"/>
-              </w:rPr>
-              <w:t>xxxxxxxxxxxxxxxxxx</w:t>
-            </w:r>
-            <w:proofErr w:type="spellEnd"/>
+            <w:r>
+              <w:rPr>
+                <w:sz w:val="16"/>
+                <w:szCs w:val="16"/>
+              </w:rPr>
+              <w:t>0x80</w:t>
+            </w:r>
           </w:p>
         </w:tc>
       </w:tr>
@@ -6794,7 +6733,7 @@
         </w:tc>
         <w:tc>
           <w:tcPr>
-            <w:tcW w:w="1201" w:type="dxa"/>
+            <w:tcW w:w="838" w:type="dxa"/>
           </w:tcPr>
           <w:p>
             <w:pPr>
@@ -6814,7 +6753,7 @@
         </w:tc>
         <w:tc>
           <w:tcPr>
-            <w:tcW w:w="2436" w:type="dxa"/>
+            <w:tcW w:w="2520" w:type="dxa"/>
           </w:tcPr>
           <w:p>
             <w:pPr>
@@ -6834,7 +6773,7 @@
         </w:tc>
         <w:tc>
           <w:tcPr>
-            <w:tcW w:w="1989" w:type="dxa"/>
+            <w:tcW w:w="2268" w:type="dxa"/>
           </w:tcPr>
           <w:p>
             <w:pPr>
@@ -6843,6 +6782,196 @@
                 <w:szCs w:val="16"/>
               </w:rPr>
             </w:pPr>
+            <w:r>
+              <w:rPr>
+                <w:sz w:val="16"/>
+                <w:szCs w:val="16"/>
+              </w:rPr>
+              <w:t>0x00</w:t>
+            </w:r>
+          </w:p>
+        </w:tc>
+      </w:tr>
+      <w:tr>
+        <w:trPr>
+          <w:trHeight w:val="170"/>
+        </w:trPr>
+        <w:tc>
+          <w:tcPr>
+            <w:tcW w:w="1313" w:type="dxa"/>
+          </w:tcPr>
+          <w:p>
+            <w:pPr>
+              <w:rPr>
+                <w:sz w:val="16"/>
+                <w:szCs w:val="16"/>
+              </w:rPr>
+            </w:pPr>
+            <w:r>
+              <w:rPr>
+                <w:sz w:val="16"/>
+                <w:szCs w:val="16"/>
+              </w:rPr>
+              <w:t>0x000001</w:t>
+            </w:r>
+            <w:r>
+              <w:rPr>
+                <w:sz w:val="16"/>
+                <w:szCs w:val="16"/>
+              </w:rPr>
+              <w:t>C0</w:t>
+            </w:r>
+          </w:p>
+        </w:tc>
+        <w:tc>
+          <w:tcPr>
+            <w:tcW w:w="1251" w:type="dxa"/>
+          </w:tcPr>
+          <w:p>
+            <w:pPr>
+              <w:rPr>
+                <w:sz w:val="16"/>
+                <w:szCs w:val="16"/>
+              </w:rPr>
+            </w:pPr>
+            <w:r>
+              <w:rPr>
+                <w:sz w:val="16"/>
+                <w:szCs w:val="16"/>
+              </w:rPr>
+              <w:t>0x000</w:t>
+            </w:r>
+            <w:r>
+              <w:rPr>
+                <w:sz w:val="16"/>
+                <w:szCs w:val="16"/>
+              </w:rPr>
+              <w:t>2</w:t>
+            </w:r>
+          </w:p>
+        </w:tc>
+        <w:tc>
+          <w:tcPr>
+            <w:tcW w:w="1559" w:type="dxa"/>
+          </w:tcPr>
+          <w:p>
+            <w:pPr>
+              <w:rPr>
+                <w:sz w:val="16"/>
+                <w:szCs w:val="16"/>
+              </w:rPr>
+            </w:pPr>
+            <w:r>
+              <w:rPr>
+                <w:sz w:val="16"/>
+                <w:szCs w:val="16"/>
+              </w:rPr>
+              <w:t>1st Partition entry</w:t>
+            </w:r>
+          </w:p>
+        </w:tc>
+        <w:tc>
+          <w:tcPr>
+            <w:tcW w:w="709" w:type="dxa"/>
+          </w:tcPr>
+          <w:p>
+            <w:pPr>
+              <w:rPr>
+                <w:sz w:val="16"/>
+                <w:szCs w:val="16"/>
+              </w:rPr>
+            </w:pPr>
+            <w:r>
+              <w:rPr>
+                <w:sz w:val="16"/>
+                <w:szCs w:val="16"/>
+              </w:rPr>
+              <w:t>1</w:t>
+            </w:r>
+          </w:p>
+        </w:tc>
+        <w:tc>
+          <w:tcPr>
+            <w:tcW w:w="838" w:type="dxa"/>
+          </w:tcPr>
+          <w:p>
+            <w:pPr>
+              <w:rPr>
+                <w:sz w:val="16"/>
+                <w:szCs w:val="16"/>
+              </w:rPr>
+            </w:pPr>
+            <w:r>
+              <w:rPr>
+                <w:sz w:val="16"/>
+                <w:szCs w:val="16"/>
+              </w:rPr>
+              <w:t>3</w:t>
+            </w:r>
+          </w:p>
+        </w:tc>
+        <w:tc>
+          <w:tcPr>
+            <w:tcW w:w="2520" w:type="dxa"/>
+          </w:tcPr>
+          <w:p>
+            <w:pPr>
+              <w:rPr>
+                <w:sz w:val="16"/>
+                <w:szCs w:val="16"/>
+              </w:rPr>
+            </w:pPr>
+            <w:r>
+              <w:rPr>
+                <w:sz w:val="16"/>
+                <w:szCs w:val="16"/>
+              </w:rPr>
+              <w:t>Beginning partition CYLINDER/SECTOR</w:t>
+            </w:r>
+          </w:p>
+          <w:p>
+            <w:pPr>
+              <w:rPr>
+                <w:sz w:val="16"/>
+                <w:szCs w:val="16"/>
+              </w:rPr>
+            </w:pPr>
+            <w:r>
+              <w:rPr>
+                <w:sz w:val="16"/>
+                <w:szCs w:val="16"/>
+              </w:rPr>
+              <w:lastRenderedPageBreak/>
+              <w:t xml:space="preserve"> </w:t>
+            </w:r>
+          </w:p>
+        </w:tc>
+        <w:tc>
+          <w:tcPr>
+            <w:tcW w:w="2268" w:type="dxa"/>
+          </w:tcPr>
+          <w:p>
+            <w:pPr>
+              <w:rPr>
+                <w:sz w:val="16"/>
+                <w:szCs w:val="16"/>
+              </w:rPr>
+            </w:pPr>
+            <w:r>
+              <w:rPr>
+                <w:sz w:val="16"/>
+                <w:szCs w:val="16"/>
+              </w:rPr>
+              <w:lastRenderedPageBreak/>
+              <w:t>0</w:t>
+            </w:r>
+            <w:r>
+              <w:rPr>
+                <w:sz w:val="16"/>
+                <w:szCs w:val="16"/>
+              </w:rPr>
+              <w:t>x01</w:t>
+            </w:r>
           </w:p>
         </w:tc>
       </w:tr>
@@ -6863,14 +6992,14 @@
                 <w:sz w:val="16"/>
                 <w:szCs w:val="16"/>
               </w:rPr>
-              <w:t>0x000001</w:t>
-            </w:r>
-            <w:r>
-              <w:rPr>
-                <w:sz w:val="16"/>
-                <w:szCs w:val="16"/>
-              </w:rPr>
-              <w:t>C0</w:t>
+              <w:t>0x000001C</w:t>
+            </w:r>
+            <w:r>
+              <w:rPr>
+                <w:sz w:val="16"/>
+                <w:szCs w:val="16"/>
+              </w:rPr>
+              <w:t>1</w:t>
             </w:r>
           </w:p>
         </w:tc>
@@ -6897,7 +7026,7 @@
                 <w:sz w:val="16"/>
                 <w:szCs w:val="16"/>
               </w:rPr>
-              <w:t>2</w:t>
+              <w:t>3</w:t>
             </w:r>
           </w:p>
         </w:tc>
@@ -6937,13 +7066,13 @@
                 <w:sz w:val="16"/>
                 <w:szCs w:val="16"/>
               </w:rPr>
-              <w:t>2</w:t>
+              <w:t>1</w:t>
             </w:r>
           </w:p>
         </w:tc>
         <w:tc>
           <w:tcPr>
-            <w:tcW w:w="1201" w:type="dxa"/>
+            <w:tcW w:w="838" w:type="dxa"/>
           </w:tcPr>
           <w:p>
             <w:pPr>
@@ -6963,7 +7092,7 @@
         </w:tc>
         <w:tc>
           <w:tcPr>
-            <w:tcW w:w="2436" w:type="dxa"/>
+            <w:tcW w:w="2520" w:type="dxa"/>
           </w:tcPr>
           <w:p>
             <w:pPr>
@@ -6983,7 +7112,7 @@
         </w:tc>
         <w:tc>
           <w:tcPr>
-            <w:tcW w:w="1989" w:type="dxa"/>
+            <w:tcW w:w="2268" w:type="dxa"/>
           </w:tcPr>
           <w:p>
             <w:pPr>
@@ -6992,6 +7121,13 @@
                 <w:szCs w:val="16"/>
               </w:rPr>
             </w:pPr>
+            <w:r>
+              <w:rPr>
+                <w:sz w:val="16"/>
+                <w:szCs w:val="16"/>
+              </w:rPr>
+              <w:t>0x10</w:t>
+            </w:r>
           </w:p>
         </w:tc>
       </w:tr>
@@ -7092,7 +7228,7 @@
         </w:tc>
         <w:tc>
           <w:tcPr>
-            <w:tcW w:w="1201" w:type="dxa"/>
+            <w:tcW w:w="838" w:type="dxa"/>
           </w:tcPr>
           <w:p>
             <w:pPr>
@@ -7112,7 +7248,7 @@
         </w:tc>
         <w:tc>
           <w:tcPr>
-            <w:tcW w:w="2436" w:type="dxa"/>
+            <w:tcW w:w="2520" w:type="dxa"/>
           </w:tcPr>
           <w:p>
             <w:pPr>
@@ -7132,7 +7268,7 @@
         </w:tc>
         <w:tc>
           <w:tcPr>
-            <w:tcW w:w="1989" w:type="dxa"/>
+            <w:tcW w:w="2268" w:type="dxa"/>
           </w:tcPr>
           <w:p>
             <w:pPr>
@@ -7146,7 +7282,14 @@
                 <w:sz w:val="16"/>
                 <w:szCs w:val="16"/>
               </w:rPr>
-              <w:t>0x0B</w:t>
+              <w:t>0x</w:t>
+            </w:r>
+            <w:r>
+              <w:rPr>
+                <w:sz w:val="16"/>
+                <w:szCs w:val="16"/>
+              </w:rPr>
+              <w:t>0C</w:t>
             </w:r>
           </w:p>
         </w:tc>
@@ -7168,7 +7311,6 @@
                 <w:sz w:val="16"/>
                 <w:szCs w:val="16"/>
               </w:rPr>
-              <w:lastRenderedPageBreak/>
               <w:t>0x000001C</w:t>
             </w:r>
             <w:r>
@@ -7249,7 +7391,7 @@
         </w:tc>
         <w:tc>
           <w:tcPr>
-            <w:tcW w:w="1201" w:type="dxa"/>
+            <w:tcW w:w="838" w:type="dxa"/>
           </w:tcPr>
           <w:p>
             <w:pPr>
@@ -7269,7 +7411,7 @@
         </w:tc>
         <w:tc>
           <w:tcPr>
-            <w:tcW w:w="2436" w:type="dxa"/>
+            <w:tcW w:w="2520" w:type="dxa"/>
           </w:tcPr>
           <w:p>
             <w:pPr>
@@ -7289,7 +7431,7 @@
         </w:tc>
         <w:tc>
           <w:tcPr>
-            <w:tcW w:w="1989" w:type="dxa"/>
+            <w:tcW w:w="2268" w:type="dxa"/>
           </w:tcPr>
           <w:p>
             <w:pPr>
@@ -7298,6 +7440,20 @@
                 <w:szCs w:val="16"/>
               </w:rPr>
             </w:pPr>
+            <w:r>
+              <w:rPr>
+                <w:sz w:val="16"/>
+                <w:szCs w:val="16"/>
+              </w:rPr>
+              <w:t>0x</w:t>
+            </w:r>
+            <w:r>
+              <w:rPr>
+                <w:sz w:val="16"/>
+                <w:szCs w:val="16"/>
+              </w:rPr>
+              <w:t>03</w:t>
+            </w:r>
           </w:p>
         </w:tc>
       </w:tr>
@@ -7392,13 +7548,13 @@
                 <w:sz w:val="16"/>
                 <w:szCs w:val="16"/>
               </w:rPr>
-              <w:t>2</w:t>
+              <w:t>1</w:t>
             </w:r>
           </w:p>
         </w:tc>
         <w:tc>
           <w:tcPr>
-            <w:tcW w:w="1201" w:type="dxa"/>
+            <w:tcW w:w="838" w:type="dxa"/>
           </w:tcPr>
           <w:p>
             <w:pPr>
@@ -7412,13 +7568,13 @@
                 <w:sz w:val="16"/>
                 <w:szCs w:val="16"/>
               </w:rPr>
-              <w:t>8</w:t>
+              <w:t>7</w:t>
             </w:r>
           </w:p>
         </w:tc>
         <w:tc>
           <w:tcPr>
-            <w:tcW w:w="2436" w:type="dxa"/>
+            <w:tcW w:w="2520" w:type="dxa"/>
           </w:tcPr>
           <w:p>
             <w:pPr>
@@ -7438,7 +7594,7 @@
         </w:tc>
         <w:tc>
           <w:tcPr>
-            <w:tcW w:w="1989" w:type="dxa"/>
+            <w:tcW w:w="2268" w:type="dxa"/>
           </w:tcPr>
           <w:p>
             <w:pPr>
@@ -7447,6 +7603,20 @@
                 <w:szCs w:val="16"/>
               </w:rPr>
             </w:pPr>
+            <w:r>
+              <w:rPr>
+                <w:sz w:val="16"/>
+                <w:szCs w:val="16"/>
+              </w:rPr>
+              <w:t>0x</w:t>
+            </w:r>
+            <w:r>
+              <w:rPr>
+                <w:sz w:val="16"/>
+                <w:szCs w:val="16"/>
+              </w:rPr>
+              <w:t>A0</w:t>
+            </w:r>
           </w:p>
         </w:tc>
       </w:tr>
@@ -7474,7 +7644,7 @@
                 <w:sz w:val="16"/>
                 <w:szCs w:val="16"/>
               </w:rPr>
-              <w:t>6</w:t>
+              <w:t>5</w:t>
             </w:r>
           </w:p>
         </w:tc>
@@ -7501,7 +7671,7 @@
                 <w:sz w:val="16"/>
                 <w:szCs w:val="16"/>
               </w:rPr>
-              <w:t>8</w:t>
+              <w:t>7</w:t>
             </w:r>
           </w:p>
         </w:tc>
@@ -7541,13 +7711,13 @@
                 <w:sz w:val="16"/>
                 <w:szCs w:val="16"/>
               </w:rPr>
-              <w:t>4</w:t>
+              <w:t>1</w:t>
             </w:r>
           </w:p>
         </w:tc>
         <w:tc>
           <w:tcPr>
-            <w:tcW w:w="1201" w:type="dxa"/>
+            <w:tcW w:w="838" w:type="dxa"/>
           </w:tcPr>
           <w:p>
             <w:pPr>
@@ -7561,13 +7731,13 @@
                 <w:sz w:val="16"/>
                 <w:szCs w:val="16"/>
               </w:rPr>
-              <w:t>12</w:t>
+              <w:t>8</w:t>
             </w:r>
           </w:p>
         </w:tc>
         <w:tc>
           <w:tcPr>
-            <w:tcW w:w="2436" w:type="dxa"/>
+            <w:tcW w:w="2520" w:type="dxa"/>
           </w:tcPr>
           <w:p>
             <w:pPr>
@@ -7581,13 +7751,13 @@
                 <w:sz w:val="16"/>
                 <w:szCs w:val="16"/>
               </w:rPr>
-              <w:t>Gap in sectors from MBR to First sector in the partition</w:t>
+              <w:t>End partition CYLINDER/SECTOR</w:t>
             </w:r>
           </w:p>
         </w:tc>
         <w:tc>
           <w:tcPr>
-            <w:tcW w:w="1989" w:type="dxa"/>
+            <w:tcW w:w="2268" w:type="dxa"/>
           </w:tcPr>
           <w:p>
             <w:pPr>
@@ -7596,6 +7766,20 @@
                 <w:szCs w:val="16"/>
               </w:rPr>
             </w:pPr>
+            <w:r>
+              <w:rPr>
+                <w:sz w:val="16"/>
+                <w:szCs w:val="16"/>
+              </w:rPr>
+              <w:t>0x</w:t>
+            </w:r>
+            <w:r>
+              <w:rPr>
+                <w:sz w:val="16"/>
+                <w:szCs w:val="16"/>
+              </w:rPr>
+              <w:t>1F</w:t>
+            </w:r>
           </w:p>
         </w:tc>
       </w:tr>
@@ -7623,7 +7807,7 @@
                 <w:sz w:val="16"/>
                 <w:szCs w:val="16"/>
               </w:rPr>
-              <w:t>A</w:t>
+              <w:t>6</w:t>
             </w:r>
           </w:p>
         </w:tc>
@@ -7650,7 +7834,7 @@
                 <w:sz w:val="16"/>
                 <w:szCs w:val="16"/>
               </w:rPr>
-              <w:t>C</w:t>
+              <w:t>8</w:t>
             </w:r>
           </w:p>
         </w:tc>
@@ -7696,7 +7880,7 @@
         </w:tc>
         <w:tc>
           <w:tcPr>
-            <w:tcW w:w="1201" w:type="dxa"/>
+            <w:tcW w:w="838" w:type="dxa"/>
           </w:tcPr>
           <w:p>
             <w:pPr>
@@ -7710,13 +7894,13 @@
                 <w:sz w:val="16"/>
                 <w:szCs w:val="16"/>
               </w:rPr>
-              <w:t>16</w:t>
+              <w:t>12</w:t>
             </w:r>
           </w:p>
         </w:tc>
         <w:tc>
           <w:tcPr>
-            <w:tcW w:w="2436" w:type="dxa"/>
+            <w:tcW w:w="2520" w:type="dxa"/>
           </w:tcPr>
           <w:p>
             <w:pPr>
@@ -7730,13 +7914,13 @@
                 <w:sz w:val="16"/>
                 <w:szCs w:val="16"/>
               </w:rPr>
-              <w:t>Number of sectors in partition</w:t>
+              <w:t>Gap in sectors from MBR to First sector in the partition</w:t>
             </w:r>
           </w:p>
         </w:tc>
         <w:tc>
           <w:tcPr>
-            <w:tcW w:w="1989" w:type="dxa"/>
+            <w:tcW w:w="2268" w:type="dxa"/>
           </w:tcPr>
           <w:p>
             <w:pPr>
@@ -7745,6 +7929,267 @@
                 <w:szCs w:val="16"/>
               </w:rPr>
             </w:pPr>
+            <w:r>
+              <w:rPr>
+                <w:sz w:val="16"/>
+                <w:szCs w:val="16"/>
+              </w:rPr>
+              <w:t>0x</w:t>
+            </w:r>
+            <w:r>
+              <w:rPr>
+                <w:sz w:val="16"/>
+                <w:szCs w:val="16"/>
+              </w:rPr>
+              <w:t xml:space="preserve">00 </w:t>
+            </w:r>
+            <w:r>
+              <w:rPr>
+                <w:sz w:val="16"/>
+                <w:szCs w:val="16"/>
+              </w:rPr>
+              <w:t>0x</w:t>
+            </w:r>
+            <w:r>
+              <w:rPr>
+                <w:sz w:val="16"/>
+                <w:szCs w:val="16"/>
+              </w:rPr>
+              <w:t xml:space="preserve">08 </w:t>
+            </w:r>
+            <w:r>
+              <w:rPr>
+                <w:sz w:val="16"/>
+                <w:szCs w:val="16"/>
+              </w:rPr>
+              <w:t>0x</w:t>
+            </w:r>
+            <w:r>
+              <w:rPr>
+                <w:sz w:val="16"/>
+                <w:szCs w:val="16"/>
+              </w:rPr>
+              <w:t xml:space="preserve">00 </w:t>
+            </w:r>
+            <w:r>
+              <w:rPr>
+                <w:sz w:val="16"/>
+                <w:szCs w:val="16"/>
+              </w:rPr>
+              <w:t>0x</w:t>
+            </w:r>
+            <w:r>
+              <w:rPr>
+                <w:sz w:val="16"/>
+                <w:szCs w:val="16"/>
+              </w:rPr>
+              <w:t>00</w:t>
+            </w:r>
+          </w:p>
+        </w:tc>
+      </w:tr>
+      <w:tr>
+        <w:tc>
+          <w:tcPr>
+            <w:tcW w:w="1313" w:type="dxa"/>
+          </w:tcPr>
+          <w:p>
+            <w:pPr>
+              <w:rPr>
+                <w:sz w:val="16"/>
+                <w:szCs w:val="16"/>
+              </w:rPr>
+            </w:pPr>
+            <w:r>
+              <w:rPr>
+                <w:sz w:val="16"/>
+                <w:szCs w:val="16"/>
+              </w:rPr>
+              <w:t>0x000001C</w:t>
+            </w:r>
+            <w:r>
+              <w:rPr>
+                <w:sz w:val="16"/>
+                <w:szCs w:val="16"/>
+              </w:rPr>
+              <w:t>A</w:t>
+            </w:r>
+          </w:p>
+        </w:tc>
+        <w:tc>
+          <w:tcPr>
+            <w:tcW w:w="1251" w:type="dxa"/>
+          </w:tcPr>
+          <w:p>
+            <w:pPr>
+              <w:rPr>
+                <w:sz w:val="16"/>
+                <w:szCs w:val="16"/>
+              </w:rPr>
+            </w:pPr>
+            <w:r>
+              <w:rPr>
+                <w:sz w:val="16"/>
+                <w:szCs w:val="16"/>
+              </w:rPr>
+              <w:t>0x00</w:t>
+            </w:r>
+            <w:r>
+              <w:rPr>
+                <w:sz w:val="16"/>
+                <w:szCs w:val="16"/>
+              </w:rPr>
+              <w:t>1C</w:t>
+            </w:r>
+          </w:p>
+        </w:tc>
+        <w:tc>
+          <w:tcPr>
+            <w:tcW w:w="1559" w:type="dxa"/>
+          </w:tcPr>
+          <w:p>
+            <w:pPr>
+              <w:rPr>
+                <w:sz w:val="16"/>
+                <w:szCs w:val="16"/>
+              </w:rPr>
+            </w:pPr>
+            <w:r>
+              <w:rPr>
+                <w:sz w:val="16"/>
+                <w:szCs w:val="16"/>
+              </w:rPr>
+              <w:t>1st Partition entry</w:t>
+            </w:r>
+          </w:p>
+        </w:tc>
+        <w:tc>
+          <w:tcPr>
+            <w:tcW w:w="709" w:type="dxa"/>
+          </w:tcPr>
+          <w:p>
+            <w:pPr>
+              <w:rPr>
+                <w:sz w:val="16"/>
+                <w:szCs w:val="16"/>
+              </w:rPr>
+            </w:pPr>
+            <w:r>
+              <w:rPr>
+                <w:sz w:val="16"/>
+                <w:szCs w:val="16"/>
+              </w:rPr>
+              <w:t>4</w:t>
+            </w:r>
+          </w:p>
+        </w:tc>
+        <w:tc>
+          <w:tcPr>
+            <w:tcW w:w="838" w:type="dxa"/>
+          </w:tcPr>
+          <w:p>
+            <w:pPr>
+              <w:rPr>
+                <w:sz w:val="16"/>
+                <w:szCs w:val="16"/>
+              </w:rPr>
+            </w:pPr>
+            <w:r>
+              <w:rPr>
+                <w:sz w:val="16"/>
+                <w:szCs w:val="16"/>
+              </w:rPr>
+              <w:t>16</w:t>
+            </w:r>
+          </w:p>
+        </w:tc>
+        <w:tc>
+          <w:tcPr>
+            <w:tcW w:w="2520" w:type="dxa"/>
+          </w:tcPr>
+          <w:p>
+            <w:pPr>
+              <w:rPr>
+                <w:sz w:val="16"/>
+                <w:szCs w:val="16"/>
+              </w:rPr>
+            </w:pPr>
+            <w:r>
+              <w:rPr>
+                <w:sz w:val="16"/>
+                <w:szCs w:val="16"/>
+              </w:rPr>
+              <w:t>Number of sectors in partition</w:t>
+            </w:r>
+          </w:p>
+        </w:tc>
+        <w:tc>
+          <w:tcPr>
+            <w:tcW w:w="2268" w:type="dxa"/>
+          </w:tcPr>
+          <w:p>
+            <w:pPr>
+              <w:rPr>
+                <w:sz w:val="16"/>
+                <w:szCs w:val="16"/>
+              </w:rPr>
+            </w:pPr>
+            <w:r>
+              <w:rPr>
+                <w:sz w:val="16"/>
+                <w:szCs w:val="16"/>
+              </w:rPr>
+              <w:t>0x</w:t>
+            </w:r>
+            <w:r>
+              <w:rPr>
+                <w:sz w:val="16"/>
+                <w:szCs w:val="16"/>
+              </w:rPr>
+              <w:t xml:space="preserve">00 </w:t>
+            </w:r>
+            <w:r>
+              <w:rPr>
+                <w:sz w:val="16"/>
+                <w:szCs w:val="16"/>
+              </w:rPr>
+              <w:t>0x</w:t>
+            </w:r>
+            <w:r>
+              <w:rPr>
+                <w:sz w:val="16"/>
+                <w:szCs w:val="16"/>
+              </w:rPr>
+              <w:t xml:space="preserve">08 </w:t>
+            </w:r>
+            <w:r>
+              <w:rPr>
+                <w:sz w:val="16"/>
+                <w:szCs w:val="16"/>
+              </w:rPr>
+              <w:t>0x</w:t>
+            </w:r>
+            <w:r>
+              <w:rPr>
+                <w:sz w:val="16"/>
+                <w:szCs w:val="16"/>
+              </w:rPr>
+              <w:t xml:space="preserve">01 </w:t>
+            </w:r>
+            <w:r>
+              <w:rPr>
+                <w:sz w:val="16"/>
+                <w:szCs w:val="16"/>
+              </w:rPr>
+              <w:t>0x</w:t>
+            </w:r>
+            <w:r>
+              <w:rPr>
+                <w:sz w:val="16"/>
+                <w:szCs w:val="16"/>
+              </w:rPr>
+              <w:t>00</w:t>
+            </w:r>
           </w:p>
         </w:tc>
       </w:tr>
@@ -8634,27 +9079,14 @@
       <w:r>
         <w:t xml:space="preserve">Figure </w:t>
       </w:r>
-      <w:r>
-        <w:fldChar w:fldCharType="begin"/>
-      </w:r>
-      <w:r>
-        <w:instrText xml:space="preserve"> SEQ Figure \* ARABIC </w:instrText>
-      </w:r>
-      <w:r>
-        <w:fldChar w:fldCharType="separate"/>
-      </w:r>
-      <w:r>
-        <w:rPr>
-          <w:noProof/>
-        </w:rPr>
-        <w:t>1</w:t>
-      </w:r>
-      <w:r>
-        <w:rPr>
-          <w:noProof/>
-        </w:rPr>
-        <w:fldChar w:fldCharType="end"/>
-      </w:r>
+      <w:fldSimple w:instr=" SEQ Figure \* ARABIC ">
+        <w:r>
+          <w:rPr>
+            <w:noProof/>
+          </w:rPr>
+          <w:t>1</w:t>
+        </w:r>
+      </w:fldSimple>
       <w:r>
         <w:t xml:space="preserve"> </w:t>
       </w:r>
@@ -9615,15 +10047,7 @@
         </w:numPr>
       </w:pPr>
       <w:r>
-        <w:t>Non-partitioned storage, such as floppy, use VBR. First sector, physical C/H/S 0,0,</w:t>
-      </w:r>
-      <w:proofErr w:type="gramStart"/>
-      <w:r>
-        <w:t>1 .</w:t>
-      </w:r>
-      <w:proofErr w:type="gramEnd"/>
-      <w:r>
-        <w:t xml:space="preserve"> Note the sector counting </w:t>
+        <w:t xml:space="preserve">Non-partitioned storage, such as floppy, use VBR. First sector, physical C/H/S 0,0,1 . Note the sector counting </w:t>
       </w:r>
       <w:r>
         <w:t>begins</w:t>
@@ -9756,15 +10180,7 @@
         <w:t>, sector 2048 contains the BPB of a partition.</w:t>
       </w:r>
       <w:r>
-        <w:t xml:space="preserve"> Both can be </w:t>
-      </w:r>
-      <w:proofErr w:type="gramStart"/>
-      <w:r>
-        <w:t>see</w:t>
-      </w:r>
-      <w:proofErr w:type="gramEnd"/>
-      <w:r>
-        <w:t xml:space="preserve"> easily using </w:t>
+        <w:t xml:space="preserve"> Both can be see easily using </w:t>
       </w:r>
       <w:proofErr w:type="spellStart"/>
       <w:r>
@@ -9781,15 +10197,7 @@
         </w:numPr>
       </w:pPr>
       <w:r>
-        <w:t xml:space="preserve">Partition information </w:t>
-      </w:r>
-      <w:proofErr w:type="gramStart"/>
-      <w:r>
-        <w:t>extracted</w:t>
-      </w:r>
-      <w:proofErr w:type="gramEnd"/>
-      <w:r>
-        <w:t xml:space="preserve"> from the 4x16 bytes before the boot magic number. The first value begins at </w:t>
+        <w:t xml:space="preserve">Partition information extracted from the 4x16 bytes before the boot magic number. The first value begins at </w:t>
       </w:r>
       <w:r>
         <w:t>0x1BE</w:t>
@@ -9881,27 +10289,14 @@
       <w:r>
         <w:t xml:space="preserve">Figure </w:t>
       </w:r>
-      <w:r>
-        <w:fldChar w:fldCharType="begin"/>
-      </w:r>
-      <w:r>
-        <w:instrText xml:space="preserve"> SEQ Figure \* ARABIC </w:instrText>
-      </w:r>
-      <w:r>
-        <w:fldChar w:fldCharType="separate"/>
-      </w:r>
-      <w:r>
-        <w:rPr>
-          <w:noProof/>
-        </w:rPr>
-        <w:t>2</w:t>
-      </w:r>
-      <w:r>
-        <w:rPr>
-          <w:noProof/>
-        </w:rPr>
-        <w:fldChar w:fldCharType="end"/>
-      </w:r>
+      <w:fldSimple w:instr=" SEQ Figure \* ARABIC ">
+        <w:r>
+          <w:rPr>
+            <w:noProof/>
+          </w:rPr>
+          <w:t>2</w:t>
+        </w:r>
+      </w:fldSimple>
       <w:r>
         <w:t xml:space="preserve"> Example of partition on MBR. 0x80 is bootable</w:t>
       </w:r>
@@ -9962,37 +10357,19 @@
       <w:r>
         <w:t xml:space="preserve">Figure </w:t>
       </w:r>
-      <w:r>
-        <w:fldChar w:fldCharType="begin"/>
-      </w:r>
-      <w:r>
-        <w:instrText xml:space="preserve"> SEQ Figure \* ARABIC </w:instrText>
-      </w:r>
-      <w:r>
-        <w:fldChar w:fldCharType="separate"/>
-      </w:r>
-      <w:r>
-        <w:rPr>
-          <w:noProof/>
-        </w:rPr>
-        <w:t>3</w:t>
-      </w:r>
-      <w:r>
-        <w:rPr>
-          <w:noProof/>
-        </w:rPr>
-        <w:fldChar w:fldCharType="end"/>
-      </w:r>
+      <w:fldSimple w:instr=" SEQ Figure \* ARABIC ">
+        <w:r>
+          <w:rPr>
+            <w:noProof/>
+          </w:rPr>
+          <w:t>3</w:t>
+        </w:r>
+      </w:fldSimple>
       <w:r>
         <w:t xml:space="preserve"> Dissection of the first partition using ChatGPT. </w:t>
       </w:r>
-      <w:proofErr w:type="gramStart"/>
-      <w:r>
-        <w:t>Is</w:t>
-      </w:r>
-      <w:proofErr w:type="gramEnd"/>
-      <w:r>
-        <w:t xml:space="preserve"> correct?</w:t>
+      <w:r>
+        <w:t>Is correct?</w:t>
       </w:r>
       <w:bookmarkEnd w:id="10"/>
     </w:p>
@@ -10064,27 +10441,14 @@
       <w:r>
         <w:t xml:space="preserve">Figure </w:t>
       </w:r>
-      <w:r>
-        <w:fldChar w:fldCharType="begin"/>
-      </w:r>
-      <w:r>
-        <w:instrText xml:space="preserve"> SEQ Figure \* ARABIC </w:instrText>
-      </w:r>
-      <w:r>
-        <w:fldChar w:fldCharType="separate"/>
-      </w:r>
-      <w:r>
-        <w:rPr>
-          <w:noProof/>
-        </w:rPr>
-        <w:t>4</w:t>
-      </w:r>
-      <w:r>
-        <w:rPr>
-          <w:noProof/>
-        </w:rPr>
-        <w:fldChar w:fldCharType="end"/>
-      </w:r>
+      <w:fldSimple w:instr=" SEQ Figure \* ARABIC ">
+        <w:r>
+          <w:rPr>
+            <w:noProof/>
+          </w:rPr>
+          <w:t>4</w:t>
+        </w:r>
+      </w:fldSimple>
       <w:r>
         <w:t xml:space="preserve"> MBR with FAT partitions</w:t>
       </w:r>
@@ -10160,27 +10524,14 @@
       <w:r>
         <w:t xml:space="preserve">Figure </w:t>
       </w:r>
-      <w:r>
-        <w:fldChar w:fldCharType="begin"/>
-      </w:r>
-      <w:r>
-        <w:instrText xml:space="preserve"> SEQ Figure \* ARABIC </w:instrText>
-      </w:r>
-      <w:r>
-        <w:fldChar w:fldCharType="separate"/>
-      </w:r>
-      <w:r>
-        <w:rPr>
-          <w:noProof/>
-        </w:rPr>
-        <w:t>5</w:t>
-      </w:r>
-      <w:r>
-        <w:rPr>
-          <w:noProof/>
-        </w:rPr>
-        <w:fldChar w:fldCharType="end"/>
-      </w:r>
+      <w:fldSimple w:instr=" SEQ Figure \* ARABIC ">
+        <w:r>
+          <w:rPr>
+            <w:noProof/>
+          </w:rPr>
+          <w:t>5</w:t>
+        </w:r>
+      </w:fldSimple>
       <w:r>
         <w:t xml:space="preserve"> FAT formats schema</w:t>
       </w:r>
@@ -10326,7 +10677,6 @@
       <w:r>
         <w:t>Invoke explorer Windows using “</w:t>
       </w:r>
-      <w:proofErr w:type="gramStart"/>
       <w:r>
         <w:rPr>
           <w:b/>
@@ -10334,7 +10684,6 @@
         </w:rPr>
         <w:t>explorer.exe .</w:t>
       </w:r>
-      <w:proofErr w:type="gramEnd"/>
       <w:r>
         <w:t>”</w:t>
       </w:r>
@@ -10476,13 +10825,8 @@
           <w:bCs/>
         </w:rPr>
       </w:pPr>
-      <w:proofErr w:type="gramStart"/>
-      <w:r>
-        <w:t>Also</w:t>
-      </w:r>
-      <w:proofErr w:type="gramEnd"/>
-      <w:r>
-        <w:t xml:space="preserve"> you can net use </w:t>
+      <w:r>
+        <w:t xml:space="preserve">Also you can net use </w:t>
       </w:r>
       <w:r>
         <w:rPr>
@@ -10838,15 +11182,7 @@
       </w:r>
       <w:proofErr w:type="spellEnd"/>
       <w:r>
-        <w:t xml:space="preserve"> = </w:t>
-      </w:r>
-      <w:proofErr w:type="gramStart"/>
-      <w:r>
-        <w:t>clear(</w:t>
-      </w:r>
-      <w:proofErr w:type="gramEnd"/>
-      <w:r>
-        <w:t>investigate how to make it permanent)</w:t>
+        <w:t xml:space="preserve"> = clear(investigate how to make it permanent)</w:t>
       </w:r>
     </w:p>
     <w:p>
@@ -10858,18 +11194,13 @@
         </w:numPr>
       </w:pPr>
       <w:r>
-        <w:t>sudo nano ~</w:t>
-      </w:r>
-      <w:proofErr w:type="gramStart"/>
-      <w:r>
-        <w:t>/.</w:t>
+        <w:t>sudo nano ~/.</w:t>
       </w:r>
       <w:proofErr w:type="spellStart"/>
       <w:r>
         <w:t>bashrc</w:t>
       </w:r>
       <w:proofErr w:type="spellEnd"/>
-      <w:proofErr w:type="gramEnd"/>
       <w:r>
         <w:t xml:space="preserve"> (to make it permanent)</w:t>
       </w:r>
@@ -11301,16 +11632,11 @@
           <w:numId w:val="1"/>
         </w:numPr>
       </w:pPr>
-      <w:proofErr w:type="gramStart"/>
       <w:r>
         <w:t>Actually,</w:t>
       </w:r>
       <w:r>
-        <w:t xml:space="preserve"> what</w:t>
-      </w:r>
-      <w:proofErr w:type="gramEnd"/>
-      <w:r>
-        <w:t xml:space="preserve"> worked was [interop] </w:t>
+        <w:t xml:space="preserve"> what worked was [interop] </w:t>
       </w:r>
       <w:r>
         <w:t>appendWindowsPath=false</w:t>
@@ -11349,13 +11675,8 @@
         </w:numPr>
       </w:pPr>
       <w:r>
-        <w:t xml:space="preserve">Now using </w:t>
-      </w:r>
-      <w:proofErr w:type="gramStart"/>
-      <w:r>
-        <w:t>code .</w:t>
-      </w:r>
-      <w:proofErr w:type="gramEnd"/>
+        <w:t>Now using code .</w:t>
+      </w:r>
       <w:r>
         <w:t xml:space="preserve"> will open native, with a warning.</w:t>
       </w:r>
@@ -12297,13 +12618,8 @@
         </w:numPr>
       </w:pPr>
       <w:r>
-        <w:t xml:space="preserve">            "options</w:t>
-      </w:r>
-      <w:proofErr w:type="gramStart"/>
-      <w:r>
-        <w:t>": {</w:t>
-      </w:r>
-      <w:proofErr w:type="gramEnd"/>
+        <w:t xml:space="preserve">            "options": {</w:t>
+      </w:r>
     </w:p>
     <w:p>
       <w:pPr>
@@ -12406,13 +12722,8 @@
         </w:numPr>
       </w:pPr>
       <w:r>
-        <w:t xml:space="preserve">            "group</w:t>
-      </w:r>
-      <w:proofErr w:type="gramStart"/>
-      <w:r>
-        <w:t>": {</w:t>
-      </w:r>
-      <w:proofErr w:type="gramEnd"/>
+        <w:t xml:space="preserve">            "group": {</w:t>
+      </w:r>
     </w:p>
     <w:p>
       <w:pPr>
@@ -12667,21 +12978,8 @@
           <w:numId w:val="1"/>
         </w:numPr>
       </w:pPr>
-      <w:proofErr w:type="gramStart"/>
-      <w:r>
-        <w:t>RoboCopy.exe  "</w:t>
-      </w:r>
-      <w:proofErr w:type="gramEnd"/>
-      <w:r>
-        <w:t xml:space="preserve">Z:\home\mihe\codebox" "C:\Users\mihe\Dropbox\TusMuertOS-Oct2025\src\helpers" </w:t>
-      </w:r>
-      <w:proofErr w:type="gramStart"/>
-      <w:r>
-        <w:t>*.*</w:t>
-      </w:r>
-      <w:proofErr w:type="gramEnd"/>
-      <w:r>
-        <w:t xml:space="preserve"> /E</w:t>
+      <w:r>
+        <w:t>RoboCopy.exe  "Z:\home\mihe\codebox" "C:\Users\mihe\Dropbox\TusMuertOS-Oct2025\src\helpers" *.* /E</w:t>
       </w:r>
     </w:p>
     <w:p>
@@ -13117,12 +13415,10 @@
         <w:t xml:space="preserve">Compile the bootloader stage1 that goes on MBR to </w:t>
       </w:r>
       <w:proofErr w:type="spellStart"/>
-      <w:proofErr w:type="gramStart"/>
       <w:r>
         <w:t>mbr.bin</w:t>
       </w:r>
       <w:proofErr w:type="spellEnd"/>
-      <w:proofErr w:type="gramEnd"/>
     </w:p>
     <w:p>
       <w:pPr>
@@ -13583,12 +13879,10 @@
         <w:t>  "</w:t>
       </w:r>
       <w:proofErr w:type="spellStart"/>
-      <w:proofErr w:type="gramStart"/>
       <w:r>
         <w:t>editor.semanticHighlighting.enabled</w:t>
       </w:r>
       <w:proofErr w:type="spellEnd"/>
-      <w:proofErr w:type="gramEnd"/>
       <w:r>
         <w:t>": true,</w:t>
       </w:r>
@@ -13598,52 +13892,35 @@
         <w:t>  "</w:t>
       </w:r>
       <w:proofErr w:type="spellStart"/>
-      <w:proofErr w:type="gramStart"/>
       <w:r>
         <w:t>editor.semanticTokenColorCustomizations</w:t>
       </w:r>
       <w:proofErr w:type="spellEnd"/>
-      <w:proofErr w:type="gramEnd"/>
       <w:r>
         <w:t>": {</w:t>
       </w:r>
     </w:p>
     <w:p>
       <w:r>
-        <w:t>    "rules</w:t>
-      </w:r>
-      <w:proofErr w:type="gramStart"/>
+        <w:t>    "rules": {</w:t>
+      </w:r>
+    </w:p>
+    <w:p>
+      <w:r>
+        <w:t>      "</w:t>
+      </w:r>
+      <w:proofErr w:type="spellStart"/>
+      <w:r>
+        <w:t>operator.controlFlow</w:t>
+      </w:r>
+      <w:proofErr w:type="spellEnd"/>
       <w:r>
         <w:t>": {</w:t>
       </w:r>
-      <w:proofErr w:type="gramEnd"/>
-    </w:p>
-    <w:p>
-      <w:r>
-        <w:t>      "</w:t>
-      </w:r>
-      <w:proofErr w:type="spellStart"/>
-      <w:proofErr w:type="gramStart"/>
-      <w:r>
-        <w:t>operator.controlFlow</w:t>
-      </w:r>
-      <w:proofErr w:type="spellEnd"/>
-      <w:r>
-        <w:t>": {</w:t>
-      </w:r>
-      <w:proofErr w:type="gramEnd"/>
-    </w:p>
-    <w:p>
-      <w:r>
-        <w:t>        "foreground"</w:t>
-      </w:r>
-      <w:proofErr w:type="gramStart"/>
-      <w:r>
-        <w:t>: "#</w:t>
-      </w:r>
-      <w:proofErr w:type="gramEnd"/>
-      <w:r>
-        <w:t>ff5100",</w:t>
+    </w:p>
+    <w:p>
+      <w:r>
+        <w:t>        "foreground": "#ff5100",</w:t>
       </w:r>
     </w:p>
     <w:p>
@@ -13669,17 +13946,12 @@
     <w:p/>
     <w:p/>
     <w:p>
-      <w:proofErr w:type="gramStart"/>
       <w:r>
         <w:t>.</w:t>
       </w:r>
       <w:proofErr w:type="spellStart"/>
       <w:r>
-        <w:t>rustfmt</w:t>
-      </w:r>
-      <w:proofErr w:type="gramEnd"/>
-      <w:r>
-        <w:t>.toml</w:t>
+        <w:t>rustfmt.toml</w:t>
       </w:r>
       <w:proofErr w:type="spellEnd"/>
       <w:r>
@@ -13790,46 +14062,46 @@
           <w:b/>
           <w:bCs/>
         </w:rPr>
-        <w:t>/</w:t>
-      </w:r>
-      <w:proofErr w:type="gramStart"/>
-      <w:r>
+        <w:t>/mnt/c/Users/mihe/Dropbox/TusMuertOS-Oct2025</w:t>
+      </w:r>
+    </w:p>
+    <w:p>
+      <w:pPr>
+        <w:ind w:firstLine="720"/>
+      </w:pPr>
+    </w:p>
+    <w:p>
+      <w:pPr>
+        <w:ind w:firstLine="720"/>
         <w:rPr>
           <w:b/>
           <w:bCs/>
         </w:rPr>
-        <w:t>mnt</w:t>
-      </w:r>
-      <w:proofErr w:type="gramEnd"/>
+      </w:pPr>
+      <w:proofErr w:type="spellStart"/>
       <w:r>
         <w:rPr>
           <w:b/>
           <w:bCs/>
         </w:rPr>
-        <w:t>/c/Users/mihe/Dropbox/TusMuertOS-Oct2025</w:t>
-      </w:r>
-    </w:p>
-    <w:p>
-      <w:pPr>
-        <w:ind w:firstLine="720"/>
-      </w:pPr>
-    </w:p>
-    <w:p>
-      <w:pPr>
-        <w:ind w:firstLine="720"/>
+        <w:lastRenderedPageBreak/>
+        <w:t>nasm</w:t>
+      </w:r>
+      <w:proofErr w:type="spellEnd"/>
+      <w:r>
         <w:rPr>
           <w:b/>
           <w:bCs/>
         </w:rPr>
-      </w:pPr>
+        <w:t xml:space="preserve"> -f bin </w:t>
+      </w:r>
       <w:proofErr w:type="spellStart"/>
       <w:r>
         <w:rPr>
           <w:b/>
           <w:bCs/>
         </w:rPr>
-        <w:lastRenderedPageBreak/>
-        <w:t>nasm</w:t>
+        <w:t>src</w:t>
       </w:r>
       <w:proofErr w:type="spellEnd"/>
       <w:r>
@@ -13837,7 +14109,7 @@
           <w:b/>
           <w:bCs/>
         </w:rPr>
-        <w:t xml:space="preserve"> -f bin </w:t>
+        <w:t xml:space="preserve">/bootloader/stage1.asm -o </w:t>
       </w:r>
       <w:proofErr w:type="spellStart"/>
       <w:r>
@@ -13853,59 +14125,59 @@
           <w:b/>
           <w:bCs/>
         </w:rPr>
-        <w:t xml:space="preserve">/bootloader/stage1.asm -o </w:t>
-      </w:r>
+        <w:t>/build/stage1.bin</w:t>
+      </w:r>
+    </w:p>
+    <w:p/>
+    <w:p>
       <w:proofErr w:type="spellStart"/>
       <w:r>
+        <w:t>bximage</w:t>
+      </w:r>
+      <w:proofErr w:type="spellEnd"/>
+      <w:r>
+        <w:t xml:space="preserve"> to create an empty floppy disk. It is an interactive tool with a menu. It shows this info after execution: The following line should appear in your </w:t>
+      </w:r>
+      <w:proofErr w:type="spellStart"/>
+      <w:r>
+        <w:t>bochsrc</w:t>
+      </w:r>
+      <w:proofErr w:type="spellEnd"/>
+      <w:r>
+        <w:t>:</w:t>
+      </w:r>
+    </w:p>
+    <w:p>
+      <w:pPr>
+        <w:ind w:firstLine="720"/>
         <w:rPr>
           <w:b/>
           <w:bCs/>
         </w:rPr>
-        <w:t>src</w:t>
-      </w:r>
-      <w:proofErr w:type="spellEnd"/>
+      </w:pPr>
+      <w:proofErr w:type="spellStart"/>
       <w:r>
         <w:rPr>
           <w:b/>
           <w:bCs/>
         </w:rPr>
-        <w:t>/build/stage1.bin</w:t>
-      </w:r>
-    </w:p>
-    <w:p/>
-    <w:p>
-      <w:proofErr w:type="spellStart"/>
-      <w:r>
-        <w:t>bximage</w:t>
+        <w:t>floppya</w:t>
       </w:r>
       <w:proofErr w:type="spellEnd"/>
       <w:r>
-        <w:t xml:space="preserve"> to create an empty floppy disk. It is an interactive tool with a menu. It shows this info after execution: The following line should appear in your </w:t>
-      </w:r>
-      <w:proofErr w:type="spellStart"/>
-      <w:r>
-        <w:t>bochsrc</w:t>
-      </w:r>
-      <w:proofErr w:type="spellEnd"/>
-      <w:r>
-        <w:t>:</w:t>
-      </w:r>
-    </w:p>
-    <w:p>
-      <w:pPr>
-        <w:ind w:firstLine="720"/>
         <w:rPr>
           <w:b/>
           <w:bCs/>
         </w:rPr>
-      </w:pPr>
+        <w:t>: image="</w:t>
+      </w:r>
       <w:proofErr w:type="spellStart"/>
       <w:r>
         <w:rPr>
           <w:b/>
           <w:bCs/>
         </w:rPr>
-        <w:t>floppya</w:t>
+        <w:t>floppy.img</w:t>
       </w:r>
       <w:proofErr w:type="spellEnd"/>
       <w:r>
@@ -13913,94 +14185,86 @@
           <w:b/>
           <w:bCs/>
         </w:rPr>
-        <w:t>: image="</w:t>
-      </w:r>
-      <w:proofErr w:type="spellStart"/>
-      <w:r>
+        <w:t>", status=inserted</w:t>
+      </w:r>
+    </w:p>
+    <w:p>
+      <w:r>
+        <w:t>Alternative to create the empty disk:</w:t>
+      </w:r>
+    </w:p>
+    <w:p>
+      <w:pPr>
+        <w:ind w:firstLine="720"/>
         <w:rPr>
           <w:b/>
           <w:bCs/>
         </w:rPr>
-        <w:t>floppy.img</w:t>
-      </w:r>
-      <w:proofErr w:type="spellEnd"/>
+      </w:pPr>
       <w:r>
         <w:rPr>
           <w:b/>
           <w:bCs/>
         </w:rPr>
-        <w:t>", status=inserted</w:t>
-      </w:r>
-    </w:p>
-    <w:p>
-      <w:r>
-        <w:t>Alternative to create the empty disk:</w:t>
-      </w:r>
-    </w:p>
-    <w:p>
-      <w:pPr>
-        <w:ind w:firstLine="720"/>
+        <w:t>dd if=/dev/zero of=</w:t>
+      </w:r>
+      <w:proofErr w:type="spellStart"/>
+      <w:r>
         <w:rPr>
           <w:b/>
           <w:bCs/>
         </w:rPr>
-      </w:pPr>
+        <w:t>teaching.img</w:t>
+      </w:r>
+      <w:proofErr w:type="spellEnd"/>
       <w:r>
         <w:rPr>
           <w:b/>
           <w:bCs/>
         </w:rPr>
-        <w:t>dd if=/dev/zero of=</w:t>
+        <w:t xml:space="preserve"> bs=512 count=2880</w:t>
+      </w:r>
+    </w:p>
+    <w:p/>
+    <w:p>
+      <w:r>
+        <w:t xml:space="preserve">Inject the bootloader (512 bytes, One sector if I am not </w:t>
       </w:r>
       <w:proofErr w:type="spellStart"/>
+      <w:r>
+        <w:t>mistaketn</w:t>
+      </w:r>
+      <w:proofErr w:type="spellEnd"/>
+      <w:r>
+        <w:t>) at the beginning of the empty disk image:</w:t>
+      </w:r>
+    </w:p>
+    <w:p>
+      <w:pPr>
+        <w:ind w:firstLine="720"/>
+      </w:pPr>
       <w:r>
         <w:rPr>
           <w:b/>
           <w:bCs/>
         </w:rPr>
-        <w:t>teaching.img</w:t>
-      </w:r>
-      <w:proofErr w:type="spellEnd"/>
+        <w:t>dd if=</w:t>
+      </w:r>
+      <w:proofErr w:type="spellStart"/>
       <w:r>
         <w:rPr>
           <w:b/>
           <w:bCs/>
         </w:rPr>
-        <w:t xml:space="preserve"> bs=512 count=2880</w:t>
-      </w:r>
-    </w:p>
-    <w:p/>
-    <w:p>
-      <w:r>
-        <w:t xml:space="preserve">Inject the bootloader (512 bytes, </w:t>
-      </w:r>
-      <w:proofErr w:type="gramStart"/>
-      <w:r>
-        <w:t>One</w:t>
-      </w:r>
-      <w:proofErr w:type="gramEnd"/>
-      <w:r>
-        <w:t xml:space="preserve"> sector if I am not </w:t>
-      </w:r>
-      <w:proofErr w:type="spellStart"/>
-      <w:r>
-        <w:t>mistaketn</w:t>
+        <w:t>src</w:t>
       </w:r>
       <w:proofErr w:type="spellEnd"/>
-      <w:r>
-        <w:t>) at the beginning of the empty disk image:</w:t>
-      </w:r>
-    </w:p>
-    <w:p>
-      <w:pPr>
-        <w:ind w:firstLine="720"/>
-      </w:pPr>
       <w:r>
         <w:rPr>
           <w:b/>
           <w:bCs/>
         </w:rPr>
-        <w:t>dd if=</w:t>
+        <w:t>/build/stage1.bin of=</w:t>
       </w:r>
       <w:proofErr w:type="spellStart"/>
       <w:r>
@@ -14016,7 +14280,7 @@
           <w:b/>
           <w:bCs/>
         </w:rPr>
-        <w:t>/build/stage1.bin of=</w:t>
+        <w:t>/build/</w:t>
       </w:r>
       <w:proofErr w:type="spellStart"/>
       <w:r>
@@ -14024,7 +14288,7 @@
           <w:b/>
           <w:bCs/>
         </w:rPr>
-        <w:t>src</w:t>
+        <w:t>floppy.img</w:t>
       </w:r>
       <w:proofErr w:type="spellEnd"/>
       <w:r>
@@ -14032,7 +14296,7 @@
           <w:b/>
           <w:bCs/>
         </w:rPr>
-        <w:t>/build/</w:t>
+        <w:t xml:space="preserve"> bs=512 count=1 conv=</w:t>
       </w:r>
       <w:proofErr w:type="spellStart"/>
       <w:r>
@@ -14040,143 +14304,142 @@
           <w:b/>
           <w:bCs/>
         </w:rPr>
-        <w:t>floppy.img</w:t>
+        <w:t>notrunc</w:t>
       </w:r>
       <w:proofErr w:type="spellEnd"/>
-      <w:r>
+    </w:p>
+    <w:p/>
+    <w:p>
+      <w:r>
+        <w:t>To quickly see the content of the disk:</w:t>
+      </w:r>
+    </w:p>
+    <w:p>
+      <w:pPr>
+        <w:ind w:firstLine="576"/>
         <w:rPr>
           <w:b/>
           <w:bCs/>
         </w:rPr>
-        <w:t xml:space="preserve"> bs=512 count=1 conv=</w:t>
-      </w:r>
+      </w:pPr>
       <w:proofErr w:type="spellStart"/>
       <w:r>
         <w:rPr>
           <w:b/>
           <w:bCs/>
         </w:rPr>
-        <w:t>notrunc</w:t>
+        <w:t>xxd</w:t>
       </w:r>
       <w:proofErr w:type="spellEnd"/>
-    </w:p>
-    <w:p/>
-    <w:p>
-      <w:r>
-        <w:t>To quickly see the content of the disk:</w:t>
-      </w:r>
-    </w:p>
-    <w:p>
-      <w:pPr>
-        <w:ind w:firstLine="576"/>
+      <w:r>
         <w:rPr>
           <w:b/>
           <w:bCs/>
         </w:rPr>
-      </w:pPr>
+        <w:t xml:space="preserve"> -l 512 </w:t>
+      </w:r>
       <w:proofErr w:type="spellStart"/>
       <w:r>
         <w:rPr>
           <w:b/>
           <w:bCs/>
         </w:rPr>
-        <w:t>xxd</w:t>
+        <w:t>floppy.img</w:t>
       </w:r>
       <w:proofErr w:type="spellEnd"/>
-      <w:r>
+    </w:p>
+    <w:p/>
+    <w:p>
+      <w:r>
+        <w:t>To debug the fat32 injecting tool. Delete the old image and create a new one:</w:t>
+      </w:r>
+    </w:p>
+    <w:p/>
+    <w:p>
+      <w:pPr>
         <w:rPr>
           <w:b/>
           <w:bCs/>
         </w:rPr>
-        <w:t xml:space="preserve"> -l 512 </w:t>
-      </w:r>
-      <w:proofErr w:type="spellStart"/>
+      </w:pPr>
       <w:r>
         <w:rPr>
           <w:b/>
           <w:bCs/>
         </w:rPr>
-        <w:t>floppy.img</w:t>
-      </w:r>
-      <w:proofErr w:type="spellEnd"/>
-    </w:p>
-    <w:p/>
-    <w:p>
-      <w:r>
-        <w:t>To debug the fat32 injecting tool. Delete the old image and create a new one:</w:t>
-      </w:r>
-    </w:p>
-    <w:p/>
-    <w:p>
-      <w:pPr>
+        <w:t>rm  ~/</w:t>
+      </w:r>
+      <w:proofErr w:type="spellStart"/>
+      <w:r>
         <w:rPr>
           <w:b/>
           <w:bCs/>
         </w:rPr>
-      </w:pPr>
-      <w:proofErr w:type="gramStart"/>
+        <w:t>codebox</w:t>
+      </w:r>
+      <w:proofErr w:type="spellEnd"/>
       <w:r>
         <w:rPr>
           <w:b/>
           <w:bCs/>
         </w:rPr>
-        <w:t>rm  ~</w:t>
-      </w:r>
-      <w:proofErr w:type="gramEnd"/>
+        <w:t>/</w:t>
+      </w:r>
+      <w:proofErr w:type="spellStart"/>
       <w:r>
         <w:rPr>
           <w:b/>
           <w:bCs/>
         </w:rPr>
-        <w:t>/</w:t>
-      </w:r>
-      <w:proofErr w:type="spellStart"/>
+        <w:t>tempimage.img</w:t>
+      </w:r>
+      <w:proofErr w:type="spellEnd"/>
       <w:r>
         <w:rPr>
           <w:b/>
           <w:bCs/>
         </w:rPr>
-        <w:t>codebox</w:t>
-      </w:r>
-      <w:proofErr w:type="spellEnd"/>
+        <w:t xml:space="preserve"> &amp;&amp; ./emptydisk01 --size-mb 34 --out ~/</w:t>
+      </w:r>
+      <w:proofErr w:type="spellStart"/>
       <w:r>
         <w:rPr>
           <w:b/>
           <w:bCs/>
         </w:rPr>
-        <w:t>/</w:t>
-      </w:r>
-      <w:proofErr w:type="spellStart"/>
+        <w:t>codebox</w:t>
+      </w:r>
+      <w:proofErr w:type="spellEnd"/>
       <w:r>
         <w:rPr>
           <w:b/>
           <w:bCs/>
         </w:rPr>
-        <w:t>tempimage.img</w:t>
-      </w:r>
-      <w:proofErr w:type="spellEnd"/>
+        <w:t>/</w:t>
+      </w:r>
+      <w:proofErr w:type="spellStart"/>
       <w:r>
         <w:rPr>
           <w:b/>
           <w:bCs/>
         </w:rPr>
-        <w:t xml:space="preserve"> &amp;</w:t>
-      </w:r>
-      <w:proofErr w:type="gramStart"/>
-      <w:r>
+        <w:t>tempimage.img</w:t>
+      </w:r>
+      <w:proofErr w:type="spellEnd"/>
+    </w:p>
+    <w:p>
+      <w:pPr>
         <w:rPr>
           <w:b/>
           <w:bCs/>
         </w:rPr>
-        <w:t>&amp; .</w:t>
-      </w:r>
-      <w:proofErr w:type="gramEnd"/>
+      </w:pPr>
       <w:r>
         <w:rPr>
           <w:b/>
           <w:bCs/>
         </w:rPr>
-        <w:t>/emptydisk01 --size-mb 34 --out ~/</w:t>
+        <w:t>rm ../../../</w:t>
       </w:r>
       <w:proofErr w:type="spellStart"/>
       <w:r>
@@ -14184,7 +14447,7 @@
           <w:b/>
           <w:bCs/>
         </w:rPr>
-        <w:t>codebox</w:t>
+        <w:t>tempimage.img</w:t>
       </w:r>
       <w:proofErr w:type="spellEnd"/>
       <w:r>
@@ -14192,7 +14455,7 @@
           <w:b/>
           <w:bCs/>
         </w:rPr>
-        <w:t>/</w:t>
+        <w:t xml:space="preserve"> &amp;&amp; ./emptydisk01 --size-mb 34 --out ../../../</w:t>
       </w:r>
       <w:proofErr w:type="spellStart"/>
       <w:r>
@@ -14204,106 +14467,34 @@
       </w:r>
       <w:proofErr w:type="spellEnd"/>
     </w:p>
-    <w:p>
-      <w:pPr>
-        <w:rPr>
-          <w:b/>
-          <w:bCs/>
-        </w:rPr>
-      </w:pPr>
-      <w:r>
-        <w:rPr>
-          <w:b/>
-          <w:bCs/>
-        </w:rPr>
-        <w:t>rm ../../../</w:t>
+    <w:p/>
+    <w:p>
+      <w:pPr>
+        <w:pStyle w:val="Heading2"/>
+      </w:pPr>
+      <w:bookmarkStart w:id="21" w:name="_Toc213355646"/>
+      <w:r>
+        <w:t>Windows PowerShell</w:t>
+      </w:r>
+      <w:bookmarkEnd w:id="21"/>
+    </w:p>
+    <w:p/>
+    <w:p>
+      <w:r>
+        <w:t xml:space="preserve">Run </w:t>
       </w:r>
       <w:proofErr w:type="spellStart"/>
       <w:r>
-        <w:rPr>
-          <w:b/>
-          <w:bCs/>
-        </w:rPr>
-        <w:t>tempimage.img</w:t>
+        <w:t>qemu</w:t>
       </w:r>
       <w:proofErr w:type="spellEnd"/>
       <w:r>
-        <w:rPr>
-          <w:b/>
-          <w:bCs/>
-        </w:rPr>
-        <w:t xml:space="preserve"> &amp;</w:t>
-      </w:r>
-      <w:proofErr w:type="gramStart"/>
-      <w:r>
-        <w:rPr>
-          <w:b/>
-          <w:bCs/>
-        </w:rPr>
-        <w:t>&amp; .</w:t>
-      </w:r>
-      <w:proofErr w:type="gramEnd"/>
-      <w:r>
-        <w:rPr>
-          <w:b/>
-          <w:bCs/>
-        </w:rPr>
-        <w:t>/emptydisk01 --size-mb 34 --out ../../../</w:t>
-      </w:r>
-      <w:proofErr w:type="spellStart"/>
-      <w:r>
-        <w:rPr>
-          <w:b/>
-          <w:bCs/>
-        </w:rPr>
-        <w:t>tempimage.img</w:t>
-      </w:r>
-      <w:proofErr w:type="spellEnd"/>
-    </w:p>
-    <w:p/>
-    <w:p>
-      <w:pPr>
-        <w:pStyle w:val="Heading2"/>
-      </w:pPr>
-      <w:bookmarkStart w:id="21" w:name="_Toc213355646"/>
-      <w:r>
-        <w:t>Windows PowerShell</w:t>
-      </w:r>
-      <w:bookmarkEnd w:id="21"/>
-    </w:p>
-    <w:p/>
-    <w:p>
-      <w:r>
-        <w:t xml:space="preserve">Run </w:t>
-      </w:r>
-      <w:proofErr w:type="spellStart"/>
-      <w:r>
-        <w:t>qemu</w:t>
-      </w:r>
-      <w:proofErr w:type="spellEnd"/>
-      <w:r>
         <w:t xml:space="preserve"> with the bootloader bin</w:t>
       </w:r>
     </w:p>
     <w:p>
       <w:r>
-        <w:t>qemu-system-i386 -drive format=</w:t>
-      </w:r>
-      <w:proofErr w:type="gramStart"/>
-      <w:r>
-        <w:t>raw,file</w:t>
-      </w:r>
-      <w:proofErr w:type="gramEnd"/>
-      <w:r>
-        <w:t>=</w:t>
-      </w:r>
-      <w:proofErr w:type="gramStart"/>
-      <w:r>
-        <w:t>C:\Users\mihe\Dropbox\TusMuertOS-Oct2025\src\build\stage1.bin,if</w:t>
-      </w:r>
-      <w:proofErr w:type="gramEnd"/>
-      <w:r>
-        <w:t>=floppy</w:t>
+        <w:t>qemu-system-i386 -drive format=raw,file=C:\Users\mihe\Dropbox\TusMuertOS-Oct2025\src\build\stage1.bin,if=floppy</w:t>
       </w:r>
     </w:p>
     <w:p/>
@@ -14371,13 +14562,8 @@
     <w:p>
       <w:r>
         <w:tab/>
-        <w:t xml:space="preserve">-q: don’t show the configuration screen before </w:t>
-      </w:r>
-      <w:proofErr w:type="gramStart"/>
-      <w:r>
-        <w:t>start</w:t>
-      </w:r>
-      <w:proofErr w:type="gramEnd"/>
+        <w:t>-q: don’t show the configuration screen before start</w:t>
+      </w:r>
     </w:p>
     <w:p>
       <w:r>
@@ -14406,13 +14592,8 @@
     <w:p/>
     <w:p>
       <w:r>
-        <w:t xml:space="preserve">NEXT </w:t>
-      </w:r>
-      <w:proofErr w:type="gramStart"/>
-      <w:r>
-        <w:t>DAY !!!!!!!!!!!!!!!!!!!!!!!!!!!!!!!!!!!!!!</w:t>
-      </w:r>
-      <w:proofErr w:type="gramEnd"/>
+        <w:t>NEXT DAY !!!!!!!!!!!!!!!!!!!!!!!!!!!!!!!!!!!!!!</w:t>
+      </w:r>
     </w:p>
     <w:p>
       <w:proofErr w:type="spellStart"/>
@@ -14494,15 +14675,7 @@
         </w:pBdr>
       </w:pPr>
       <w:r>
-        <w:t xml:space="preserve">    mov ax, start    </w:t>
-      </w:r>
-      <w:proofErr w:type="gramStart"/>
-      <w:r>
-        <w:t xml:space="preserve">  ;</w:t>
-      </w:r>
-      <w:proofErr w:type="gramEnd"/>
-      <w:r>
-        <w:t xml:space="preserve"> imm16 encodes the absolute offset of “start”</w:t>
+        <w:t xml:space="preserve">    mov ax, start      ; imm16 encodes the absolute offset of “start”</w:t>
       </w:r>
     </w:p>
     <w:p>
@@ -14551,15 +14724,7 @@
     <w:p/>
     <w:p>
       <w:r>
-        <w:t xml:space="preserve">No solution </w:t>
-      </w:r>
-      <w:proofErr w:type="gramStart"/>
-      <w:r>
-        <w:t>found</w:t>
-      </w:r>
-      <w:proofErr w:type="gramEnd"/>
-      <w:r>
-        <w:t xml:space="preserve"> yet. Tried to add to </w:t>
+        <w:t xml:space="preserve">No solution found yet. Tried to add to </w:t>
       </w:r>
       <w:proofErr w:type="spellStart"/>
       <w:r>
@@ -14768,12 +14933,10 @@
         <w:t>-</w:t>
       </w:r>
       <w:proofErr w:type="spellStart"/>
-      <w:proofErr w:type="gramStart"/>
       <w:r>
         <w:t>fno</w:t>
       </w:r>
       <w:proofErr w:type="spellEnd"/>
-      <w:proofErr w:type="gramEnd"/>
       <w:r>
         <w:t>-omit-frame-pointer</w:t>
       </w:r>
@@ -14781,15 +14944,7 @@
     <w:p>
       <w:r>
         <w:lastRenderedPageBreak/>
-        <w:t xml:space="preserve">Example of a prologue where a parameter coming on RDI is just saved on RBP. It may help performance, but it is difficult to </w:t>
-      </w:r>
-      <w:proofErr w:type="gramStart"/>
-      <w:r>
-        <w:t>reason about</w:t>
-      </w:r>
-      <w:proofErr w:type="gramEnd"/>
-      <w:r>
-        <w:t xml:space="preserve"> while reading the disassembled code.</w:t>
+        <w:t>Example of a prologue where a parameter coming on RDI is just saved on RBP. It may help performance, but it is difficult to reason about while reading the disassembled code.</w:t>
       </w:r>
     </w:p>
     <w:p>
@@ -14997,6 +15152,18 @@
       <w:pPr>
         <w:pStyle w:val="ListParagraph"/>
         <w:numPr>
+          <w:ilvl w:val="0"/>
+          <w:numId w:val="1"/>
+        </w:numPr>
+      </w:pPr>
+      <w:r>
+        <w:t>dd if=/dev/zero of=hd34mbfat32.img bs=1M count=34</w:t>
+      </w:r>
+    </w:p>
+    <w:p>
+      <w:pPr>
+        <w:pStyle w:val="ListParagraph"/>
+        <w:numPr>
           <w:ilvl w:val="1"/>
           <w:numId w:val="1"/>
         </w:numPr>
@@ -15035,9 +15202,31 @@
         <w:t>msdos</w:t>
       </w:r>
       <w:proofErr w:type="spellEnd"/>
-      <w:r>
-        <w:tab/>
-      </w:r>
+    </w:p>
+    <w:p>
+      <w:pPr>
+        <w:pStyle w:val="ListParagraph"/>
+        <w:numPr>
+          <w:ilvl w:val="0"/>
+          <w:numId w:val="1"/>
+        </w:numPr>
+      </w:pPr>
+      <w:r>
+        <w:t xml:space="preserve">sudo parted hd34mbfat32.img </w:t>
+      </w:r>
+      <w:proofErr w:type="spellStart"/>
+      <w:r>
+        <w:t>mklabel</w:t>
+      </w:r>
+      <w:proofErr w:type="spellEnd"/>
+      <w:r>
+        <w:t xml:space="preserve"> </w:t>
+      </w:r>
+      <w:proofErr w:type="spellStart"/>
+      <w:r>
+        <w:t>msdos</w:t>
+      </w:r>
+      <w:proofErr w:type="spellEnd"/>
     </w:p>
     <w:p>
       <w:pPr>
@@ -15048,15 +15237,7 @@
         </w:numPr>
       </w:pPr>
       <w:r>
-        <w:t xml:space="preserve">There </w:t>
-      </w:r>
-      <w:proofErr w:type="gramStart"/>
-      <w:r>
-        <w:t>are</w:t>
-      </w:r>
-      <w:proofErr w:type="gramEnd"/>
-      <w:r>
-        <w:t xml:space="preserve"> only a valid list of </w:t>
+        <w:t xml:space="preserve">There are only a valid list of </w:t>
       </w:r>
       <w:proofErr w:type="spellStart"/>
       <w:r>
@@ -15270,6 +15451,9 @@
         </w:numPr>
       </w:pPr>
       <w:r>
+        <w:rPr>
+          <w:noProof/>
+        </w:rPr>
         <w:lastRenderedPageBreak/>
         <w:drawing>
           <wp:inline distT="0" distB="0" distL="0" distR="0" wp14:anchorId="77FB95D4" wp14:editId="3B3CAE3C">
@@ -15360,6 +15544,32 @@
       <w:pPr>
         <w:pStyle w:val="ListParagraph"/>
         <w:numPr>
+          <w:ilvl w:val="1"/>
+          <w:numId w:val="1"/>
+        </w:numPr>
+      </w:pPr>
+      <w:r>
+        <w:t xml:space="preserve">sudo parted </w:t>
+      </w:r>
+      <w:r>
+        <w:t>hd34mbfat32.img</w:t>
+      </w:r>
+      <w:r>
+        <w:t xml:space="preserve"> --script </w:t>
+      </w:r>
+      <w:proofErr w:type="spellStart"/>
+      <w:r>
+        <w:t>mkpart</w:t>
+      </w:r>
+      <w:proofErr w:type="spellEnd"/>
+      <w:r>
+        <w:t xml:space="preserve"> primary fat32 1MiB 100%</w:t>
+      </w:r>
+    </w:p>
+    <w:p>
+      <w:pPr>
+        <w:pStyle w:val="ListParagraph"/>
+        <w:numPr>
           <w:ilvl w:val="2"/>
           <w:numId w:val="1"/>
         </w:numPr>
@@ -15430,10 +15640,43 @@
         </w:numPr>
       </w:pPr>
       <w:r>
+        <w:t>S</w:t>
+      </w:r>
+      <w:r>
+        <w:t>udo</w:t>
+      </w:r>
+      <w:r>
+        <w:t xml:space="preserve"> </w:t>
+      </w:r>
+      <w:r>
         <w:t>parted disk16mb.img unit B print</w:t>
       </w:r>
       <w:r>
-        <w:t xml:space="preserve"> (Note there is not actual file system. Partition is there but no file system)</w:t>
+        <w:t xml:space="preserve"> </w:t>
+      </w:r>
+    </w:p>
+    <w:p>
+      <w:pPr>
+        <w:pStyle w:val="ListParagraph"/>
+        <w:numPr>
+          <w:ilvl w:val="1"/>
+          <w:numId w:val="1"/>
+        </w:numPr>
+      </w:pPr>
+      <w:r>
+        <w:t xml:space="preserve">sudo parted hd34mbfat32.img unit B print </w:t>
+      </w:r>
+    </w:p>
+    <w:p>
+      <w:pPr>
+        <w:pStyle w:val="ListParagraph"/>
+        <w:numPr>
+          <w:ilvl w:val="1"/>
+          <w:numId w:val="1"/>
+        </w:numPr>
+      </w:pPr>
+      <w:r>
+        <w:t>(Note there is not actual file system. Partition is there but no file system)</w:t>
       </w:r>
     </w:p>
     <w:p>
@@ -15507,15 +15750,7 @@
       </w:r>
       <w:proofErr w:type="spellEnd"/>
       <w:r>
-        <w:t xml:space="preserve"> hd16mbfat32.img@@1048576 -</w:t>
-      </w:r>
-      <w:proofErr w:type="gramStart"/>
-      <w:r>
-        <w:t>F :</w:t>
-      </w:r>
-      <w:proofErr w:type="gramEnd"/>
-      <w:r>
-        <w:t>:</w:t>
+        <w:t xml:space="preserve"> hd16mbfat32.img@@1048576 -F ::</w:t>
       </w:r>
     </w:p>
     <w:p>
@@ -15538,13 +15773,8 @@
           <w:numId w:val="1"/>
         </w:numPr>
       </w:pPr>
-      <w:proofErr w:type="gramStart"/>
-      <w:r>
-        <w:t>@@Start</w:t>
-      </w:r>
-      <w:proofErr w:type="gramEnd"/>
-      <w:r>
-        <w:t xml:space="preserve"> (from the parted output)</w:t>
+      <w:r>
+        <w:t>@@Start (from the parted output)</w:t>
       </w:r>
     </w:p>
     <w:p>
@@ -15567,13 +15797,8 @@
           <w:numId w:val="1"/>
         </w:numPr>
       </w:pPr>
-      <w:proofErr w:type="gramStart"/>
-      <w:r>
-        <w:t>::</w:t>
-      </w:r>
-      <w:proofErr w:type="gramEnd"/>
-      <w:r>
-        <w:t xml:space="preserve"> Root directory of the image</w:t>
+      <w:r>
+        <w:t>:: Root directory of the image</w:t>
       </w:r>
     </w:p>
     <w:p>
@@ -15774,114 +15999,85 @@
       </w:r>
       <w:proofErr w:type="spellEnd"/>
       <w:r>
+        <w:t xml:space="preserve"> disk16mb.img@@1048576 myfile.txt ::</w:t>
+      </w:r>
+    </w:p>
+    <w:p>
+      <w:pPr>
+        <w:pStyle w:val="ListParagraph"/>
+        <w:numPr>
+          <w:ilvl w:val="2"/>
+          <w:numId w:val="1"/>
+        </w:numPr>
+      </w:pPr>
+      <w:r>
+        <w:t>mmd -</w:t>
+      </w:r>
+      <w:proofErr w:type="spellStart"/>
+      <w:r>
+        <w:t>i</w:t>
+      </w:r>
+      <w:proofErr w:type="spellEnd"/>
+      <w:r>
+        <w:t xml:space="preserve"> disk16mb.img@@1048576 ::/boot</w:t>
+      </w:r>
+    </w:p>
+    <w:p>
+      <w:pPr>
+        <w:pStyle w:val="ListParagraph"/>
+        <w:numPr>
+          <w:ilvl w:val="2"/>
+          <w:numId w:val="1"/>
+        </w:numPr>
+      </w:pPr>
+      <w:proofErr w:type="spellStart"/>
+      <w:r>
+        <w:t>mcopy</w:t>
+      </w:r>
+      <w:proofErr w:type="spellEnd"/>
+      <w:r>
+        <w:t xml:space="preserve"> -</w:t>
+      </w:r>
+      <w:proofErr w:type="spellStart"/>
+      <w:r>
+        <w:t>i</w:t>
+      </w:r>
+      <w:proofErr w:type="spellEnd"/>
+      <w:r>
         <w:t xml:space="preserve"> disk16mb.img@@1048576 </w:t>
       </w:r>
-      <w:proofErr w:type="gramStart"/>
-      <w:r>
-        <w:t>myfile.txt :</w:t>
-      </w:r>
-      <w:proofErr w:type="gramEnd"/>
-      <w:r>
-        <w:t>:</w:t>
-      </w:r>
-    </w:p>
-    <w:p>
-      <w:pPr>
-        <w:pStyle w:val="ListParagraph"/>
-        <w:numPr>
-          <w:ilvl w:val="2"/>
-          <w:numId w:val="1"/>
-        </w:numPr>
-      </w:pPr>
-      <w:r>
-        <w:t>mmd -</w:t>
-      </w:r>
       <w:proofErr w:type="spellStart"/>
       <w:r>
+        <w:t>kernel.bin</w:t>
+      </w:r>
+      <w:proofErr w:type="spellEnd"/>
+      <w:r>
+        <w:t xml:space="preserve"> ::/boot</w:t>
+      </w:r>
+    </w:p>
+    <w:p>
+      <w:pPr>
+        <w:pStyle w:val="ListParagraph"/>
+        <w:numPr>
+          <w:ilvl w:val="1"/>
+          <w:numId w:val="1"/>
+        </w:numPr>
+      </w:pPr>
+      <w:proofErr w:type="spellStart"/>
+      <w:r>
+        <w:t>mdir</w:t>
+      </w:r>
+      <w:proofErr w:type="spellEnd"/>
+      <w:r>
+        <w:t xml:space="preserve"> -</w:t>
+      </w:r>
+      <w:proofErr w:type="spellStart"/>
+      <w:r>
         <w:t>i</w:t>
       </w:r>
       <w:proofErr w:type="spellEnd"/>
       <w:r>
-        <w:t xml:space="preserve"> disk16mb.img@@</w:t>
-      </w:r>
-      <w:proofErr w:type="gramStart"/>
-      <w:r>
-        <w:t>1048576 :</w:t>
-      </w:r>
-      <w:proofErr w:type="gramEnd"/>
-      <w:r>
-        <w:t>:/boot</w:t>
-      </w:r>
-    </w:p>
-    <w:p>
-      <w:pPr>
-        <w:pStyle w:val="ListParagraph"/>
-        <w:numPr>
-          <w:ilvl w:val="2"/>
-          <w:numId w:val="1"/>
-        </w:numPr>
-      </w:pPr>
-      <w:proofErr w:type="spellStart"/>
-      <w:r>
-        <w:t>mcopy</w:t>
-      </w:r>
-      <w:proofErr w:type="spellEnd"/>
-      <w:r>
-        <w:t xml:space="preserve"> -</w:t>
-      </w:r>
-      <w:proofErr w:type="spellStart"/>
-      <w:r>
-        <w:t>i</w:t>
-      </w:r>
-      <w:proofErr w:type="spellEnd"/>
-      <w:r>
-        <w:t xml:space="preserve"> disk16mb.img@@1048576 </w:t>
-      </w:r>
-      <w:proofErr w:type="spellStart"/>
-      <w:proofErr w:type="gramStart"/>
-      <w:r>
-        <w:t>kernel.bin</w:t>
-      </w:r>
-      <w:proofErr w:type="spellEnd"/>
-      <w:r>
-        <w:t xml:space="preserve"> :</w:t>
-      </w:r>
-      <w:proofErr w:type="gramEnd"/>
-      <w:r>
-        <w:t>:/boot</w:t>
-      </w:r>
-    </w:p>
-    <w:p>
-      <w:pPr>
-        <w:pStyle w:val="ListParagraph"/>
-        <w:numPr>
-          <w:ilvl w:val="1"/>
-          <w:numId w:val="1"/>
-        </w:numPr>
-      </w:pPr>
-      <w:proofErr w:type="spellStart"/>
-      <w:r>
-        <w:t>mdir</w:t>
-      </w:r>
-      <w:proofErr w:type="spellEnd"/>
-      <w:r>
-        <w:t xml:space="preserve"> -</w:t>
-      </w:r>
-      <w:proofErr w:type="spellStart"/>
-      <w:r>
-        <w:t>i</w:t>
-      </w:r>
-      <w:proofErr w:type="spellEnd"/>
-      <w:r>
-        <w:t xml:space="preserve"> hd16mbfat32.img@@</w:t>
-      </w:r>
-      <w:proofErr w:type="gramStart"/>
-      <w:r>
-        <w:t>1048576 :</w:t>
-      </w:r>
-      <w:proofErr w:type="gramEnd"/>
-      <w:r>
-        <w:t>:</w:t>
+        <w:t xml:space="preserve"> hd16mbfat32.img@@1048576 ::</w:t>
       </w:r>
     </w:p>
     <w:p>
@@ -16237,6 +16433,9 @@
     </w:p>
     <w:p>
       <w:r>
+        <w:rPr>
+          <w:noProof/>
+        </w:rPr>
         <w:drawing>
           <wp:inline distT="0" distB="0" distL="0" distR="0" wp14:anchorId="5AC70F25" wp14:editId="3747B13A">
             <wp:extent cx="2273417" cy="2315629"/>
@@ -16367,21 +16566,7 @@
           <w:b/>
           <w:bCs/>
         </w:rPr>
-        <w:t>00</w:t>
-      </w:r>
-      <w:r>
-        <w:rPr>
-          <w:b/>
-          <w:bCs/>
-        </w:rPr>
-        <w:t xml:space="preserve"> </w:t>
-      </w:r>
-      <w:r>
-        <w:rPr>
-          <w:b/>
-          <w:bCs/>
-        </w:rPr>
-        <w:t>| Starting CHS</w:t>
+        <w:t>00 | Starting CHS</w:t>
       </w:r>
     </w:p>
     <w:p>
@@ -16538,11 +16723,7 @@
         </w:rPr>
       </w:pPr>
       <w:r>
-        <w:t xml:space="preserve">CYLINDER </w:t>
-      </w:r>
-      <w:proofErr w:type="gramStart"/>
-      <w:r>
-        <w:t>=</w:t>
+        <w:t>CYLINDER =</w:t>
       </w:r>
       <w:r>
         <w:rPr>
@@ -16554,19 +16735,36 @@
         <w:rPr>
           <w:color w:val="00B0F0"/>
         </w:rPr>
-        <w:t>00</w:t>
-      </w:r>
-      <w:proofErr w:type="gramEnd"/>
+        <w:t>00 0000 0000</w:t>
+      </w:r>
       <w:r>
         <w:rPr>
           <w:color w:val="00B0F0"/>
         </w:rPr>
-        <w:t xml:space="preserve"> 0000 0000</w:t>
+        <w:t xml:space="preserve"> </w:t>
       </w:r>
       <w:r>
         <w:rPr>
           <w:color w:val="00B0F0"/>
         </w:rPr>
+        <w:t xml:space="preserve">= </w:t>
+      </w:r>
+      <w:r>
+        <w:rPr>
+          <w:color w:val="00B0F0"/>
+        </w:rPr>
+        <w:t xml:space="preserve">    </w:t>
+      </w:r>
+      <w:r>
+        <w:rPr>
+          <w:color w:val="00B0F0"/>
+        </w:rPr>
+        <w:t xml:space="preserve"> 0x00</w:t>
+      </w:r>
+      <w:r>
+        <w:rPr>
+          <w:color w:val="00B0F0"/>
+        </w:rPr>
         <w:t xml:space="preserve"> </w:t>
       </w:r>
       <w:r>
@@ -16579,40 +16777,14 @@
         <w:rPr>
           <w:color w:val="00B0F0"/>
         </w:rPr>
-        <w:t xml:space="preserve">    </w:t>
+        <w:t xml:space="preserve"> </w:t>
       </w:r>
       <w:r>
         <w:rPr>
           <w:color w:val="00B0F0"/>
         </w:rPr>
-        <w:t xml:space="preserve"> 0x00</w:t>
-      </w:r>
-      <w:r>
-        <w:rPr>
-          <w:color w:val="00B0F0"/>
-        </w:rPr>
-        <w:t xml:space="preserve"> </w:t>
-      </w:r>
-      <w:proofErr w:type="gramStart"/>
-      <w:r>
-        <w:rPr>
-          <w:color w:val="00B0F0"/>
-        </w:rPr>
-        <w:t xml:space="preserve">= </w:t>
-      </w:r>
-      <w:r>
-        <w:rPr>
-          <w:color w:val="00B0F0"/>
-        </w:rPr>
-        <w:t xml:space="preserve"> </w:t>
-      </w:r>
-      <w:r>
-        <w:rPr>
-          <w:color w:val="00B0F0"/>
-        </w:rPr>
         <w:t>0</w:t>
       </w:r>
-      <w:proofErr w:type="gramEnd"/>
     </w:p>
     <w:p>
       <w:pPr>
@@ -16695,52 +16867,127 @@
       </w:r>
     </w:p>
     <w:p>
-      <w:r>
+      <w:pPr>
+        <w:rPr>
+          <w:lang w:val="es-ES"/>
+        </w:rPr>
+      </w:pPr>
+      <w:r>
+        <w:rPr>
+          <w:lang w:val="es-ES"/>
+        </w:rPr>
         <w:t>LBA = (</w:t>
       </w:r>
       <w:r>
         <w:rPr>
           <w:color w:val="00B0F0"/>
+          <w:lang w:val="es-ES"/>
         </w:rPr>
         <w:t>0</w:t>
       </w:r>
       <w:r>
+        <w:rPr>
+          <w:lang w:val="es-ES"/>
+        </w:rPr>
         <w:t xml:space="preserve"> * 255 + </w:t>
       </w:r>
       <w:r>
         <w:rPr>
           <w:color w:val="EE0000"/>
+          <w:lang w:val="es-ES"/>
         </w:rPr>
         <w:t>32</w:t>
       </w:r>
       <w:r>
+        <w:rPr>
+          <w:lang w:val="es-ES"/>
+        </w:rPr>
         <w:t>) * 63 + (</w:t>
       </w:r>
       <w:r>
         <w:rPr>
           <w:color w:val="00B050"/>
+          <w:lang w:val="es-ES"/>
         </w:rPr>
         <w:t>33</w:t>
       </w:r>
       <w:r>
+        <w:rPr>
+          <w:lang w:val="es-ES"/>
+        </w:rPr>
         <w:t xml:space="preserve"> – 1)</w:t>
       </w:r>
     </w:p>
     <w:p>
-      <w:r>
+      <w:pPr>
+        <w:rPr>
+          <w:lang w:val="es-ES"/>
+        </w:rPr>
+      </w:pPr>
+      <w:r>
+        <w:rPr>
+          <w:lang w:val="es-ES"/>
+        </w:rPr>
         <w:t>LBA = (32) * 63 + (32)</w:t>
       </w:r>
     </w:p>
     <w:p>
-      <w:r>
+      <w:pPr>
+        <w:rPr>
+          <w:lang w:val="es-ES"/>
+        </w:rPr>
+      </w:pPr>
+      <w:r>
+        <w:rPr>
+          <w:lang w:val="es-ES"/>
+        </w:rPr>
         <w:t>LBA = 2016 + 32</w:t>
       </w:r>
     </w:p>
     <w:p>
-      <w:r>
-        <w:t>LBA = 2048 (Chef’s kiss!)</w:t>
-      </w:r>
-      <w:r>
+      <w:pPr>
+        <w:rPr>
+          <w:lang w:val="es-ES"/>
+        </w:rPr>
+      </w:pPr>
+      <w:r>
+        <w:rPr>
+          <w:lang w:val="es-ES"/>
+        </w:rPr>
+        <w:t>LBA = 2048 (</w:t>
+      </w:r>
+      <w:proofErr w:type="spellStart"/>
+      <w:r>
+        <w:rPr>
+          <w:lang w:val="es-ES"/>
+        </w:rPr>
+        <w:t>Chef’s</w:t>
+      </w:r>
+      <w:proofErr w:type="spellEnd"/>
+      <w:r>
+        <w:rPr>
+          <w:lang w:val="es-ES"/>
+        </w:rPr>
+        <w:t xml:space="preserve"> </w:t>
+      </w:r>
+      <w:proofErr w:type="spellStart"/>
+      <w:r>
+        <w:rPr>
+          <w:lang w:val="es-ES"/>
+        </w:rPr>
+        <w:t>kiss</w:t>
+      </w:r>
+      <w:proofErr w:type="spellEnd"/>
+      <w:r>
+        <w:rPr>
+          <w:lang w:val="es-ES"/>
+        </w:rPr>
+        <w:t>!)</w:t>
+      </w:r>
+      <w:r>
+        <w:rPr>
+          <w:lang w:val="es-ES"/>
+        </w:rPr>
         <w:t xml:space="preserve"> </w:t>
       </w:r>
     </w:p>
@@ -16784,66 +17031,35 @@
           <w:b/>
           <w:bCs/>
         </w:rPr>
-        <w:t>0x</w:t>
-      </w:r>
+        <w:t xml:space="preserve">0xFE 0xFF </w:t>
+      </w:r>
+      <w:proofErr w:type="spellStart"/>
       <w:r>
         <w:rPr>
           <w:b/>
           <w:bCs/>
         </w:rPr>
-        <w:t xml:space="preserve">FE </w:t>
-      </w:r>
+        <w:t>0xFF</w:t>
+      </w:r>
+      <w:proofErr w:type="spellEnd"/>
       <w:r>
         <w:rPr>
           <w:b/>
           <w:bCs/>
         </w:rPr>
-        <w:t>0x</w:t>
+        <w:t xml:space="preserve"> | Ending CHS</w:t>
       </w:r>
       <w:r>
         <w:rPr>
           <w:b/>
           <w:bCs/>
         </w:rPr>
-        <w:t xml:space="preserve">FF </w:t>
-      </w:r>
-      <w:proofErr w:type="spellStart"/>
-      <w:r>
-        <w:rPr>
-          <w:b/>
-          <w:bCs/>
-        </w:rPr>
-        <w:t>0x</w:t>
-      </w:r>
-      <w:r>
-        <w:rPr>
-          <w:b/>
-          <w:bCs/>
-        </w:rPr>
-        <w:t>FF</w:t>
-      </w:r>
-      <w:proofErr w:type="spellEnd"/>
-      <w:r>
-        <w:rPr>
-          <w:b/>
-          <w:bCs/>
-        </w:rPr>
-        <w:t xml:space="preserve"> | Ending CHS</w:t>
-      </w:r>
-      <w:r>
-        <w:rPr>
-          <w:b/>
-          <w:bCs/>
-        </w:rPr>
         <w:t xml:space="preserve"> – This value is special Sentinel Value</w:t>
       </w:r>
     </w:p>
     <w:p>
       <w:r>
-        <w:t xml:space="preserve">In human words, </w:t>
-      </w:r>
-      <w:r>
-        <w:t>“This partition extends to the end of the disk; don’t trust CHS — use LBA instead.”</w:t>
+        <w:t>In human words, “This partition extends to the end of the disk; don’t trust CHS — use LBA instead.”</w:t>
       </w:r>
     </w:p>
     <w:p>
@@ -17051,11 +17267,7 @@
         </w:rPr>
       </w:pPr>
       <w:r>
-        <w:t xml:space="preserve">CYLINDER </w:t>
-      </w:r>
-      <w:proofErr w:type="gramStart"/>
-      <w:r>
-        <w:t>=</w:t>
+        <w:t>CYLINDER =</w:t>
       </w:r>
       <w:r>
         <w:rPr>
@@ -17069,7 +17281,6 @@
         </w:rPr>
         <w:t>11</w:t>
       </w:r>
-      <w:proofErr w:type="gramEnd"/>
       <w:r>
         <w:rPr>
           <w:color w:val="00B0F0"/>
@@ -17162,22 +17373,14 @@
         <w:rPr>
           <w:color w:val="00B050"/>
         </w:rPr>
-        <w:t xml:space="preserve"> </w:t>
-      </w:r>
-      <w:proofErr w:type="gramStart"/>
+        <w:t xml:space="preserve"> = </w:t>
+      </w:r>
       <w:r>
         <w:rPr>
           <w:color w:val="00B050"/>
         </w:rPr>
-        <w:t xml:space="preserve">= </w:t>
-      </w:r>
-      <w:r>
-        <w:rPr>
-          <w:color w:val="00B050"/>
-        </w:rPr>
         <w:t xml:space="preserve"> 63</w:t>
       </w:r>
-      <w:proofErr w:type="gramEnd"/>
     </w:p>
     <w:p>
       <w:pPr>
@@ -17333,16 +17536,31 @@
     </w:p>
     <w:p>
       <w:r>
+        <w:t>+</w:t>
+      </w:r>
+    </w:p>
+    <w:p>
+      <w:r>
         <w:t>Unallocated (GAP) 1,048,064 bytes</w:t>
       </w:r>
     </w:p>
     <w:p>
       <w:r>
+        <w:t>+</w:t>
+      </w:r>
+    </w:p>
+    <w:p>
+      <w:r>
         <w:t>First partition 34,603,008</w:t>
       </w:r>
     </w:p>
     <w:p>
       <w:r>
+        <w:t>=</w:t>
+      </w:r>
+    </w:p>
+    <w:p>
+      <w:r>
         <w:t xml:space="preserve">All together: </w:t>
       </w:r>
       <w:r>
@@ -17377,25 +17595,13 @@
         <w:t>0x</w:t>
       </w:r>
       <w:r>
-        <w:t xml:space="preserve">10 </w:t>
-      </w:r>
-      <w:proofErr w:type="gramStart"/>
-      <w:r>
-        <w:t xml:space="preserve">→ </w:t>
+        <w:t xml:space="preserve">10 → </w:t>
       </w:r>
       <w:r>
         <w:t xml:space="preserve"> </w:t>
       </w:r>
       <w:r>
-        <w:t>C</w:t>
-      </w:r>
-      <w:proofErr w:type="gramEnd"/>
-      <w:r>
-        <w:t>16 / H</w:t>
-      </w:r>
-      <w:proofErr w:type="gramStart"/>
-      <w:r>
-        <w:t xml:space="preserve">0 </w:t>
+        <w:t xml:space="preserve">C16 / H0 </w:t>
       </w:r>
       <w:r>
         <w:t xml:space="preserve"> </w:t>
@@ -17403,7 +17609,6 @@
       <w:r>
         <w:t>/</w:t>
       </w:r>
-      <w:proofErr w:type="gramEnd"/>
       <w:r>
         <w:t xml:space="preserve"> </w:t>
       </w:r>
@@ -17434,11 +17639,7 @@
         <w:t>0x</w:t>
       </w:r>
       <w:r>
-        <w:t>1F → C543 / H</w:t>
-      </w:r>
-      <w:proofErr w:type="gramStart"/>
-      <w:r>
-        <w:t xml:space="preserve">3 </w:t>
+        <w:t xml:space="preserve">1F → C543 / H3 </w:t>
       </w:r>
       <w:r>
         <w:t xml:space="preserve"> </w:t>
@@ -17446,7 +17647,6 @@
       <w:r>
         <w:t>/</w:t>
       </w:r>
-      <w:proofErr w:type="gramEnd"/>
       <w:r>
         <w:t xml:space="preserve"> </w:t>
       </w:r>
@@ -17510,21 +17710,8 @@
         </w:numPr>
       </w:pPr>
       <w:r>
-        <w:t>“</w:t>
-      </w:r>
-      <w:proofErr w:type="gramStart"/>
-      <w:r>
-        <w:t>cd</w:t>
-      </w:r>
-      <w:proofErr w:type="gramEnd"/>
-      <w:r>
-        <w:t xml:space="preserve"> </w:t>
-      </w:r>
-      <w:proofErr w:type="gramStart"/>
-      <w:r>
-        <w:t>–“</w:t>
-      </w:r>
-      <w:proofErr w:type="gramEnd"/>
+        <w:t>“cd –“</w:t>
+      </w:r>
     </w:p>
     <w:p>
       <w:pPr>
@@ -17653,15 +17840,7 @@
         </w:numPr>
       </w:pPr>
       <w:r>
-        <w:t>Partition table on the MBR. I remember seeing adding 4 16</w:t>
-      </w:r>
-      <w:proofErr w:type="gramStart"/>
-      <w:r>
-        <w:t>bytes</w:t>
-      </w:r>
-      <w:proofErr w:type="gramEnd"/>
-      <w:r>
-        <w:t xml:space="preserve"> reserved structures before 0xAA55</w:t>
+        <w:t>Partition table on the MBR. I remember seeing adding 4 16bytes reserved structures before 0xAA55</w:t>
       </w:r>
     </w:p>
     <w:p>
@@ -17673,15 +17852,7 @@
         </w:numPr>
       </w:pPr>
       <w:r>
-        <w:t xml:space="preserve">I guess this applies if the MBR is for a hard </w:t>
-      </w:r>
-      <w:proofErr w:type="gramStart"/>
-      <w:r>
-        <w:t>disk, but</w:t>
-      </w:r>
-      <w:proofErr w:type="gramEnd"/>
-      <w:r>
-        <w:t xml:space="preserve"> does not apply for a floppy</w:t>
+        <w:t>I guess this applies if the MBR is for a hard disk, but does not apply for a floppy</w:t>
       </w:r>
       <w:r>
         <w:t>. This is an educated guess</w:t>
@@ -17696,15 +17867,7 @@
         </w:numPr>
       </w:pPr>
       <w:r>
-        <w:t xml:space="preserve">On floppy, the FAT info at 0 starts with a jump to code, followed by the FAT info. This way </w:t>
-      </w:r>
-      <w:proofErr w:type="gramStart"/>
-      <w:r>
-        <w:t>both,</w:t>
-      </w:r>
-      <w:proofErr w:type="gramEnd"/>
-      <w:r>
-        <w:t xml:space="preserve"> the bootloader and FAT info can coexist, because there is a jump. Validate this because I got this explained by </w:t>
+        <w:t xml:space="preserve">On floppy, the FAT info at 0 starts with a jump to code, followed by the FAT info. This way both, the bootloader and FAT info can coexist, because there is a jump. Validate this because I got this explained by </w:t>
       </w:r>
       <w:r>
         <w:t>ChatGPT. It makes a lot of sense, but still…</w:t>
@@ -17719,15 +17882,7 @@
         </w:numPr>
       </w:pPr>
       <w:r>
-        <w:t xml:space="preserve">A Disk with multiple partitions, the first byte </w:t>
-      </w:r>
-      <w:proofErr w:type="gramStart"/>
-      <w:r>
-        <w:t>define</w:t>
-      </w:r>
-      <w:proofErr w:type="gramEnd"/>
-      <w:r>
-        <w:t xml:space="preserve"> if it is bootable 0x80 = bootable.</w:t>
+        <w:t>A Disk with multiple partitions, the first byte define if it is bootable 0x80 = bootable.</w:t>
       </w:r>
       <w:r>
         <w:t xml:space="preserve"> The first byte on one of those 4 16 bytes partitions at the end of the MBR before the 0xAA55</w:t>
@@ -17742,15 +17897,7 @@
         </w:numPr>
       </w:pPr>
       <w:r>
-        <w:t xml:space="preserve">Can MBR and BPB be fused together? I found something related to a short jump at the beginning, of </w:t>
-      </w:r>
-      <w:proofErr w:type="gramStart"/>
-      <w:r>
-        <w:t>BPB ???</w:t>
-      </w:r>
-      <w:proofErr w:type="gramEnd"/>
-      <w:r>
-        <w:t xml:space="preserve"> Dive deeper into this!</w:t>
+        <w:t>Can MBR and BPB be fused together? I found something related to a short jump at the beginning, of BPB ??? Dive deeper into this!</w:t>
       </w:r>
       <w:r>
         <w:t xml:space="preserve"> I think BPB merged on MBR is for disk without partitions, such as floppy disks. </w:t>
@@ -17819,13 +17966,8 @@
       </w:r>
       <w:proofErr w:type="spellEnd"/>
       <w:r>
-        <w:t xml:space="preserve"> </w:t>
-      </w:r>
-      <w:proofErr w:type="gramStart"/>
-      <w:r>
-        <w:t>file )</w:t>
-      </w:r>
-      <w:proofErr w:type="gramEnd"/>
+        <w:t xml:space="preserve"> file )</w:t>
+      </w:r>
     </w:p>
     <w:p>
       <w:pPr>
@@ -17928,27 +18070,14 @@
       <w:r>
         <w:t xml:space="preserve">Figure </w:t>
       </w:r>
-      <w:r>
-        <w:fldChar w:fldCharType="begin"/>
-      </w:r>
-      <w:r>
-        <w:instrText xml:space="preserve"> SEQ Figure \* ARABIC </w:instrText>
-      </w:r>
-      <w:r>
-        <w:fldChar w:fldCharType="separate"/>
-      </w:r>
-      <w:r>
-        <w:rPr>
-          <w:noProof/>
-        </w:rPr>
-        <w:t>6</w:t>
-      </w:r>
-      <w:r>
-        <w:rPr>
-          <w:noProof/>
-        </w:rPr>
-        <w:fldChar w:fldCharType="end"/>
-      </w:r>
+      <w:fldSimple w:instr=" SEQ Figure \* ARABIC ">
+        <w:r>
+          <w:rPr>
+            <w:noProof/>
+          </w:rPr>
+          <w:t>6</w:t>
+        </w:r>
+      </w:fldSimple>
       <w:r>
         <w:t xml:space="preserve"> Quick and dirt bootloader with ABCD printed</w:t>
       </w:r>
@@ -18009,27 +18138,14 @@
       <w:r>
         <w:t xml:space="preserve">Figure </w:t>
       </w:r>
-      <w:r>
-        <w:fldChar w:fldCharType="begin"/>
-      </w:r>
-      <w:r>
-        <w:instrText xml:space="preserve"> SEQ Figure \* ARABIC </w:instrText>
-      </w:r>
-      <w:r>
-        <w:fldChar w:fldCharType="separate"/>
-      </w:r>
-      <w:r>
-        <w:rPr>
-          <w:noProof/>
-        </w:rPr>
-        <w:t>7</w:t>
-      </w:r>
-      <w:r>
-        <w:rPr>
-          <w:noProof/>
-        </w:rPr>
-        <w:fldChar w:fldCharType="end"/>
-      </w:r>
+      <w:fldSimple w:instr=" SEQ Figure \* ARABIC ">
+        <w:r>
+          <w:rPr>
+            <w:noProof/>
+          </w:rPr>
+          <w:t>7</w:t>
+        </w:r>
+      </w:fldSimple>
       <w:r>
         <w:t xml:space="preserve"> Early </w:t>
       </w:r>
@@ -18103,27 +18219,14 @@
       <w:r>
         <w:t xml:space="preserve">Figure </w:t>
       </w:r>
-      <w:r>
-        <w:fldChar w:fldCharType="begin"/>
-      </w:r>
-      <w:r>
-        <w:instrText xml:space="preserve"> SEQ Figure \* ARABIC </w:instrText>
-      </w:r>
-      <w:r>
-        <w:fldChar w:fldCharType="separate"/>
-      </w:r>
-      <w:r>
-        <w:rPr>
-          <w:noProof/>
-        </w:rPr>
-        <w:t>8</w:t>
-      </w:r>
-      <w:r>
-        <w:rPr>
-          <w:noProof/>
-        </w:rPr>
-        <w:fldChar w:fldCharType="end"/>
-      </w:r>
+      <w:fldSimple w:instr=" SEQ Figure \* ARABIC ">
+        <w:r>
+          <w:rPr>
+            <w:noProof/>
+          </w:rPr>
+          <w:t>8</w:t>
+        </w:r>
+      </w:fldSimple>
       <w:r>
         <w:t xml:space="preserve"> Revived my old kernel with </w:t>
       </w:r>
@@ -18205,27 +18308,14 @@
       <w:r>
         <w:t xml:space="preserve">Figure </w:t>
       </w:r>
-      <w:r>
-        <w:fldChar w:fldCharType="begin"/>
-      </w:r>
-      <w:r>
-        <w:instrText xml:space="preserve"> SEQ Figure \* ARABIC </w:instrText>
-      </w:r>
-      <w:r>
-        <w:fldChar w:fldCharType="separate"/>
-      </w:r>
-      <w:r>
-        <w:rPr>
-          <w:noProof/>
-        </w:rPr>
-        <w:t>9</w:t>
-      </w:r>
-      <w:r>
-        <w:rPr>
-          <w:noProof/>
-        </w:rPr>
-        <w:fldChar w:fldCharType="end"/>
-      </w:r>
+      <w:fldSimple w:instr=" SEQ Figure \* ARABIC ">
+        <w:r>
+          <w:rPr>
+            <w:noProof/>
+          </w:rPr>
+          <w:t>9</w:t>
+        </w:r>
+      </w:fldSimple>
       <w:r>
         <w:t xml:space="preserve"> First steps FAT32 imaging tool</w:t>
       </w:r>
@@ -18291,27 +18381,14 @@
       <w:r>
         <w:t xml:space="preserve">Figure </w:t>
       </w:r>
-      <w:r>
-        <w:fldChar w:fldCharType="begin"/>
-      </w:r>
-      <w:r>
-        <w:instrText xml:space="preserve"> SEQ Figure \* ARABIC </w:instrText>
-      </w:r>
-      <w:r>
-        <w:fldChar w:fldCharType="separate"/>
-      </w:r>
-      <w:r>
-        <w:rPr>
-          <w:noProof/>
-        </w:rPr>
-        <w:t>10</w:t>
-      </w:r>
-      <w:r>
-        <w:rPr>
-          <w:noProof/>
-        </w:rPr>
-        <w:fldChar w:fldCharType="end"/>
-      </w:r>
+      <w:fldSimple w:instr=" SEQ Figure \* ARABIC ">
+        <w:r>
+          <w:rPr>
+            <w:noProof/>
+          </w:rPr>
+          <w:t>10</w:t>
+        </w:r>
+      </w:fldSimple>
       <w:r>
         <w:t xml:space="preserve"> Forged FAT32 HD Image file using Linux tooling</w:t>
       </w:r>
@@ -18371,27 +18448,14 @@
       <w:r>
         <w:t xml:space="preserve">Figure </w:t>
       </w:r>
-      <w:r>
-        <w:fldChar w:fldCharType="begin"/>
-      </w:r>
-      <w:r>
-        <w:instrText xml:space="preserve"> SEQ Figure \* ARABIC </w:instrText>
-      </w:r>
-      <w:r>
-        <w:fldChar w:fldCharType="separate"/>
-      </w:r>
-      <w:r>
-        <w:rPr>
-          <w:noProof/>
-        </w:rPr>
-        <w:t>11</w:t>
-      </w:r>
-      <w:r>
-        <w:rPr>
-          <w:noProof/>
-        </w:rPr>
-        <w:fldChar w:fldCharType="end"/>
-      </w:r>
+      <w:fldSimple w:instr=" SEQ Figure \* ARABIC ">
+        <w:r>
+          <w:rPr>
+            <w:noProof/>
+          </w:rPr>
+          <w:t>11</w:t>
+        </w:r>
+      </w:fldSimple>
       <w:r>
         <w:t xml:space="preserve"> Good progress on my custom FAT32 imaging tool</w:t>
       </w:r>
@@ -18458,27 +18522,14 @@
       <w:r>
         <w:t xml:space="preserve">Figure </w:t>
       </w:r>
-      <w:r>
-        <w:fldChar w:fldCharType="begin"/>
-      </w:r>
-      <w:r>
-        <w:instrText xml:space="preserve"> SEQ Figure \* ARABIC </w:instrText>
-      </w:r>
-      <w:r>
-        <w:fldChar w:fldCharType="separate"/>
-      </w:r>
-      <w:r>
-        <w:rPr>
-          <w:noProof/>
-        </w:rPr>
-        <w:t>12</w:t>
-      </w:r>
-      <w:r>
-        <w:rPr>
-          <w:noProof/>
-        </w:rPr>
-        <w:fldChar w:fldCharType="end"/>
-      </w:r>
+      <w:fldSimple w:instr=" SEQ Figure \* ARABIC ">
+        <w:r>
+          <w:rPr>
+            <w:noProof/>
+          </w:rPr>
+          <w:t>12</w:t>
+        </w:r>
+      </w:fldSimple>
       <w:r>
         <w:t xml:space="preserve"> In Rust we trust (but not on this unsafe one)</w:t>
       </w:r>
@@ -18544,27 +18595,14 @@
       <w:r>
         <w:t xml:space="preserve">Figure </w:t>
       </w:r>
-      <w:r>
-        <w:fldChar w:fldCharType="begin"/>
-      </w:r>
-      <w:r>
-        <w:instrText xml:space="preserve"> SEQ Figure \* ARABIC </w:instrText>
-      </w:r>
-      <w:r>
-        <w:fldChar w:fldCharType="separate"/>
-      </w:r>
-      <w:r>
-        <w:rPr>
-          <w:noProof/>
-        </w:rPr>
-        <w:t>13</w:t>
-      </w:r>
-      <w:r>
-        <w:rPr>
-          <w:noProof/>
-        </w:rPr>
-        <w:fldChar w:fldCharType="end"/>
-      </w:r>
+      <w:fldSimple w:instr=" SEQ Figure \* ARABIC ">
+        <w:r>
+          <w:rPr>
+            <w:noProof/>
+          </w:rPr>
+          <w:t>13</w:t>
+        </w:r>
+      </w:fldSimple>
       <w:r>
         <w:t xml:space="preserve"> Rustlings to dust off my rust skills</w:t>
       </w:r>
@@ -18630,27 +18668,14 @@
       <w:r>
         <w:t xml:space="preserve">Figure </w:t>
       </w:r>
-      <w:r>
-        <w:fldChar w:fldCharType="begin"/>
-      </w:r>
-      <w:r>
-        <w:instrText xml:space="preserve"> SEQ Figure \* ARABIC </w:instrText>
-      </w:r>
-      <w:r>
-        <w:fldChar w:fldCharType="separate"/>
-      </w:r>
-      <w:r>
-        <w:rPr>
-          <w:noProof/>
-        </w:rPr>
-        <w:t>14</w:t>
-      </w:r>
-      <w:r>
-        <w:rPr>
-          <w:noProof/>
-        </w:rPr>
-        <w:fldChar w:fldCharType="end"/>
-      </w:r>
+      <w:fldSimple w:instr=" SEQ Figure \* ARABIC ">
+        <w:r>
+          <w:rPr>
+            <w:noProof/>
+          </w:rPr>
+          <w:t>14</w:t>
+        </w:r>
+      </w:fldSimple>
       <w:r>
         <w:t xml:space="preserve"> Empty images</w:t>
       </w:r>
@@ -18716,27 +18741,14 @@
       <w:r>
         <w:t xml:space="preserve">Figure </w:t>
       </w:r>
-      <w:r>
-        <w:fldChar w:fldCharType="begin"/>
-      </w:r>
-      <w:r>
-        <w:instrText xml:space="preserve"> SEQ Figure \* ARABIC </w:instrText>
-      </w:r>
-      <w:r>
-        <w:fldChar w:fldCharType="separate"/>
-      </w:r>
-      <w:r>
-        <w:rPr>
-          <w:noProof/>
-        </w:rPr>
-        <w:t>15</w:t>
-      </w:r>
-      <w:r>
-        <w:rPr>
-          <w:noProof/>
-        </w:rPr>
-        <w:fldChar w:fldCharType="end"/>
-      </w:r>
+      <w:fldSimple w:instr=" SEQ Figure \* ARABIC ">
+        <w:r>
+          <w:rPr>
+            <w:noProof/>
+          </w:rPr>
+          <w:t>15</w:t>
+        </w:r>
+      </w:fldSimple>
       <w:r>
         <w:t xml:space="preserve"> Partition table and magic number injected with </w:t>
       </w:r>
@@ -18802,27 +18814,14 @@
       <w:r>
         <w:t xml:space="preserve">Figure </w:t>
       </w:r>
-      <w:r>
-        <w:fldChar w:fldCharType="begin"/>
-      </w:r>
-      <w:r>
-        <w:instrText xml:space="preserve"> SEQ Figure \* ARABIC </w:instrText>
-      </w:r>
-      <w:r>
-        <w:fldChar w:fldCharType="separate"/>
-      </w:r>
-      <w:r>
-        <w:rPr>
-          <w:noProof/>
-        </w:rPr>
-        <w:t>16</w:t>
-      </w:r>
-      <w:r>
-        <w:rPr>
-          <w:noProof/>
-        </w:rPr>
-        <w:fldChar w:fldCharType="end"/>
-      </w:r>
+      <w:fldSimple w:instr=" SEQ Figure \* ARABIC ">
+        <w:r>
+          <w:rPr>
+            <w:noProof/>
+          </w:rPr>
+          <w:t>16</w:t>
+        </w:r>
+      </w:fldSimple>
       <w:r>
         <w:t xml:space="preserve"> </w:t>
       </w:r>
@@ -18835,12 +18834,140 @@
       <w:bookmarkEnd w:id="45"/>
     </w:p>
     <w:p>
+      <w:r>
+        <w:t>07-November</w:t>
+      </w:r>
+    </w:p>
+    <w:p/>
+    <w:p>
+      <w:pPr>
+        <w:keepNext/>
+      </w:pPr>
+      <w:r>
+        <w:drawing>
+          <wp:inline distT="0" distB="0" distL="0" distR="0" wp14:anchorId="7A770244" wp14:editId="2A68DF87">
+            <wp:extent cx="5943600" cy="332105"/>
+            <wp:effectExtent l="0" t="0" r="0" b="0"/>
+            <wp:docPr id="326163830" name="Picture 1"/>
+            <wp:cNvGraphicFramePr>
+              <a:graphicFrameLocks xmlns:a="http://schemas.openxmlformats.org/drawingml/2006/main" noChangeAspect="1"/>
+            </wp:cNvGraphicFramePr>
+            <a:graphic xmlns:a="http://schemas.openxmlformats.org/drawingml/2006/main">
+              <a:graphicData uri="http://schemas.openxmlformats.org/drawingml/2006/picture">
+                <pic:pic xmlns:pic="http://schemas.openxmlformats.org/drawingml/2006/picture">
+                  <pic:nvPicPr>
+                    <pic:cNvPr id="326163830" name=""/>
+                    <pic:cNvPicPr/>
+                  </pic:nvPicPr>
+                  <pic:blipFill>
+                    <a:blip r:embed="rId51"/>
+                    <a:stretch>
+                      <a:fillRect/>
+                    </a:stretch>
+                  </pic:blipFill>
+                  <pic:spPr>
+                    <a:xfrm>
+                      <a:off x="0" y="0"/>
+                      <a:ext cx="5943600" cy="332105"/>
+                    </a:xfrm>
+                    <a:prstGeom prst="rect">
+                      <a:avLst/>
+                    </a:prstGeom>
+                  </pic:spPr>
+                </pic:pic>
+              </a:graphicData>
+            </a:graphic>
+          </wp:inline>
+        </w:drawing>
+      </w:r>
+    </w:p>
+    <w:p>
+      <w:pPr>
+        <w:pStyle w:val="Caption"/>
+      </w:pPr>
+      <w:r>
+        <w:t xml:space="preserve">Figure </w:t>
+      </w:r>
+      <w:fldSimple w:instr=" SEQ Figure \* ARABIC ">
+        <w:r>
+          <w:rPr>
+            <w:noProof/>
+          </w:rPr>
+          <w:t>17</w:t>
+        </w:r>
+      </w:fldSimple>
+      <w:r>
+        <w:t xml:space="preserve"> Automated deleting and creating an empty image</w:t>
+      </w:r>
+    </w:p>
+    <w:p/>
+    <w:p>
+      <w:pPr>
+        <w:keepNext/>
+      </w:pPr>
+      <w:r>
+        <w:drawing>
+          <wp:inline distT="0" distB="0" distL="0" distR="0" wp14:anchorId="59CF373C" wp14:editId="4BABF800">
+            <wp:extent cx="5943600" cy="1501140"/>
+            <wp:effectExtent l="0" t="0" r="0" b="3810"/>
+            <wp:docPr id="1414441945" name="Picture 1" descr="A computer screen with text and numbers&#10;&#10;AI-generated content may be incorrect."/>
+            <wp:cNvGraphicFramePr>
+              <a:graphicFrameLocks xmlns:a="http://schemas.openxmlformats.org/drawingml/2006/main" noChangeAspect="1"/>
+            </wp:cNvGraphicFramePr>
+            <a:graphic xmlns:a="http://schemas.openxmlformats.org/drawingml/2006/main">
+              <a:graphicData uri="http://schemas.openxmlformats.org/drawingml/2006/picture">
+                <pic:pic xmlns:pic="http://schemas.openxmlformats.org/drawingml/2006/picture">
+                  <pic:nvPicPr>
+                    <pic:cNvPr id="1414441945" name="Picture 1" descr="A computer screen with text and numbers&#10;&#10;AI-generated content may be incorrect."/>
+                    <pic:cNvPicPr/>
+                  </pic:nvPicPr>
+                  <pic:blipFill>
+                    <a:blip r:embed="rId52"/>
+                    <a:stretch>
+                      <a:fillRect/>
+                    </a:stretch>
+                  </pic:blipFill>
+                  <pic:spPr>
+                    <a:xfrm>
+                      <a:off x="0" y="0"/>
+                      <a:ext cx="5943600" cy="1501140"/>
+                    </a:xfrm>
+                    <a:prstGeom prst="rect">
+                      <a:avLst/>
+                    </a:prstGeom>
+                  </pic:spPr>
+                </pic:pic>
+              </a:graphicData>
+            </a:graphic>
+          </wp:inline>
+        </w:drawing>
+      </w:r>
+    </w:p>
+    <w:p>
+      <w:pPr>
+        <w:pStyle w:val="Caption"/>
+      </w:pPr>
+      <w:r>
+        <w:t xml:space="preserve">Figure </w:t>
+      </w:r>
+      <w:fldSimple w:instr=" SEQ Figure \* ARABIC ">
+        <w:r>
+          <w:rPr>
+            <w:noProof/>
+          </w:rPr>
+          <w:t>18</w:t>
+        </w:r>
+      </w:fldSimple>
+      <w:r>
+        <w:t xml:space="preserve"> Final values for FAT32 24MB disk injection</w:t>
+      </w:r>
+    </w:p>
+    <w:p>
       <w:pPr>
         <w:pStyle w:val="Heading1"/>
       </w:pPr>
       <w:bookmarkStart w:id="46" w:name="_Toc213355660"/>
       <w:r>
-        <w:lastRenderedPageBreak/>
         <w:t>Resources</w:t>
       </w:r>
       <w:bookmarkEnd w:id="46"/>
@@ -18884,7 +19011,7 @@
             <w:tcW w:w="4675" w:type="dxa"/>
           </w:tcPr>
           <w:p>
-            <w:hyperlink r:id="rId51" w:history="1">
+            <w:hyperlink r:id="rId53" w:history="1">
               <w:r>
                 <w:rPr>
                   <w:rStyle w:val="Hyperlink"/>
@@ -18920,7 +19047,7 @@
             <w:tcW w:w="4675" w:type="dxa"/>
           </w:tcPr>
           <w:p>
-            <w:hyperlink r:id="rId52" w:history="1">
+            <w:hyperlink r:id="rId54" w:history="1">
               <w:r>
                 <w:rPr>
                   <w:rStyle w:val="Hyperlink"/>
@@ -18940,85 +19067,6 @@
           <w:p>
             <w:r>
               <w:t>FAT Reference from Microsoft. Internet archive</w:t>
-            </w:r>
-          </w:p>
-        </w:tc>
-      </w:tr>
-      <w:tr>
-        <w:tc>
-          <w:tcPr>
-            <w:tcW w:w="4675" w:type="dxa"/>
-          </w:tcPr>
-          <w:p>
-            <w:hyperlink r:id="rId53" w:history="1">
-              <w:r>
-                <w:rPr>
-                  <w:rStyle w:val="Hyperlink"/>
-                </w:rPr>
-                <w:t>https://euroassembler.eu/</w:t>
-              </w:r>
-            </w:hyperlink>
-            <w:r>
-              <w:t xml:space="preserve"> </w:t>
-            </w:r>
-          </w:p>
-        </w:tc>
-        <w:tc>
-          <w:tcPr>
-            <w:tcW w:w="4675" w:type="dxa"/>
-          </w:tcPr>
-          <w:p>
-            <w:r>
-              <w:t>Yet another assembler. There is a ton of work behind. The macros</w:t>
-            </w:r>
-            <w:r>
-              <w:t xml:space="preserve"> and projects</w:t>
-            </w:r>
-            <w:r>
-              <w:t xml:space="preserve"> section contain a lot of pre-canned structures and </w:t>
-            </w:r>
-            <w:proofErr w:type="spellStart"/>
-            <w:r>
-              <w:t>asm</w:t>
-            </w:r>
-            <w:proofErr w:type="spellEnd"/>
-            <w:r>
-              <w:t xml:space="preserve"> for </w:t>
-            </w:r>
-            <w:proofErr w:type="spellStart"/>
-            <w:r>
-              <w:t>OsDev</w:t>
-            </w:r>
-            <w:proofErr w:type="spellEnd"/>
-          </w:p>
-        </w:tc>
-      </w:tr>
-      <w:tr>
-        <w:tc>
-          <w:tcPr>
-            <w:tcW w:w="4675" w:type="dxa"/>
-          </w:tcPr>
-          <w:p>
-            <w:hyperlink r:id="rId54" w:history="1">
-              <w:r>
-                <w:rPr>
-                  <w:rStyle w:val="Hyperlink"/>
-                </w:rPr>
-                <w:t>https://elm-chan.org/docs/fat_e.html</w:t>
-              </w:r>
-            </w:hyperlink>
-            <w:r>
-              <w:t xml:space="preserve"> </w:t>
-            </w:r>
-          </w:p>
-        </w:tc>
-        <w:tc>
-          <w:tcPr>
-            <w:tcW w:w="4675" w:type="dxa"/>
-          </w:tcPr>
-          <w:p>
-            <w:r>
-              <w:t>FAT stuff</w:t>
             </w:r>
           </w:p>
         </w:tc>
@@ -19034,7 +19082,7 @@
                 <w:rPr>
                   <w:rStyle w:val="Hyperlink"/>
                 </w:rPr>
-                <w:t>https://github.com/lukearend/x86-bootloader</w:t>
+                <w:t>https://euroassembler.eu/</w:t>
               </w:r>
             </w:hyperlink>
             <w:r>
@@ -19048,8 +19096,27 @@
           </w:tcPr>
           <w:p>
             <w:r>
-              <w:t>Bootloader assembly, very basic</w:t>
-            </w:r>
+              <w:t>Yet another assembler. There is a ton of work behind. The macros</w:t>
+            </w:r>
+            <w:r>
+              <w:t xml:space="preserve"> and projects</w:t>
+            </w:r>
+            <w:r>
+              <w:t xml:space="preserve"> section contain a lot of pre-canned structures and </w:t>
+            </w:r>
+            <w:proofErr w:type="spellStart"/>
+            <w:r>
+              <w:t>asm</w:t>
+            </w:r>
+            <w:proofErr w:type="spellEnd"/>
+            <w:r>
+              <w:t xml:space="preserve"> for </w:t>
+            </w:r>
+            <w:proofErr w:type="spellStart"/>
+            <w:r>
+              <w:t>OsDev</w:t>
+            </w:r>
+            <w:proofErr w:type="spellEnd"/>
           </w:p>
         </w:tc>
       </w:tr>
@@ -19064,7 +19131,7 @@
                 <w:rPr>
                   <w:rStyle w:val="Hyperlink"/>
                 </w:rPr>
-                <w:t>https://en.wikipedia.org/wiki/Master_boot_record</w:t>
+                <w:t>https://elm-chan.org/docs/fat_e.html</w:t>
               </w:r>
             </w:hyperlink>
             <w:r>
@@ -19078,32 +19145,7 @@
           </w:tcPr>
           <w:p>
             <w:r>
-              <w:t>The sector layout section is a good summary.</w:t>
-            </w:r>
-          </w:p>
-        </w:tc>
-      </w:tr>
-      <w:tr>
-        <w:tc>
-          <w:tcPr>
-            <w:tcW w:w="4675" w:type="dxa"/>
-          </w:tcPr>
-          <w:p>
-            <w:r>
-              <w:t>docs\Reference\FileSystem\FAT-Specification-Microsoft-Aug2005.pdf</w:t>
-            </w:r>
-            <w:r>
-              <w:t xml:space="preserve"> </w:t>
-            </w:r>
-          </w:p>
-        </w:tc>
-        <w:tc>
-          <w:tcPr>
-            <w:tcW w:w="4675" w:type="dxa"/>
-          </w:tcPr>
-          <w:p>
-            <w:r>
-              <w:t>PDF FAT reference</w:t>
+              <w:t>FAT stuff</w:t>
             </w:r>
           </w:p>
         </w:tc>
@@ -19119,9 +19161,12 @@
                 <w:rPr>
                   <w:rStyle w:val="Hyperlink"/>
                 </w:rPr>
-                <w:t>https://www.easeus.com/resource/fat32-disk-structure.html?srsltid=AfmBOorykOEYj97O-GVlZWgVod0F3h0Jx9gLmAidlQA_ZXAyrPXHGyzE</w:t>
+                <w:t>https://github.com/lukearend/x86-bootloader</w:t>
               </w:r>
             </w:hyperlink>
+            <w:r>
+              <w:t xml:space="preserve"> </w:t>
+            </w:r>
           </w:p>
         </w:tc>
         <w:tc>
@@ -19130,13 +19175,7 @@
           </w:tcPr>
           <w:p>
             <w:r>
-              <w:t>Clear and concise FAT</w:t>
-            </w:r>
-            <w:r>
-              <w:t>32</w:t>
-            </w:r>
-            <w:r>
-              <w:t xml:space="preserve"> structures</w:t>
+              <w:t>Bootloader assembly, very basic</w:t>
             </w:r>
           </w:p>
         </w:tc>
@@ -19152,6 +19191,94 @@
                 <w:rPr>
                   <w:rStyle w:val="Hyperlink"/>
                 </w:rPr>
+                <w:t>https://en.wikipedia.org/wiki/Master_boot_record</w:t>
+              </w:r>
+            </w:hyperlink>
+            <w:r>
+              <w:t xml:space="preserve"> </w:t>
+            </w:r>
+          </w:p>
+        </w:tc>
+        <w:tc>
+          <w:tcPr>
+            <w:tcW w:w="4675" w:type="dxa"/>
+          </w:tcPr>
+          <w:p>
+            <w:r>
+              <w:t>The sector layout section is a good summary.</w:t>
+            </w:r>
+          </w:p>
+        </w:tc>
+      </w:tr>
+      <w:tr>
+        <w:tc>
+          <w:tcPr>
+            <w:tcW w:w="4675" w:type="dxa"/>
+          </w:tcPr>
+          <w:p>
+            <w:r>
+              <w:t>docs\Reference\FileSystem\FAT-Specification-Microsoft-Aug2005.pdf</w:t>
+            </w:r>
+            <w:r>
+              <w:t xml:space="preserve"> </w:t>
+            </w:r>
+          </w:p>
+        </w:tc>
+        <w:tc>
+          <w:tcPr>
+            <w:tcW w:w="4675" w:type="dxa"/>
+          </w:tcPr>
+          <w:p>
+            <w:r>
+              <w:t>PDF FAT reference</w:t>
+            </w:r>
+          </w:p>
+        </w:tc>
+      </w:tr>
+      <w:tr>
+        <w:tc>
+          <w:tcPr>
+            <w:tcW w:w="4675" w:type="dxa"/>
+          </w:tcPr>
+          <w:p>
+            <w:hyperlink r:id="rId59" w:history="1">
+              <w:r>
+                <w:rPr>
+                  <w:rStyle w:val="Hyperlink"/>
+                </w:rPr>
+                <w:t>https://www.easeus.com/resource/fat32-disk-structure.html?srsltid=AfmBOorykOEYj97O-GVlZWgVod0F3h0Jx9gLmAidlQA_ZXAyrPXHGyzE</w:t>
+              </w:r>
+            </w:hyperlink>
+          </w:p>
+        </w:tc>
+        <w:tc>
+          <w:tcPr>
+            <w:tcW w:w="4675" w:type="dxa"/>
+          </w:tcPr>
+          <w:p>
+            <w:r>
+              <w:t>Clear and concise FAT</w:t>
+            </w:r>
+            <w:r>
+              <w:t>32</w:t>
+            </w:r>
+            <w:r>
+              <w:t xml:space="preserve"> structures</w:t>
+            </w:r>
+          </w:p>
+        </w:tc>
+      </w:tr>
+      <w:tr>
+        <w:tc>
+          <w:tcPr>
+            <w:tcW w:w="4675" w:type="dxa"/>
+          </w:tcPr>
+          <w:p>
+            <w:hyperlink r:id="rId60" w:history="1">
+              <w:r>
+                <w:rPr>
+                  <w:rStyle w:val="Hyperlink"/>
+                </w:rPr>
                 <w:t>https://oort.rs</w:t>
               </w:r>
             </w:hyperlink>
@@ -19174,7 +19301,7 @@
             <w:tcW w:w="4675" w:type="dxa"/>
           </w:tcPr>
           <w:p>
-            <w:hyperlink r:id="rId59" w:history="1">
+            <w:hyperlink r:id="rId61" w:history="1">
               <w:r>
                 <w:rPr>
                   <w:rStyle w:val="Hyperlink"/>
@@ -19487,6 +19614,32 @@
             </w:pPr>
             <w:r>
               <w:t>5 hours</w:t>
+            </w:r>
+          </w:p>
+        </w:tc>
+      </w:tr>
+      <w:tr>
+        <w:tc>
+          <w:tcPr>
+            <w:cnfStyle w:val="001000000000" w:firstRow="0" w:lastRow="0" w:firstColumn="1" w:lastColumn="0" w:oddVBand="0" w:evenVBand="0" w:oddHBand="0" w:evenHBand="0" w:firstRowFirstColumn="0" w:firstRowLastColumn="0" w:lastRowFirstColumn="0" w:lastRowLastColumn="0"/>
+            <w:tcW w:w="4675" w:type="dxa"/>
+          </w:tcPr>
+          <w:p>
+            <w:r>
+              <w:t>07-November-2025</w:t>
+            </w:r>
+          </w:p>
+        </w:tc>
+        <w:tc>
+          <w:tcPr>
+            <w:tcW w:w="4675" w:type="dxa"/>
+          </w:tcPr>
+          <w:p>
+            <w:pPr>
+              <w:cnfStyle w:val="000000000000" w:firstRow="0" w:lastRow="0" w:firstColumn="0" w:lastColumn="0" w:oddVBand="0" w:evenVBand="0" w:oddHBand="0" w:evenHBand="0" w:firstRowFirstColumn="0" w:firstRowLastColumn="0" w:lastRowFirstColumn="0" w:lastRowLastColumn="0"/>
+            </w:pPr>
+            <w:r>
+              <w:t>8 hours</w:t>
             </w:r>
           </w:p>
         </w:tc>
@@ -20692,7 +20845,7 @@
       </w:r>
     </w:p>
     <w:sectPr>
-      <w:headerReference w:type="default" r:id="rId60"/>
+      <w:headerReference w:type="default" r:id="rId62"/>
       <w:pgSz w:w="12240" w:h="15840"/>
       <w:pgMar w:top="1440" w:right="1440" w:bottom="1440" w:left="1440" w:header="720" w:footer="720" w:gutter="0"/>
       <w:pgNumType w:start="0"/>
@@ -21817,7 +21970,7 @@
   <w:style w:type="paragraph" w:default="1" w:styleId="Normal">
     <w:name w:val="Normal"/>
     <w:qFormat/>
-    <w:rsid w:val="00D67BC0"/>
+    <w:rsid w:val="00211765"/>
     <w:rPr>
       <w:sz w:val="20"/>
     </w:rPr>
@@ -22072,6 +22225,7 @@
   <w:style w:type="character" w:default="1" w:styleId="DefaultParagraphFont">
     <w:name w:val="Default Paragraph Font"/>
     <w:uiPriority w:val="1"/>
+    <w:semiHidden/>
     <w:unhideWhenUsed/>
   </w:style>
   <w:style w:type="table" w:default="1" w:styleId="TableNormal">

</xml_diff>

<commit_message>
VBR and FSInfo ready. Research about FAT directories and files. Configured Bochs to boot from HD Image instead of floppy.
</commit_message>
<xml_diff>
--- a/docs/TusMuertos-v2.0-Design.docx
+++ b/docs/TusMuertos-v2.0-Design.docx
@@ -16092,6 +16092,39 @@
       <w:pPr>
         <w:pStyle w:val="ListParagraph"/>
         <w:numPr>
+          <w:ilvl w:val="1"/>
+          <w:numId w:val="1"/>
+        </w:numPr>
+      </w:pPr>
+      <w:proofErr w:type="spellStart"/>
+      <w:r>
+        <w:t>mformat</w:t>
+      </w:r>
+      <w:proofErr w:type="spellEnd"/>
+      <w:r>
+        <w:t xml:space="preserve"> -</w:t>
+      </w:r>
+      <w:proofErr w:type="spellStart"/>
+      <w:r>
+        <w:t>i</w:t>
+      </w:r>
+      <w:proofErr w:type="spellEnd"/>
+      <w:r>
+        <w:t xml:space="preserve"> hd34mbfat32.img@@1048576 -</w:t>
+      </w:r>
+      <w:proofErr w:type="gramStart"/>
+      <w:r>
+        <w:t>F :</w:t>
+      </w:r>
+      <w:proofErr w:type="gramEnd"/>
+      <w:r>
+        <w:t>:</w:t>
+      </w:r>
+    </w:p>
+    <w:p>
+      <w:pPr>
+        <w:pStyle w:val="ListParagraph"/>
+        <w:numPr>
           <w:ilvl w:val="2"/>
           <w:numId w:val="1"/>
         </w:numPr>
@@ -16293,15 +16326,7 @@
       </w:r>
       <w:proofErr w:type="spellEnd"/>
       <w:r>
-        <w:t xml:space="preserve"> is the </w:t>
-      </w:r>
-      <w:proofErr w:type="spellStart"/>
-      <w:r>
-        <w:t>FSInfo</w:t>
-      </w:r>
-      <w:proofErr w:type="spellEnd"/>
-      <w:r>
-        <w:t xml:space="preserve"> </w:t>
+        <w:t xml:space="preserve"> is the FSInfo </w:t>
       </w:r>
     </w:p>
     <w:p>
@@ -16444,6 +16469,39 @@
       <w:proofErr w:type="spellEnd"/>
       <w:r>
         <w:t xml:space="preserve"> hd16mbfat32.img@@</w:t>
+      </w:r>
+      <w:proofErr w:type="gramStart"/>
+      <w:r>
+        <w:t>1048576 :</w:t>
+      </w:r>
+      <w:proofErr w:type="gramEnd"/>
+      <w:r>
+        <w:t>:</w:t>
+      </w:r>
+    </w:p>
+    <w:p>
+      <w:pPr>
+        <w:pStyle w:val="ListParagraph"/>
+        <w:numPr>
+          <w:ilvl w:val="1"/>
+          <w:numId w:val="1"/>
+        </w:numPr>
+      </w:pPr>
+      <w:proofErr w:type="spellStart"/>
+      <w:r>
+        <w:t>mdir</w:t>
+      </w:r>
+      <w:proofErr w:type="spellEnd"/>
+      <w:r>
+        <w:t xml:space="preserve"> -</w:t>
+      </w:r>
+      <w:proofErr w:type="spellStart"/>
+      <w:r>
+        <w:t>i</w:t>
+      </w:r>
+      <w:proofErr w:type="spellEnd"/>
+      <w:r>
+        <w:t xml:space="preserve"> hd34mbfat32.img@@</w:t>
       </w:r>
       <w:proofErr w:type="gramStart"/>
       <w:r>
@@ -16814,6 +16872,9 @@
         </w:numPr>
       </w:pPr>
       <w:r>
+        <w:rPr>
+          <w:noProof/>
+        </w:rPr>
         <w:drawing>
           <wp:inline distT="0" distB="0" distL="0" distR="0" wp14:anchorId="3190726C" wp14:editId="2E6C6095">
             <wp:extent cx="5943600" cy="1983740"/>
@@ -16880,6 +16941,9 @@
         </w:numPr>
       </w:pPr>
       <w:r>
+        <w:rPr>
+          <w:noProof/>
+        </w:rPr>
         <w:drawing>
           <wp:inline distT="0" distB="0" distL="0" distR="0" wp14:anchorId="55CC4291" wp14:editId="5799F873">
             <wp:extent cx="5943600" cy="1934845"/>
@@ -16960,6 +17024,9 @@
       </w:r>
       <w:proofErr w:type="spellEnd"/>
       <w:r>
+        <w:rPr>
+          <w:noProof/>
+        </w:rPr>
         <w:drawing>
           <wp:inline distT="0" distB="0" distL="0" distR="0" wp14:anchorId="01EC0235" wp14:editId="4FA5E7D6">
             <wp:extent cx="5943600" cy="1537335"/>
@@ -17023,6 +17090,9 @@
         </w:numPr>
       </w:pPr>
       <w:r>
+        <w:rPr>
+          <w:noProof/>
+        </w:rPr>
         <w:drawing>
           <wp:inline distT="0" distB="0" distL="0" distR="0" wp14:anchorId="256327DB" wp14:editId="601E8CDD">
             <wp:extent cx="5943600" cy="428625"/>
@@ -17114,6 +17184,9 @@
         </w:numPr>
       </w:pPr>
       <w:r>
+        <w:rPr>
+          <w:noProof/>
+        </w:rPr>
         <w:drawing>
           <wp:inline distT="0" distB="0" distL="0" distR="0" wp14:anchorId="24E40D30" wp14:editId="4232F8CD">
             <wp:extent cx="5943600" cy="1720850"/>
@@ -17177,6 +17250,9 @@
         </w:numPr>
       </w:pPr>
       <w:r>
+        <w:rPr>
+          <w:noProof/>
+        </w:rPr>
         <w:drawing>
           <wp:inline distT="0" distB="0" distL="0" distR="0" wp14:anchorId="1EF3786B" wp14:editId="28D6B9FC">
             <wp:extent cx="5943600" cy="2870835"/>
@@ -17376,6 +17452,238 @@
           <w:numId w:val="1"/>
         </w:numPr>
       </w:pPr>
+      <w:r>
+        <w:t>ff</w:t>
+      </w:r>
+    </w:p>
+    <w:p>
+      <w:pPr>
+        <w:pStyle w:val="ListParagraph"/>
+        <w:numPr>
+          <w:ilvl w:val="1"/>
+          <w:numId w:val="1"/>
+        </w:numPr>
+      </w:pPr>
+      <w:r>
+        <w:t xml:space="preserve">check this alternative way to create a disk </w:t>
+      </w:r>
+      <w:hyperlink r:id="rId45" w:history="1">
+        <w:r>
+          <w:rPr>
+            <w:rStyle w:val="Hyperlink"/>
+          </w:rPr>
+          <w:t>https://github.com/rafalh/rust-fatfs/blob/master/scripts/create-test-img.sh</w:t>
+        </w:r>
+      </w:hyperlink>
+      <w:r>
+        <w:t xml:space="preserve"> to see how canonical is compared to this doc and my tools</w:t>
+      </w:r>
+    </w:p>
+    <w:p>
+      <w:pPr>
+        <w:pStyle w:val="ListParagraph"/>
+        <w:numPr>
+          <w:ilvl w:val="1"/>
+          <w:numId w:val="1"/>
+        </w:numPr>
+      </w:pPr>
+      <w:r>
+        <w:t xml:space="preserve">This shows a disk example with files and folders created, 4 files, 1 boot directory, using </w:t>
+      </w:r>
+      <w:proofErr w:type="spellStart"/>
+      <w:r>
+        <w:t>mdir</w:t>
+      </w:r>
+      <w:proofErr w:type="spellEnd"/>
+      <w:r>
+        <w:t xml:space="preserve"> and </w:t>
+      </w:r>
+      <w:proofErr w:type="spellStart"/>
+      <w:r>
+        <w:t>fsstat</w:t>
+      </w:r>
+      <w:proofErr w:type="spellEnd"/>
+    </w:p>
+    <w:p>
+      <w:pPr>
+        <w:pStyle w:val="ListParagraph"/>
+        <w:numPr>
+          <w:ilvl w:val="2"/>
+          <w:numId w:val="1"/>
+        </w:numPr>
+      </w:pPr>
+      <w:proofErr w:type="spellStart"/>
+      <w:r>
+        <w:t>mdir</w:t>
+      </w:r>
+      <w:proofErr w:type="spellEnd"/>
+      <w:r>
+        <w:t xml:space="preserve"> -</w:t>
+      </w:r>
+      <w:proofErr w:type="spellStart"/>
+      <w:r>
+        <w:t>i</w:t>
+      </w:r>
+      <w:proofErr w:type="spellEnd"/>
+      <w:r>
+        <w:t xml:space="preserve"> hd34mbfat32.img@@</w:t>
+      </w:r>
+      <w:proofErr w:type="gramStart"/>
+      <w:r>
+        <w:t>1048576 :</w:t>
+      </w:r>
+      <w:proofErr w:type="gramEnd"/>
+      <w:r>
+        <w:t>:/boot</w:t>
+      </w:r>
+    </w:p>
+    <w:p>
+      <w:pPr>
+        <w:pStyle w:val="ListParagraph"/>
+        <w:numPr>
+          <w:ilvl w:val="2"/>
+          <w:numId w:val="1"/>
+        </w:numPr>
+      </w:pPr>
+      <w:proofErr w:type="spellStart"/>
+      <w:r>
+        <w:t>mdir</w:t>
+      </w:r>
+      <w:proofErr w:type="spellEnd"/>
+      <w:r>
+        <w:t xml:space="preserve"> -</w:t>
+      </w:r>
+      <w:proofErr w:type="spellStart"/>
+      <w:r>
+        <w:t>i</w:t>
+      </w:r>
+      <w:proofErr w:type="spellEnd"/>
+      <w:r>
+        <w:t xml:space="preserve"> hd34mbfat32.img@@</w:t>
+      </w:r>
+      <w:proofErr w:type="gramStart"/>
+      <w:r>
+        <w:t>1048576 :</w:t>
+      </w:r>
+      <w:proofErr w:type="gramEnd"/>
+      <w:r>
+        <w:t>:</w:t>
+      </w:r>
+    </w:p>
+    <w:p>
+      <w:pPr>
+        <w:pStyle w:val="ListParagraph"/>
+        <w:numPr>
+          <w:ilvl w:val="2"/>
+          <w:numId w:val="1"/>
+        </w:numPr>
+      </w:pPr>
+      <w:proofErr w:type="spellStart"/>
+      <w:proofErr w:type="gramStart"/>
+      <w:r>
+        <w:t>fsstat</w:t>
+      </w:r>
+      <w:proofErr w:type="spellEnd"/>
+      <w:r>
+        <w:t xml:space="preserve">  -</w:t>
+      </w:r>
+      <w:proofErr w:type="gramEnd"/>
+      <w:r>
+        <w:t>f fat32 -o 2048 hd34mbfat32.img</w:t>
+      </w:r>
+    </w:p>
+    <w:p>
+      <w:pPr>
+        <w:pStyle w:val="ListParagraph"/>
+        <w:numPr>
+          <w:ilvl w:val="1"/>
+          <w:numId w:val="1"/>
+        </w:numPr>
+      </w:pPr>
+      <w:r>
+        <w:drawing>
+          <wp:inline distT="0" distB="0" distL="0" distR="0" wp14:anchorId="48CB9478" wp14:editId="46ACA507">
+            <wp:extent cx="5943600" cy="2299335"/>
+            <wp:effectExtent l="0" t="0" r="0" b="5715"/>
+            <wp:docPr id="1893293476" name="Picture 1" descr="A screenshot of a computer&#10;&#10;AI-generated content may be incorrect."/>
+            <wp:cNvGraphicFramePr>
+              <a:graphicFrameLocks xmlns:a="http://schemas.openxmlformats.org/drawingml/2006/main" noChangeAspect="1"/>
+            </wp:cNvGraphicFramePr>
+            <a:graphic xmlns:a="http://schemas.openxmlformats.org/drawingml/2006/main">
+              <a:graphicData uri="http://schemas.openxmlformats.org/drawingml/2006/picture">
+                <pic:pic xmlns:pic="http://schemas.openxmlformats.org/drawingml/2006/picture">
+                  <pic:nvPicPr>
+                    <pic:cNvPr id="1893293476" name="Picture 1" descr="A screenshot of a computer&#10;&#10;AI-generated content may be incorrect."/>
+                    <pic:cNvPicPr/>
+                  </pic:nvPicPr>
+                  <pic:blipFill>
+                    <a:blip r:embed="rId46"/>
+                    <a:stretch>
+                      <a:fillRect/>
+                    </a:stretch>
+                  </pic:blipFill>
+                  <pic:spPr>
+                    <a:xfrm>
+                      <a:off x="0" y="0"/>
+                      <a:ext cx="5943600" cy="2299335"/>
+                    </a:xfrm>
+                    <a:prstGeom prst="rect">
+                      <a:avLst/>
+                    </a:prstGeom>
+                  </pic:spPr>
+                </pic:pic>
+              </a:graphicData>
+            </a:graphic>
+          </wp:inline>
+        </w:drawing>
+      </w:r>
+    </w:p>
+    <w:p>
+      <w:pPr>
+        <w:pStyle w:val="ListParagraph"/>
+        <w:numPr>
+          <w:ilvl w:val="1"/>
+          <w:numId w:val="1"/>
+        </w:numPr>
+      </w:pPr>
+      <w:r>
+        <w:lastRenderedPageBreak/>
+        <w:drawing>
+          <wp:inline distT="0" distB="0" distL="0" distR="0" wp14:anchorId="5A0B0C61" wp14:editId="1A4ED99F">
+            <wp:extent cx="5943600" cy="4872355"/>
+            <wp:effectExtent l="0" t="0" r="0" b="4445"/>
+            <wp:docPr id="2140865519" name="Picture 1" descr="A screenshot of a computer&#10;&#10;AI-generated content may be incorrect."/>
+            <wp:cNvGraphicFramePr>
+              <a:graphicFrameLocks xmlns:a="http://schemas.openxmlformats.org/drawingml/2006/main" noChangeAspect="1"/>
+            </wp:cNvGraphicFramePr>
+            <a:graphic xmlns:a="http://schemas.openxmlformats.org/drawingml/2006/main">
+              <a:graphicData uri="http://schemas.openxmlformats.org/drawingml/2006/picture">
+                <pic:pic xmlns:pic="http://schemas.openxmlformats.org/drawingml/2006/picture">
+                  <pic:nvPicPr>
+                    <pic:cNvPr id="2140865519" name="Picture 1" descr="A screenshot of a computer&#10;&#10;AI-generated content may be incorrect."/>
+                    <pic:cNvPicPr/>
+                  </pic:nvPicPr>
+                  <pic:blipFill>
+                    <a:blip r:embed="rId47"/>
+                    <a:stretch>
+                      <a:fillRect/>
+                    </a:stretch>
+                  </pic:blipFill>
+                  <pic:spPr>
+                    <a:xfrm>
+                      <a:off x="0" y="0"/>
+                      <a:ext cx="5943600" cy="4872355"/>
+                    </a:xfrm>
+                    <a:prstGeom prst="rect">
+                      <a:avLst/>
+                    </a:prstGeom>
+                  </pic:spPr>
+                </pic:pic>
+              </a:graphicData>
+            </a:graphic>
+          </wp:inline>
+        </w:drawing>
+      </w:r>
     </w:p>
     <w:p/>
     <w:p/>
@@ -17580,6 +17888,7 @@
     </w:p>
     <w:p>
       <w:r>
+        <w:lastRenderedPageBreak/>
         <w:t xml:space="preserve">80 20 21 00 0C FE FF </w:t>
       </w:r>
       <w:proofErr w:type="spellStart"/>
@@ -17617,7 +17926,7 @@
                     <pic:cNvPicPr/>
                   </pic:nvPicPr>
                   <pic:blipFill>
-                    <a:blip r:embed="rId45"/>
+                    <a:blip r:embed="rId48"/>
                     <a:stretch>
                       <a:fillRect/>
                     </a:stretch>
@@ -17660,7 +17969,6 @@
     <w:p/>
     <w:p>
       <w:r>
-        <w:lastRenderedPageBreak/>
         <w:t>Example for a partition starting at 1Mb (LBA 2048 * 512)</w:t>
       </w:r>
       <w:r>
@@ -18156,6 +18464,7 @@
         <w:rPr>
           <w:lang w:val="es-ES"/>
         </w:rPr>
+        <w:lastRenderedPageBreak/>
         <w:t>LBA = 2048 (</w:t>
       </w:r>
       <w:proofErr w:type="spellStart"/>
@@ -18678,7 +18987,6 @@
     </w:p>
     <w:p>
       <w:r>
-        <w:lastRenderedPageBreak/>
         <w:t xml:space="preserve">LBA = </w:t>
       </w:r>
       <w:r>
@@ -18857,6 +19165,7 @@
     </w:p>
     <w:p>
       <w:r>
+        <w:lastRenderedPageBreak/>
         <w:t>For another example, a 34MB FAT32 image file created with a dd to 34MB and then a parted to fat32.</w:t>
       </w:r>
     </w:p>
@@ -19408,7 +19717,6 @@
         <w:rPr>
           <w:lang w:val="es-ES"/>
         </w:rPr>
-        <w:lastRenderedPageBreak/>
         <w:t>LBA = (</w:t>
       </w:r>
       <w:r>
@@ -19584,11 +19892,9 @@
       <w:r>
         <w:t xml:space="preserve"> beings at 1MB, I guess this is related to the </w:t>
       </w:r>
-      <w:proofErr w:type="gramStart"/>
-      <w:r>
-        <w:t>disconnection</w:t>
-      </w:r>
-      <w:proofErr w:type="gramEnd"/>
+      <w:r>
+        <w:t>disconnect</w:t>
+      </w:r>
       <w:r>
         <w:t xml:space="preserve"> between CHS and LBA values. Research!</w:t>
       </w:r>
@@ -19597,26 +19903,1260 @@
       <w:r>
         <w:t>…and ends…</w:t>
       </w:r>
+    </w:p>
+    <w:p/>
+    <w:p>
+      <w:pPr>
+        <w:pStyle w:val="Heading3"/>
+      </w:pPr>
+      <w:r>
+        <w:t>FAT32 Layout table</w:t>
+      </w:r>
+    </w:p>
+    <w:p/>
+    <w:p>
+      <w:r>
+        <w:t>Sectors of a canonical 34MB FAT32 image with one 100% size partition</w:t>
+      </w:r>
+    </w:p>
+    <w:tbl>
+      <w:tblPr>
+        <w:tblStyle w:val="TableGrid"/>
+        <w:tblW w:w="10255" w:type="dxa"/>
+        <w:tblLayout w:type="fixed"/>
+        <w:tblLook w:val="04A0" w:firstRow="1" w:lastRow="0" w:firstColumn="1" w:lastColumn="0" w:noHBand="0" w:noVBand="1"/>
+      </w:tblPr>
+      <w:tblGrid>
+        <w:gridCol w:w="1702"/>
+        <w:gridCol w:w="1447"/>
+        <w:gridCol w:w="2325"/>
+        <w:gridCol w:w="1721"/>
+        <w:gridCol w:w="1980"/>
+        <w:gridCol w:w="1080"/>
+      </w:tblGrid>
+      <w:tr>
+        <w:tc>
+          <w:tcPr>
+            <w:tcW w:w="1702" w:type="dxa"/>
+          </w:tcPr>
+          <w:p>
+            <w:r>
+              <w:t>Sector</w:t>
+            </w:r>
+          </w:p>
+        </w:tc>
+        <w:tc>
+          <w:tcPr>
+            <w:tcW w:w="1447" w:type="dxa"/>
+          </w:tcPr>
+          <w:p>
+            <w:r>
+              <w:t>Offset</w:t>
+            </w:r>
+          </w:p>
+        </w:tc>
+        <w:tc>
+          <w:tcPr>
+            <w:tcW w:w="2325" w:type="dxa"/>
+          </w:tcPr>
+          <w:p>
+            <w:r>
+              <w:t>Offset Bytes</w:t>
+            </w:r>
+          </w:p>
+        </w:tc>
+        <w:tc>
+          <w:tcPr>
+            <w:tcW w:w="1721" w:type="dxa"/>
+          </w:tcPr>
+          <w:p>
+            <w:r>
+              <w:t>Content</w:t>
+            </w:r>
+          </w:p>
+        </w:tc>
+        <w:tc>
+          <w:tcPr>
+            <w:tcW w:w="1980" w:type="dxa"/>
+          </w:tcPr>
+          <w:p>
+            <w:r>
+              <w:t>Size bytes</w:t>
+            </w:r>
+          </w:p>
+        </w:tc>
+        <w:tc>
+          <w:tcPr>
+            <w:tcW w:w="1080" w:type="dxa"/>
+          </w:tcPr>
+          <w:p>
+            <w:r>
+              <w:t>Size sectors</w:t>
+            </w:r>
+          </w:p>
+        </w:tc>
+      </w:tr>
+      <w:tr>
+        <w:tc>
+          <w:tcPr>
+            <w:tcW w:w="1702" w:type="dxa"/>
+          </w:tcPr>
+          <w:p>
+            <w:r>
+              <w:t>0</w:t>
+            </w:r>
+          </w:p>
+        </w:tc>
+        <w:tc>
+          <w:tcPr>
+            <w:tcW w:w="1447" w:type="dxa"/>
+          </w:tcPr>
+          <w:p>
+            <w:r>
+              <w:t>0x00000000</w:t>
+            </w:r>
+          </w:p>
+        </w:tc>
+        <w:tc>
+          <w:tcPr>
+            <w:tcW w:w="2325" w:type="dxa"/>
+          </w:tcPr>
+          <w:p>
+            <w:r>
+              <w:t>0</w:t>
+            </w:r>
+          </w:p>
+        </w:tc>
+        <w:tc>
+          <w:tcPr>
+            <w:tcW w:w="1721" w:type="dxa"/>
+          </w:tcPr>
+          <w:p>
+            <w:r>
+              <w:t>MBR</w:t>
+            </w:r>
+          </w:p>
+        </w:tc>
+        <w:tc>
+          <w:tcPr>
+            <w:tcW w:w="1980" w:type="dxa"/>
+          </w:tcPr>
+          <w:p>
+            <w:r>
+              <w:t>512</w:t>
+            </w:r>
+          </w:p>
+        </w:tc>
+        <w:tc>
+          <w:tcPr>
+            <w:tcW w:w="1080" w:type="dxa"/>
+          </w:tcPr>
+          <w:p>
+            <w:r>
+              <w:t>1</w:t>
+            </w:r>
+          </w:p>
+        </w:tc>
+      </w:tr>
+      <w:tr>
+        <w:tc>
+          <w:tcPr>
+            <w:tcW w:w="1702" w:type="dxa"/>
+          </w:tcPr>
+          <w:p>
+            <w:r>
+              <w:t>2048(+2048)</w:t>
+            </w:r>
+          </w:p>
+        </w:tc>
+        <w:tc>
+          <w:tcPr>
+            <w:tcW w:w="1447" w:type="dxa"/>
+          </w:tcPr>
+          <w:p>
+            <w:r>
+              <w:t>0x00</w:t>
+            </w:r>
+            <w:r>
+              <w:rPr>
+                <w:color w:val="EE0000"/>
+              </w:rPr>
+              <w:t>1</w:t>
+            </w:r>
+            <w:r>
+              <w:t>00000</w:t>
+            </w:r>
+          </w:p>
+        </w:tc>
+        <w:tc>
+          <w:tcPr>
+            <w:tcW w:w="2325" w:type="dxa"/>
+          </w:tcPr>
+          <w:p>
+            <w:r>
+              <w:t>1</w:t>
+            </w:r>
+            <w:r>
+              <w:t>,</w:t>
+            </w:r>
+            <w:r>
+              <w:t>048</w:t>
+            </w:r>
+            <w:r>
+              <w:t>,</w:t>
+            </w:r>
+            <w:r>
+              <w:t>576</w:t>
+            </w:r>
+            <w:r>
+              <w:t>(1MiB)</w:t>
+            </w:r>
+          </w:p>
+        </w:tc>
+        <w:tc>
+          <w:tcPr>
+            <w:tcW w:w="1721" w:type="dxa"/>
+          </w:tcPr>
+          <w:p>
+            <w:r>
+              <w:t>VBR</w:t>
+            </w:r>
+          </w:p>
+        </w:tc>
+        <w:tc>
+          <w:tcPr>
+            <w:tcW w:w="1980" w:type="dxa"/>
+          </w:tcPr>
+          <w:p>
+            <w:r>
+              <w:t>512</w:t>
+            </w:r>
+          </w:p>
+        </w:tc>
+        <w:tc>
+          <w:tcPr>
+            <w:tcW w:w="1080" w:type="dxa"/>
+          </w:tcPr>
+          <w:p>
+            <w:r>
+              <w:t>1</w:t>
+            </w:r>
+          </w:p>
+        </w:tc>
+      </w:tr>
+      <w:tr>
+        <w:tc>
+          <w:tcPr>
+            <w:tcW w:w="1702" w:type="dxa"/>
+          </w:tcPr>
+          <w:p>
+            <w:r>
+              <w:t>2049(+1)</w:t>
+            </w:r>
+          </w:p>
+        </w:tc>
+        <w:tc>
+          <w:tcPr>
+            <w:tcW w:w="1447" w:type="dxa"/>
+          </w:tcPr>
+          <w:p>
+            <w:r>
+              <w:t>0x</w:t>
+            </w:r>
+            <w:r>
+              <w:t>00</w:t>
+            </w:r>
+            <w:r>
+              <w:t>100</w:t>
+            </w:r>
+            <w:r>
+              <w:rPr>
+                <w:color w:val="EE0000"/>
+              </w:rPr>
+              <w:t>2</w:t>
+            </w:r>
+            <w:r>
+              <w:t>00</w:t>
+            </w:r>
+          </w:p>
+        </w:tc>
+        <w:tc>
+          <w:tcPr>
+            <w:tcW w:w="2325" w:type="dxa"/>
+          </w:tcPr>
+          <w:p>
+            <w:r>
+              <w:t>1</w:t>
+            </w:r>
+            <w:r>
+              <w:t>,</w:t>
+            </w:r>
+            <w:r>
+              <w:t>049</w:t>
+            </w:r>
+            <w:r>
+              <w:t>,</w:t>
+            </w:r>
+            <w:r>
+              <w:t>088</w:t>
+            </w:r>
+            <w:r>
+              <w:t>(1MiB+)</w:t>
+            </w:r>
+          </w:p>
+        </w:tc>
+        <w:tc>
+          <w:tcPr>
+            <w:tcW w:w="1721" w:type="dxa"/>
+          </w:tcPr>
+          <w:p>
+            <w:r>
+              <w:t>FSInfo</w:t>
+            </w:r>
+          </w:p>
+        </w:tc>
+        <w:tc>
+          <w:tcPr>
+            <w:tcW w:w="1980" w:type="dxa"/>
+          </w:tcPr>
+          <w:p>
+            <w:r>
+              <w:t>512</w:t>
+            </w:r>
+          </w:p>
+        </w:tc>
+        <w:tc>
+          <w:tcPr>
+            <w:tcW w:w="1080" w:type="dxa"/>
+          </w:tcPr>
+          <w:p>
+            <w:r>
+              <w:t>1</w:t>
+            </w:r>
+          </w:p>
+        </w:tc>
+      </w:tr>
+      <w:tr>
+        <w:tc>
+          <w:tcPr>
+            <w:tcW w:w="1702" w:type="dxa"/>
+          </w:tcPr>
+          <w:p>
+            <w:r>
+              <w:t>2054(+5)</w:t>
+            </w:r>
+          </w:p>
+        </w:tc>
+        <w:tc>
+          <w:tcPr>
+            <w:tcW w:w="1447" w:type="dxa"/>
+          </w:tcPr>
+          <w:p>
+            <w:r>
+              <w:t>0x</w:t>
+            </w:r>
+            <w:r>
+              <w:t>00</w:t>
+            </w:r>
+            <w:r>
+              <w:t>100</w:t>
+            </w:r>
+            <w:r>
+              <w:rPr>
+                <w:color w:val="EE0000"/>
+              </w:rPr>
+              <w:t>C</w:t>
+            </w:r>
+            <w:r>
+              <w:t>00</w:t>
+            </w:r>
+          </w:p>
+        </w:tc>
+        <w:tc>
+          <w:tcPr>
+            <w:tcW w:w="2325" w:type="dxa"/>
+          </w:tcPr>
+          <w:p>
+            <w:r>
+              <w:t>1</w:t>
+            </w:r>
+            <w:r>
+              <w:t>,</w:t>
+            </w:r>
+            <w:r>
+              <w:t>051</w:t>
+            </w:r>
+            <w:r>
+              <w:t>,</w:t>
+            </w:r>
+            <w:r>
+              <w:t>648</w:t>
+            </w:r>
+            <w:r>
+              <w:t>(1MiB+)</w:t>
+            </w:r>
+          </w:p>
+        </w:tc>
+        <w:tc>
+          <w:tcPr>
+            <w:tcW w:w="1721" w:type="dxa"/>
+          </w:tcPr>
+          <w:p>
+            <w:r>
+              <w:t xml:space="preserve">Backup </w:t>
+            </w:r>
+            <w:r>
+              <w:t>VBR</w:t>
+            </w:r>
+          </w:p>
+        </w:tc>
+        <w:tc>
+          <w:tcPr>
+            <w:tcW w:w="1980" w:type="dxa"/>
+          </w:tcPr>
+          <w:p>
+            <w:r>
+              <w:t>512</w:t>
+            </w:r>
+          </w:p>
+        </w:tc>
+        <w:tc>
+          <w:tcPr>
+            <w:tcW w:w="1080" w:type="dxa"/>
+          </w:tcPr>
+          <w:p>
+            <w:r>
+              <w:t>1</w:t>
+            </w:r>
+          </w:p>
+        </w:tc>
+      </w:tr>
+      <w:tr>
+        <w:tc>
+          <w:tcPr>
+            <w:tcW w:w="1702" w:type="dxa"/>
+          </w:tcPr>
+          <w:p>
+            <w:r>
+              <w:t>2080(+26)</w:t>
+            </w:r>
+          </w:p>
+        </w:tc>
+        <w:tc>
+          <w:tcPr>
+            <w:tcW w:w="1447" w:type="dxa"/>
+          </w:tcPr>
+          <w:p>
+            <w:r>
+              <w:t>0x</w:t>
+            </w:r>
+            <w:r>
+              <w:t>00</w:t>
+            </w:r>
+            <w:r>
+              <w:t>10</w:t>
+            </w:r>
+            <w:r>
+              <w:rPr>
+                <w:color w:val="EE0000"/>
+              </w:rPr>
+              <w:t>4</w:t>
+            </w:r>
+            <w:r>
+              <w:rPr>
+                <w:color w:val="EE0000"/>
+              </w:rPr>
+              <w:t>0</w:t>
+            </w:r>
+            <w:r>
+              <w:t>00</w:t>
+            </w:r>
+          </w:p>
+        </w:tc>
+        <w:tc>
+          <w:tcPr>
+            <w:tcW w:w="2325" w:type="dxa"/>
+          </w:tcPr>
+          <w:p>
+            <w:r>
+              <w:t>1</w:t>
+            </w:r>
+            <w:r>
+              <w:t>,</w:t>
+            </w:r>
+            <w:r>
+              <w:t>064</w:t>
+            </w:r>
+            <w:r>
+              <w:t>,</w:t>
+            </w:r>
+            <w:r>
+              <w:t>960</w:t>
+            </w:r>
+            <w:r>
+              <w:t>(1MiB+)</w:t>
+            </w:r>
+          </w:p>
+        </w:tc>
+        <w:tc>
+          <w:tcPr>
+            <w:tcW w:w="1721" w:type="dxa"/>
+          </w:tcPr>
+          <w:p>
+            <w:r>
+              <w:t>I guess FAT</w:t>
+            </w:r>
+          </w:p>
+        </w:tc>
+        <w:tc>
+          <w:tcPr>
+            <w:tcW w:w="1980" w:type="dxa"/>
+          </w:tcPr>
+          <w:p>
+            <w:r>
+              <w:t>266</w:t>
+            </w:r>
+            <w:r>
+              <w:t>,</w:t>
+            </w:r>
+            <w:r>
+              <w:t>240</w:t>
+            </w:r>
+            <w:r>
+              <w:t>(26KiB)</w:t>
+            </w:r>
+          </w:p>
+        </w:tc>
+        <w:tc>
+          <w:tcPr>
+            <w:tcW w:w="1080" w:type="dxa"/>
+          </w:tcPr>
+          <w:p>
+            <w:r>
+              <w:t>520</w:t>
+            </w:r>
+          </w:p>
+        </w:tc>
+      </w:tr>
+      <w:tr>
+        <w:tc>
+          <w:tcPr>
+            <w:tcW w:w="1702" w:type="dxa"/>
+          </w:tcPr>
+          <w:p>
+            <w:r>
+              <w:t>2600(+520)</w:t>
+            </w:r>
+          </w:p>
+        </w:tc>
+        <w:tc>
+          <w:tcPr>
+            <w:tcW w:w="1447" w:type="dxa"/>
+          </w:tcPr>
+          <w:p>
+            <w:r>
+              <w:t>0x</w:t>
+            </w:r>
+            <w:r>
+              <w:t>00</w:t>
+            </w:r>
+            <w:r>
+              <w:t>1</w:t>
+            </w:r>
+            <w:r>
+              <w:rPr>
+                <w:color w:val="EE0000"/>
+              </w:rPr>
+              <w:t>4</w:t>
+            </w:r>
+            <w:r>
+              <w:t>5000</w:t>
+            </w:r>
+          </w:p>
+        </w:tc>
+        <w:tc>
+          <w:tcPr>
+            <w:tcW w:w="2325" w:type="dxa"/>
+          </w:tcPr>
+          <w:p>
+            <w:r>
+              <w:t>1</w:t>
+            </w:r>
+            <w:r>
+              <w:t>,</w:t>
+            </w:r>
+            <w:r>
+              <w:t>331</w:t>
+            </w:r>
+            <w:r>
+              <w:t>,</w:t>
+            </w:r>
+            <w:r>
+              <w:t>200</w:t>
+            </w:r>
+            <w:r>
+              <w:t>(1,3MiB)</w:t>
+            </w:r>
+          </w:p>
+        </w:tc>
+        <w:tc>
+          <w:tcPr>
+            <w:tcW w:w="1721" w:type="dxa"/>
+          </w:tcPr>
+          <w:p>
+            <w:r>
+              <w:t>I guess FAT</w:t>
+            </w:r>
+          </w:p>
+        </w:tc>
+        <w:tc>
+          <w:tcPr>
+            <w:tcW w:w="1980" w:type="dxa"/>
+          </w:tcPr>
+          <w:p>
+            <w:r>
+              <w:t>266</w:t>
+            </w:r>
+            <w:r>
+              <w:t>,</w:t>
+            </w:r>
+            <w:r>
+              <w:t>240</w:t>
+            </w:r>
+            <w:r>
+              <w:t>(26KiB)</w:t>
+            </w:r>
+          </w:p>
+        </w:tc>
+        <w:tc>
+          <w:tcPr>
+            <w:tcW w:w="1080" w:type="dxa"/>
+          </w:tcPr>
+          <w:p>
+            <w:r>
+              <w:t>520</w:t>
+            </w:r>
+          </w:p>
+        </w:tc>
+      </w:tr>
+      <w:tr>
+        <w:tc>
+          <w:tcPr>
+            <w:tcW w:w="1702" w:type="dxa"/>
+          </w:tcPr>
+          <w:p>
+            <w:r>
+              <w:t>3120(+520)</w:t>
+            </w:r>
+          </w:p>
+        </w:tc>
+        <w:tc>
+          <w:tcPr>
+            <w:tcW w:w="1447" w:type="dxa"/>
+          </w:tcPr>
+          <w:p>
+            <w:r>
+              <w:t>0x</w:t>
+            </w:r>
+            <w:r>
+              <w:t>00</w:t>
+            </w:r>
+            <w:r>
+              <w:rPr>
+                <w:color w:val="EE0000"/>
+              </w:rPr>
+              <w:t>18</w:t>
+            </w:r>
+            <w:r>
+              <w:t>6000</w:t>
+            </w:r>
+          </w:p>
+        </w:tc>
+        <w:tc>
+          <w:tcPr>
+            <w:tcW w:w="2325" w:type="dxa"/>
+          </w:tcPr>
+          <w:p>
+            <w:r>
+              <w:t>1</w:t>
+            </w:r>
+            <w:r>
+              <w:t>,</w:t>
+            </w:r>
+            <w:r>
+              <w:t>597</w:t>
+            </w:r>
+            <w:r>
+              <w:t>,</w:t>
+            </w:r>
+            <w:r>
+              <w:t>440</w:t>
+            </w:r>
+            <w:r>
+              <w:t>(1,5MiB)</w:t>
+            </w:r>
+          </w:p>
+        </w:tc>
+        <w:tc>
+          <w:tcPr>
+            <w:tcW w:w="1721" w:type="dxa"/>
+          </w:tcPr>
+          <w:p>
+            <w:r>
+              <w:t>Data</w:t>
+            </w:r>
+          </w:p>
+        </w:tc>
+        <w:tc>
+          <w:tcPr>
+            <w:tcW w:w="1980" w:type="dxa"/>
+          </w:tcPr>
+          <w:p>
+            <w:r>
+              <w:t>???</w:t>
+            </w:r>
+          </w:p>
+        </w:tc>
+        <w:tc>
+          <w:tcPr>
+            <w:tcW w:w="1080" w:type="dxa"/>
+          </w:tcPr>
+          <w:p/>
+        </w:tc>
+      </w:tr>
+      <w:tr>
+        <w:tc>
+          <w:tcPr>
+            <w:tcW w:w="1702" w:type="dxa"/>
+          </w:tcPr>
+          <w:p/>
+        </w:tc>
+        <w:tc>
+          <w:tcPr>
+            <w:tcW w:w="1447" w:type="dxa"/>
+          </w:tcPr>
+          <w:p>
+            <w:r>
+              <w:t>0x00000000</w:t>
+            </w:r>
+          </w:p>
+        </w:tc>
+        <w:tc>
+          <w:tcPr>
+            <w:tcW w:w="2325" w:type="dxa"/>
+          </w:tcPr>
+          <w:p/>
+        </w:tc>
+        <w:tc>
+          <w:tcPr>
+            <w:tcW w:w="1721" w:type="dxa"/>
+          </w:tcPr>
+          <w:p/>
+        </w:tc>
+        <w:tc>
+          <w:tcPr>
+            <w:tcW w:w="1980" w:type="dxa"/>
+          </w:tcPr>
+          <w:p/>
+        </w:tc>
+        <w:tc>
+          <w:tcPr>
+            <w:tcW w:w="1080" w:type="dxa"/>
+          </w:tcPr>
+          <w:p/>
+        </w:tc>
+      </w:tr>
+      <w:tr>
+        <w:tc>
+          <w:tcPr>
+            <w:tcW w:w="1702" w:type="dxa"/>
+          </w:tcPr>
+          <w:p/>
+        </w:tc>
+        <w:tc>
+          <w:tcPr>
+            <w:tcW w:w="1447" w:type="dxa"/>
+          </w:tcPr>
+          <w:p>
+            <w:r>
+              <w:t>0x00000000</w:t>
+            </w:r>
+          </w:p>
+        </w:tc>
+        <w:tc>
+          <w:tcPr>
+            <w:tcW w:w="2325" w:type="dxa"/>
+          </w:tcPr>
+          <w:p/>
+        </w:tc>
+        <w:tc>
+          <w:tcPr>
+            <w:tcW w:w="1721" w:type="dxa"/>
+          </w:tcPr>
+          <w:p/>
+        </w:tc>
+        <w:tc>
+          <w:tcPr>
+            <w:tcW w:w="1980" w:type="dxa"/>
+          </w:tcPr>
+          <w:p/>
+        </w:tc>
+        <w:tc>
+          <w:tcPr>
+            <w:tcW w:w="1080" w:type="dxa"/>
+          </w:tcPr>
+          <w:p/>
+        </w:tc>
+      </w:tr>
+      <w:tr>
+        <w:tc>
+          <w:tcPr>
+            <w:tcW w:w="1702" w:type="dxa"/>
+          </w:tcPr>
+          <w:p/>
+        </w:tc>
+        <w:tc>
+          <w:tcPr>
+            <w:tcW w:w="1447" w:type="dxa"/>
+          </w:tcPr>
+          <w:p>
+            <w:r>
+              <w:t>0x00000000</w:t>
+            </w:r>
+          </w:p>
+        </w:tc>
+        <w:tc>
+          <w:tcPr>
+            <w:tcW w:w="2325" w:type="dxa"/>
+          </w:tcPr>
+          <w:p/>
+        </w:tc>
+        <w:tc>
+          <w:tcPr>
+            <w:tcW w:w="1721" w:type="dxa"/>
+          </w:tcPr>
+          <w:p/>
+        </w:tc>
+        <w:tc>
+          <w:tcPr>
+            <w:tcW w:w="1980" w:type="dxa"/>
+          </w:tcPr>
+          <w:p/>
+        </w:tc>
+        <w:tc>
+          <w:tcPr>
+            <w:tcW w:w="1080" w:type="dxa"/>
+          </w:tcPr>
+          <w:p/>
+        </w:tc>
+      </w:tr>
+      <w:tr>
+        <w:tc>
+          <w:tcPr>
+            <w:tcW w:w="1702" w:type="dxa"/>
+          </w:tcPr>
+          <w:p/>
+        </w:tc>
+        <w:tc>
+          <w:tcPr>
+            <w:tcW w:w="1447" w:type="dxa"/>
+          </w:tcPr>
+          <w:p>
+            <w:r>
+              <w:t>0x00000000</w:t>
+            </w:r>
+          </w:p>
+        </w:tc>
+        <w:tc>
+          <w:tcPr>
+            <w:tcW w:w="2325" w:type="dxa"/>
+          </w:tcPr>
+          <w:p/>
+        </w:tc>
+        <w:tc>
+          <w:tcPr>
+            <w:tcW w:w="1721" w:type="dxa"/>
+          </w:tcPr>
+          <w:p/>
+        </w:tc>
+        <w:tc>
+          <w:tcPr>
+            <w:tcW w:w="1980" w:type="dxa"/>
+          </w:tcPr>
+          <w:p/>
+        </w:tc>
+        <w:tc>
+          <w:tcPr>
+            <w:tcW w:w="1080" w:type="dxa"/>
+          </w:tcPr>
+          <w:p/>
+        </w:tc>
+      </w:tr>
+    </w:tbl>
+    <w:p/>
+    <w:p>
+      <w:r>
+        <w:t>What is missing</w:t>
+      </w:r>
+    </w:p>
+    <w:p>
+      <w:r>
+        <w:t xml:space="preserve">Backup </w:t>
+      </w:r>
+      <w:proofErr w:type="spellStart"/>
+      <w:r>
+        <w:t>MSinfo</w:t>
+      </w:r>
+      <w:proofErr w:type="spellEnd"/>
     </w:p>
     <w:p/>
     <w:p/>
+    <w:p>
+      <w:pPr>
+        <w:pStyle w:val="Heading3"/>
+      </w:pPr>
+      <w:r>
+        <w:t>Script to create the canonical FAT32 file</w:t>
+      </w:r>
+    </w:p>
+    <w:p/>
+    <w:p>
+      <w:proofErr w:type="gramStart"/>
+      <w:r>
+        <w:t>#!/</w:t>
+      </w:r>
+      <w:proofErr w:type="gramEnd"/>
+      <w:r>
+        <w:t>bin/bash</w:t>
+      </w:r>
+    </w:p>
+    <w:p>
+      <w:r>
+        <w:t>set -e</w:t>
+      </w:r>
+    </w:p>
+    <w:p>
+      <w:r>
+        <w:t>echo "Deleting the file first"</w:t>
+      </w:r>
+    </w:p>
+    <w:p>
+      <w:r>
+        <w:t>sudo rm hd34mbfat32.img</w:t>
+      </w:r>
+    </w:p>
+    <w:p/>
+    <w:p>
+      <w:r>
+        <w:t># Name of the image</w:t>
+      </w:r>
+    </w:p>
+    <w:p>
+      <w:r>
+        <w:t>IMG_NAME="hd34mbfat32.img"</w:t>
+      </w:r>
+    </w:p>
+    <w:p/>
+    <w:p>
+      <w:r>
+        <w:t># Create a 34 MB empty disk image</w:t>
+      </w:r>
+    </w:p>
+    <w:p>
+      <w:r>
+        <w:t>echo "Creating 34MB blank image..."</w:t>
+      </w:r>
+    </w:p>
+    <w:p>
+      <w:r>
+        <w:t>dd if=/dev/zero of="$IMG_NAME" bs=1M count=34</w:t>
+      </w:r>
+    </w:p>
+    <w:p/>
+    <w:p>
+      <w:r>
+        <w:t># Create MBR partition table</w:t>
+      </w:r>
+    </w:p>
+    <w:p>
+      <w:r>
+        <w:t>echo "Creating MBR partition table..."</w:t>
+      </w:r>
+    </w:p>
+    <w:p>
+      <w:r>
+        <w:t xml:space="preserve">sudo parted "$IMG_NAME" --script </w:t>
+      </w:r>
+      <w:proofErr w:type="spellStart"/>
+      <w:r>
+        <w:t>mklabel</w:t>
+      </w:r>
+      <w:proofErr w:type="spellEnd"/>
+      <w:r>
+        <w:t xml:space="preserve"> </w:t>
+      </w:r>
+      <w:proofErr w:type="spellStart"/>
+      <w:r>
+        <w:t>msdos</w:t>
+      </w:r>
+      <w:proofErr w:type="spellEnd"/>
+    </w:p>
+    <w:p/>
+    <w:p>
+      <w:r>
+        <w:t># Create FAT32 partition starting at 1MiB until the end</w:t>
+      </w:r>
+    </w:p>
+    <w:p>
+      <w:r>
+        <w:t>echo "Creating FAT32 partition..."</w:t>
+      </w:r>
+    </w:p>
+    <w:p>
+      <w:r>
+        <w:t xml:space="preserve">sudo parted "$IMG_NAME" --script </w:t>
+      </w:r>
+      <w:proofErr w:type="spellStart"/>
+      <w:r>
+        <w:t>mkpart</w:t>
+      </w:r>
+      <w:proofErr w:type="spellEnd"/>
+      <w:r>
+        <w:t xml:space="preserve"> primary fat32 1MiB 100%</w:t>
+      </w:r>
+    </w:p>
+    <w:p/>
+    <w:p>
+      <w:r>
+        <w:t xml:space="preserve">echo "Show the FAT </w:t>
+      </w:r>
+      <w:proofErr w:type="gramStart"/>
+      <w:r>
+        <w:t>partition:...</w:t>
+      </w:r>
+      <w:proofErr w:type="gramEnd"/>
+      <w:r>
+        <w:t>.."</w:t>
+      </w:r>
+    </w:p>
+    <w:p>
+      <w:r>
+        <w:lastRenderedPageBreak/>
+        <w:t xml:space="preserve">sudo parted hd34mbfat32.img unit B print </w:t>
+      </w:r>
+    </w:p>
+    <w:p/>
+    <w:p>
+      <w:r>
+        <w:t xml:space="preserve">echo "Format </w:t>
+      </w:r>
+      <w:proofErr w:type="gramStart"/>
+      <w:r>
+        <w:t>it:...</w:t>
+      </w:r>
+      <w:proofErr w:type="gramEnd"/>
+      <w:r>
+        <w:t>.."</w:t>
+      </w:r>
+    </w:p>
+    <w:p>
+      <w:proofErr w:type="spellStart"/>
+      <w:r>
+        <w:t>mformat</w:t>
+      </w:r>
+      <w:proofErr w:type="spellEnd"/>
+      <w:r>
+        <w:t xml:space="preserve"> -</w:t>
+      </w:r>
+      <w:proofErr w:type="spellStart"/>
+      <w:r>
+        <w:t>i</w:t>
+      </w:r>
+      <w:proofErr w:type="spellEnd"/>
+      <w:r>
+        <w:t xml:space="preserve"> hd34mbfat32.img@@1048576 -</w:t>
+      </w:r>
+      <w:proofErr w:type="gramStart"/>
+      <w:r>
+        <w:t>F :</w:t>
+      </w:r>
+      <w:proofErr w:type="gramEnd"/>
+      <w:r>
+        <w:t>:</w:t>
+      </w:r>
+    </w:p>
+    <w:p/>
+    <w:p>
+      <w:r>
+        <w:t xml:space="preserve">echo "Show the FAT </w:t>
+      </w:r>
+      <w:proofErr w:type="gramStart"/>
+      <w:r>
+        <w:t>partition:...</w:t>
+      </w:r>
+      <w:proofErr w:type="gramEnd"/>
+      <w:r>
+        <w:t>.."</w:t>
+      </w:r>
+    </w:p>
+    <w:p>
+      <w:r>
+        <w:t xml:space="preserve">sudo parted hd34mbfat32.img unit B print </w:t>
+      </w:r>
+    </w:p>
+    <w:p/>
+    <w:p>
+      <w:r>
+        <w:t>echo "Done!"</w:t>
+      </w:r>
+    </w:p>
+    <w:p>
+      <w:pPr>
+        <w:rPr>
+          <w:b/>
+          <w:bCs/>
+        </w:rPr>
+      </w:pPr>
+    </w:p>
     <w:p/>
     <w:p/>
     <w:p>
       <w:pPr>
-        <w:rPr>
-          <w:b/>
-          <w:bCs/>
-        </w:rPr>
-      </w:pPr>
-    </w:p>
-    <w:p>
-      <w:pPr>
-        <w:rPr>
-          <w:b/>
-          <w:bCs/>
-        </w:rPr>
-      </w:pPr>
+        <w:pStyle w:val="Heading2"/>
+      </w:pPr>
+      <w:bookmarkStart w:id="31" w:name="_Toc213355656"/>
+      <w:r>
+        <w:t xml:space="preserve">Return to the last working directory. Windows and </w:t>
+      </w:r>
+      <w:proofErr w:type="spellStart"/>
+      <w:r>
+        <w:t>linux</w:t>
+      </w:r>
+      <w:bookmarkEnd w:id="31"/>
+      <w:proofErr w:type="spellEnd"/>
+    </w:p>
+    <w:p/>
+    <w:p>
+      <w:pPr>
+        <w:pStyle w:val="ListParagraph"/>
+        <w:numPr>
+          <w:ilvl w:val="0"/>
+          <w:numId w:val="1"/>
+        </w:numPr>
+      </w:pPr>
+      <w:r>
+        <w:t>Linux:</w:t>
+      </w:r>
+    </w:p>
+    <w:p>
+      <w:pPr>
+        <w:pStyle w:val="ListParagraph"/>
+        <w:numPr>
+          <w:ilvl w:val="1"/>
+          <w:numId w:val="1"/>
+        </w:numPr>
+      </w:pPr>
+      <w:r>
+        <w:t>“</w:t>
+      </w:r>
+      <w:proofErr w:type="gramStart"/>
+      <w:r>
+        <w:t>cd</w:t>
+      </w:r>
+      <w:proofErr w:type="gramEnd"/>
+      <w:r>
+        <w:t xml:space="preserve"> </w:t>
+      </w:r>
+      <w:proofErr w:type="gramStart"/>
+      <w:r>
+        <w:t>–“</w:t>
+      </w:r>
+      <w:proofErr w:type="gramEnd"/>
+    </w:p>
+    <w:p>
+      <w:pPr>
+        <w:pStyle w:val="ListParagraph"/>
+        <w:numPr>
+          <w:ilvl w:val="0"/>
+          <w:numId w:val="1"/>
+        </w:numPr>
+      </w:pPr>
+      <w:r>
+        <w:t>Windows:</w:t>
+      </w:r>
+    </w:p>
+    <w:p>
+      <w:pPr>
+        <w:pStyle w:val="ListParagraph"/>
+        <w:numPr>
+          <w:ilvl w:val="1"/>
+          <w:numId w:val="1"/>
+        </w:numPr>
+      </w:pPr>
+      <w:proofErr w:type="spellStart"/>
+      <w:r>
+        <w:t>Pushd</w:t>
+      </w:r>
+      <w:proofErr w:type="spellEnd"/>
+      <w:r>
+        <w:t xml:space="preserve"> or push-location</w:t>
+      </w:r>
+    </w:p>
+    <w:p>
+      <w:pPr>
+        <w:pStyle w:val="ListParagraph"/>
+        <w:numPr>
+          <w:ilvl w:val="1"/>
+          <w:numId w:val="1"/>
+        </w:numPr>
+      </w:pPr>
+      <w:r>
+        <w:t xml:space="preserve">Move </w:t>
+      </w:r>
+    </w:p>
+    <w:p>
+      <w:pPr>
+        <w:pStyle w:val="ListParagraph"/>
+        <w:numPr>
+          <w:ilvl w:val="1"/>
+          <w:numId w:val="1"/>
+        </w:numPr>
+      </w:pPr>
+      <w:proofErr w:type="spellStart"/>
+      <w:r>
+        <w:t>Popd</w:t>
+      </w:r>
+      <w:proofErr w:type="spellEnd"/>
+      <w:r>
+        <w:t xml:space="preserve"> or pop-location</w:t>
+      </w:r>
+    </w:p>
+    <w:p/>
+    <w:p>
+      <w:pPr>
+        <w:pStyle w:val="Heading2"/>
+      </w:pPr>
+      <w:bookmarkStart w:id="32" w:name="_Toc213355657"/>
+      <w:r>
+        <w:t>Forcing a pointer to be interpreted as a type does have a name: Type punning</w:t>
+      </w:r>
+      <w:bookmarkEnd w:id="32"/>
+    </w:p>
+    <w:p/>
+    <w:p>
+      <w:pPr>
+        <w:pStyle w:val="ListParagraph"/>
+        <w:numPr>
+          <w:ilvl w:val="0"/>
+          <w:numId w:val="1"/>
+        </w:numPr>
+      </w:pPr>
+      <w:r>
+        <w:t>Seriously</w:t>
+      </w:r>
+      <w:r>
+        <w:t>…?</w:t>
+      </w:r>
     </w:p>
     <w:p/>
     <w:p/>
@@ -19624,16 +21164,74 @@
       <w:pPr>
         <w:pStyle w:val="Heading2"/>
       </w:pPr>
-      <w:bookmarkStart w:id="31" w:name="_Toc213355656"/>
-      <w:r>
-        <w:t xml:space="preserve">Return to the last working directory. Windows and </w:t>
+      <w:r>
+        <w:t>Run a bash script from WSL but on the mounted windows drive and created on Windows:</w:t>
+      </w:r>
+    </w:p>
+    <w:p/>
+    <w:p>
+      <w:pPr>
+        <w:pStyle w:val="ListParagraph"/>
+        <w:numPr>
+          <w:ilvl w:val="0"/>
+          <w:numId w:val="1"/>
+        </w:numPr>
+      </w:pPr>
+      <w:r>
+        <w:t>Create the .</w:t>
       </w:r>
       <w:proofErr w:type="spellStart"/>
       <w:r>
-        <w:t>linux</w:t>
-      </w:r>
-      <w:bookmarkEnd w:id="31"/>
+        <w:t>sh</w:t>
+      </w:r>
       <w:proofErr w:type="spellEnd"/>
+      <w:r>
+        <w:t xml:space="preserve"> file on Windows</w:t>
+      </w:r>
+    </w:p>
+    <w:p>
+      <w:pPr>
+        <w:pStyle w:val="ListParagraph"/>
+        <w:numPr>
+          <w:ilvl w:val="0"/>
+          <w:numId w:val="1"/>
+        </w:numPr>
+      </w:pPr>
+      <w:r>
+        <w:t xml:space="preserve">Execute </w:t>
+      </w:r>
+      <w:r>
+        <w:t>dos2unix _createfatdisc.sh</w:t>
+      </w:r>
+      <w:r>
+        <w:t xml:space="preserve"> to convert the end of file and lines</w:t>
+      </w:r>
+    </w:p>
+    <w:p>
+      <w:pPr>
+        <w:pStyle w:val="ListParagraph"/>
+        <w:numPr>
+          <w:ilvl w:val="0"/>
+          <w:numId w:val="1"/>
+        </w:numPr>
+      </w:pPr>
+      <w:r>
+        <w:t xml:space="preserve">Execute normally from WSL: </w:t>
+      </w:r>
+      <w:r>
+        <w:t>./_createfatdisc.sh</w:t>
+      </w:r>
+    </w:p>
+    <w:p>
+      <w:pPr>
+        <w:pStyle w:val="Heading1"/>
+      </w:pPr>
+      <w:bookmarkStart w:id="33" w:name="_Toc213355658"/>
+      <w:r>
+        <w:lastRenderedPageBreak/>
+        <w:t>Research backlog</w:t>
+      </w:r>
+      <w:bookmarkEnd w:id="33"/>
     </w:p>
     <w:p/>
     <w:p>
@@ -19645,33 +21243,17 @@
         </w:numPr>
       </w:pPr>
       <w:r>
-        <w:t>Linux:</w:t>
-      </w:r>
-    </w:p>
-    <w:p>
-      <w:pPr>
-        <w:pStyle w:val="ListParagraph"/>
-        <w:numPr>
-          <w:ilvl w:val="1"/>
-          <w:numId w:val="1"/>
-        </w:numPr>
-      </w:pPr>
-      <w:r>
-        <w:t>“</w:t>
-      </w:r>
-      <w:proofErr w:type="gramStart"/>
-      <w:r>
-        <w:t>cd</w:t>
-      </w:r>
-      <w:proofErr w:type="gramEnd"/>
+        <w:t>Disk formats FAT12/</w:t>
+      </w:r>
+      <w:r>
+        <w:t>16/</w:t>
+      </w:r>
+      <w:r>
+        <w:t>32</w:t>
+      </w:r>
       <w:r>
         <w:t xml:space="preserve"> </w:t>
       </w:r>
-      <w:proofErr w:type="gramStart"/>
-      <w:r>
-        <w:t>–“</w:t>
-      </w:r>
-      <w:proofErr w:type="gramEnd"/>
     </w:p>
     <w:p>
       <w:pPr>
@@ -19682,124 +21264,6 @@
         </w:numPr>
       </w:pPr>
       <w:r>
-        <w:t>Windows:</w:t>
-      </w:r>
-    </w:p>
-    <w:p>
-      <w:pPr>
-        <w:pStyle w:val="ListParagraph"/>
-        <w:numPr>
-          <w:ilvl w:val="1"/>
-          <w:numId w:val="1"/>
-        </w:numPr>
-      </w:pPr>
-      <w:proofErr w:type="spellStart"/>
-      <w:r>
-        <w:t>Pushd</w:t>
-      </w:r>
-      <w:proofErr w:type="spellEnd"/>
-      <w:r>
-        <w:t xml:space="preserve"> or push-location</w:t>
-      </w:r>
-    </w:p>
-    <w:p>
-      <w:pPr>
-        <w:pStyle w:val="ListParagraph"/>
-        <w:numPr>
-          <w:ilvl w:val="1"/>
-          <w:numId w:val="1"/>
-        </w:numPr>
-      </w:pPr>
-      <w:r>
-        <w:t xml:space="preserve">Move </w:t>
-      </w:r>
-    </w:p>
-    <w:p>
-      <w:pPr>
-        <w:pStyle w:val="ListParagraph"/>
-        <w:numPr>
-          <w:ilvl w:val="1"/>
-          <w:numId w:val="1"/>
-        </w:numPr>
-      </w:pPr>
-      <w:proofErr w:type="spellStart"/>
-      <w:r>
-        <w:t>Popd</w:t>
-      </w:r>
-      <w:proofErr w:type="spellEnd"/>
-      <w:r>
-        <w:t xml:space="preserve"> or pop-location</w:t>
-      </w:r>
-    </w:p>
-    <w:p/>
-    <w:p>
-      <w:pPr>
-        <w:pStyle w:val="Heading2"/>
-      </w:pPr>
-      <w:bookmarkStart w:id="32" w:name="_Toc213355657"/>
-      <w:r>
-        <w:t>Forcing a pointer to be interpreted as a type does have a name: Type punning</w:t>
-      </w:r>
-      <w:bookmarkEnd w:id="32"/>
-    </w:p>
-    <w:p/>
-    <w:p>
-      <w:pPr>
-        <w:pStyle w:val="ListParagraph"/>
-        <w:numPr>
-          <w:ilvl w:val="0"/>
-          <w:numId w:val="1"/>
-        </w:numPr>
-      </w:pPr>
-      <w:r>
-        <w:t>Seriously</w:t>
-      </w:r>
-      <w:r>
-        <w:t>…?</w:t>
-      </w:r>
-    </w:p>
-    <w:p>
-      <w:pPr>
-        <w:pStyle w:val="Heading1"/>
-      </w:pPr>
-      <w:bookmarkStart w:id="33" w:name="_Toc213355658"/>
-      <w:r>
-        <w:t>Research backlog</w:t>
-      </w:r>
-      <w:bookmarkEnd w:id="33"/>
-    </w:p>
-    <w:p/>
-    <w:p>
-      <w:pPr>
-        <w:pStyle w:val="ListParagraph"/>
-        <w:numPr>
-          <w:ilvl w:val="0"/>
-          <w:numId w:val="1"/>
-        </w:numPr>
-      </w:pPr>
-      <w:r>
-        <w:t>Disk formats FAT12/</w:t>
-      </w:r>
-      <w:r>
-        <w:t>16/</w:t>
-      </w:r>
-      <w:r>
-        <w:t>32</w:t>
-      </w:r>
-      <w:r>
-        <w:t xml:space="preserve"> </w:t>
-      </w:r>
-    </w:p>
-    <w:p>
-      <w:pPr>
-        <w:pStyle w:val="ListParagraph"/>
-        <w:numPr>
-          <w:ilvl w:val="0"/>
-          <w:numId w:val="1"/>
-        </w:numPr>
-      </w:pPr>
-      <w:r>
-        <w:lastRenderedPageBreak/>
         <w:t>Partition table on the MBR. I remember seeing adding 4 16</w:t>
       </w:r>
       <w:proofErr w:type="gramStart"/>
@@ -20046,7 +21510,7 @@
                     <pic:cNvPicPr/>
                   </pic:nvPicPr>
                   <pic:blipFill>
-                    <a:blip r:embed="rId46"/>
+                    <a:blip r:embed="rId49"/>
                     <a:stretch>
                       <a:fillRect/>
                     </a:stretch>
@@ -20114,7 +21578,7 @@
                     <pic:cNvPicPr/>
                   </pic:nvPicPr>
                   <pic:blipFill>
-                    <a:blip r:embed="rId47"/>
+                    <a:blip r:embed="rId50"/>
                     <a:stretch>
                       <a:fillRect/>
                     </a:stretch>
@@ -20195,7 +21659,7 @@
                     <pic:cNvPicPr/>
                   </pic:nvPicPr>
                   <pic:blipFill>
-                    <a:blip r:embed="rId48"/>
+                    <a:blip r:embed="rId51"/>
                     <a:stretch>
                       <a:fillRect/>
                     </a:stretch>
@@ -20284,7 +21748,7 @@
                     <pic:cNvPicPr/>
                   </pic:nvPicPr>
                   <pic:blipFill>
-                    <a:blip r:embed="rId49"/>
+                    <a:blip r:embed="rId52"/>
                     <a:stretch>
                       <a:fillRect/>
                     </a:stretch>
@@ -20357,7 +21821,7 @@
                     <pic:cNvPicPr/>
                   </pic:nvPicPr>
                   <pic:blipFill>
-                    <a:blip r:embed="rId50"/>
+                    <a:blip r:embed="rId53"/>
                     <a:stretch>
                       <a:fillRect/>
                     </a:stretch>
@@ -20424,7 +21888,7 @@
                     <pic:cNvPicPr/>
                   </pic:nvPicPr>
                   <pic:blipFill>
-                    <a:blip r:embed="rId51"/>
+                    <a:blip r:embed="rId54"/>
                     <a:stretch>
                       <a:fillRect/>
                     </a:stretch>
@@ -20498,7 +21962,7 @@
                     <pic:cNvPicPr/>
                   </pic:nvPicPr>
                   <pic:blipFill>
-                    <a:blip r:embed="rId52"/>
+                    <a:blip r:embed="rId55"/>
                     <a:stretch>
                       <a:fillRect/>
                     </a:stretch>
@@ -20571,7 +22035,7 @@
                     <pic:cNvPicPr/>
                   </pic:nvPicPr>
                   <pic:blipFill>
-                    <a:blip r:embed="rId53"/>
+                    <a:blip r:embed="rId56"/>
                     <a:stretch>
                       <a:fillRect/>
                     </a:stretch>
@@ -20644,7 +22108,7 @@
                     <pic:cNvPicPr/>
                   </pic:nvPicPr>
                   <pic:blipFill>
-                    <a:blip r:embed="rId54"/>
+                    <a:blip r:embed="rId57"/>
                     <a:stretch>
                       <a:fillRect/>
                     </a:stretch>
@@ -20717,7 +22181,7 @@
                     <pic:cNvPicPr/>
                   </pic:nvPicPr>
                   <pic:blipFill>
-                    <a:blip r:embed="rId55"/>
+                    <a:blip r:embed="rId58"/>
                     <a:stretch>
                       <a:fillRect/>
                     </a:stretch>
@@ -20790,7 +22254,7 @@
                     <pic:cNvPicPr/>
                   </pic:nvPicPr>
                   <pic:blipFill>
-                    <a:blip r:embed="rId56"/>
+                    <a:blip r:embed="rId59"/>
                     <a:stretch>
                       <a:fillRect/>
                     </a:stretch>
@@ -20868,7 +22332,7 @@
                     <pic:cNvPicPr/>
                   </pic:nvPicPr>
                   <pic:blipFill>
-                    <a:blip r:embed="rId57"/>
+                    <a:blip r:embed="rId60"/>
                     <a:stretch>
                       <a:fillRect/>
                     </a:stretch>
@@ -20933,7 +22397,7 @@
                     <pic:cNvPicPr/>
                   </pic:nvPicPr>
                   <pic:blipFill>
-                    <a:blip r:embed="rId58"/>
+                    <a:blip r:embed="rId61"/>
                     <a:stretch>
                       <a:fillRect/>
                     </a:stretch>
@@ -20974,6 +22438,22 @@
       </w:r>
     </w:p>
     <w:p>
+      <w:r>
+        <w:t>08-November-2025</w:t>
+      </w:r>
+    </w:p>
+    <w:p>
+      <w:r>
+        <w:t xml:space="preserve">No screenshots </w:t>
+      </w:r>
+    </w:p>
+    <w:p>
+      <w:r>
+        <w:t>09-November-2025</w:t>
+      </w:r>
+    </w:p>
+    <w:p/>
+    <w:p>
       <w:pPr>
         <w:pStyle w:val="Heading1"/>
       </w:pPr>
@@ -21022,7 +22502,7 @@
             <w:tcW w:w="4675" w:type="dxa"/>
           </w:tcPr>
           <w:p>
-            <w:hyperlink r:id="rId59" w:history="1">
+            <w:hyperlink r:id="rId62" w:history="1">
               <w:r>
                 <w:rPr>
                   <w:rStyle w:val="Hyperlink"/>
@@ -21058,7 +22538,7 @@
             <w:tcW w:w="4675" w:type="dxa"/>
           </w:tcPr>
           <w:p>
-            <w:hyperlink r:id="rId60" w:history="1">
+            <w:hyperlink r:id="rId63" w:history="1">
               <w:r>
                 <w:rPr>
                   <w:rStyle w:val="Hyperlink"/>
@@ -21088,7 +22568,7 @@
             <w:tcW w:w="4675" w:type="dxa"/>
           </w:tcPr>
           <w:p>
-            <w:hyperlink r:id="rId61" w:history="1">
+            <w:hyperlink r:id="rId64" w:history="1">
               <w:r>
                 <w:rPr>
                   <w:rStyle w:val="Hyperlink"/>
@@ -21107,17 +22587,17 @@
           </w:tcPr>
           <w:p>
             <w:r>
-              <w:t>Yet another assembler. There is a ton of work behind. The macros</w:t>
+              <w:t xml:space="preserve">Yet another assembler. There is a </w:t>
+            </w:r>
+            <w:r>
+              <w:lastRenderedPageBreak/>
+              <w:t>ton of work behind. The macros</w:t>
             </w:r>
             <w:r>
               <w:t xml:space="preserve"> and projects</w:t>
             </w:r>
             <w:r>
-              <w:t xml:space="preserve"> section contain a lot of pre-canned </w:t>
-            </w:r>
-            <w:r>
-              <w:lastRenderedPageBreak/>
-              <w:t xml:space="preserve">structures and </w:t>
+              <w:t xml:space="preserve"> section contain a lot of pre-canned structures and </w:t>
             </w:r>
             <w:proofErr w:type="spellStart"/>
             <w:r>
@@ -21141,7 +22621,7 @@
             <w:tcW w:w="4675" w:type="dxa"/>
           </w:tcPr>
           <w:p>
-            <w:hyperlink r:id="rId62" w:history="1">
+            <w:hyperlink r:id="rId65" w:history="1">
               <w:r>
                 <w:rPr>
                   <w:rStyle w:val="Hyperlink"/>
@@ -21171,7 +22651,7 @@
             <w:tcW w:w="4675" w:type="dxa"/>
           </w:tcPr>
           <w:p>
-            <w:hyperlink r:id="rId63" w:history="1">
+            <w:hyperlink r:id="rId66" w:history="1">
               <w:r>
                 <w:rPr>
                   <w:rStyle w:val="Hyperlink"/>
@@ -21201,7 +22681,7 @@
             <w:tcW w:w="4675" w:type="dxa"/>
           </w:tcPr>
           <w:p>
-            <w:hyperlink r:id="rId64" w:history="1">
+            <w:hyperlink r:id="rId67" w:history="1">
               <w:r>
                 <w:rPr>
                   <w:rStyle w:val="Hyperlink"/>
@@ -21256,7 +22736,7 @@
             <w:tcW w:w="4675" w:type="dxa"/>
           </w:tcPr>
           <w:p>
-            <w:hyperlink r:id="rId65" w:history="1">
+            <w:hyperlink r:id="rId68" w:history="1">
               <w:r>
                 <w:rPr>
                   <w:rStyle w:val="Hyperlink"/>
@@ -21289,7 +22769,7 @@
             <w:tcW w:w="4675" w:type="dxa"/>
           </w:tcPr>
           <w:p>
-            <w:hyperlink r:id="rId66" w:history="1">
+            <w:hyperlink r:id="rId69" w:history="1">
               <w:r>
                 <w:rPr>
                   <w:rStyle w:val="Hyperlink"/>
@@ -21316,7 +22796,7 @@
             <w:tcW w:w="4675" w:type="dxa"/>
           </w:tcPr>
           <w:p>
-            <w:hyperlink r:id="rId67" w:history="1">
+            <w:hyperlink r:id="rId70" w:history="1">
               <w:r>
                 <w:rPr>
                   <w:rStyle w:val="Hyperlink"/>
@@ -21346,7 +22826,7 @@
             <w:tcW w:w="4675" w:type="dxa"/>
           </w:tcPr>
           <w:p>
-            <w:hyperlink r:id="rId68" w:history="1">
+            <w:hyperlink r:id="rId71" w:history="1">
               <w:r>
                 <w:rPr>
                   <w:rStyle w:val="Hyperlink"/>
@@ -21366,6 +22846,91 @@
           <w:p>
             <w:r>
               <w:t>Probably the best FAT reference outside the specs</w:t>
+            </w:r>
+          </w:p>
+        </w:tc>
+      </w:tr>
+      <w:tr>
+        <w:tc>
+          <w:tcPr>
+            <w:tcW w:w="4675" w:type="dxa"/>
+          </w:tcPr>
+          <w:p>
+            <w:proofErr w:type="spellStart"/>
+            <w:r>
+              <w:t>Watcom</w:t>
+            </w:r>
+            <w:proofErr w:type="spellEnd"/>
+            <w:r>
+              <w:t xml:space="preserve"> sources for assembly, </w:t>
+            </w:r>
+            <w:proofErr w:type="spellStart"/>
+            <w:r>
+              <w:t>chs</w:t>
+            </w:r>
+            <w:proofErr w:type="spellEnd"/>
+            <w:r>
+              <w:t xml:space="preserve"> online calculator </w:t>
+            </w:r>
+            <w:hyperlink r:id="rId72" w:history="1">
+              <w:r>
+                <w:rPr>
+                  <w:rStyle w:val="Hyperlink"/>
+                </w:rPr>
+                <w:t>https://www.youtube.com/watch?v=7CrUM8Uf9ho</w:t>
+              </w:r>
+            </w:hyperlink>
+            <w:r>
+              <w:t xml:space="preserve"> </w:t>
+            </w:r>
+          </w:p>
+        </w:tc>
+        <w:tc>
+          <w:tcPr>
+            <w:tcW w:w="4675" w:type="dxa"/>
+          </w:tcPr>
+          <w:p/>
+        </w:tc>
+      </w:tr>
+      <w:tr>
+        <w:tc>
+          <w:tcPr>
+            <w:tcW w:w="4675" w:type="dxa"/>
+          </w:tcPr>
+          <w:p>
+            <w:hyperlink r:id="rId73" w:history="1">
+              <w:r>
+                <w:rPr>
+                  <w:rStyle w:val="Hyperlink"/>
+                </w:rPr>
+                <w:t>https://ide.kaitai.io/</w:t>
+              </w:r>
+            </w:hyperlink>
+            <w:r>
+              <w:t xml:space="preserve"> </w:t>
+            </w:r>
+          </w:p>
+          <w:p>
+            <w:hyperlink r:id="rId74" w:history="1">
+              <w:r>
+                <w:rPr>
+                  <w:rStyle w:val="Hyperlink"/>
+                </w:rPr>
+                <w:t>https://kaitai.io/</w:t>
+              </w:r>
+            </w:hyperlink>
+            <w:r>
+              <w:t xml:space="preserve"> </w:t>
+            </w:r>
+          </w:p>
+        </w:tc>
+        <w:tc>
+          <w:tcPr>
+            <w:tcW w:w="4675" w:type="dxa"/>
+          </w:tcPr>
+          <w:p>
+            <w:r>
+              <w:t>To work with structs</w:t>
             </w:r>
           </w:p>
         </w:tc>
@@ -21685,6 +23250,35 @@
             </w:pPr>
             <w:r>
               <w:t>8 hours</w:t>
+            </w:r>
+          </w:p>
+        </w:tc>
+      </w:tr>
+      <w:tr>
+        <w:trPr>
+          <w:cnfStyle w:val="000000100000" w:firstRow="0" w:lastRow="0" w:firstColumn="0" w:lastColumn="0" w:oddVBand="0" w:evenVBand="0" w:oddHBand="1" w:evenHBand="0" w:firstRowFirstColumn="0" w:firstRowLastColumn="0" w:lastRowFirstColumn="0" w:lastRowLastColumn="0"/>
+        </w:trPr>
+        <w:tc>
+          <w:tcPr>
+            <w:cnfStyle w:val="001000000000" w:firstRow="0" w:lastRow="0" w:firstColumn="1" w:lastColumn="0" w:oddVBand="0" w:evenVBand="0" w:oddHBand="0" w:evenHBand="0" w:firstRowFirstColumn="0" w:firstRowLastColumn="0" w:lastRowFirstColumn="0" w:lastRowLastColumn="0"/>
+            <w:tcW w:w="4675" w:type="dxa"/>
+          </w:tcPr>
+          <w:p>
+            <w:r>
+              <w:t>08-November-2025</w:t>
+            </w:r>
+          </w:p>
+        </w:tc>
+        <w:tc>
+          <w:tcPr>
+            <w:tcW w:w="4675" w:type="dxa"/>
+          </w:tcPr>
+          <w:p>
+            <w:pPr>
+              <w:cnfStyle w:val="000000100000" w:firstRow="0" w:lastRow="0" w:firstColumn="0" w:lastColumn="0" w:oddVBand="0" w:evenVBand="0" w:oddHBand="1" w:evenHBand="0" w:firstRowFirstColumn="0" w:firstRowLastColumn="0" w:lastRowFirstColumn="0" w:lastRowLastColumn="0"/>
+            </w:pPr>
+            <w:r>
+              <w:t>10 hours</w:t>
             </w:r>
           </w:p>
         </w:tc>
@@ -22890,7 +24484,7 @@
       </w:r>
     </w:p>
     <w:sectPr>
-      <w:headerReference w:type="default" r:id="rId69"/>
+      <w:headerReference w:type="default" r:id="rId75"/>
       <w:pgSz w:w="12240" w:h="15840"/>
       <w:pgMar w:top="1440" w:right="1440" w:bottom="1440" w:left="1440" w:header="720" w:footer="720" w:gutter="0"/>
       <w:pgNumType w:start="0"/>
@@ -23612,6 +25206,15 @@
     <w:abstractNumId w:val="0"/>
   </w:num>
   <w:num w:numId="42" w16cid:durableId="2116292498">
+    <w:abstractNumId w:val="0"/>
+  </w:num>
+  <w:num w:numId="43" w16cid:durableId="165707250">
+    <w:abstractNumId w:val="0"/>
+  </w:num>
+  <w:num w:numId="44" w16cid:durableId="1841461430">
+    <w:abstractNumId w:val="0"/>
+  </w:num>
+  <w:num w:numId="45" w16cid:durableId="1421757342">
     <w:abstractNumId w:val="0"/>
   </w:num>
 </w:numbering>

</xml_diff>

<commit_message>
MBR and VBR partition entries issue. Research before continuing development
</commit_message>
<xml_diff>
--- a/docs/TusMuertos-v2.0-Design.docx
+++ b/docs/TusMuertos-v2.0-Design.docx
@@ -9342,6 +9342,21 @@
         </w:numPr>
       </w:pPr>
       <w:r>
+        <w:t>Use ; better than &amp;&amp; to concatenate commands on linux. If first command fails, &amp;&amp; prevents the second command to execute. Alternatively you can use || true</w:t>
+      </w:r>
+      <w:r>
+        <w:t xml:space="preserve"> to force the first command to always return true</w:t>
+      </w:r>
+    </w:p>
+    <w:p>
+      <w:pPr>
+        <w:pStyle w:val="ListParagraph"/>
+        <w:numPr>
+          <w:ilvl w:val="0"/>
+          <w:numId w:val="1"/>
+        </w:numPr>
+      </w:pPr>
+      <w:r>
         <w:t>Assembly gotchas:</w:t>
       </w:r>
     </w:p>
@@ -9403,6 +9418,18 @@
       </w:pPr>
       <w:r>
         <w:t>Use cx as the classic loop counter</w:t>
+      </w:r>
+    </w:p>
+    <w:p>
+      <w:pPr>
+        <w:pStyle w:val="ListParagraph"/>
+        <w:numPr>
+          <w:ilvl w:val="1"/>
+          <w:numId w:val="1"/>
+        </w:numPr>
+      </w:pPr>
+      <w:r>
+        <w:t>Use lea and cmovle to avoid branching. You can compute both values and do a conditional move (Example calculate ASCII by adding 48 or 55 and use cmovle to keep on or another depending on cmp comparation)</w:t>
       </w:r>
     </w:p>
     <w:p>
@@ -13611,22 +13638,79 @@
           <w:b/>
           <w:bCs/>
         </w:rPr>
-        <w:t>rm  ~/codebox/tempimage.img &amp;&amp; ./emptydisk01 --size-mb 34 --out ~/codebox/tempimage.img</w:t>
-      </w:r>
-    </w:p>
-    <w:p>
-      <w:pPr>
+        <w:t xml:space="preserve">rm  ~/codebox/tempimage.img </w:t>
+      </w:r>
+      <w:r>
         <w:rPr>
           <w:b/>
           <w:bCs/>
         </w:rPr>
-      </w:pPr>
+        <w:t>;</w:t>
+      </w:r>
       <w:r>
         <w:rPr>
           <w:b/>
           <w:bCs/>
         </w:rPr>
-        <w:t>rm ../../../tempimage.img &amp;&amp; ./emptydisk01 --size-mb 34 --out ../../../tempimage.img</w:t>
+        <w:t xml:space="preserve"> ./emptydisk01 --size-mb 34 --out ~/codebox/tempimage.img</w:t>
+      </w:r>
+    </w:p>
+    <w:p>
+      <w:pPr>
+        <w:rPr>
+          <w:b/>
+          <w:bCs/>
+        </w:rPr>
+      </w:pPr>
+      <w:r>
+        <w:rPr>
+          <w:b/>
+          <w:bCs/>
+        </w:rPr>
+        <w:t xml:space="preserve">rm ../../../tempimage.img </w:t>
+      </w:r>
+      <w:r>
+        <w:rPr>
+          <w:b/>
+          <w:bCs/>
+        </w:rPr>
+        <w:t>;</w:t>
+      </w:r>
+      <w:r>
+        <w:rPr>
+          <w:b/>
+          <w:bCs/>
+        </w:rPr>
+        <w:t xml:space="preserve"> ./emptydisk01 --size-mb 34 --out ../../../tempimage.img</w:t>
+      </w:r>
+      <w:r>
+        <w:rPr>
+          <w:b/>
+          <w:bCs/>
+        </w:rPr>
+        <w:t xml:space="preserve"> (from this folder) </w:t>
+      </w:r>
+      <w:r>
+        <w:rPr>
+          <w:b/>
+          <w:bCs/>
+        </w:rPr>
+        <w:t>~/codebox/emptydisk01/target/debug</w:t>
+      </w:r>
+    </w:p>
+    <w:p>
+      <w:pPr>
+        <w:rPr>
+          <w:b/>
+          <w:bCs/>
+        </w:rPr>
+      </w:pPr>
+      <w:r>
+        <w:rPr>
+          <w:b/>
+          <w:bCs/>
+        </w:rPr>
+        <w:t>DO NOT EXECUTE IT ON /MNT or Windows directly. This is a codebox command</w:t>
       </w:r>
     </w:p>
     <w:p/>
@@ -13659,12 +13743,12 @@
     </w:p>
     <w:p>
       <w:r>
+        <w:lastRenderedPageBreak/>
         <w:t>Create a Bochs configuration file, copying the template: bochsrc-sample.txt</w:t>
       </w:r>
     </w:p>
     <w:p>
       <w:r>
-        <w:lastRenderedPageBreak/>
         <w:t xml:space="preserve">Uncomment the lines you require with the settings you require. </w:t>
       </w:r>
     </w:p>
@@ -13823,7 +13907,6 @@
       </w:pPr>
       <w:bookmarkStart w:id="25" w:name="_Toc213355650"/>
       <w:r>
-        <w:lastRenderedPageBreak/>
         <w:t>On bootloader, will mov sp, 0x7C00 make the next push to overwrite the first byte of the bootloader? (Overlap)</w:t>
       </w:r>
       <w:bookmarkEnd w:id="25"/>
@@ -20813,6 +20896,86 @@
           </w:p>
         </w:tc>
       </w:tr>
+      <w:tr>
+        <w:tc>
+          <w:tcPr>
+            <w:tcW w:w="4675" w:type="dxa"/>
+          </w:tcPr>
+          <w:p>
+            <w:hyperlink r:id="rId79" w:history="1">
+              <w:r>
+                <w:rPr>
+                  <w:rStyle w:val="Hyperlink"/>
+                </w:rPr>
+                <w:t>https://github.com/horsicq/Detect-It-Easy</w:t>
+              </w:r>
+            </w:hyperlink>
+          </w:p>
+        </w:tc>
+        <w:tc>
+          <w:tcPr>
+            <w:tcW w:w="4675" w:type="dxa"/>
+          </w:tcPr>
+          <w:p/>
+        </w:tc>
+      </w:tr>
+      <w:tr>
+        <w:tc>
+          <w:tcPr>
+            <w:tcW w:w="4675" w:type="dxa"/>
+          </w:tcPr>
+          <w:p>
+            <w:hyperlink r:id="rId80" w:history="1">
+              <w:r>
+                <w:rPr>
+                  <w:rStyle w:val="Hyperlink"/>
+                </w:rPr>
+                <w:t>https://en.wikipedia.org/wiki/SYSLINUX</w:t>
+              </w:r>
+            </w:hyperlink>
+            <w:r>
+              <w:t xml:space="preserve"> </w:t>
+            </w:r>
+          </w:p>
+        </w:tc>
+        <w:tc>
+          <w:tcPr>
+            <w:tcW w:w="4675" w:type="dxa"/>
+          </w:tcPr>
+          <w:p>
+            <w:r>
+              <w:t>Bootloader</w:t>
+            </w:r>
+          </w:p>
+        </w:tc>
+      </w:tr>
+      <w:tr>
+        <w:tc>
+          <w:tcPr>
+            <w:tcW w:w="4675" w:type="dxa"/>
+          </w:tcPr>
+          <w:p>
+            <w:hyperlink r:id="rId81" w:history="1">
+              <w:r>
+                <w:rPr>
+                  <w:rStyle w:val="Hyperlink"/>
+                </w:rPr>
+                <w:t>https://pandoc.org/</w:t>
+              </w:r>
+            </w:hyperlink>
+          </w:p>
+        </w:tc>
+        <w:tc>
+          <w:tcPr>
+            <w:tcW w:w="4675" w:type="dxa"/>
+          </w:tcPr>
+          <w:p>
+            <w:r>
+              <w:t>To convert this to markdown: mkdocs or the new from the mkdocs team</w:t>
+            </w:r>
+          </w:p>
+        </w:tc>
+      </w:tr>
     </w:tbl>
     <w:p>
       <w:r>
@@ -20821,6 +20984,7 @@
     </w:p>
     <w:p>
       <w:r>
+        <w:lastRenderedPageBreak/>
         <w:br w:type="page"/>
       </w:r>
     </w:p>
@@ -21196,6 +21360,32 @@
             </w:pPr>
             <w:r>
               <w:t>3 hours</w:t>
+            </w:r>
+          </w:p>
+        </w:tc>
+      </w:tr>
+      <w:tr>
+        <w:tc>
+          <w:tcPr>
+            <w:cnfStyle w:val="001000000000" w:firstRow="0" w:lastRow="0" w:firstColumn="1" w:lastColumn="0" w:oddVBand="0" w:evenVBand="0" w:oddHBand="0" w:evenHBand="0" w:firstRowFirstColumn="0" w:firstRowLastColumn="0" w:lastRowFirstColumn="0" w:lastRowLastColumn="0"/>
+            <w:tcW w:w="4675" w:type="dxa"/>
+          </w:tcPr>
+          <w:p>
+            <w:r>
+              <w:t>16-November-2025</w:t>
+            </w:r>
+          </w:p>
+        </w:tc>
+        <w:tc>
+          <w:tcPr>
+            <w:tcW w:w="4675" w:type="dxa"/>
+          </w:tcPr>
+          <w:p>
+            <w:pPr>
+              <w:cnfStyle w:val="000000000000" w:firstRow="0" w:lastRow="0" w:firstColumn="0" w:lastColumn="0" w:oddVBand="0" w:evenVBand="0" w:oddHBand="0" w:evenHBand="0" w:firstRowFirstColumn="0" w:firstRowLastColumn="0" w:lastRowFirstColumn="0" w:lastRowLastColumn="0"/>
+            </w:pPr>
+            <w:r>
+              <w:t>4 hours</w:t>
             </w:r>
           </w:p>
         </w:tc>
@@ -22545,7 +22735,7 @@
       </w:r>
     </w:p>
     <w:sectPr>
-      <w:headerReference w:type="default" r:id="rId79"/>
+      <w:headerReference w:type="default" r:id="rId82"/>
       <w:pgSz w:w="12240" w:h="15840"/>
       <w:pgMar w:top="1440" w:right="1440" w:bottom="1440" w:left="1440" w:header="720" w:footer="720" w:gutter="0"/>
       <w:pgNumType w:start="0"/>

</xml_diff>